<commit_message>
first draft of distraction discussion
</commit_message>
<xml_diff>
--- a/output/papers/Round 2/manuscript-brief.docx
+++ b/output/papers/Round 2/manuscript-brief.docx
@@ -7318,14 +7318,27 @@
       <w:r>
         <w:t xml:space="preserve">able </w:t>
       </w:r>
-      <w:fldSimple w:instr=" SEQ Table \* ARABIC ">
-        <w:r>
-          <w:rPr>
-            <w:noProof/>
-          </w:rPr>
-          <w:t>1</w:t>
-        </w:r>
-      </w:fldSimple>
+      <w:r>
+        <w:fldChar w:fldCharType="begin"/>
+      </w:r>
+      <w:r>
+        <w:instrText xml:space="preserve"> SEQ Table \* ARABIC </w:instrText>
+      </w:r>
+      <w:r>
+        <w:fldChar w:fldCharType="separate"/>
+      </w:r>
+      <w:r>
+        <w:rPr>
+          <w:noProof/>
+        </w:rPr>
+        <w:t>1</w:t>
+      </w:r>
+      <w:r>
+        <w:rPr>
+          <w:noProof/>
+        </w:rPr>
+        <w:fldChar w:fldCharType="end"/>
+      </w:r>
       <w:bookmarkEnd w:id="18"/>
       <w:r>
         <w:tab/>
@@ -15479,20 +15492,30 @@
         </w:rPr>
         <w:t>-like stimuli.</w:t>
       </w:r>
-      <w:r>
-        <w:rPr>
-          <w:i/>
-          <w:iCs/>
-          <w:szCs w:val="22"/>
-        </w:rPr>
-        <w:t xml:space="preserve"> </w:t>
-      </w:r>
-      <w:r>
-        <w:rPr>
-          <w:szCs w:val="22"/>
-        </w:rPr>
-        <w:t xml:space="preserve"> </w:t>
-      </w:r>
+      <w:ins w:id="49" w:author="Cummings, Shawn" w:date="2025-05-10T14:39:00Z" w16du:dateUtc="2025-05-10T18:39:00Z">
+        <w:r>
+          <w:rPr>
+            <w:szCs w:val="22"/>
+          </w:rPr>
+          <w:t xml:space="preserve"> </w:t>
+        </w:r>
+      </w:ins>
+      <w:del w:id="50" w:author="Cummings, Shawn" w:date="2025-05-10T14:39:00Z" w16du:dateUtc="2025-05-10T18:39:00Z">
+        <w:r>
+          <w:rPr>
+            <w:i/>
+            <w:iCs/>
+            <w:szCs w:val="22"/>
+          </w:rPr>
+          <w:delText xml:space="preserve"> </w:delText>
+        </w:r>
+        <w:r>
+          <w:rPr>
+            <w:szCs w:val="22"/>
+          </w:rPr>
+          <w:delText xml:space="preserve"> </w:delText>
+        </w:r>
+      </w:del>
       <w:r>
         <w:rPr>
           <w:szCs w:val="22"/>
@@ -15555,7 +15578,6 @@
           <w:szCs w:val="22"/>
         </w:rPr>
       </w:pPr>
-      <w:commentRangeStart w:id="49"/>
       <w:r>
         <w:rPr>
           <w:sz w:val="22"/>
@@ -15571,14 +15593,6 @@
         </w:rPr>
         <w:t xml:space="preserve"> 2</w:t>
       </w:r>
-      <w:commentRangeEnd w:id="49"/>
-      <w:r>
-        <w:rPr>
-          <w:rStyle w:val="CommentReference"/>
-          <w:b w:val="0"/>
-        </w:rPr>
-        <w:commentReference w:id="49"/>
-      </w:r>
     </w:p>
     <w:p>
       <w:pPr>
@@ -15778,7 +15792,61 @@
         <w:rPr>
           <w:szCs w:val="22"/>
         </w:rPr>
-        <w:t>specific state of the articulators (lip rounding, oral cavity opening) during the production of the fricative.</w:t>
+        <w:t>specific state of the articulators (lip rounding, oral cavity opening) during the production of the fricative</w:t>
+      </w:r>
+      <w:ins w:id="51" w:author="Cummings, Shawn" w:date="2025-05-10T14:43:00Z" w16du:dateUtc="2025-05-10T18:43:00Z">
+        <w:r>
+          <w:rPr>
+            <w:szCs w:val="22"/>
+          </w:rPr>
+          <w:t>.</w:t>
+        </w:r>
+      </w:ins>
+      <w:ins w:id="52" w:author="Cummings, Shawn" w:date="2025-05-10T14:45:00Z" w16du:dateUtc="2025-05-10T18:45:00Z">
+        <w:r>
+          <w:rPr>
+            <w:szCs w:val="22"/>
+          </w:rPr>
+          <w:t xml:space="preserve"> </w:t>
+        </w:r>
+      </w:ins>
+      <w:ins w:id="53" w:author="Cummings, Shawn" w:date="2025-05-10T14:43:00Z" w16du:dateUtc="2025-05-10T18:43:00Z">
+        <w:r>
+          <w:rPr>
+            <w:szCs w:val="22"/>
+          </w:rPr>
+          <w:t>This manipulation</w:t>
+        </w:r>
+      </w:ins>
+      <w:ins w:id="54" w:author="Cummings, Shawn" w:date="2025-05-10T14:44:00Z" w16du:dateUtc="2025-05-10T18:44:00Z">
+        <w:r>
+          <w:rPr>
+            <w:szCs w:val="22"/>
+          </w:rPr>
+          <w:t xml:space="preserve"> follows previous work usin</w:t>
+        </w:r>
+      </w:ins>
+      <w:ins w:id="55" w:author="Cummings, Shawn" w:date="2025-05-10T14:45:00Z" w16du:dateUtc="2025-05-10T18:45:00Z">
+        <w:r>
+          <w:rPr>
+            <w:szCs w:val="22"/>
+          </w:rPr>
+          <w:t>g a black box to occlude articulatory information while retaining continuity of the presented stimulus</w:t>
+        </w:r>
+      </w:ins>
+      <w:ins w:id="56" w:author="Cummings, Shawn" w:date="2025-05-10T14:43:00Z" w16du:dateUtc="2025-05-10T18:43:00Z">
+        <w:r>
+          <w:rPr>
+            <w:szCs w:val="22"/>
+          </w:rPr>
+          <w:t xml:space="preserve"> (Viswanathan &amp; Stephens, 2016)</w:t>
+        </w:r>
+      </w:ins>
+      <w:r>
+        <w:rPr>
+          <w:szCs w:val="22"/>
+        </w:rPr>
+        <w:t>.</w:t>
       </w:r>
     </w:p>
     <w:p>
@@ -15849,7 +15917,7 @@
           <w:szCs w:val="22"/>
         </w:rPr>
       </w:pPr>
-      <w:bookmarkStart w:id="50" w:name="_Ref136084921"/>
+      <w:bookmarkStart w:id="57" w:name="_Ref136084921"/>
       <w:r>
         <w:rPr>
           <w:szCs w:val="22"/>
@@ -15888,7 +15956,7 @@
         </w:rPr>
         <w:fldChar w:fldCharType="end"/>
       </w:r>
-      <w:bookmarkEnd w:id="50"/>
+      <w:bookmarkEnd w:id="57"/>
       <w:r>
         <w:rPr>
           <w:szCs w:val="22"/>
@@ -16023,11 +16091,34 @@
           <w:szCs w:val="22"/>
         </w:rPr>
       </w:pPr>
-      <w:r>
-        <w:rPr>
-          <w:szCs w:val="22"/>
-        </w:rPr>
-        <w:t xml:space="preserve">This manipulation served two purposes. First, by assessing the effect of pen location in Experiment 2, we can test whether the presence of a pen in the mouth was sufficient to cause the effect observed in Experiments 1a-c or whether listeners need to have more direct evidence of the </w:t>
+      <w:del w:id="58" w:author="Cummings, Shawn" w:date="2025-05-10T14:44:00Z" w16du:dateUtc="2025-05-10T18:44:00Z">
+        <w:r>
+          <w:rPr>
+            <w:szCs w:val="22"/>
+          </w:rPr>
+          <w:delText>This manipulation</w:delText>
+        </w:r>
+      </w:del>
+      <w:ins w:id="59" w:author="Cummings, Shawn" w:date="2025-05-10T14:44:00Z" w16du:dateUtc="2025-05-10T18:44:00Z">
+        <w:r>
+          <w:rPr>
+            <w:szCs w:val="22"/>
+          </w:rPr>
+          <w:t>Experiment 2</w:t>
+        </w:r>
+      </w:ins>
+      <w:r>
+        <w:rPr>
+          <w:szCs w:val="22"/>
+        </w:rPr>
+        <w:t xml:space="preserve"> served two purposes. First, by assessing the effect of pen location in Experiment 2, we can test whether the presence of a pen in the mouth was sufficient to cause the </w:t>
+      </w:r>
+      <w:r>
+        <w:rPr>
+          <w:szCs w:val="22"/>
+        </w:rPr>
+        <w:lastRenderedPageBreak/>
+        <w:t xml:space="preserve">effect observed in Experiments 1a-c or whether listeners need to have more direct evidence of the </w:t>
       </w:r>
       <w:r>
         <w:rPr>
@@ -16041,14 +16132,7 @@
         <w:rPr>
           <w:szCs w:val="22"/>
         </w:rPr>
-        <w:t xml:space="preserve"> of the pen in the mouth. For example, if listeners only compensate if </w:t>
-      </w:r>
-      <w:r>
-        <w:rPr>
-          <w:szCs w:val="22"/>
-        </w:rPr>
-        <w:lastRenderedPageBreak/>
-        <w:t>they observe that the pen indeed causes more lip rounding or larger opening of the oral cavity</w:t>
+        <w:t xml:space="preserve"> of the pen in the mouth. For example, if listeners only compensate if they observe that the pen indeed causes more lip rounding or larger opening of the oral cavity</w:t>
       </w:r>
       <w:r>
         <w:rPr>
@@ -16286,6 +16370,7 @@
         <w:rPr>
           <w:szCs w:val="22"/>
         </w:rPr>
+        <w:lastRenderedPageBreak/>
         <w:br w:type="page"/>
       </w:r>
     </w:p>
@@ -17399,7 +17484,7 @@
           <w:szCs w:val="22"/>
         </w:rPr>
       </w:pPr>
-      <w:bookmarkStart w:id="51" w:name="_Ref136190811"/>
+      <w:bookmarkStart w:id="60" w:name="_Ref136190811"/>
       <w:r>
         <w:rPr>
           <w:szCs w:val="22"/>
@@ -17438,7 +17523,7 @@
         </w:rPr>
         <w:fldChar w:fldCharType="end"/>
       </w:r>
-      <w:bookmarkEnd w:id="51"/>
+      <w:bookmarkEnd w:id="60"/>
       <w:r>
         <w:rPr>
           <w:szCs w:val="22"/>
@@ -17545,7 +17630,7 @@
       <w:pPr>
         <w:pStyle w:val="Caption"/>
       </w:pPr>
-      <w:bookmarkStart w:id="52" w:name="_Ref136190818"/>
+      <w:bookmarkStart w:id="61" w:name="_Ref136190818"/>
       <w:r>
         <w:rPr>
           <w:szCs w:val="22"/>
@@ -17585,7 +17670,7 @@
         </w:rPr>
         <w:fldChar w:fldCharType="end"/>
       </w:r>
-      <w:bookmarkEnd w:id="52"/>
+      <w:bookmarkEnd w:id="61"/>
       <w:r>
         <w:rPr>
           <w:szCs w:val="22"/>
@@ -19853,7 +19938,7 @@
     <w:p>
       <w:pPr>
         <w:rPr>
-          <w:szCs w:val="22"/>
+          <w:ins w:id="62" w:author="Cummings, Shawn" w:date="2025-05-10T13:58:00Z" w16du:dateUtc="2025-05-10T17:58:00Z"/>
         </w:rPr>
       </w:pPr>
       <w:r>
@@ -20294,22 +20379,529 @@
     </w:p>
     <w:p>
       <w:pPr>
-        <w:pStyle w:val="Heading1"/>
-        <w:rPr>
-          <w:szCs w:val="22"/>
-        </w:rPr>
-      </w:pPr>
-      <w:r>
-        <w:rPr>
-          <w:sz w:val="22"/>
-          <w:szCs w:val="22"/>
-        </w:rPr>
-        <w:t>General Discussion</w:t>
-      </w:r>
+        <w:rPr>
+          <w:ins w:id="63" w:author="Cummings, Shawn" w:date="2025-05-10T14:21:00Z" w16du:dateUtc="2025-05-10T18:21:00Z"/>
+          <w:szCs w:val="22"/>
+        </w:rPr>
+      </w:pPr>
+      <w:ins w:id="64" w:author="Cummings, Shawn" w:date="2025-05-10T13:58:00Z" w16du:dateUtc="2025-05-10T17:58:00Z">
+        <w:r>
+          <w:t>At first blush, the results of Experiment 2 favor hypothesis 1b above, t</w:t>
+        </w:r>
+      </w:ins>
+      <w:ins w:id="65" w:author="Cummings, Shawn" w:date="2025-05-10T13:59:00Z" w16du:dateUtc="2025-05-10T17:59:00Z">
+        <w:r>
+          <w:t xml:space="preserve">hat listeners </w:t>
+        </w:r>
+        <w:r>
+          <w:rPr>
+            <w:szCs w:val="22"/>
+          </w:rPr>
+          <w:t>compensate based on the visually evident state of the articulators caused by the pen in the mouth</w:t>
+        </w:r>
+        <w:r>
+          <w:rPr>
+            <w:szCs w:val="22"/>
+          </w:rPr>
+          <w:t xml:space="preserve"> </w:t>
+        </w:r>
+        <w:r>
+          <w:rPr>
+            <w:szCs w:val="22"/>
+          </w:rPr>
+          <w:t>rather than the presence of the pen itself</w:t>
+        </w:r>
+        <w:r>
+          <w:rPr>
+            <w:szCs w:val="22"/>
+          </w:rPr>
+          <w:t xml:space="preserve">. </w:t>
+        </w:r>
+      </w:ins>
+      <w:ins w:id="66" w:author="Cummings, Shawn" w:date="2025-05-10T14:00:00Z" w16du:dateUtc="2025-05-10T18:00:00Z">
+        <w:r>
+          <w:rPr>
+            <w:szCs w:val="22"/>
+          </w:rPr>
+          <w:t xml:space="preserve">However, the </w:t>
+        </w:r>
+      </w:ins>
+      <w:ins w:id="67" w:author="Cummings, Shawn" w:date="2025-05-10T14:01:00Z" w16du:dateUtc="2025-05-10T18:01:00Z">
+        <w:r>
+          <w:rPr>
+            <w:szCs w:val="22"/>
+          </w:rPr>
+          <w:t>addition of the black box did more than just remove evidence of the state of the articulators</w:t>
+        </w:r>
+      </w:ins>
+      <w:ins w:id="68" w:author="Cummings, Shawn" w:date="2025-05-10T14:07:00Z" w16du:dateUtc="2025-05-10T18:07:00Z">
+        <w:r>
+          <w:rPr>
+            <w:szCs w:val="22"/>
+          </w:rPr>
+          <w:t>; i</w:t>
+        </w:r>
+      </w:ins>
+      <w:ins w:id="69" w:author="Cummings, Shawn" w:date="2025-05-10T14:02:00Z" w16du:dateUtc="2025-05-10T18:02:00Z">
+        <w:r>
+          <w:rPr>
+            <w:szCs w:val="22"/>
+          </w:rPr>
+          <w:t>t also imposed distracting visual input</w:t>
+        </w:r>
+      </w:ins>
+      <w:ins w:id="70" w:author="Cummings, Shawn" w:date="2025-05-10T14:03:00Z" w16du:dateUtc="2025-05-10T18:03:00Z">
+        <w:r>
+          <w:rPr>
+            <w:szCs w:val="22"/>
+          </w:rPr>
+          <w:t xml:space="preserve"> during a critical window for perception of the target sound. </w:t>
+        </w:r>
+      </w:ins>
+      <w:ins w:id="71" w:author="Cummings, Shawn" w:date="2025-05-10T14:13:00Z" w16du:dateUtc="2025-05-10T18:13:00Z">
+        <w:r>
+          <w:rPr>
+            <w:szCs w:val="22"/>
+          </w:rPr>
+          <w:t>Here we briefly discuss</w:t>
+        </w:r>
+      </w:ins>
+      <w:ins w:id="72" w:author="Cummings, Shawn" w:date="2025-05-10T14:04:00Z" w16du:dateUtc="2025-05-10T18:04:00Z">
+        <w:r>
+          <w:rPr>
+            <w:szCs w:val="22"/>
+          </w:rPr>
+          <w:t xml:space="preserve"> two possibilities</w:t>
+        </w:r>
+      </w:ins>
+      <w:ins w:id="73" w:author="Cummings, Shawn" w:date="2025-05-10T14:13:00Z" w16du:dateUtc="2025-05-10T18:13:00Z">
+        <w:r>
+          <w:rPr>
+            <w:szCs w:val="22"/>
+          </w:rPr>
+          <w:t xml:space="preserve"> which</w:t>
+        </w:r>
+      </w:ins>
+      <w:ins w:id="74" w:author="Cummings, Shawn" w:date="2025-05-10T14:04:00Z" w16du:dateUtc="2025-05-10T18:04:00Z">
+        <w:r>
+          <w:rPr>
+            <w:szCs w:val="22"/>
+          </w:rPr>
+          <w:t xml:space="preserve"> emerge from this facet of the manipulation</w:t>
+        </w:r>
+      </w:ins>
+      <w:ins w:id="75" w:author="Cummings, Shawn" w:date="2025-05-10T14:13:00Z" w16du:dateUtc="2025-05-10T18:13:00Z">
+        <w:r>
+          <w:rPr>
+            <w:szCs w:val="22"/>
+          </w:rPr>
+          <w:t xml:space="preserve">. </w:t>
+        </w:r>
+      </w:ins>
+      <w:ins w:id="76" w:author="Cummings, Shawn" w:date="2025-05-10T14:04:00Z" w16du:dateUtc="2025-05-10T18:04:00Z">
+        <w:r>
+          <w:rPr>
+            <w:szCs w:val="22"/>
+          </w:rPr>
+          <w:t>First,</w:t>
+        </w:r>
+      </w:ins>
+      <w:ins w:id="77" w:author="Cummings, Shawn" w:date="2025-05-10T14:07:00Z" w16du:dateUtc="2025-05-10T18:07:00Z">
+        <w:r>
+          <w:rPr>
+            <w:szCs w:val="22"/>
+          </w:rPr>
+          <w:t xml:space="preserve"> distraction could globally disrupt attention</w:t>
+        </w:r>
+      </w:ins>
+      <w:ins w:id="78" w:author="Cummings, Shawn" w:date="2025-05-10T14:12:00Z" w16du:dateUtc="2025-05-10T18:12:00Z">
+        <w:r>
+          <w:rPr>
+            <w:szCs w:val="22"/>
+          </w:rPr>
+          <w:t xml:space="preserve"> and</w:t>
+        </w:r>
+      </w:ins>
+      <w:ins w:id="79" w:author="Cummings, Shawn" w:date="2025-05-10T14:10:00Z" w16du:dateUtc="2025-05-10T18:10:00Z">
+        <w:r>
+          <w:rPr>
+            <w:szCs w:val="22"/>
+          </w:rPr>
+          <w:t xml:space="preserve"> </w:t>
+        </w:r>
+      </w:ins>
+      <w:ins w:id="80" w:author="Cummings, Shawn" w:date="2025-05-10T14:11:00Z" w16du:dateUtc="2025-05-10T18:11:00Z">
+        <w:r>
+          <w:rPr>
+            <w:szCs w:val="22"/>
+          </w:rPr>
+          <w:t xml:space="preserve">interrupt </w:t>
+        </w:r>
+      </w:ins>
+      <w:ins w:id="81" w:author="Cummings, Shawn" w:date="2025-05-10T14:12:00Z" w16du:dateUtc="2025-05-10T18:12:00Z">
+        <w:r>
+          <w:rPr>
+            <w:szCs w:val="22"/>
+          </w:rPr>
+          <w:t>the</w:t>
+        </w:r>
+      </w:ins>
+      <w:ins w:id="82" w:author="Cummings, Shawn" w:date="2025-05-10T14:11:00Z" w16du:dateUtc="2025-05-10T18:11:00Z">
+        <w:r>
+          <w:rPr>
+            <w:szCs w:val="22"/>
+          </w:rPr>
+          <w:t xml:space="preserve"> cognitive process underl</w:t>
+        </w:r>
+      </w:ins>
+      <w:ins w:id="83" w:author="Cummings, Shawn" w:date="2025-05-10T14:12:00Z" w16du:dateUtc="2025-05-10T18:12:00Z">
+        <w:r>
+          <w:rPr>
+            <w:szCs w:val="22"/>
+          </w:rPr>
+          <w:t>ying</w:t>
+        </w:r>
+      </w:ins>
+      <w:ins w:id="84" w:author="Cummings, Shawn" w:date="2025-05-10T14:11:00Z" w16du:dateUtc="2025-05-10T18:11:00Z">
+        <w:r>
+          <w:rPr>
+            <w:szCs w:val="22"/>
+          </w:rPr>
+          <w:t xml:space="preserve"> compensation</w:t>
+        </w:r>
+      </w:ins>
+      <w:ins w:id="85" w:author="Cummings, Shawn" w:date="2025-05-10T14:12:00Z" w16du:dateUtc="2025-05-10T18:12:00Z">
+        <w:r>
+          <w:rPr>
+            <w:szCs w:val="22"/>
+          </w:rPr>
+          <w:t xml:space="preserve">. A number of factors make this explanation unlikely, though not impossible. </w:t>
+        </w:r>
+      </w:ins>
+      <w:ins w:id="86" w:author="Cummings, Shawn" w:date="2025-05-10T14:15:00Z" w16du:dateUtc="2025-05-10T18:15:00Z">
+        <w:r>
+          <w:rPr>
+            <w:szCs w:val="22"/>
+          </w:rPr>
+          <w:t>Listeners</w:t>
+        </w:r>
+      </w:ins>
+      <w:ins w:id="87" w:author="Cummings, Shawn" w:date="2025-05-10T14:16:00Z" w16du:dateUtc="2025-05-10T18:16:00Z">
+        <w:r>
+          <w:rPr>
+            <w:szCs w:val="22"/>
+          </w:rPr>
+          <w:t xml:space="preserve"> in experiment 2 demonstrated numerically greater </w:t>
+        </w:r>
+      </w:ins>
+      <w:ins w:id="88" w:author="Cummings, Shawn" w:date="2025-05-10T14:15:00Z" w16du:dateUtc="2025-05-10T18:15:00Z">
+        <w:r>
+          <w:rPr>
+            <w:szCs w:val="22"/>
+          </w:rPr>
+          <w:t xml:space="preserve">sensitivity to the acoustic continuum </w:t>
+        </w:r>
+      </w:ins>
+      <w:ins w:id="89" w:author="Cummings, Shawn" w:date="2025-05-10T14:16:00Z" w16du:dateUtc="2025-05-10T18:16:00Z">
+        <w:r>
+          <w:rPr>
+            <w:szCs w:val="22"/>
+          </w:rPr>
+          <w:t>than</w:t>
+        </w:r>
+      </w:ins>
+      <w:ins w:id="90" w:author="Cummings, Shawn" w:date="2025-05-10T14:15:00Z" w16du:dateUtc="2025-05-10T18:15:00Z">
+        <w:r>
+          <w:rPr>
+            <w:szCs w:val="22"/>
+          </w:rPr>
+          <w:t xml:space="preserve"> experiments 1a-c</w:t>
+        </w:r>
+      </w:ins>
+      <w:ins w:id="91" w:author="Cummings, Shawn" w:date="2025-05-10T14:16:00Z" w16du:dateUtc="2025-05-10T18:16:00Z">
+        <w:r>
+          <w:rPr>
+            <w:szCs w:val="22"/>
+          </w:rPr>
+          <w:t xml:space="preserve">, speaking against a higher </w:t>
+        </w:r>
+      </w:ins>
+      <w:ins w:id="92" w:author="Cummings, Shawn" w:date="2025-05-10T14:17:00Z" w16du:dateUtc="2025-05-10T18:17:00Z">
+        <w:r>
+          <w:rPr>
+            <w:szCs w:val="22"/>
+          </w:rPr>
+          <w:t xml:space="preserve">proportion of attentional lapses or random guesses. Along a similar vein, average reaction time was </w:t>
+        </w:r>
+        <w:r>
+          <w:rPr>
+            <w:szCs w:val="22"/>
+          </w:rPr>
+          <w:lastRenderedPageBreak/>
+          <w:t>not significantly higher in Experiment 2. Finall</w:t>
+        </w:r>
+      </w:ins>
+      <w:ins w:id="93" w:author="Cummings, Shawn" w:date="2025-05-10T14:18:00Z" w16du:dateUtc="2025-05-10T18:18:00Z">
+        <w:r>
+          <w:rPr>
+            <w:szCs w:val="22"/>
+          </w:rPr>
+          <w:t xml:space="preserve">y, while the black box was likely initially surprising to listeners, </w:t>
+        </w:r>
+      </w:ins>
+      <w:ins w:id="94" w:author="Cummings, Shawn" w:date="2025-05-10T14:19:00Z" w16du:dateUtc="2025-05-10T18:19:00Z">
+        <w:r>
+          <w:rPr>
+            <w:szCs w:val="22"/>
+          </w:rPr>
+          <w:t xml:space="preserve">it appeared very predictably </w:t>
+        </w:r>
+        <w:commentRangeStart w:id="95"/>
+        <w:commentRangeStart w:id="96"/>
+        <w:r>
+          <w:rPr>
+            <w:szCs w:val="22"/>
+          </w:rPr>
+          <w:t>at the same point in the presented stimulus for each of the 72 trials.</w:t>
+        </w:r>
+      </w:ins>
+      <w:commentRangeEnd w:id="95"/>
+      <w:ins w:id="97" w:author="Cummings, Shawn" w:date="2025-05-10T14:48:00Z" w16du:dateUtc="2025-05-10T18:48:00Z">
+        <w:r>
+          <w:rPr>
+            <w:rStyle w:val="CommentReference"/>
+          </w:rPr>
+          <w:commentReference w:id="95"/>
+        </w:r>
+        <w:commentRangeEnd w:id="96"/>
+        <w:r>
+          <w:rPr>
+            <w:rStyle w:val="CommentReference"/>
+          </w:rPr>
+          <w:commentReference w:id="96"/>
+        </w:r>
+      </w:ins>
+      <w:ins w:id="98" w:author="Cummings, Shawn" w:date="2025-05-10T14:19:00Z" w16du:dateUtc="2025-05-10T18:19:00Z">
+        <w:r>
+          <w:rPr>
+            <w:szCs w:val="22"/>
+          </w:rPr>
+          <w:t xml:space="preserve"> Thus, any initial distraction would likely</w:t>
+        </w:r>
+      </w:ins>
+      <w:ins w:id="99" w:author="Cummings, Shawn" w:date="2025-05-10T14:20:00Z" w16du:dateUtc="2025-05-10T18:20:00Z">
+        <w:r>
+          <w:rPr>
+            <w:szCs w:val="22"/>
+          </w:rPr>
+          <w:t xml:space="preserve"> atrophy over the course of testing. Analyses reported in the SI</w:t>
+        </w:r>
+      </w:ins>
+      <w:ins w:id="100" w:author="Cummings, Shawn" w:date="2025-05-10T14:21:00Z" w16du:dateUtc="2025-05-10T18:21:00Z">
+        <w:r>
+          <w:rPr>
+            <w:szCs w:val="22"/>
+          </w:rPr>
+          <w:t xml:space="preserve"> confirm that no effects emerged or interacted with testing block. </w:t>
+        </w:r>
+      </w:ins>
     </w:p>
     <w:p>
       <w:pPr>
         <w:rPr>
+          <w:ins w:id="101" w:author="Cummings, Shawn" w:date="2025-05-10T14:14:00Z" w16du:dateUtc="2025-05-10T18:14:00Z"/>
+          <w:szCs w:val="22"/>
+        </w:rPr>
+      </w:pPr>
+      <w:ins w:id="102" w:author="Cummings, Shawn" w:date="2025-05-10T14:21:00Z" w16du:dateUtc="2025-05-10T18:21:00Z">
+        <w:r>
+          <w:rPr>
+            <w:szCs w:val="22"/>
+          </w:rPr>
+          <w:t>A second</w:t>
+        </w:r>
+      </w:ins>
+      <w:ins w:id="103" w:author="Cummings, Shawn" w:date="2025-05-10T14:23:00Z" w16du:dateUtc="2025-05-10T18:23:00Z">
+        <w:r>
+          <w:rPr>
+            <w:szCs w:val="22"/>
+          </w:rPr>
+          <w:t xml:space="preserve"> </w:t>
+        </w:r>
+      </w:ins>
+      <w:ins w:id="104" w:author="Cummings, Shawn" w:date="2025-05-10T14:21:00Z" w16du:dateUtc="2025-05-10T18:21:00Z">
+        <w:r>
+          <w:rPr>
+            <w:szCs w:val="22"/>
+          </w:rPr>
+          <w:t>alternative is that while</w:t>
+        </w:r>
+      </w:ins>
+      <w:ins w:id="105" w:author="Cummings, Shawn" w:date="2025-05-10T14:22:00Z" w16du:dateUtc="2025-05-10T18:22:00Z">
+        <w:r>
+          <w:rPr>
+            <w:szCs w:val="22"/>
+          </w:rPr>
+          <w:t xml:space="preserve"> the presence of the pen </w:t>
+        </w:r>
+      </w:ins>
+      <w:ins w:id="106" w:author="Cummings, Shawn" w:date="2025-05-10T14:23:00Z" w16du:dateUtc="2025-05-10T18:23:00Z">
+        <w:r>
+          <w:rPr>
+            <w:szCs w:val="22"/>
+          </w:rPr>
+          <w:t>itself—rather than its impact on the articulators—may be sufficient to induce compensation, the black box made</w:t>
+        </w:r>
+      </w:ins>
+      <w:ins w:id="107" w:author="Cummings, Shawn" w:date="2025-05-10T14:24:00Z" w16du:dateUtc="2025-05-10T18:24:00Z">
+        <w:r>
+          <w:rPr>
+            <w:szCs w:val="22"/>
+          </w:rPr>
+          <w:t xml:space="preserve"> this presence less obvious and harder to visually access.</w:t>
+        </w:r>
+      </w:ins>
+      <w:ins w:id="108" w:author="Cummings, Shawn" w:date="2025-05-10T14:26:00Z" w16du:dateUtc="2025-05-10T18:26:00Z">
+        <w:r>
+          <w:rPr>
+            <w:szCs w:val="22"/>
+          </w:rPr>
+          <w:t xml:space="preserve"> </w:t>
+        </w:r>
+        <w:commentRangeStart w:id="109"/>
+        <w:r>
+          <w:rPr>
+            <w:szCs w:val="22"/>
+          </w:rPr>
+          <w:t xml:space="preserve">Experiment 2b addresses this concern to a limited extent, in that </w:t>
+        </w:r>
+      </w:ins>
+      <w:ins w:id="110" w:author="Cummings, Shawn" w:date="2025-05-10T14:29:00Z" w16du:dateUtc="2025-05-10T18:29:00Z">
+        <w:r>
+          <w:rPr>
+            <w:szCs w:val="22"/>
+          </w:rPr>
+          <w:t xml:space="preserve">participants explicitly confirmed awareness of the pen. However, </w:t>
+        </w:r>
+      </w:ins>
+      <w:ins w:id="111" w:author="Cummings, Shawn" w:date="2025-05-10T14:30:00Z" w16du:dateUtc="2025-05-10T18:30:00Z">
+        <w:r>
+          <w:rPr>
+            <w:szCs w:val="22"/>
+          </w:rPr>
+          <w:t xml:space="preserve">the dual-task nature of the experiment </w:t>
+        </w:r>
+        <w:r>
+          <w:rPr>
+            <w:szCs w:val="22"/>
+          </w:rPr>
+          <w:t>imposed additional</w:t>
+        </w:r>
+      </w:ins>
+      <w:ins w:id="112" w:author="Cummings, Shawn" w:date="2025-05-10T14:33:00Z" w16du:dateUtc="2025-05-10T18:33:00Z">
+        <w:r>
+          <w:rPr>
+            <w:szCs w:val="22"/>
+          </w:rPr>
+          <w:t xml:space="preserve"> and orthogonal attentional demands. </w:t>
+        </w:r>
+      </w:ins>
+      <w:commentRangeEnd w:id="109"/>
+      <w:ins w:id="113" w:author="Cummings, Shawn" w:date="2025-05-10T14:38:00Z" w16du:dateUtc="2025-05-10T18:38:00Z">
+        <w:r>
+          <w:rPr>
+            <w:rStyle w:val="CommentReference"/>
+          </w:rPr>
+          <w:commentReference w:id="109"/>
+        </w:r>
+      </w:ins>
+      <w:ins w:id="114" w:author="Cummings, Shawn" w:date="2025-05-10T14:34:00Z" w16du:dateUtc="2025-05-10T18:34:00Z">
+        <w:r>
+          <w:rPr>
+            <w:szCs w:val="22"/>
+          </w:rPr>
+          <w:t xml:space="preserve">Fruitful follow-up work could more </w:t>
+        </w:r>
+      </w:ins>
+      <w:ins w:id="115" w:author="Cummings, Shawn" w:date="2025-05-10T14:33:00Z" w16du:dateUtc="2025-05-10T18:33:00Z">
+        <w:r>
+          <w:rPr>
+            <w:szCs w:val="22"/>
+          </w:rPr>
+          <w:t xml:space="preserve">conclusively assess the role of the pen </w:t>
+        </w:r>
+        <w:r>
+          <w:rPr>
+            <w:szCs w:val="22"/>
+          </w:rPr>
+          <w:t xml:space="preserve">versus </w:t>
+        </w:r>
+      </w:ins>
+      <w:ins w:id="116" w:author="Cummings, Shawn" w:date="2025-05-10T14:34:00Z" w16du:dateUtc="2025-05-10T18:34:00Z">
+        <w:r>
+          <w:rPr>
+            <w:szCs w:val="22"/>
+          </w:rPr>
+          <w:t xml:space="preserve">its impact on the articulators by </w:t>
+        </w:r>
+        <w:r>
+          <w:rPr>
+            <w:szCs w:val="22"/>
+          </w:rPr>
+          <w:t>rem</w:t>
+        </w:r>
+      </w:ins>
+      <w:ins w:id="117" w:author="Cummings, Shawn" w:date="2025-05-10T14:35:00Z" w16du:dateUtc="2025-05-10T18:35:00Z">
+        <w:r>
+          <w:rPr>
+            <w:szCs w:val="22"/>
+          </w:rPr>
+          <w:t xml:space="preserve">oving one while sparing the other. For example, videos could be presented of pen-impacted articulation, but with the pen itself </w:t>
+        </w:r>
+      </w:ins>
+      <w:ins w:id="118" w:author="Cummings, Shawn" w:date="2025-05-10T14:36:00Z" w16du:dateUtc="2025-05-10T18:36:00Z">
+        <w:r>
+          <w:rPr>
+            <w:szCs w:val="22"/>
+          </w:rPr>
+          <w:t xml:space="preserve">removed in video post-processing. Conversely, the pen could be highlighted in front of the </w:t>
+        </w:r>
+      </w:ins>
+      <w:ins w:id="119" w:author="Cummings, Shawn" w:date="2025-05-10T14:37:00Z" w16du:dateUtc="2025-05-10T18:37:00Z">
+        <w:r>
+          <w:rPr>
+            <w:szCs w:val="22"/>
+          </w:rPr>
+          <w:t xml:space="preserve">occluder in videos of the type employed in Experiment 2, or the image of a pen could be superimposed onto videos of pen-free articulation. </w:t>
+        </w:r>
+      </w:ins>
+    </w:p>
+    <w:p>
+      <w:pPr>
+        <w:rPr>
+          <w:del w:id="120" w:author="Cummings, Shawn" w:date="2025-05-10T14:25:00Z" w16du:dateUtc="2025-05-10T18:25:00Z"/>
+          <w:szCs w:val="22"/>
+        </w:rPr>
+      </w:pPr>
+    </w:p>
+    <w:p>
+      <w:pPr>
+        <w:pStyle w:val="Heading1"/>
+        <w:rPr>
+          <w:szCs w:val="22"/>
+        </w:rPr>
+      </w:pPr>
+      <w:r>
+        <w:rPr>
+          <w:sz w:val="22"/>
+          <w:szCs w:val="22"/>
+        </w:rPr>
+        <w:t>General Discussion</w:t>
+      </w:r>
+    </w:p>
+    <w:p>
+      <w:pPr>
+        <w:rPr>
           <w:szCs w:val="22"/>
         </w:rPr>
       </w:pPr>
@@ -20493,14 +21085,7 @@
         <w:rPr>
           <w:szCs w:val="22"/>
         </w:rPr>
-        <w:t xml:space="preserve"> a talker’s lips exhibit a certain shape, as long as (1) they do, and (2) plausibly </w:t>
-      </w:r>
-      <w:r>
-        <w:rPr>
-          <w:szCs w:val="22"/>
-        </w:rPr>
-        <w:lastRenderedPageBreak/>
-        <w:t xml:space="preserve">do so for </w:t>
+        <w:t xml:space="preserve"> a talker’s lips exhibit a certain shape, as long as (1) they do, and (2) plausibly do so for </w:t>
       </w:r>
       <w:r>
         <w:rPr>
@@ -20526,6 +21111,7 @@
         <w:rPr>
           <w:szCs w:val="22"/>
         </w:rPr>
+        <w:lastRenderedPageBreak/>
         <w:t>The results of Experiment 2—the absence of compensation in the absence of direct visual evidence that lip shape was indeed affected by the pen—</w:t>
       </w:r>
       <w:r>
@@ -20615,7 +21201,7 @@
         </w:rPr>
         <w:t>results raise questions for future research on perceptual recalibration. Previous work has found that perceptual recalibration to an unfamiliar talker’s speech can be blocked when the unexpected pronunciations occur while the talker has a pen in the mouth. In perceptual recalibration experiments, listeners are exp</w:t>
       </w:r>
-      <w:ins w:id="53" w:author="Cummings, Shawn" w:date="2025-05-08T22:40:00Z" w16du:dateUtc="2025-05-09T02:40:00Z">
+      <w:ins w:id="121" w:author="Cummings, Shawn" w:date="2025-05-08T22:40:00Z" w16du:dateUtc="2025-05-09T02:40:00Z">
         <w:r>
           <w:rPr>
             <w:szCs w:val="22"/>
@@ -20623,7 +21209,7 @@
           <w:t>osed</w:t>
         </w:r>
       </w:ins>
-      <w:del w:id="54" w:author="Cummings, Shawn" w:date="2025-05-08T22:40:00Z" w16du:dateUtc="2025-05-09T02:40:00Z">
+      <w:del w:id="122" w:author="Cummings, Shawn" w:date="2025-05-08T22:40:00Z" w16du:dateUtc="2025-05-09T02:40:00Z">
         <w:r>
           <w:rPr>
             <w:szCs w:val="22"/>
@@ -20726,7 +21312,6 @@
           <w:iCs/>
           <w:szCs w:val="22"/>
         </w:rPr>
-        <w:lastRenderedPageBreak/>
         <w:t>ma</w:t>
       </w:r>
       <w:r>
@@ -20774,7 +21359,14 @@
         <w:rPr>
           <w:szCs w:val="22"/>
         </w:rPr>
-        <w:t>mixed with many filler stimuli. Following exposure, listeners were tested on an audio-only</w:t>
+        <w:t xml:space="preserve">mixed with many filler stimuli. Following exposure, listeners were </w:t>
+      </w:r>
+      <w:r>
+        <w:rPr>
+          <w:szCs w:val="22"/>
+        </w:rPr>
+        <w:lastRenderedPageBreak/>
+        <w:t>tested on an audio-only</w:t>
       </w:r>
       <w:r>
         <w:rPr>
@@ -21365,14 +21957,7 @@
         <w:rPr>
           <w:szCs w:val="22"/>
         </w:rPr>
-        <w:t xml:space="preserve">-biased exposure because it makes the critical </w:t>
-      </w:r>
-      <w:r>
-        <w:rPr>
-          <w:szCs w:val="22"/>
-        </w:rPr>
-        <w:lastRenderedPageBreak/>
-        <w:t xml:space="preserve">recordings sound shifted </w:t>
+        <w:t xml:space="preserve">-biased exposure because it makes the critical recordings sound shifted </w:t>
       </w:r>
       <w:r>
         <w:rPr>
@@ -21398,7 +21983,14 @@
         <w:rPr>
           <w:szCs w:val="22"/>
         </w:rPr>
-        <w:t>. We consider this an interesting possibility to be explored in future research.</w:t>
+        <w:t xml:space="preserve">. We consider this an interesting possibility </w:t>
+      </w:r>
+      <w:r>
+        <w:rPr>
+          <w:szCs w:val="22"/>
+        </w:rPr>
+        <w:lastRenderedPageBreak/>
+        <w:t>to be explored in future research.</w:t>
       </w:r>
     </w:p>
     <w:p>
@@ -24008,7 +24600,7 @@
       </w:r>
     </w:p>
   </w:comment>
-  <w:comment w:id="49" w:author="Cummings, Shawn" w:date="2025-05-09T14:29:00Z" w:initials="SC">
+  <w:comment w:id="95" w:author="Cummings, Shawn" w:date="2025-05-10T14:48:00Z" w:initials="SC">
     <w:p>
       <w:pPr>
         <w:jc w:val="left"/>
@@ -24020,7 +24612,39 @@
         <w:annotationRef/>
       </w:r>
       <w:r>
-        <w:t>Mention inspiration from VS16 somewhere!</w:t>
+        <w:t>We can’t say anything stronger than this— the box indeed wasn’t centered on the same place in the frame between videos (but was pretty close), and wasn’t exactly the same size</w:t>
+      </w:r>
+    </w:p>
+  </w:comment>
+  <w:comment w:id="96" w:author="Cummings, Shawn" w:date="2025-05-10T14:48:00Z" w:initials="SC">
+    <w:p>
+      <w:pPr>
+        <w:jc w:val="left"/>
+      </w:pPr>
+      <w:r>
+        <w:rPr>
+          <w:rStyle w:val="CommentReference"/>
+        </w:rPr>
+        <w:annotationRef/>
+      </w:r>
+      <w:r>
+        <w:t>Happy to include some of these details here or in SI if we think anyone will care? They also can see the videos</w:t>
+      </w:r>
+    </w:p>
+  </w:comment>
+  <w:comment w:id="109" w:author="Cummings, Shawn" w:date="2025-05-10T14:38:00Z" w:initials="SC">
+    <w:p>
+      <w:pPr>
+        <w:jc w:val="left"/>
+      </w:pPr>
+      <w:r>
+        <w:rPr>
+          <w:rStyle w:val="CommentReference"/>
+        </w:rPr>
+        <w:annotationRef/>
+      </w:r>
+      <w:r>
+        <w:t>How would we feel about elevating 2B to main text, given we have the space and it is of interest to this point?</w:t>
       </w:r>
     </w:p>
   </w:comment>
@@ -24033,7 +24657,9 @@
   <w15:commentEx w15:paraId="5B928638" w15:done="0"/>
   <w15:commentEx w15:paraId="09066744" w15:paraIdParent="5B928638" w15:done="0"/>
   <w15:commentEx w15:paraId="6784E010" w15:done="0"/>
-  <w15:commentEx w15:paraId="47F63844" w15:done="0"/>
+  <w15:commentEx w15:paraId="5EF04D88" w15:done="0"/>
+  <w15:commentEx w15:paraId="0E385131" w15:paraIdParent="5EF04D88" w15:done="0"/>
+  <w15:commentEx w15:paraId="4E01394A" w15:done="0"/>
 </w15:commentsEx>
 </file>
 
@@ -24043,7 +24669,9 @@
   <w16cex:commentExtensible w16cex:durableId="7FA83320" w16cex:dateUtc="2025-05-09T16:59:00Z"/>
   <w16cex:commentExtensible w16cex:durableId="68397BDD" w16cex:dateUtc="2025-05-09T17:12:00Z"/>
   <w16cex:commentExtensible w16cex:durableId="3E19854B" w16cex:dateUtc="2025-05-09T02:44:00Z"/>
-  <w16cex:commentExtensible w16cex:durableId="3FF6367C" w16cex:dateUtc="2025-05-09T18:29:00Z"/>
+  <w16cex:commentExtensible w16cex:durableId="767D0C05" w16cex:dateUtc="2025-05-10T18:48:00Z"/>
+  <w16cex:commentExtensible w16cex:durableId="634EF7E0" w16cex:dateUtc="2025-05-10T18:48:00Z"/>
+  <w16cex:commentExtensible w16cex:durableId="1023DC09" w16cex:dateUtc="2025-05-10T18:38:00Z"/>
 </w16cex:commentsExtensible>
 </file>
 
@@ -24053,7 +24681,9 @@
   <w16cid:commentId w16cid:paraId="5B928638" w16cid:durableId="7FA83320"/>
   <w16cid:commentId w16cid:paraId="09066744" w16cid:durableId="68397BDD"/>
   <w16cid:commentId w16cid:paraId="6784E010" w16cid:durableId="3E19854B"/>
-  <w16cid:commentId w16cid:paraId="47F63844" w16cid:durableId="3FF6367C"/>
+  <w16cid:commentId w16cid:paraId="5EF04D88" w16cid:durableId="767D0C05"/>
+  <w16cid:commentId w16cid:paraId="0E385131" w16cid:durableId="634EF7E0"/>
+  <w16cid:commentId w16cid:paraId="4E01394A" w16cid:durableId="1023DC09"/>
 </w16cid:commentsIds>
 </file>
 
@@ -29631,7 +30261,7 @@
   <w:style w:type="paragraph" w:default="1" w:styleId="Normal">
     <w:name w:val="Normal"/>
     <w:qFormat/>
-    <w:rsid w:val="00303033"/>
+    <w:rsid w:val="005A6A78"/>
     <w:pPr>
       <w:widowControl w:val="0"/>
       <w:autoSpaceDE w:val="0"/>
@@ -29687,7 +30317,6 @@
   <w:style w:type="character" w:default="1" w:styleId="DefaultParagraphFont">
     <w:name w:val="Default Paragraph Font"/>
     <w:uiPriority w:val="1"/>
-    <w:semiHidden/>
     <w:unhideWhenUsed/>
   </w:style>
   <w:style w:type="table" w:default="1" w:styleId="TableNormal">

</xml_diff>

<commit_message>
Replying to some comments
</commit_message>
<xml_diff>
--- a/output/papers/Round 2/manuscript-brief.docx
+++ b/output/papers/Round 2/manuscript-brief.docx
@@ -23306,7 +23306,8 @@
         <w:t xml:space="preserve"> </w:t>
       </w:r>
       <w:commentRangeStart w:id="323"/>
-      <w:ins w:id="324" w:author="Jaeger, Florian" w:date="2025-05-10T16:14:00Z" w16du:dateUtc="2025-05-10T20:14:00Z">
+      <w:commentRangeStart w:id="324"/>
+      <w:ins w:id="325" w:author="Jaeger, Florian" w:date="2025-05-10T16:14:00Z" w16du:dateUtc="2025-05-10T20:14:00Z">
         <w:r>
           <w:rPr>
             <w:szCs w:val="22"/>
@@ -23314,7 +23315,7 @@
           <w:t xml:space="preserve">For instance, Kraljic et al. (2008) </w:t>
         </w:r>
       </w:ins>
-      <w:ins w:id="325" w:author="Jaeger, Florian" w:date="2025-05-10T16:17:00Z" w16du:dateUtc="2025-05-10T20:17:00Z">
+      <w:ins w:id="326" w:author="Jaeger, Florian" w:date="2025-05-10T16:17:00Z" w16du:dateUtc="2025-05-10T20:17:00Z">
         <w:r>
           <w:rPr>
             <w:szCs w:val="22"/>
@@ -23322,7 +23323,7 @@
           <w:t xml:space="preserve">attributing the blocking effect to “pragmatic” reasoning that prevents perceptual learning for </w:t>
         </w:r>
       </w:ins>
-      <w:ins w:id="326" w:author="Jaeger, Florian" w:date="2025-05-10T16:19:00Z" w16du:dateUtc="2025-05-10T20:19:00Z">
+      <w:ins w:id="327" w:author="Jaeger, Florian" w:date="2025-05-10T16:19:00Z" w16du:dateUtc="2025-05-10T20:19:00Z">
         <w:r>
           <w:rPr>
             <w:szCs w:val="22"/>
@@ -23330,7 +23331,7 @@
           <w:t>“</w:t>
         </w:r>
       </w:ins>
-      <w:ins w:id="327" w:author="Jaeger, Florian" w:date="2025-05-10T16:18:00Z" w16du:dateUtc="2025-05-10T20:18:00Z">
+      <w:ins w:id="328" w:author="Jaeger, Florian" w:date="2025-05-10T16:18:00Z" w16du:dateUtc="2025-05-10T20:18:00Z">
         <w:r>
           <w:rPr>
             <w:szCs w:val="22"/>
@@ -23338,7 +23339,7 @@
           <w:t>incidental</w:t>
         </w:r>
       </w:ins>
-      <w:ins w:id="328" w:author="Jaeger, Florian" w:date="2025-05-10T16:20:00Z" w16du:dateUtc="2025-05-10T20:20:00Z">
+      <w:ins w:id="329" w:author="Jaeger, Florian" w:date="2025-05-10T16:20:00Z" w16du:dateUtc="2025-05-10T20:20:00Z">
         <w:r>
           <w:rPr>
             <w:szCs w:val="22"/>
@@ -23346,7 +23347,7 @@
           <w:t>”</w:t>
         </w:r>
       </w:ins>
-      <w:ins w:id="329" w:author="Jaeger, Florian" w:date="2025-05-10T16:18:00Z" w16du:dateUtc="2025-05-10T20:18:00Z">
+      <w:ins w:id="330" w:author="Jaeger, Florian" w:date="2025-05-10T16:18:00Z" w16du:dateUtc="2025-05-10T20:18:00Z">
         <w:r>
           <w:rPr>
             <w:szCs w:val="22"/>
@@ -23354,7 +23355,7 @@
           <w:t xml:space="preserve"> </w:t>
         </w:r>
       </w:ins>
-      <w:ins w:id="330" w:author="Jaeger, Florian" w:date="2025-05-10T16:19:00Z" w16du:dateUtc="2025-05-10T20:19:00Z">
+      <w:ins w:id="331" w:author="Jaeger, Florian" w:date="2025-05-10T16:19:00Z" w16du:dateUtc="2025-05-10T20:19:00Z">
         <w:r>
           <w:rPr>
             <w:szCs w:val="22"/>
@@ -23362,7 +23363,7 @@
           <w:t>changes in pronunciation</w:t>
         </w:r>
       </w:ins>
-      <w:ins w:id="331" w:author="Jaeger, Florian" w:date="2025-05-10T16:18:00Z" w16du:dateUtc="2025-05-10T20:18:00Z">
+      <w:ins w:id="332" w:author="Jaeger, Florian" w:date="2025-05-10T16:18:00Z" w16du:dateUtc="2025-05-10T20:18:00Z">
         <w:r>
           <w:rPr>
             <w:szCs w:val="22"/>
@@ -23370,7 +23371,7 @@
           <w:t xml:space="preserve">—like </w:t>
         </w:r>
       </w:ins>
-      <w:ins w:id="332" w:author="Jaeger, Florian" w:date="2025-05-10T16:19:00Z" w16du:dateUtc="2025-05-10T20:19:00Z">
+      <w:ins w:id="333" w:author="Jaeger, Florian" w:date="2025-05-10T16:19:00Z" w16du:dateUtc="2025-05-10T20:19:00Z">
         <w:r>
           <w:rPr>
             <w:szCs w:val="22"/>
@@ -23378,7 +23379,7 @@
           <w:t xml:space="preserve">those arising </w:t>
         </w:r>
       </w:ins>
-      <w:ins w:id="333" w:author="Jaeger, Florian" w:date="2025-05-10T16:18:00Z" w16du:dateUtc="2025-05-10T20:18:00Z">
+      <w:ins w:id="334" w:author="Jaeger, Florian" w:date="2025-05-10T16:18:00Z" w16du:dateUtc="2025-05-10T20:18:00Z">
         <w:r>
           <w:rPr>
             <w:szCs w:val="22"/>
@@ -23386,7 +23387,7 @@
           <w:t>a pen is in the mouth</w:t>
         </w:r>
       </w:ins>
-      <w:ins w:id="334" w:author="Jaeger, Florian" w:date="2025-05-10T16:20:00Z" w16du:dateUtc="2025-05-10T20:20:00Z">
+      <w:ins w:id="335" w:author="Jaeger, Florian" w:date="2025-05-10T16:20:00Z" w16du:dateUtc="2025-05-10T20:20:00Z">
         <w:r>
           <w:rPr>
             <w:szCs w:val="22"/>
@@ -23394,7 +23395,7 @@
           <w:t xml:space="preserve">—while allowing perceptual learning for changes that are considered “characteristic” of the talker’s speech. </w:t>
         </w:r>
       </w:ins>
-      <w:ins w:id="335" w:author="Jaeger, Florian" w:date="2025-05-10T16:21:00Z" w16du:dateUtc="2025-05-10T20:21:00Z">
+      <w:ins w:id="336" w:author="Jaeger, Florian" w:date="2025-05-10T16:21:00Z" w16du:dateUtc="2025-05-10T20:21:00Z">
         <w:r>
           <w:rPr>
             <w:szCs w:val="22"/>
@@ -23402,7 +23403,7 @@
           <w:t xml:space="preserve">Based on a series of new experiments, </w:t>
         </w:r>
       </w:ins>
-      <w:ins w:id="336" w:author="Jaeger, Florian" w:date="2025-05-10T16:20:00Z" w16du:dateUtc="2025-05-10T20:20:00Z">
+      <w:ins w:id="337" w:author="Jaeger, Florian" w:date="2025-05-10T16:20:00Z" w16du:dateUtc="2025-05-10T20:20:00Z">
         <w:r>
           <w:rPr>
             <w:szCs w:val="22"/>
@@ -23410,7 +23411,7 @@
           <w:t>Kraljic and Samuel (2011) revised this account</w:t>
         </w:r>
       </w:ins>
-      <w:ins w:id="337" w:author="Jaeger, Florian" w:date="2025-05-10T16:21:00Z" w16du:dateUtc="2025-05-10T20:21:00Z">
+      <w:ins w:id="338" w:author="Jaeger, Florian" w:date="2025-05-10T16:21:00Z" w16du:dateUtc="2025-05-10T20:21:00Z">
         <w:r>
           <w:rPr>
             <w:szCs w:val="22"/>
@@ -23418,7 +23419,7 @@
           <w:t>, suggesting instead that audiovisual inputs with a pen in the mouth are stored as separate exemplars that do not affect l</w:t>
         </w:r>
       </w:ins>
-      <w:ins w:id="338" w:author="Jaeger, Florian" w:date="2025-05-10T16:22:00Z" w16du:dateUtc="2025-05-10T20:22:00Z">
+      <w:ins w:id="339" w:author="Jaeger, Florian" w:date="2025-05-10T16:22:00Z" w16du:dateUtc="2025-05-10T20:22:00Z">
         <w:r>
           <w:rPr>
             <w:szCs w:val="22"/>
@@ -23426,7 +23427,7 @@
           <w:t>isteners’ categorization decisions for audio-only speech inputs</w:t>
         </w:r>
       </w:ins>
-      <w:ins w:id="339" w:author="Jaeger, Florian" w:date="2025-05-10T16:23:00Z" w16du:dateUtc="2025-05-10T20:23:00Z">
+      <w:ins w:id="340" w:author="Jaeger, Florian" w:date="2025-05-10T16:23:00Z" w16du:dateUtc="2025-05-10T20:23:00Z">
         <w:r>
           <w:rPr>
             <w:szCs w:val="22"/>
@@ -23448,7 +23449,7 @@
           <w:t xml:space="preserve"> perceptual recalibration experiments on this question to date. </w:t>
         </w:r>
       </w:ins>
-      <w:ins w:id="340" w:author="Jaeger, Florian" w:date="2025-05-10T16:33:00Z" w16du:dateUtc="2025-05-10T20:33:00Z">
+      <w:ins w:id="341" w:author="Jaeger, Florian" w:date="2025-05-10T16:33:00Z" w16du:dateUtc="2025-05-10T20:33:00Z">
         <w:r>
           <w:rPr>
             <w:szCs w:val="22"/>
@@ -23456,7 +23457,7 @@
           <w:t>However, based on additional experiments</w:t>
         </w:r>
       </w:ins>
-      <w:ins w:id="341" w:author="Jaeger, Florian" w:date="2025-05-10T16:23:00Z" w16du:dateUtc="2025-05-10T20:23:00Z">
+      <w:ins w:id="342" w:author="Jaeger, Florian" w:date="2025-05-10T16:23:00Z" w16du:dateUtc="2025-05-10T20:23:00Z">
         <w:r>
           <w:rPr>
             <w:szCs w:val="22"/>
@@ -23464,7 +23465,7 @@
           <w:t>, Liu and Jaeger (2018) argued t</w:t>
         </w:r>
       </w:ins>
-      <w:ins w:id="342" w:author="Jaeger, Florian" w:date="2025-05-10T16:24:00Z" w16du:dateUtc="2025-05-10T20:24:00Z">
+      <w:ins w:id="343" w:author="Jaeger, Florian" w:date="2025-05-10T16:24:00Z" w16du:dateUtc="2025-05-10T20:24:00Z">
         <w:r>
           <w:rPr>
             <w:szCs w:val="22"/>
@@ -23472,7 +23473,7 @@
           <w:t>hat the existing data were, in fact, more compatible with an account more along the lines of the original proposal by Kraljic et al. (2008)</w:t>
         </w:r>
       </w:ins>
-      <w:ins w:id="343" w:author="Jaeger, Florian" w:date="2025-05-10T16:32:00Z" w16du:dateUtc="2025-05-10T20:32:00Z">
+      <w:ins w:id="344" w:author="Jaeger, Florian" w:date="2025-05-10T16:32:00Z" w16du:dateUtc="2025-05-10T20:32:00Z">
         <w:r>
           <w:rPr>
             <w:szCs w:val="22"/>
@@ -23495,37 +23496,46 @@
         </w:r>
       </w:ins>
       <w:commentRangeEnd w:id="323"/>
-      <w:ins w:id="344" w:author="Jaeger, Florian" w:date="2025-05-10T16:40:00Z" w16du:dateUtc="2025-05-10T20:40:00Z">
+      <w:ins w:id="345" w:author="Jaeger, Florian" w:date="2025-05-10T16:40:00Z" w16du:dateUtc="2025-05-10T20:40:00Z">
         <w:r>
           <w:rPr>
             <w:rStyle w:val="CommentReference"/>
           </w:rPr>
           <w:commentReference w:id="323"/>
         </w:r>
+      </w:ins>
+      <w:commentRangeEnd w:id="324"/>
+      <w:r>
+        <w:rPr>
+          <w:rStyle w:val="CommentReference"/>
+        </w:rPr>
+        <w:commentReference w:id="324"/>
+      </w:r>
+      <w:ins w:id="346" w:author="Jaeger, Florian" w:date="2025-05-10T16:40:00Z" w16du:dateUtc="2025-05-10T20:40:00Z">
         <w:r>
           <w:rPr>
             <w:szCs w:val="22"/>
           </w:rPr>
           <w:t xml:space="preserve"> While some of these accounts (in particular the causal inference account) have conceptual similarities to </w:t>
-        </w:r>
-      </w:ins>
-      <w:ins w:id="345" w:author="Jaeger, Florian" w:date="2025-05-10T16:41:00Z" w16du:dateUtc="2025-05-10T20:41:00Z">
-        <w:r>
-          <w:rPr>
-            <w:szCs w:val="22"/>
-          </w:rPr>
-          <w:t xml:space="preserve">compensation, previously offered explanations of the blocking effect </w:t>
-        </w:r>
-      </w:ins>
-      <w:ins w:id="346" w:author="Jaeger, Florian" w:date="2025-05-10T16:42:00Z" w16du:dateUtc="2025-05-10T20:42:00Z">
-        <w:r>
-          <w:rPr>
-            <w:szCs w:val="22"/>
-          </w:rPr>
-          <w:t xml:space="preserve">share that they </w:t>
         </w:r>
       </w:ins>
       <w:ins w:id="347" w:author="Jaeger, Florian" w:date="2025-05-10T16:41:00Z" w16du:dateUtc="2025-05-10T20:41:00Z">
+        <w:r>
+          <w:rPr>
+            <w:szCs w:val="22"/>
+          </w:rPr>
+          <w:t xml:space="preserve">compensation, previously offered explanations of the blocking effect </w:t>
+        </w:r>
+      </w:ins>
+      <w:ins w:id="348" w:author="Jaeger, Florian" w:date="2025-05-10T16:42:00Z" w16du:dateUtc="2025-05-10T20:42:00Z">
+        <w:r>
+          <w:rPr>
+            <w:szCs w:val="22"/>
+          </w:rPr>
+          <w:t xml:space="preserve">share that they </w:t>
+        </w:r>
+      </w:ins>
+      <w:ins w:id="349" w:author="Jaeger, Florian" w:date="2025-05-10T16:41:00Z" w16du:dateUtc="2025-05-10T20:41:00Z">
         <w:r>
           <w:rPr>
             <w:szCs w:val="22"/>
@@ -23574,7 +23584,7 @@
         </w:rPr>
         <w:t xml:space="preserve">The results of </w:t>
       </w:r>
-      <w:del w:id="348" w:author="Cummings, Shawn" w:date="2025-05-11T12:35:00Z" w16du:dateUtc="2025-05-11T16:35:00Z">
+      <w:del w:id="350" w:author="Cummings, Shawn" w:date="2025-05-11T12:35:00Z" w16du:dateUtc="2025-05-11T16:35:00Z">
         <w:r>
           <w:rPr>
             <w:szCs w:val="22"/>
@@ -23582,7 +23592,7 @@
           <w:delText>Experiments</w:delText>
         </w:r>
       </w:del>
-      <w:ins w:id="349" w:author="Jaeger, Florian" w:date="2025-05-10T16:25:00Z" w16du:dateUtc="2025-05-10T20:25:00Z">
+      <w:ins w:id="351" w:author="Jaeger, Florian" w:date="2025-05-10T16:25:00Z" w16du:dateUtc="2025-05-10T20:25:00Z">
         <w:r>
           <w:rPr>
             <w:szCs w:val="22"/>
@@ -23590,7 +23600,7 @@
           <w:t>our e</w:t>
         </w:r>
       </w:ins>
-      <w:del w:id="350" w:author="Jaeger, Florian" w:date="2025-05-10T16:25:00Z" w16du:dateUtc="2025-05-10T20:25:00Z">
+      <w:del w:id="352" w:author="Jaeger, Florian" w:date="2025-05-10T16:25:00Z" w16du:dateUtc="2025-05-10T20:25:00Z">
         <w:r>
           <w:rPr>
             <w:szCs w:val="22"/>
@@ -23598,7 +23608,7 @@
           <w:delText>E</w:delText>
         </w:r>
       </w:del>
-      <w:ins w:id="351" w:author="Cummings, Shawn" w:date="2025-05-11T12:35:00Z" w16du:dateUtc="2025-05-11T16:35:00Z">
+      <w:ins w:id="353" w:author="Cummings, Shawn" w:date="2025-05-11T12:35:00Z" w16du:dateUtc="2025-05-11T16:35:00Z">
         <w:r>
           <w:rPr>
             <w:szCs w:val="22"/>
@@ -23606,46 +23616,12 @@
           <w:t>xperiment</w:t>
         </w:r>
       </w:ins>
-      <w:ins w:id="352" w:author="Jaeger, Florian" w:date="2025-05-10T16:25:00Z" w16du:dateUtc="2025-05-10T20:25:00Z">
+      <w:ins w:id="354" w:author="Jaeger, Florian" w:date="2025-05-10T16:25:00Z" w16du:dateUtc="2025-05-10T20:25:00Z">
         <w:r>
           <w:rPr>
             <w:szCs w:val="22"/>
           </w:rPr>
           <w:t>s</w:t>
-        </w:r>
-      </w:ins>
-      <w:del w:id="353" w:author="Jaeger, Florian" w:date="2025-05-10T16:25:00Z" w16du:dateUtc="2025-05-10T20:25:00Z">
-        <w:r>
-          <w:rPr>
-            <w:szCs w:val="22"/>
-          </w:rPr>
-          <w:delText>s 1a-c</w:delText>
-        </w:r>
-      </w:del>
-      <w:r>
-        <w:rPr>
-          <w:szCs w:val="22"/>
-        </w:rPr>
-        <w:t xml:space="preserve"> </w:t>
-      </w:r>
-      <w:r>
-        <w:rPr>
-          <w:szCs w:val="22"/>
-        </w:rPr>
-        <w:t>raise the possibility</w:t>
-      </w:r>
-      <w:r>
-        <w:rPr>
-          <w:szCs w:val="22"/>
-        </w:rPr>
-        <w:t xml:space="preserve"> </w:t>
-      </w:r>
-      <w:ins w:id="354" w:author="Jaeger, Florian" w:date="2025-05-10T16:25:00Z" w16du:dateUtc="2025-05-10T20:25:00Z">
-        <w:r>
-          <w:rPr>
-            <w:szCs w:val="22"/>
-          </w:rPr>
-          <w:t>of another, qualitatively different, explanation:</w:t>
         </w:r>
       </w:ins>
       <w:del w:id="355" w:author="Jaeger, Florian" w:date="2025-05-10T16:25:00Z" w16du:dateUtc="2025-05-10T20:25:00Z">
@@ -23653,6 +23629,40 @@
           <w:rPr>
             <w:szCs w:val="22"/>
           </w:rPr>
+          <w:delText>s 1a-c</w:delText>
+        </w:r>
+      </w:del>
+      <w:r>
+        <w:rPr>
+          <w:szCs w:val="22"/>
+        </w:rPr>
+        <w:t xml:space="preserve"> </w:t>
+      </w:r>
+      <w:r>
+        <w:rPr>
+          <w:szCs w:val="22"/>
+        </w:rPr>
+        <w:t>raise the possibility</w:t>
+      </w:r>
+      <w:r>
+        <w:rPr>
+          <w:szCs w:val="22"/>
+        </w:rPr>
+        <w:t xml:space="preserve"> </w:t>
+      </w:r>
+      <w:ins w:id="356" w:author="Jaeger, Florian" w:date="2025-05-10T16:25:00Z" w16du:dateUtc="2025-05-10T20:25:00Z">
+        <w:r>
+          <w:rPr>
+            <w:szCs w:val="22"/>
+          </w:rPr>
+          <w:t>of another, qualitatively different, explanation:</w:t>
+        </w:r>
+      </w:ins>
+      <w:del w:id="357" w:author="Jaeger, Florian" w:date="2025-05-10T16:25:00Z" w16du:dateUtc="2025-05-10T20:25:00Z">
+        <w:r>
+          <w:rPr>
+            <w:szCs w:val="22"/>
+          </w:rPr>
           <w:delText>that</w:delText>
         </w:r>
       </w:del>
@@ -23682,7 +23692,7 @@
         </w:rPr>
         <w:t xml:space="preserve"> for the pen in the mouth during exposure.</w:t>
       </w:r>
-      <w:ins w:id="356" w:author="Cummings, Shawn" w:date="2025-05-11T12:35:00Z" w16du:dateUtc="2025-05-11T16:35:00Z">
+      <w:ins w:id="358" w:author="Cummings, Shawn" w:date="2025-05-11T12:35:00Z" w16du:dateUtc="2025-05-11T16:35:00Z">
         <w:r>
           <w:rPr>
             <w:szCs w:val="22"/>
@@ -23690,7 +23700,7 @@
           <w:t xml:space="preserve"> </w:t>
         </w:r>
       </w:ins>
-      <w:ins w:id="357" w:author="Jaeger, Florian" w:date="2025-05-10T16:43:00Z" w16du:dateUtc="2025-05-10T20:43:00Z">
+      <w:ins w:id="359" w:author="Jaeger, Florian" w:date="2025-05-10T16:43:00Z" w16du:dateUtc="2025-05-10T20:43:00Z">
         <w:r>
           <w:rPr>
             <w:szCs w:val="22"/>
@@ -23981,28 +23991,12 @@
         </w:rPr>
         <w:t xml:space="preserve">. </w:t>
       </w:r>
-      <w:del w:id="358" w:author="Cummings, Shawn" w:date="2025-05-11T12:35:00Z" w16du:dateUtc="2025-05-11T16:35:00Z">
+      <w:del w:id="360" w:author="Cummings, Shawn" w:date="2025-05-11T12:35:00Z" w16du:dateUtc="2025-05-11T16:35:00Z">
         <w:r>
           <w:rPr>
             <w:szCs w:val="22"/>
           </w:rPr>
           <w:delText>We consider this an interesting possibility</w:delText>
-        </w:r>
-      </w:del>
-      <w:ins w:id="359" w:author="Jaeger, Florian" w:date="2025-05-10T16:12:00Z" w16du:dateUtc="2025-05-10T20:12:00Z">
-        <w:r>
-          <w:rPr>
-            <w:szCs w:val="22"/>
-          </w:rPr>
-          <w:t xml:space="preserve">If an explanation along these lines turns out to be </w:t>
-        </w:r>
-      </w:ins>
-      <w:del w:id="360" w:author="Cummings, Shawn" w:date="2025-05-11T12:35:00Z" w16du:dateUtc="2025-05-11T16:35:00Z">
-        <w:r>
-          <w:rPr>
-            <w:szCs w:val="22"/>
-          </w:rPr>
-          <w:delText>explored in future research.</w:delText>
         </w:r>
       </w:del>
       <w:ins w:id="361" w:author="Jaeger, Florian" w:date="2025-05-10T16:12:00Z" w16du:dateUtc="2025-05-10T20:12:00Z">
@@ -24010,10 +24004,26 @@
           <w:rPr>
             <w:szCs w:val="22"/>
           </w:rPr>
+          <w:t xml:space="preserve">If an explanation along these lines turns out to be </w:t>
+        </w:r>
+      </w:ins>
+      <w:del w:id="362" w:author="Cummings, Shawn" w:date="2025-05-11T12:35:00Z" w16du:dateUtc="2025-05-11T16:35:00Z">
+        <w:r>
+          <w:rPr>
+            <w:szCs w:val="22"/>
+          </w:rPr>
+          <w:delText>explored in future research.</w:delText>
+        </w:r>
+      </w:del>
+      <w:ins w:id="363" w:author="Jaeger, Florian" w:date="2025-05-10T16:12:00Z" w16du:dateUtc="2025-05-10T20:12:00Z">
+        <w:r>
+          <w:rPr>
+            <w:szCs w:val="22"/>
+          </w:rPr>
           <w:t xml:space="preserve">correct, this would also </w:t>
         </w:r>
       </w:ins>
-      <w:ins w:id="362" w:author="Jaeger, Florian" w:date="2025-05-10T16:13:00Z" w16du:dateUtc="2025-05-10T20:13:00Z">
+      <w:ins w:id="364" w:author="Jaeger, Florian" w:date="2025-05-10T16:13:00Z" w16du:dateUtc="2025-05-10T20:13:00Z">
         <w:r>
           <w:rPr>
             <w:szCs w:val="22"/>
@@ -24021,7 +24031,7 @@
           <w:t xml:space="preserve">preempt the need to evoke memory (Kraljic &amp; Samuel, 2011) or learning </w:t>
         </w:r>
       </w:ins>
-      <w:ins w:id="363" w:author="Jaeger, Florian" w:date="2025-05-10T16:14:00Z" w16du:dateUtc="2025-05-10T20:14:00Z">
+      <w:ins w:id="365" w:author="Jaeger, Florian" w:date="2025-05-10T16:14:00Z" w16du:dateUtc="2025-05-10T20:14:00Z">
         <w:r>
           <w:rPr>
             <w:szCs w:val="22"/>
@@ -24029,7 +24039,7 @@
           <w:t>mechanisms (Kraljic et al., 2008).</w:t>
         </w:r>
       </w:ins>
-      <w:ins w:id="364" w:author="Jaeger, Florian" w:date="2025-05-10T16:41:00Z" w16du:dateUtc="2025-05-10T20:41:00Z">
+      <w:ins w:id="366" w:author="Jaeger, Florian" w:date="2025-05-10T16:41:00Z" w16du:dateUtc="2025-05-10T20:41:00Z">
         <w:r>
           <w:rPr>
             <w:szCs w:val="22"/>
@@ -24037,7 +24047,7 @@
           <w:t xml:space="preserve"> </w:t>
         </w:r>
       </w:ins>
-      <w:ins w:id="365" w:author="Cummings, Shawn" w:date="2025-05-11T12:35:00Z" w16du:dateUtc="2025-05-11T16:35:00Z">
+      <w:ins w:id="367" w:author="Cummings, Shawn" w:date="2025-05-11T12:35:00Z" w16du:dateUtc="2025-05-11T16:35:00Z">
         <w:r>
           <w:rPr>
             <w:szCs w:val="22"/>
@@ -26876,6 +26886,22 @@
           <w:color w:val="000000"/>
         </w:rPr>
         <w:t>This could also be kept for the NEXT paper instead? What do you think?</w:t>
+      </w:r>
+    </w:p>
+  </w:comment>
+  <w:comment w:id="324" w:author="Cummings, Shawn" w:date="2025-05-11T12:41:00Z" w:initials="SC">
+    <w:p>
+      <w:pPr>
+        <w:jc w:val="left"/>
+      </w:pPr>
+      <w:r>
+        <w:rPr>
+          <w:rStyle w:val="CommentReference"/>
+        </w:rPr>
+        <w:annotationRef/>
+      </w:r>
+      <w:r>
+        <w:t>I don’t mind it here, especially since R2 seemed receptive to this direction! And I think no real harm done by double-dipping and using this discussion as the intro in the next one</w:t>
       </w:r>
     </w:p>
   </w:comment>
@@ -26900,6 +26926,7 @@
   <w15:commentEx w15:paraId="0E385131" w15:paraIdParent="5EF04D88" w15:done="0"/>
   <w15:commentEx w15:paraId="4E01394A" w15:done="0"/>
   <w15:commentEx w15:paraId="30E70483" w15:done="0"/>
+  <w15:commentEx w15:paraId="090E90E6" w15:paraIdParent="30E70483" w15:done="0"/>
 </w15:commentsEx>
 </file>
 
@@ -26921,6 +26948,7 @@
   <w16cex:commentExtensible w16cex:durableId="634EF7E0" w16cex:dateUtc="2025-05-10T18:48:00Z"/>
   <w16cex:commentExtensible w16cex:durableId="1023DC09" w16cex:dateUtc="2025-05-10T18:38:00Z"/>
   <w16cex:commentExtensible w16cex:durableId="1D37473A" w16cex:dateUtc="2025-05-10T20:40:00Z"/>
+  <w16cex:commentExtensible w16cex:durableId="4FA86475" w16cex:dateUtc="2025-05-11T16:41:00Z"/>
 </w16cex:commentsExtensible>
 </file>
 
@@ -26942,6 +26970,7 @@
   <w16cid:commentId w16cid:paraId="0E385131" w16cid:durableId="634EF7E0"/>
   <w16cid:commentId w16cid:paraId="4E01394A" w16cid:durableId="1023DC09"/>
   <w16cid:commentId w16cid:paraId="30E70483" w16cid:durableId="1D37473A"/>
+  <w16cid:commentId w16cid:paraId="090E90E6" w16cid:durableId="4FA86475"/>
 </w16cid:commentsIds>
 </file>
 

</xml_diff>

<commit_message>
Descriptive stats on RT
</commit_message>
<xml_diff>
--- a/output/papers/Round 2/manuscript-brief.docx
+++ b/output/papers/Round 2/manuscript-brief.docx
@@ -11185,6 +11185,7 @@
     <w:p>
       <w:pPr>
         <w:rPr>
+          <w:ins w:id="9" w:author="Cummings, Shawn" w:date="2025-05-12T20:54:00Z" w16du:dateUtc="2025-05-13T00:54:00Z"/>
           <w:szCs w:val="22"/>
         </w:rPr>
       </w:pPr>
@@ -11357,8 +11358,8 @@
         </w:rPr>
         <w:t xml:space="preserve">summarizes those tests for all three experiments. </w:t>
       </w:r>
-      <w:commentRangeStart w:id="9"/>
       <w:commentRangeStart w:id="10"/>
+      <w:commentRangeStart w:id="11"/>
       <w:r>
         <w:rPr>
           <w:szCs w:val="22"/>
@@ -11415,19 +11416,19 @@
         </w:rPr>
         <w:t xml:space="preserve"> continuum steps </w:t>
       </w:r>
-      <w:commentRangeEnd w:id="9"/>
+      <w:commentRangeEnd w:id="10"/>
       <w:r>
         <w:rPr>
           <w:rStyle w:val="CommentReference"/>
         </w:rPr>
-        <w:commentReference w:id="9"/>
-      </w:r>
-      <w:commentRangeEnd w:id="10"/>
+        <w:commentReference w:id="10"/>
+      </w:r>
+      <w:commentRangeEnd w:id="11"/>
       <w:r>
         <w:rPr>
           <w:rStyle w:val="CommentReference"/>
         </w:rPr>
-        <w:commentReference w:id="10"/>
+        <w:commentReference w:id="11"/>
       </w:r>
       <w:r>
         <w:rPr>
@@ -11495,6 +11496,60 @@
         </w:rPr>
         <w:t>continuum and visual bias.</w:t>
       </w:r>
+    </w:p>
+    <w:p>
+      <w:pPr>
+        <w:ind w:firstLine="0"/>
+        <w:rPr>
+          <w:szCs w:val="22"/>
+        </w:rPr>
+        <w:pPrChange w:id="12" w:author="Cummings, Shawn" w:date="2025-05-12T20:55:00Z" w16du:dateUtc="2025-05-13T00:55:00Z">
+          <w:pPr/>
+        </w:pPrChange>
+      </w:pPr>
+      <w:ins w:id="13" w:author="Cummings, Shawn" w:date="2025-05-12T20:54:00Z" w16du:dateUtc="2025-05-13T00:54:00Z">
+        <w:r>
+          <w:rPr>
+            <w:noProof/>
+            <w:szCs w:val="22"/>
+          </w:rPr>
+          <w:drawing>
+            <wp:inline distT="0" distB="0" distL="0" distR="0" wp14:anchorId="1E17D0B6" wp14:editId="40EC08D6">
+              <wp:extent cx="5486400" cy="5715000"/>
+              <wp:effectExtent l="0" t="0" r="0" b="0"/>
+              <wp:docPr id="587542116" name="Picture 5" descr="A screenshot of a graph&#10;&#10;Description automatically generated"/>
+              <wp:cNvGraphicFramePr>
+                <a:graphicFrameLocks xmlns:a="http://schemas.openxmlformats.org/drawingml/2006/main" noChangeAspect="1"/>
+              </wp:cNvGraphicFramePr>
+              <a:graphic xmlns:a="http://schemas.openxmlformats.org/drawingml/2006/main">
+                <a:graphicData uri="http://schemas.openxmlformats.org/drawingml/2006/picture">
+                  <pic:pic xmlns:pic="http://schemas.openxmlformats.org/drawingml/2006/picture">
+                    <pic:nvPicPr>
+                      <pic:cNvPr id="587542116" name="Picture 5" descr="A screenshot of a graph&#10;&#10;Description automatically generated"/>
+                      <pic:cNvPicPr/>
+                    </pic:nvPicPr>
+                    <pic:blipFill>
+                      <a:blip r:embed="rId18"/>
+                      <a:stretch>
+                        <a:fillRect/>
+                      </a:stretch>
+                    </pic:blipFill>
+                    <pic:spPr>
+                      <a:xfrm>
+                        <a:off x="0" y="0"/>
+                        <a:ext cx="5486400" cy="5715000"/>
+                      </a:xfrm>
+                      <a:prstGeom prst="rect">
+                        <a:avLst/>
+                      </a:prstGeom>
+                    </pic:spPr>
+                  </pic:pic>
+                </a:graphicData>
+              </a:graphic>
+            </wp:inline>
+          </w:drawing>
+        </w:r>
+      </w:ins>
     </w:p>
     <w:p>
       <w:pPr>
@@ -11510,66 +11565,69 @@
           <w:docGrid w:linePitch="360"/>
         </w:sectPr>
       </w:pPr>
-      <w:bookmarkStart w:id="11" w:name="_Ref136190394"/>
-      <w:commentRangeStart w:id="12"/>
-      <w:commentRangeStart w:id="13"/>
-      <w:r>
-        <w:rPr>
-          <w:noProof/>
-          <w:szCs w:val="22"/>
-        </w:rPr>
-        <w:lastRenderedPageBreak/>
-        <w:drawing>
-          <wp:anchor distT="0" distB="0" distL="114300" distR="114300" simplePos="0" relativeHeight="251672576" behindDoc="0" locked="0" layoutInCell="1" allowOverlap="1" wp14:anchorId="321665CF" wp14:editId="5772BB5C">
-            <wp:simplePos x="0" y="0"/>
-            <wp:positionH relativeFrom="column">
-              <wp:posOffset>0</wp:posOffset>
-            </wp:positionH>
-            <wp:positionV relativeFrom="paragraph">
-              <wp:posOffset>454</wp:posOffset>
-            </wp:positionV>
-            <wp:extent cx="5486400" cy="5715000"/>
-            <wp:effectExtent l="0" t="0" r="0" b="0"/>
-            <wp:wrapTopAndBottom/>
-            <wp:docPr id="721742728" name="Picture 2" descr="A screenshot of a graph&#10;&#10;Description automatically generated"/>
-            <wp:cNvGraphicFramePr>
-              <a:graphicFrameLocks xmlns:a="http://schemas.openxmlformats.org/drawingml/2006/main" noChangeAspect="1"/>
-            </wp:cNvGraphicFramePr>
-            <a:graphic xmlns:a="http://schemas.openxmlformats.org/drawingml/2006/main">
-              <a:graphicData uri="http://schemas.openxmlformats.org/drawingml/2006/picture">
-                <pic:pic xmlns:pic="http://schemas.openxmlformats.org/drawingml/2006/picture">
-                  <pic:nvPicPr>
-                    <pic:cNvPr id="721742728" name="Picture 2" descr="A screenshot of a graph&#10;&#10;Description automatically generated"/>
-                    <pic:cNvPicPr/>
-                  </pic:nvPicPr>
-                  <pic:blipFill>
-                    <a:blip r:embed="rId18"/>
-                    <a:stretch>
-                      <a:fillRect/>
-                    </a:stretch>
-                  </pic:blipFill>
-                  <pic:spPr>
-                    <a:xfrm>
-                      <a:off x="0" y="0"/>
-                      <a:ext cx="5486400" cy="5715000"/>
-                    </a:xfrm>
-                    <a:prstGeom prst="rect">
-                      <a:avLst/>
-                    </a:prstGeom>
-                  </pic:spPr>
-                </pic:pic>
-              </a:graphicData>
-            </a:graphic>
-            <wp14:sizeRelH relativeFrom="page">
-              <wp14:pctWidth>0</wp14:pctWidth>
-            </wp14:sizeRelH>
-            <wp14:sizeRelV relativeFrom="page">
-              <wp14:pctHeight>0</wp14:pctHeight>
-            </wp14:sizeRelV>
-          </wp:anchor>
-        </w:drawing>
-      </w:r>
-      <w:commentRangeEnd w:id="12"/>
+      <w:bookmarkStart w:id="14" w:name="_Ref136190394"/>
+      <w:commentRangeStart w:id="15"/>
+      <w:commentRangeStart w:id="16"/>
+      <w:commentRangeStart w:id="17"/>
+      <w:del w:id="18" w:author="Cummings, Shawn" w:date="2025-05-12T20:53:00Z" w16du:dateUtc="2025-05-13T00:53:00Z">
+        <w:r>
+          <w:rPr>
+            <w:noProof/>
+            <w:szCs w:val="22"/>
+          </w:rPr>
+          <w:lastRenderedPageBreak/>
+          <w:drawing>
+            <wp:anchor distT="0" distB="0" distL="114300" distR="114300" simplePos="0" relativeHeight="251672576" behindDoc="0" locked="0" layoutInCell="1" allowOverlap="1" wp14:anchorId="321665CF" wp14:editId="24DC646C">
+              <wp:simplePos x="0" y="0"/>
+              <wp:positionH relativeFrom="column">
+                <wp:posOffset>0</wp:posOffset>
+              </wp:positionH>
+              <wp:positionV relativeFrom="paragraph">
+                <wp:posOffset>454</wp:posOffset>
+              </wp:positionV>
+              <wp:extent cx="5486400" cy="5715000"/>
+              <wp:effectExtent l="0" t="0" r="0" b="0"/>
+              <wp:wrapTopAndBottom/>
+              <wp:docPr id="721742728" name="Picture 2" descr="A screenshot of a graph&#10;&#10;Description automatically generated"/>
+              <wp:cNvGraphicFramePr>
+                <a:graphicFrameLocks xmlns:a="http://schemas.openxmlformats.org/drawingml/2006/main" noChangeAspect="1"/>
+              </wp:cNvGraphicFramePr>
+              <a:graphic xmlns:a="http://schemas.openxmlformats.org/drawingml/2006/main">
+                <a:graphicData uri="http://schemas.openxmlformats.org/drawingml/2006/picture">
+                  <pic:pic xmlns:pic="http://schemas.openxmlformats.org/drawingml/2006/picture">
+                    <pic:nvPicPr>
+                      <pic:cNvPr id="721742728" name="Picture 2" descr="A screenshot of a graph&#10;&#10;Description automatically generated"/>
+                      <pic:cNvPicPr/>
+                    </pic:nvPicPr>
+                    <pic:blipFill>
+                      <a:blip r:embed="rId19"/>
+                      <a:stretch>
+                        <a:fillRect/>
+                      </a:stretch>
+                    </pic:blipFill>
+                    <pic:spPr>
+                      <a:xfrm>
+                        <a:off x="0" y="0"/>
+                        <a:ext cx="5486400" cy="5715000"/>
+                      </a:xfrm>
+                      <a:prstGeom prst="rect">
+                        <a:avLst/>
+                      </a:prstGeom>
+                    </pic:spPr>
+                  </pic:pic>
+                </a:graphicData>
+              </a:graphic>
+              <wp14:sizeRelH relativeFrom="page">
+                <wp14:pctWidth>0</wp14:pctWidth>
+              </wp14:sizeRelH>
+              <wp14:sizeRelV relativeFrom="page">
+                <wp14:pctHeight>0</wp14:pctHeight>
+              </wp14:sizeRelV>
+            </wp:anchor>
+          </w:drawing>
+        </w:r>
+      </w:del>
+      <w:commentRangeEnd w:id="15"/>
       <w:r>
         <w:rPr>
           <w:rStyle w:val="CommentReference"/>
@@ -11577,9 +11635,9 @@
           <w:iCs w:val="0"/>
           <w:color w:val="auto"/>
         </w:rPr>
-        <w:commentReference w:id="12"/>
-      </w:r>
-      <w:commentRangeEnd w:id="13"/>
+        <w:commentReference w:id="15"/>
+      </w:r>
+      <w:commentRangeEnd w:id="16"/>
       <w:r>
         <w:rPr>
           <w:rStyle w:val="CommentReference"/>
@@ -11587,7 +11645,17 @@
           <w:iCs w:val="0"/>
           <w:color w:val="auto"/>
         </w:rPr>
-        <w:commentReference w:id="13"/>
+        <w:commentReference w:id="16"/>
+      </w:r>
+      <w:commentRangeEnd w:id="17"/>
+      <w:r>
+        <w:rPr>
+          <w:rStyle w:val="CommentReference"/>
+          <w:i w:val="0"/>
+          <w:iCs w:val="0"/>
+          <w:color w:val="auto"/>
+        </w:rPr>
+        <w:commentReference w:id="17"/>
       </w:r>
       <w:r>
         <w:rPr>
@@ -11633,7 +11701,7 @@
         </w:rPr>
         <w:fldChar w:fldCharType="end"/>
       </w:r>
-      <w:bookmarkEnd w:id="11"/>
+      <w:bookmarkEnd w:id="14"/>
       <w:r>
         <w:rPr>
           <w:szCs w:val="22"/>
@@ -11733,7 +11801,7 @@
       <w:pPr>
         <w:pStyle w:val="Caption"/>
       </w:pPr>
-      <w:bookmarkStart w:id="14" w:name="_Ref136190384"/>
+      <w:bookmarkStart w:id="19" w:name="_Ref136190384"/>
       <w:r>
         <w:rPr>
           <w:szCs w:val="22"/>
@@ -11773,7 +11841,7 @@
         </w:rPr>
         <w:fldChar w:fldCharType="end"/>
       </w:r>
-      <w:bookmarkEnd w:id="14"/>
+      <w:bookmarkEnd w:id="19"/>
       <w:r>
         <w:rPr>
           <w:szCs w:val="22"/>
@@ -15438,7 +15506,7 @@
       <w:pPr>
         <w:ind w:firstLine="0"/>
         <w:sectPr>
-          <w:footerReference w:type="default" r:id="rId19"/>
+          <w:footerReference w:type="default" r:id="rId20"/>
           <w:pgSz w:w="15840" w:h="12240" w:orient="landscape"/>
           <w:pgMar w:top="1800" w:right="1440" w:bottom="1800" w:left="1440" w:header="720" w:footer="720" w:gutter="0"/>
           <w:cols w:space="720"/>
@@ -15839,7 +15907,7 @@
           <w:szCs w:val="22"/>
         </w:rPr>
       </w:pPr>
-      <w:commentRangeStart w:id="15"/>
+      <w:commentRangeStart w:id="20"/>
       <w:r>
         <w:rPr>
           <w:szCs w:val="22"/>
@@ -15992,12 +16060,12 @@
         </w:rPr>
         <w:t>.</w:t>
       </w:r>
-      <w:commentRangeEnd w:id="15"/>
+      <w:commentRangeEnd w:id="20"/>
       <w:r>
         <w:rPr>
           <w:rStyle w:val="CommentReference"/>
         </w:rPr>
-        <w:commentReference w:id="15"/>
+        <w:commentReference w:id="20"/>
       </w:r>
     </w:p>
     <w:p>
@@ -17013,7 +17081,7 @@
                     <pic:cNvPicPr/>
                   </pic:nvPicPr>
                   <pic:blipFill>
-                    <a:blip r:embed="rId20"/>
+                    <a:blip r:embed="rId21"/>
                     <a:stretch>
                       <a:fillRect/>
                     </a:stretch>
@@ -17047,7 +17115,7 @@
           <w:szCs w:val="22"/>
         </w:rPr>
       </w:pPr>
-      <w:bookmarkStart w:id="16" w:name="_Ref136084921"/>
+      <w:bookmarkStart w:id="21" w:name="_Ref136084921"/>
       <w:r>
         <w:rPr>
           <w:szCs w:val="22"/>
@@ -17086,7 +17154,7 @@
         </w:rPr>
         <w:fldChar w:fldCharType="end"/>
       </w:r>
-      <w:bookmarkEnd w:id="16"/>
+      <w:bookmarkEnd w:id="21"/>
       <w:r>
         <w:rPr>
           <w:szCs w:val="22"/>
@@ -18597,7 +18665,7 @@
                     <pic:cNvPicPr/>
                   </pic:nvPicPr>
                   <pic:blipFill>
-                    <a:blip r:embed="rId21"/>
+                    <a:blip r:embed="rId22"/>
                     <a:stretch>
                       <a:fillRect/>
                     </a:stretch>
@@ -18625,7 +18693,7 @@
           <w:szCs w:val="22"/>
         </w:rPr>
       </w:pPr>
-      <w:bookmarkStart w:id="17" w:name="_Ref136190811"/>
+      <w:bookmarkStart w:id="22" w:name="_Ref136190811"/>
       <w:r>
         <w:rPr>
           <w:szCs w:val="22"/>
@@ -18664,7 +18732,7 @@
         </w:rPr>
         <w:fldChar w:fldCharType="end"/>
       </w:r>
-      <w:bookmarkEnd w:id="17"/>
+      <w:bookmarkEnd w:id="22"/>
       <w:r>
         <w:rPr>
           <w:szCs w:val="22"/>
@@ -18771,7 +18839,7 @@
       <w:pPr>
         <w:pStyle w:val="Caption"/>
       </w:pPr>
-      <w:bookmarkStart w:id="18" w:name="_Ref136190818"/>
+      <w:bookmarkStart w:id="23" w:name="_Ref136190818"/>
       <w:r>
         <w:rPr>
           <w:szCs w:val="22"/>
@@ -18811,7 +18879,7 @@
         </w:rPr>
         <w:fldChar w:fldCharType="end"/>
       </w:r>
-      <w:bookmarkEnd w:id="18"/>
+      <w:bookmarkEnd w:id="23"/>
       <w:r>
         <w:rPr>
           <w:szCs w:val="22"/>
@@ -21830,7 +21898,8 @@
         </w:rPr>
         <w:t xml:space="preserve"> not significantly higher in Experiment </w:t>
       </w:r>
-      <w:commentRangeStart w:id="19"/>
+      <w:commentRangeStart w:id="24"/>
+      <w:commentRangeStart w:id="25"/>
       <w:r>
         <w:rPr>
           <w:szCs w:val="22"/>
@@ -21841,14 +21910,109 @@
         <w:rPr>
           <w:szCs w:val="22"/>
         </w:rPr>
-        <w:t xml:space="preserve"> (mean log-RT = XXX, SD = XXX), compared to Experiments 1a-c (mean = XXX, SD = XXX)</w:t>
-      </w:r>
-      <w:commentRangeEnd w:id="19"/>
+        <w:t xml:space="preserve"> (mean log-RT = </w:t>
+      </w:r>
+      <w:ins w:id="26" w:author="Cummings, Shawn" w:date="2025-05-12T21:06:00Z" w16du:dateUtc="2025-05-13T01:06:00Z">
+        <w:r>
+          <w:rPr>
+            <w:szCs w:val="22"/>
+          </w:rPr>
+          <w:t>3.45</w:t>
+        </w:r>
+      </w:ins>
+      <w:del w:id="27" w:author="Cummings, Shawn" w:date="2025-05-12T21:06:00Z" w16du:dateUtc="2025-05-13T01:06:00Z">
+        <w:r>
+          <w:rPr>
+            <w:szCs w:val="22"/>
+          </w:rPr>
+          <w:delText>XXX</w:delText>
+        </w:r>
+      </w:del>
+      <w:r>
+        <w:rPr>
+          <w:szCs w:val="22"/>
+        </w:rPr>
+        <w:t xml:space="preserve">, SD = </w:t>
+      </w:r>
+      <w:ins w:id="28" w:author="Cummings, Shawn" w:date="2025-05-12T21:07:00Z" w16du:dateUtc="2025-05-13T01:07:00Z">
+        <w:r>
+          <w:rPr>
+            <w:szCs w:val="22"/>
+          </w:rPr>
+          <w:t>0.14</w:t>
+        </w:r>
+      </w:ins>
+      <w:del w:id="29" w:author="Cummings, Shawn" w:date="2025-05-12T21:07:00Z" w16du:dateUtc="2025-05-13T01:07:00Z">
+        <w:r>
+          <w:rPr>
+            <w:szCs w:val="22"/>
+          </w:rPr>
+          <w:delText>XXX</w:delText>
+        </w:r>
+      </w:del>
+      <w:r>
+        <w:rPr>
+          <w:szCs w:val="22"/>
+        </w:rPr>
+        <w:t xml:space="preserve">), compared to Experiments 1a-c (mean = </w:t>
+      </w:r>
+      <w:ins w:id="30" w:author="Cummings, Shawn" w:date="2025-05-12T21:09:00Z" w16du:dateUtc="2025-05-13T01:09:00Z">
+        <w:r>
+          <w:rPr>
+            <w:szCs w:val="22"/>
+          </w:rPr>
+          <w:t>3.44</w:t>
+        </w:r>
+      </w:ins>
+      <w:del w:id="31" w:author="Cummings, Shawn" w:date="2025-05-12T21:09:00Z" w16du:dateUtc="2025-05-13T01:09:00Z">
+        <w:r>
+          <w:rPr>
+            <w:szCs w:val="22"/>
+          </w:rPr>
+          <w:delText>XXX</w:delText>
+        </w:r>
+      </w:del>
+      <w:r>
+        <w:rPr>
+          <w:szCs w:val="22"/>
+        </w:rPr>
+        <w:t xml:space="preserve">, SD = </w:t>
+      </w:r>
+      <w:ins w:id="32" w:author="Cummings, Shawn" w:date="2025-05-12T21:09:00Z" w16du:dateUtc="2025-05-13T01:09:00Z">
+        <w:r>
+          <w:rPr>
+            <w:szCs w:val="22"/>
+          </w:rPr>
+          <w:t>0.15</w:t>
+        </w:r>
+      </w:ins>
+      <w:del w:id="33" w:author="Cummings, Shawn" w:date="2025-05-12T21:09:00Z" w16du:dateUtc="2025-05-13T01:09:00Z">
+        <w:r>
+          <w:rPr>
+            <w:szCs w:val="22"/>
+          </w:rPr>
+          <w:delText>XXX</w:delText>
+        </w:r>
+      </w:del>
+      <w:r>
+        <w:rPr>
+          <w:szCs w:val="22"/>
+        </w:rPr>
+        <w:t>)</w:t>
+      </w:r>
+      <w:commentRangeEnd w:id="24"/>
       <w:r>
         <w:rPr>
           <w:rStyle w:val="CommentReference"/>
         </w:rPr>
-        <w:commentReference w:id="19"/>
+        <w:commentReference w:id="24"/>
+      </w:r>
+      <w:commentRangeEnd w:id="25"/>
+      <w:r>
+        <w:rPr>
+          <w:rStyle w:val="CommentReference"/>
+        </w:rPr>
+        <w:commentReference w:id="25"/>
       </w:r>
       <w:r>
         <w:rPr>
@@ -21905,7 +22069,7 @@
         </w:rPr>
         <w:t>A second alternative is that while the presence of the pen itself—rather than its impact on the articulators—may be sufficient to induce compensation, the black box</w:t>
       </w:r>
-      <w:commentRangeStart w:id="20"/>
+      <w:commentRangeStart w:id="34"/>
       <w:r>
         <w:rPr>
           <w:szCs w:val="22"/>
@@ -21930,12 +22094,12 @@
         </w:rPr>
         <w:t xml:space="preserve"> less obvious and harder to visually access. </w:t>
       </w:r>
-      <w:commentRangeEnd w:id="20"/>
+      <w:commentRangeEnd w:id="34"/>
       <w:r>
         <w:rPr>
           <w:rStyle w:val="CommentReference"/>
         </w:rPr>
-        <w:commentReference w:id="20"/>
+        <w:commentReference w:id="34"/>
       </w:r>
       <w:r>
         <w:rPr>
@@ -23827,7 +23991,7 @@
         </w:rPr>
         <w:t>, Linda Liu, and Xin Xie for sharing materials and feedback for a tutorial on crowdsourcing experiments developed as part of this project (</w:t>
       </w:r>
-      <w:hyperlink r:id="rId22" w:history="1">
+      <w:hyperlink r:id="rId23" w:history="1">
         <w:r>
           <w:rPr>
             <w:rStyle w:val="Hyperlink"/>
@@ -24472,7 +24636,7 @@
         </w:rPr>
         <w:t> (pp. 189–201). Boston Review. </w:t>
       </w:r>
-      <w:hyperlink r:id="rId23" w:tgtFrame="_blank" w:history="1">
+      <w:hyperlink r:id="rId24" w:tgtFrame="_blank" w:history="1">
         <w:r>
           <w:rPr>
             <w:rStyle w:val="Hyperlink"/>
@@ -25399,7 +25563,7 @@
         </w:rPr>
         <w:t xml:space="preserve">(3). </w:t>
       </w:r>
-      <w:hyperlink r:id="rId24" w:history="1">
+      <w:hyperlink r:id="rId25" w:history="1">
         <w:r>
           <w:rPr>
             <w:rStyle w:val="Hyperlink"/>
@@ -26322,7 +26486,7 @@
         </w:rPr>
         <w:t xml:space="preserve">Xie, X., Liu, L., &amp; Jaeger, T. F. (2021, January 11). Xie, Liu, &amp; Jaeger (2020). Cross-talker generalization during foreign-accented speech perception. </w:t>
       </w:r>
-      <w:hyperlink r:id="rId25" w:history="1">
+      <w:hyperlink r:id="rId26" w:history="1">
         <w:r>
           <w:rPr>
             <w:rStyle w:val="Hyperlink"/>
@@ -26337,11 +26501,11 @@
         <w:spacing w:line="240" w:lineRule="auto"/>
         <w:ind w:left="360" w:hanging="360"/>
         <w:rPr>
-          <w:ins w:id="21" w:author="Cummings, Shawn" w:date="2025-05-12T20:19:00Z" w16du:dateUtc="2025-05-13T00:19:00Z"/>
-          <w:szCs w:val="22"/>
-        </w:rPr>
-      </w:pPr>
-      <w:ins w:id="22" w:author="Cummings, Shawn" w:date="2025-05-12T20:19:00Z">
+          <w:ins w:id="35" w:author="Cummings, Shawn" w:date="2025-05-12T20:19:00Z" w16du:dateUtc="2025-05-13T00:19:00Z"/>
+          <w:szCs w:val="22"/>
+        </w:rPr>
+      </w:pPr>
+      <w:ins w:id="36" w:author="Cummings, Shawn" w:date="2025-05-12T20:19:00Z">
         <w:r>
           <w:rPr>
             <w:szCs w:val="22"/>
@@ -26594,7 +26758,7 @@
       </w:r>
     </w:p>
   </w:comment>
-  <w:comment w:id="9" w:author="Jaeger, Florian" w:date="2025-05-11T16:22:00Z" w:initials="TJ">
+  <w:comment w:id="10" w:author="Jaeger, Florian" w:date="2025-05-11T16:22:00Z" w:initials="TJ">
     <w:p>
       <w:pPr>
         <w:jc w:val="left"/>
@@ -26613,7 +26777,7 @@
       </w:r>
     </w:p>
   </w:comment>
-  <w:comment w:id="10" w:author="Jaeger, Florian" w:date="2025-05-11T16:22:00Z" w:initials="TJ">
+  <w:comment w:id="11" w:author="Jaeger, Florian" w:date="2025-05-11T16:22:00Z" w:initials="TJ">
     <w:p>
       <w:pPr>
         <w:jc w:val="left"/>
@@ -26632,7 +26796,7 @@
       </w:r>
     </w:p>
   </w:comment>
-  <w:comment w:id="12" w:author="Jaeger, Florian" w:date="2025-05-11T17:36:00Z" w:initials="TJ">
+  <w:comment w:id="15" w:author="Jaeger, Florian" w:date="2025-05-11T17:36:00Z" w:initials="TJ">
     <w:p>
       <w:pPr>
         <w:jc w:val="left"/>
@@ -26651,7 +26815,7 @@
       </w:r>
     </w:p>
   </w:comment>
-  <w:comment w:id="13" w:author="Jaeger, Florian" w:date="2025-05-11T17:37:00Z" w:initials="TJ">
+  <w:comment w:id="16" w:author="Jaeger, Florian" w:date="2025-05-11T17:37:00Z" w:initials="TJ">
     <w:p>
       <w:pPr>
         <w:jc w:val="left"/>
@@ -26670,7 +26834,7 @@
       </w:r>
     </w:p>
   </w:comment>
-  <w:comment w:id="15" w:author="Jaeger, Florian" w:date="2025-05-11T17:39:00Z" w:initials="TJ">
+  <w:comment w:id="17" w:author="Cummings, Shawn" w:date="2025-05-12T20:55:00Z" w:initials="SC">
     <w:p>
       <w:pPr>
         <w:jc w:val="left"/>
@@ -26682,14 +26846,11 @@
         <w:annotationRef/>
       </w:r>
       <w:r>
-        <w:rPr>
-          <w:color w:val="000000"/>
-        </w:rPr>
-        <w:t>perhaps this could go here?</w:t>
+        <w:t>Done!</w:t>
       </w:r>
     </w:p>
   </w:comment>
-  <w:comment w:id="19" w:author="Jaeger, Florian" w:date="2025-05-11T16:49:00Z" w:initials="TJ">
+  <w:comment w:id="20" w:author="Jaeger, Florian" w:date="2025-05-11T17:39:00Z" w:initials="TJ">
     <w:p>
       <w:pPr>
         <w:jc w:val="left"/>
@@ -26704,11 +26865,46 @@
         <w:rPr>
           <w:color w:val="000000"/>
         </w:rPr>
-        <w:t>would be good to fill this in?</w:t>
+        <w:t>perhaps this could go here?</w:t>
       </w:r>
     </w:p>
   </w:comment>
-  <w:comment w:id="20" w:author="Jaeger, Florian" w:date="2025-05-11T16:53:00Z" w:initials="TJ">
+  <w:comment w:id="24" w:author="Jaeger, Florian" w:date="2025-05-11T16:49:00Z" w:initials="TJ">
+    <w:p>
+      <w:pPr>
+        <w:jc w:val="left"/>
+      </w:pPr>
+      <w:r>
+        <w:rPr>
+          <w:rStyle w:val="CommentReference"/>
+        </w:rPr>
+        <w:annotationRef/>
+      </w:r>
+      <w:r>
+        <w:rPr>
+          <w:color w:val="000000"/>
+        </w:rPr>
+        <w:t>would be good to fill this in?</w:t>
+      </w:r>
+    </w:p>
+  </w:comment>
+  <w:comment w:id="25" w:author="Cummings, Shawn" w:date="2025-05-12T21:09:00Z" w:initials="SC">
+    <w:p>
+      <w:pPr>
+        <w:jc w:val="left"/>
+      </w:pPr>
+      <w:r>
+        <w:rPr>
+          <w:rStyle w:val="CommentReference"/>
+        </w:rPr>
+        <w:annotationRef/>
+      </w:r>
+      <w:r>
+        <w:t>Beautifully similar RTs!</w:t>
+      </w:r>
+    </w:p>
+  </w:comment>
+  <w:comment w:id="34" w:author="Jaeger, Florian" w:date="2025-05-11T16:53:00Z" w:initials="TJ">
     <w:p>
       <w:pPr>
         <w:jc w:val="left"/>
@@ -26743,8 +26939,10 @@
   <w15:commentEx w15:paraId="13E32899" w15:paraIdParent="17828F86" w15:done="1"/>
   <w15:commentEx w15:paraId="35B6A348" w15:done="0"/>
   <w15:commentEx w15:paraId="23B94270" w15:paraIdParent="35B6A348" w15:done="0"/>
+  <w15:commentEx w15:paraId="30A11CDB" w15:paraIdParent="35B6A348" w15:done="0"/>
   <w15:commentEx w15:paraId="3231CFD4" w15:done="1"/>
   <w15:commentEx w15:paraId="695C0F94" w15:done="0"/>
+  <w15:commentEx w15:paraId="0A4DDCE7" w15:paraIdParent="695C0F94" w15:done="0"/>
   <w15:commentEx w15:paraId="1552380C" w15:done="0"/>
 </w15:commentsEx>
 </file>
@@ -26762,8 +26960,10 @@
   <w16cex:commentExtensible w16cex:durableId="2A777EBB" w16cex:dateUtc="2025-05-11T20:22:00Z"/>
   <w16cex:commentExtensible w16cex:durableId="3B8CC745" w16cex:dateUtc="2025-05-11T21:36:00Z"/>
   <w16cex:commentExtensible w16cex:durableId="18153A9E" w16cex:dateUtc="2025-05-11T21:37:00Z"/>
+  <w16cex:commentExtensible w16cex:durableId="14BEE2CC" w16cex:dateUtc="2025-05-13T00:55:00Z"/>
   <w16cex:commentExtensible w16cex:durableId="27B64A8D" w16cex:dateUtc="2025-05-11T21:39:00Z"/>
   <w16cex:commentExtensible w16cex:durableId="5D330C59" w16cex:dateUtc="2025-05-11T20:49:00Z"/>
+  <w16cex:commentExtensible w16cex:durableId="47D3472C" w16cex:dateUtc="2025-05-13T01:09:00Z"/>
   <w16cex:commentExtensible w16cex:durableId="259C817C" w16cex:dateUtc="2025-05-11T20:53:00Z"/>
 </w16cex:commentsExtensible>
 </file>
@@ -26781,8 +26981,10 @@
   <w16cid:commentId w16cid:paraId="13E32899" w16cid:durableId="2A777EBB"/>
   <w16cid:commentId w16cid:paraId="35B6A348" w16cid:durableId="3B8CC745"/>
   <w16cid:commentId w16cid:paraId="23B94270" w16cid:durableId="18153A9E"/>
+  <w16cid:commentId w16cid:paraId="30A11CDB" w16cid:durableId="14BEE2CC"/>
   <w16cid:commentId w16cid:paraId="3231CFD4" w16cid:durableId="27B64A8D"/>
   <w16cid:commentId w16cid:paraId="695C0F94" w16cid:durableId="5D330C59"/>
+  <w16cid:commentId w16cid:paraId="0A4DDCE7" w16cid:durableId="47D3472C"/>
   <w16cid:commentId w16cid:paraId="1552380C" w16cid:durableId="259C817C"/>
 </w16cid:commentsIds>
 </file>

</xml_diff>

<commit_message>
Edited for typo and punctuation
Added some comments about wording and fixed typos and punctuation (including Menghan's suggestions)
</commit_message>
<xml_diff>
--- a/output/papers/Round 2/manuscript-brief.docx
+++ b/output/papers/Round 2/manuscript-brief.docx
@@ -1,6 +1,6 @@
 
 <file path=word/document.xml><?xml version="1.0" encoding="utf-8"?>
-<w:document xmlns:wpc="http://schemas.microsoft.com/office/word/2010/wordprocessingCanvas" xmlns:cx="http://schemas.microsoft.com/office/drawing/2014/chartex" xmlns:cx1="http://schemas.microsoft.com/office/drawing/2015/9/8/chartex" xmlns:cx2="http://schemas.microsoft.com/office/drawing/2015/10/21/chartex" xmlns:cx3="http://schemas.microsoft.com/office/drawing/2016/5/9/chartex" xmlns:cx4="http://schemas.microsoft.com/office/drawing/2016/5/10/chartex" xmlns:cx5="http://schemas.microsoft.com/office/drawing/2016/5/11/chartex" xmlns:cx6="http://schemas.microsoft.com/office/drawing/2016/5/12/chartex" xmlns:cx7="http://schemas.microsoft.com/office/drawing/2016/5/13/chartex" xmlns:cx8="http://schemas.microsoft.com/office/drawing/2016/5/14/chartex" xmlns:mc="http://schemas.openxmlformats.org/markup-compatibility/2006" xmlns:aink="http://schemas.microsoft.com/office/drawing/2016/ink" xmlns:am3d="http://schemas.microsoft.com/office/drawing/2017/model3d" xmlns:o="urn:schemas-microsoft-com:office:office" xmlns:oel="http://schemas.microsoft.com/office/2019/extlst" xmlns:r="http://schemas.openxmlformats.org/officeDocument/2006/relationships" xmlns:m="http://schemas.openxmlformats.org/officeDocument/2006/math" xmlns:v="urn:schemas-microsoft-com:vml" xmlns:wp14="http://schemas.microsoft.com/office/word/2010/wordprocessingDrawing" xmlns:wp="http://schemas.openxmlformats.org/drawingml/2006/wordprocessingDrawing" xmlns:w10="urn:schemas-microsoft-com:office:word" xmlns:w="http://schemas.openxmlformats.org/wordprocessingml/2006/main" xmlns:w14="http://schemas.microsoft.com/office/word/2010/wordml" xmlns:w15="http://schemas.microsoft.com/office/word/2012/wordml" xmlns:w16cex="http://schemas.microsoft.com/office/word/2018/wordml/cex" xmlns:w16cid="http://schemas.microsoft.com/office/word/2016/wordml/cid" xmlns:w16="http://schemas.microsoft.com/office/word/2018/wordml" xmlns:w16du="http://schemas.microsoft.com/office/word/2023/wordml/word16du" xmlns:w16sdtdh="http://schemas.microsoft.com/office/word/2020/wordml/sdtdatahash" xmlns:w16se="http://schemas.microsoft.com/office/word/2015/wordml/symex" xmlns:wpg="http://schemas.microsoft.com/office/word/2010/wordprocessingGroup" xmlns:wpi="http://schemas.microsoft.com/office/word/2010/wordprocessingInk" xmlns:wne="http://schemas.microsoft.com/office/word/2006/wordml" xmlns:wps="http://schemas.microsoft.com/office/word/2010/wordprocessingShape" mc:Ignorable="w14 w15 w16se w16cid w16 w16cex w16sdtdh w16du wp14">
+<w:document xmlns:wpc="http://schemas.microsoft.com/office/word/2010/wordprocessingCanvas" xmlns:cx="http://schemas.microsoft.com/office/drawing/2014/chartex" xmlns:cx1="http://schemas.microsoft.com/office/drawing/2015/9/8/chartex" xmlns:cx2="http://schemas.microsoft.com/office/drawing/2015/10/21/chartex" xmlns:cx3="http://schemas.microsoft.com/office/drawing/2016/5/9/chartex" xmlns:cx4="http://schemas.microsoft.com/office/drawing/2016/5/10/chartex" xmlns:cx5="http://schemas.microsoft.com/office/drawing/2016/5/11/chartex" xmlns:cx6="http://schemas.microsoft.com/office/drawing/2016/5/12/chartex" xmlns:cx7="http://schemas.microsoft.com/office/drawing/2016/5/13/chartex" xmlns:cx8="http://schemas.microsoft.com/office/drawing/2016/5/14/chartex" xmlns:mc="http://schemas.openxmlformats.org/markup-compatibility/2006" xmlns:aink="http://schemas.microsoft.com/office/drawing/2016/ink" xmlns:am3d="http://schemas.microsoft.com/office/drawing/2017/model3d" xmlns:o="urn:schemas-microsoft-com:office:office" xmlns:oel="http://schemas.microsoft.com/office/2019/extlst" xmlns:r="http://schemas.openxmlformats.org/officeDocument/2006/relationships" xmlns:m="http://schemas.openxmlformats.org/officeDocument/2006/math" xmlns:v="urn:schemas-microsoft-com:vml" xmlns:wp14="http://schemas.microsoft.com/office/word/2010/wordprocessingDrawing" xmlns:wp="http://schemas.openxmlformats.org/drawingml/2006/wordprocessingDrawing" xmlns:w10="urn:schemas-microsoft-com:office:word" xmlns:w="http://schemas.openxmlformats.org/wordprocessingml/2006/main" xmlns:w14="http://schemas.microsoft.com/office/word/2010/wordml" xmlns:w15="http://schemas.microsoft.com/office/word/2012/wordml" xmlns:w16cex="http://schemas.microsoft.com/office/word/2018/wordml/cex" xmlns:w16cid="http://schemas.microsoft.com/office/word/2016/wordml/cid" xmlns:w16="http://schemas.microsoft.com/office/word/2018/wordml" xmlns:w16du="http://schemas.microsoft.com/office/word/2023/wordml/word16du" xmlns:w16sdtdh="http://schemas.microsoft.com/office/word/2020/wordml/sdtdatahash" xmlns:w16sdtfl="http://schemas.microsoft.com/office/word/2024/wordml/sdtformatlock" xmlns:w16se="http://schemas.microsoft.com/office/word/2015/wordml/symex" xmlns:wpg="http://schemas.microsoft.com/office/word/2010/wordprocessingGroup" xmlns:wpi="http://schemas.microsoft.com/office/word/2010/wordprocessingInk" xmlns:wne="http://schemas.microsoft.com/office/word/2006/wordml" xmlns:wps="http://schemas.microsoft.com/office/word/2010/wordprocessingShape" mc:Ignorable="w14 w15 w16se w16cid w16 w16cex w16sdtdh w16sdtfl w16du wp14">
   <w:body>
     <w:p/>
     <w:p>
@@ -110,21 +110,29 @@
         <w:rPr>
           <w:szCs w:val="22"/>
         </w:rPr>
-        <w:t xml:space="preserve">, </w:t>
-      </w:r>
-      <w:proofErr w:type="spellStart"/>
-      <w:r>
-        <w:rPr>
-          <w:szCs w:val="22"/>
-        </w:rPr>
-        <w:t>Gevher</w:t>
-      </w:r>
-      <w:proofErr w:type="spellEnd"/>
-      <w:r>
-        <w:rPr>
-          <w:szCs w:val="22"/>
-        </w:rPr>
-        <w:t xml:space="preserve"> Karboga</w:t>
+        <w:t xml:space="preserve">, Gevher </w:t>
+      </w:r>
+      <w:ins w:id="0" w:author="Karboga, Gevher" w:date="2025-05-20T18:54:00Z" w16du:dateUtc="2025-05-20T22:54:00Z">
+        <w:r>
+          <w:rPr>
+            <w:szCs w:val="22"/>
+          </w:rPr>
+          <w:t>E</w:t>
+        </w:r>
+      </w:ins>
+      <w:ins w:id="1" w:author="Karboga, Gevher" w:date="2025-05-20T18:55:00Z" w16du:dateUtc="2025-05-20T22:55:00Z">
+        <w:r>
+          <w:rPr>
+            <w:szCs w:val="22"/>
+          </w:rPr>
+          <w:t xml:space="preserve">. </w:t>
+        </w:r>
+      </w:ins>
+      <w:r>
+        <w:rPr>
+          <w:szCs w:val="22"/>
+        </w:rPr>
+        <w:t>Karboga</w:t>
       </w:r>
       <w:r>
         <w:rPr>
@@ -619,7 +627,21 @@
         <w:rPr>
           <w:szCs w:val="22"/>
         </w:rPr>
-        <w:t xml:space="preserve"> In a series of perception experiments, we find that listeners compensate for the presence of a pen in the mouth of the talker, as long as the effects of the pen on the articulators (e.g., lip shape) are visually evident.</w:t>
+        <w:t xml:space="preserve"> In a series of perception experiments, we find that listeners compensate for the presence of a pen in the mouth of the talker, </w:t>
+      </w:r>
+      <w:proofErr w:type="gramStart"/>
+      <w:r>
+        <w:rPr>
+          <w:szCs w:val="22"/>
+        </w:rPr>
+        <w:t>as long as</w:t>
+      </w:r>
+      <w:proofErr w:type="gramEnd"/>
+      <w:r>
+        <w:rPr>
+          <w:szCs w:val="22"/>
+        </w:rPr>
+        <w:t xml:space="preserve"> the effects of the pen on the articulators (e.g., lip shape) are visually evident.</w:t>
       </w:r>
       <w:r>
         <w:rPr>
@@ -924,7 +946,21 @@
         <w:rPr>
           <w:szCs w:val="22"/>
         </w:rPr>
-        <w:t xml:space="preserve">acoustically more similar to typical </w:t>
+        <w:t xml:space="preserve">acoustically more </w:t>
+      </w:r>
+      <w:proofErr w:type="gramStart"/>
+      <w:r>
+        <w:rPr>
+          <w:szCs w:val="22"/>
+        </w:rPr>
+        <w:t>similar to</w:t>
+      </w:r>
+      <w:proofErr w:type="gramEnd"/>
+      <w:r>
+        <w:rPr>
+          <w:szCs w:val="22"/>
+        </w:rPr>
+        <w:t xml:space="preserve"> typical </w:t>
       </w:r>
       <w:r>
         <w:rPr>
@@ -1006,21 +1042,7 @@
         <w:rPr>
           <w:szCs w:val="22"/>
         </w:rPr>
-        <w:t xml:space="preserve">/u/ biases listeners towards /s/ responses (Mann &amp; </w:t>
-      </w:r>
-      <w:proofErr w:type="spellStart"/>
-      <w:r>
-        <w:rPr>
-          <w:szCs w:val="22"/>
-        </w:rPr>
-        <w:t>Repp</w:t>
-      </w:r>
-      <w:proofErr w:type="spellEnd"/>
-      <w:r>
-        <w:rPr>
-          <w:szCs w:val="22"/>
-        </w:rPr>
-        <w:t xml:space="preserve">, 1980; Mann &amp; Soli, 1991). </w:t>
+        <w:t xml:space="preserve">/u/ biases listeners towards /s/ responses (Mann &amp; Repp, 1980; Mann &amp; Soli, 1991). </w:t>
       </w:r>
       <w:r>
         <w:rPr>
@@ -1202,13 +1224,27 @@
         <w:rPr>
           <w:szCs w:val="22"/>
         </w:rPr>
-        <w:t xml:space="preserve">McMurray &amp; Jongman, 2011, 2016; </w:t>
+        <w:t xml:space="preserve">McMurray &amp; </w:t>
       </w:r>
       <w:proofErr w:type="spellStart"/>
       <w:r>
         <w:rPr>
           <w:szCs w:val="22"/>
         </w:rPr>
+        <w:t>Jongman</w:t>
+      </w:r>
+      <w:proofErr w:type="spellEnd"/>
+      <w:r>
+        <w:rPr>
+          <w:szCs w:val="22"/>
+        </w:rPr>
+        <w:t xml:space="preserve">, 2011, 2016; </w:t>
+      </w:r>
+      <w:proofErr w:type="spellStart"/>
+      <w:r>
+        <w:rPr>
+          <w:szCs w:val="22"/>
+        </w:rPr>
         <w:t>Syrdal</w:t>
       </w:r>
       <w:proofErr w:type="spellEnd"/>
@@ -1216,21 +1252,7 @@
         <w:rPr>
           <w:szCs w:val="22"/>
         </w:rPr>
-        <w:t xml:space="preserve"> &amp; Gopal, 1986; for review, see </w:t>
-      </w:r>
-      <w:proofErr w:type="spellStart"/>
-      <w:r>
-        <w:rPr>
-          <w:szCs w:val="22"/>
-        </w:rPr>
-        <w:t>Weatherholtz</w:t>
-      </w:r>
-      <w:proofErr w:type="spellEnd"/>
-      <w:r>
-        <w:rPr>
-          <w:szCs w:val="22"/>
-        </w:rPr>
-        <w:t xml:space="preserve"> &amp; Jaeger, 2016</w:t>
+        <w:t xml:space="preserve"> &amp; Gopal, 1986; for review, see Weatherholtz &amp; Jaeger, 2016</w:t>
       </w:r>
       <w:r>
         <w:rPr>
@@ -1363,21 +1385,7 @@
         <w:rPr>
           <w:szCs w:val="22"/>
         </w:rPr>
-        <w:t xml:space="preserve">; Kang et al., 2016; </w:t>
-      </w:r>
-      <w:proofErr w:type="spellStart"/>
-      <w:r>
-        <w:rPr>
-          <w:szCs w:val="22"/>
-        </w:rPr>
-        <w:t>Mitterer</w:t>
-      </w:r>
-      <w:proofErr w:type="spellEnd"/>
-      <w:r>
-        <w:rPr>
-          <w:szCs w:val="22"/>
-        </w:rPr>
-        <w:t>, 2006</w:t>
+        <w:t>; Kang et al., 2016; Mitterer, 2006</w:t>
       </w:r>
       <w:r>
         <w:rPr>
@@ -2068,7 +2076,21 @@
         <w:rPr>
           <w:szCs w:val="22"/>
         </w:rPr>
-        <w:t xml:space="preserve">from /s/ in English (Jongman, Wayland, &amp; Wong, 2000), both of these </w:t>
+        <w:t xml:space="preserve">from /s/ in English (Jongman, Wayland, &amp; Wong, 2000), </w:t>
+      </w:r>
+      <w:proofErr w:type="gramStart"/>
+      <w:r>
+        <w:rPr>
+          <w:szCs w:val="22"/>
+        </w:rPr>
+        <w:t>both of these</w:t>
+      </w:r>
+      <w:proofErr w:type="gramEnd"/>
+      <w:r>
+        <w:rPr>
+          <w:szCs w:val="22"/>
+        </w:rPr>
+        <w:t xml:space="preserve"> </w:t>
       </w:r>
       <w:r>
         <w:rPr>
@@ -2116,7 +2138,21 @@
         <w:rPr>
           <w:szCs w:val="22"/>
         </w:rPr>
-        <w:t xml:space="preserve">te for either or both of these effects of the pen on articulation, it should bias their perception towards </w:t>
+        <w:t xml:space="preserve">te for either or </w:t>
+      </w:r>
+      <w:proofErr w:type="gramStart"/>
+      <w:r>
+        <w:rPr>
+          <w:szCs w:val="22"/>
+        </w:rPr>
+        <w:t>both of these</w:t>
+      </w:r>
+      <w:proofErr w:type="gramEnd"/>
+      <w:r>
+        <w:rPr>
+          <w:szCs w:val="22"/>
+        </w:rPr>
+        <w:t xml:space="preserve"> effects of the pen on articulation, it should bias their perception towards </w:t>
       </w:r>
       <w:r>
         <w:rPr>
@@ -2183,7 +2219,21 @@
         <w:rPr>
           <w:szCs w:val="22"/>
         </w:rPr>
-        <w:t xml:space="preserve"> in a separate line of</w:t>
+        <w:t xml:space="preserve"> </w:t>
+      </w:r>
+      <w:del w:id="2" w:author="Karboga, Gevher" w:date="2025-05-20T16:59:00Z" w16du:dateUtc="2025-05-20T20:59:00Z">
+        <w:r>
+          <w:rPr>
+            <w:szCs w:val="22"/>
+          </w:rPr>
+          <w:delText xml:space="preserve">in </w:delText>
+        </w:r>
+      </w:del>
+      <w:r>
+        <w:rPr>
+          <w:szCs w:val="22"/>
+        </w:rPr>
+        <w:t>a separate line of</w:t>
       </w:r>
       <w:r>
         <w:rPr>
@@ -2219,21 +2269,7 @@
         <w:rPr>
           <w:szCs w:val="22"/>
         </w:rPr>
-        <w:t xml:space="preserve"> (e.g., </w:t>
-      </w:r>
-      <w:proofErr w:type="spellStart"/>
-      <w:r>
-        <w:rPr>
-          <w:szCs w:val="22"/>
-        </w:rPr>
-        <w:t>Kraljic</w:t>
-      </w:r>
-      <w:proofErr w:type="spellEnd"/>
-      <w:r>
-        <w:rPr>
-          <w:szCs w:val="22"/>
-        </w:rPr>
-        <w:t xml:space="preserve"> &amp; Samuel, 2006; Norris et al., 2003)</w:t>
+        <w:t xml:space="preserve"> (e.g., Kraljic &amp; Samuel, 2006; Norris et al., 2003)</w:t>
       </w:r>
       <w:r>
         <w:rPr>
@@ -2329,21 +2365,7 @@
         <w:rPr>
           <w:szCs w:val="22"/>
         </w:rPr>
-        <w:t xml:space="preserve">, in </w:t>
-      </w:r>
-      <w:proofErr w:type="spellStart"/>
-      <w:r>
-        <w:rPr>
-          <w:szCs w:val="22"/>
-        </w:rPr>
-        <w:t>Kraljic</w:t>
-      </w:r>
-      <w:proofErr w:type="spellEnd"/>
-      <w:r>
-        <w:rPr>
-          <w:szCs w:val="22"/>
-        </w:rPr>
-        <w:t xml:space="preserve"> and Samuel, 2006</w:t>
+        <w:t>, in Kraljic and Samuel, 2006</w:t>
       </w:r>
       <w:r>
         <w:rPr>
@@ -2477,16 +2499,8 @@
         <w:rPr>
           <w:szCs w:val="22"/>
         </w:rPr>
-        <w:t xml:space="preserve"> &amp; </w:t>
-      </w:r>
-      <w:proofErr w:type="spellStart"/>
-      <w:r>
-        <w:rPr>
-          <w:szCs w:val="22"/>
-        </w:rPr>
-        <w:t>Kraljic</w:t>
-      </w:r>
-      <w:proofErr w:type="spellEnd"/>
+        <w:t xml:space="preserve"> &amp; Kraljic</w:t>
+      </w:r>
       <w:r>
         <w:rPr>
           <w:szCs w:val="22"/>
@@ -2547,33 +2561,11 @@
         </w:rPr>
         <w:t>if the talker has a pen in the mouth during the pronunciation of the shifted words (</w:t>
       </w:r>
-      <w:proofErr w:type="spellStart"/>
-      <w:r>
-        <w:rPr>
-          <w:szCs w:val="22"/>
-        </w:rPr>
-        <w:t>Kraljic</w:t>
-      </w:r>
-      <w:proofErr w:type="spellEnd"/>
-      <w:r>
-        <w:rPr>
-          <w:szCs w:val="22"/>
-        </w:rPr>
-        <w:t xml:space="preserve"> et al., 2008; </w:t>
-      </w:r>
-      <w:proofErr w:type="spellStart"/>
-      <w:r>
-        <w:rPr>
-          <w:szCs w:val="22"/>
-        </w:rPr>
-        <w:t>Kraljic</w:t>
-      </w:r>
-      <w:proofErr w:type="spellEnd"/>
-      <w:r>
-        <w:rPr>
-          <w:szCs w:val="22"/>
-        </w:rPr>
-        <w:t xml:space="preserve"> &amp; Samuel, 2011; Liu &amp; Jaeger, 2018). As we detail in the general discussion, different learning and memory mechanisms have been evoked as explanation for this blocking</w:t>
+      <w:r>
+        <w:rPr>
+          <w:szCs w:val="22"/>
+        </w:rPr>
+        <w:t>Kraljic et al., 2008; Kraljic &amp; Samuel, 2011; Liu &amp; Jaeger, 2018). As we detail in the general discussion, different learning and memory mechanisms have been evoked as explanation for this blocking</w:t>
       </w:r>
       <w:r>
         <w:rPr>
@@ -2901,21 +2893,7 @@
         <w:rPr>
           <w:szCs w:val="22"/>
         </w:rPr>
-        <w:t xml:space="preserve">blocking of perceptual recalibration when the talker has a pen in the mouth during the shifted pronunciations (e.g., </w:t>
-      </w:r>
-      <w:proofErr w:type="spellStart"/>
-      <w:r>
-        <w:rPr>
-          <w:szCs w:val="22"/>
-        </w:rPr>
-        <w:t>Kraljic</w:t>
-      </w:r>
-      <w:proofErr w:type="spellEnd"/>
-      <w:r>
-        <w:rPr>
-          <w:szCs w:val="22"/>
-        </w:rPr>
-        <w:t xml:space="preserve"> et al., 2008), as described above</w:t>
+        <w:t>blocking of perceptual recalibration when the talker has a pen in the mouth during the shifted pronunciations (e.g., Kraljic et al., 2008), as described above</w:t>
       </w:r>
       <w:r>
         <w:rPr>
@@ -2951,21 +2929,7 @@
         <w:rPr>
           <w:szCs w:val="22"/>
         </w:rPr>
-        <w:t xml:space="preserve">; building on the seminal work of </w:t>
-      </w:r>
-      <w:proofErr w:type="spellStart"/>
-      <w:r>
-        <w:rPr>
-          <w:szCs w:val="22"/>
-        </w:rPr>
-        <w:t>Kraljic</w:t>
-      </w:r>
-      <w:proofErr w:type="spellEnd"/>
-      <w:r>
-        <w:rPr>
-          <w:szCs w:val="22"/>
-        </w:rPr>
-        <w:t xml:space="preserve"> et al., 2008).</w:t>
+        <w:t>; building on the seminal work of Kraljic et al., 2008).</w:t>
       </w:r>
       <w:r>
         <w:rPr>
@@ -2977,7 +2941,21 @@
         <w:rPr>
           <w:szCs w:val="22"/>
         </w:rPr>
-        <w:t xml:space="preserve">Where our design decision for the present work were motivated by the goal to ultimately also address question (2), </w:t>
+        <w:t>Where our design decision</w:t>
+      </w:r>
+      <w:ins w:id="3" w:author="Karboga, Gevher" w:date="2025-05-20T17:02:00Z" w16du:dateUtc="2025-05-20T21:02:00Z">
+        <w:r>
+          <w:rPr>
+            <w:szCs w:val="22"/>
+          </w:rPr>
+          <w:t>s</w:t>
+        </w:r>
+      </w:ins>
+      <w:r>
+        <w:rPr>
+          <w:szCs w:val="22"/>
+        </w:rPr>
+        <w:t xml:space="preserve"> for the present work were motivated by the goal to ultimately also address question (2), </w:t>
       </w:r>
       <w:r>
         <w:rPr>
@@ -3146,7 +3124,15 @@
         <w:t>9.7</w:t>
       </w:r>
       <w:r>
-        <w:t xml:space="preserve">% as Non-Hispanic, and </w:t>
+        <w:t xml:space="preserve">% as </w:t>
+      </w:r>
+      <w:proofErr w:type="gramStart"/>
+      <w:r>
+        <w:t>Non-Hispanic</w:t>
+      </w:r>
+      <w:proofErr w:type="gramEnd"/>
+      <w:r>
+        <w:t xml:space="preserve">, and </w:t>
       </w:r>
       <w:r>
         <w:t>1.9</w:t>
@@ -3902,7 +3888,7 @@
           <w:szCs w:val="22"/>
         </w:rPr>
       </w:pPr>
-      <w:bookmarkStart w:id="0" w:name="_Ref81579849"/>
+      <w:bookmarkStart w:id="4" w:name="_Ref81579849"/>
       <w:r>
         <w:rPr>
           <w:szCs w:val="22"/>
@@ -3941,7 +3927,7 @@
         </w:rPr>
         <w:fldChar w:fldCharType="end"/>
       </w:r>
-      <w:bookmarkEnd w:id="0"/>
+      <w:bookmarkEnd w:id="4"/>
       <w:r>
         <w:rPr>
           <w:szCs w:val="22"/>
@@ -3997,7 +3983,6 @@
         </w:rPr>
         <w:t xml:space="preserve"> items in Experiments 1a-c, illustrating the critical manipulation. Participants saw and heard </w:t>
       </w:r>
-      <w:proofErr w:type="spellStart"/>
       <w:r>
         <w:rPr>
           <w:szCs w:val="22"/>
@@ -4008,14 +3993,7 @@
         <w:rPr>
           <w:szCs w:val="22"/>
         </w:rPr>
-        <w:t>ly</w:t>
-      </w:r>
-      <w:proofErr w:type="spellEnd"/>
-      <w:r>
-        <w:rPr>
-          <w:szCs w:val="22"/>
-        </w:rPr>
-        <w:t xml:space="preserve"> presented speech stimuli </w:t>
+        <w:t xml:space="preserve">ly presented speech stimuli </w:t>
       </w:r>
       <w:r>
         <w:rPr>
@@ -4108,128 +4086,114 @@
         <w:rPr>
           <w:szCs w:val="22"/>
         </w:rPr>
-        <w:t xml:space="preserve">Proctor, </w:t>
+        <w:t xml:space="preserve">Proctor, Shadle, &amp; </w:t>
       </w:r>
       <w:proofErr w:type="spellStart"/>
       <w:r>
         <w:rPr>
           <w:szCs w:val="22"/>
         </w:rPr>
-        <w:t>Shadle</w:t>
+        <w:t>Iskarous</w:t>
       </w:r>
       <w:proofErr w:type="spellEnd"/>
       <w:r>
         <w:rPr>
           <w:szCs w:val="22"/>
         </w:rPr>
-        <w:t xml:space="preserve">, &amp; </w:t>
+        <w:t xml:space="preserve">, </w:t>
+      </w:r>
+      <w:r>
+        <w:rPr>
+          <w:szCs w:val="22"/>
+        </w:rPr>
+        <w:t>2006</w:t>
+      </w:r>
+      <w:r>
+        <w:rPr>
+          <w:szCs w:val="22"/>
+        </w:rPr>
+        <w:t>)</w:t>
+      </w:r>
+      <w:r>
+        <w:rPr>
+          <w:szCs w:val="22"/>
+        </w:rPr>
+        <w:t xml:space="preserve">. </w:t>
+      </w:r>
+      <w:r>
+        <w:rPr>
+          <w:szCs w:val="22"/>
+        </w:rPr>
+        <w:t xml:space="preserve">Speech perception </w:t>
+      </w:r>
+      <w:r>
+        <w:rPr>
+          <w:szCs w:val="22"/>
+        </w:rPr>
+        <w:t xml:space="preserve">is well-known to </w:t>
+      </w:r>
+      <w:r>
+        <w:rPr>
+          <w:szCs w:val="22"/>
+        </w:rPr>
+        <w:t>integrate acoustic and visual information to articulation, and identification responses are known to reflect this integration (McGurk &amp; McDonal</w:t>
+      </w:r>
+      <w:r>
+        <w:rPr>
+          <w:szCs w:val="22"/>
+        </w:rPr>
+        <w:t>d</w:t>
+      </w:r>
+      <w:r>
+        <w:rPr>
+          <w:szCs w:val="22"/>
+        </w:rPr>
+        <w:t xml:space="preserve">, 1976; </w:t>
+      </w:r>
+      <w:r>
+        <w:rPr>
+          <w:szCs w:val="22"/>
+        </w:rPr>
+        <w:t xml:space="preserve">see also </w:t>
       </w:r>
       <w:proofErr w:type="spellStart"/>
       <w:r>
         <w:rPr>
           <w:szCs w:val="22"/>
         </w:rPr>
-        <w:t>Iskarous</w:t>
+        <w:t>Bejjanki</w:t>
       </w:r>
       <w:proofErr w:type="spellEnd"/>
       <w:r>
         <w:rPr>
           <w:szCs w:val="22"/>
         </w:rPr>
-        <w:t xml:space="preserve">, </w:t>
-      </w:r>
-      <w:r>
-        <w:rPr>
-          <w:szCs w:val="22"/>
-        </w:rPr>
-        <w:t>2006</w:t>
-      </w:r>
-      <w:r>
-        <w:rPr>
-          <w:szCs w:val="22"/>
-        </w:rPr>
-        <w:t>)</w:t>
-      </w:r>
-      <w:r>
-        <w:rPr>
-          <w:szCs w:val="22"/>
-        </w:rPr>
-        <w:t xml:space="preserve">. </w:t>
-      </w:r>
-      <w:r>
-        <w:rPr>
-          <w:szCs w:val="22"/>
-        </w:rPr>
-        <w:t xml:space="preserve">Speech perception </w:t>
-      </w:r>
-      <w:r>
-        <w:rPr>
-          <w:szCs w:val="22"/>
-        </w:rPr>
-        <w:t xml:space="preserve">is well-known to </w:t>
-      </w:r>
-      <w:r>
-        <w:rPr>
-          <w:szCs w:val="22"/>
-        </w:rPr>
-        <w:t>integrate acoustic and visual information to articulation, and identification responses are known to reflect this integration (McGurk &amp; McDonal</w:t>
-      </w:r>
-      <w:r>
-        <w:rPr>
-          <w:szCs w:val="22"/>
-        </w:rPr>
-        <w:t>d</w:t>
-      </w:r>
-      <w:r>
-        <w:rPr>
-          <w:szCs w:val="22"/>
-        </w:rPr>
-        <w:t xml:space="preserve">, 1976; </w:t>
-      </w:r>
-      <w:r>
-        <w:rPr>
-          <w:szCs w:val="22"/>
-        </w:rPr>
-        <w:t xml:space="preserve">see also </w:t>
+        <w:t xml:space="preserve"> et al., 2011; </w:t>
+      </w:r>
+      <w:r>
+        <w:rPr>
+          <w:szCs w:val="22"/>
+        </w:rPr>
+        <w:t>Franken et al., 2017</w:t>
+      </w:r>
+      <w:r>
+        <w:rPr>
+          <w:szCs w:val="22"/>
+        </w:rPr>
+        <w:t xml:space="preserve">; </w:t>
       </w:r>
       <w:proofErr w:type="spellStart"/>
       <w:r>
         <w:rPr>
           <w:szCs w:val="22"/>
         </w:rPr>
-        <w:t>Bejjanki</w:t>
+        <w:t>Lüttke</w:t>
       </w:r>
       <w:proofErr w:type="spellEnd"/>
       <w:r>
         <w:rPr>
           <w:szCs w:val="22"/>
         </w:rPr>
-        <w:t xml:space="preserve"> et al., 2011; </w:t>
-      </w:r>
-      <w:r>
-        <w:rPr>
-          <w:szCs w:val="22"/>
-        </w:rPr>
-        <w:t>Franken et al., 2017</w:t>
-      </w:r>
-      <w:r>
-        <w:rPr>
-          <w:szCs w:val="22"/>
-        </w:rPr>
-        <w:t xml:space="preserve">; </w:t>
-      </w:r>
-      <w:proofErr w:type="spellStart"/>
-      <w:r>
-        <w:rPr>
-          <w:szCs w:val="22"/>
-        </w:rPr>
-        <w:t>Lüttke</w:t>
-      </w:r>
-      <w:proofErr w:type="spellEnd"/>
-      <w:r>
-        <w:rPr>
-          <w:szCs w:val="22"/>
-        </w:rPr>
         <w:t xml:space="preserve"> et al., 2018</w:t>
       </w:r>
       <w:r>
@@ -4344,21 +4308,7 @@
         <w:rPr>
           <w:szCs w:val="22"/>
         </w:rPr>
-        <w:t xml:space="preserve"> </w:t>
-      </w:r>
-      <w:proofErr w:type="spellStart"/>
-      <w:r>
-        <w:rPr>
-          <w:szCs w:val="22"/>
-        </w:rPr>
-        <w:t>gradiently</w:t>
-      </w:r>
-      <w:proofErr w:type="spellEnd"/>
-      <w:r>
-        <w:rPr>
-          <w:szCs w:val="22"/>
-        </w:rPr>
-        <w:t xml:space="preserve"> vary</w:t>
+        <w:t xml:space="preserve"> gradiently vary</w:t>
       </w:r>
       <w:r>
         <w:rPr>
@@ -5573,19 +5523,11 @@
         </w:rPr>
         <w:t xml:space="preserve"> pronunciations by a female talker in her twenties—the same recordings elicited in </w:t>
       </w:r>
-      <w:proofErr w:type="spellStart"/>
-      <w:r>
-        <w:rPr>
-          <w:szCs w:val="22"/>
-        </w:rPr>
-        <w:t>Kraljic</w:t>
-      </w:r>
-      <w:proofErr w:type="spellEnd"/>
-      <w:r>
-        <w:rPr>
-          <w:szCs w:val="22"/>
-        </w:rPr>
-        <w:t xml:space="preserve"> et al. (2008</w:t>
+      <w:r>
+        <w:rPr>
+          <w:szCs w:val="22"/>
+        </w:rPr>
+        <w:t>Kraljic et al. (2008</w:t>
       </w:r>
       <w:r>
         <w:rPr>
@@ -5931,21 +5873,7 @@
         <w:rPr>
           <w:szCs w:val="22"/>
         </w:rPr>
-        <w:t xml:space="preserve"> </w:t>
-      </w:r>
-      <w:proofErr w:type="spellStart"/>
-      <w:r>
-        <w:rPr>
-          <w:szCs w:val="22"/>
-        </w:rPr>
-        <w:t>Kraljic</w:t>
-      </w:r>
-      <w:proofErr w:type="spellEnd"/>
-      <w:r>
-        <w:rPr>
-          <w:szCs w:val="22"/>
-        </w:rPr>
-        <w:t xml:space="preserve"> et al., 2008 and </w:t>
+        <w:t xml:space="preserve"> Kraljic et al., 2008 and </w:t>
       </w:r>
       <w:r>
         <w:rPr>
@@ -5978,8 +5906,8 @@
           <w:szCs w:val="22"/>
         </w:rPr>
       </w:pPr>
-      <w:commentRangeStart w:id="1"/>
-      <w:commentRangeStart w:id="2"/>
+      <w:commentRangeStart w:id="5"/>
+      <w:commentRangeStart w:id="6"/>
       <w:r>
         <w:rPr>
           <w:szCs w:val="22"/>
@@ -6064,19 +5992,19 @@
         </w:rPr>
         <w:t xml:space="preserve">, </w:t>
       </w:r>
-      <w:commentRangeEnd w:id="1"/>
+      <w:commentRangeEnd w:id="5"/>
       <w:r>
         <w:rPr>
           <w:rStyle w:val="CommentReference"/>
         </w:rPr>
-        <w:commentReference w:id="1"/>
-      </w:r>
-      <w:commentRangeEnd w:id="2"/>
+        <w:commentReference w:id="5"/>
+      </w:r>
+      <w:commentRangeEnd w:id="6"/>
       <w:r>
         <w:rPr>
           <w:rStyle w:val="CommentReference"/>
         </w:rPr>
-        <w:commentReference w:id="2"/>
+        <w:commentReference w:id="6"/>
       </w:r>
       <w:r>
         <w:rPr>
@@ -6178,21 +6106,7 @@
         <w:rPr>
           <w:szCs w:val="22"/>
         </w:rPr>
-        <w:t xml:space="preserve"> the original video stimuli from </w:t>
-      </w:r>
-      <w:proofErr w:type="spellStart"/>
-      <w:r>
-        <w:rPr>
-          <w:szCs w:val="22"/>
-        </w:rPr>
-        <w:t>Kraljic</w:t>
-      </w:r>
-      <w:proofErr w:type="spellEnd"/>
-      <w:r>
-        <w:rPr>
-          <w:szCs w:val="22"/>
-        </w:rPr>
-        <w:t xml:space="preserve"> et al. (2008) are no longer available. The videos show a female talker of similar age as the one employed in </w:t>
+        <w:t xml:space="preserve"> the original video stimuli from Kraljic et al. (2008) are no longer available. The videos show a female talker of similar age as the one employed in </w:t>
       </w:r>
       <w:r>
         <w:rPr>
@@ -6200,19 +6114,11 @@
         </w:rPr>
         <w:t xml:space="preserve">the audio and video recordings of </w:t>
       </w:r>
-      <w:proofErr w:type="spellStart"/>
-      <w:r>
-        <w:rPr>
-          <w:szCs w:val="22"/>
-        </w:rPr>
-        <w:t>Kraljic</w:t>
-      </w:r>
-      <w:proofErr w:type="spellEnd"/>
-      <w:r>
-        <w:rPr>
-          <w:szCs w:val="22"/>
-        </w:rPr>
-        <w:t xml:space="preserve"> et al. (2008), providing a highly plausible match for the voice of the talker in audio recordings</w:t>
+      <w:r>
+        <w:rPr>
+          <w:szCs w:val="22"/>
+        </w:rPr>
+        <w:t>Kraljic et al. (2008), providing a highly plausible match for the voice of the talker in audio recordings</w:t>
       </w:r>
       <w:r>
         <w:rPr>
@@ -6557,21 +6463,7 @@
         <w:rPr>
           <w:szCs w:val="22"/>
         </w:rPr>
-        <w:t xml:space="preserve">video editing software </w:t>
-      </w:r>
-      <w:proofErr w:type="spellStart"/>
-      <w:r>
-        <w:rPr>
-          <w:szCs w:val="22"/>
-        </w:rPr>
-        <w:t>Shotcut</w:t>
-      </w:r>
-      <w:proofErr w:type="spellEnd"/>
-      <w:r>
-        <w:rPr>
-          <w:szCs w:val="22"/>
-        </w:rPr>
-        <w:t xml:space="preserve"> </w:t>
+        <w:t xml:space="preserve">video editing software Shotcut </w:t>
       </w:r>
       <w:r>
         <w:rPr>
@@ -6871,7 +6763,21 @@
         <w:rPr>
           <w:szCs w:val="22"/>
         </w:rPr>
-        <w:t xml:space="preserve"> eleven of these twelve videos. The twelfth video was replaced with a video in kind because, the results of Experiment 1a indicated a particularly strong visual bias for that video. </w:t>
+        <w:t xml:space="preserve"> eleven of these twelve videos. The twelfth video was replaced with a video in kind because</w:t>
+      </w:r>
+      <w:del w:id="7" w:author="Karboga, Gevher" w:date="2025-05-20T17:44:00Z" w16du:dateUtc="2025-05-20T21:44:00Z">
+        <w:r>
+          <w:rPr>
+            <w:szCs w:val="22"/>
+          </w:rPr>
+          <w:delText>,</w:delText>
+        </w:r>
+      </w:del>
+      <w:r>
+        <w:rPr>
+          <w:szCs w:val="22"/>
+        </w:rPr>
+        <w:t xml:space="preserve"> the results of Experiment 1a indicated a particularly strong visual bias for that video. </w:t>
       </w:r>
     </w:p>
     <w:p>
@@ -7328,7 +7234,21 @@
         <w:rPr>
           <w:szCs w:val="22"/>
         </w:rPr>
-        <w:t xml:space="preserve">. None of the trials during the test phase actually contained a white dot. Participants then completed 72 trials of an </w:t>
+        <w:t>. None of the trials during the test phase actually contained a white dot. Participants then completed 72 trials of a</w:t>
+      </w:r>
+      <w:del w:id="8" w:author="Karboga, Gevher" w:date="2025-05-20T17:46:00Z" w16du:dateUtc="2025-05-20T21:46:00Z">
+        <w:r>
+          <w:rPr>
+            <w:szCs w:val="22"/>
+          </w:rPr>
+          <w:delText>n</w:delText>
+        </w:r>
+      </w:del>
+      <w:r>
+        <w:rPr>
+          <w:szCs w:val="22"/>
+        </w:rPr>
+        <w:t xml:space="preserve"> </w:t>
       </w:r>
       <w:r>
         <w:rPr>
@@ -7439,21 +7359,7 @@
         <w:rPr>
           <w:szCs w:val="22"/>
         </w:rPr>
-        <w:t>The order of test stimuli was determined separately for each participant through constrained randomization that grouped stimuli into blocks and then randomized the order within and across blocks (</w:t>
-      </w:r>
-      <w:proofErr w:type="spellStart"/>
-      <w:r>
-        <w:rPr>
-          <w:szCs w:val="22"/>
-        </w:rPr>
-        <w:t>Kraljic</w:t>
-      </w:r>
-      <w:proofErr w:type="spellEnd"/>
-      <w:r>
-        <w:rPr>
-          <w:szCs w:val="22"/>
-        </w:rPr>
-        <w:t xml:space="preserve"> et al., 2008; Liu &amp; Jaeger, 2018). Specifically, the 72 audiovisual stimuli were grouped into six blocks of 12 stimuli so that each of the 12 video items occurred exactly once within each block. Each block further fully crossed the two pen locations (pen in hand vs. mouth) with the two visual bias conditions (/s/ vs. /</w:t>
+        <w:t>The order of test stimuli was determined separately for each participant through constrained randomization that grouped stimuli into blocks and then randomized the order within and across blocks (Kraljic et al., 2008; Liu &amp; Jaeger, 2018). Specifically, the 72 audiovisual stimuli were grouped into six blocks of 12 stimuli so that each of the 12 video items occurred exactly once within each block. Each block further fully crossed the two pen locations (pen in hand vs. mouth) with the two visual bias conditions (/s/ vs. /</w:t>
       </w:r>
       <w:r>
         <w:rPr>
@@ -7499,7 +7405,21 @@
         <w:rPr>
           <w:szCs w:val="22"/>
         </w:rPr>
-        <w:t xml:space="preserve"> continuum). One of these two instances occurred with the pen in the mouth and one occurred with the pen in the hand. Across the six blocks</w:t>
+        <w:t xml:space="preserve"> continuum). One of these two instances occurred with the pen in the mouth</w:t>
+      </w:r>
+      <w:ins w:id="9" w:author="Karboga, Gevher" w:date="2025-05-20T17:49:00Z" w16du:dateUtc="2025-05-20T21:49:00Z">
+        <w:r>
+          <w:rPr>
+            <w:szCs w:val="22"/>
+          </w:rPr>
+          <w:t>,</w:t>
+        </w:r>
+      </w:ins>
+      <w:r>
+        <w:rPr>
+          <w:szCs w:val="22"/>
+        </w:rPr>
+        <w:t xml:space="preserve"> and one occurred with the pen in the hand. Across the six blocks</w:t>
       </w:r>
       <w:r>
         <w:rPr>
@@ -7955,8 +7875,8 @@
         </w:rPr>
         <w:t xml:space="preserve"> summarizes the exclusions for all experiments. </w:t>
       </w:r>
-      <w:commentRangeStart w:id="3"/>
-      <w:commentRangeStart w:id="4"/>
+      <w:commentRangeStart w:id="10"/>
+      <w:commentRangeStart w:id="11"/>
       <w:r>
         <w:rPr>
           <w:szCs w:val="22"/>
@@ -7993,7 +7913,7 @@
         </w:rPr>
         <w:t>(</w:t>
       </w:r>
-      <w:commentRangeStart w:id="5"/>
+      <w:commentRangeStart w:id="12"/>
       <w:r>
         <w:rPr>
           <w:szCs w:val="22"/>
@@ -8006,12 +7926,12 @@
         </w:rPr>
         <w:t xml:space="preserve"> </w:t>
       </w:r>
-      <w:commentRangeEnd w:id="5"/>
+      <w:commentRangeEnd w:id="12"/>
       <w:r>
         <w:rPr>
           <w:rStyle w:val="CommentReference"/>
         </w:rPr>
-        <w:commentReference w:id="5"/>
+        <w:commentReference w:id="12"/>
       </w:r>
       <w:r>
         <w:rPr>
@@ -8151,19 +8071,19 @@
         </w:rPr>
         <w:t>never the case.</w:t>
       </w:r>
-      <w:commentRangeEnd w:id="3"/>
+      <w:commentRangeEnd w:id="10"/>
       <w:r>
         <w:rPr>
           <w:rStyle w:val="CommentReference"/>
         </w:rPr>
-        <w:commentReference w:id="3"/>
-      </w:r>
-      <w:commentRangeEnd w:id="4"/>
+        <w:commentReference w:id="10"/>
+      </w:r>
+      <w:commentRangeEnd w:id="11"/>
       <w:r>
         <w:rPr>
           <w:rStyle w:val="CommentReference"/>
         </w:rPr>
-        <w:commentReference w:id="4"/>
+        <w:commentReference w:id="11"/>
       </w:r>
     </w:p>
     <w:p>
@@ -8173,7 +8093,7 @@
           <w:szCs w:val="22"/>
         </w:rPr>
       </w:pPr>
-      <w:bookmarkStart w:id="6" w:name="_Ref136088042"/>
+      <w:bookmarkStart w:id="13" w:name="_Ref136088042"/>
       <w:r>
         <w:lastRenderedPageBreak/>
         <w:t>T</w:t>
@@ -8189,7 +8109,7 @@
           <w:t>1</w:t>
         </w:r>
       </w:fldSimple>
-      <w:bookmarkEnd w:id="6"/>
+      <w:bookmarkEnd w:id="13"/>
       <w:r>
         <w:tab/>
         <w:t xml:space="preserve">Exclusions for all experiments reported. </w:t>
@@ -10747,11 +10667,9 @@
       <w:r>
         <w:t xml:space="preserve"> as monotonically ordered categorical predictors (</w:t>
       </w:r>
-      <w:proofErr w:type="spellStart"/>
       <w:r>
         <w:t>Bürkner</w:t>
       </w:r>
-      <w:proofErr w:type="spellEnd"/>
       <w:r>
         <w:t xml:space="preserve"> &amp; Charpentier</w:t>
       </w:r>
@@ -10768,7 +10686,21 @@
         <w:rPr>
           <w:szCs w:val="22"/>
         </w:rPr>
-        <w:t xml:space="preserve"> This avoids the linearity assumption made in most previous analyses of perceptual recalibration experiments, allowing changes across continuum steps or from block to block have non-linear effects, while still constraining effects to be monotonic.</w:t>
+        <w:t xml:space="preserve"> This avoids the linearity assumption made in most previous analyses of perceptual recalibration experiments, allowing changes across continuum steps or from block to block </w:t>
+      </w:r>
+      <w:ins w:id="14" w:author="Karboga, Gevher" w:date="2025-05-20T18:00:00Z" w16du:dateUtc="2025-05-20T22:00:00Z">
+        <w:r>
+          <w:rPr>
+            <w:szCs w:val="22"/>
+          </w:rPr>
+          <w:t xml:space="preserve">to </w:t>
+        </w:r>
+      </w:ins>
+      <w:r>
+        <w:rPr>
+          <w:szCs w:val="22"/>
+        </w:rPr>
+        <w:t>have non-linear effects, while still constraining effects to be monotonic.</w:t>
       </w:r>
       <w:r>
         <w:rPr>
@@ -10820,27 +10752,27 @@
         </w:rPr>
         <w:t xml:space="preserve">the three design variables </w:t>
       </w:r>
-      <w:commentRangeStart w:id="7"/>
-      <w:commentRangeStart w:id="8"/>
+      <w:commentRangeStart w:id="16"/>
+      <w:commentRangeStart w:id="17"/>
       <w:r>
         <w:rPr>
           <w:szCs w:val="22"/>
         </w:rPr>
         <w:t>pen location</w:t>
       </w:r>
-      <w:commentRangeEnd w:id="7"/>
+      <w:commentRangeEnd w:id="16"/>
       <w:r>
         <w:rPr>
           <w:rStyle w:val="CommentReference"/>
         </w:rPr>
-        <w:commentReference w:id="7"/>
-      </w:r>
-      <w:commentRangeEnd w:id="8"/>
+        <w:commentReference w:id="16"/>
+      </w:r>
+      <w:commentRangeEnd w:id="17"/>
       <w:r>
         <w:rPr>
           <w:rStyle w:val="CommentReference"/>
         </w:rPr>
-        <w:commentReference w:id="8"/>
+        <w:commentReference w:id="17"/>
       </w:r>
       <w:r>
         <w:rPr>
@@ -10889,13 +10821,60 @@
         <w:rPr>
           <w:szCs w:val="22"/>
         </w:rPr>
-        <w:t xml:space="preserve">We followed recommended practice and use weakly regularizing priors to facilitate model convergence, </w:t>
-      </w:r>
-      <w:r>
-        <w:rPr>
-          <w:szCs w:val="22"/>
-        </w:rPr>
-        <w:t xml:space="preserve">specifically </w:t>
+        <w:t>We followed recommended practice and use</w:t>
+      </w:r>
+      <w:ins w:id="18" w:author="Karboga, Gevher" w:date="2025-05-20T18:02:00Z" w16du:dateUtc="2025-05-20T22:02:00Z">
+        <w:r>
+          <w:rPr>
+            <w:szCs w:val="22"/>
+          </w:rPr>
+          <w:t>d</w:t>
+        </w:r>
+      </w:ins>
+      <w:r>
+        <w:rPr>
+          <w:szCs w:val="22"/>
+        </w:rPr>
+        <w:t xml:space="preserve"> weakly regularizing priors to facilitate model convergence</w:t>
+      </w:r>
+      <w:ins w:id="19" w:author="Karboga, Gevher" w:date="2025-05-20T18:07:00Z" w16du:dateUtc="2025-05-20T22:07:00Z">
+        <w:r>
+          <w:t xml:space="preserve"> </w:t>
+        </w:r>
+        <w:r>
+          <w:rPr>
+            <w:szCs w:val="22"/>
+          </w:rPr>
+          <w:t>—</w:t>
+        </w:r>
+      </w:ins>
+      <w:del w:id="20" w:author="Karboga, Gevher" w:date="2025-05-20T18:02:00Z" w16du:dateUtc="2025-05-20T22:02:00Z">
+        <w:r>
+          <w:rPr>
+            <w:szCs w:val="22"/>
+          </w:rPr>
+          <w:delText xml:space="preserve">, </w:delText>
+        </w:r>
+      </w:del>
+      <w:r>
+        <w:rPr>
+          <w:szCs w:val="22"/>
+        </w:rPr>
+        <w:t>specifically</w:t>
+      </w:r>
+      <w:ins w:id="21" w:author="Karboga, Gevher" w:date="2025-05-20T18:02:00Z" w16du:dateUtc="2025-05-20T22:02:00Z">
+        <w:r>
+          <w:rPr>
+            <w:szCs w:val="22"/>
+          </w:rPr>
+          <w:t>,</w:t>
+        </w:r>
+      </w:ins>
+      <w:r>
+        <w:rPr>
+          <w:szCs w:val="22"/>
+        </w:rPr>
+        <w:t xml:space="preserve"> </w:t>
       </w:r>
       <w:r>
         <w:rPr>
@@ -10933,19 +10912,11 @@
         </w:rPr>
         <w:t xml:space="preserve">e.g., </w:t>
       </w:r>
-      <w:proofErr w:type="spellStart"/>
-      <w:r>
-        <w:rPr>
-          <w:szCs w:val="22"/>
-        </w:rPr>
-        <w:t>Hörberg</w:t>
-      </w:r>
-      <w:proofErr w:type="spellEnd"/>
-      <w:r>
-        <w:rPr>
-          <w:szCs w:val="22"/>
-        </w:rPr>
-        <w:t xml:space="preserve"> &amp; Jaeger, 2021; Xie, Liu, &amp; Jaeger, 2021). For fixed effect parameters, we use</w:t>
+      <w:r>
+        <w:rPr>
+          <w:szCs w:val="22"/>
+        </w:rPr>
+        <w:t>Hörberg &amp; Jaeger, 2021; Xie, Liu, &amp; Jaeger, 2021). For fixed effect parameters, we use</w:t>
       </w:r>
       <w:r>
         <w:rPr>
@@ -11135,21 +11106,7 @@
         <w:rPr>
           <w:szCs w:val="22"/>
         </w:rPr>
-        <w:t xml:space="preserve"> (</w:t>
-      </w:r>
-      <w:proofErr w:type="spellStart"/>
-      <w:r>
-        <w:rPr>
-          <w:szCs w:val="22"/>
-        </w:rPr>
-        <w:t>Bürkner</w:t>
-      </w:r>
-      <w:proofErr w:type="spellEnd"/>
-      <w:r>
-        <w:rPr>
-          <w:szCs w:val="22"/>
-        </w:rPr>
-        <w:t>, 2017) in R version 4.</w:t>
+        <w:t xml:space="preserve"> (Bürkner, 2017) in R version 4.</w:t>
       </w:r>
       <w:r>
         <w:rPr>
@@ -11185,7 +11142,7 @@
     <w:p>
       <w:pPr>
         <w:rPr>
-          <w:ins w:id="9" w:author="Cummings, Shawn" w:date="2025-05-12T20:54:00Z" w16du:dateUtc="2025-05-13T00:54:00Z"/>
+          <w:ins w:id="22" w:author="Cummings, Shawn" w:date="2025-05-12T20:54:00Z" w16du:dateUtc="2025-05-13T00:54:00Z"/>
           <w:szCs w:val="22"/>
         </w:rPr>
       </w:pPr>
@@ -11358,8 +11315,8 @@
         </w:rPr>
         <w:t xml:space="preserve">summarizes those tests for all three experiments. </w:t>
       </w:r>
-      <w:commentRangeStart w:id="10"/>
-      <w:commentRangeStart w:id="11"/>
+      <w:commentRangeStart w:id="23"/>
+      <w:commentRangeStart w:id="24"/>
       <w:r>
         <w:rPr>
           <w:szCs w:val="22"/>
@@ -11416,19 +11373,19 @@
         </w:rPr>
         <w:t xml:space="preserve"> continuum steps </w:t>
       </w:r>
-      <w:commentRangeEnd w:id="10"/>
+      <w:commentRangeEnd w:id="23"/>
       <w:r>
         <w:rPr>
           <w:rStyle w:val="CommentReference"/>
         </w:rPr>
-        <w:commentReference w:id="10"/>
-      </w:r>
-      <w:commentRangeEnd w:id="11"/>
+        <w:commentReference w:id="23"/>
+      </w:r>
+      <w:commentRangeEnd w:id="24"/>
       <w:r>
         <w:rPr>
           <w:rStyle w:val="CommentReference"/>
         </w:rPr>
-        <w:commentReference w:id="11"/>
+        <w:commentReference w:id="24"/>
       </w:r>
       <w:r>
         <w:rPr>
@@ -11503,11 +11460,11 @@
         <w:rPr>
           <w:szCs w:val="22"/>
         </w:rPr>
-        <w:pPrChange w:id="12" w:author="Cummings, Shawn" w:date="2025-05-12T20:55:00Z" w16du:dateUtc="2025-05-13T00:55:00Z">
+        <w:pPrChange w:id="25" w:author="Cummings, Shawn" w:date="2025-05-12T20:55:00Z" w16du:dateUtc="2025-05-13T00:55:00Z">
           <w:pPr/>
         </w:pPrChange>
       </w:pPr>
-      <w:ins w:id="13" w:author="Cummings, Shawn" w:date="2025-05-12T20:54:00Z" w16du:dateUtc="2025-05-13T00:54:00Z">
+      <w:ins w:id="26" w:author="Cummings, Shawn" w:date="2025-05-12T20:54:00Z" w16du:dateUtc="2025-05-13T00:54:00Z">
         <w:r>
           <w:rPr>
             <w:noProof/>
@@ -11565,11 +11522,11 @@
           <w:docGrid w:linePitch="360"/>
         </w:sectPr>
       </w:pPr>
-      <w:bookmarkStart w:id="14" w:name="_Ref136190394"/>
-      <w:commentRangeStart w:id="15"/>
-      <w:commentRangeStart w:id="16"/>
-      <w:commentRangeStart w:id="17"/>
-      <w:del w:id="18" w:author="Cummings, Shawn" w:date="2025-05-12T20:53:00Z" w16du:dateUtc="2025-05-13T00:53:00Z">
+      <w:bookmarkStart w:id="27" w:name="_Ref136190394"/>
+      <w:commentRangeStart w:id="28"/>
+      <w:commentRangeStart w:id="29"/>
+      <w:commentRangeStart w:id="30"/>
+      <w:del w:id="31" w:author="Cummings, Shawn" w:date="2025-05-12T20:53:00Z" w16du:dateUtc="2025-05-13T00:53:00Z">
         <w:r>
           <w:rPr>
             <w:noProof/>
@@ -11627,7 +11584,7 @@
           </w:drawing>
         </w:r>
       </w:del>
-      <w:commentRangeEnd w:id="15"/>
+      <w:commentRangeEnd w:id="28"/>
       <w:r>
         <w:rPr>
           <w:rStyle w:val="CommentReference"/>
@@ -11635,9 +11592,9 @@
           <w:iCs w:val="0"/>
           <w:color w:val="auto"/>
         </w:rPr>
-        <w:commentReference w:id="15"/>
-      </w:r>
-      <w:commentRangeEnd w:id="16"/>
+        <w:commentReference w:id="28"/>
+      </w:r>
+      <w:commentRangeEnd w:id="29"/>
       <w:r>
         <w:rPr>
           <w:rStyle w:val="CommentReference"/>
@@ -11645,9 +11602,9 @@
           <w:iCs w:val="0"/>
           <w:color w:val="auto"/>
         </w:rPr>
-        <w:commentReference w:id="16"/>
-      </w:r>
-      <w:commentRangeEnd w:id="17"/>
+        <w:commentReference w:id="29"/>
+      </w:r>
+      <w:commentRangeEnd w:id="30"/>
       <w:r>
         <w:rPr>
           <w:rStyle w:val="CommentReference"/>
@@ -11655,7 +11612,7 @@
           <w:iCs w:val="0"/>
           <w:color w:val="auto"/>
         </w:rPr>
-        <w:commentReference w:id="17"/>
+        <w:commentReference w:id="30"/>
       </w:r>
       <w:r>
         <w:rPr>
@@ -11701,7 +11658,7 @@
         </w:rPr>
         <w:fldChar w:fldCharType="end"/>
       </w:r>
-      <w:bookmarkEnd w:id="14"/>
+      <w:bookmarkEnd w:id="27"/>
       <w:r>
         <w:rPr>
           <w:szCs w:val="22"/>
@@ -11801,7 +11758,7 @@
       <w:pPr>
         <w:pStyle w:val="Caption"/>
       </w:pPr>
-      <w:bookmarkStart w:id="19" w:name="_Ref136190384"/>
+      <w:bookmarkStart w:id="32" w:name="_Ref136190384"/>
       <w:r>
         <w:rPr>
           <w:szCs w:val="22"/>
@@ -11841,7 +11798,7 @@
         </w:rPr>
         <w:fldChar w:fldCharType="end"/>
       </w:r>
-      <w:bookmarkEnd w:id="19"/>
+      <w:bookmarkEnd w:id="32"/>
       <w:r>
         <w:rPr>
           <w:szCs w:val="22"/>
@@ -15822,21 +15779,7 @@
         <w:rPr>
           <w:szCs w:val="22"/>
         </w:rPr>
-        <w:t xml:space="preserve">Massaro &amp; Friedman, 1990; Bicknell, </w:t>
-      </w:r>
-      <w:proofErr w:type="spellStart"/>
-      <w:r>
-        <w:rPr>
-          <w:szCs w:val="22"/>
-        </w:rPr>
-        <w:t>Bushong</w:t>
-      </w:r>
-      <w:proofErr w:type="spellEnd"/>
-      <w:r>
-        <w:rPr>
-          <w:szCs w:val="22"/>
-        </w:rPr>
-        <w:t xml:space="preserve">, </w:t>
+        <w:t xml:space="preserve">Massaro &amp; Friedman, 1990; Bicknell, Bushong, </w:t>
       </w:r>
       <w:proofErr w:type="spellStart"/>
       <w:r>
@@ -15907,7 +15850,7 @@
           <w:szCs w:val="22"/>
         </w:rPr>
       </w:pPr>
-      <w:commentRangeStart w:id="20"/>
+      <w:commentRangeStart w:id="33"/>
       <w:r>
         <w:rPr>
           <w:szCs w:val="22"/>
@@ -15936,7 +15879,21 @@
         <w:rPr>
           <w:szCs w:val="22"/>
         </w:rPr>
-        <w:t xml:space="preserve">clearly affected participants </w:t>
+        <w:t>clearly affected participants</w:t>
+      </w:r>
+      <w:ins w:id="34" w:author="Karboga, Gevher" w:date="2025-05-20T15:10:00Z" w16du:dateUtc="2025-05-20T19:10:00Z">
+        <w:r>
+          <w:rPr>
+            <w:szCs w:val="22"/>
+          </w:rPr>
+          <w:t>’</w:t>
+        </w:r>
+      </w:ins>
+      <w:r>
+        <w:rPr>
+          <w:szCs w:val="22"/>
+        </w:rPr>
+        <w:t xml:space="preserve"> </w:t>
       </w:r>
       <w:r>
         <w:rPr>
@@ -16060,12 +16017,12 @@
         </w:rPr>
         <w:t>.</w:t>
       </w:r>
-      <w:commentRangeEnd w:id="20"/>
+      <w:commentRangeEnd w:id="33"/>
       <w:r>
         <w:rPr>
           <w:rStyle w:val="CommentReference"/>
         </w:rPr>
-        <w:commentReference w:id="20"/>
+        <w:commentReference w:id="33"/>
       </w:r>
     </w:p>
     <w:p>
@@ -16229,7 +16186,21 @@
         <w:rPr>
           <w:szCs w:val="22"/>
         </w:rPr>
-        <w:t xml:space="preserve"> This effect was larger when for tokens that were acoustically or visually more </w:t>
+        <w:t xml:space="preserve"> This effect was larger </w:t>
+      </w:r>
+      <w:del w:id="35" w:author="Karboga, Gevher" w:date="2025-05-20T18:11:00Z" w16du:dateUtc="2025-05-20T22:11:00Z">
+        <w:r>
+          <w:rPr>
+            <w:szCs w:val="22"/>
+          </w:rPr>
+          <w:delText xml:space="preserve">when </w:delText>
+        </w:r>
+      </w:del>
+      <w:r>
+        <w:rPr>
+          <w:szCs w:val="22"/>
+        </w:rPr>
+        <w:t xml:space="preserve">for tokens that were acoustically or visually more </w:t>
       </w:r>
       <w:proofErr w:type="spellStart"/>
       <w:r>
@@ -16300,21 +16271,7 @@
         <w:rPr>
           <w:szCs w:val="22"/>
         </w:rPr>
-        <w:t xml:space="preserve"> integration. It is well established that non-phonetic, non-acoustic factors are integrated in perception. For example, </w:t>
-      </w:r>
-      <w:proofErr w:type="spellStart"/>
-      <w:r>
-        <w:rPr>
-          <w:szCs w:val="22"/>
-        </w:rPr>
-        <w:t>Gick</w:t>
-      </w:r>
-      <w:proofErr w:type="spellEnd"/>
-      <w:r>
-        <w:rPr>
-          <w:szCs w:val="22"/>
-        </w:rPr>
-        <w:t xml:space="preserve"> &amp; Derrick (2009) found that feeling a burst of air on the skin—consistent with the aspiration of a /p/ but not with /b/</w:t>
+        <w:t xml:space="preserve"> integration. It is well established that non-phonetic, non-acoustic factors are integrated in perception. For example, Gick &amp; Derrick (2009) found that feeling a burst of air on the skin—consistent with the aspiration of a /p/ but not with /b/</w:t>
       </w:r>
       <w:r>
         <w:rPr>
@@ -16508,7 +16465,21 @@
         <w:rPr>
           <w:szCs w:val="22"/>
         </w:rPr>
-        <w:t xml:space="preserve">. Similarly, if listeners ignored the pen, or if the effects of the pen on articulation, were not sufficiently visually evident, we should have failed to find </w:t>
+        <w:t>. Similarly, if listeners ignored the pen, or if the effects of the pen on articulation</w:t>
+      </w:r>
+      <w:del w:id="36" w:author="Karboga, Gevher" w:date="2025-05-20T18:13:00Z" w16du:dateUtc="2025-05-20T22:13:00Z">
+        <w:r>
+          <w:rPr>
+            <w:szCs w:val="22"/>
+          </w:rPr>
+          <w:delText>,</w:delText>
+        </w:r>
+      </w:del>
+      <w:r>
+        <w:rPr>
+          <w:szCs w:val="22"/>
+        </w:rPr>
+        <w:t xml:space="preserve"> were not sufficiently visually evident, we should have failed to find </w:t>
       </w:r>
       <w:r>
         <w:rPr>
@@ -17115,7 +17086,7 @@
           <w:szCs w:val="22"/>
         </w:rPr>
       </w:pPr>
-      <w:bookmarkStart w:id="21" w:name="_Ref136084921"/>
+      <w:bookmarkStart w:id="37" w:name="_Ref136084921"/>
       <w:r>
         <w:rPr>
           <w:szCs w:val="22"/>
@@ -17154,7 +17125,7 @@
         </w:rPr>
         <w:fldChar w:fldCharType="end"/>
       </w:r>
-      <w:bookmarkEnd w:id="21"/>
+      <w:bookmarkEnd w:id="37"/>
       <w:r>
         <w:rPr>
           <w:szCs w:val="22"/>
@@ -17401,21 +17372,7 @@
         <w:rPr>
           <w:szCs w:val="22"/>
         </w:rPr>
-        <w:t xml:space="preserve"> Fowler’s conjecture. Previous work has found effects of visually presented phonetic context to be strongest when the relevant visual evidence—e.g., of lip-rounding—is particularly clear (e.g., </w:t>
-      </w:r>
-      <w:proofErr w:type="spellStart"/>
-      <w:r>
-        <w:rPr>
-          <w:szCs w:val="22"/>
-        </w:rPr>
-        <w:t>Mitterer</w:t>
-      </w:r>
-      <w:proofErr w:type="spellEnd"/>
-      <w:r>
-        <w:rPr>
-          <w:szCs w:val="22"/>
-        </w:rPr>
-        <w:t xml:space="preserve">, 2006; Kang et al., 2016 vs. </w:t>
+        <w:t xml:space="preserve"> Fowler’s conjecture. Previous work has found effects of visually presented phonetic context to be strongest when the relevant visual evidence—e.g., of lip-rounding—is particularly clear (e.g., Mitterer, 2006; Kang et al., 2016 vs. </w:t>
       </w:r>
       <w:proofErr w:type="spellStart"/>
       <w:r>
@@ -17454,7 +17411,21 @@
         <w:rPr>
           <w:szCs w:val="22"/>
         </w:rPr>
-        <w:t xml:space="preserve">Second, Experiment 2 allows us to test whether the decreased rate of </w:t>
+        <w:t xml:space="preserve">Second, </w:t>
+      </w:r>
+      <w:proofErr w:type="gramStart"/>
+      <w:r>
+        <w:rPr>
+          <w:szCs w:val="22"/>
+        </w:rPr>
+        <w:t>Experiment</w:t>
+      </w:r>
+      <w:proofErr w:type="gramEnd"/>
+      <w:r>
+        <w:rPr>
+          <w:szCs w:val="22"/>
+        </w:rPr>
+        <w:t xml:space="preserve"> 2 allows us to test whether the decreased rate of </w:t>
       </w:r>
       <w:proofErr w:type="spellStart"/>
       <w:r>
@@ -17803,7 +17774,21 @@
         <w:rPr>
           <w:szCs w:val="22"/>
         </w:rPr>
-        <w:t>In cases where the talker moved during production, the size of the rectangle was increased such that the above criterion always applied. This gave rise slightly different dimensions between different video frames.</w:t>
+        <w:t xml:space="preserve">In cases where the talker moved during production, the size of the rectangle was increased such that the above criterion always applied. This gave rise </w:t>
+      </w:r>
+      <w:ins w:id="38" w:author="Karboga, Gevher" w:date="2025-05-20T15:09:00Z" w16du:dateUtc="2025-05-20T19:09:00Z">
+        <w:r>
+          <w:rPr>
+            <w:szCs w:val="22"/>
+          </w:rPr>
+          <w:t xml:space="preserve">to </w:t>
+        </w:r>
+      </w:ins>
+      <w:r>
+        <w:rPr>
+          <w:szCs w:val="22"/>
+        </w:rPr>
+        <w:t>slightly different dimensions between different video frames.</w:t>
       </w:r>
       <w:r>
         <w:rPr>
@@ -18693,7 +18678,7 @@
           <w:szCs w:val="22"/>
         </w:rPr>
       </w:pPr>
-      <w:bookmarkStart w:id="22" w:name="_Ref136190811"/>
+      <w:bookmarkStart w:id="39" w:name="_Ref136190811"/>
       <w:r>
         <w:rPr>
           <w:szCs w:val="22"/>
@@ -18732,7 +18717,7 @@
         </w:rPr>
         <w:fldChar w:fldCharType="end"/>
       </w:r>
-      <w:bookmarkEnd w:id="22"/>
+      <w:bookmarkEnd w:id="39"/>
       <w:r>
         <w:rPr>
           <w:szCs w:val="22"/>
@@ -18839,7 +18824,7 @@
       <w:pPr>
         <w:pStyle w:val="Caption"/>
       </w:pPr>
-      <w:bookmarkStart w:id="23" w:name="_Ref136190818"/>
+      <w:bookmarkStart w:id="40" w:name="_Ref136190818"/>
       <w:r>
         <w:rPr>
           <w:szCs w:val="22"/>
@@ -18879,7 +18864,7 @@
         </w:rPr>
         <w:fldChar w:fldCharType="end"/>
       </w:r>
-      <w:bookmarkEnd w:id="23"/>
+      <w:bookmarkEnd w:id="40"/>
       <w:r>
         <w:rPr>
           <w:szCs w:val="22"/>
@@ -21085,7 +21070,21 @@
         <w:rPr>
           <w:szCs w:val="22"/>
         </w:rPr>
-        <w:t>ogether t</w:t>
+        <w:t>ogether</w:t>
+      </w:r>
+      <w:ins w:id="41" w:author="Karboga, Gevher" w:date="2025-05-20T18:25:00Z" w16du:dateUtc="2025-05-20T22:25:00Z">
+        <w:r>
+          <w:rPr>
+            <w:szCs w:val="22"/>
+          </w:rPr>
+          <w:t>,</w:t>
+        </w:r>
+      </w:ins>
+      <w:r>
+        <w:rPr>
+          <w:szCs w:val="22"/>
+        </w:rPr>
+        <w:t xml:space="preserve"> t</w:t>
       </w:r>
       <w:r>
         <w:rPr>
@@ -21127,7 +21126,21 @@
         <w:rPr>
           <w:szCs w:val="22"/>
         </w:rPr>
-        <w:t xml:space="preserve">suggests that a pen in the mouth of the talker is </w:t>
+        <w:t>suggest</w:t>
+      </w:r>
+      <w:del w:id="42" w:author="Karboga, Gevher" w:date="2025-05-20T18:25:00Z" w16du:dateUtc="2025-05-20T22:25:00Z">
+        <w:r>
+          <w:rPr>
+            <w:szCs w:val="22"/>
+          </w:rPr>
+          <w:delText>s</w:delText>
+        </w:r>
+      </w:del>
+      <w:r>
+        <w:rPr>
+          <w:szCs w:val="22"/>
+        </w:rPr>
+        <w:t xml:space="preserve"> that a pen in the mouth of the talker is </w:t>
       </w:r>
       <w:r>
         <w:rPr>
@@ -21150,6 +21163,7 @@
           <w:szCs w:val="22"/>
         </w:rPr>
       </w:pPr>
+      <w:commentRangeStart w:id="43"/>
       <w:r>
         <w:rPr>
           <w:szCs w:val="22"/>
@@ -21267,7 +21281,20 @@
         <w:rPr>
           <w:szCs w:val="22"/>
         </w:rPr>
-        <w:t xml:space="preserve"> condition in Experiment 1c. There is, however, also some evidence that visual occlusion might explain </w:t>
+        <w:t xml:space="preserve"> condition in Experiment 1c. </w:t>
+      </w:r>
+      <w:commentRangeEnd w:id="43"/>
+      <w:r>
+        <w:rPr>
+          <w:rStyle w:val="CommentReference"/>
+        </w:rPr>
+        <w:commentReference w:id="43"/>
+      </w:r>
+      <w:r>
+        <w:rPr>
+          <w:szCs w:val="22"/>
+        </w:rPr>
+        <w:t xml:space="preserve">There is, however, also some evidence that visual occlusion might explain </w:t>
       </w:r>
       <w:r>
         <w:rPr>
@@ -21751,19 +21778,25 @@
         </w:rPr>
         <w:t xml:space="preserve">. </w:t>
       </w:r>
-      <w:proofErr w:type="spellStart"/>
-      <w:r>
-        <w:rPr>
-          <w:szCs w:val="22"/>
-        </w:rPr>
-        <w:t>Coimpared</w:t>
-      </w:r>
-      <w:proofErr w:type="spellEnd"/>
-      <w:r>
-        <w:rPr>
-          <w:szCs w:val="22"/>
-        </w:rPr>
-        <w:t xml:space="preserve"> to Experiments 1a-c, l</w:t>
+      <w:r>
+        <w:rPr>
+          <w:szCs w:val="22"/>
+        </w:rPr>
+        <w:t>Co</w:t>
+      </w:r>
+      <w:del w:id="44" w:author="Karboga, Gevher" w:date="2025-05-20T15:10:00Z" w16du:dateUtc="2025-05-20T19:10:00Z">
+        <w:r>
+          <w:rPr>
+            <w:szCs w:val="22"/>
+          </w:rPr>
+          <w:delText>i</w:delText>
+        </w:r>
+      </w:del>
+      <w:r>
+        <w:rPr>
+          <w:szCs w:val="22"/>
+        </w:rPr>
+        <w:t>mpared to Experiments 1a-c, l</w:t>
       </w:r>
       <w:r>
         <w:rPr>
@@ -21898,8 +21931,8 @@
         </w:rPr>
         <w:t xml:space="preserve"> not significantly higher in Experiment </w:t>
       </w:r>
-      <w:commentRangeStart w:id="24"/>
-      <w:commentRangeStart w:id="25"/>
+      <w:commentRangeStart w:id="45"/>
+      <w:commentRangeStart w:id="46"/>
       <w:r>
         <w:rPr>
           <w:szCs w:val="22"/>
@@ -21912,7 +21945,7 @@
         </w:rPr>
         <w:t xml:space="preserve"> (mean log-RT = </w:t>
       </w:r>
-      <w:ins w:id="26" w:author="Cummings, Shawn" w:date="2025-05-12T21:06:00Z" w16du:dateUtc="2025-05-13T01:06:00Z">
+      <w:ins w:id="47" w:author="Cummings, Shawn" w:date="2025-05-12T21:06:00Z" w16du:dateUtc="2025-05-13T01:06:00Z">
         <w:r>
           <w:rPr>
             <w:szCs w:val="22"/>
@@ -21920,7 +21953,7 @@
           <w:t>3.45</w:t>
         </w:r>
       </w:ins>
-      <w:del w:id="27" w:author="Cummings, Shawn" w:date="2025-05-12T21:06:00Z" w16du:dateUtc="2025-05-13T01:06:00Z">
+      <w:del w:id="48" w:author="Cummings, Shawn" w:date="2025-05-12T21:06:00Z" w16du:dateUtc="2025-05-13T01:06:00Z">
         <w:r>
           <w:rPr>
             <w:szCs w:val="22"/>
@@ -21934,7 +21967,7 @@
         </w:rPr>
         <w:t xml:space="preserve">, SD = </w:t>
       </w:r>
-      <w:ins w:id="28" w:author="Cummings, Shawn" w:date="2025-05-12T21:07:00Z" w16du:dateUtc="2025-05-13T01:07:00Z">
+      <w:ins w:id="49" w:author="Cummings, Shawn" w:date="2025-05-12T21:07:00Z" w16du:dateUtc="2025-05-13T01:07:00Z">
         <w:r>
           <w:rPr>
             <w:szCs w:val="22"/>
@@ -21942,7 +21975,7 @@
           <w:t>0.14</w:t>
         </w:r>
       </w:ins>
-      <w:del w:id="29" w:author="Cummings, Shawn" w:date="2025-05-12T21:07:00Z" w16du:dateUtc="2025-05-13T01:07:00Z">
+      <w:del w:id="50" w:author="Cummings, Shawn" w:date="2025-05-12T21:07:00Z" w16du:dateUtc="2025-05-13T01:07:00Z">
         <w:r>
           <w:rPr>
             <w:szCs w:val="22"/>
@@ -21956,7 +21989,7 @@
         </w:rPr>
         <w:t xml:space="preserve">), compared to Experiments 1a-c (mean = </w:t>
       </w:r>
-      <w:ins w:id="30" w:author="Cummings, Shawn" w:date="2025-05-12T21:09:00Z" w16du:dateUtc="2025-05-13T01:09:00Z">
+      <w:ins w:id="51" w:author="Cummings, Shawn" w:date="2025-05-12T21:09:00Z" w16du:dateUtc="2025-05-13T01:09:00Z">
         <w:r>
           <w:rPr>
             <w:szCs w:val="22"/>
@@ -21964,7 +21997,7 @@
           <w:t>3.44</w:t>
         </w:r>
       </w:ins>
-      <w:del w:id="31" w:author="Cummings, Shawn" w:date="2025-05-12T21:09:00Z" w16du:dateUtc="2025-05-13T01:09:00Z">
+      <w:del w:id="52" w:author="Cummings, Shawn" w:date="2025-05-12T21:09:00Z" w16du:dateUtc="2025-05-13T01:09:00Z">
         <w:r>
           <w:rPr>
             <w:szCs w:val="22"/>
@@ -21978,7 +22011,7 @@
         </w:rPr>
         <w:t xml:space="preserve">, SD = </w:t>
       </w:r>
-      <w:ins w:id="32" w:author="Cummings, Shawn" w:date="2025-05-12T21:09:00Z" w16du:dateUtc="2025-05-13T01:09:00Z">
+      <w:ins w:id="53" w:author="Cummings, Shawn" w:date="2025-05-12T21:09:00Z" w16du:dateUtc="2025-05-13T01:09:00Z">
         <w:r>
           <w:rPr>
             <w:szCs w:val="22"/>
@@ -21986,7 +22019,7 @@
           <w:t>0.15</w:t>
         </w:r>
       </w:ins>
-      <w:del w:id="33" w:author="Cummings, Shawn" w:date="2025-05-12T21:09:00Z" w16du:dateUtc="2025-05-13T01:09:00Z">
+      <w:del w:id="54" w:author="Cummings, Shawn" w:date="2025-05-12T21:09:00Z" w16du:dateUtc="2025-05-13T01:09:00Z">
         <w:r>
           <w:rPr>
             <w:szCs w:val="22"/>
@@ -22000,19 +22033,19 @@
         </w:rPr>
         <w:t>)</w:t>
       </w:r>
-      <w:commentRangeEnd w:id="24"/>
+      <w:commentRangeEnd w:id="45"/>
       <w:r>
         <w:rPr>
           <w:rStyle w:val="CommentReference"/>
         </w:rPr>
-        <w:commentReference w:id="24"/>
-      </w:r>
-      <w:commentRangeEnd w:id="25"/>
+        <w:commentReference w:id="45"/>
+      </w:r>
+      <w:commentRangeEnd w:id="46"/>
       <w:r>
         <w:rPr>
           <w:rStyle w:val="CommentReference"/>
         </w:rPr>
-        <w:commentReference w:id="25"/>
+        <w:commentReference w:id="46"/>
       </w:r>
       <w:r>
         <w:rPr>
@@ -22069,7 +22102,7 @@
         </w:rPr>
         <w:t>A second alternative is that while the presence of the pen itself—rather than its impact on the articulators—may be sufficient to induce compensation, the black box</w:t>
       </w:r>
-      <w:commentRangeStart w:id="34"/>
+      <w:commentRangeStart w:id="55"/>
       <w:r>
         <w:rPr>
           <w:szCs w:val="22"/>
@@ -22094,12 +22127,12 @@
         </w:rPr>
         <w:t xml:space="preserve"> less obvious and harder to visually access. </w:t>
       </w:r>
-      <w:commentRangeEnd w:id="34"/>
+      <w:commentRangeEnd w:id="55"/>
       <w:r>
         <w:rPr>
           <w:rStyle w:val="CommentReference"/>
         </w:rPr>
-        <w:commentReference w:id="34"/>
+        <w:commentReference w:id="55"/>
       </w:r>
       <w:r>
         <w:rPr>
@@ -22201,7 +22234,21 @@
         <w:rPr>
           <w:szCs w:val="22"/>
         </w:rPr>
-        <w:t xml:space="preserve">Either of these manipulations would require substantial more advanced video-editing than used in Experiment 2. </w:t>
+        <w:t>Either of these manipulations would require substantial</w:t>
+      </w:r>
+      <w:ins w:id="56" w:author="Karboga, Gevher" w:date="2025-05-20T15:11:00Z" w16du:dateUtc="2025-05-20T19:11:00Z">
+        <w:r>
+          <w:rPr>
+            <w:szCs w:val="22"/>
+          </w:rPr>
+          <w:t>ly</w:t>
+        </w:r>
+      </w:ins>
+      <w:r>
+        <w:rPr>
+          <w:szCs w:val="22"/>
+        </w:rPr>
+        <w:t xml:space="preserve"> more advanced video-editing than used in Experiment 2. </w:t>
       </w:r>
     </w:p>
     <w:p>
@@ -22373,13 +22420,19 @@
         <w:rPr>
           <w:szCs w:val="22"/>
         </w:rPr>
-        <w:t xml:space="preserve"> articulators—the pen’s effect on lip shape—affect listeners’ perception in ways consistent with compensation accounts. </w:t>
+        <w:t xml:space="preserve"> articulators—the pen’s </w:t>
       </w:r>
       <w:r>
         <w:rPr>
           <w:szCs w:val="22"/>
         </w:rPr>
         <w:lastRenderedPageBreak/>
+        <w:t xml:space="preserve">effect on lip shape—affect listeners’ perception in ways consistent with compensation accounts. </w:t>
+      </w:r>
+      <w:r>
+        <w:rPr>
+          <w:szCs w:val="22"/>
+        </w:rPr>
         <w:t xml:space="preserve">This provides novel support for Fowler’s conjecture (Fowler, 2006): it indeed does not appear to matter </w:t>
       </w:r>
       <w:r>
@@ -22494,7 +22547,57 @@
         <w:rPr>
           <w:szCs w:val="22"/>
         </w:rPr>
-        <w:t>. First, our findings leave open whether compensation for visually evident effects of non-phonological causes—like the pen—draws on the same neural mechanisms as normalization/compensation for the effects of phonetic contexts. The present findings only suggest that Fowler’s compensation account provides a unifying explanation for the qualitative consequences of both phenomena. It is unclear, for example, whether compensation for visually-presented non-phonetic context take place in the same brain areas that are responsible for audiovisual integration during speech perception, and whether those areas that also process compensation for preceding phonetic context. Alternatively, compensation might take place at multiple points in the processing of speech input.</w:t>
+        <w:t>. First, our findings leave open whether compensation for visually evident effects of non-phonological causes—like the pen—draws on the same neural mechanisms as normalization/compensation for the effects of phonetic contexts. The present findings only suggest that Fowler’s compensation account provides a unifying explanation for the qualitative consequences of both phenomena. It is unclear, for example, whether compensation for visually</w:t>
+      </w:r>
+      <w:ins w:id="57" w:author="Karboga, Gevher" w:date="2025-05-20T18:39:00Z" w16du:dateUtc="2025-05-20T22:39:00Z">
+        <w:r>
+          <w:rPr>
+            <w:szCs w:val="22"/>
+          </w:rPr>
+          <w:t xml:space="preserve"> </w:t>
+        </w:r>
+      </w:ins>
+      <w:del w:id="58" w:author="Karboga, Gevher" w:date="2025-05-20T18:39:00Z" w16du:dateUtc="2025-05-20T22:39:00Z">
+        <w:r>
+          <w:rPr>
+            <w:szCs w:val="22"/>
+          </w:rPr>
+          <w:delText>-</w:delText>
+        </w:r>
+      </w:del>
+      <w:r>
+        <w:rPr>
+          <w:szCs w:val="22"/>
+        </w:rPr>
+        <w:t>presented non-phonetic context take</w:t>
+      </w:r>
+      <w:ins w:id="59" w:author="Karboga, Gevher" w:date="2025-05-20T18:39:00Z" w16du:dateUtc="2025-05-20T22:39:00Z">
+        <w:r>
+          <w:rPr>
+            <w:szCs w:val="22"/>
+          </w:rPr>
+          <w:t>s</w:t>
+        </w:r>
+      </w:ins>
+      <w:r>
+        <w:rPr>
+          <w:szCs w:val="22"/>
+        </w:rPr>
+        <w:t xml:space="preserve"> place in the same brain areas that are responsible for audiovisual integration during speech perception, and whether those areas </w:t>
+      </w:r>
+      <w:del w:id="60" w:author="Karboga, Gevher" w:date="2025-05-20T18:39:00Z" w16du:dateUtc="2025-05-20T22:39:00Z">
+        <w:r>
+          <w:rPr>
+            <w:szCs w:val="22"/>
+          </w:rPr>
+          <w:delText xml:space="preserve">that </w:delText>
+        </w:r>
+      </w:del>
+      <w:r>
+        <w:rPr>
+          <w:szCs w:val="22"/>
+        </w:rPr>
+        <w:t>also process compensation for preceding phonetic context. Alternatively, compensation might take place at multiple points in the processing of speech input.</w:t>
       </w:r>
     </w:p>
     <w:p>
@@ -22549,28 +22652,14 @@
         <w:rPr>
           <w:szCs w:val="22"/>
         </w:rPr>
-        <w:t xml:space="preserve"> to speech from an unfamiliar talker for which the realization of a particular sound is shifted towards a neighboring category. For example, </w:t>
-      </w:r>
-      <w:proofErr w:type="spellStart"/>
-      <w:r>
-        <w:rPr>
-          <w:szCs w:val="22"/>
-        </w:rPr>
-        <w:t>Kraljic</w:t>
-      </w:r>
-      <w:proofErr w:type="spellEnd"/>
-      <w:r>
-        <w:rPr>
-          <w:szCs w:val="22"/>
-        </w:rPr>
-        <w:t xml:space="preserve"> &amp; Samuel (2006) exposed listeners to either </w:t>
+        <w:t xml:space="preserve"> to speech from an unfamiliar talker for which the realization of a particular sound is shifted </w:t>
       </w:r>
       <w:r>
         <w:rPr>
           <w:szCs w:val="22"/>
         </w:rPr>
         <w:lastRenderedPageBreak/>
-        <w:t xml:space="preserve">typical </w:t>
+        <w:t xml:space="preserve">towards a neighboring category. For example, Kraljic &amp; Samuel (2006) exposed listeners to either typical </w:t>
       </w:r>
       <w:r>
         <w:rPr>
@@ -22838,21 +22927,7 @@
         <w:rPr>
           <w:szCs w:val="22"/>
         </w:rPr>
-        <w:t xml:space="preserve">, </w:t>
-      </w:r>
-      <w:proofErr w:type="spellStart"/>
-      <w:r>
-        <w:rPr>
-          <w:szCs w:val="22"/>
-        </w:rPr>
-        <w:t>Kraljic</w:t>
-      </w:r>
-      <w:proofErr w:type="spellEnd"/>
-      <w:r>
-        <w:rPr>
-          <w:szCs w:val="22"/>
-        </w:rPr>
-        <w:t xml:space="preserve"> et al. (2008) found that </w:t>
+        <w:t xml:space="preserve">, Kraljic et al. (2008) found that </w:t>
       </w:r>
       <w:r>
         <w:rPr>
@@ -23041,19 +23116,11 @@
         </w:rPr>
         <w:t xml:space="preserve">see discussion in </w:t>
       </w:r>
-      <w:proofErr w:type="spellStart"/>
-      <w:r>
-        <w:rPr>
-          <w:szCs w:val="22"/>
-        </w:rPr>
-        <w:t>Kraljic</w:t>
-      </w:r>
-      <w:proofErr w:type="spellEnd"/>
-      <w:r>
-        <w:rPr>
-          <w:szCs w:val="22"/>
-        </w:rPr>
-        <w:t xml:space="preserve"> &amp; Samuel, 2011; Liu &amp; Jaeger, 2018).</w:t>
+      <w:r>
+        <w:rPr>
+          <w:szCs w:val="22"/>
+        </w:rPr>
+        <w:t>Kraljic &amp; Samuel, 2011; Liu &amp; Jaeger, 2018).</w:t>
       </w:r>
       <w:r>
         <w:rPr>
@@ -23065,21 +23132,7 @@
         <w:rPr>
           <w:szCs w:val="22"/>
         </w:rPr>
-        <w:t xml:space="preserve">For instance, </w:t>
-      </w:r>
-      <w:proofErr w:type="spellStart"/>
-      <w:r>
-        <w:rPr>
-          <w:szCs w:val="22"/>
-        </w:rPr>
-        <w:t>Kraljic</w:t>
-      </w:r>
-      <w:proofErr w:type="spellEnd"/>
-      <w:r>
-        <w:rPr>
-          <w:szCs w:val="22"/>
-        </w:rPr>
-        <w:t xml:space="preserve"> et al. (2008) attributing the blocking effect to “pragmatic” reasoning that prevents perceptual learning for </w:t>
+        <w:t xml:space="preserve">For instance, Kraljic et al. (2008) attributing the blocking effect to “pragmatic” reasoning that prevents perceptual learning for </w:t>
       </w:r>
       <w:r>
         <w:rPr>
@@ -23133,21 +23186,7 @@
         <w:rPr>
           <w:szCs w:val="22"/>
         </w:rPr>
-        <w:t xml:space="preserve">—while allowing perceptual learning for changes that are considered “characteristic” of the talker’s speech. Based on a series of new experiments, </w:t>
-      </w:r>
-      <w:proofErr w:type="spellStart"/>
-      <w:r>
-        <w:rPr>
-          <w:szCs w:val="22"/>
-        </w:rPr>
-        <w:t>Kraljic</w:t>
-      </w:r>
-      <w:proofErr w:type="spellEnd"/>
-      <w:r>
-        <w:rPr>
-          <w:szCs w:val="22"/>
-        </w:rPr>
-        <w:t xml:space="preserve"> and Samuel (2011) revised this account, suggesting instead that audiovisual inputs with a pen in the mouth are stored as separate exemplars that do not affect listeners’ categorization decisions for audio-only speech inputs—i.e., the type of speech input that has been used in the test phase of </w:t>
+        <w:t xml:space="preserve">—while allowing perceptual learning for changes that are considered “characteristic” of the talker’s speech. Based on a series of new experiments, Kraljic and Samuel (2011) revised this account, suggesting instead that audiovisual inputs with a pen in the mouth are stored as separate exemplars that do not affect listeners’ categorization decisions for audio-only speech inputs—i.e., the type of speech input that has been used in the test phase of </w:t>
       </w:r>
       <w:r>
         <w:rPr>
@@ -23173,21 +23212,7 @@
         <w:rPr>
           <w:szCs w:val="22"/>
         </w:rPr>
-        <w:t xml:space="preserve">, Liu and Jaeger (2018) argued that the existing data were, in fact, more compatible with an account more along the lines of the original proposal by </w:t>
-      </w:r>
-      <w:proofErr w:type="spellStart"/>
-      <w:r>
-        <w:rPr>
-          <w:szCs w:val="22"/>
-        </w:rPr>
-        <w:t>Kraljic</w:t>
-      </w:r>
-      <w:proofErr w:type="spellEnd"/>
-      <w:r>
-        <w:rPr>
-          <w:szCs w:val="22"/>
-        </w:rPr>
-        <w:t xml:space="preserve"> et al. (2008)</w:t>
+        <w:t>, Liu and Jaeger (2018) argued that the existing data were, in fact, more compatible with an account more along the lines of the original proposal by Kraljic et al. (2008)</w:t>
       </w:r>
       <w:r>
         <w:rPr>
@@ -23213,14 +23238,35 @@
         <w:rPr>
           <w:szCs w:val="22"/>
         </w:rPr>
-        <w:t xml:space="preserve"> While some of these accounts (in particular the causal inference account) have conceptual similarities to compensation, previously offered </w:t>
+        <w:t xml:space="preserve"> While some of these accounts (</w:t>
+      </w:r>
+      <w:proofErr w:type="gramStart"/>
+      <w:r>
+        <w:rPr>
+          <w:szCs w:val="22"/>
+        </w:rPr>
+        <w:t xml:space="preserve">in particular </w:t>
       </w:r>
       <w:r>
         <w:rPr>
           <w:szCs w:val="22"/>
         </w:rPr>
         <w:lastRenderedPageBreak/>
-        <w:t xml:space="preserve">explanations of the blocking effect share that they appeal to </w:t>
+        <w:t>the</w:t>
+      </w:r>
+      <w:proofErr w:type="gramEnd"/>
+      <w:r>
+        <w:rPr>
+          <w:szCs w:val="22"/>
+        </w:rPr>
+        <w:t xml:space="preserve"> causal inference account) have conceptual similarities to compensation, </w:t>
+      </w:r>
+      <w:commentRangeStart w:id="61"/>
+      <w:r>
+        <w:rPr>
+          <w:szCs w:val="22"/>
+        </w:rPr>
+        <w:t xml:space="preserve">previously offered explanations of the blocking effect share that they appeal to </w:t>
       </w:r>
       <w:r>
         <w:rPr>
@@ -23250,6 +23296,13 @@
         </w:rPr>
         <w:t>.</w:t>
       </w:r>
+      <w:commentRangeEnd w:id="61"/>
+      <w:r>
+        <w:rPr>
+          <w:rStyle w:val="CommentReference"/>
+        </w:rPr>
+        <w:commentReference w:id="61"/>
+      </w:r>
     </w:p>
     <w:p>
       <w:pPr>
@@ -23503,7 +23556,29 @@
         <w:rPr>
           <w:szCs w:val="22"/>
         </w:rPr>
-        <w:t>-biased exposure, leaving unclear how these two effects trade off. However, it is also known that shifts larger than those typically used in perceptual recalibration experiments</w:t>
+        <w:t xml:space="preserve">-biased exposure, leaving </w:t>
+      </w:r>
+      <w:ins w:id="62" w:author="Karboga, Gevher" w:date="2025-05-20T18:52:00Z" w16du:dateUtc="2025-05-20T22:52:00Z">
+        <w:r>
+          <w:rPr>
+            <w:szCs w:val="22"/>
+          </w:rPr>
+          <w:t xml:space="preserve">it </w:t>
+        </w:r>
+      </w:ins>
+      <w:proofErr w:type="gramStart"/>
+      <w:r>
+        <w:rPr>
+          <w:szCs w:val="22"/>
+        </w:rPr>
+        <w:t>unclear</w:t>
+      </w:r>
+      <w:proofErr w:type="gramEnd"/>
+      <w:r>
+        <w:rPr>
+          <w:szCs w:val="22"/>
+        </w:rPr>
+        <w:t xml:space="preserve"> how these two effects trade off. However, it is also known that shifts larger than those typically used in perceptual recalibration experiments</w:t>
       </w:r>
       <w:r>
         <w:rPr>
@@ -23617,35 +23692,7 @@
         <w:rPr>
           <w:szCs w:val="22"/>
         </w:rPr>
-        <w:t>If an explanation along these lines turns out to be correct, this would also preempt the need to evoke memory (</w:t>
-      </w:r>
-      <w:proofErr w:type="spellStart"/>
-      <w:r>
-        <w:rPr>
-          <w:szCs w:val="22"/>
-        </w:rPr>
-        <w:t>Kraljic</w:t>
-      </w:r>
-      <w:proofErr w:type="spellEnd"/>
-      <w:r>
-        <w:rPr>
-          <w:szCs w:val="22"/>
-        </w:rPr>
-        <w:t xml:space="preserve"> &amp; Samuel, 2011) or learning mechanisms (</w:t>
-      </w:r>
-      <w:proofErr w:type="spellStart"/>
-      <w:r>
-        <w:rPr>
-          <w:szCs w:val="22"/>
-        </w:rPr>
-        <w:t>Kraljic</w:t>
-      </w:r>
-      <w:proofErr w:type="spellEnd"/>
-      <w:r>
-        <w:rPr>
-          <w:szCs w:val="22"/>
-        </w:rPr>
-        <w:t xml:space="preserve"> et al., 2008).</w:t>
+        <w:t>If an explanation along these lines turns out to be correct, this would also preempt the need to evoke memory (Kraljic &amp; Samuel, 2011) or learning mechanisms (Kraljic et al., 2008).</w:t>
       </w:r>
       <w:r>
         <w:rPr>
@@ -23726,21 +23773,7 @@
         <w:rPr>
           <w:szCs w:val="22"/>
         </w:rPr>
-        <w:t xml:space="preserve">This research was supported by a </w:t>
-      </w:r>
-      <w:proofErr w:type="spellStart"/>
-      <w:r>
-        <w:rPr>
-          <w:szCs w:val="22"/>
-        </w:rPr>
-        <w:t>Bilski</w:t>
-      </w:r>
-      <w:proofErr w:type="spellEnd"/>
-      <w:r>
-        <w:rPr>
-          <w:szCs w:val="22"/>
-        </w:rPr>
-        <w:t xml:space="preserve">-Mayer Summer Research Fellowship to </w:t>
+        <w:t xml:space="preserve">This research was supported by a Bilski-Mayer Summer Research Fellowship to </w:t>
       </w:r>
       <w:r>
         <w:rPr>
@@ -23847,21 +23880,7 @@
         <w:rPr>
           <w:szCs w:val="22"/>
         </w:rPr>
-        <w:t xml:space="preserve">researchers’ dedication to open science: the audio recordings were obtained from Tanya </w:t>
-      </w:r>
-      <w:proofErr w:type="spellStart"/>
-      <w:r>
-        <w:rPr>
-          <w:szCs w:val="22"/>
-        </w:rPr>
-        <w:t>Kraljic</w:t>
-      </w:r>
-      <w:proofErr w:type="spellEnd"/>
-      <w:r>
-        <w:rPr>
-          <w:szCs w:val="22"/>
-        </w:rPr>
-        <w:t xml:space="preserve"> and Arthur Samuel, the video recordings were obtained from Molly Babel; </w:t>
+        <w:t xml:space="preserve">researchers’ dedication to open science: the audio recordings were obtained from Tanya Kraljic and Arthur Samuel, the video recordings were obtained from Molly Babel; </w:t>
       </w:r>
       <w:r>
         <w:rPr>
@@ -23903,7 +23922,29 @@
         <w:rPr>
           <w:szCs w:val="22"/>
         </w:rPr>
-        <w:t>, HMTL, and CSS</w:t>
+        <w:t xml:space="preserve">, </w:t>
+      </w:r>
+      <w:del w:id="63" w:author="Karboga, Gevher" w:date="2025-05-20T18:54:00Z" w16du:dateUtc="2025-05-20T22:54:00Z">
+        <w:r>
+          <w:rPr>
+            <w:szCs w:val="22"/>
+          </w:rPr>
+          <w:delText>HMTL</w:delText>
+        </w:r>
+      </w:del>
+      <w:ins w:id="64" w:author="Karboga, Gevher" w:date="2025-05-20T18:54:00Z" w16du:dateUtc="2025-05-20T22:54:00Z">
+        <w:r>
+          <w:rPr>
+            <w:szCs w:val="22"/>
+          </w:rPr>
+          <w:t>HTML</w:t>
+        </w:r>
+      </w:ins>
+      <w:r>
+        <w:rPr>
+          <w:szCs w:val="22"/>
+        </w:rPr>
+        <w:t>, and CSS</w:t>
       </w:r>
       <w:r>
         <w:rPr>
@@ -23975,21 +24016,7 @@
         <w:rPr>
           <w:szCs w:val="22"/>
         </w:rPr>
-        <w:t xml:space="preserve">we thank Zach Burchill, Wednesday </w:t>
-      </w:r>
-      <w:proofErr w:type="spellStart"/>
-      <w:r>
-        <w:rPr>
-          <w:szCs w:val="22"/>
-        </w:rPr>
-        <w:t>Bushong</w:t>
-      </w:r>
-      <w:proofErr w:type="spellEnd"/>
-      <w:r>
-        <w:rPr>
-          <w:szCs w:val="22"/>
-        </w:rPr>
-        <w:t>, Linda Liu, and Xin Xie for sharing materials and feedback for a tutorial on crowdsourcing experiments developed as part of this project (</w:t>
+        <w:t>we thank Zach Burchill, Wednesday Bushong, Linda Liu, and Xin Xie for sharing materials and feedback for a tutorial on crowdsourcing experiments developed as part of this project (</w:t>
       </w:r>
       <w:hyperlink r:id="rId23" w:history="1">
         <w:r>
@@ -24032,8 +24059,44 @@
         <w:rPr>
           <w:szCs w:val="22"/>
         </w:rPr>
-        <w:t xml:space="preserve"> SNC proposed the experiment. SNC, GK, and MY designed the experiment and developed the hypotheses, with input from TFJ. SNC created the audiovisual stimuli from the source audio and video files. TFJ and GK programmed the web-based experiments. G</w:t>
-      </w:r>
+        <w:t xml:space="preserve"> SNC proposed the experiment. SNC, G</w:t>
+      </w:r>
+      <w:ins w:id="65" w:author="Karboga, Gevher" w:date="2025-05-20T18:55:00Z" w16du:dateUtc="2025-05-20T22:55:00Z">
+        <w:r>
+          <w:rPr>
+            <w:szCs w:val="22"/>
+          </w:rPr>
+          <w:t>E</w:t>
+        </w:r>
+      </w:ins>
+      <w:r>
+        <w:rPr>
+          <w:szCs w:val="22"/>
+        </w:rPr>
+        <w:t>K, and MY designed the experiment and developed the hypotheses, with input from TFJ. SNC created the audiovisual stimuli from the source audio and video files. TFJ and G</w:t>
+      </w:r>
+      <w:ins w:id="66" w:author="Karboga, Gevher" w:date="2025-05-20T18:55:00Z" w16du:dateUtc="2025-05-20T22:55:00Z">
+        <w:r>
+          <w:rPr>
+            <w:szCs w:val="22"/>
+          </w:rPr>
+          <w:t>E</w:t>
+        </w:r>
+      </w:ins>
+      <w:r>
+        <w:rPr>
+          <w:szCs w:val="22"/>
+        </w:rPr>
+        <w:t>K programmed the web-based experiments. G</w:t>
+      </w:r>
+      <w:ins w:id="67" w:author="Karboga, Gevher" w:date="2025-05-20T18:55:00Z" w16du:dateUtc="2025-05-20T22:55:00Z">
+        <w:r>
+          <w:rPr>
+            <w:szCs w:val="22"/>
+          </w:rPr>
+          <w:t>E</w:t>
+        </w:r>
+      </w:ins>
       <w:r>
         <w:rPr>
           <w:szCs w:val="22"/>
@@ -24120,21 +24183,7 @@
         <w:rPr>
           <w:szCs w:val="22"/>
         </w:rPr>
-        <w:t xml:space="preserve">Babel, M. (2016). Replication of T </w:t>
-      </w:r>
-      <w:proofErr w:type="spellStart"/>
-      <w:r>
-        <w:rPr>
-          <w:szCs w:val="22"/>
-        </w:rPr>
-        <w:t>Kraljic</w:t>
-      </w:r>
-      <w:proofErr w:type="spellEnd"/>
-      <w:r>
-        <w:rPr>
-          <w:szCs w:val="22"/>
-        </w:rPr>
-        <w:t>, AG Samuel, SE Brennan (2008</w:t>
+        <w:t>Babel, M. (2016). Replication of T Kraljic, AG Samuel, SE Brennan (2008</w:t>
       </w:r>
       <w:r>
         <w:rPr>
@@ -24146,7 +24195,21 @@
         <w:rPr>
           <w:szCs w:val="22"/>
         </w:rPr>
-        <w:t xml:space="preserve">, PS 19(4). Retrieved from osf.io.pj5hb. </w:t>
+        <w:t xml:space="preserve">, PS 19(4). Retrieved from </w:t>
+      </w:r>
+      <w:proofErr w:type="gramStart"/>
+      <w:r>
+        <w:rPr>
+          <w:szCs w:val="22"/>
+        </w:rPr>
+        <w:t>osf.io.pj</w:t>
+      </w:r>
+      <w:proofErr w:type="gramEnd"/>
+      <w:r>
+        <w:rPr>
+          <w:szCs w:val="22"/>
+        </w:rPr>
+        <w:t xml:space="preserve">5hb. </w:t>
       </w:r>
     </w:p>
     <w:p>
@@ -24261,21 +24324,7 @@
         <w:rPr>
           <w:szCs w:val="22"/>
         </w:rPr>
-        <w:t xml:space="preserve">, </w:t>
-      </w:r>
-      <w:proofErr w:type="spellStart"/>
-      <w:r>
-        <w:rPr>
-          <w:szCs w:val="22"/>
-        </w:rPr>
-        <w:t>Knill</w:t>
-      </w:r>
-      <w:proofErr w:type="spellEnd"/>
-      <w:r>
-        <w:rPr>
-          <w:szCs w:val="22"/>
-        </w:rPr>
-        <w:t xml:space="preserve"> D</w:t>
+        <w:t>, Knill D</w:t>
       </w:r>
       <w:r>
         <w:rPr>
@@ -24299,21 +24348,7 @@
         <w:rPr>
           <w:szCs w:val="22"/>
         </w:rPr>
-        <w:t xml:space="preserve">, </w:t>
-      </w:r>
-      <w:proofErr w:type="spellStart"/>
-      <w:r>
-        <w:rPr>
-          <w:szCs w:val="22"/>
-        </w:rPr>
-        <w:t>Aslin</w:t>
-      </w:r>
-      <w:proofErr w:type="spellEnd"/>
-      <w:r>
-        <w:rPr>
-          <w:szCs w:val="22"/>
-        </w:rPr>
-        <w:t xml:space="preserve"> R</w:t>
+        <w:t>, Aslin R</w:t>
       </w:r>
       <w:r>
         <w:rPr>
@@ -24402,7 +24437,6 @@
           <w:szCs w:val="22"/>
         </w:rPr>
       </w:pPr>
-      <w:proofErr w:type="spellStart"/>
       <w:r>
         <w:rPr>
           <w:szCs w:val="22"/>
@@ -24415,7 +24449,6 @@
         </w:rPr>
         <w:t>ürkner</w:t>
       </w:r>
-      <w:proofErr w:type="spellEnd"/>
       <w:r>
         <w:rPr>
           <w:szCs w:val="22"/>
@@ -24463,19 +24496,11 @@
           <w:szCs w:val="22"/>
         </w:rPr>
       </w:pPr>
-      <w:proofErr w:type="spellStart"/>
-      <w:r>
-        <w:rPr>
-          <w:szCs w:val="22"/>
-        </w:rPr>
-        <w:t>Bürkner</w:t>
-      </w:r>
-      <w:proofErr w:type="spellEnd"/>
-      <w:r>
-        <w:rPr>
-          <w:szCs w:val="22"/>
-        </w:rPr>
-        <w:t>, P. C., &amp; Charpentier, E. (2020). Modelling monotonic effects of ordinal predictors in Bayesian regression models. </w:t>
+      <w:r>
+        <w:rPr>
+          <w:szCs w:val="22"/>
+        </w:rPr>
+        <w:t>Bürkner, P. C., &amp; Charpentier, E. (2020). Modelling monotonic effects of ordinal predictors in Bayesian regression models. </w:t>
       </w:r>
       <w:r>
         <w:rPr>
@@ -24606,7 +24631,21 @@
         <w:rPr>
           <w:szCs w:val="22"/>
         </w:rPr>
-        <w:t xml:space="preserve">Fowler, C. A. (2004). Speech as a Supramodal or </w:t>
+        <w:t xml:space="preserve">Fowler, C. A. (2004). Speech as a </w:t>
+      </w:r>
+      <w:proofErr w:type="spellStart"/>
+      <w:r>
+        <w:rPr>
+          <w:szCs w:val="22"/>
+        </w:rPr>
+        <w:t>Supramodal</w:t>
+      </w:r>
+      <w:proofErr w:type="spellEnd"/>
+      <w:r>
+        <w:rPr>
+          <w:szCs w:val="22"/>
+        </w:rPr>
+        <w:t xml:space="preserve"> or </w:t>
       </w:r>
       <w:proofErr w:type="spellStart"/>
       <w:r>
@@ -24693,21 +24732,7 @@
         <w:rPr>
           <w:szCs w:val="22"/>
         </w:rPr>
-        <w:t xml:space="preserve">Francis, A. L., </w:t>
-      </w:r>
-      <w:proofErr w:type="spellStart"/>
-      <w:r>
-        <w:rPr>
-          <w:szCs w:val="22"/>
-        </w:rPr>
-        <w:t>Ciocca</w:t>
-      </w:r>
-      <w:proofErr w:type="spellEnd"/>
-      <w:r>
-        <w:rPr>
-          <w:szCs w:val="22"/>
-        </w:rPr>
-        <w:t>, V., Wong, N. K. Y., Leung, W. H. Y., &amp; Chu, P. C. Y. (2006). Extrinsic context affects perceptual normalization of lexical tone. </w:t>
+        <w:t>Francis, A. L., Ciocca, V., Wong, N. K. Y., Leung, W. H. Y., &amp; Chu, P. C. Y. (2006). Extrinsic context affects perceptual normalization of lexical tone. </w:t>
       </w:r>
       <w:r>
         <w:rPr>
@@ -24898,19 +24923,11 @@
           <w:szCs w:val="22"/>
         </w:rPr>
       </w:pPr>
-      <w:proofErr w:type="spellStart"/>
-      <w:r>
-        <w:rPr>
-          <w:szCs w:val="22"/>
-        </w:rPr>
-        <w:t>Gick</w:t>
-      </w:r>
-      <w:proofErr w:type="spellEnd"/>
-      <w:r>
-        <w:rPr>
-          <w:szCs w:val="22"/>
-        </w:rPr>
-        <w:t>, B., &amp; Derrick, D. (2009). Aero-tactile integration in speech perception. </w:t>
+      <w:r>
+        <w:rPr>
+          <w:szCs w:val="22"/>
+        </w:rPr>
+        <w:t>Gick, B., &amp; Derrick, D. (2009). Aero-tactile integration in speech perception. </w:t>
       </w:r>
       <w:r>
         <w:rPr>
@@ -25004,7 +25021,6 @@
           <w:szCs w:val="22"/>
         </w:rPr>
       </w:pPr>
-      <w:proofErr w:type="spellStart"/>
       <w:r>
         <w:rPr>
           <w:szCs w:val="22"/>
@@ -25021,14 +25037,7 @@
         <w:rPr>
           <w:szCs w:val="22"/>
         </w:rPr>
-        <w:t>rberg</w:t>
-      </w:r>
-      <w:proofErr w:type="spellEnd"/>
-      <w:r>
-        <w:rPr>
-          <w:szCs w:val="22"/>
-        </w:rPr>
-        <w:t xml:space="preserve">, </w:t>
+        <w:t xml:space="preserve">rberg, </w:t>
       </w:r>
       <w:r>
         <w:rPr>
@@ -25158,19 +25167,11 @@
           <w:szCs w:val="22"/>
         </w:rPr>
       </w:pPr>
-      <w:proofErr w:type="spellStart"/>
-      <w:r>
-        <w:rPr>
-          <w:szCs w:val="22"/>
-        </w:rPr>
-        <w:t>Kraljic</w:t>
-      </w:r>
-      <w:proofErr w:type="spellEnd"/>
-      <w:r>
-        <w:rPr>
-          <w:szCs w:val="22"/>
-        </w:rPr>
-        <w:t xml:space="preserve">, </w:t>
+      <w:r>
+        <w:rPr>
+          <w:szCs w:val="22"/>
+        </w:rPr>
+        <w:t xml:space="preserve">Kraljic, </w:t>
       </w:r>
       <w:r>
         <w:rPr>
@@ -25201,19 +25202,25 @@
           <w:szCs w:val="22"/>
         </w:rPr>
       </w:pPr>
-      <w:proofErr w:type="spellStart"/>
-      <w:r>
-        <w:rPr>
-          <w:szCs w:val="22"/>
-        </w:rPr>
-        <w:t>Kraljic</w:t>
-      </w:r>
-      <w:proofErr w:type="spellEnd"/>
-      <w:r>
-        <w:rPr>
-          <w:szCs w:val="22"/>
-        </w:rPr>
-        <w:t xml:space="preserve">, T., &amp; Samuel, A. G. (2011). Perceptual learning evidence for contextually-specific representations. </w:t>
+      <w:r>
+        <w:rPr>
+          <w:szCs w:val="22"/>
+        </w:rPr>
+        <w:t xml:space="preserve">Kraljic, T., &amp; Samuel, A. G. (2011). Perceptual learning evidence for </w:t>
+      </w:r>
+      <w:proofErr w:type="gramStart"/>
+      <w:r>
+        <w:rPr>
+          <w:szCs w:val="22"/>
+        </w:rPr>
+        <w:t>contextually-specific</w:t>
+      </w:r>
+      <w:proofErr w:type="gramEnd"/>
+      <w:r>
+        <w:rPr>
+          <w:szCs w:val="22"/>
+        </w:rPr>
+        <w:t xml:space="preserve"> representations. </w:t>
       </w:r>
       <w:r>
         <w:rPr>
@@ -25250,20 +25257,12 @@
           <w:szCs w:val="22"/>
         </w:rPr>
       </w:pPr>
-      <w:proofErr w:type="spellStart"/>
       <w:r>
         <w:rPr>
           <w:szCs w:val="22"/>
         </w:rPr>
         <w:lastRenderedPageBreak/>
-        <w:t>Kraljic</w:t>
-      </w:r>
-      <w:proofErr w:type="spellEnd"/>
-      <w:r>
-        <w:rPr>
-          <w:szCs w:val="22"/>
-        </w:rPr>
-        <w:t xml:space="preserve">, T., Samuel, A. G., &amp; Brennan, S. E. (2008). First impressions and last resorts: How listeners adjust to speaker variability: Research article. </w:t>
+        <w:t xml:space="preserve">Kraljic, T., Samuel, A. G., &amp; Brennan, S. E. (2008). First impressions and last resorts: How listeners adjust to speaker variability: Research article. </w:t>
       </w:r>
       <w:r>
         <w:rPr>
@@ -25519,21 +25518,7 @@
         <w:rPr>
           <w:szCs w:val="22"/>
         </w:rPr>
-        <w:t>, C. S., Pérez-</w:t>
-      </w:r>
-      <w:proofErr w:type="spellStart"/>
-      <w:r>
-        <w:rPr>
-          <w:szCs w:val="22"/>
-        </w:rPr>
-        <w:t>Bellido</w:t>
-      </w:r>
-      <w:proofErr w:type="spellEnd"/>
-      <w:r>
-        <w:rPr>
-          <w:szCs w:val="22"/>
-        </w:rPr>
-        <w:t xml:space="preserve">, A., &amp; de Lange, F. P. (2018). Rapid recalibration of speech perception after experiencing the McGurk illusion. </w:t>
+        <w:t xml:space="preserve">, C. S., Pérez-Bellido, A., &amp; de Lange, F. P. (2018). Rapid recalibration of speech perception after experiencing the McGurk illusion. </w:t>
       </w:r>
       <w:r>
         <w:rPr>
@@ -25592,23 +25577,7 @@
           <w:rFonts w:hint="eastAsia"/>
           <w:szCs w:val="22"/>
         </w:rPr>
-        <w:t xml:space="preserve">V. A., &amp; </w:t>
-      </w:r>
-      <w:proofErr w:type="spellStart"/>
-      <w:r>
-        <w:rPr>
-          <w:rFonts w:hint="eastAsia"/>
-          <w:szCs w:val="22"/>
-        </w:rPr>
-        <w:t>Repp</w:t>
-      </w:r>
-      <w:proofErr w:type="spellEnd"/>
-      <w:r>
-        <w:rPr>
-          <w:rFonts w:hint="eastAsia"/>
-          <w:szCs w:val="22"/>
-        </w:rPr>
-        <w:t>, B. H. (1980). Influence of vocalic context on perception of the [</w:t>
+        <w:t>V. A., &amp; Repp, B. H. (1980). Influence of vocalic context on perception of the [</w:t>
       </w:r>
       <w:r>
         <w:rPr>
@@ -25967,19 +25936,11 @@
           <w:szCs w:val="22"/>
         </w:rPr>
       </w:pPr>
-      <w:proofErr w:type="spellStart"/>
-      <w:r>
-        <w:rPr>
-          <w:szCs w:val="22"/>
-        </w:rPr>
-        <w:t>Mitterer</w:t>
-      </w:r>
-      <w:proofErr w:type="spellEnd"/>
-      <w:r>
-        <w:rPr>
-          <w:szCs w:val="22"/>
-        </w:rPr>
-        <w:t xml:space="preserve">, H. (2006). On the causes of compensation for coarticulation: Evidence for phonological mediation. </w:t>
+      <w:r>
+        <w:rPr>
+          <w:szCs w:val="22"/>
+        </w:rPr>
+        <w:t xml:space="preserve">Mitterer, H. (2006). On the causes of compensation for coarticulation: Evidence for phonological mediation. </w:t>
       </w:r>
       <w:r>
         <w:rPr>
@@ -26122,25 +26083,7 @@
           <w:szCs w:val="22"/>
           <w:shd w:val="clear" w:color="auto" w:fill="FFFFFF"/>
         </w:rPr>
-        <w:t xml:space="preserve">Proctor, M., </w:t>
-      </w:r>
-      <w:proofErr w:type="spellStart"/>
-      <w:r>
-        <w:rPr>
-          <w:color w:val="222222"/>
-          <w:szCs w:val="22"/>
-          <w:shd w:val="clear" w:color="auto" w:fill="FFFFFF"/>
-        </w:rPr>
-        <w:t>Shadle</w:t>
-      </w:r>
-      <w:proofErr w:type="spellEnd"/>
-      <w:r>
-        <w:rPr>
-          <w:color w:val="222222"/>
-          <w:szCs w:val="22"/>
-          <w:shd w:val="clear" w:color="auto" w:fill="FFFFFF"/>
-        </w:rPr>
-        <w:t xml:space="preserve">, C., &amp; </w:t>
+        <w:t xml:space="preserve">Proctor, M., Shadle, C., &amp; </w:t>
       </w:r>
       <w:proofErr w:type="spellStart"/>
       <w:r>
@@ -26320,7 +26263,16 @@
           <w:iCs/>
           <w:szCs w:val="22"/>
         </w:rPr>
-        <w:t>The Journal of the Acoustical Society of America, 79(4)</w:t>
+        <w:t xml:space="preserve">The Journal of the Acoustical Society of </w:t>
+      </w:r>
+      <w:r>
+        <w:rPr>
+          <w:i/>
+          <w:iCs/>
+          <w:szCs w:val="22"/>
+        </w:rPr>
+        <w:lastRenderedPageBreak/>
+        <w:t>America, 79(4)</w:t>
       </w:r>
       <w:r>
         <w:rPr>
@@ -26341,7 +26293,6 @@
         <w:rPr>
           <w:szCs w:val="22"/>
         </w:rPr>
-        <w:lastRenderedPageBreak/>
         <w:t>Viswanathan, N., &amp; Stephens, J. D. (2016). Compensation for visually specified coarticulation in liquid–stop contexts. </w:t>
       </w:r>
       <w:r>
@@ -26444,19 +26395,11 @@
           <w:szCs w:val="22"/>
         </w:rPr>
       </w:pPr>
-      <w:proofErr w:type="spellStart"/>
-      <w:r>
-        <w:rPr>
-          <w:szCs w:val="22"/>
-        </w:rPr>
-        <w:t>Weatherholtz</w:t>
-      </w:r>
-      <w:proofErr w:type="spellEnd"/>
-      <w:r>
-        <w:rPr>
-          <w:szCs w:val="22"/>
-        </w:rPr>
-        <w:t xml:space="preserve">, K., &amp; Jaeger, T. F. (2016). Speech perception and generalization across talkers and accents. Linguistics: </w:t>
+      <w:r>
+        <w:rPr>
+          <w:szCs w:val="22"/>
+        </w:rPr>
+        <w:t xml:space="preserve">Weatherholtz, K., &amp; Jaeger, T. F. (2016). Speech perception and generalization across talkers and accents. Linguistics: </w:t>
       </w:r>
       <w:r>
         <w:rPr>
@@ -26501,11 +26444,11 @@
         <w:spacing w:line="240" w:lineRule="auto"/>
         <w:ind w:left="360" w:hanging="360"/>
         <w:rPr>
-          <w:ins w:id="35" w:author="Cummings, Shawn" w:date="2025-05-12T20:19:00Z" w16du:dateUtc="2025-05-13T00:19:00Z"/>
-          <w:szCs w:val="22"/>
-        </w:rPr>
-      </w:pPr>
-      <w:ins w:id="36" w:author="Cummings, Shawn" w:date="2025-05-12T20:19:00Z">
+          <w:ins w:id="68" w:author="Cummings, Shawn" w:date="2025-05-12T20:19:00Z" w16du:dateUtc="2025-05-13T00:19:00Z"/>
+          <w:szCs w:val="22"/>
+        </w:rPr>
+      </w:pPr>
+      <w:ins w:id="69" w:author="Cummings, Shawn" w:date="2025-05-12T20:19:00Z">
         <w:r>
           <w:rPr>
             <w:szCs w:val="22"/>
@@ -26568,21 +26511,7 @@
         <w:rPr>
           <w:szCs w:val="22"/>
         </w:rPr>
-        <w:t>Yeni-</w:t>
-      </w:r>
-      <w:proofErr w:type="spellStart"/>
-      <w:r>
-        <w:rPr>
-          <w:szCs w:val="22"/>
-        </w:rPr>
-        <w:t>Komshian</w:t>
-      </w:r>
-      <w:proofErr w:type="spellEnd"/>
-      <w:r>
-        <w:rPr>
-          <w:szCs w:val="22"/>
-        </w:rPr>
-        <w:t xml:space="preserve">, </w:t>
+        <w:t xml:space="preserve">Yeni-Komshian, </w:t>
       </w:r>
       <w:r>
         <w:rPr>
@@ -26625,8 +26554,8 @@
 </file>
 
 <file path=word/comments.xml><?xml version="1.0" encoding="utf-8"?>
-<w:comments xmlns:wpc="http://schemas.microsoft.com/office/word/2010/wordprocessingCanvas" xmlns:cx="http://schemas.microsoft.com/office/drawing/2014/chartex" xmlns:cx1="http://schemas.microsoft.com/office/drawing/2015/9/8/chartex" xmlns:cx2="http://schemas.microsoft.com/office/drawing/2015/10/21/chartex" xmlns:cx3="http://schemas.microsoft.com/office/drawing/2016/5/9/chartex" xmlns:cx4="http://schemas.microsoft.com/office/drawing/2016/5/10/chartex" xmlns:cx5="http://schemas.microsoft.com/office/drawing/2016/5/11/chartex" xmlns:cx6="http://schemas.microsoft.com/office/drawing/2016/5/12/chartex" xmlns:cx7="http://schemas.microsoft.com/office/drawing/2016/5/13/chartex" xmlns:cx8="http://schemas.microsoft.com/office/drawing/2016/5/14/chartex" xmlns:mc="http://schemas.openxmlformats.org/markup-compatibility/2006" xmlns:aink="http://schemas.microsoft.com/office/drawing/2016/ink" xmlns:am3d="http://schemas.microsoft.com/office/drawing/2017/model3d" xmlns:o="urn:schemas-microsoft-com:office:office" xmlns:oel="http://schemas.microsoft.com/office/2019/extlst" xmlns:r="http://schemas.openxmlformats.org/officeDocument/2006/relationships" xmlns:m="http://schemas.openxmlformats.org/officeDocument/2006/math" xmlns:v="urn:schemas-microsoft-com:vml" xmlns:wp14="http://schemas.microsoft.com/office/word/2010/wordprocessingDrawing" xmlns:wp="http://schemas.openxmlformats.org/drawingml/2006/wordprocessingDrawing" xmlns:w10="urn:schemas-microsoft-com:office:word" xmlns:w="http://schemas.openxmlformats.org/wordprocessingml/2006/main" xmlns:w14="http://schemas.microsoft.com/office/word/2010/wordml" xmlns:w15="http://schemas.microsoft.com/office/word/2012/wordml" xmlns:w16cex="http://schemas.microsoft.com/office/word/2018/wordml/cex" xmlns:w16cid="http://schemas.microsoft.com/office/word/2016/wordml/cid" xmlns:w16="http://schemas.microsoft.com/office/word/2018/wordml" xmlns:w16du="http://schemas.microsoft.com/office/word/2023/wordml/word16du" xmlns:w16sdtdh="http://schemas.microsoft.com/office/word/2020/wordml/sdtdatahash" xmlns:w16se="http://schemas.microsoft.com/office/word/2015/wordml/symex" xmlns:wpg="http://schemas.microsoft.com/office/word/2010/wordprocessingGroup" xmlns:wpi="http://schemas.microsoft.com/office/word/2010/wordprocessingInk" xmlns:wne="http://schemas.microsoft.com/office/word/2006/wordml" xmlns:wps="http://schemas.microsoft.com/office/word/2010/wordprocessingShape" mc:Ignorable="w14 w15 w16se w16cid w16 w16cex w16sdtdh w16du wp14">
-  <w:comment w:id="1" w:author="Jaeger, Florian" w:date="2025-05-11T17:22:00Z" w:initials="TJ">
+<w:comments xmlns:wpc="http://schemas.microsoft.com/office/word/2010/wordprocessingCanvas" xmlns:cx="http://schemas.microsoft.com/office/drawing/2014/chartex" xmlns:cx1="http://schemas.microsoft.com/office/drawing/2015/9/8/chartex" xmlns:cx2="http://schemas.microsoft.com/office/drawing/2015/10/21/chartex" xmlns:cx3="http://schemas.microsoft.com/office/drawing/2016/5/9/chartex" xmlns:cx4="http://schemas.microsoft.com/office/drawing/2016/5/10/chartex" xmlns:cx5="http://schemas.microsoft.com/office/drawing/2016/5/11/chartex" xmlns:cx6="http://schemas.microsoft.com/office/drawing/2016/5/12/chartex" xmlns:cx7="http://schemas.microsoft.com/office/drawing/2016/5/13/chartex" xmlns:cx8="http://schemas.microsoft.com/office/drawing/2016/5/14/chartex" xmlns:mc="http://schemas.openxmlformats.org/markup-compatibility/2006" xmlns:aink="http://schemas.microsoft.com/office/drawing/2016/ink" xmlns:am3d="http://schemas.microsoft.com/office/drawing/2017/model3d" xmlns:o="urn:schemas-microsoft-com:office:office" xmlns:oel="http://schemas.microsoft.com/office/2019/extlst" xmlns:r="http://schemas.openxmlformats.org/officeDocument/2006/relationships" xmlns:m="http://schemas.openxmlformats.org/officeDocument/2006/math" xmlns:v="urn:schemas-microsoft-com:vml" xmlns:wp14="http://schemas.microsoft.com/office/word/2010/wordprocessingDrawing" xmlns:wp="http://schemas.openxmlformats.org/drawingml/2006/wordprocessingDrawing" xmlns:w10="urn:schemas-microsoft-com:office:word" xmlns:w="http://schemas.openxmlformats.org/wordprocessingml/2006/main" xmlns:w14="http://schemas.microsoft.com/office/word/2010/wordml" xmlns:w15="http://schemas.microsoft.com/office/word/2012/wordml" xmlns:w16cex="http://schemas.microsoft.com/office/word/2018/wordml/cex" xmlns:w16cid="http://schemas.microsoft.com/office/word/2016/wordml/cid" xmlns:w16="http://schemas.microsoft.com/office/word/2018/wordml" xmlns:w16du="http://schemas.microsoft.com/office/word/2023/wordml/word16du" xmlns:w16sdtdh="http://schemas.microsoft.com/office/word/2020/wordml/sdtdatahash" xmlns:w16sdtfl="http://schemas.microsoft.com/office/word/2024/wordml/sdtformatlock" xmlns:w16se="http://schemas.microsoft.com/office/word/2015/wordml/symex" xmlns:wpg="http://schemas.microsoft.com/office/word/2010/wordprocessingGroup" xmlns:wpi="http://schemas.microsoft.com/office/word/2010/wordprocessingInk" xmlns:wne="http://schemas.microsoft.com/office/word/2006/wordml" xmlns:wps="http://schemas.microsoft.com/office/word/2010/wordprocessingShape" mc:Ignorable="w14 w15 w16se w16cid w16 w16cex w16sdtdh w16sdtfl w16du wp14">
+  <w:comment w:id="5" w:author="Jaeger, Florian" w:date="2025-05-11T17:22:00Z" w:initials="TJ">
     <w:p>
       <w:pPr>
         <w:jc w:val="left"/>
@@ -26645,7 +26574,7 @@
       </w:r>
     </w:p>
   </w:comment>
-  <w:comment w:id="2" w:author="Cummings, Shawn" w:date="2025-05-12T20:36:00Z" w:initials="SC">
+  <w:comment w:id="6" w:author="Cummings, Shawn" w:date="2025-05-12T20:36:00Z" w:initials="SC">
     <w:p>
       <w:pPr>
         <w:jc w:val="left"/>
@@ -26661,7 +26590,7 @@
       </w:r>
     </w:p>
   </w:comment>
-  <w:comment w:id="5" w:author="Jaeger, Florian" w:date="2025-05-11T16:16:00Z" w:initials="TJ">
+  <w:comment w:id="12" w:author="Jaeger, Florian" w:date="2025-05-11T16:16:00Z" w:initials="TJ">
     <w:p>
       <w:pPr>
         <w:jc w:val="left"/>
@@ -26680,7 +26609,7 @@
       </w:r>
     </w:p>
   </w:comment>
-  <w:comment w:id="3" w:author="Cummings, Shawn" w:date="2025-05-09T12:59:00Z" w:initials="SC">
+  <w:comment w:id="10" w:author="Cummings, Shawn" w:date="2025-05-09T12:59:00Z" w:initials="SC">
     <w:p>
       <w:pPr>
         <w:jc w:val="left"/>
@@ -26696,7 +26625,7 @@
       </w:r>
     </w:p>
   </w:comment>
-  <w:comment w:id="4" w:author="Cummings, Shawn" w:date="2025-05-09T13:12:00Z" w:initials="SC">
+  <w:comment w:id="11" w:author="Cummings, Shawn" w:date="2025-05-09T13:12:00Z" w:initials="SC">
     <w:p>
       <w:pPr>
         <w:jc w:val="left"/>
@@ -26712,7 +26641,7 @@
       </w:r>
     </w:p>
   </w:comment>
-  <w:comment w:id="7" w:author="Jaeger, Florian" w:date="2025-05-11T16:19:00Z" w:initials="TJ">
+  <w:comment w:id="16" w:author="Jaeger, Florian" w:date="2025-05-11T16:19:00Z" w:initials="TJ">
     <w:p>
       <w:pPr>
         <w:jc w:val="left"/>
@@ -26742,7 +26671,7 @@
       </w:r>
     </w:p>
   </w:comment>
-  <w:comment w:id="8" w:author="Cummings, Shawn" w:date="2025-05-12T20:37:00Z" w:initials="SC">
+  <w:comment w:id="17" w:author="Cummings, Shawn" w:date="2025-05-12T20:37:00Z" w:initials="SC">
     <w:p>
       <w:pPr>
         <w:jc w:val="left"/>
@@ -26758,7 +26687,7 @@
       </w:r>
     </w:p>
   </w:comment>
-  <w:comment w:id="10" w:author="Jaeger, Florian" w:date="2025-05-11T16:22:00Z" w:initials="TJ">
+  <w:comment w:id="23" w:author="Jaeger, Florian" w:date="2025-05-11T16:22:00Z" w:initials="TJ">
     <w:p>
       <w:pPr>
         <w:jc w:val="left"/>
@@ -26777,7 +26706,7 @@
       </w:r>
     </w:p>
   </w:comment>
-  <w:comment w:id="11" w:author="Jaeger, Florian" w:date="2025-05-11T16:22:00Z" w:initials="TJ">
+  <w:comment w:id="24" w:author="Jaeger, Florian" w:date="2025-05-11T16:22:00Z" w:initials="TJ">
     <w:p>
       <w:pPr>
         <w:jc w:val="left"/>
@@ -26796,7 +26725,7 @@
       </w:r>
     </w:p>
   </w:comment>
-  <w:comment w:id="15" w:author="Jaeger, Florian" w:date="2025-05-11T17:36:00Z" w:initials="TJ">
+  <w:comment w:id="28" w:author="Jaeger, Florian" w:date="2025-05-11T17:36:00Z" w:initials="TJ">
     <w:p>
       <w:pPr>
         <w:jc w:val="left"/>
@@ -26815,7 +26744,7 @@
       </w:r>
     </w:p>
   </w:comment>
-  <w:comment w:id="16" w:author="Jaeger, Florian" w:date="2025-05-11T17:37:00Z" w:initials="TJ">
+  <w:comment w:id="29" w:author="Jaeger, Florian" w:date="2025-05-11T17:37:00Z" w:initials="TJ">
     <w:p>
       <w:pPr>
         <w:jc w:val="left"/>
@@ -26834,7 +26763,7 @@
       </w:r>
     </w:p>
   </w:comment>
-  <w:comment w:id="17" w:author="Cummings, Shawn" w:date="2025-05-12T20:55:00Z" w:initials="SC">
+  <w:comment w:id="30" w:author="Cummings, Shawn" w:date="2025-05-12T20:55:00Z" w:initials="SC">
     <w:p>
       <w:pPr>
         <w:jc w:val="left"/>
@@ -26850,7 +26779,7 @@
       </w:r>
     </w:p>
   </w:comment>
-  <w:comment w:id="20" w:author="Jaeger, Florian" w:date="2025-05-11T17:39:00Z" w:initials="TJ">
+  <w:comment w:id="33" w:author="Jaeger, Florian" w:date="2025-05-11T17:39:00Z" w:initials="TJ">
     <w:p>
       <w:pPr>
         <w:jc w:val="left"/>
@@ -26869,7 +26798,7 @@
       </w:r>
     </w:p>
   </w:comment>
-  <w:comment w:id="24" w:author="Jaeger, Florian" w:date="2025-05-11T16:49:00Z" w:initials="TJ">
+  <w:comment w:id="43" w:author="Karboga, Gevher" w:date="2025-05-20T18:47:00Z" w:initials="GK">
     <w:p>
       <w:pPr>
         <w:jc w:val="left"/>
@@ -26884,11 +26813,11 @@
         <w:rPr>
           <w:color w:val="000000"/>
         </w:rPr>
-        <w:t>would be good to fill this in?</w:t>
+        <w:t>It could be better to divide this long sentence into two. Just a suggestion.</w:t>
       </w:r>
     </w:p>
   </w:comment>
-  <w:comment w:id="25" w:author="Cummings, Shawn" w:date="2025-05-12T21:09:00Z" w:initials="SC">
+  <w:comment w:id="45" w:author="Jaeger, Florian" w:date="2025-05-11T16:49:00Z" w:initials="TJ">
     <w:p>
       <w:pPr>
         <w:jc w:val="left"/>
@@ -26900,11 +26829,14 @@
         <w:annotationRef/>
       </w:r>
       <w:r>
-        <w:t>Beautifully similar RTs!</w:t>
+        <w:rPr>
+          <w:color w:val="000000"/>
+        </w:rPr>
+        <w:t>would be good to fill this in?</w:t>
       </w:r>
     </w:p>
   </w:comment>
-  <w:comment w:id="34" w:author="Jaeger, Florian" w:date="2025-05-11T16:53:00Z" w:initials="TJ">
+  <w:comment w:id="46" w:author="Cummings, Shawn" w:date="2025-05-12T21:09:00Z" w:initials="SC">
     <w:p>
       <w:pPr>
         <w:jc w:val="left"/>
@@ -26916,10 +26848,45 @@
         <w:annotationRef/>
       </w:r>
       <w:r>
+        <w:t>Beautifully similar RTs!</w:t>
+      </w:r>
+    </w:p>
+  </w:comment>
+  <w:comment w:id="55" w:author="Jaeger, Florian" w:date="2025-05-11T16:53:00Z" w:initials="TJ">
+    <w:p>
+      <w:pPr>
+        <w:jc w:val="left"/>
+      </w:pPr>
+      <w:r>
+        <w:rPr>
+          <w:rStyle w:val="CommentReference"/>
+        </w:rPr>
+        <w:annotationRef/>
+      </w:r>
+      <w:r>
         <w:rPr>
           <w:color w:val="000000"/>
         </w:rPr>
         <w:t>For Exp 1a-c, Gevher coded comments for whether they mentioned the pen (it’s in the data directory). We could ask her whether she’d be willing to do the same of Exp 2 to see whether the rate of pen mention differed between experiments?</w:t>
+      </w:r>
+    </w:p>
+  </w:comment>
+  <w:comment w:id="61" w:author="Karboga, Gevher" w:date="2025-05-20T18:50:00Z" w:initials="GK">
+    <w:p>
+      <w:pPr>
+        <w:jc w:val="left"/>
+      </w:pPr>
+      <w:r>
+        <w:rPr>
+          <w:rStyle w:val="CommentReference"/>
+        </w:rPr>
+        <w:annotationRef/>
+      </w:r>
+      <w:r>
+        <w:rPr>
+          <w:color w:val="000000"/>
+        </w:rPr>
+        <w:t xml:space="preserve">I’m a bit confused about the wording of this sentence. I understand what we’re trying to say but this part of the sentence feels a bit jarring. Maybe sth like “, previous explanations of the blocking effect appeal/have consistently appealed to learning and/or memory.” </w:t>
       </w:r>
     </w:p>
   </w:comment>
@@ -26927,7 +26894,7 @@
 </file>
 
 <file path=word/commentsExtended.xml><?xml version="1.0" encoding="utf-8"?>
-<w15:commentsEx xmlns:wpc="http://schemas.microsoft.com/office/word/2010/wordprocessingCanvas" xmlns:cx="http://schemas.microsoft.com/office/drawing/2014/chartex" xmlns:cx1="http://schemas.microsoft.com/office/drawing/2015/9/8/chartex" xmlns:cx2="http://schemas.microsoft.com/office/drawing/2015/10/21/chartex" xmlns:cx3="http://schemas.microsoft.com/office/drawing/2016/5/9/chartex" xmlns:cx4="http://schemas.microsoft.com/office/drawing/2016/5/10/chartex" xmlns:cx5="http://schemas.microsoft.com/office/drawing/2016/5/11/chartex" xmlns:cx6="http://schemas.microsoft.com/office/drawing/2016/5/12/chartex" xmlns:cx7="http://schemas.microsoft.com/office/drawing/2016/5/13/chartex" xmlns:cx8="http://schemas.microsoft.com/office/drawing/2016/5/14/chartex" xmlns:mc="http://schemas.openxmlformats.org/markup-compatibility/2006" xmlns:aink="http://schemas.microsoft.com/office/drawing/2016/ink" xmlns:am3d="http://schemas.microsoft.com/office/drawing/2017/model3d" xmlns:o="urn:schemas-microsoft-com:office:office" xmlns:oel="http://schemas.microsoft.com/office/2019/extlst" xmlns:r="http://schemas.openxmlformats.org/officeDocument/2006/relationships" xmlns:m="http://schemas.openxmlformats.org/officeDocument/2006/math" xmlns:v="urn:schemas-microsoft-com:vml" xmlns:wp14="http://schemas.microsoft.com/office/word/2010/wordprocessingDrawing" xmlns:wp="http://schemas.openxmlformats.org/drawingml/2006/wordprocessingDrawing" xmlns:w10="urn:schemas-microsoft-com:office:word" xmlns:w="http://schemas.openxmlformats.org/wordprocessingml/2006/main" xmlns:w14="http://schemas.microsoft.com/office/word/2010/wordml" xmlns:w15="http://schemas.microsoft.com/office/word/2012/wordml" xmlns:w16cex="http://schemas.microsoft.com/office/word/2018/wordml/cex" xmlns:w16cid="http://schemas.microsoft.com/office/word/2016/wordml/cid" xmlns:w16="http://schemas.microsoft.com/office/word/2018/wordml" xmlns:w16du="http://schemas.microsoft.com/office/word/2023/wordml/word16du" xmlns:w16sdtdh="http://schemas.microsoft.com/office/word/2020/wordml/sdtdatahash" xmlns:w16se="http://schemas.microsoft.com/office/word/2015/wordml/symex" xmlns:wpg="http://schemas.microsoft.com/office/word/2010/wordprocessingGroup" xmlns:wpi="http://schemas.microsoft.com/office/word/2010/wordprocessingInk" xmlns:wne="http://schemas.microsoft.com/office/word/2006/wordml" xmlns:wps="http://schemas.microsoft.com/office/word/2010/wordprocessingShape" mc:Ignorable="w14 w15 w16se w16cid w16 w16cex w16sdtdh w16du wp14">
+<w15:commentsEx xmlns:wpc="http://schemas.microsoft.com/office/word/2010/wordprocessingCanvas" xmlns:cx="http://schemas.microsoft.com/office/drawing/2014/chartex" xmlns:cx1="http://schemas.microsoft.com/office/drawing/2015/9/8/chartex" xmlns:cx2="http://schemas.microsoft.com/office/drawing/2015/10/21/chartex" xmlns:cx3="http://schemas.microsoft.com/office/drawing/2016/5/9/chartex" xmlns:cx4="http://schemas.microsoft.com/office/drawing/2016/5/10/chartex" xmlns:cx5="http://schemas.microsoft.com/office/drawing/2016/5/11/chartex" xmlns:cx6="http://schemas.microsoft.com/office/drawing/2016/5/12/chartex" xmlns:cx7="http://schemas.microsoft.com/office/drawing/2016/5/13/chartex" xmlns:cx8="http://schemas.microsoft.com/office/drawing/2016/5/14/chartex" xmlns:mc="http://schemas.openxmlformats.org/markup-compatibility/2006" xmlns:aink="http://schemas.microsoft.com/office/drawing/2016/ink" xmlns:am3d="http://schemas.microsoft.com/office/drawing/2017/model3d" xmlns:o="urn:schemas-microsoft-com:office:office" xmlns:oel="http://schemas.microsoft.com/office/2019/extlst" xmlns:r="http://schemas.openxmlformats.org/officeDocument/2006/relationships" xmlns:m="http://schemas.openxmlformats.org/officeDocument/2006/math" xmlns:v="urn:schemas-microsoft-com:vml" xmlns:wp14="http://schemas.microsoft.com/office/word/2010/wordprocessingDrawing" xmlns:wp="http://schemas.openxmlformats.org/drawingml/2006/wordprocessingDrawing" xmlns:w10="urn:schemas-microsoft-com:office:word" xmlns:w="http://schemas.openxmlformats.org/wordprocessingml/2006/main" xmlns:w14="http://schemas.microsoft.com/office/word/2010/wordml" xmlns:w15="http://schemas.microsoft.com/office/word/2012/wordml" xmlns:w16cex="http://schemas.microsoft.com/office/word/2018/wordml/cex" xmlns:w16cid="http://schemas.microsoft.com/office/word/2016/wordml/cid" xmlns:w16="http://schemas.microsoft.com/office/word/2018/wordml" xmlns:w16du="http://schemas.microsoft.com/office/word/2023/wordml/word16du" xmlns:w16sdtdh="http://schemas.microsoft.com/office/word/2020/wordml/sdtdatahash" xmlns:w16sdtfl="http://schemas.microsoft.com/office/word/2024/wordml/sdtformatlock" xmlns:w16se="http://schemas.microsoft.com/office/word/2015/wordml/symex" xmlns:wpg="http://schemas.microsoft.com/office/word/2010/wordprocessingGroup" xmlns:wpi="http://schemas.microsoft.com/office/word/2010/wordprocessingInk" xmlns:wne="http://schemas.microsoft.com/office/word/2006/wordml" xmlns:wps="http://schemas.microsoft.com/office/word/2010/wordprocessingShape" mc:Ignorable="w14 w15 w16se w16cid w16 w16cex w16sdtdh w16sdtfl w16du wp14">
   <w15:commentEx w15:paraId="4DDBF32D" w15:done="0"/>
   <w15:commentEx w15:paraId="1486FF83" w15:paraIdParent="4DDBF32D" w15:done="0"/>
   <w15:commentEx w15:paraId="2245456D" w15:done="0"/>
@@ -26941,14 +26908,16 @@
   <w15:commentEx w15:paraId="23B94270" w15:paraIdParent="35B6A348" w15:done="0"/>
   <w15:commentEx w15:paraId="30A11CDB" w15:paraIdParent="35B6A348" w15:done="0"/>
   <w15:commentEx w15:paraId="3231CFD4" w15:done="1"/>
+  <w15:commentEx w15:paraId="74A83416" w15:done="0"/>
   <w15:commentEx w15:paraId="695C0F94" w15:done="0"/>
   <w15:commentEx w15:paraId="0A4DDCE7" w15:paraIdParent="695C0F94" w15:done="0"/>
   <w15:commentEx w15:paraId="1552380C" w15:done="0"/>
+  <w15:commentEx w15:paraId="50666CB3" w15:done="0"/>
 </w15:commentsEx>
 </file>
 
 <file path=word/commentsExtensible.xml><?xml version="1.0" encoding="utf-8"?>
-<w16cex:commentsExtensible xmlns:wpc="http://schemas.microsoft.com/office/word/2010/wordprocessingCanvas" xmlns:cx="http://schemas.microsoft.com/office/drawing/2014/chartex" xmlns:cx1="http://schemas.microsoft.com/office/drawing/2015/9/8/chartex" xmlns:cx2="http://schemas.microsoft.com/office/drawing/2015/10/21/chartex" xmlns:cx3="http://schemas.microsoft.com/office/drawing/2016/5/9/chartex" xmlns:cx4="http://schemas.microsoft.com/office/drawing/2016/5/10/chartex" xmlns:cx5="http://schemas.microsoft.com/office/drawing/2016/5/11/chartex" xmlns:cx6="http://schemas.microsoft.com/office/drawing/2016/5/12/chartex" xmlns:cx7="http://schemas.microsoft.com/office/drawing/2016/5/13/chartex" xmlns:cx8="http://schemas.microsoft.com/office/drawing/2016/5/14/chartex" xmlns:cr="http://schemas.microsoft.com/office/comments/2020/reactions" xmlns:mc="http://schemas.openxmlformats.org/markup-compatibility/2006" xmlns:aink="http://schemas.microsoft.com/office/drawing/2016/ink" xmlns:am3d="http://schemas.microsoft.com/office/drawing/2017/model3d" xmlns:o="urn:schemas-microsoft-com:office:office" xmlns:oel="http://schemas.microsoft.com/office/2019/extlst" xmlns:r="http://schemas.openxmlformats.org/officeDocument/2006/relationships" xmlns:m="http://schemas.openxmlformats.org/officeDocument/2006/math" xmlns:v="urn:schemas-microsoft-com:vml" xmlns:wp14="http://schemas.microsoft.com/office/word/2010/wordprocessingDrawing" xmlns:wp="http://schemas.openxmlformats.org/drawingml/2006/wordprocessingDrawing" xmlns:w10="urn:schemas-microsoft-com:office:word" xmlns:w="http://schemas.openxmlformats.org/wordprocessingml/2006/main" xmlns:w14="http://schemas.microsoft.com/office/word/2010/wordml" xmlns:w15="http://schemas.microsoft.com/office/word/2012/wordml" xmlns:w16cex="http://schemas.microsoft.com/office/word/2018/wordml/cex" xmlns:w16cid="http://schemas.microsoft.com/office/word/2016/wordml/cid" xmlns:w16="http://schemas.microsoft.com/office/word/2018/wordml" xmlns:w16du="http://schemas.microsoft.com/office/word/2023/wordml/word16du" xmlns:w16sdtdh="http://schemas.microsoft.com/office/word/2020/wordml/sdtdatahash" xmlns:w16se="http://schemas.microsoft.com/office/word/2015/wordml/symex" xmlns:wpg="http://schemas.microsoft.com/office/word/2010/wordprocessingGroup" xmlns:wpi="http://schemas.microsoft.com/office/word/2010/wordprocessingInk" xmlns:wne="http://schemas.microsoft.com/office/word/2006/wordml" xmlns:wps="http://schemas.microsoft.com/office/word/2010/wordprocessingShape" mc:Ignorable="w14 w15 w16se w16cid w16 w16cex w16sdtdh cr w16du wp14">
+<w16cex:commentsExtensible xmlns:wpc="http://schemas.microsoft.com/office/word/2010/wordprocessingCanvas" xmlns:cx="http://schemas.microsoft.com/office/drawing/2014/chartex" xmlns:cx1="http://schemas.microsoft.com/office/drawing/2015/9/8/chartex" xmlns:cx2="http://schemas.microsoft.com/office/drawing/2015/10/21/chartex" xmlns:cx3="http://schemas.microsoft.com/office/drawing/2016/5/9/chartex" xmlns:cx4="http://schemas.microsoft.com/office/drawing/2016/5/10/chartex" xmlns:cx5="http://schemas.microsoft.com/office/drawing/2016/5/11/chartex" xmlns:cx6="http://schemas.microsoft.com/office/drawing/2016/5/12/chartex" xmlns:cx7="http://schemas.microsoft.com/office/drawing/2016/5/13/chartex" xmlns:cx8="http://schemas.microsoft.com/office/drawing/2016/5/14/chartex" xmlns:cr="http://schemas.microsoft.com/office/comments/2020/reactions" xmlns:mc="http://schemas.openxmlformats.org/markup-compatibility/2006" xmlns:aink="http://schemas.microsoft.com/office/drawing/2016/ink" xmlns:am3d="http://schemas.microsoft.com/office/drawing/2017/model3d" xmlns:o="urn:schemas-microsoft-com:office:office" xmlns:oel="http://schemas.microsoft.com/office/2019/extlst" xmlns:r="http://schemas.openxmlformats.org/officeDocument/2006/relationships" xmlns:m="http://schemas.openxmlformats.org/officeDocument/2006/math" xmlns:v="urn:schemas-microsoft-com:vml" xmlns:wp14="http://schemas.microsoft.com/office/word/2010/wordprocessingDrawing" xmlns:wp="http://schemas.openxmlformats.org/drawingml/2006/wordprocessingDrawing" xmlns:w10="urn:schemas-microsoft-com:office:word" xmlns:w="http://schemas.openxmlformats.org/wordprocessingml/2006/main" xmlns:w14="http://schemas.microsoft.com/office/word/2010/wordml" xmlns:w15="http://schemas.microsoft.com/office/word/2012/wordml" xmlns:w16cex="http://schemas.microsoft.com/office/word/2018/wordml/cex" xmlns:w16cid="http://schemas.microsoft.com/office/word/2016/wordml/cid" xmlns:w16="http://schemas.microsoft.com/office/word/2018/wordml" xmlns:w16du="http://schemas.microsoft.com/office/word/2023/wordml/word16du" xmlns:w16sdtdh="http://schemas.microsoft.com/office/word/2020/wordml/sdtdatahash" xmlns:w16sdtfl="http://schemas.microsoft.com/office/word/2024/wordml/sdtformatlock" xmlns:w16se="http://schemas.microsoft.com/office/word/2015/wordml/symex" xmlns:wpg="http://schemas.microsoft.com/office/word/2010/wordprocessingGroup" xmlns:wpi="http://schemas.microsoft.com/office/word/2010/wordprocessingInk" xmlns:wne="http://schemas.microsoft.com/office/word/2006/wordml" xmlns:wps="http://schemas.microsoft.com/office/word/2010/wordprocessingShape" mc:Ignorable="w14 w15 w16se w16cid w16 w16cex w16sdtdh w16sdtfl cr w16du wp14">
   <w16cex:commentExtensible w16cex:durableId="2D808FF6" w16cex:dateUtc="2025-05-11T21:22:00Z"/>
   <w16cex:commentExtensible w16cex:durableId="4DB993EE" w16cex:dateUtc="2025-05-13T00:36:00Z"/>
   <w16cex:commentExtensible w16cex:durableId="6685186B" w16cex:dateUtc="2025-05-11T20:16:00Z"/>
@@ -26962,14 +26931,16 @@
   <w16cex:commentExtensible w16cex:durableId="18153A9E" w16cex:dateUtc="2025-05-11T21:37:00Z"/>
   <w16cex:commentExtensible w16cex:durableId="14BEE2CC" w16cex:dateUtc="2025-05-13T00:55:00Z"/>
   <w16cex:commentExtensible w16cex:durableId="27B64A8D" w16cex:dateUtc="2025-05-11T21:39:00Z"/>
+  <w16cex:commentExtensible w16cex:durableId="18FD6B1C" w16cex:dateUtc="2025-05-20T22:47:00Z"/>
   <w16cex:commentExtensible w16cex:durableId="5D330C59" w16cex:dateUtc="2025-05-11T20:49:00Z"/>
   <w16cex:commentExtensible w16cex:durableId="47D3472C" w16cex:dateUtc="2025-05-13T01:09:00Z"/>
   <w16cex:commentExtensible w16cex:durableId="259C817C" w16cex:dateUtc="2025-05-11T20:53:00Z"/>
+  <w16cex:commentExtensible w16cex:durableId="270D0BD5" w16cex:dateUtc="2025-05-20T22:50:00Z"/>
 </w16cex:commentsExtensible>
 </file>
 
 <file path=word/commentsIds.xml><?xml version="1.0" encoding="utf-8"?>
-<w16cid:commentsIds xmlns:wpc="http://schemas.microsoft.com/office/word/2010/wordprocessingCanvas" xmlns:cx="http://schemas.microsoft.com/office/drawing/2014/chartex" xmlns:cx1="http://schemas.microsoft.com/office/drawing/2015/9/8/chartex" xmlns:cx2="http://schemas.microsoft.com/office/drawing/2015/10/21/chartex" xmlns:cx3="http://schemas.microsoft.com/office/drawing/2016/5/9/chartex" xmlns:cx4="http://schemas.microsoft.com/office/drawing/2016/5/10/chartex" xmlns:cx5="http://schemas.microsoft.com/office/drawing/2016/5/11/chartex" xmlns:cx6="http://schemas.microsoft.com/office/drawing/2016/5/12/chartex" xmlns:cx7="http://schemas.microsoft.com/office/drawing/2016/5/13/chartex" xmlns:cx8="http://schemas.microsoft.com/office/drawing/2016/5/14/chartex" xmlns:mc="http://schemas.openxmlformats.org/markup-compatibility/2006" xmlns:aink="http://schemas.microsoft.com/office/drawing/2016/ink" xmlns:am3d="http://schemas.microsoft.com/office/drawing/2017/model3d" xmlns:o="urn:schemas-microsoft-com:office:office" xmlns:oel="http://schemas.microsoft.com/office/2019/extlst" xmlns:r="http://schemas.openxmlformats.org/officeDocument/2006/relationships" xmlns:m="http://schemas.openxmlformats.org/officeDocument/2006/math" xmlns:v="urn:schemas-microsoft-com:vml" xmlns:wp14="http://schemas.microsoft.com/office/word/2010/wordprocessingDrawing" xmlns:wp="http://schemas.openxmlformats.org/drawingml/2006/wordprocessingDrawing" xmlns:w10="urn:schemas-microsoft-com:office:word" xmlns:w="http://schemas.openxmlformats.org/wordprocessingml/2006/main" xmlns:w14="http://schemas.microsoft.com/office/word/2010/wordml" xmlns:w15="http://schemas.microsoft.com/office/word/2012/wordml" xmlns:w16cex="http://schemas.microsoft.com/office/word/2018/wordml/cex" xmlns:w16cid="http://schemas.microsoft.com/office/word/2016/wordml/cid" xmlns:w16="http://schemas.microsoft.com/office/word/2018/wordml" xmlns:w16du="http://schemas.microsoft.com/office/word/2023/wordml/word16du" xmlns:w16sdtdh="http://schemas.microsoft.com/office/word/2020/wordml/sdtdatahash" xmlns:w16se="http://schemas.microsoft.com/office/word/2015/wordml/symex" xmlns:wpg="http://schemas.microsoft.com/office/word/2010/wordprocessingGroup" xmlns:wpi="http://schemas.microsoft.com/office/word/2010/wordprocessingInk" xmlns:wne="http://schemas.microsoft.com/office/word/2006/wordml" xmlns:wps="http://schemas.microsoft.com/office/word/2010/wordprocessingShape" mc:Ignorable="w14 w15 w16se w16cid w16 w16cex w16sdtdh w16du wp14">
+<w16cid:commentsIds xmlns:wpc="http://schemas.microsoft.com/office/word/2010/wordprocessingCanvas" xmlns:cx="http://schemas.microsoft.com/office/drawing/2014/chartex" xmlns:cx1="http://schemas.microsoft.com/office/drawing/2015/9/8/chartex" xmlns:cx2="http://schemas.microsoft.com/office/drawing/2015/10/21/chartex" xmlns:cx3="http://schemas.microsoft.com/office/drawing/2016/5/9/chartex" xmlns:cx4="http://schemas.microsoft.com/office/drawing/2016/5/10/chartex" xmlns:cx5="http://schemas.microsoft.com/office/drawing/2016/5/11/chartex" xmlns:cx6="http://schemas.microsoft.com/office/drawing/2016/5/12/chartex" xmlns:cx7="http://schemas.microsoft.com/office/drawing/2016/5/13/chartex" xmlns:cx8="http://schemas.microsoft.com/office/drawing/2016/5/14/chartex" xmlns:mc="http://schemas.openxmlformats.org/markup-compatibility/2006" xmlns:aink="http://schemas.microsoft.com/office/drawing/2016/ink" xmlns:am3d="http://schemas.microsoft.com/office/drawing/2017/model3d" xmlns:o="urn:schemas-microsoft-com:office:office" xmlns:oel="http://schemas.microsoft.com/office/2019/extlst" xmlns:r="http://schemas.openxmlformats.org/officeDocument/2006/relationships" xmlns:m="http://schemas.openxmlformats.org/officeDocument/2006/math" xmlns:v="urn:schemas-microsoft-com:vml" xmlns:wp14="http://schemas.microsoft.com/office/word/2010/wordprocessingDrawing" xmlns:wp="http://schemas.openxmlformats.org/drawingml/2006/wordprocessingDrawing" xmlns:w10="urn:schemas-microsoft-com:office:word" xmlns:w="http://schemas.openxmlformats.org/wordprocessingml/2006/main" xmlns:w14="http://schemas.microsoft.com/office/word/2010/wordml" xmlns:w15="http://schemas.microsoft.com/office/word/2012/wordml" xmlns:w16cex="http://schemas.microsoft.com/office/word/2018/wordml/cex" xmlns:w16cid="http://schemas.microsoft.com/office/word/2016/wordml/cid" xmlns:w16="http://schemas.microsoft.com/office/word/2018/wordml" xmlns:w16du="http://schemas.microsoft.com/office/word/2023/wordml/word16du" xmlns:w16sdtdh="http://schemas.microsoft.com/office/word/2020/wordml/sdtdatahash" xmlns:w16sdtfl="http://schemas.microsoft.com/office/word/2024/wordml/sdtformatlock" xmlns:w16se="http://schemas.microsoft.com/office/word/2015/wordml/symex" xmlns:wpg="http://schemas.microsoft.com/office/word/2010/wordprocessingGroup" xmlns:wpi="http://schemas.microsoft.com/office/word/2010/wordprocessingInk" xmlns:wne="http://schemas.microsoft.com/office/word/2006/wordml" xmlns:wps="http://schemas.microsoft.com/office/word/2010/wordprocessingShape" mc:Ignorable="w14 w15 w16se w16cid w16 w16cex w16sdtdh w16sdtfl w16du wp14">
   <w16cid:commentId w16cid:paraId="4DDBF32D" w16cid:durableId="2D808FF6"/>
   <w16cid:commentId w16cid:paraId="1486FF83" w16cid:durableId="4DB993EE"/>
   <w16cid:commentId w16cid:paraId="2245456D" w16cid:durableId="6685186B"/>
@@ -26983,14 +26954,16 @@
   <w16cid:commentId w16cid:paraId="23B94270" w16cid:durableId="18153A9E"/>
   <w16cid:commentId w16cid:paraId="30A11CDB" w16cid:durableId="14BEE2CC"/>
   <w16cid:commentId w16cid:paraId="3231CFD4" w16cid:durableId="27B64A8D"/>
+  <w16cid:commentId w16cid:paraId="74A83416" w16cid:durableId="18FD6B1C"/>
   <w16cid:commentId w16cid:paraId="695C0F94" w16cid:durableId="5D330C59"/>
   <w16cid:commentId w16cid:paraId="0A4DDCE7" w16cid:durableId="47D3472C"/>
   <w16cid:commentId w16cid:paraId="1552380C" w16cid:durableId="259C817C"/>
+  <w16cid:commentId w16cid:paraId="50666CB3" w16cid:durableId="270D0BD5"/>
 </w16cid:commentsIds>
 </file>
 
 <file path=word/endnotes.xml><?xml version="1.0" encoding="utf-8"?>
-<w:endnotes xmlns:wpc="http://schemas.microsoft.com/office/word/2010/wordprocessingCanvas" xmlns:cx="http://schemas.microsoft.com/office/drawing/2014/chartex" xmlns:cx1="http://schemas.microsoft.com/office/drawing/2015/9/8/chartex" xmlns:cx2="http://schemas.microsoft.com/office/drawing/2015/10/21/chartex" xmlns:cx3="http://schemas.microsoft.com/office/drawing/2016/5/9/chartex" xmlns:cx4="http://schemas.microsoft.com/office/drawing/2016/5/10/chartex" xmlns:cx5="http://schemas.microsoft.com/office/drawing/2016/5/11/chartex" xmlns:cx6="http://schemas.microsoft.com/office/drawing/2016/5/12/chartex" xmlns:cx7="http://schemas.microsoft.com/office/drawing/2016/5/13/chartex" xmlns:cx8="http://schemas.microsoft.com/office/drawing/2016/5/14/chartex" xmlns:mc="http://schemas.openxmlformats.org/markup-compatibility/2006" xmlns:aink="http://schemas.microsoft.com/office/drawing/2016/ink" xmlns:am3d="http://schemas.microsoft.com/office/drawing/2017/model3d" xmlns:o="urn:schemas-microsoft-com:office:office" xmlns:oel="http://schemas.microsoft.com/office/2019/extlst" xmlns:r="http://schemas.openxmlformats.org/officeDocument/2006/relationships" xmlns:m="http://schemas.openxmlformats.org/officeDocument/2006/math" xmlns:v="urn:schemas-microsoft-com:vml" xmlns:wp14="http://schemas.microsoft.com/office/word/2010/wordprocessingDrawing" xmlns:wp="http://schemas.openxmlformats.org/drawingml/2006/wordprocessingDrawing" xmlns:w10="urn:schemas-microsoft-com:office:word" xmlns:w="http://schemas.openxmlformats.org/wordprocessingml/2006/main" xmlns:w14="http://schemas.microsoft.com/office/word/2010/wordml" xmlns:w15="http://schemas.microsoft.com/office/word/2012/wordml" xmlns:w16cex="http://schemas.microsoft.com/office/word/2018/wordml/cex" xmlns:w16cid="http://schemas.microsoft.com/office/word/2016/wordml/cid" xmlns:w16="http://schemas.microsoft.com/office/word/2018/wordml" xmlns:w16du="http://schemas.microsoft.com/office/word/2023/wordml/word16du" xmlns:w16sdtdh="http://schemas.microsoft.com/office/word/2020/wordml/sdtdatahash" xmlns:w16se="http://schemas.microsoft.com/office/word/2015/wordml/symex" xmlns:wpg="http://schemas.microsoft.com/office/word/2010/wordprocessingGroup" xmlns:wpi="http://schemas.microsoft.com/office/word/2010/wordprocessingInk" xmlns:wne="http://schemas.microsoft.com/office/word/2006/wordml" xmlns:wps="http://schemas.microsoft.com/office/word/2010/wordprocessingShape" mc:Ignorable="w14 w15 w16se w16cid w16 w16cex w16sdtdh w16du wp14">
+<w:endnotes xmlns:wpc="http://schemas.microsoft.com/office/word/2010/wordprocessingCanvas" xmlns:cx="http://schemas.microsoft.com/office/drawing/2014/chartex" xmlns:cx1="http://schemas.microsoft.com/office/drawing/2015/9/8/chartex" xmlns:cx2="http://schemas.microsoft.com/office/drawing/2015/10/21/chartex" xmlns:cx3="http://schemas.microsoft.com/office/drawing/2016/5/9/chartex" xmlns:cx4="http://schemas.microsoft.com/office/drawing/2016/5/10/chartex" xmlns:cx5="http://schemas.microsoft.com/office/drawing/2016/5/11/chartex" xmlns:cx6="http://schemas.microsoft.com/office/drawing/2016/5/12/chartex" xmlns:cx7="http://schemas.microsoft.com/office/drawing/2016/5/13/chartex" xmlns:cx8="http://schemas.microsoft.com/office/drawing/2016/5/14/chartex" xmlns:mc="http://schemas.openxmlformats.org/markup-compatibility/2006" xmlns:aink="http://schemas.microsoft.com/office/drawing/2016/ink" xmlns:am3d="http://schemas.microsoft.com/office/drawing/2017/model3d" xmlns:o="urn:schemas-microsoft-com:office:office" xmlns:oel="http://schemas.microsoft.com/office/2019/extlst" xmlns:r="http://schemas.openxmlformats.org/officeDocument/2006/relationships" xmlns:m="http://schemas.openxmlformats.org/officeDocument/2006/math" xmlns:v="urn:schemas-microsoft-com:vml" xmlns:wp14="http://schemas.microsoft.com/office/word/2010/wordprocessingDrawing" xmlns:wp="http://schemas.openxmlformats.org/drawingml/2006/wordprocessingDrawing" xmlns:w10="urn:schemas-microsoft-com:office:word" xmlns:w="http://schemas.openxmlformats.org/wordprocessingml/2006/main" xmlns:w14="http://schemas.microsoft.com/office/word/2010/wordml" xmlns:w15="http://schemas.microsoft.com/office/word/2012/wordml" xmlns:w16cex="http://schemas.microsoft.com/office/word/2018/wordml/cex" xmlns:w16cid="http://schemas.microsoft.com/office/word/2016/wordml/cid" xmlns:w16="http://schemas.microsoft.com/office/word/2018/wordml" xmlns:w16du="http://schemas.microsoft.com/office/word/2023/wordml/word16du" xmlns:w16sdtdh="http://schemas.microsoft.com/office/word/2020/wordml/sdtdatahash" xmlns:w16sdtfl="http://schemas.microsoft.com/office/word/2024/wordml/sdtformatlock" xmlns:w16se="http://schemas.microsoft.com/office/word/2015/wordml/symex" xmlns:wpg="http://schemas.microsoft.com/office/word/2010/wordprocessingGroup" xmlns:wpi="http://schemas.microsoft.com/office/word/2010/wordprocessingInk" xmlns:wne="http://schemas.microsoft.com/office/word/2006/wordml" xmlns:wps="http://schemas.microsoft.com/office/word/2010/wordprocessingShape" mc:Ignorable="w14 w15 w16se w16cid w16 w16cex w16sdtdh w16sdtfl w16du wp14">
   <w:endnote w:type="separator" w:id="-1">
     <w:p>
       <w:r>
@@ -27012,7 +26985,7 @@
 </file>
 
 <file path=word/footer1.xml><?xml version="1.0" encoding="utf-8"?>
-<w:ftr xmlns:wpc="http://schemas.microsoft.com/office/word/2010/wordprocessingCanvas" xmlns:cx="http://schemas.microsoft.com/office/drawing/2014/chartex" xmlns:cx1="http://schemas.microsoft.com/office/drawing/2015/9/8/chartex" xmlns:cx2="http://schemas.microsoft.com/office/drawing/2015/10/21/chartex" xmlns:cx3="http://schemas.microsoft.com/office/drawing/2016/5/9/chartex" xmlns:cx4="http://schemas.microsoft.com/office/drawing/2016/5/10/chartex" xmlns:cx5="http://schemas.microsoft.com/office/drawing/2016/5/11/chartex" xmlns:cx6="http://schemas.microsoft.com/office/drawing/2016/5/12/chartex" xmlns:cx7="http://schemas.microsoft.com/office/drawing/2016/5/13/chartex" xmlns:cx8="http://schemas.microsoft.com/office/drawing/2016/5/14/chartex" xmlns:mc="http://schemas.openxmlformats.org/markup-compatibility/2006" xmlns:aink="http://schemas.microsoft.com/office/drawing/2016/ink" xmlns:am3d="http://schemas.microsoft.com/office/drawing/2017/model3d" xmlns:o="urn:schemas-microsoft-com:office:office" xmlns:oel="http://schemas.microsoft.com/office/2019/extlst" xmlns:r="http://schemas.openxmlformats.org/officeDocument/2006/relationships" xmlns:m="http://schemas.openxmlformats.org/officeDocument/2006/math" xmlns:v="urn:schemas-microsoft-com:vml" xmlns:wp14="http://schemas.microsoft.com/office/word/2010/wordprocessingDrawing" xmlns:wp="http://schemas.openxmlformats.org/drawingml/2006/wordprocessingDrawing" xmlns:w10="urn:schemas-microsoft-com:office:word" xmlns:w="http://schemas.openxmlformats.org/wordprocessingml/2006/main" xmlns:w14="http://schemas.microsoft.com/office/word/2010/wordml" xmlns:w15="http://schemas.microsoft.com/office/word/2012/wordml" xmlns:w16cex="http://schemas.microsoft.com/office/word/2018/wordml/cex" xmlns:w16cid="http://schemas.microsoft.com/office/word/2016/wordml/cid" xmlns:w16="http://schemas.microsoft.com/office/word/2018/wordml" xmlns:w16du="http://schemas.microsoft.com/office/word/2023/wordml/word16du" xmlns:w16sdtdh="http://schemas.microsoft.com/office/word/2020/wordml/sdtdatahash" xmlns:w16se="http://schemas.microsoft.com/office/word/2015/wordml/symex" xmlns:wpg="http://schemas.microsoft.com/office/word/2010/wordprocessingGroup" xmlns:wpi="http://schemas.microsoft.com/office/word/2010/wordprocessingInk" xmlns:wne="http://schemas.microsoft.com/office/word/2006/wordml" xmlns:wps="http://schemas.microsoft.com/office/word/2010/wordprocessingShape" mc:Ignorable="w14 w15 w16se w16cid w16 w16cex w16sdtdh w16du wp14">
+<w:ftr xmlns:wpc="http://schemas.microsoft.com/office/word/2010/wordprocessingCanvas" xmlns:cx="http://schemas.microsoft.com/office/drawing/2014/chartex" xmlns:cx1="http://schemas.microsoft.com/office/drawing/2015/9/8/chartex" xmlns:cx2="http://schemas.microsoft.com/office/drawing/2015/10/21/chartex" xmlns:cx3="http://schemas.microsoft.com/office/drawing/2016/5/9/chartex" xmlns:cx4="http://schemas.microsoft.com/office/drawing/2016/5/10/chartex" xmlns:cx5="http://schemas.microsoft.com/office/drawing/2016/5/11/chartex" xmlns:cx6="http://schemas.microsoft.com/office/drawing/2016/5/12/chartex" xmlns:cx7="http://schemas.microsoft.com/office/drawing/2016/5/13/chartex" xmlns:cx8="http://schemas.microsoft.com/office/drawing/2016/5/14/chartex" xmlns:mc="http://schemas.openxmlformats.org/markup-compatibility/2006" xmlns:aink="http://schemas.microsoft.com/office/drawing/2016/ink" xmlns:am3d="http://schemas.microsoft.com/office/drawing/2017/model3d" xmlns:o="urn:schemas-microsoft-com:office:office" xmlns:oel="http://schemas.microsoft.com/office/2019/extlst" xmlns:r="http://schemas.openxmlformats.org/officeDocument/2006/relationships" xmlns:m="http://schemas.openxmlformats.org/officeDocument/2006/math" xmlns:v="urn:schemas-microsoft-com:vml" xmlns:wp14="http://schemas.microsoft.com/office/word/2010/wordprocessingDrawing" xmlns:wp="http://schemas.openxmlformats.org/drawingml/2006/wordprocessingDrawing" xmlns:w10="urn:schemas-microsoft-com:office:word" xmlns:w="http://schemas.openxmlformats.org/wordprocessingml/2006/main" xmlns:w14="http://schemas.microsoft.com/office/word/2010/wordml" xmlns:w15="http://schemas.microsoft.com/office/word/2012/wordml" xmlns:w16cex="http://schemas.microsoft.com/office/word/2018/wordml/cex" xmlns:w16cid="http://schemas.microsoft.com/office/word/2016/wordml/cid" xmlns:w16="http://schemas.microsoft.com/office/word/2018/wordml" xmlns:w16du="http://schemas.microsoft.com/office/word/2023/wordml/word16du" xmlns:w16sdtdh="http://schemas.microsoft.com/office/word/2020/wordml/sdtdatahash" xmlns:w16sdtfl="http://schemas.microsoft.com/office/word/2024/wordml/sdtformatlock" xmlns:w16se="http://schemas.microsoft.com/office/word/2015/wordml/symex" xmlns:wpg="http://schemas.microsoft.com/office/word/2010/wordprocessingGroup" xmlns:wpi="http://schemas.microsoft.com/office/word/2010/wordprocessingInk" xmlns:wne="http://schemas.microsoft.com/office/word/2006/wordml" xmlns:wps="http://schemas.microsoft.com/office/word/2010/wordprocessingShape" mc:Ignorable="w14 w15 w16se w16cid w16 w16cex w16sdtdh w16sdtfl w16du wp14">
   <w:sdt>
     <w:sdtPr>
       <w:rPr>
@@ -27062,7 +27035,7 @@
 </file>
 
 <file path=word/footer2.xml><?xml version="1.0" encoding="utf-8"?>
-<w:ftr xmlns:wpc="http://schemas.microsoft.com/office/word/2010/wordprocessingCanvas" xmlns:cx="http://schemas.microsoft.com/office/drawing/2014/chartex" xmlns:cx1="http://schemas.microsoft.com/office/drawing/2015/9/8/chartex" xmlns:cx2="http://schemas.microsoft.com/office/drawing/2015/10/21/chartex" xmlns:cx3="http://schemas.microsoft.com/office/drawing/2016/5/9/chartex" xmlns:cx4="http://schemas.microsoft.com/office/drawing/2016/5/10/chartex" xmlns:cx5="http://schemas.microsoft.com/office/drawing/2016/5/11/chartex" xmlns:cx6="http://schemas.microsoft.com/office/drawing/2016/5/12/chartex" xmlns:cx7="http://schemas.microsoft.com/office/drawing/2016/5/13/chartex" xmlns:cx8="http://schemas.microsoft.com/office/drawing/2016/5/14/chartex" xmlns:mc="http://schemas.openxmlformats.org/markup-compatibility/2006" xmlns:aink="http://schemas.microsoft.com/office/drawing/2016/ink" xmlns:am3d="http://schemas.microsoft.com/office/drawing/2017/model3d" xmlns:o="urn:schemas-microsoft-com:office:office" xmlns:oel="http://schemas.microsoft.com/office/2019/extlst" xmlns:r="http://schemas.openxmlformats.org/officeDocument/2006/relationships" xmlns:m="http://schemas.openxmlformats.org/officeDocument/2006/math" xmlns:v="urn:schemas-microsoft-com:vml" xmlns:wp14="http://schemas.microsoft.com/office/word/2010/wordprocessingDrawing" xmlns:wp="http://schemas.openxmlformats.org/drawingml/2006/wordprocessingDrawing" xmlns:w10="urn:schemas-microsoft-com:office:word" xmlns:w="http://schemas.openxmlformats.org/wordprocessingml/2006/main" xmlns:w14="http://schemas.microsoft.com/office/word/2010/wordml" xmlns:w15="http://schemas.microsoft.com/office/word/2012/wordml" xmlns:w16cex="http://schemas.microsoft.com/office/word/2018/wordml/cex" xmlns:w16cid="http://schemas.microsoft.com/office/word/2016/wordml/cid" xmlns:w16="http://schemas.microsoft.com/office/word/2018/wordml" xmlns:w16du="http://schemas.microsoft.com/office/word/2023/wordml/word16du" xmlns:w16sdtdh="http://schemas.microsoft.com/office/word/2020/wordml/sdtdatahash" xmlns:w16se="http://schemas.microsoft.com/office/word/2015/wordml/symex" xmlns:wpg="http://schemas.microsoft.com/office/word/2010/wordprocessingGroup" xmlns:wpi="http://schemas.microsoft.com/office/word/2010/wordprocessingInk" xmlns:wne="http://schemas.microsoft.com/office/word/2006/wordml" xmlns:wps="http://schemas.microsoft.com/office/word/2010/wordprocessingShape" mc:Ignorable="w14 w15 w16se w16cid w16 w16cex w16sdtdh w16du wp14">
+<w:ftr xmlns:wpc="http://schemas.microsoft.com/office/word/2010/wordprocessingCanvas" xmlns:cx="http://schemas.microsoft.com/office/drawing/2014/chartex" xmlns:cx1="http://schemas.microsoft.com/office/drawing/2015/9/8/chartex" xmlns:cx2="http://schemas.microsoft.com/office/drawing/2015/10/21/chartex" xmlns:cx3="http://schemas.microsoft.com/office/drawing/2016/5/9/chartex" xmlns:cx4="http://schemas.microsoft.com/office/drawing/2016/5/10/chartex" xmlns:cx5="http://schemas.microsoft.com/office/drawing/2016/5/11/chartex" xmlns:cx6="http://schemas.microsoft.com/office/drawing/2016/5/12/chartex" xmlns:cx7="http://schemas.microsoft.com/office/drawing/2016/5/13/chartex" xmlns:cx8="http://schemas.microsoft.com/office/drawing/2016/5/14/chartex" xmlns:mc="http://schemas.openxmlformats.org/markup-compatibility/2006" xmlns:aink="http://schemas.microsoft.com/office/drawing/2016/ink" xmlns:am3d="http://schemas.microsoft.com/office/drawing/2017/model3d" xmlns:o="urn:schemas-microsoft-com:office:office" xmlns:oel="http://schemas.microsoft.com/office/2019/extlst" xmlns:r="http://schemas.openxmlformats.org/officeDocument/2006/relationships" xmlns:m="http://schemas.openxmlformats.org/officeDocument/2006/math" xmlns:v="urn:schemas-microsoft-com:vml" xmlns:wp14="http://schemas.microsoft.com/office/word/2010/wordprocessingDrawing" xmlns:wp="http://schemas.openxmlformats.org/drawingml/2006/wordprocessingDrawing" xmlns:w10="urn:schemas-microsoft-com:office:word" xmlns:w="http://schemas.openxmlformats.org/wordprocessingml/2006/main" xmlns:w14="http://schemas.microsoft.com/office/word/2010/wordml" xmlns:w15="http://schemas.microsoft.com/office/word/2012/wordml" xmlns:w16cex="http://schemas.microsoft.com/office/word/2018/wordml/cex" xmlns:w16cid="http://schemas.microsoft.com/office/word/2016/wordml/cid" xmlns:w16="http://schemas.microsoft.com/office/word/2018/wordml" xmlns:w16du="http://schemas.microsoft.com/office/word/2023/wordml/word16du" xmlns:w16sdtdh="http://schemas.microsoft.com/office/word/2020/wordml/sdtdatahash" xmlns:w16sdtfl="http://schemas.microsoft.com/office/word/2024/wordml/sdtformatlock" xmlns:w16se="http://schemas.microsoft.com/office/word/2015/wordml/symex" xmlns:wpg="http://schemas.microsoft.com/office/word/2010/wordprocessingGroup" xmlns:wpi="http://schemas.microsoft.com/office/word/2010/wordprocessingInk" xmlns:wne="http://schemas.microsoft.com/office/word/2006/wordml" xmlns:wps="http://schemas.microsoft.com/office/word/2010/wordprocessingShape" mc:Ignorable="w14 w15 w16se w16cid w16 w16cex w16sdtdh w16sdtfl w16du wp14">
   <w:p>
     <w:pPr>
       <w:pStyle w:val="Footer"/>
@@ -27157,7 +27130,7 @@
 </file>
 
 <file path=word/footer3.xml><?xml version="1.0" encoding="utf-8"?>
-<w:ftr xmlns:wpc="http://schemas.microsoft.com/office/word/2010/wordprocessingCanvas" xmlns:cx="http://schemas.microsoft.com/office/drawing/2014/chartex" xmlns:cx1="http://schemas.microsoft.com/office/drawing/2015/9/8/chartex" xmlns:cx2="http://schemas.microsoft.com/office/drawing/2015/10/21/chartex" xmlns:cx3="http://schemas.microsoft.com/office/drawing/2016/5/9/chartex" xmlns:cx4="http://schemas.microsoft.com/office/drawing/2016/5/10/chartex" xmlns:cx5="http://schemas.microsoft.com/office/drawing/2016/5/11/chartex" xmlns:cx6="http://schemas.microsoft.com/office/drawing/2016/5/12/chartex" xmlns:cx7="http://schemas.microsoft.com/office/drawing/2016/5/13/chartex" xmlns:cx8="http://schemas.microsoft.com/office/drawing/2016/5/14/chartex" xmlns:mc="http://schemas.openxmlformats.org/markup-compatibility/2006" xmlns:aink="http://schemas.microsoft.com/office/drawing/2016/ink" xmlns:am3d="http://schemas.microsoft.com/office/drawing/2017/model3d" xmlns:o="urn:schemas-microsoft-com:office:office" xmlns:oel="http://schemas.microsoft.com/office/2019/extlst" xmlns:r="http://schemas.openxmlformats.org/officeDocument/2006/relationships" xmlns:m="http://schemas.openxmlformats.org/officeDocument/2006/math" xmlns:v="urn:schemas-microsoft-com:vml" xmlns:wp14="http://schemas.microsoft.com/office/word/2010/wordprocessingDrawing" xmlns:wp="http://schemas.openxmlformats.org/drawingml/2006/wordprocessingDrawing" xmlns:w10="urn:schemas-microsoft-com:office:word" xmlns:w="http://schemas.openxmlformats.org/wordprocessingml/2006/main" xmlns:w14="http://schemas.microsoft.com/office/word/2010/wordml" xmlns:w15="http://schemas.microsoft.com/office/word/2012/wordml" xmlns:w16cex="http://schemas.microsoft.com/office/word/2018/wordml/cex" xmlns:w16cid="http://schemas.microsoft.com/office/word/2016/wordml/cid" xmlns:w16="http://schemas.microsoft.com/office/word/2018/wordml" xmlns:w16du="http://schemas.microsoft.com/office/word/2023/wordml/word16du" xmlns:w16sdtdh="http://schemas.microsoft.com/office/word/2020/wordml/sdtdatahash" xmlns:w16se="http://schemas.microsoft.com/office/word/2015/wordml/symex" xmlns:wpg="http://schemas.microsoft.com/office/word/2010/wordprocessingGroup" xmlns:wpi="http://schemas.microsoft.com/office/word/2010/wordprocessingInk" xmlns:wne="http://schemas.microsoft.com/office/word/2006/wordml" xmlns:wps="http://schemas.microsoft.com/office/word/2010/wordprocessingShape" mc:Ignorable="w14 w15 w16se w16cid w16 w16cex w16sdtdh w16du wp14">
+<w:ftr xmlns:wpc="http://schemas.microsoft.com/office/word/2010/wordprocessingCanvas" xmlns:cx="http://schemas.microsoft.com/office/drawing/2014/chartex" xmlns:cx1="http://schemas.microsoft.com/office/drawing/2015/9/8/chartex" xmlns:cx2="http://schemas.microsoft.com/office/drawing/2015/10/21/chartex" xmlns:cx3="http://schemas.microsoft.com/office/drawing/2016/5/9/chartex" xmlns:cx4="http://schemas.microsoft.com/office/drawing/2016/5/10/chartex" xmlns:cx5="http://schemas.microsoft.com/office/drawing/2016/5/11/chartex" xmlns:cx6="http://schemas.microsoft.com/office/drawing/2016/5/12/chartex" xmlns:cx7="http://schemas.microsoft.com/office/drawing/2016/5/13/chartex" xmlns:cx8="http://schemas.microsoft.com/office/drawing/2016/5/14/chartex" xmlns:mc="http://schemas.openxmlformats.org/markup-compatibility/2006" xmlns:aink="http://schemas.microsoft.com/office/drawing/2016/ink" xmlns:am3d="http://schemas.microsoft.com/office/drawing/2017/model3d" xmlns:o="urn:schemas-microsoft-com:office:office" xmlns:oel="http://schemas.microsoft.com/office/2019/extlst" xmlns:r="http://schemas.openxmlformats.org/officeDocument/2006/relationships" xmlns:m="http://schemas.openxmlformats.org/officeDocument/2006/math" xmlns:v="urn:schemas-microsoft-com:vml" xmlns:wp14="http://schemas.microsoft.com/office/word/2010/wordprocessingDrawing" xmlns:wp="http://schemas.openxmlformats.org/drawingml/2006/wordprocessingDrawing" xmlns:w10="urn:schemas-microsoft-com:office:word" xmlns:w="http://schemas.openxmlformats.org/wordprocessingml/2006/main" xmlns:w14="http://schemas.microsoft.com/office/word/2010/wordml" xmlns:w15="http://schemas.microsoft.com/office/word/2012/wordml" xmlns:w16cex="http://schemas.microsoft.com/office/word/2018/wordml/cex" xmlns:w16cid="http://schemas.microsoft.com/office/word/2016/wordml/cid" xmlns:w16="http://schemas.microsoft.com/office/word/2018/wordml" xmlns:w16du="http://schemas.microsoft.com/office/word/2023/wordml/word16du" xmlns:w16sdtdh="http://schemas.microsoft.com/office/word/2020/wordml/sdtdatahash" xmlns:w16sdtfl="http://schemas.microsoft.com/office/word/2024/wordml/sdtformatlock" xmlns:w16se="http://schemas.microsoft.com/office/word/2015/wordml/symex" xmlns:wpg="http://schemas.microsoft.com/office/word/2010/wordprocessingGroup" xmlns:wpi="http://schemas.microsoft.com/office/word/2010/wordprocessingInk" xmlns:wne="http://schemas.microsoft.com/office/word/2006/wordml" xmlns:wps="http://schemas.microsoft.com/office/word/2010/wordprocessingShape" mc:Ignorable="w14 w15 w16se w16cid w16 w16cex w16sdtdh w16sdtfl w16du wp14">
   <w:p>
     <w:pPr>
       <w:pStyle w:val="Footer"/>
@@ -27252,7 +27225,7 @@
 </file>
 
 <file path=word/footnotes.xml><?xml version="1.0" encoding="utf-8"?>
-<w:footnotes xmlns:wpc="http://schemas.microsoft.com/office/word/2010/wordprocessingCanvas" xmlns:cx="http://schemas.microsoft.com/office/drawing/2014/chartex" xmlns:cx1="http://schemas.microsoft.com/office/drawing/2015/9/8/chartex" xmlns:cx2="http://schemas.microsoft.com/office/drawing/2015/10/21/chartex" xmlns:cx3="http://schemas.microsoft.com/office/drawing/2016/5/9/chartex" xmlns:cx4="http://schemas.microsoft.com/office/drawing/2016/5/10/chartex" xmlns:cx5="http://schemas.microsoft.com/office/drawing/2016/5/11/chartex" xmlns:cx6="http://schemas.microsoft.com/office/drawing/2016/5/12/chartex" xmlns:cx7="http://schemas.microsoft.com/office/drawing/2016/5/13/chartex" xmlns:cx8="http://schemas.microsoft.com/office/drawing/2016/5/14/chartex" xmlns:mc="http://schemas.openxmlformats.org/markup-compatibility/2006" xmlns:aink="http://schemas.microsoft.com/office/drawing/2016/ink" xmlns:am3d="http://schemas.microsoft.com/office/drawing/2017/model3d" xmlns:o="urn:schemas-microsoft-com:office:office" xmlns:oel="http://schemas.microsoft.com/office/2019/extlst" xmlns:r="http://schemas.openxmlformats.org/officeDocument/2006/relationships" xmlns:m="http://schemas.openxmlformats.org/officeDocument/2006/math" xmlns:v="urn:schemas-microsoft-com:vml" xmlns:wp14="http://schemas.microsoft.com/office/word/2010/wordprocessingDrawing" xmlns:wp="http://schemas.openxmlformats.org/drawingml/2006/wordprocessingDrawing" xmlns:w10="urn:schemas-microsoft-com:office:word" xmlns:w="http://schemas.openxmlformats.org/wordprocessingml/2006/main" xmlns:w14="http://schemas.microsoft.com/office/word/2010/wordml" xmlns:w15="http://schemas.microsoft.com/office/word/2012/wordml" xmlns:w16cex="http://schemas.microsoft.com/office/word/2018/wordml/cex" xmlns:w16cid="http://schemas.microsoft.com/office/word/2016/wordml/cid" xmlns:w16="http://schemas.microsoft.com/office/word/2018/wordml" xmlns:w16du="http://schemas.microsoft.com/office/word/2023/wordml/word16du" xmlns:w16sdtdh="http://schemas.microsoft.com/office/word/2020/wordml/sdtdatahash" xmlns:w16se="http://schemas.microsoft.com/office/word/2015/wordml/symex" xmlns:wpg="http://schemas.microsoft.com/office/word/2010/wordprocessingGroup" xmlns:wpi="http://schemas.microsoft.com/office/word/2010/wordprocessingInk" xmlns:wne="http://schemas.microsoft.com/office/word/2006/wordml" xmlns:wps="http://schemas.microsoft.com/office/word/2010/wordprocessingShape" mc:Ignorable="w14 w15 w16se w16cid w16 w16cex w16sdtdh w16du wp14">
+<w:footnotes xmlns:wpc="http://schemas.microsoft.com/office/word/2010/wordprocessingCanvas" xmlns:cx="http://schemas.microsoft.com/office/drawing/2014/chartex" xmlns:cx1="http://schemas.microsoft.com/office/drawing/2015/9/8/chartex" xmlns:cx2="http://schemas.microsoft.com/office/drawing/2015/10/21/chartex" xmlns:cx3="http://schemas.microsoft.com/office/drawing/2016/5/9/chartex" xmlns:cx4="http://schemas.microsoft.com/office/drawing/2016/5/10/chartex" xmlns:cx5="http://schemas.microsoft.com/office/drawing/2016/5/11/chartex" xmlns:cx6="http://schemas.microsoft.com/office/drawing/2016/5/12/chartex" xmlns:cx7="http://schemas.microsoft.com/office/drawing/2016/5/13/chartex" xmlns:cx8="http://schemas.microsoft.com/office/drawing/2016/5/14/chartex" xmlns:mc="http://schemas.openxmlformats.org/markup-compatibility/2006" xmlns:aink="http://schemas.microsoft.com/office/drawing/2016/ink" xmlns:am3d="http://schemas.microsoft.com/office/drawing/2017/model3d" xmlns:o="urn:schemas-microsoft-com:office:office" xmlns:oel="http://schemas.microsoft.com/office/2019/extlst" xmlns:r="http://schemas.openxmlformats.org/officeDocument/2006/relationships" xmlns:m="http://schemas.openxmlformats.org/officeDocument/2006/math" xmlns:v="urn:schemas-microsoft-com:vml" xmlns:wp14="http://schemas.microsoft.com/office/word/2010/wordprocessingDrawing" xmlns:wp="http://schemas.openxmlformats.org/drawingml/2006/wordprocessingDrawing" xmlns:w10="urn:schemas-microsoft-com:office:word" xmlns:w="http://schemas.openxmlformats.org/wordprocessingml/2006/main" xmlns:w14="http://schemas.microsoft.com/office/word/2010/wordml" xmlns:w15="http://schemas.microsoft.com/office/word/2012/wordml" xmlns:w16cex="http://schemas.microsoft.com/office/word/2018/wordml/cex" xmlns:w16cid="http://schemas.microsoft.com/office/word/2016/wordml/cid" xmlns:w16="http://schemas.microsoft.com/office/word/2018/wordml" xmlns:w16du="http://schemas.microsoft.com/office/word/2023/wordml/word16du" xmlns:w16sdtdh="http://schemas.microsoft.com/office/word/2020/wordml/sdtdatahash" xmlns:w16sdtfl="http://schemas.microsoft.com/office/word/2024/wordml/sdtformatlock" xmlns:w16se="http://schemas.microsoft.com/office/word/2015/wordml/symex" xmlns:wpg="http://schemas.microsoft.com/office/word/2010/wordprocessingGroup" xmlns:wpi="http://schemas.microsoft.com/office/word/2010/wordprocessingInk" xmlns:wne="http://schemas.microsoft.com/office/word/2006/wordml" xmlns:wps="http://schemas.microsoft.com/office/word/2010/wordprocessingShape" mc:Ignorable="w14 w15 w16se w16cid w16 w16cex w16sdtdh w16sdtfl w16du wp14">
   <w:footnote w:type="separator" w:id="-1">
     <w:p>
       <w:r>
@@ -27359,21 +27332,7 @@
         <w:rPr>
           <w:szCs w:val="22"/>
         </w:rPr>
-        <w:t xml:space="preserve"> (e.g., </w:t>
-      </w:r>
-      <w:proofErr w:type="spellStart"/>
-      <w:r>
-        <w:rPr>
-          <w:szCs w:val="22"/>
-        </w:rPr>
-        <w:t>Kraljic</w:t>
-      </w:r>
-      <w:proofErr w:type="spellEnd"/>
-      <w:r>
-        <w:rPr>
-          <w:szCs w:val="22"/>
-        </w:rPr>
-        <w:t xml:space="preserve"> et al., 2008)</w:t>
+        <w:t xml:space="preserve"> (e.g., Kraljic et al., 2008)</w:t>
       </w:r>
       <w:r>
         <w:rPr>
@@ -27430,15 +27389,7 @@
         <w:t>have</w:t>
       </w:r>
       <w:r>
-        <w:t xml:space="preserve"> </w:t>
-      </w:r>
-      <w:proofErr w:type="spellStart"/>
-      <w:r>
-        <w:t>gradiently</w:t>
-      </w:r>
-      <w:proofErr w:type="spellEnd"/>
-      <w:r>
-        <w:t xml:space="preserve"> manipulated visual cues to articulation</w:t>
+        <w:t xml:space="preserve"> gradiently manipulated visual cues to articulation</w:t>
       </w:r>
       <w:r>
         <w:t xml:space="preserve"> </w:t>
@@ -27590,7 +27541,15 @@
         <w:t xml:space="preserve"> </w:t>
       </w:r>
       <w:r>
-        <w:t>Additional analyses strongly supported linear effects of acoustic continuum and non-linear effects of test blocks for all experiments. The results we report below replicate when standard linear effects used for continuum and block.</w:t>
+        <w:t xml:space="preserve">Additional analyses strongly supported linear effects of acoustic continuum and non-linear effects of test blocks for all experiments. The results we report below replicate when standard linear effects </w:t>
+      </w:r>
+      <w:ins w:id="15" w:author="Karboga, Gevher" w:date="2025-05-20T17:58:00Z" w16du:dateUtc="2025-05-20T21:58:00Z">
+        <w:r>
+          <w:t xml:space="preserve">are </w:t>
+        </w:r>
+      </w:ins>
+      <w:r>
+        <w:t>used for continuum and block.</w:t>
       </w:r>
     </w:p>
   </w:footnote>
@@ -27629,7 +27588,7 @@
 </file>
 
 <file path=word/header1.xml><?xml version="1.0" encoding="utf-8"?>
-<w:hdr xmlns:wpc="http://schemas.microsoft.com/office/word/2010/wordprocessingCanvas" xmlns:cx="http://schemas.microsoft.com/office/drawing/2014/chartex" xmlns:cx1="http://schemas.microsoft.com/office/drawing/2015/9/8/chartex" xmlns:cx2="http://schemas.microsoft.com/office/drawing/2015/10/21/chartex" xmlns:cx3="http://schemas.microsoft.com/office/drawing/2016/5/9/chartex" xmlns:cx4="http://schemas.microsoft.com/office/drawing/2016/5/10/chartex" xmlns:cx5="http://schemas.microsoft.com/office/drawing/2016/5/11/chartex" xmlns:cx6="http://schemas.microsoft.com/office/drawing/2016/5/12/chartex" xmlns:cx7="http://schemas.microsoft.com/office/drawing/2016/5/13/chartex" xmlns:cx8="http://schemas.microsoft.com/office/drawing/2016/5/14/chartex" xmlns:mc="http://schemas.openxmlformats.org/markup-compatibility/2006" xmlns:aink="http://schemas.microsoft.com/office/drawing/2016/ink" xmlns:am3d="http://schemas.microsoft.com/office/drawing/2017/model3d" xmlns:o="urn:schemas-microsoft-com:office:office" xmlns:oel="http://schemas.microsoft.com/office/2019/extlst" xmlns:r="http://schemas.openxmlformats.org/officeDocument/2006/relationships" xmlns:m="http://schemas.openxmlformats.org/officeDocument/2006/math" xmlns:v="urn:schemas-microsoft-com:vml" xmlns:wp14="http://schemas.microsoft.com/office/word/2010/wordprocessingDrawing" xmlns:wp="http://schemas.openxmlformats.org/drawingml/2006/wordprocessingDrawing" xmlns:w10="urn:schemas-microsoft-com:office:word" xmlns:w="http://schemas.openxmlformats.org/wordprocessingml/2006/main" xmlns:w14="http://schemas.microsoft.com/office/word/2010/wordml" xmlns:w15="http://schemas.microsoft.com/office/word/2012/wordml" xmlns:w16cex="http://schemas.microsoft.com/office/word/2018/wordml/cex" xmlns:w16cid="http://schemas.microsoft.com/office/word/2016/wordml/cid" xmlns:w16="http://schemas.microsoft.com/office/word/2018/wordml" xmlns:w16du="http://schemas.microsoft.com/office/word/2023/wordml/word16du" xmlns:w16sdtdh="http://schemas.microsoft.com/office/word/2020/wordml/sdtdatahash" xmlns:w16se="http://schemas.microsoft.com/office/word/2015/wordml/symex" xmlns:wpg="http://schemas.microsoft.com/office/word/2010/wordprocessingGroup" xmlns:wpi="http://schemas.microsoft.com/office/word/2010/wordprocessingInk" xmlns:wne="http://schemas.microsoft.com/office/word/2006/wordml" xmlns:wps="http://schemas.microsoft.com/office/word/2010/wordprocessingShape" mc:Ignorable="w14 w15 w16se w16cid w16 w16cex w16sdtdh w16du wp14">
+<w:hdr xmlns:wpc="http://schemas.microsoft.com/office/word/2010/wordprocessingCanvas" xmlns:cx="http://schemas.microsoft.com/office/drawing/2014/chartex" xmlns:cx1="http://schemas.microsoft.com/office/drawing/2015/9/8/chartex" xmlns:cx2="http://schemas.microsoft.com/office/drawing/2015/10/21/chartex" xmlns:cx3="http://schemas.microsoft.com/office/drawing/2016/5/9/chartex" xmlns:cx4="http://schemas.microsoft.com/office/drawing/2016/5/10/chartex" xmlns:cx5="http://schemas.microsoft.com/office/drawing/2016/5/11/chartex" xmlns:cx6="http://schemas.microsoft.com/office/drawing/2016/5/12/chartex" xmlns:cx7="http://schemas.microsoft.com/office/drawing/2016/5/13/chartex" xmlns:cx8="http://schemas.microsoft.com/office/drawing/2016/5/14/chartex" xmlns:mc="http://schemas.openxmlformats.org/markup-compatibility/2006" xmlns:aink="http://schemas.microsoft.com/office/drawing/2016/ink" xmlns:am3d="http://schemas.microsoft.com/office/drawing/2017/model3d" xmlns:o="urn:schemas-microsoft-com:office:office" xmlns:oel="http://schemas.microsoft.com/office/2019/extlst" xmlns:r="http://schemas.openxmlformats.org/officeDocument/2006/relationships" xmlns:m="http://schemas.openxmlformats.org/officeDocument/2006/math" xmlns:v="urn:schemas-microsoft-com:vml" xmlns:wp14="http://schemas.microsoft.com/office/word/2010/wordprocessingDrawing" xmlns:wp="http://schemas.openxmlformats.org/drawingml/2006/wordprocessingDrawing" xmlns:w10="urn:schemas-microsoft-com:office:word" xmlns:w="http://schemas.openxmlformats.org/wordprocessingml/2006/main" xmlns:w14="http://schemas.microsoft.com/office/word/2010/wordml" xmlns:w15="http://schemas.microsoft.com/office/word/2012/wordml" xmlns:w16cex="http://schemas.microsoft.com/office/word/2018/wordml/cex" xmlns:w16cid="http://schemas.microsoft.com/office/word/2016/wordml/cid" xmlns:w16="http://schemas.microsoft.com/office/word/2018/wordml" xmlns:w16du="http://schemas.microsoft.com/office/word/2023/wordml/word16du" xmlns:w16sdtdh="http://schemas.microsoft.com/office/word/2020/wordml/sdtdatahash" xmlns:w16sdtfl="http://schemas.microsoft.com/office/word/2024/wordml/sdtformatlock" xmlns:w16se="http://schemas.microsoft.com/office/word/2015/wordml/symex" xmlns:wpg="http://schemas.microsoft.com/office/word/2010/wordprocessingGroup" xmlns:wpi="http://schemas.microsoft.com/office/word/2010/wordprocessingInk" xmlns:wne="http://schemas.microsoft.com/office/word/2006/wordml" xmlns:wps="http://schemas.microsoft.com/office/word/2010/wordprocessingShape" mc:Ignorable="w14 w15 w16se w16cid w16 w16cex w16sdtdh w16sdtfl w16du wp14">
   <w:p>
     <w:pPr>
       <w:pStyle w:val="Header"/>
@@ -27654,7 +27613,7 @@
 </file>
 
 <file path=word/numbering.xml><?xml version="1.0" encoding="utf-8"?>
-<w:numbering xmlns:wpc="http://schemas.microsoft.com/office/word/2010/wordprocessingCanvas" xmlns:cx="http://schemas.microsoft.com/office/drawing/2014/chartex" xmlns:cx1="http://schemas.microsoft.com/office/drawing/2015/9/8/chartex" xmlns:cx2="http://schemas.microsoft.com/office/drawing/2015/10/21/chartex" xmlns:cx3="http://schemas.microsoft.com/office/drawing/2016/5/9/chartex" xmlns:cx4="http://schemas.microsoft.com/office/drawing/2016/5/10/chartex" xmlns:cx5="http://schemas.microsoft.com/office/drawing/2016/5/11/chartex" xmlns:cx6="http://schemas.microsoft.com/office/drawing/2016/5/12/chartex" xmlns:cx7="http://schemas.microsoft.com/office/drawing/2016/5/13/chartex" xmlns:cx8="http://schemas.microsoft.com/office/drawing/2016/5/14/chartex" xmlns:mc="http://schemas.openxmlformats.org/markup-compatibility/2006" xmlns:aink="http://schemas.microsoft.com/office/drawing/2016/ink" xmlns:am3d="http://schemas.microsoft.com/office/drawing/2017/model3d" xmlns:o="urn:schemas-microsoft-com:office:office" xmlns:oel="http://schemas.microsoft.com/office/2019/extlst" xmlns:r="http://schemas.openxmlformats.org/officeDocument/2006/relationships" xmlns:m="http://schemas.openxmlformats.org/officeDocument/2006/math" xmlns:v="urn:schemas-microsoft-com:vml" xmlns:wp14="http://schemas.microsoft.com/office/word/2010/wordprocessingDrawing" xmlns:wp="http://schemas.openxmlformats.org/drawingml/2006/wordprocessingDrawing" xmlns:w10="urn:schemas-microsoft-com:office:word" xmlns:w="http://schemas.openxmlformats.org/wordprocessingml/2006/main" xmlns:w14="http://schemas.microsoft.com/office/word/2010/wordml" xmlns:w15="http://schemas.microsoft.com/office/word/2012/wordml" xmlns:w16cex="http://schemas.microsoft.com/office/word/2018/wordml/cex" xmlns:w16cid="http://schemas.microsoft.com/office/word/2016/wordml/cid" xmlns:w16="http://schemas.microsoft.com/office/word/2018/wordml" xmlns:w16du="http://schemas.microsoft.com/office/word/2023/wordml/word16du" xmlns:w16sdtdh="http://schemas.microsoft.com/office/word/2020/wordml/sdtdatahash" xmlns:w16se="http://schemas.microsoft.com/office/word/2015/wordml/symex" xmlns:wpg="http://schemas.microsoft.com/office/word/2010/wordprocessingGroup" xmlns:wpi="http://schemas.microsoft.com/office/word/2010/wordprocessingInk" xmlns:wne="http://schemas.microsoft.com/office/word/2006/wordml" xmlns:wps="http://schemas.microsoft.com/office/word/2010/wordprocessingShape" mc:Ignorable="w14 w15 w16se w16cid w16 w16cex w16sdtdh w16du wp14">
+<w:numbering xmlns:wpc="http://schemas.microsoft.com/office/word/2010/wordprocessingCanvas" xmlns:cx="http://schemas.microsoft.com/office/drawing/2014/chartex" xmlns:cx1="http://schemas.microsoft.com/office/drawing/2015/9/8/chartex" xmlns:cx2="http://schemas.microsoft.com/office/drawing/2015/10/21/chartex" xmlns:cx3="http://schemas.microsoft.com/office/drawing/2016/5/9/chartex" xmlns:cx4="http://schemas.microsoft.com/office/drawing/2016/5/10/chartex" xmlns:cx5="http://schemas.microsoft.com/office/drawing/2016/5/11/chartex" xmlns:cx6="http://schemas.microsoft.com/office/drawing/2016/5/12/chartex" xmlns:cx7="http://schemas.microsoft.com/office/drawing/2016/5/13/chartex" xmlns:cx8="http://schemas.microsoft.com/office/drawing/2016/5/14/chartex" xmlns:mc="http://schemas.openxmlformats.org/markup-compatibility/2006" xmlns:aink="http://schemas.microsoft.com/office/drawing/2016/ink" xmlns:am3d="http://schemas.microsoft.com/office/drawing/2017/model3d" xmlns:o="urn:schemas-microsoft-com:office:office" xmlns:oel="http://schemas.microsoft.com/office/2019/extlst" xmlns:r="http://schemas.openxmlformats.org/officeDocument/2006/relationships" xmlns:m="http://schemas.openxmlformats.org/officeDocument/2006/math" xmlns:v="urn:schemas-microsoft-com:vml" xmlns:wp14="http://schemas.microsoft.com/office/word/2010/wordprocessingDrawing" xmlns:wp="http://schemas.openxmlformats.org/drawingml/2006/wordprocessingDrawing" xmlns:w10="urn:schemas-microsoft-com:office:word" xmlns:w="http://schemas.openxmlformats.org/wordprocessingml/2006/main" xmlns:w14="http://schemas.microsoft.com/office/word/2010/wordml" xmlns:w15="http://schemas.microsoft.com/office/word/2012/wordml" xmlns:w16cex="http://schemas.microsoft.com/office/word/2018/wordml/cex" xmlns:w16cid="http://schemas.microsoft.com/office/word/2016/wordml/cid" xmlns:w16="http://schemas.microsoft.com/office/word/2018/wordml" xmlns:w16du="http://schemas.microsoft.com/office/word/2023/wordml/word16du" xmlns:w16sdtdh="http://schemas.microsoft.com/office/word/2020/wordml/sdtdatahash" xmlns:w16sdtfl="http://schemas.microsoft.com/office/word/2024/wordml/sdtformatlock" xmlns:w16se="http://schemas.microsoft.com/office/word/2015/wordml/symex" xmlns:wpg="http://schemas.microsoft.com/office/word/2010/wordprocessingGroup" xmlns:wpi="http://schemas.microsoft.com/office/word/2010/wordprocessingInk" xmlns:wne="http://schemas.microsoft.com/office/word/2006/wordml" xmlns:wps="http://schemas.microsoft.com/office/word/2010/wordprocessingShape" mc:Ignorable="w14 w15 w16se w16cid w16 w16cex w16sdtdh w16sdtfl w16du wp14">
   <w:abstractNum w:abstractNumId="0" w15:restartNumberingAfterBreak="0">
     <w:nsid w:val="05EC708F"/>
     <w:multiLevelType w:val="hybridMultilevel"/>
@@ -31974,7 +31933,10 @@
 </file>
 
 <file path=word/people.xml><?xml version="1.0" encoding="utf-8"?>
-<w15:people xmlns:wpc="http://schemas.microsoft.com/office/word/2010/wordprocessingCanvas" xmlns:cx="http://schemas.microsoft.com/office/drawing/2014/chartex" xmlns:cx1="http://schemas.microsoft.com/office/drawing/2015/9/8/chartex" xmlns:cx2="http://schemas.microsoft.com/office/drawing/2015/10/21/chartex" xmlns:cx3="http://schemas.microsoft.com/office/drawing/2016/5/9/chartex" xmlns:cx4="http://schemas.microsoft.com/office/drawing/2016/5/10/chartex" xmlns:cx5="http://schemas.microsoft.com/office/drawing/2016/5/11/chartex" xmlns:cx6="http://schemas.microsoft.com/office/drawing/2016/5/12/chartex" xmlns:cx7="http://schemas.microsoft.com/office/drawing/2016/5/13/chartex" xmlns:cx8="http://schemas.microsoft.com/office/drawing/2016/5/14/chartex" xmlns:mc="http://schemas.openxmlformats.org/markup-compatibility/2006" xmlns:aink="http://schemas.microsoft.com/office/drawing/2016/ink" xmlns:am3d="http://schemas.microsoft.com/office/drawing/2017/model3d" xmlns:o="urn:schemas-microsoft-com:office:office" xmlns:oel="http://schemas.microsoft.com/office/2019/extlst" xmlns:r="http://schemas.openxmlformats.org/officeDocument/2006/relationships" xmlns:m="http://schemas.openxmlformats.org/officeDocument/2006/math" xmlns:v="urn:schemas-microsoft-com:vml" xmlns:wp14="http://schemas.microsoft.com/office/word/2010/wordprocessingDrawing" xmlns:wp="http://schemas.openxmlformats.org/drawingml/2006/wordprocessingDrawing" xmlns:w10="urn:schemas-microsoft-com:office:word" xmlns:w="http://schemas.openxmlformats.org/wordprocessingml/2006/main" xmlns:w14="http://schemas.microsoft.com/office/word/2010/wordml" xmlns:w15="http://schemas.microsoft.com/office/word/2012/wordml" xmlns:w16cex="http://schemas.microsoft.com/office/word/2018/wordml/cex" xmlns:w16cid="http://schemas.microsoft.com/office/word/2016/wordml/cid" xmlns:w16="http://schemas.microsoft.com/office/word/2018/wordml" xmlns:w16du="http://schemas.microsoft.com/office/word/2023/wordml/word16du" xmlns:w16sdtdh="http://schemas.microsoft.com/office/word/2020/wordml/sdtdatahash" xmlns:w16se="http://schemas.microsoft.com/office/word/2015/wordml/symex" xmlns:wpg="http://schemas.microsoft.com/office/word/2010/wordprocessingGroup" xmlns:wpi="http://schemas.microsoft.com/office/word/2010/wordprocessingInk" xmlns:wne="http://schemas.microsoft.com/office/word/2006/wordml" xmlns:wps="http://schemas.microsoft.com/office/word/2010/wordprocessingShape" mc:Ignorable="w14 w15 w16se w16cid w16 w16cex w16sdtdh w16du wp14">
+<w15:people xmlns:wpc="http://schemas.microsoft.com/office/word/2010/wordprocessingCanvas" xmlns:cx="http://schemas.microsoft.com/office/drawing/2014/chartex" xmlns:cx1="http://schemas.microsoft.com/office/drawing/2015/9/8/chartex" xmlns:cx2="http://schemas.microsoft.com/office/drawing/2015/10/21/chartex" xmlns:cx3="http://schemas.microsoft.com/office/drawing/2016/5/9/chartex" xmlns:cx4="http://schemas.microsoft.com/office/drawing/2016/5/10/chartex" xmlns:cx5="http://schemas.microsoft.com/office/drawing/2016/5/11/chartex" xmlns:cx6="http://schemas.microsoft.com/office/drawing/2016/5/12/chartex" xmlns:cx7="http://schemas.microsoft.com/office/drawing/2016/5/13/chartex" xmlns:cx8="http://schemas.microsoft.com/office/drawing/2016/5/14/chartex" xmlns:mc="http://schemas.openxmlformats.org/markup-compatibility/2006" xmlns:aink="http://schemas.microsoft.com/office/drawing/2016/ink" xmlns:am3d="http://schemas.microsoft.com/office/drawing/2017/model3d" xmlns:o="urn:schemas-microsoft-com:office:office" xmlns:oel="http://schemas.microsoft.com/office/2019/extlst" xmlns:r="http://schemas.openxmlformats.org/officeDocument/2006/relationships" xmlns:m="http://schemas.openxmlformats.org/officeDocument/2006/math" xmlns:v="urn:schemas-microsoft-com:vml" xmlns:wp14="http://schemas.microsoft.com/office/word/2010/wordprocessingDrawing" xmlns:wp="http://schemas.openxmlformats.org/drawingml/2006/wordprocessingDrawing" xmlns:w10="urn:schemas-microsoft-com:office:word" xmlns:w="http://schemas.openxmlformats.org/wordprocessingml/2006/main" xmlns:w14="http://schemas.microsoft.com/office/word/2010/wordml" xmlns:w15="http://schemas.microsoft.com/office/word/2012/wordml" xmlns:w16cex="http://schemas.microsoft.com/office/word/2018/wordml/cex" xmlns:w16cid="http://schemas.microsoft.com/office/word/2016/wordml/cid" xmlns:w16="http://schemas.microsoft.com/office/word/2018/wordml" xmlns:w16du="http://schemas.microsoft.com/office/word/2023/wordml/word16du" xmlns:w16sdtdh="http://schemas.microsoft.com/office/word/2020/wordml/sdtdatahash" xmlns:w16sdtfl="http://schemas.microsoft.com/office/word/2024/wordml/sdtformatlock" xmlns:w16se="http://schemas.microsoft.com/office/word/2015/wordml/symex" xmlns:wpg="http://schemas.microsoft.com/office/word/2010/wordprocessingGroup" xmlns:wpi="http://schemas.microsoft.com/office/word/2010/wordprocessingInk" xmlns:wne="http://schemas.microsoft.com/office/word/2006/wordml" xmlns:wps="http://schemas.microsoft.com/office/word/2010/wordprocessingShape" mc:Ignorable="w14 w15 w16se w16cid w16 w16cex w16sdtdh w16sdtfl w16du wp14">
+  <w15:person w15:author="Karboga, Gevher">
+    <w15:presenceInfo w15:providerId="AD" w15:userId="S::gkarboga@ur.rochester.edu::3e9fc68b-c35f-4d37-9439-ea100d896997"/>
+  </w15:person>
   <w15:person w15:author="Jaeger, Florian">
     <w15:presenceInfo w15:providerId="AD" w15:userId="S::fjaeger@ur.rochester.edu::0d0acd91-09a2-4ddb-a934-22efc544688e"/>
   </w15:person>
@@ -31985,7 +31947,7 @@
 </file>
 
 <file path=word/styles.xml><?xml version="1.0" encoding="utf-8"?>
-<w:styles xmlns:mc="http://schemas.openxmlformats.org/markup-compatibility/2006" xmlns:r="http://schemas.openxmlformats.org/officeDocument/2006/relationships" xmlns:w="http://schemas.openxmlformats.org/wordprocessingml/2006/main" xmlns:w14="http://schemas.microsoft.com/office/word/2010/wordml" xmlns:w15="http://schemas.microsoft.com/office/word/2012/wordml" xmlns:w16cex="http://schemas.microsoft.com/office/word/2018/wordml/cex" xmlns:w16cid="http://schemas.microsoft.com/office/word/2016/wordml/cid" xmlns:w16="http://schemas.microsoft.com/office/word/2018/wordml" xmlns:w16du="http://schemas.microsoft.com/office/word/2023/wordml/word16du" xmlns:w16sdtdh="http://schemas.microsoft.com/office/word/2020/wordml/sdtdatahash" xmlns:w16se="http://schemas.microsoft.com/office/word/2015/wordml/symex" mc:Ignorable="w14 w15 w16se w16cid w16 w16cex w16sdtdh w16du">
+<w:styles xmlns:mc="http://schemas.openxmlformats.org/markup-compatibility/2006" xmlns:r="http://schemas.openxmlformats.org/officeDocument/2006/relationships" xmlns:w="http://schemas.openxmlformats.org/wordprocessingml/2006/main" xmlns:w14="http://schemas.microsoft.com/office/word/2010/wordml" xmlns:w15="http://schemas.microsoft.com/office/word/2012/wordml" xmlns:w16cex="http://schemas.microsoft.com/office/word/2018/wordml/cex" xmlns:w16cid="http://schemas.microsoft.com/office/word/2016/wordml/cid" xmlns:w16="http://schemas.microsoft.com/office/word/2018/wordml" xmlns:w16du="http://schemas.microsoft.com/office/word/2023/wordml/word16du" xmlns:w16sdtdh="http://schemas.microsoft.com/office/word/2020/wordml/sdtdatahash" xmlns:w16sdtfl="http://schemas.microsoft.com/office/word/2024/wordml/sdtformatlock" xmlns:w16se="http://schemas.microsoft.com/office/word/2015/wordml/symex" mc:Ignorable="w14 w15 w16se w16cid w16 w16cex w16sdtdh w16sdtfl w16du">
   <w:docDefaults>
     <w:rPrDefault>
       <w:rPr>
@@ -32432,6 +32394,7 @@
   <w:style w:type="character" w:default="1" w:styleId="DefaultParagraphFont">
     <w:name w:val="Default Paragraph Font"/>
     <w:uiPriority w:val="1"/>
+    <w:semiHidden/>
     <w:unhideWhenUsed/>
   </w:style>
   <w:style w:type="table" w:default="1" w:styleId="TableNormal">

</xml_diff>

<commit_message>
Publish branch and stubs of changes
nothing yet working
</commit_message>
<xml_diff>
--- a/output/papers/Round 2/manuscript-brief.docx
+++ b/output/papers/Round 2/manuscript-brief.docx
@@ -8031,6 +8031,44 @@
         </w:rPr>
         <w:t>due to (incorrect) catch trial responses</w:t>
       </w:r>
+      <w:ins w:id="6" w:author="Cummings, Shawn" w:date="2025-05-19T12:08:00Z" w16du:dateUtc="2025-05-19T16:08:00Z">
+        <w:r>
+          <w:rPr>
+            <w:szCs w:val="22"/>
+          </w:rPr>
+          <w:t xml:space="preserve"> </w:t>
+        </w:r>
+        <w:commentRangeStart w:id="7"/>
+        <w:r>
+          <w:rPr>
+            <w:szCs w:val="22"/>
+          </w:rPr>
+          <w:t xml:space="preserve">and __ were removed due to being +/- 3 </w:t>
+        </w:r>
+        <w:proofErr w:type="spellStart"/>
+        <w:r>
+          <w:rPr>
+            <w:szCs w:val="22"/>
+          </w:rPr>
+          <w:t>sd</w:t>
+        </w:r>
+        <w:proofErr w:type="spellEnd"/>
+        <w:r>
+          <w:rPr>
+            <w:szCs w:val="22"/>
+          </w:rPr>
+          <w:t xml:space="preserve"> from average</w:t>
+        </w:r>
+      </w:ins>
+      <w:commentRangeEnd w:id="7"/>
+      <w:ins w:id="8" w:author="Cummings, Shawn" w:date="2025-05-19T12:09:00Z" w16du:dateUtc="2025-05-19T16:09:00Z">
+        <w:r>
+          <w:rPr>
+            <w:rStyle w:val="CommentReference"/>
+          </w:rPr>
+          <w:commentReference w:id="7"/>
+        </w:r>
+      </w:ins>
       <w:r>
         <w:rPr>
           <w:szCs w:val="22"/>
@@ -8173,7 +8211,7 @@
           <w:szCs w:val="22"/>
         </w:rPr>
       </w:pPr>
-      <w:bookmarkStart w:id="6" w:name="_Ref136088042"/>
+      <w:bookmarkStart w:id="9" w:name="_Ref136088042"/>
       <w:r>
         <w:lastRenderedPageBreak/>
         <w:t>T</w:t>
@@ -8189,7 +8227,7 @@
           <w:t>1</w:t>
         </w:r>
       </w:fldSimple>
-      <w:bookmarkEnd w:id="6"/>
+      <w:bookmarkEnd w:id="9"/>
       <w:r>
         <w:tab/>
         <w:t xml:space="preserve">Exclusions for all experiments reported. </w:t>
@@ -10820,27 +10858,27 @@
         </w:rPr>
         <w:t xml:space="preserve">the three design variables </w:t>
       </w:r>
-      <w:commentRangeStart w:id="7"/>
-      <w:commentRangeStart w:id="8"/>
+      <w:commentRangeStart w:id="10"/>
+      <w:commentRangeStart w:id="11"/>
       <w:r>
         <w:rPr>
           <w:szCs w:val="22"/>
         </w:rPr>
         <w:t>pen location</w:t>
       </w:r>
-      <w:commentRangeEnd w:id="7"/>
+      <w:commentRangeEnd w:id="10"/>
       <w:r>
         <w:rPr>
           <w:rStyle w:val="CommentReference"/>
         </w:rPr>
-        <w:commentReference w:id="7"/>
-      </w:r>
-      <w:commentRangeEnd w:id="8"/>
+        <w:commentReference w:id="10"/>
+      </w:r>
+      <w:commentRangeEnd w:id="11"/>
       <w:r>
         <w:rPr>
           <w:rStyle w:val="CommentReference"/>
         </w:rPr>
-        <w:commentReference w:id="8"/>
+        <w:commentReference w:id="11"/>
       </w:r>
       <w:r>
         <w:rPr>
@@ -11185,7 +11223,7 @@
     <w:p>
       <w:pPr>
         <w:rPr>
-          <w:ins w:id="9" w:author="Cummings, Shawn" w:date="2025-05-12T20:54:00Z" w16du:dateUtc="2025-05-13T00:54:00Z"/>
+          <w:ins w:id="12" w:author="Cummings, Shawn" w:date="2025-05-12T20:54:00Z" w16du:dateUtc="2025-05-13T00:54:00Z"/>
           <w:szCs w:val="22"/>
         </w:rPr>
       </w:pPr>
@@ -11358,8 +11396,8 @@
         </w:rPr>
         <w:t xml:space="preserve">summarizes those tests for all three experiments. </w:t>
       </w:r>
-      <w:commentRangeStart w:id="10"/>
-      <w:commentRangeStart w:id="11"/>
+      <w:commentRangeStart w:id="13"/>
+      <w:commentRangeStart w:id="14"/>
       <w:r>
         <w:rPr>
           <w:szCs w:val="22"/>
@@ -11416,19 +11454,19 @@
         </w:rPr>
         <w:t xml:space="preserve"> continuum steps </w:t>
       </w:r>
-      <w:commentRangeEnd w:id="10"/>
+      <w:commentRangeEnd w:id="13"/>
       <w:r>
         <w:rPr>
           <w:rStyle w:val="CommentReference"/>
         </w:rPr>
-        <w:commentReference w:id="10"/>
-      </w:r>
-      <w:commentRangeEnd w:id="11"/>
+        <w:commentReference w:id="13"/>
+      </w:r>
+      <w:commentRangeEnd w:id="14"/>
       <w:r>
         <w:rPr>
           <w:rStyle w:val="CommentReference"/>
         </w:rPr>
-        <w:commentReference w:id="11"/>
+        <w:commentReference w:id="14"/>
       </w:r>
       <w:r>
         <w:rPr>
@@ -11503,11 +11541,11 @@
         <w:rPr>
           <w:szCs w:val="22"/>
         </w:rPr>
-        <w:pPrChange w:id="12" w:author="Cummings, Shawn" w:date="2025-05-12T20:55:00Z" w16du:dateUtc="2025-05-13T00:55:00Z">
+        <w:pPrChange w:id="15" w:author="Cummings, Shawn" w:date="2025-05-12T20:55:00Z" w16du:dateUtc="2025-05-13T00:55:00Z">
           <w:pPr/>
         </w:pPrChange>
       </w:pPr>
-      <w:ins w:id="13" w:author="Cummings, Shawn" w:date="2025-05-12T20:54:00Z" w16du:dateUtc="2025-05-13T00:54:00Z">
+      <w:ins w:id="16" w:author="Cummings, Shawn" w:date="2025-05-12T20:54:00Z" w16du:dateUtc="2025-05-13T00:54:00Z">
         <w:r>
           <w:rPr>
             <w:noProof/>
@@ -11565,11 +11603,11 @@
           <w:docGrid w:linePitch="360"/>
         </w:sectPr>
       </w:pPr>
-      <w:bookmarkStart w:id="14" w:name="_Ref136190394"/>
-      <w:commentRangeStart w:id="15"/>
-      <w:commentRangeStart w:id="16"/>
-      <w:commentRangeStart w:id="17"/>
-      <w:del w:id="18" w:author="Cummings, Shawn" w:date="2025-05-12T20:53:00Z" w16du:dateUtc="2025-05-13T00:53:00Z">
+      <w:bookmarkStart w:id="17" w:name="_Ref136190394"/>
+      <w:commentRangeStart w:id="18"/>
+      <w:commentRangeStart w:id="19"/>
+      <w:commentRangeStart w:id="20"/>
+      <w:del w:id="21" w:author="Cummings, Shawn" w:date="2025-05-12T20:53:00Z" w16du:dateUtc="2025-05-13T00:53:00Z">
         <w:r>
           <w:rPr>
             <w:noProof/>
@@ -11627,7 +11665,7 @@
           </w:drawing>
         </w:r>
       </w:del>
-      <w:commentRangeEnd w:id="15"/>
+      <w:commentRangeEnd w:id="18"/>
       <w:r>
         <w:rPr>
           <w:rStyle w:val="CommentReference"/>
@@ -11635,9 +11673,9 @@
           <w:iCs w:val="0"/>
           <w:color w:val="auto"/>
         </w:rPr>
-        <w:commentReference w:id="15"/>
-      </w:r>
-      <w:commentRangeEnd w:id="16"/>
+        <w:commentReference w:id="18"/>
+      </w:r>
+      <w:commentRangeEnd w:id="19"/>
       <w:r>
         <w:rPr>
           <w:rStyle w:val="CommentReference"/>
@@ -11645,9 +11683,9 @@
           <w:iCs w:val="0"/>
           <w:color w:val="auto"/>
         </w:rPr>
-        <w:commentReference w:id="16"/>
-      </w:r>
-      <w:commentRangeEnd w:id="17"/>
+        <w:commentReference w:id="19"/>
+      </w:r>
+      <w:commentRangeEnd w:id="20"/>
       <w:r>
         <w:rPr>
           <w:rStyle w:val="CommentReference"/>
@@ -11655,7 +11693,7 @@
           <w:iCs w:val="0"/>
           <w:color w:val="auto"/>
         </w:rPr>
-        <w:commentReference w:id="17"/>
+        <w:commentReference w:id="20"/>
       </w:r>
       <w:r>
         <w:rPr>
@@ -11701,7 +11739,7 @@
         </w:rPr>
         <w:fldChar w:fldCharType="end"/>
       </w:r>
-      <w:bookmarkEnd w:id="14"/>
+      <w:bookmarkEnd w:id="17"/>
       <w:r>
         <w:rPr>
           <w:szCs w:val="22"/>
@@ -11801,7 +11839,7 @@
       <w:pPr>
         <w:pStyle w:val="Caption"/>
       </w:pPr>
-      <w:bookmarkStart w:id="19" w:name="_Ref136190384"/>
+      <w:bookmarkStart w:id="22" w:name="_Ref136190384"/>
       <w:r>
         <w:rPr>
           <w:szCs w:val="22"/>
@@ -11841,7 +11879,7 @@
         </w:rPr>
         <w:fldChar w:fldCharType="end"/>
       </w:r>
-      <w:bookmarkEnd w:id="19"/>
+      <w:bookmarkEnd w:id="22"/>
       <w:r>
         <w:rPr>
           <w:szCs w:val="22"/>
@@ -15907,7 +15945,7 @@
           <w:szCs w:val="22"/>
         </w:rPr>
       </w:pPr>
-      <w:commentRangeStart w:id="20"/>
+      <w:commentRangeStart w:id="23"/>
       <w:r>
         <w:rPr>
           <w:szCs w:val="22"/>
@@ -16060,12 +16098,12 @@
         </w:rPr>
         <w:t>.</w:t>
       </w:r>
-      <w:commentRangeEnd w:id="20"/>
+      <w:commentRangeEnd w:id="23"/>
       <w:r>
         <w:rPr>
           <w:rStyle w:val="CommentReference"/>
         </w:rPr>
-        <w:commentReference w:id="20"/>
+        <w:commentReference w:id="23"/>
       </w:r>
     </w:p>
     <w:p>
@@ -17115,7 +17153,7 @@
           <w:szCs w:val="22"/>
         </w:rPr>
       </w:pPr>
-      <w:bookmarkStart w:id="21" w:name="_Ref136084921"/>
+      <w:bookmarkStart w:id="24" w:name="_Ref136084921"/>
       <w:r>
         <w:rPr>
           <w:szCs w:val="22"/>
@@ -17154,7 +17192,7 @@
         </w:rPr>
         <w:fldChar w:fldCharType="end"/>
       </w:r>
-      <w:bookmarkEnd w:id="21"/>
+      <w:bookmarkEnd w:id="24"/>
       <w:r>
         <w:rPr>
           <w:szCs w:val="22"/>
@@ -18693,7 +18731,7 @@
           <w:szCs w:val="22"/>
         </w:rPr>
       </w:pPr>
-      <w:bookmarkStart w:id="22" w:name="_Ref136190811"/>
+      <w:bookmarkStart w:id="25" w:name="_Ref136190811"/>
       <w:r>
         <w:rPr>
           <w:szCs w:val="22"/>
@@ -18732,7 +18770,7 @@
         </w:rPr>
         <w:fldChar w:fldCharType="end"/>
       </w:r>
-      <w:bookmarkEnd w:id="22"/>
+      <w:bookmarkEnd w:id="25"/>
       <w:r>
         <w:rPr>
           <w:szCs w:val="22"/>
@@ -18839,7 +18877,7 @@
       <w:pPr>
         <w:pStyle w:val="Caption"/>
       </w:pPr>
-      <w:bookmarkStart w:id="23" w:name="_Ref136190818"/>
+      <w:bookmarkStart w:id="26" w:name="_Ref136190818"/>
       <w:r>
         <w:rPr>
           <w:szCs w:val="22"/>
@@ -18879,7 +18917,7 @@
         </w:rPr>
         <w:fldChar w:fldCharType="end"/>
       </w:r>
-      <w:bookmarkEnd w:id="23"/>
+      <w:bookmarkEnd w:id="26"/>
       <w:r>
         <w:rPr>
           <w:szCs w:val="22"/>
@@ -21898,8 +21936,8 @@
         </w:rPr>
         <w:t xml:space="preserve"> not significantly higher in Experiment </w:t>
       </w:r>
-      <w:commentRangeStart w:id="24"/>
-      <w:commentRangeStart w:id="25"/>
+      <w:commentRangeStart w:id="27"/>
+      <w:commentRangeStart w:id="28"/>
       <w:r>
         <w:rPr>
           <w:szCs w:val="22"/>
@@ -21912,7 +21950,7 @@
         </w:rPr>
         <w:t xml:space="preserve"> (mean log-RT = </w:t>
       </w:r>
-      <w:ins w:id="26" w:author="Cummings, Shawn" w:date="2025-05-12T21:06:00Z" w16du:dateUtc="2025-05-13T01:06:00Z">
+      <w:ins w:id="29" w:author="Cummings, Shawn" w:date="2025-05-12T21:06:00Z" w16du:dateUtc="2025-05-13T01:06:00Z">
         <w:r>
           <w:rPr>
             <w:szCs w:val="22"/>
@@ -21920,7 +21958,7 @@
           <w:t>3.45</w:t>
         </w:r>
       </w:ins>
-      <w:del w:id="27" w:author="Cummings, Shawn" w:date="2025-05-12T21:06:00Z" w16du:dateUtc="2025-05-13T01:06:00Z">
+      <w:del w:id="30" w:author="Cummings, Shawn" w:date="2025-05-12T21:06:00Z" w16du:dateUtc="2025-05-13T01:06:00Z">
         <w:r>
           <w:rPr>
             <w:szCs w:val="22"/>
@@ -21934,7 +21972,7 @@
         </w:rPr>
         <w:t xml:space="preserve">, SD = </w:t>
       </w:r>
-      <w:ins w:id="28" w:author="Cummings, Shawn" w:date="2025-05-12T21:07:00Z" w16du:dateUtc="2025-05-13T01:07:00Z">
+      <w:ins w:id="31" w:author="Cummings, Shawn" w:date="2025-05-12T21:07:00Z" w16du:dateUtc="2025-05-13T01:07:00Z">
         <w:r>
           <w:rPr>
             <w:szCs w:val="22"/>
@@ -21942,7 +21980,7 @@
           <w:t>0.14</w:t>
         </w:r>
       </w:ins>
-      <w:del w:id="29" w:author="Cummings, Shawn" w:date="2025-05-12T21:07:00Z" w16du:dateUtc="2025-05-13T01:07:00Z">
+      <w:del w:id="32" w:author="Cummings, Shawn" w:date="2025-05-12T21:07:00Z" w16du:dateUtc="2025-05-13T01:07:00Z">
         <w:r>
           <w:rPr>
             <w:szCs w:val="22"/>
@@ -21956,7 +21994,7 @@
         </w:rPr>
         <w:t xml:space="preserve">), compared to Experiments 1a-c (mean = </w:t>
       </w:r>
-      <w:ins w:id="30" w:author="Cummings, Shawn" w:date="2025-05-12T21:09:00Z" w16du:dateUtc="2025-05-13T01:09:00Z">
+      <w:ins w:id="33" w:author="Cummings, Shawn" w:date="2025-05-12T21:09:00Z" w16du:dateUtc="2025-05-13T01:09:00Z">
         <w:r>
           <w:rPr>
             <w:szCs w:val="22"/>
@@ -21964,7 +22002,7 @@
           <w:t>3.44</w:t>
         </w:r>
       </w:ins>
-      <w:del w:id="31" w:author="Cummings, Shawn" w:date="2025-05-12T21:09:00Z" w16du:dateUtc="2025-05-13T01:09:00Z">
+      <w:del w:id="34" w:author="Cummings, Shawn" w:date="2025-05-12T21:09:00Z" w16du:dateUtc="2025-05-13T01:09:00Z">
         <w:r>
           <w:rPr>
             <w:szCs w:val="22"/>
@@ -21978,7 +22016,7 @@
         </w:rPr>
         <w:t xml:space="preserve">, SD = </w:t>
       </w:r>
-      <w:ins w:id="32" w:author="Cummings, Shawn" w:date="2025-05-12T21:09:00Z" w16du:dateUtc="2025-05-13T01:09:00Z">
+      <w:ins w:id="35" w:author="Cummings, Shawn" w:date="2025-05-12T21:09:00Z" w16du:dateUtc="2025-05-13T01:09:00Z">
         <w:r>
           <w:rPr>
             <w:szCs w:val="22"/>
@@ -21986,7 +22024,7 @@
           <w:t>0.15</w:t>
         </w:r>
       </w:ins>
-      <w:del w:id="33" w:author="Cummings, Shawn" w:date="2025-05-12T21:09:00Z" w16du:dateUtc="2025-05-13T01:09:00Z">
+      <w:del w:id="36" w:author="Cummings, Shawn" w:date="2025-05-12T21:09:00Z" w16du:dateUtc="2025-05-13T01:09:00Z">
         <w:r>
           <w:rPr>
             <w:szCs w:val="22"/>
@@ -22000,19 +22038,19 @@
         </w:rPr>
         <w:t>)</w:t>
       </w:r>
-      <w:commentRangeEnd w:id="24"/>
+      <w:commentRangeEnd w:id="27"/>
       <w:r>
         <w:rPr>
           <w:rStyle w:val="CommentReference"/>
         </w:rPr>
-        <w:commentReference w:id="24"/>
-      </w:r>
-      <w:commentRangeEnd w:id="25"/>
+        <w:commentReference w:id="27"/>
+      </w:r>
+      <w:commentRangeEnd w:id="28"/>
       <w:r>
         <w:rPr>
           <w:rStyle w:val="CommentReference"/>
         </w:rPr>
-        <w:commentReference w:id="25"/>
+        <w:commentReference w:id="28"/>
       </w:r>
       <w:r>
         <w:rPr>
@@ -22069,7 +22107,7 @@
         </w:rPr>
         <w:t>A second alternative is that while the presence of the pen itself—rather than its impact on the articulators—may be sufficient to induce compensation, the black box</w:t>
       </w:r>
-      <w:commentRangeStart w:id="34"/>
+      <w:commentRangeStart w:id="37"/>
       <w:r>
         <w:rPr>
           <w:szCs w:val="22"/>
@@ -22094,12 +22132,12 @@
         </w:rPr>
         <w:t xml:space="preserve"> less obvious and harder to visually access. </w:t>
       </w:r>
-      <w:commentRangeEnd w:id="34"/>
+      <w:commentRangeEnd w:id="37"/>
       <w:r>
         <w:rPr>
           <w:rStyle w:val="CommentReference"/>
         </w:rPr>
-        <w:commentReference w:id="34"/>
+        <w:commentReference w:id="37"/>
       </w:r>
       <w:r>
         <w:rPr>
@@ -26501,11 +26539,11 @@
         <w:spacing w:line="240" w:lineRule="auto"/>
         <w:ind w:left="360" w:hanging="360"/>
         <w:rPr>
-          <w:ins w:id="35" w:author="Cummings, Shawn" w:date="2025-05-12T20:19:00Z" w16du:dateUtc="2025-05-13T00:19:00Z"/>
-          <w:szCs w:val="22"/>
-        </w:rPr>
-      </w:pPr>
-      <w:ins w:id="36" w:author="Cummings, Shawn" w:date="2025-05-12T20:19:00Z">
+          <w:ins w:id="38" w:author="Cummings, Shawn" w:date="2025-05-12T20:19:00Z" w16du:dateUtc="2025-05-13T00:19:00Z"/>
+          <w:szCs w:val="22"/>
+        </w:rPr>
+      </w:pPr>
+      <w:ins w:id="39" w:author="Cummings, Shawn" w:date="2025-05-12T20:19:00Z">
         <w:r>
           <w:rPr>
             <w:szCs w:val="22"/>
@@ -26680,6 +26718,22 @@
       </w:r>
     </w:p>
   </w:comment>
+  <w:comment w:id="7" w:author="Cummings, Shawn" w:date="2025-05-19T12:09:00Z" w:initials="SC">
+    <w:p>
+      <w:pPr>
+        <w:jc w:val="left"/>
+      </w:pPr>
+      <w:r>
+        <w:rPr>
+          <w:rStyle w:val="CommentReference"/>
+        </w:rPr>
+        <w:annotationRef/>
+      </w:r>
+      <w:r>
+        <w:t>Little more here, align with above and with reviewer concerns</w:t>
+      </w:r>
+    </w:p>
+  </w:comment>
   <w:comment w:id="3" w:author="Cummings, Shawn" w:date="2025-05-09T12:59:00Z" w:initials="SC">
     <w:p>
       <w:pPr>
@@ -26712,7 +26766,7 @@
       </w:r>
     </w:p>
   </w:comment>
-  <w:comment w:id="7" w:author="Jaeger, Florian" w:date="2025-05-11T16:19:00Z" w:initials="TJ">
+  <w:comment w:id="10" w:author="Jaeger, Florian" w:date="2025-05-11T16:19:00Z" w:initials="TJ">
     <w:p>
       <w:pPr>
         <w:jc w:val="left"/>
@@ -26742,7 +26796,7 @@
       </w:r>
     </w:p>
   </w:comment>
-  <w:comment w:id="8" w:author="Cummings, Shawn" w:date="2025-05-12T20:37:00Z" w:initials="SC">
+  <w:comment w:id="11" w:author="Cummings, Shawn" w:date="2025-05-12T20:37:00Z" w:initials="SC">
     <w:p>
       <w:pPr>
         <w:jc w:val="left"/>
@@ -26758,7 +26812,7 @@
       </w:r>
     </w:p>
   </w:comment>
-  <w:comment w:id="10" w:author="Jaeger, Florian" w:date="2025-05-11T16:22:00Z" w:initials="TJ">
+  <w:comment w:id="13" w:author="Jaeger, Florian" w:date="2025-05-11T16:22:00Z" w:initials="TJ">
     <w:p>
       <w:pPr>
         <w:jc w:val="left"/>
@@ -26777,7 +26831,7 @@
       </w:r>
     </w:p>
   </w:comment>
-  <w:comment w:id="11" w:author="Jaeger, Florian" w:date="2025-05-11T16:22:00Z" w:initials="TJ">
+  <w:comment w:id="14" w:author="Jaeger, Florian" w:date="2025-05-11T16:22:00Z" w:initials="TJ">
     <w:p>
       <w:pPr>
         <w:jc w:val="left"/>
@@ -26796,7 +26850,7 @@
       </w:r>
     </w:p>
   </w:comment>
-  <w:comment w:id="15" w:author="Jaeger, Florian" w:date="2025-05-11T17:36:00Z" w:initials="TJ">
+  <w:comment w:id="18" w:author="Jaeger, Florian" w:date="2025-05-11T17:36:00Z" w:initials="TJ">
     <w:p>
       <w:pPr>
         <w:jc w:val="left"/>
@@ -26815,7 +26869,7 @@
       </w:r>
     </w:p>
   </w:comment>
-  <w:comment w:id="16" w:author="Jaeger, Florian" w:date="2025-05-11T17:37:00Z" w:initials="TJ">
+  <w:comment w:id="19" w:author="Jaeger, Florian" w:date="2025-05-11T17:37:00Z" w:initials="TJ">
     <w:p>
       <w:pPr>
         <w:jc w:val="left"/>
@@ -26834,7 +26888,7 @@
       </w:r>
     </w:p>
   </w:comment>
-  <w:comment w:id="17" w:author="Cummings, Shawn" w:date="2025-05-12T20:55:00Z" w:initials="SC">
+  <w:comment w:id="20" w:author="Cummings, Shawn" w:date="2025-05-12T20:55:00Z" w:initials="SC">
     <w:p>
       <w:pPr>
         <w:jc w:val="left"/>
@@ -26850,7 +26904,7 @@
       </w:r>
     </w:p>
   </w:comment>
-  <w:comment w:id="20" w:author="Jaeger, Florian" w:date="2025-05-11T17:39:00Z" w:initials="TJ">
+  <w:comment w:id="23" w:author="Jaeger, Florian" w:date="2025-05-11T17:39:00Z" w:initials="TJ">
     <w:p>
       <w:pPr>
         <w:jc w:val="left"/>
@@ -26869,7 +26923,7 @@
       </w:r>
     </w:p>
   </w:comment>
-  <w:comment w:id="24" w:author="Jaeger, Florian" w:date="2025-05-11T16:49:00Z" w:initials="TJ">
+  <w:comment w:id="27" w:author="Jaeger, Florian" w:date="2025-05-11T16:49:00Z" w:initials="TJ">
     <w:p>
       <w:pPr>
         <w:jc w:val="left"/>
@@ -26888,7 +26942,7 @@
       </w:r>
     </w:p>
   </w:comment>
-  <w:comment w:id="25" w:author="Cummings, Shawn" w:date="2025-05-12T21:09:00Z" w:initials="SC">
+  <w:comment w:id="28" w:author="Cummings, Shawn" w:date="2025-05-12T21:09:00Z" w:initials="SC">
     <w:p>
       <w:pPr>
         <w:jc w:val="left"/>
@@ -26904,7 +26958,7 @@
       </w:r>
     </w:p>
   </w:comment>
-  <w:comment w:id="34" w:author="Jaeger, Florian" w:date="2025-05-11T16:53:00Z" w:initials="TJ">
+  <w:comment w:id="37" w:author="Jaeger, Florian" w:date="2025-05-11T16:53:00Z" w:initials="TJ">
     <w:p>
       <w:pPr>
         <w:jc w:val="left"/>
@@ -26931,6 +26985,7 @@
   <w15:commentEx w15:paraId="4DDBF32D" w15:done="0"/>
   <w15:commentEx w15:paraId="1486FF83" w15:paraIdParent="4DDBF32D" w15:done="0"/>
   <w15:commentEx w15:paraId="2245456D" w15:done="0"/>
+  <w15:commentEx w15:paraId="4917F669" w15:done="0"/>
   <w15:commentEx w15:paraId="5B928638" w15:done="0"/>
   <w15:commentEx w15:paraId="09066744" w15:paraIdParent="5B928638" w15:done="0"/>
   <w15:commentEx w15:paraId="0CC8A972" w15:done="0"/>
@@ -26952,6 +27007,7 @@
   <w16cex:commentExtensible w16cex:durableId="2D808FF6" w16cex:dateUtc="2025-05-11T21:22:00Z"/>
   <w16cex:commentExtensible w16cex:durableId="4DB993EE" w16cex:dateUtc="2025-05-13T00:36:00Z"/>
   <w16cex:commentExtensible w16cex:durableId="6685186B" w16cex:dateUtc="2025-05-11T20:16:00Z"/>
+  <w16cex:commentExtensible w16cex:durableId="14E56084" w16cex:dateUtc="2025-05-19T16:09:00Z"/>
   <w16cex:commentExtensible w16cex:durableId="7FA83320" w16cex:dateUtc="2025-05-09T16:59:00Z"/>
   <w16cex:commentExtensible w16cex:durableId="68397BDD" w16cex:dateUtc="2025-05-09T17:12:00Z"/>
   <w16cex:commentExtensible w16cex:durableId="6BE9660C" w16cex:dateUtc="2025-05-11T20:19:00Z"/>
@@ -26973,6 +27029,7 @@
   <w16cid:commentId w16cid:paraId="4DDBF32D" w16cid:durableId="2D808FF6"/>
   <w16cid:commentId w16cid:paraId="1486FF83" w16cid:durableId="4DB993EE"/>
   <w16cid:commentId w16cid:paraId="2245456D" w16cid:durableId="6685186B"/>
+  <w16cid:commentId w16cid:paraId="4917F669" w16cid:durableId="14E56084"/>
   <w16cid:commentId w16cid:paraId="5B928638" w16cid:durableId="7FA83320"/>
   <w16cid:commentId w16cid:paraId="09066744" w16cid:durableId="68397BDD"/>
   <w16cid:commentId w16cid:paraId="0CC8A972" w16cid:durableId="6BE9660C"/>
@@ -32432,6 +32489,7 @@
   <w:style w:type="character" w:default="1" w:styleId="DefaultParagraphFont">
     <w:name w:val="Default Paragraph Font"/>
     <w:uiPriority w:val="1"/>
+    <w:semiHidden/>
     <w:unhideWhenUsed/>
   </w:style>
   <w:style w:type="table" w:default="1" w:styleId="TableNormal">
@@ -33314,7 +33372,7 @@
 </file>
 
 <file path=customXml/itemProps1.xml><?xml version="1.0" encoding="utf-8"?>
-<ds:datastoreItem xmlns:ds="http://schemas.openxmlformats.org/officeDocument/2006/customXml" ds:itemID="{CEAF82DD-8E2B-F442-854C-D22AA8B4402F}">
+<ds:datastoreItem xmlns:ds="http://schemas.openxmlformats.org/officeDocument/2006/customXml" ds:itemID="{B20ED14E-20BD-0342-A447-925FFA2C3804}">
   <ds:schemaRefs>
     <ds:schemaRef ds:uri="http://schemas.openxmlformats.org/officeDocument/2006/bibliography"/>
   </ds:schemaRefs>
@@ -33322,7 +33380,7 @@
 </file>
 
 <file path=customXml/itemProps2.xml><?xml version="1.0" encoding="utf-8"?>
-<ds:datastoreItem xmlns:ds="http://schemas.openxmlformats.org/officeDocument/2006/customXml" ds:itemID="{B20ED14E-20BD-0342-A447-925FFA2C3804}">
+<ds:datastoreItem xmlns:ds="http://schemas.openxmlformats.org/officeDocument/2006/customXml" ds:itemID="{CEAF82DD-8E2B-F442-854C-D22AA8B4402F}">
   <ds:schemaRefs>
     <ds:schemaRef ds:uri="http://schemas.openxmlformats.org/officeDocument/2006/bibliography"/>
   </ds:schemaRefs>

</xml_diff>

<commit_message>
description of trial-level exclusions
</commit_message>
<xml_diff>
--- a/output/papers/Round 2/manuscript-brief.docx
+++ b/output/papers/Round 2/manuscript-brief.docx
@@ -7760,6 +7760,82 @@
         </w:rPr>
         <w:t xml:space="preserve"> </w:t>
       </w:r>
+      <w:ins w:id="7" w:author="Cummings, Shawn" w:date="2025-05-21T14:25:00Z" w16du:dateUtc="2025-05-21T18:25:00Z">
+        <w:r>
+          <w:rPr>
+            <w:szCs w:val="22"/>
+          </w:rPr>
+          <w:t>Individual trials were additionally excluded</w:t>
+        </w:r>
+      </w:ins>
+      <w:ins w:id="8" w:author="Cummings, Shawn" w:date="2025-05-21T14:27:00Z" w16du:dateUtc="2025-05-21T18:27:00Z">
+        <w:r>
+          <w:rPr>
+            <w:szCs w:val="22"/>
+          </w:rPr>
+          <w:t xml:space="preserve"> due either to (incorrect) catch trial responses, or</w:t>
+        </w:r>
+      </w:ins>
+      <w:ins w:id="9" w:author="Cummings, Shawn" w:date="2025-05-21T14:25:00Z" w16du:dateUtc="2025-05-21T18:25:00Z">
+        <w:r>
+          <w:rPr>
+            <w:szCs w:val="22"/>
+          </w:rPr>
+          <w:t xml:space="preserve"> </w:t>
+        </w:r>
+      </w:ins>
+      <w:ins w:id="10" w:author="Cummings, Shawn" w:date="2025-05-21T14:26:00Z" w16du:dateUtc="2025-05-21T18:26:00Z">
+        <w:r>
+          <w:rPr>
+            <w:szCs w:val="22"/>
+          </w:rPr>
+          <w:t>for being unusually slow or fast. This was operationalized by scaling</w:t>
+        </w:r>
+      </w:ins>
+      <w:ins w:id="11" w:author="Cummings, Shawn" w:date="2025-05-21T14:29:00Z" w16du:dateUtc="2025-05-21T18:29:00Z">
+        <w:r>
+          <w:rPr>
+            <w:szCs w:val="22"/>
+          </w:rPr>
+          <w:t xml:space="preserve"> </w:t>
+        </w:r>
+        <w:r>
+          <w:rPr>
+            <w:szCs w:val="22"/>
+          </w:rPr>
+          <w:t>log-transformed RT</w:t>
+        </w:r>
+        <w:r>
+          <w:rPr>
+            <w:szCs w:val="22"/>
+          </w:rPr>
+          <w:t>s by participant, and then again by trial (to account for the fact that participants generally sped up over the course of the experiment</w:t>
+        </w:r>
+      </w:ins>
+      <w:ins w:id="12" w:author="Cummings, Shawn" w:date="2025-05-21T14:30:00Z" w16du:dateUtc="2025-05-21T18:30:00Z">
+        <w:r>
+          <w:rPr>
+            <w:szCs w:val="22"/>
+          </w:rPr>
+          <w:t xml:space="preserve">). </w:t>
+        </w:r>
+      </w:ins>
+      <w:ins w:id="13" w:author="Cummings, Shawn" w:date="2025-05-21T14:28:00Z" w16du:dateUtc="2025-05-21T18:28:00Z">
+        <w:r>
+          <w:rPr>
+            <w:szCs w:val="22"/>
+          </w:rPr>
+          <w:t xml:space="preserve"> </w:t>
+        </w:r>
+      </w:ins>
+      <w:ins w:id="14" w:author="Cummings, Shawn" w:date="2025-05-21T14:26:00Z" w16du:dateUtc="2025-05-21T18:26:00Z">
+        <w:r>
+          <w:rPr>
+            <w:szCs w:val="22"/>
+          </w:rPr>
+          <w:t xml:space="preserve"> </w:t>
+        </w:r>
+      </w:ins>
     </w:p>
     <w:p>
       <w:pPr>
@@ -7811,8 +7887,6 @@
         </w:rPr>
         <w:t xml:space="preserve"> summarizes the exclusions for all experiments. </w:t>
       </w:r>
-      <w:commentRangeStart w:id="7"/>
-      <w:commentRangeStart w:id="8"/>
       <w:r>
         <w:rPr>
           <w:szCs w:val="22"/>
@@ -7849,7 +7923,7 @@
         </w:rPr>
         <w:t>(</w:t>
       </w:r>
-      <w:commentRangeStart w:id="9"/>
+      <w:commentRangeStart w:id="15"/>
       <w:r>
         <w:rPr>
           <w:szCs w:val="22"/>
@@ -7862,12 +7936,12 @@
         </w:rPr>
         <w:t xml:space="preserve"> </w:t>
       </w:r>
-      <w:commentRangeEnd w:id="9"/>
+      <w:commentRangeEnd w:id="15"/>
       <w:r>
         <w:rPr>
           <w:rStyle w:val="CommentReference"/>
         </w:rPr>
-        <w:commentReference w:id="9"/>
+        <w:commentReference w:id="15"/>
       </w:r>
       <w:r>
         <w:rPr>
@@ -7903,6 +7977,7 @@
         <w:rPr>
           <w:szCs w:val="22"/>
         </w:rPr>
+        <w:lastRenderedPageBreak/>
         <w:t>12</w:t>
       </w:r>
       <w:r>
@@ -8006,20 +8081,6 @@
           <w:szCs w:val="22"/>
         </w:rPr>
         <w:t>never the case.</w:t>
-      </w:r>
-      <w:commentRangeEnd w:id="7"/>
-      <w:r>
-        <w:rPr>
-          <w:rStyle w:val="CommentReference"/>
-        </w:rPr>
-        <w:commentReference w:id="7"/>
-      </w:r>
-      <w:commentRangeEnd w:id="8"/>
-      <w:r>
-        <w:rPr>
-          <w:rStyle w:val="CommentReference"/>
-        </w:rPr>
-        <w:commentReference w:id="8"/>
       </w:r>
     </w:p>
     <w:p>
@@ -8029,9 +8090,8 @@
           <w:szCs w:val="22"/>
         </w:rPr>
       </w:pPr>
-      <w:bookmarkStart w:id="10" w:name="_Ref136088042"/>
-      <w:r>
-        <w:lastRenderedPageBreak/>
+      <w:bookmarkStart w:id="16" w:name="_Ref136088042"/>
+      <w:r>
         <w:t>T</w:t>
       </w:r>
       <w:r>
@@ -8045,7 +8105,7 @@
           <w:t>1</w:t>
         </w:r>
       </w:fldSimple>
-      <w:bookmarkEnd w:id="10"/>
+      <w:bookmarkEnd w:id="16"/>
       <w:r>
         <w:tab/>
         <w:t xml:space="preserve">Exclusions for all experiments reported. </w:t>
@@ -10473,7 +10533,14 @@
         <w:rPr>
           <w:szCs w:val="22"/>
         </w:rPr>
-        <w:t>for the analysis of identification responses</w:t>
+        <w:t xml:space="preserve">for the analysis of identification </w:t>
+      </w:r>
+      <w:r>
+        <w:rPr>
+          <w:szCs w:val="22"/>
+        </w:rPr>
+        <w:lastRenderedPageBreak/>
+        <w:t>responses</w:t>
       </w:r>
       <w:r>
         <w:rPr>
@@ -10558,7 +10625,6 @@
         <w:rPr>
           <w:szCs w:val="22"/>
         </w:rPr>
-        <w:lastRenderedPageBreak/>
         <w:t xml:space="preserve">as well as all their interactions. </w:t>
       </w:r>
       <w:r>
@@ -10686,27 +10752,27 @@
         </w:rPr>
         <w:t xml:space="preserve">the three design variables </w:t>
       </w:r>
-      <w:commentRangeStart w:id="12"/>
-      <w:commentRangeStart w:id="13"/>
+      <w:commentRangeStart w:id="18"/>
+      <w:commentRangeStart w:id="19"/>
       <w:r>
         <w:rPr>
           <w:szCs w:val="22"/>
         </w:rPr>
         <w:t>pen location</w:t>
       </w:r>
-      <w:commentRangeEnd w:id="12"/>
+      <w:commentRangeEnd w:id="18"/>
       <w:r>
         <w:rPr>
           <w:rStyle w:val="CommentReference"/>
         </w:rPr>
-        <w:commentReference w:id="12"/>
-      </w:r>
-      <w:commentRangeEnd w:id="13"/>
+        <w:commentReference w:id="18"/>
+      </w:r>
+      <w:commentRangeEnd w:id="19"/>
       <w:r>
         <w:rPr>
           <w:rStyle w:val="CommentReference"/>
         </w:rPr>
-        <w:commentReference w:id="13"/>
+        <w:commentReference w:id="19"/>
       </w:r>
       <w:r>
         <w:rPr>
@@ -10999,7 +11065,15 @@
             <w:rFonts w:ascii="Cambria Math" w:hAnsi="Cambria Math"/>
             <w:szCs w:val="22"/>
           </w:rPr>
-          <m:t>≤1.002</m:t>
+          <m:t>≤</m:t>
+        </m:r>
+        <m:r>
+          <w:rPr>
+            <w:rFonts w:ascii="Cambria Math" w:hAnsi="Cambria Math"/>
+            <w:szCs w:val="22"/>
+          </w:rPr>
+          <w:lastRenderedPageBreak/>
+          <m:t>1.002</m:t>
         </m:r>
       </m:oMath>
       <w:r>
@@ -11062,7 +11136,7 @@
     <w:p>
       <w:pPr>
         <w:rPr>
-          <w:ins w:id="14" w:author="Cummings, Shawn" w:date="2025-05-12T20:54:00Z" w16du:dateUtc="2025-05-13T00:54:00Z"/>
+          <w:ins w:id="20" w:author="Cummings, Shawn" w:date="2025-05-12T20:54:00Z" w16du:dateUtc="2025-05-13T00:54:00Z"/>
           <w:szCs w:val="22"/>
         </w:rPr>
       </w:pPr>
@@ -11142,14 +11216,7 @@
         <w:rPr>
           <w:szCs w:val="22"/>
         </w:rPr>
-        <w:t xml:space="preserve">, we </w:t>
-      </w:r>
-      <w:r>
-        <w:rPr>
-          <w:szCs w:val="22"/>
-        </w:rPr>
-        <w:lastRenderedPageBreak/>
-        <w:t xml:space="preserve">present Bayesian hypothesis tests </w:t>
+        <w:t xml:space="preserve">, we present Bayesian hypothesis tests </w:t>
       </w:r>
       <w:r>
         <w:rPr>
@@ -11235,8 +11302,8 @@
         </w:rPr>
         <w:t xml:space="preserve">summarizes those tests for all three experiments. </w:t>
       </w:r>
-      <w:commentRangeStart w:id="15"/>
-      <w:commentRangeStart w:id="16"/>
+      <w:commentRangeStart w:id="21"/>
+      <w:commentRangeStart w:id="22"/>
       <w:r>
         <w:rPr>
           <w:szCs w:val="22"/>
@@ -11293,19 +11360,19 @@
         </w:rPr>
         <w:t xml:space="preserve"> continuum steps </w:t>
       </w:r>
-      <w:commentRangeEnd w:id="15"/>
+      <w:commentRangeEnd w:id="21"/>
       <w:r>
         <w:rPr>
           <w:rStyle w:val="CommentReference"/>
         </w:rPr>
-        <w:commentReference w:id="15"/>
-      </w:r>
-      <w:commentRangeEnd w:id="16"/>
+        <w:commentReference w:id="21"/>
+      </w:r>
+      <w:commentRangeEnd w:id="22"/>
       <w:r>
         <w:rPr>
           <w:rStyle w:val="CommentReference"/>
         </w:rPr>
-        <w:commentReference w:id="16"/>
+        <w:commentReference w:id="22"/>
       </w:r>
       <w:r>
         <w:rPr>
@@ -11380,16 +11447,17 @@
         <w:rPr>
           <w:szCs w:val="22"/>
         </w:rPr>
-        <w:pPrChange w:id="17" w:author="Cummings, Shawn" w:date="2025-05-12T20:55:00Z" w16du:dateUtc="2025-05-13T00:55:00Z">
+        <w:pPrChange w:id="23" w:author="Cummings, Shawn" w:date="2025-05-12T20:55:00Z" w16du:dateUtc="2025-05-13T00:55:00Z">
           <w:pPr/>
         </w:pPrChange>
       </w:pPr>
-      <w:ins w:id="18" w:author="Cummings, Shawn" w:date="2025-05-12T20:54:00Z" w16du:dateUtc="2025-05-13T00:54:00Z">
+      <w:ins w:id="24" w:author="Cummings, Shawn" w:date="2025-05-12T20:54:00Z" w16du:dateUtc="2025-05-13T00:54:00Z">
         <w:r>
           <w:rPr>
             <w:noProof/>
             <w:szCs w:val="22"/>
           </w:rPr>
+          <w:lastRenderedPageBreak/>
           <w:drawing>
             <wp:inline distT="0" distB="0" distL="0" distR="0" wp14:anchorId="1E17D0B6" wp14:editId="40EC08D6">
               <wp:extent cx="5486400" cy="5715000"/>
@@ -11442,17 +11510,16 @@
           <w:docGrid w:linePitch="360"/>
         </w:sectPr>
       </w:pPr>
-      <w:bookmarkStart w:id="19" w:name="_Ref136190394"/>
-      <w:commentRangeStart w:id="20"/>
-      <w:commentRangeStart w:id="21"/>
-      <w:commentRangeStart w:id="22"/>
-      <w:del w:id="23" w:author="Cummings, Shawn" w:date="2025-05-12T20:53:00Z" w16du:dateUtc="2025-05-13T00:53:00Z">
+      <w:bookmarkStart w:id="25" w:name="_Ref136190394"/>
+      <w:commentRangeStart w:id="26"/>
+      <w:commentRangeStart w:id="27"/>
+      <w:commentRangeStart w:id="28"/>
+      <w:del w:id="29" w:author="Cummings, Shawn" w:date="2025-05-12T20:53:00Z" w16du:dateUtc="2025-05-13T00:53:00Z">
         <w:r>
           <w:rPr>
             <w:noProof/>
             <w:szCs w:val="22"/>
           </w:rPr>
-          <w:lastRenderedPageBreak/>
           <w:drawing>
             <wp:anchor distT="0" distB="0" distL="114300" distR="114300" simplePos="0" relativeHeight="251672576" behindDoc="0" locked="0" layoutInCell="1" allowOverlap="1" wp14:anchorId="321665CF" wp14:editId="24DC646C">
               <wp:simplePos x="0" y="0"/>
@@ -11504,7 +11571,7 @@
           </w:drawing>
         </w:r>
       </w:del>
-      <w:commentRangeEnd w:id="20"/>
+      <w:commentRangeEnd w:id="26"/>
       <w:r>
         <w:rPr>
           <w:rStyle w:val="CommentReference"/>
@@ -11512,9 +11579,9 @@
           <w:iCs w:val="0"/>
           <w:color w:val="auto"/>
         </w:rPr>
-        <w:commentReference w:id="20"/>
-      </w:r>
-      <w:commentRangeEnd w:id="21"/>
+        <w:commentReference w:id="26"/>
+      </w:r>
+      <w:commentRangeEnd w:id="27"/>
       <w:r>
         <w:rPr>
           <w:rStyle w:val="CommentReference"/>
@@ -11522,9 +11589,9 @@
           <w:iCs w:val="0"/>
           <w:color w:val="auto"/>
         </w:rPr>
-        <w:commentReference w:id="21"/>
-      </w:r>
-      <w:commentRangeEnd w:id="22"/>
+        <w:commentReference w:id="27"/>
+      </w:r>
+      <w:commentRangeEnd w:id="28"/>
       <w:r>
         <w:rPr>
           <w:rStyle w:val="CommentReference"/>
@@ -11532,7 +11599,7 @@
           <w:iCs w:val="0"/>
           <w:color w:val="auto"/>
         </w:rPr>
-        <w:commentReference w:id="22"/>
+        <w:commentReference w:id="28"/>
       </w:r>
       <w:r>
         <w:rPr>
@@ -11578,7 +11645,7 @@
         </w:rPr>
         <w:fldChar w:fldCharType="end"/>
       </w:r>
-      <w:bookmarkEnd w:id="19"/>
+      <w:bookmarkEnd w:id="25"/>
       <w:r>
         <w:rPr>
           <w:szCs w:val="22"/>
@@ -11678,7 +11745,7 @@
       <w:pPr>
         <w:pStyle w:val="Caption"/>
       </w:pPr>
-      <w:bookmarkStart w:id="24" w:name="_Ref136190384"/>
+      <w:bookmarkStart w:id="30" w:name="_Ref136190384"/>
       <w:r>
         <w:rPr>
           <w:szCs w:val="22"/>
@@ -11718,7 +11785,7 @@
         </w:rPr>
         <w:fldChar w:fldCharType="end"/>
       </w:r>
-      <w:bookmarkEnd w:id="24"/>
+      <w:bookmarkEnd w:id="30"/>
       <w:r>
         <w:rPr>
           <w:szCs w:val="22"/>
@@ -15784,7 +15851,7 @@
           <w:szCs w:val="22"/>
         </w:rPr>
       </w:pPr>
-      <w:commentRangeStart w:id="25"/>
+      <w:commentRangeStart w:id="31"/>
       <w:r>
         <w:rPr>
           <w:szCs w:val="22"/>
@@ -15949,12 +16016,12 @@
         </w:rPr>
         <w:t>.</w:t>
       </w:r>
-      <w:commentRangeEnd w:id="25"/>
+      <w:commentRangeEnd w:id="31"/>
       <w:r>
         <w:rPr>
           <w:rStyle w:val="CommentReference"/>
         </w:rPr>
-        <w:commentReference w:id="25"/>
+        <w:commentReference w:id="31"/>
       </w:r>
     </w:p>
     <w:p>
@@ -16990,7 +17057,7 @@
           <w:szCs w:val="22"/>
         </w:rPr>
       </w:pPr>
-      <w:bookmarkStart w:id="26" w:name="_Ref136084921"/>
+      <w:bookmarkStart w:id="32" w:name="_Ref136084921"/>
       <w:r>
         <w:rPr>
           <w:szCs w:val="22"/>
@@ -17029,7 +17096,7 @@
         </w:rPr>
         <w:fldChar w:fldCharType="end"/>
       </w:r>
-      <w:bookmarkEnd w:id="26"/>
+      <w:bookmarkEnd w:id="32"/>
       <w:r>
         <w:rPr>
           <w:szCs w:val="22"/>
@@ -18566,7 +18633,7 @@
           <w:szCs w:val="22"/>
         </w:rPr>
       </w:pPr>
-      <w:bookmarkStart w:id="27" w:name="_Ref136190811"/>
+      <w:bookmarkStart w:id="33" w:name="_Ref136190811"/>
       <w:r>
         <w:rPr>
           <w:szCs w:val="22"/>
@@ -18605,7 +18672,7 @@
         </w:rPr>
         <w:fldChar w:fldCharType="end"/>
       </w:r>
-      <w:bookmarkEnd w:id="27"/>
+      <w:bookmarkEnd w:id="33"/>
       <w:r>
         <w:rPr>
           <w:szCs w:val="22"/>
@@ -18712,7 +18779,7 @@
       <w:pPr>
         <w:pStyle w:val="Caption"/>
       </w:pPr>
-      <w:bookmarkStart w:id="28" w:name="_Ref136190818"/>
+      <w:bookmarkStart w:id="34" w:name="_Ref136190818"/>
       <w:r>
         <w:rPr>
           <w:szCs w:val="22"/>
@@ -18752,7 +18819,7 @@
         </w:rPr>
         <w:fldChar w:fldCharType="end"/>
       </w:r>
-      <w:bookmarkEnd w:id="28"/>
+      <w:bookmarkEnd w:id="34"/>
       <w:r>
         <w:rPr>
           <w:szCs w:val="22"/>
@@ -21035,7 +21102,7 @@
           <w:szCs w:val="22"/>
         </w:rPr>
       </w:pPr>
-      <w:commentRangeStart w:id="29"/>
+      <w:commentRangeStart w:id="35"/>
       <w:r>
         <w:rPr>
           <w:szCs w:val="22"/>
@@ -21155,12 +21222,12 @@
         </w:rPr>
         <w:t xml:space="preserve"> condition in Experiment 1c. </w:t>
       </w:r>
-      <w:commentRangeEnd w:id="29"/>
+      <w:commentRangeEnd w:id="35"/>
       <w:r>
         <w:rPr>
           <w:rStyle w:val="CommentReference"/>
         </w:rPr>
-        <w:commentReference w:id="29"/>
+        <w:commentReference w:id="35"/>
       </w:r>
       <w:r>
         <w:rPr>
@@ -21789,8 +21856,8 @@
         </w:rPr>
         <w:t xml:space="preserve"> not significantly higher in Experiment </w:t>
       </w:r>
-      <w:commentRangeStart w:id="30"/>
-      <w:commentRangeStart w:id="31"/>
+      <w:commentRangeStart w:id="36"/>
+      <w:commentRangeStart w:id="37"/>
       <w:r>
         <w:rPr>
           <w:szCs w:val="22"/>
@@ -21803,7 +21870,7 @@
         </w:rPr>
         <w:t xml:space="preserve"> (mean log-RT = </w:t>
       </w:r>
-      <w:ins w:id="32" w:author="Cummings, Shawn" w:date="2025-05-12T21:06:00Z" w16du:dateUtc="2025-05-13T01:06:00Z">
+      <w:ins w:id="38" w:author="Cummings, Shawn" w:date="2025-05-12T21:06:00Z" w16du:dateUtc="2025-05-13T01:06:00Z">
         <w:r>
           <w:rPr>
             <w:szCs w:val="22"/>
@@ -21811,7 +21878,7 @@
           <w:t>3.45</w:t>
         </w:r>
       </w:ins>
-      <w:del w:id="33" w:author="Cummings, Shawn" w:date="2025-05-12T21:06:00Z" w16du:dateUtc="2025-05-13T01:06:00Z">
+      <w:del w:id="39" w:author="Cummings, Shawn" w:date="2025-05-12T21:06:00Z" w16du:dateUtc="2025-05-13T01:06:00Z">
         <w:r>
           <w:rPr>
             <w:szCs w:val="22"/>
@@ -21825,7 +21892,7 @@
         </w:rPr>
         <w:t xml:space="preserve">, SD = </w:t>
       </w:r>
-      <w:ins w:id="34" w:author="Cummings, Shawn" w:date="2025-05-12T21:07:00Z" w16du:dateUtc="2025-05-13T01:07:00Z">
+      <w:ins w:id="40" w:author="Cummings, Shawn" w:date="2025-05-12T21:07:00Z" w16du:dateUtc="2025-05-13T01:07:00Z">
         <w:r>
           <w:rPr>
             <w:szCs w:val="22"/>
@@ -21833,7 +21900,7 @@
           <w:t>0.14</w:t>
         </w:r>
       </w:ins>
-      <w:del w:id="35" w:author="Cummings, Shawn" w:date="2025-05-12T21:07:00Z" w16du:dateUtc="2025-05-13T01:07:00Z">
+      <w:del w:id="41" w:author="Cummings, Shawn" w:date="2025-05-12T21:07:00Z" w16du:dateUtc="2025-05-13T01:07:00Z">
         <w:r>
           <w:rPr>
             <w:szCs w:val="22"/>
@@ -21847,7 +21914,7 @@
         </w:rPr>
         <w:t xml:space="preserve">), compared to Experiments 1a-c (mean = </w:t>
       </w:r>
-      <w:ins w:id="36" w:author="Cummings, Shawn" w:date="2025-05-12T21:09:00Z" w16du:dateUtc="2025-05-13T01:09:00Z">
+      <w:ins w:id="42" w:author="Cummings, Shawn" w:date="2025-05-12T21:09:00Z" w16du:dateUtc="2025-05-13T01:09:00Z">
         <w:r>
           <w:rPr>
             <w:szCs w:val="22"/>
@@ -21855,7 +21922,7 @@
           <w:t>3.44</w:t>
         </w:r>
       </w:ins>
-      <w:del w:id="37" w:author="Cummings, Shawn" w:date="2025-05-12T21:09:00Z" w16du:dateUtc="2025-05-13T01:09:00Z">
+      <w:del w:id="43" w:author="Cummings, Shawn" w:date="2025-05-12T21:09:00Z" w16du:dateUtc="2025-05-13T01:09:00Z">
         <w:r>
           <w:rPr>
             <w:szCs w:val="22"/>
@@ -21869,7 +21936,7 @@
         </w:rPr>
         <w:t xml:space="preserve">, SD = </w:t>
       </w:r>
-      <w:ins w:id="38" w:author="Cummings, Shawn" w:date="2025-05-12T21:09:00Z" w16du:dateUtc="2025-05-13T01:09:00Z">
+      <w:ins w:id="44" w:author="Cummings, Shawn" w:date="2025-05-12T21:09:00Z" w16du:dateUtc="2025-05-13T01:09:00Z">
         <w:r>
           <w:rPr>
             <w:szCs w:val="22"/>
@@ -21877,7 +21944,7 @@
           <w:t>0.15</w:t>
         </w:r>
       </w:ins>
-      <w:del w:id="39" w:author="Cummings, Shawn" w:date="2025-05-12T21:09:00Z" w16du:dateUtc="2025-05-13T01:09:00Z">
+      <w:del w:id="45" w:author="Cummings, Shawn" w:date="2025-05-12T21:09:00Z" w16du:dateUtc="2025-05-13T01:09:00Z">
         <w:r>
           <w:rPr>
             <w:szCs w:val="22"/>
@@ -21891,19 +21958,19 @@
         </w:rPr>
         <w:t>)</w:t>
       </w:r>
-      <w:commentRangeEnd w:id="30"/>
+      <w:commentRangeEnd w:id="36"/>
       <w:r>
         <w:rPr>
           <w:rStyle w:val="CommentReference"/>
         </w:rPr>
-        <w:commentReference w:id="30"/>
-      </w:r>
-      <w:commentRangeEnd w:id="31"/>
+        <w:commentReference w:id="36"/>
+      </w:r>
+      <w:commentRangeEnd w:id="37"/>
       <w:r>
         <w:rPr>
           <w:rStyle w:val="CommentReference"/>
         </w:rPr>
-        <w:commentReference w:id="31"/>
+        <w:commentReference w:id="37"/>
       </w:r>
       <w:r>
         <w:rPr>
@@ -21960,7 +22027,7 @@
         </w:rPr>
         <w:t>A second alternative is that while the presence of the pen itself—rather than its impact on the articulators—may be sufficient to induce compensation, the black box</w:t>
       </w:r>
-      <w:commentRangeStart w:id="40"/>
+      <w:commentRangeStart w:id="46"/>
       <w:r>
         <w:rPr>
           <w:szCs w:val="22"/>
@@ -21985,12 +22052,12 @@
         </w:rPr>
         <w:t xml:space="preserve"> less obvious and harder to visually access. </w:t>
       </w:r>
-      <w:commentRangeEnd w:id="40"/>
+      <w:commentRangeEnd w:id="46"/>
       <w:r>
         <w:rPr>
           <w:rStyle w:val="CommentReference"/>
         </w:rPr>
-        <w:commentReference w:id="40"/>
+        <w:commentReference w:id="46"/>
       </w:r>
       <w:r>
         <w:rPr>
@@ -22094,7 +22161,7 @@
         </w:rPr>
         <w:t>Either of these manipulations would require substantial</w:t>
       </w:r>
-      <w:ins w:id="41" w:author="Karboga, Gevher" w:date="2025-05-20T15:11:00Z" w16du:dateUtc="2025-05-20T19:11:00Z">
+      <w:ins w:id="47" w:author="Karboga, Gevher" w:date="2025-05-20T15:11:00Z" w16du:dateUtc="2025-05-20T19:11:00Z">
         <w:r>
           <w:rPr>
             <w:szCs w:val="22"/>
@@ -22407,7 +22474,7 @@
         </w:rPr>
         <w:t>. First, our findings leave open whether compensation for visually evident effects of non-phonological causes—like the pen—draws on the same neural mechanisms as normalization/compensation for the effects of phonetic contexts. The present findings only suggest that Fowler’s compensation account provides a unifying explanation for the qualitative consequences of both phenomena. It is unclear, for example, whether compensation for visually</w:t>
       </w:r>
-      <w:ins w:id="42" w:author="Karboga, Gevher" w:date="2025-05-20T18:39:00Z" w16du:dateUtc="2025-05-20T22:39:00Z">
+      <w:ins w:id="48" w:author="Karboga, Gevher" w:date="2025-05-20T18:39:00Z" w16du:dateUtc="2025-05-20T22:39:00Z">
         <w:r>
           <w:rPr>
             <w:szCs w:val="22"/>
@@ -23081,7 +23148,7 @@
         <w:lastRenderedPageBreak/>
         <w:t>the causal inference account) have conceptual similarities to compensation,</w:t>
       </w:r>
-      <w:ins w:id="43" w:author="Cummings, Shawn" w:date="2025-05-21T14:22:00Z" w16du:dateUtc="2025-05-21T18:22:00Z">
+      <w:ins w:id="49" w:author="Cummings, Shawn" w:date="2025-05-21T14:22:00Z" w16du:dateUtc="2025-05-21T18:22:00Z">
         <w:r>
           <w:rPr>
             <w:szCs w:val="22"/>
@@ -23089,7 +23156,7 @@
           <w:t xml:space="preserve"> they differ crucially f</w:t>
         </w:r>
       </w:ins>
-      <w:ins w:id="44" w:author="Cummings, Shawn" w:date="2025-05-21T14:23:00Z" w16du:dateUtc="2025-05-21T18:23:00Z">
+      <w:ins w:id="50" w:author="Cummings, Shawn" w:date="2025-05-21T14:23:00Z" w16du:dateUtc="2025-05-21T18:23:00Z">
         <w:r>
           <w:rPr>
             <w:szCs w:val="22"/>
@@ -23097,7 +23164,7 @@
           <w:t>rom compensation</w:t>
         </w:r>
       </w:ins>
-      <w:ins w:id="45" w:author="Cummings, Shawn" w:date="2025-05-21T14:22:00Z" w16du:dateUtc="2025-05-21T18:22:00Z">
+      <w:ins w:id="51" w:author="Cummings, Shawn" w:date="2025-05-21T14:22:00Z" w16du:dateUtc="2025-05-21T18:22:00Z">
         <w:r>
           <w:rPr>
             <w:szCs w:val="22"/>
@@ -23105,7 +23172,7 @@
           <w:t xml:space="preserve"> in positing the blocking effect</w:t>
         </w:r>
       </w:ins>
-      <w:ins w:id="46" w:author="Cummings, Shawn" w:date="2025-05-21T14:23:00Z" w16du:dateUtc="2025-05-21T18:23:00Z">
+      <w:ins w:id="52" w:author="Cummings, Shawn" w:date="2025-05-21T14:23:00Z" w16du:dateUtc="2025-05-21T18:23:00Z">
         <w:r>
           <w:rPr>
             <w:szCs w:val="22"/>
@@ -23113,7 +23180,7 @@
           <w:t xml:space="preserve"> as a consequence of </w:t>
         </w:r>
       </w:ins>
-      <w:ins w:id="47" w:author="Cummings, Shawn" w:date="2025-05-21T14:22:00Z" w16du:dateUtc="2025-05-21T18:22:00Z">
+      <w:ins w:id="53" w:author="Cummings, Shawn" w:date="2025-05-21T14:22:00Z" w16du:dateUtc="2025-05-21T18:22:00Z">
         <w:r>
           <w:rPr>
             <w:szCs w:val="22"/>
@@ -23121,14 +23188,14 @@
           <w:t xml:space="preserve"> </w:t>
         </w:r>
       </w:ins>
-      <w:del w:id="48" w:author="Cummings, Shawn" w:date="2025-05-21T14:23:00Z" w16du:dateUtc="2025-05-21T18:23:00Z">
+      <w:del w:id="54" w:author="Cummings, Shawn" w:date="2025-05-21T14:23:00Z" w16du:dateUtc="2025-05-21T18:23:00Z">
         <w:r>
           <w:rPr>
             <w:szCs w:val="22"/>
           </w:rPr>
           <w:delText xml:space="preserve"> </w:delText>
         </w:r>
-        <w:commentRangeStart w:id="49"/>
+        <w:commentRangeStart w:id="55"/>
         <w:r>
           <w:rPr>
             <w:szCs w:val="22"/>
@@ -23164,12 +23231,12 @@
         </w:rPr>
         <w:t>.</w:t>
       </w:r>
-      <w:commentRangeEnd w:id="49"/>
+      <w:commentRangeEnd w:id="55"/>
       <w:r>
         <w:rPr>
           <w:rStyle w:val="CommentReference"/>
         </w:rPr>
-        <w:commentReference w:id="49"/>
+        <w:commentReference w:id="55"/>
       </w:r>
     </w:p>
     <w:p>
@@ -26236,11 +26303,11 @@
         <w:spacing w:line="240" w:lineRule="auto"/>
         <w:ind w:left="360" w:hanging="360"/>
         <w:rPr>
-          <w:ins w:id="50" w:author="Cummings, Shawn" w:date="2025-05-12T20:19:00Z" w16du:dateUtc="2025-05-13T00:19:00Z"/>
-          <w:szCs w:val="22"/>
-        </w:rPr>
-      </w:pPr>
-      <w:ins w:id="51" w:author="Cummings, Shawn" w:date="2025-05-12T20:19:00Z">
+          <w:ins w:id="56" w:author="Cummings, Shawn" w:date="2025-05-12T20:19:00Z" w16du:dateUtc="2025-05-13T00:19:00Z"/>
+          <w:szCs w:val="22"/>
+        </w:rPr>
+      </w:pPr>
+      <w:ins w:id="57" w:author="Cummings, Shawn" w:date="2025-05-12T20:19:00Z">
         <w:r>
           <w:rPr>
             <w:szCs w:val="22"/>
@@ -26382,7 +26449,7 @@
       </w:r>
     </w:p>
   </w:comment>
-  <w:comment w:id="9" w:author="Jaeger, Florian" w:date="2025-05-11T16:16:00Z" w:initials="TJ">
+  <w:comment w:id="15" w:author="Jaeger, Florian" w:date="2025-05-11T16:16:00Z" w:initials="TJ">
     <w:p>
       <w:pPr>
         <w:jc w:val="left"/>
@@ -26401,7 +26468,7 @@
       </w:r>
     </w:p>
   </w:comment>
-  <w:comment w:id="7" w:author="Cummings, Shawn" w:date="2025-05-09T12:59:00Z" w:initials="SC">
+  <w:comment w:id="18" w:author="Jaeger, Florian" w:date="2025-05-11T16:19:00Z" w:initials="TJ">
     <w:p>
       <w:pPr>
         <w:jc w:val="left"/>
@@ -26413,11 +26480,25 @@
         <w:annotationRef/>
       </w:r>
       <w:r>
-        <w:t>We also excluded based on individual trials with long/short RTs— should that be described?</w:t>
+        <w:rPr>
+          <w:color w:val="000000"/>
+        </w:rPr>
+        <w:t xml:space="preserve">should we perhaps rename this </w:t>
+      </w:r>
+    </w:p>
+    <w:p>
+      <w:pPr>
+        <w:jc w:val="left"/>
+      </w:pPr>
+      <w:r>
+        <w:rPr>
+          <w:color w:val="000000"/>
+        </w:rPr>
+        <w:t>“pen placement”? (also would have to change the code)</w:t>
       </w:r>
     </w:p>
   </w:comment>
-  <w:comment w:id="8" w:author="Cummings, Shawn" w:date="2025-05-09T13:12:00Z" w:initials="SC">
+  <w:comment w:id="19" w:author="Cummings, Shawn" w:date="2025-05-12T20:37:00Z" w:initials="SC">
     <w:p>
       <w:pPr>
         <w:jc w:val="left"/>
@@ -26429,11 +26510,11 @@
         <w:annotationRef/>
       </w:r>
       <w:r>
-        <w:t>This is also where the white dot trials should be clarified?</w:t>
+        <w:t xml:space="preserve">The two feel pretty synonymous to me… not opposed to “pen placement” if you see a benefit! </w:t>
       </w:r>
     </w:p>
   </w:comment>
-  <w:comment w:id="12" w:author="Jaeger, Florian" w:date="2025-05-11T16:19:00Z" w:initials="TJ">
+  <w:comment w:id="21" w:author="Jaeger, Florian" w:date="2025-05-11T16:22:00Z" w:initials="TJ">
     <w:p>
       <w:pPr>
         <w:jc w:val="left"/>
@@ -26448,22 +26529,11 @@
         <w:rPr>
           <w:color w:val="000000"/>
         </w:rPr>
-        <w:t xml:space="preserve">should we perhaps rename this </w:t>
-      </w:r>
-    </w:p>
-    <w:p>
-      <w:pPr>
-        <w:jc w:val="left"/>
-      </w:pPr>
-      <w:r>
-        <w:rPr>
-          <w:color w:val="000000"/>
-        </w:rPr>
-        <w:t>“pen placement”? (also would have to change the code)</w:t>
+        <w:t>reworded somewhat since we didn’t actually code continuum step as continuous (I had forgotten)</w:t>
       </w:r>
     </w:p>
   </w:comment>
-  <w:comment w:id="13" w:author="Cummings, Shawn" w:date="2025-05-12T20:37:00Z" w:initials="SC">
+  <w:comment w:id="22" w:author="Jaeger, Florian" w:date="2025-05-11T16:22:00Z" w:initials="TJ">
     <w:p>
       <w:pPr>
         <w:jc w:val="left"/>
@@ -26475,11 +26545,14 @@
         <w:annotationRef/>
       </w:r>
       <w:r>
-        <w:t xml:space="preserve">The two feel pretty synonymous to me… not opposed to “pen placement” if you see a benefit! </w:t>
+        <w:rPr>
+          <w:color w:val="000000"/>
+        </w:rPr>
+        <w:t>I also moved it into the main text since it seems sufficiently important.</w:t>
       </w:r>
     </w:p>
   </w:comment>
-  <w:comment w:id="15" w:author="Jaeger, Florian" w:date="2025-05-11T16:22:00Z" w:initials="TJ">
+  <w:comment w:id="26" w:author="Jaeger, Florian" w:date="2025-05-11T17:36:00Z" w:initials="TJ">
     <w:p>
       <w:pPr>
         <w:jc w:val="left"/>
@@ -26494,11 +26567,11 @@
         <w:rPr>
           <w:color w:val="000000"/>
         </w:rPr>
-        <w:t>reworded somewhat since we didn’t actually code continuum step as continuous (I had forgotten)</w:t>
+        <w:t>If we replace this, perhaps add a “-“ between ashi and responses?</w:t>
       </w:r>
     </w:p>
   </w:comment>
-  <w:comment w:id="16" w:author="Jaeger, Florian" w:date="2025-05-11T16:22:00Z" w:initials="TJ">
+  <w:comment w:id="27" w:author="Jaeger, Florian" w:date="2025-05-11T17:37:00Z" w:initials="TJ">
     <w:p>
       <w:pPr>
         <w:jc w:val="left"/>
@@ -26513,11 +26586,11 @@
         <w:rPr>
           <w:color w:val="000000"/>
         </w:rPr>
-        <w:t>I also moved it into the main text since it seems sufficiently important.</w:t>
+        <w:t>as we seem to do that in the text.</w:t>
       </w:r>
     </w:p>
   </w:comment>
-  <w:comment w:id="20" w:author="Jaeger, Florian" w:date="2025-05-11T17:36:00Z" w:initials="TJ">
+  <w:comment w:id="28" w:author="Cummings, Shawn" w:date="2025-05-12T20:55:00Z" w:initials="SC">
     <w:p>
       <w:pPr>
         <w:jc w:val="left"/>
@@ -26529,14 +26602,11 @@
         <w:annotationRef/>
       </w:r>
       <w:r>
-        <w:rPr>
-          <w:color w:val="000000"/>
-        </w:rPr>
-        <w:t>If we replace this, perhaps add a “-“ between ashi and responses?</w:t>
+        <w:t>Done!</w:t>
       </w:r>
     </w:p>
   </w:comment>
-  <w:comment w:id="21" w:author="Jaeger, Florian" w:date="2025-05-11T17:37:00Z" w:initials="TJ">
+  <w:comment w:id="31" w:author="Jaeger, Florian" w:date="2025-05-11T17:39:00Z" w:initials="TJ">
     <w:p>
       <w:pPr>
         <w:jc w:val="left"/>
@@ -26551,11 +26621,11 @@
         <w:rPr>
           <w:color w:val="000000"/>
         </w:rPr>
-        <w:t>as we seem to do that in the text.</w:t>
+        <w:t>perhaps this could go here?</w:t>
       </w:r>
     </w:p>
   </w:comment>
-  <w:comment w:id="22" w:author="Cummings, Shawn" w:date="2025-05-12T20:55:00Z" w:initials="SC">
+  <w:comment w:id="35" w:author="Karboga, Gevher" w:date="2025-05-20T18:47:00Z" w:initials="GK">
     <w:p>
       <w:pPr>
         <w:jc w:val="left"/>
@@ -26567,11 +26637,14 @@
         <w:annotationRef/>
       </w:r>
       <w:r>
-        <w:t>Done!</w:t>
+        <w:rPr>
+          <w:color w:val="000000"/>
+        </w:rPr>
+        <w:t>It could be better to divide this long sentence into two. Just a suggestion.</w:t>
       </w:r>
     </w:p>
   </w:comment>
-  <w:comment w:id="25" w:author="Jaeger, Florian" w:date="2025-05-11T17:39:00Z" w:initials="TJ">
+  <w:comment w:id="36" w:author="Jaeger, Florian" w:date="2025-05-11T16:49:00Z" w:initials="TJ">
     <w:p>
       <w:pPr>
         <w:jc w:val="left"/>
@@ -26586,11 +26659,11 @@
         <w:rPr>
           <w:color w:val="000000"/>
         </w:rPr>
-        <w:t>perhaps this could go here?</w:t>
+        <w:t>would be good to fill this in?</w:t>
       </w:r>
     </w:p>
   </w:comment>
-  <w:comment w:id="29" w:author="Karboga, Gevher" w:date="2025-05-20T18:47:00Z" w:initials="GK">
+  <w:comment w:id="37" w:author="Cummings, Shawn" w:date="2025-05-12T21:09:00Z" w:initials="SC">
     <w:p>
       <w:pPr>
         <w:jc w:val="left"/>
@@ -26602,14 +26675,11 @@
         <w:annotationRef/>
       </w:r>
       <w:r>
-        <w:rPr>
-          <w:color w:val="000000"/>
-        </w:rPr>
-        <w:t>It could be better to divide this long sentence into two. Just a suggestion.</w:t>
+        <w:t>Beautifully similar RTs!</w:t>
       </w:r>
     </w:p>
   </w:comment>
-  <w:comment w:id="30" w:author="Jaeger, Florian" w:date="2025-05-11T16:49:00Z" w:initials="TJ">
+  <w:comment w:id="46" w:author="Jaeger, Florian" w:date="2025-05-11T16:53:00Z" w:initials="TJ">
     <w:p>
       <w:pPr>
         <w:jc w:val="left"/>
@@ -26624,46 +26694,11 @@
         <w:rPr>
           <w:color w:val="000000"/>
         </w:rPr>
-        <w:t>would be good to fill this in?</w:t>
+        <w:t>For Exp 1a-c, Gevher coded comments for whether they mentioned the pen (it’s in the data directory). We could ask her whether she’d be willing to do the same of Exp 2 to see whether the rate of pen mention differed between experiments?</w:t>
       </w:r>
     </w:p>
   </w:comment>
-  <w:comment w:id="31" w:author="Cummings, Shawn" w:date="2025-05-12T21:09:00Z" w:initials="SC">
-    <w:p>
-      <w:pPr>
-        <w:jc w:val="left"/>
-      </w:pPr>
-      <w:r>
-        <w:rPr>
-          <w:rStyle w:val="CommentReference"/>
-        </w:rPr>
-        <w:annotationRef/>
-      </w:r>
-      <w:r>
-        <w:t>Beautifully similar RTs!</w:t>
-      </w:r>
-    </w:p>
-  </w:comment>
-  <w:comment w:id="40" w:author="Jaeger, Florian" w:date="2025-05-11T16:53:00Z" w:initials="TJ">
-    <w:p>
-      <w:pPr>
-        <w:jc w:val="left"/>
-      </w:pPr>
-      <w:r>
-        <w:rPr>
-          <w:rStyle w:val="CommentReference"/>
-        </w:rPr>
-        <w:annotationRef/>
-      </w:r>
-      <w:r>
-        <w:rPr>
-          <w:color w:val="000000"/>
-        </w:rPr>
-        <w:t>For Exp 1a-c, Gevher coded comments for whether they mentioned the pen (it’s in the data directory). We could ask her whether she’d be willing to do the same of Exp 2 to see whether the rate of pen mention differed between experiments?</w:t>
-      </w:r>
-    </w:p>
-  </w:comment>
-  <w:comment w:id="49" w:author="Karboga, Gevher" w:date="2025-05-20T18:50:00Z" w:initials="GK">
+  <w:comment w:id="55" w:author="Karboga, Gevher" w:date="2025-05-20T18:50:00Z" w:initials="GK">
     <w:p>
       <w:pPr>
         <w:jc w:val="left"/>
@@ -26690,8 +26725,6 @@
   <w15:commentEx w15:paraId="4DDBF32D" w15:done="0"/>
   <w15:commentEx w15:paraId="1486FF83" w15:paraIdParent="4DDBF32D" w15:done="0"/>
   <w15:commentEx w15:paraId="2245456D" w15:done="0"/>
-  <w15:commentEx w15:paraId="5B928638" w15:done="0"/>
-  <w15:commentEx w15:paraId="09066744" w15:paraIdParent="5B928638" w15:done="0"/>
   <w15:commentEx w15:paraId="0CC8A972" w15:done="0"/>
   <w15:commentEx w15:paraId="5574534F" w15:paraIdParent="0CC8A972" w15:done="0"/>
   <w15:commentEx w15:paraId="17828F86" w15:done="1"/>
@@ -26713,8 +26746,6 @@
   <w16cex:commentExtensible w16cex:durableId="2D808FF6" w16cex:dateUtc="2025-05-11T21:22:00Z"/>
   <w16cex:commentExtensible w16cex:durableId="4DB993EE" w16cex:dateUtc="2025-05-13T00:36:00Z"/>
   <w16cex:commentExtensible w16cex:durableId="6685186B" w16cex:dateUtc="2025-05-11T20:16:00Z"/>
-  <w16cex:commentExtensible w16cex:durableId="7FA83320" w16cex:dateUtc="2025-05-09T16:59:00Z"/>
-  <w16cex:commentExtensible w16cex:durableId="68397BDD" w16cex:dateUtc="2025-05-09T17:12:00Z"/>
   <w16cex:commentExtensible w16cex:durableId="6BE9660C" w16cex:dateUtc="2025-05-11T20:19:00Z"/>
   <w16cex:commentExtensible w16cex:durableId="0D181876" w16cex:dateUtc="2025-05-13T00:37:00Z"/>
   <w16cex:commentExtensible w16cex:durableId="4169CD45" w16cex:dateUtc="2025-05-11T20:22:00Z"/>
@@ -26736,8 +26767,6 @@
   <w16cid:commentId w16cid:paraId="4DDBF32D" w16cid:durableId="2D808FF6"/>
   <w16cid:commentId w16cid:paraId="1486FF83" w16cid:durableId="4DB993EE"/>
   <w16cid:commentId w16cid:paraId="2245456D" w16cid:durableId="6685186B"/>
-  <w16cid:commentId w16cid:paraId="5B928638" w16cid:durableId="7FA83320"/>
-  <w16cid:commentId w16cid:paraId="09066744" w16cid:durableId="68397BDD"/>
   <w16cid:commentId w16cid:paraId="0CC8A972" w16cid:durableId="6BE9660C"/>
   <w16cid:commentId w16cid:paraId="5574534F" w16cid:durableId="0D181876"/>
   <w16cid:commentId w16cid:paraId="17828F86" w16cid:durableId="4169CD45"/>
@@ -27335,7 +27364,7 @@
       <w:r>
         <w:t xml:space="preserve">Additional analyses strongly supported linear effects of acoustic continuum and non-linear effects of test blocks for all experiments. The results we report below replicate when standard linear effects </w:t>
       </w:r>
-      <w:ins w:id="11" w:author="Karboga, Gevher" w:date="2025-05-20T17:58:00Z" w16du:dateUtc="2025-05-20T21:58:00Z">
+      <w:ins w:id="17" w:author="Karboga, Gevher" w:date="2025-05-20T17:58:00Z" w16du:dateUtc="2025-05-20T21:58:00Z">
         <w:r>
           <w:t xml:space="preserve">are </w:t>
         </w:r>

</xml_diff>

<commit_message>
Add 'pen' comment mentions
</commit_message>
<xml_diff>
--- a/output/papers/Round 2/manuscript-brief.docx
+++ b/output/papers/Round 2/manuscript-brief.docx
@@ -1,6 +1,6 @@
 
 <file path=word/document.xml><?xml version="1.0" encoding="utf-8"?>
-<w:document xmlns:wpc="http://schemas.microsoft.com/office/word/2010/wordprocessingCanvas" xmlns:cx="http://schemas.microsoft.com/office/drawing/2014/chartex" xmlns:cx1="http://schemas.microsoft.com/office/drawing/2015/9/8/chartex" xmlns:cx2="http://schemas.microsoft.com/office/drawing/2015/10/21/chartex" xmlns:cx3="http://schemas.microsoft.com/office/drawing/2016/5/9/chartex" xmlns:cx4="http://schemas.microsoft.com/office/drawing/2016/5/10/chartex" xmlns:cx5="http://schemas.microsoft.com/office/drawing/2016/5/11/chartex" xmlns:cx6="http://schemas.microsoft.com/office/drawing/2016/5/12/chartex" xmlns:cx7="http://schemas.microsoft.com/office/drawing/2016/5/13/chartex" xmlns:cx8="http://schemas.microsoft.com/office/drawing/2016/5/14/chartex" xmlns:mc="http://schemas.openxmlformats.org/markup-compatibility/2006" xmlns:aink="http://schemas.microsoft.com/office/drawing/2016/ink" xmlns:am3d="http://schemas.microsoft.com/office/drawing/2017/model3d" xmlns:o="urn:schemas-microsoft-com:office:office" xmlns:oel="http://schemas.microsoft.com/office/2019/extlst" xmlns:r="http://schemas.openxmlformats.org/officeDocument/2006/relationships" xmlns:m="http://schemas.openxmlformats.org/officeDocument/2006/math" xmlns:v="urn:schemas-microsoft-com:vml" xmlns:wp14="http://schemas.microsoft.com/office/word/2010/wordprocessingDrawing" xmlns:wp="http://schemas.openxmlformats.org/drawingml/2006/wordprocessingDrawing" xmlns:w10="urn:schemas-microsoft-com:office:word" xmlns:w="http://schemas.openxmlformats.org/wordprocessingml/2006/main" xmlns:w14="http://schemas.microsoft.com/office/word/2010/wordml" xmlns:w15="http://schemas.microsoft.com/office/word/2012/wordml" xmlns:w16cex="http://schemas.microsoft.com/office/word/2018/wordml/cex" xmlns:w16cid="http://schemas.microsoft.com/office/word/2016/wordml/cid" xmlns:w16="http://schemas.microsoft.com/office/word/2018/wordml" xmlns:w16du="http://schemas.microsoft.com/office/word/2023/wordml/word16du" xmlns:w16sdtdh="http://schemas.microsoft.com/office/word/2020/wordml/sdtdatahash" xmlns:w16sdtfl="http://schemas.microsoft.com/office/word/2024/wordml/sdtformatlock" xmlns:w16se="http://schemas.microsoft.com/office/word/2015/wordml/symex" xmlns:wpg="http://schemas.microsoft.com/office/word/2010/wordprocessingGroup" xmlns:wpi="http://schemas.microsoft.com/office/word/2010/wordprocessingInk" xmlns:wne="http://schemas.microsoft.com/office/word/2006/wordml" xmlns:wps="http://schemas.microsoft.com/office/word/2010/wordprocessingShape" mc:Ignorable="w14 w15 w16se w16cid w16 w16cex w16sdtdh w16sdtfl w16du wp14">
+<w:document xmlns:wpc="http://schemas.microsoft.com/office/word/2010/wordprocessingCanvas" xmlns:cx="http://schemas.microsoft.com/office/drawing/2014/chartex" xmlns:cx1="http://schemas.microsoft.com/office/drawing/2015/9/8/chartex" xmlns:cx2="http://schemas.microsoft.com/office/drawing/2015/10/21/chartex" xmlns:cx3="http://schemas.microsoft.com/office/drawing/2016/5/9/chartex" xmlns:cx4="http://schemas.microsoft.com/office/drawing/2016/5/10/chartex" xmlns:cx5="http://schemas.microsoft.com/office/drawing/2016/5/11/chartex" xmlns:cx6="http://schemas.microsoft.com/office/drawing/2016/5/12/chartex" xmlns:cx7="http://schemas.microsoft.com/office/drawing/2016/5/13/chartex" xmlns:cx8="http://schemas.microsoft.com/office/drawing/2016/5/14/chartex" xmlns:mc="http://schemas.openxmlformats.org/markup-compatibility/2006" xmlns:aink="http://schemas.microsoft.com/office/drawing/2016/ink" xmlns:am3d="http://schemas.microsoft.com/office/drawing/2017/model3d" xmlns:o="urn:schemas-microsoft-com:office:office" xmlns:oel="http://schemas.microsoft.com/office/2019/extlst" xmlns:r="http://schemas.openxmlformats.org/officeDocument/2006/relationships" xmlns:m="http://schemas.openxmlformats.org/officeDocument/2006/math" xmlns:v="urn:schemas-microsoft-com:vml" xmlns:wp14="http://schemas.microsoft.com/office/word/2010/wordprocessingDrawing" xmlns:wp="http://schemas.openxmlformats.org/drawingml/2006/wordprocessingDrawing" xmlns:w10="urn:schemas-microsoft-com:office:word" xmlns:w="http://schemas.openxmlformats.org/wordprocessingml/2006/main" xmlns:w14="http://schemas.microsoft.com/office/word/2010/wordml" xmlns:w15="http://schemas.microsoft.com/office/word/2012/wordml" xmlns:w16cex="http://schemas.microsoft.com/office/word/2018/wordml/cex" xmlns:w16cid="http://schemas.microsoft.com/office/word/2016/wordml/cid" xmlns:w16="http://schemas.microsoft.com/office/word/2018/wordml" xmlns:w16du="http://schemas.microsoft.com/office/word/2023/wordml/word16du" xmlns:w16sdtdh="http://schemas.microsoft.com/office/word/2020/wordml/sdtdatahash" xmlns:w16se="http://schemas.microsoft.com/office/word/2015/wordml/symex" xmlns:wpg="http://schemas.microsoft.com/office/word/2010/wordprocessingGroup" xmlns:wpi="http://schemas.microsoft.com/office/word/2010/wordprocessingInk" xmlns:wne="http://schemas.microsoft.com/office/word/2006/wordml" xmlns:wps="http://schemas.microsoft.com/office/word/2010/wordprocessingShape" mc:Ignorable="w14 w15 w16se w16cid w16 w16cex w16sdtdh w16du wp14">
   <w:body>
     <w:p/>
     <w:p>
@@ -314,7 +314,14 @@
         <w:rPr>
           <w:szCs w:val="22"/>
         </w:rPr>
-        <w:t xml:space="preserve"> ~</w:t>
+        <w:t xml:space="preserve"> </w:t>
+      </w:r>
+      <w:commentRangeStart w:id="0"/>
+      <w:r>
+        <w:rPr>
+          <w:szCs w:val="22"/>
+        </w:rPr>
+        <w:t>~</w:t>
       </w:r>
       <w:r>
         <w:rPr>
@@ -333,6 +340,13 @@
           <w:szCs w:val="22"/>
         </w:rPr>
         <w:t>00</w:t>
+      </w:r>
+      <w:commentRangeEnd w:id="0"/>
+      <w:r>
+        <w:rPr>
+          <w:rStyle w:val="CommentReference"/>
+        </w:rPr>
+        <w:commentReference w:id="0"/>
       </w:r>
     </w:p>
     <w:p>
@@ -495,9 +509,9 @@
           <w:szCs w:val="22"/>
         </w:rPr>
         <w:sectPr>
-          <w:headerReference w:type="default" r:id="rId9"/>
-          <w:footerReference w:type="even" r:id="rId10"/>
-          <w:footerReference w:type="default" r:id="rId11"/>
+          <w:headerReference w:type="default" r:id="rId13"/>
+          <w:footerReference w:type="even" r:id="rId14"/>
+          <w:footerReference w:type="default" r:id="rId15"/>
           <w:pgSz w:w="12240" w:h="15840"/>
           <w:pgMar w:top="1440" w:right="1800" w:bottom="1440" w:left="1800" w:header="720" w:footer="720" w:gutter="0"/>
           <w:cols w:space="720"/>
@@ -603,21 +617,7 @@
         <w:rPr>
           <w:szCs w:val="22"/>
         </w:rPr>
-        <w:t xml:space="preserve"> In a series of perception experiments, we find that listeners compensate for the presence of a pen in the mouth of the talker, </w:t>
-      </w:r>
-      <w:proofErr w:type="gramStart"/>
-      <w:r>
-        <w:rPr>
-          <w:szCs w:val="22"/>
-        </w:rPr>
-        <w:t>as long as</w:t>
-      </w:r>
-      <w:proofErr w:type="gramEnd"/>
-      <w:r>
-        <w:rPr>
-          <w:szCs w:val="22"/>
-        </w:rPr>
-        <w:t xml:space="preserve"> the effects of the pen on the articulators (e.g., lip shape) are visually evident.</w:t>
+        <w:t xml:space="preserve"> In a series of perception experiments, we find that listeners compensate for the presence of a pen in the mouth of the talker, as long as the effects of the pen on the articulators (e.g., lip shape) are visually evident.</w:t>
       </w:r>
       <w:r>
         <w:rPr>
@@ -908,21 +908,7 @@
         <w:rPr>
           <w:szCs w:val="22"/>
         </w:rPr>
-        <w:t xml:space="preserve">acoustically more </w:t>
-      </w:r>
-      <w:proofErr w:type="gramStart"/>
-      <w:r>
-        <w:rPr>
-          <w:szCs w:val="22"/>
-        </w:rPr>
-        <w:t>similar to</w:t>
-      </w:r>
-      <w:proofErr w:type="gramEnd"/>
-      <w:r>
-        <w:rPr>
-          <w:szCs w:val="22"/>
-        </w:rPr>
-        <w:t xml:space="preserve"> typical </w:t>
+        <w:t xml:space="preserve">acoustically more similar to typical </w:t>
       </w:r>
       <w:r>
         <w:rPr>
@@ -2002,16 +1988,26 @@
         <w:rPr>
           <w:szCs w:val="22"/>
         </w:rPr>
-        <w:t xml:space="preserve">from /s/ in English (Jongman, Wayland, &amp; Wong, 2000), </w:t>
-      </w:r>
-      <w:proofErr w:type="gramStart"/>
-      <w:r>
-        <w:rPr>
-          <w:szCs w:val="22"/>
-        </w:rPr>
-        <w:t>both of these</w:t>
-      </w:r>
-      <w:proofErr w:type="gramEnd"/>
+        <w:t xml:space="preserve">from /s/ in English (Jongman, Wayland, &amp; Wong, 2000), both of these </w:t>
+      </w:r>
+      <w:r>
+        <w:rPr>
+          <w:szCs w:val="22"/>
+        </w:rPr>
+        <w:t>effects</w:t>
+      </w:r>
+      <w:r>
+        <w:rPr>
+          <w:szCs w:val="22"/>
+        </w:rPr>
+        <w:t xml:space="preserve"> are predicted to make </w:t>
+      </w:r>
+      <w:r>
+        <w:rPr>
+          <w:szCs w:val="22"/>
+        </w:rPr>
+        <w:t>fricatives produced with a pen in the mouth</w:t>
+      </w:r>
       <w:r>
         <w:rPr>
           <w:szCs w:val="22"/>
@@ -2022,30 +2018,6 @@
         <w:rPr>
           <w:szCs w:val="22"/>
         </w:rPr>
-        <w:t>effects</w:t>
-      </w:r>
-      <w:r>
-        <w:rPr>
-          <w:szCs w:val="22"/>
-        </w:rPr>
-        <w:t xml:space="preserve"> are predicted to make </w:t>
-      </w:r>
-      <w:r>
-        <w:rPr>
-          <w:szCs w:val="22"/>
-        </w:rPr>
-        <w:t>fricatives produced with a pen in the mouth</w:t>
-      </w:r>
-      <w:r>
-        <w:rPr>
-          <w:szCs w:val="22"/>
-        </w:rPr>
-        <w:t xml:space="preserve"> </w:t>
-      </w:r>
-      <w:r>
-        <w:rPr>
-          <w:szCs w:val="22"/>
-        </w:rPr>
         <w:t xml:space="preserve">acoustically more ‘/ʃ/-like’. </w:t>
       </w:r>
       <w:r>
@@ -2064,21 +2036,7 @@
         <w:rPr>
           <w:szCs w:val="22"/>
         </w:rPr>
-        <w:t xml:space="preserve">te for either or </w:t>
-      </w:r>
-      <w:proofErr w:type="gramStart"/>
-      <w:r>
-        <w:rPr>
-          <w:szCs w:val="22"/>
-        </w:rPr>
-        <w:t>both of these</w:t>
-      </w:r>
-      <w:proofErr w:type="gramEnd"/>
-      <w:r>
-        <w:rPr>
-          <w:szCs w:val="22"/>
-        </w:rPr>
-        <w:t xml:space="preserve"> effects of the pen on articulation, it should bias their perception towards </w:t>
+        <w:t xml:space="preserve">te for either or both of these effects of the pen on articulation, it should bias their perception towards </w:t>
       </w:r>
       <w:r>
         <w:rPr>
@@ -2731,7 +2689,7 @@
         </w:rPr>
         <w:t xml:space="preserve"> at </w:t>
       </w:r>
-      <w:hyperlink r:id="rId12" w:history="1">
+      <w:hyperlink r:id="rId16" w:history="1">
         <w:r>
           <w:rPr>
             <w:rStyle w:val="Hyperlink"/>
@@ -3015,13 +2973,8 @@
       <w:r>
         <w:t xml:space="preserve"> </w:t>
       </w:r>
-      <w:proofErr w:type="gramStart"/>
-      <w:r>
-        <w:t>With regard to</w:t>
-      </w:r>
-      <w:proofErr w:type="gramEnd"/>
-      <w:r>
-        <w:t xml:space="preserve"> ethnicity, </w:t>
+      <w:r>
+        <w:t xml:space="preserve">With regard to ethnicity, </w:t>
       </w:r>
       <w:r>
         <w:t>8.5</w:t>
@@ -3711,7 +3664,7 @@
                     <pic:cNvPicPr/>
                   </pic:nvPicPr>
                   <pic:blipFill>
-                    <a:blip r:embed="rId13"/>
+                    <a:blip r:embed="rId17"/>
                     <a:stretch>
                       <a:fillRect/>
                     </a:stretch>
@@ -3795,7 +3748,7 @@
           <w:szCs w:val="22"/>
         </w:rPr>
       </w:pPr>
-      <w:bookmarkStart w:id="0" w:name="_Ref81579849"/>
+      <w:bookmarkStart w:id="1" w:name="_Ref81579849"/>
       <w:r>
         <w:rPr>
           <w:szCs w:val="22"/>
@@ -3834,7 +3787,7 @@
         </w:rPr>
         <w:fldChar w:fldCharType="end"/>
       </w:r>
-      <w:bookmarkEnd w:id="0"/>
+      <w:bookmarkEnd w:id="1"/>
       <w:r>
         <w:rPr>
           <w:szCs w:val="22"/>
@@ -3993,7 +3946,21 @@
         <w:rPr>
           <w:szCs w:val="22"/>
         </w:rPr>
-        <w:t xml:space="preserve">Proctor, Shadle, &amp; </w:t>
+        <w:t xml:space="preserve">Proctor, </w:t>
+      </w:r>
+      <w:proofErr w:type="spellStart"/>
+      <w:r>
+        <w:rPr>
+          <w:szCs w:val="22"/>
+        </w:rPr>
+        <w:t>Shadle</w:t>
+      </w:r>
+      <w:proofErr w:type="spellEnd"/>
+      <w:r>
+        <w:rPr>
+          <w:szCs w:val="22"/>
+        </w:rPr>
+        <w:t xml:space="preserve">, &amp; </w:t>
       </w:r>
       <w:proofErr w:type="spellStart"/>
       <w:r>
@@ -7688,7 +7655,7 @@
         </w:rPr>
         <w:t xml:space="preserve"> summarizes the </w:t>
       </w:r>
-      <w:ins w:id="1" w:author="Jaeger, Florian" w:date="2025-05-21T14:28:00Z" w16du:dateUtc="2025-05-21T18:28:00Z">
+      <w:ins w:id="2" w:author="Jaeger, Florian" w:date="2025-05-21T14:28:00Z" w16du:dateUtc="2025-05-21T18:28:00Z">
         <w:r>
           <w:rPr>
             <w:szCs w:val="22"/>
@@ -7708,7 +7675,7 @@
         </w:rPr>
         <w:t xml:space="preserve">After participant exclusions, </w:t>
       </w:r>
-      <w:ins w:id="2" w:author="Jaeger, Florian" w:date="2025-05-21T14:17:00Z" w16du:dateUtc="2025-05-21T18:17:00Z">
+      <w:ins w:id="3" w:author="Jaeger, Florian" w:date="2025-05-21T14:17:00Z" w16du:dateUtc="2025-05-21T18:17:00Z">
         <w:r>
           <w:rPr>
             <w:szCs w:val="22"/>
@@ -7716,7 +7683,7 @@
           <w:t xml:space="preserve">we applied trial-level exclusions. </w:t>
         </w:r>
       </w:ins>
-      <w:ins w:id="3" w:author="Jaeger, Florian" w:date="2025-05-21T14:28:00Z" w16du:dateUtc="2025-05-21T18:28:00Z">
+      <w:ins w:id="4" w:author="Jaeger, Florian" w:date="2025-05-21T14:28:00Z" w16du:dateUtc="2025-05-21T18:28:00Z">
         <w:r>
           <w:rPr>
             <w:szCs w:val="22"/>
@@ -7724,7 +7691,7 @@
           <w:t>For Experiments 1a-c, w</w:t>
         </w:r>
       </w:ins>
-      <w:ins w:id="4" w:author="Jaeger, Florian" w:date="2025-05-21T14:17:00Z" w16du:dateUtc="2025-05-21T18:17:00Z">
+      <w:ins w:id="5" w:author="Jaeger, Florian" w:date="2025-05-21T14:17:00Z" w16du:dateUtc="2025-05-21T18:17:00Z">
         <w:r>
           <w:rPr>
             <w:szCs w:val="22"/>
@@ -7732,7 +7699,7 @@
           <w:t xml:space="preserve">e excluded </w:t>
         </w:r>
       </w:ins>
-      <w:commentRangeStart w:id="5"/>
+      <w:commentRangeStart w:id="6"/>
       <w:r>
         <w:rPr>
           <w:szCs w:val="22"/>
@@ -7769,14 +7736,14 @@
         </w:rPr>
         <w:t xml:space="preserve"> </w:t>
       </w:r>
-      <w:commentRangeEnd w:id="5"/>
+      <w:commentRangeEnd w:id="6"/>
       <w:r>
         <w:rPr>
           <w:rStyle w:val="CommentReference"/>
         </w:rPr>
-        <w:commentReference w:id="5"/>
-      </w:r>
-      <w:ins w:id="6" w:author="Jaeger, Florian" w:date="2025-05-21T14:28:00Z" w16du:dateUtc="2025-05-21T18:28:00Z">
+        <w:commentReference w:id="6"/>
+      </w:r>
+      <w:ins w:id="7" w:author="Jaeger, Florian" w:date="2025-05-21T14:28:00Z" w16du:dateUtc="2025-05-21T18:28:00Z">
         <w:r>
           <w:rPr>
             <w:szCs w:val="22"/>
@@ -7784,7 +7751,7 @@
           <w:t>that were missing a categorization response since</w:t>
         </w:r>
       </w:ins>
-      <w:del w:id="7" w:author="Jaeger, Florian" w:date="2025-05-21T14:17:00Z" w16du:dateUtc="2025-05-21T18:17:00Z">
+      <w:del w:id="8" w:author="Jaeger, Florian" w:date="2025-05-21T14:17:00Z" w16du:dateUtc="2025-05-21T18:17:00Z">
         <w:r>
           <w:rPr>
             <w:szCs w:val="22"/>
@@ -7792,7 +7759,7 @@
           <w:delText xml:space="preserve">were </w:delText>
         </w:r>
       </w:del>
-      <w:ins w:id="8" w:author="Jaeger, Florian" w:date="2025-05-21T14:28:00Z" w16du:dateUtc="2025-05-21T18:28:00Z">
+      <w:ins w:id="9" w:author="Jaeger, Florian" w:date="2025-05-21T14:28:00Z" w16du:dateUtc="2025-05-21T18:28:00Z">
         <w:r>
           <w:rPr>
             <w:szCs w:val="22"/>
@@ -7800,7 +7767,7 @@
           <w:t xml:space="preserve"> </w:t>
         </w:r>
       </w:ins>
-      <w:ins w:id="9" w:author="Jaeger, Florian" w:date="2025-05-21T14:19:00Z" w16du:dateUtc="2025-05-21T18:19:00Z">
+      <w:ins w:id="10" w:author="Jaeger, Florian" w:date="2025-05-21T14:19:00Z" w16du:dateUtc="2025-05-21T18:19:00Z">
         <w:r>
           <w:rPr>
             <w:szCs w:val="22"/>
@@ -7808,7 +7775,7 @@
           <w:t>participants indicated a catch trial</w:t>
         </w:r>
       </w:ins>
-      <w:ins w:id="10" w:author="Jaeger, Florian" w:date="2025-05-21T14:21:00Z" w16du:dateUtc="2025-05-21T18:21:00Z">
+      <w:ins w:id="11" w:author="Jaeger, Florian" w:date="2025-05-21T14:21:00Z" w16du:dateUtc="2025-05-21T18:21:00Z">
         <w:r>
           <w:rPr>
             <w:szCs w:val="22"/>
@@ -7816,7 +7783,7 @@
           <w:t xml:space="preserve"> (a</w:t>
         </w:r>
       </w:ins>
-      <w:ins w:id="11" w:author="Jaeger, Florian" w:date="2025-05-21T14:19:00Z" w16du:dateUtc="2025-05-21T18:19:00Z">
+      <w:ins w:id="12" w:author="Jaeger, Florian" w:date="2025-05-21T14:19:00Z" w16du:dateUtc="2025-05-21T18:19:00Z">
         <w:r>
           <w:rPr>
             <w:szCs w:val="22"/>
@@ -7824,7 +7791,7 @@
           <w:t xml:space="preserve">s detailed </w:t>
         </w:r>
       </w:ins>
-      <w:ins w:id="12" w:author="Jaeger, Florian" w:date="2025-05-21T14:20:00Z" w16du:dateUtc="2025-05-21T18:20:00Z">
+      <w:ins w:id="13" w:author="Jaeger, Florian" w:date="2025-05-21T14:20:00Z" w16du:dateUtc="2025-05-21T18:20:00Z">
         <w:r>
           <w:rPr>
             <w:szCs w:val="22"/>
@@ -7836,7 +7803,7 @@
             <w:i/>
             <w:iCs/>
             <w:szCs w:val="22"/>
-            <w:rPrChange w:id="13" w:author="Jaeger, Florian" w:date="2025-05-21T14:20:00Z" w16du:dateUtc="2025-05-21T18:20:00Z">
+            <w:rPrChange w:id="14" w:author="Jaeger, Florian" w:date="2025-05-21T14:20:00Z" w16du:dateUtc="2025-05-21T18:20:00Z">
               <w:rPr>
                 <w:szCs w:val="22"/>
               </w:rPr>
@@ -7845,7 +7812,7 @@
           <w:t>Procedure</w:t>
         </w:r>
       </w:ins>
-      <w:ins w:id="14" w:author="Jaeger, Florian" w:date="2025-05-21T14:19:00Z" w16du:dateUtc="2025-05-21T18:19:00Z">
+      <w:ins w:id="15" w:author="Jaeger, Florian" w:date="2025-05-21T14:19:00Z" w16du:dateUtc="2025-05-21T18:19:00Z">
         <w:r>
           <w:rPr>
             <w:szCs w:val="22"/>
@@ -7853,7 +7820,7 @@
           <w:t xml:space="preserve">, </w:t>
         </w:r>
       </w:ins>
-      <w:ins w:id="15" w:author="Jaeger, Florian" w:date="2025-05-21T14:20:00Z" w16du:dateUtc="2025-05-21T18:20:00Z">
+      <w:ins w:id="16" w:author="Jaeger, Florian" w:date="2025-05-21T14:20:00Z" w16du:dateUtc="2025-05-21T18:20:00Z">
         <w:r>
           <w:rPr>
             <w:szCs w:val="22"/>
@@ -7861,7 +7828,7 @@
           <w:t>the experiments reporte</w:t>
         </w:r>
       </w:ins>
-      <w:ins w:id="16" w:author="Jaeger, Florian" w:date="2025-05-21T14:21:00Z" w16du:dateUtc="2025-05-21T18:21:00Z">
+      <w:ins w:id="17" w:author="Jaeger, Florian" w:date="2025-05-21T14:21:00Z" w16du:dateUtc="2025-05-21T18:21:00Z">
         <w:r>
           <w:rPr>
             <w:szCs w:val="22"/>
@@ -7869,7 +7836,7 @@
           <w:t xml:space="preserve">d here </w:t>
         </w:r>
       </w:ins>
-      <w:ins w:id="17" w:author="Jaeger, Florian" w:date="2025-05-21T14:22:00Z" w16du:dateUtc="2025-05-21T18:22:00Z">
+      <w:ins w:id="18" w:author="Jaeger, Florian" w:date="2025-05-21T14:22:00Z" w16du:dateUtc="2025-05-21T18:22:00Z">
         <w:r>
           <w:rPr>
             <w:szCs w:val="22"/>
@@ -7877,7 +7844,7 @@
           <w:t>did not actually</w:t>
         </w:r>
       </w:ins>
-      <w:ins w:id="18" w:author="Jaeger, Florian" w:date="2025-05-21T14:21:00Z" w16du:dateUtc="2025-05-21T18:21:00Z">
+      <w:ins w:id="19" w:author="Jaeger, Florian" w:date="2025-05-21T14:21:00Z" w16du:dateUtc="2025-05-21T18:21:00Z">
         <w:r>
           <w:rPr>
             <w:szCs w:val="22"/>
@@ -7885,7 +7852,7 @@
           <w:t xml:space="preserve"> contain</w:t>
         </w:r>
       </w:ins>
-      <w:ins w:id="19" w:author="Jaeger, Florian" w:date="2025-05-21T14:22:00Z" w16du:dateUtc="2025-05-21T18:22:00Z">
+      <w:ins w:id="20" w:author="Jaeger, Florian" w:date="2025-05-21T14:22:00Z" w16du:dateUtc="2025-05-21T18:22:00Z">
         <w:r>
           <w:rPr>
             <w:szCs w:val="22"/>
@@ -7893,7 +7860,7 @@
           <w:t xml:space="preserve"> any</w:t>
         </w:r>
       </w:ins>
-      <w:ins w:id="20" w:author="Jaeger, Florian" w:date="2025-05-21T14:21:00Z" w16du:dateUtc="2025-05-21T18:21:00Z">
+      <w:ins w:id="21" w:author="Jaeger, Florian" w:date="2025-05-21T14:21:00Z" w16du:dateUtc="2025-05-21T18:21:00Z">
         <w:r>
           <w:rPr>
             <w:szCs w:val="22"/>
@@ -7901,7 +7868,7 @@
           <w:t xml:space="preserve"> catch trials</w:t>
         </w:r>
       </w:ins>
-      <w:ins w:id="21" w:author="Jaeger, Florian" w:date="2025-05-21T14:22:00Z" w16du:dateUtc="2025-05-21T18:22:00Z">
+      <w:ins w:id="22" w:author="Jaeger, Florian" w:date="2025-05-21T14:22:00Z" w16du:dateUtc="2025-05-21T18:22:00Z">
         <w:r>
           <w:rPr>
             <w:szCs w:val="22"/>
@@ -7909,7 +7876,7 @@
           <w:t>)</w:t>
         </w:r>
       </w:ins>
-      <w:ins w:id="22" w:author="Jaeger, Florian" w:date="2025-05-21T14:21:00Z" w16du:dateUtc="2025-05-21T18:21:00Z">
+      <w:ins w:id="23" w:author="Jaeger, Florian" w:date="2025-05-21T14:21:00Z" w16du:dateUtc="2025-05-21T18:21:00Z">
         <w:r>
           <w:rPr>
             <w:szCs w:val="22"/>
@@ -7917,7 +7884,7 @@
           <w:t>.</w:t>
         </w:r>
       </w:ins>
-      <w:ins w:id="23" w:author="Jaeger, Florian" w:date="2025-05-21T14:22:00Z" w16du:dateUtc="2025-05-21T18:22:00Z">
+      <w:ins w:id="24" w:author="Jaeger, Florian" w:date="2025-05-21T14:22:00Z" w16du:dateUtc="2025-05-21T18:22:00Z">
         <w:r>
           <w:rPr>
             <w:szCs w:val="22"/>
@@ -7925,8 +7892,8 @@
           <w:t xml:space="preserve"> We also excluded </w:t>
         </w:r>
       </w:ins>
-      <w:commentRangeStart w:id="24"/>
-      <w:ins w:id="25" w:author="Jaeger, Florian" w:date="2025-05-21T14:23:00Z" w16du:dateUtc="2025-05-21T18:23:00Z">
+      <w:commentRangeStart w:id="25"/>
+      <w:ins w:id="26" w:author="Jaeger, Florian" w:date="2025-05-21T14:23:00Z" w16du:dateUtc="2025-05-21T18:23:00Z">
         <w:r>
           <w:rPr>
             <w:szCs w:val="22"/>
@@ -7934,7 +7901,7 @@
           <w:t>XXX</w:t>
         </w:r>
       </w:ins>
-      <w:ins w:id="26" w:author="Jaeger, Florian" w:date="2025-05-21T14:22:00Z" w16du:dateUtc="2025-05-21T18:22:00Z">
+      <w:ins w:id="27" w:author="Jaeger, Florian" w:date="2025-05-21T14:22:00Z" w16du:dateUtc="2025-05-21T18:22:00Z">
         <w:r>
           <w:rPr>
             <w:szCs w:val="22"/>
@@ -7942,7 +7909,7 @@
           <w:t xml:space="preserve"> trials</w:t>
         </w:r>
       </w:ins>
-      <w:ins w:id="27" w:author="Jaeger, Florian" w:date="2025-05-21T14:24:00Z" w16du:dateUtc="2025-05-21T18:24:00Z">
+      <w:ins w:id="28" w:author="Jaeger, Florian" w:date="2025-05-21T14:24:00Z" w16du:dateUtc="2025-05-21T18:24:00Z">
         <w:r>
           <w:rPr>
             <w:szCs w:val="22"/>
@@ -7950,7 +7917,7 @@
           <w:t xml:space="preserve"> (XX.X%)</w:t>
         </w:r>
       </w:ins>
-      <w:ins w:id="28" w:author="Jaeger, Florian" w:date="2025-05-21T14:22:00Z" w16du:dateUtc="2025-05-21T18:22:00Z">
+      <w:ins w:id="29" w:author="Jaeger, Florian" w:date="2025-05-21T14:22:00Z" w16du:dateUtc="2025-05-21T18:22:00Z">
         <w:r>
           <w:rPr>
             <w:szCs w:val="22"/>
@@ -7958,16 +7925,16 @@
           <w:t xml:space="preserve"> </w:t>
         </w:r>
       </w:ins>
-      <w:commentRangeEnd w:id="24"/>
-      <w:ins w:id="29" w:author="Jaeger, Florian" w:date="2025-05-21T14:30:00Z" w16du:dateUtc="2025-05-21T18:30:00Z">
+      <w:commentRangeEnd w:id="25"/>
+      <w:ins w:id="30" w:author="Jaeger, Florian" w:date="2025-05-21T14:30:00Z" w16du:dateUtc="2025-05-21T18:30:00Z">
         <w:r>
           <w:rPr>
             <w:rStyle w:val="CommentReference"/>
           </w:rPr>
-          <w:commentReference w:id="24"/>
+          <w:commentReference w:id="25"/>
         </w:r>
       </w:ins>
-      <w:ins w:id="30" w:author="Jaeger, Florian" w:date="2025-05-21T14:22:00Z" w16du:dateUtc="2025-05-21T18:22:00Z">
+      <w:ins w:id="31" w:author="Jaeger, Florian" w:date="2025-05-21T14:22:00Z" w16du:dateUtc="2025-05-21T18:22:00Z">
         <w:r>
           <w:rPr>
             <w:szCs w:val="22"/>
@@ -7982,7 +7949,7 @@
           <w:t>log-transformed RTs outs</w:t>
         </w:r>
       </w:ins>
-      <w:ins w:id="31" w:author="Jaeger, Florian" w:date="2025-05-21T14:23:00Z" w16du:dateUtc="2025-05-21T18:23:00Z">
+      <w:ins w:id="32" w:author="Jaeger, Florian" w:date="2025-05-21T14:23:00Z" w16du:dateUtc="2025-05-21T18:23:00Z">
         <w:r>
           <w:rPr>
             <w:szCs w:val="22"/>
@@ -7996,7 +7963,7 @@
           <w:t xml:space="preserve"> SD of mean of scaled log-transformed RTs at that trial position; for details and visualization, see SI). This </w:t>
         </w:r>
       </w:ins>
-      <w:del w:id="32" w:author="Jaeger, Florian" w:date="2025-05-21T14:19:00Z" w16du:dateUtc="2025-05-21T18:19:00Z">
+      <w:del w:id="33" w:author="Jaeger, Florian" w:date="2025-05-21T14:19:00Z" w16du:dateUtc="2025-05-21T18:19:00Z">
         <w:r>
           <w:rPr>
             <w:szCs w:val="22"/>
@@ -8016,7 +7983,7 @@
           <w:delText xml:space="preserve">, </w:delText>
         </w:r>
       </w:del>
-      <w:ins w:id="33" w:author="Jaeger, Florian" w:date="2025-05-21T14:29:00Z" w16du:dateUtc="2025-05-21T18:29:00Z">
+      <w:ins w:id="34" w:author="Jaeger, Florian" w:date="2025-05-21T14:29:00Z" w16du:dateUtc="2025-05-21T18:29:00Z">
         <w:r>
           <w:rPr>
             <w:szCs w:val="22"/>
@@ -8024,7 +7991,7 @@
           <w:t>left</w:t>
         </w:r>
       </w:ins>
-      <w:del w:id="34" w:author="Jaeger, Florian" w:date="2025-05-21T14:29:00Z" w16du:dateUtc="2025-05-21T18:29:00Z">
+      <w:del w:id="35" w:author="Jaeger, Florian" w:date="2025-05-21T14:29:00Z" w16du:dateUtc="2025-05-21T18:29:00Z">
         <w:r>
           <w:rPr>
             <w:szCs w:val="22"/>
@@ -8044,7 +8011,7 @@
         </w:rPr>
         <w:t xml:space="preserve"> </w:t>
       </w:r>
-      <w:commentRangeStart w:id="35"/>
+      <w:commentRangeStart w:id="36"/>
       <w:r>
         <w:rPr>
           <w:szCs w:val="22"/>
@@ -8093,12 +8060,12 @@
         </w:rPr>
         <w:t xml:space="preserve"> </w:t>
       </w:r>
-      <w:commentRangeEnd w:id="35"/>
+      <w:commentRangeEnd w:id="36"/>
       <w:r>
         <w:rPr>
           <w:rStyle w:val="CommentReference"/>
         </w:rPr>
-        <w:commentReference w:id="35"/>
+        <w:commentReference w:id="36"/>
       </w:r>
       <w:r>
         <w:rPr>
@@ -8174,7 +8141,7 @@
           <w:szCs w:val="22"/>
         </w:rPr>
       </w:pPr>
-      <w:bookmarkStart w:id="36" w:name="_Ref136088042"/>
+      <w:bookmarkStart w:id="37" w:name="_Ref136088042"/>
       <w:r>
         <w:t>T</w:t>
       </w:r>
@@ -8202,21 +8169,18 @@
         </w:rPr>
         <w:fldChar w:fldCharType="end"/>
       </w:r>
-      <w:bookmarkEnd w:id="36"/>
+      <w:bookmarkEnd w:id="37"/>
       <w:r>
         <w:tab/>
       </w:r>
-      <w:del w:id="37" w:author="Jaeger, Florian" w:date="2025-05-21T14:27:00Z" w16du:dateUtc="2025-05-21T18:27:00Z">
+      <w:del w:id="38" w:author="Jaeger, Florian" w:date="2025-05-21T14:27:00Z" w16du:dateUtc="2025-05-21T18:27:00Z">
         <w:r>
           <w:delText xml:space="preserve">Exclusions </w:delText>
         </w:r>
       </w:del>
-      <w:ins w:id="38" w:author="Jaeger, Florian" w:date="2025-05-21T14:27:00Z" w16du:dateUtc="2025-05-21T18:27:00Z">
+      <w:ins w:id="39" w:author="Jaeger, Florian" w:date="2025-05-21T14:27:00Z" w16du:dateUtc="2025-05-21T18:27:00Z">
         <w:r>
-          <w:t>Participant e</w:t>
-        </w:r>
-        <w:r>
-          <w:t xml:space="preserve">xclusions </w:t>
+          <w:t xml:space="preserve">Participant exclusions </w:t>
         </w:r>
       </w:ins>
       <w:r>
@@ -8225,12 +8189,12 @@
       <w:r>
         <w:t xml:space="preserve">Total exclusions can be less than the sum of all individual exclusion criteria since some participants failed multiple criteria. </w:t>
       </w:r>
-      <w:ins w:id="39" w:author="Jaeger, Florian" w:date="2025-05-21T14:16:00Z" w16du:dateUtc="2025-05-21T18:16:00Z">
+      <w:ins w:id="40" w:author="Jaeger, Florian" w:date="2025-05-21T14:16:00Z" w16du:dateUtc="2025-05-21T18:16:00Z">
         <w:r>
           <w:t>The SI contains additional visualizations of particip</w:t>
         </w:r>
       </w:ins>
-      <w:ins w:id="40" w:author="Jaeger, Florian" w:date="2025-05-21T14:17:00Z" w16du:dateUtc="2025-05-21T18:17:00Z">
+      <w:ins w:id="41" w:author="Jaeger, Florian" w:date="2025-05-21T14:17:00Z" w16du:dateUtc="2025-05-21T18:17:00Z">
         <w:r>
           <w:t>ant exclusions.</w:t>
         </w:r>
@@ -8248,7 +8212,7 @@
           <w:right w:w="15" w:type="dxa"/>
         </w:tblCellMar>
         <w:tblLook w:val="04A0" w:firstRow="1" w:lastRow="0" w:firstColumn="1" w:lastColumn="0" w:noHBand="0" w:noVBand="1"/>
-        <w:tblPrChange w:id="41" w:author="Jaeger, Florian" w:date="2025-05-21T14:27:00Z" w16du:dateUtc="2025-05-21T18:27:00Z">
+        <w:tblPrChange w:id="42" w:author="Jaeger, Florian" w:date="2025-05-21T14:27:00Z" w16du:dateUtc="2025-05-21T18:27:00Z">
           <w:tblPr>
             <w:tblW w:w="0" w:type="auto"/>
             <w:tblCellSpacing w:w="15" w:type="dxa"/>
@@ -8269,7 +8233,7 @@
         <w:gridCol w:w="910"/>
         <w:gridCol w:w="910"/>
         <w:gridCol w:w="1155"/>
-        <w:tblGridChange w:id="42">
+        <w:tblGridChange w:id="43">
           <w:tblGrid>
             <w:gridCol w:w="45"/>
             <w:gridCol w:w="2654"/>
@@ -8284,7 +8248,7 @@
       <w:tr>
         <w:trPr>
           <w:tblCellSpacing w:w="15" w:type="dxa"/>
-          <w:trPrChange w:id="43" w:author="Jaeger, Florian" w:date="2025-05-21T14:27:00Z" w16du:dateUtc="2025-05-21T18:27:00Z">
+          <w:trPrChange w:id="44" w:author="Jaeger, Florian" w:date="2025-05-21T14:27:00Z" w16du:dateUtc="2025-05-21T18:27:00Z">
             <w:trPr>
               <w:gridBefore w:val="1"/>
               <w:tblCellSpacing w:w="15" w:type="dxa"/>
@@ -8299,7 +8263,7 @@
             </w:tcBorders>
             <w:vAlign w:val="center"/>
             <w:hideMark/>
-            <w:tcPrChange w:id="44" w:author="Jaeger, Florian" w:date="2025-05-21T14:27:00Z" w16du:dateUtc="2025-05-21T18:27:00Z">
+            <w:tcPrChange w:id="45" w:author="Jaeger, Florian" w:date="2025-05-21T14:27:00Z" w16du:dateUtc="2025-05-21T18:27:00Z">
               <w:tcPr>
                 <w:tcW w:w="0" w:type="auto"/>
                 <w:tcBorders>
@@ -8349,7 +8313,7 @@
             </w:tcBorders>
             <w:vAlign w:val="center"/>
             <w:hideMark/>
-            <w:tcPrChange w:id="45" w:author="Jaeger, Florian" w:date="2025-05-21T14:27:00Z" w16du:dateUtc="2025-05-21T18:27:00Z">
+            <w:tcPrChange w:id="46" w:author="Jaeger, Florian" w:date="2025-05-21T14:27:00Z" w16du:dateUtc="2025-05-21T18:27:00Z">
               <w:tcPr>
                 <w:tcW w:w="0" w:type="auto"/>
                 <w:tcBorders>
@@ -8388,56 +8352,6 @@
                 <w:lang w:eastAsia="en-US"/>
               </w:rPr>
               <w:t>1a</w:t>
-            </w:r>
-          </w:p>
-        </w:tc>
-        <w:tc>
-          <w:tcPr>
-            <w:tcW w:w="0" w:type="auto"/>
-            <w:tcBorders>
-              <w:bottom w:val="single" w:sz="18" w:space="0" w:color="auto"/>
-              <w:right w:val="single" w:sz="4" w:space="0" w:color="auto"/>
-            </w:tcBorders>
-            <w:vAlign w:val="center"/>
-            <w:hideMark/>
-            <w:tcPrChange w:id="46" w:author="Jaeger, Florian" w:date="2025-05-21T14:27:00Z" w16du:dateUtc="2025-05-21T18:27:00Z">
-              <w:tcPr>
-                <w:tcW w:w="0" w:type="auto"/>
-                <w:tcBorders>
-                  <w:bottom w:val="single" w:sz="18" w:space="0" w:color="auto"/>
-                  <w:right w:val="single" w:sz="4" w:space="0" w:color="auto"/>
-                </w:tcBorders>
-                <w:vAlign w:val="center"/>
-                <w:hideMark/>
-              </w:tcPr>
-            </w:tcPrChange>
-          </w:tcPr>
-          <w:p>
-            <w:pPr>
-              <w:widowControl/>
-              <w:autoSpaceDE/>
-              <w:autoSpaceDN/>
-              <w:adjustRightInd/>
-              <w:spacing w:line="240" w:lineRule="auto"/>
-              <w:ind w:firstLine="0"/>
-              <w:jc w:val="left"/>
-              <w:rPr>
-                <w:rFonts w:eastAsia="Times New Roman"/>
-                <w:b/>
-                <w:bCs/>
-                <w:sz w:val="24"/>
-                <w:lang w:eastAsia="en-US"/>
-              </w:rPr>
-            </w:pPr>
-            <w:r>
-              <w:rPr>
-                <w:rFonts w:eastAsia="Times New Roman"/>
-                <w:b/>
-                <w:bCs/>
-                <w:sz w:val="24"/>
-                <w:lang w:eastAsia="en-US"/>
-              </w:rPr>
-              <w:t>1b</w:t>
             </w:r>
           </w:p>
         </w:tc>
@@ -8487,7 +8401,7 @@
                 <w:sz w:val="24"/>
                 <w:lang w:eastAsia="en-US"/>
               </w:rPr>
-              <w:t>1c</w:t>
+              <w:t>1b</w:t>
             </w:r>
           </w:p>
         </w:tc>
@@ -8498,7 +8412,57 @@
               <w:bottom w:val="single" w:sz="18" w:space="0" w:color="auto"/>
               <w:right w:val="single" w:sz="4" w:space="0" w:color="auto"/>
             </w:tcBorders>
+            <w:vAlign w:val="center"/>
+            <w:hideMark/>
             <w:tcPrChange w:id="48" w:author="Jaeger, Florian" w:date="2025-05-21T14:27:00Z" w16du:dateUtc="2025-05-21T18:27:00Z">
+              <w:tcPr>
+                <w:tcW w:w="0" w:type="auto"/>
+                <w:tcBorders>
+                  <w:bottom w:val="single" w:sz="18" w:space="0" w:color="auto"/>
+                  <w:right w:val="single" w:sz="4" w:space="0" w:color="auto"/>
+                </w:tcBorders>
+                <w:vAlign w:val="center"/>
+                <w:hideMark/>
+              </w:tcPr>
+            </w:tcPrChange>
+          </w:tcPr>
+          <w:p>
+            <w:pPr>
+              <w:widowControl/>
+              <w:autoSpaceDE/>
+              <w:autoSpaceDN/>
+              <w:adjustRightInd/>
+              <w:spacing w:line="240" w:lineRule="auto"/>
+              <w:ind w:firstLine="0"/>
+              <w:jc w:val="left"/>
+              <w:rPr>
+                <w:rFonts w:eastAsia="Times New Roman"/>
+                <w:b/>
+                <w:bCs/>
+                <w:sz w:val="24"/>
+                <w:lang w:eastAsia="en-US"/>
+              </w:rPr>
+            </w:pPr>
+            <w:r>
+              <w:rPr>
+                <w:rFonts w:eastAsia="Times New Roman"/>
+                <w:b/>
+                <w:bCs/>
+                <w:sz w:val="24"/>
+                <w:lang w:eastAsia="en-US"/>
+              </w:rPr>
+              <w:t>1c</w:t>
+            </w:r>
+          </w:p>
+        </w:tc>
+        <w:tc>
+          <w:tcPr>
+            <w:tcW w:w="0" w:type="auto"/>
+            <w:tcBorders>
+              <w:bottom w:val="single" w:sz="18" w:space="0" w:color="auto"/>
+              <w:right w:val="single" w:sz="4" w:space="0" w:color="auto"/>
+            </w:tcBorders>
+            <w:tcPrChange w:id="49" w:author="Jaeger, Florian" w:date="2025-05-21T14:27:00Z" w16du:dateUtc="2025-05-21T18:27:00Z">
               <w:tcPr>
                 <w:tcW w:w="0" w:type="auto"/>
                 <w:tcBorders>
@@ -8543,7 +8507,7 @@
             <w:tcBorders>
               <w:bottom w:val="single" w:sz="18" w:space="0" w:color="auto"/>
             </w:tcBorders>
-            <w:tcPrChange w:id="49" w:author="Jaeger, Florian" w:date="2025-05-21T14:27:00Z" w16du:dateUtc="2025-05-21T18:27:00Z">
+            <w:tcPrChange w:id="50" w:author="Jaeger, Florian" w:date="2025-05-21T14:27:00Z" w16du:dateUtc="2025-05-21T18:27:00Z">
               <w:tcPr>
                 <w:tcW w:w="0" w:type="auto"/>
                 <w:tcBorders>
@@ -8585,7 +8549,7 @@
       <w:tr>
         <w:trPr>
           <w:tblCellSpacing w:w="15" w:type="dxa"/>
-          <w:trPrChange w:id="50" w:author="Jaeger, Florian" w:date="2025-05-21T14:27:00Z" w16du:dateUtc="2025-05-21T18:27:00Z">
+          <w:trPrChange w:id="51" w:author="Jaeger, Florian" w:date="2025-05-21T14:27:00Z" w16du:dateUtc="2025-05-21T18:27:00Z">
             <w:trPr>
               <w:gridBefore w:val="1"/>
               <w:tblCellSpacing w:w="15" w:type="dxa"/>
@@ -8599,7 +8563,7 @@
               <w:top w:val="single" w:sz="4" w:space="0" w:color="auto"/>
             </w:tcBorders>
             <w:vAlign w:val="center"/>
-            <w:tcPrChange w:id="51" w:author="Jaeger, Florian" w:date="2025-05-21T14:27:00Z" w16du:dateUtc="2025-05-21T18:27:00Z">
+            <w:tcPrChange w:id="52" w:author="Jaeger, Florian" w:date="2025-05-21T14:27:00Z" w16du:dateUtc="2025-05-21T18:27:00Z">
               <w:tcPr>
                 <w:tcW w:w="0" w:type="auto"/>
                 <w:tcBorders>
@@ -8647,60 +8611,12 @@
               <w:right w:val="single" w:sz="4" w:space="0" w:color="auto"/>
             </w:tcBorders>
             <w:vAlign w:val="center"/>
-            <w:tcPrChange w:id="52" w:author="Jaeger, Florian" w:date="2025-05-21T14:27:00Z" w16du:dateUtc="2025-05-21T18:27:00Z">
+            <w:tcPrChange w:id="53" w:author="Jaeger, Florian" w:date="2025-05-21T14:27:00Z" w16du:dateUtc="2025-05-21T18:27:00Z">
               <w:tcPr>
                 <w:tcW w:w="0" w:type="auto"/>
                 <w:tcBorders>
                   <w:top w:val="single" w:sz="4" w:space="0" w:color="auto"/>
                   <w:left w:val="single" w:sz="4" w:space="0" w:color="auto"/>
-                  <w:right w:val="single" w:sz="4" w:space="0" w:color="auto"/>
-                </w:tcBorders>
-                <w:vAlign w:val="center"/>
-              </w:tcPr>
-            </w:tcPrChange>
-          </w:tcPr>
-          <w:p>
-            <w:pPr>
-              <w:widowControl/>
-              <w:autoSpaceDE/>
-              <w:autoSpaceDN/>
-              <w:adjustRightInd/>
-              <w:spacing w:line="240" w:lineRule="auto"/>
-              <w:ind w:firstLine="0"/>
-              <w:jc w:val="left"/>
-              <w:rPr>
-                <w:rFonts w:eastAsia="Times New Roman"/>
-                <w:i/>
-                <w:iCs/>
-                <w:sz w:val="24"/>
-                <w:lang w:eastAsia="en-US"/>
-              </w:rPr>
-            </w:pPr>
-            <w:r>
-              <w:rPr>
-                <w:rFonts w:eastAsia="Times New Roman"/>
-                <w:i/>
-                <w:iCs/>
-                <w:sz w:val="24"/>
-                <w:lang w:eastAsia="en-US"/>
-              </w:rPr>
-              <w:t>64</w:t>
-            </w:r>
-          </w:p>
-        </w:tc>
-        <w:tc>
-          <w:tcPr>
-            <w:tcW w:w="0" w:type="auto"/>
-            <w:tcBorders>
-              <w:top w:val="single" w:sz="4" w:space="0" w:color="auto"/>
-              <w:right w:val="single" w:sz="4" w:space="0" w:color="auto"/>
-            </w:tcBorders>
-            <w:vAlign w:val="center"/>
-            <w:tcPrChange w:id="53" w:author="Jaeger, Florian" w:date="2025-05-21T14:27:00Z" w16du:dateUtc="2025-05-21T18:27:00Z">
-              <w:tcPr>
-                <w:tcW w:w="0" w:type="auto"/>
-                <w:tcBorders>
-                  <w:top w:val="single" w:sz="4" w:space="0" w:color="auto"/>
                   <w:right w:val="single" w:sz="4" w:space="0" w:color="auto"/>
                 </w:tcBorders>
                 <w:vAlign w:val="center"/>
@@ -8791,7 +8707,55 @@
               <w:top w:val="single" w:sz="4" w:space="0" w:color="auto"/>
               <w:right w:val="single" w:sz="4" w:space="0" w:color="auto"/>
             </w:tcBorders>
+            <w:vAlign w:val="center"/>
             <w:tcPrChange w:id="55" w:author="Jaeger, Florian" w:date="2025-05-21T14:27:00Z" w16du:dateUtc="2025-05-21T18:27:00Z">
+              <w:tcPr>
+                <w:tcW w:w="0" w:type="auto"/>
+                <w:tcBorders>
+                  <w:top w:val="single" w:sz="4" w:space="0" w:color="auto"/>
+                  <w:right w:val="single" w:sz="4" w:space="0" w:color="auto"/>
+                </w:tcBorders>
+                <w:vAlign w:val="center"/>
+              </w:tcPr>
+            </w:tcPrChange>
+          </w:tcPr>
+          <w:p>
+            <w:pPr>
+              <w:widowControl/>
+              <w:autoSpaceDE/>
+              <w:autoSpaceDN/>
+              <w:adjustRightInd/>
+              <w:spacing w:line="240" w:lineRule="auto"/>
+              <w:ind w:firstLine="0"/>
+              <w:jc w:val="left"/>
+              <w:rPr>
+                <w:rFonts w:eastAsia="Times New Roman"/>
+                <w:i/>
+                <w:iCs/>
+                <w:sz w:val="24"/>
+                <w:lang w:eastAsia="en-US"/>
+              </w:rPr>
+            </w:pPr>
+            <w:r>
+              <w:rPr>
+                <w:rFonts w:eastAsia="Times New Roman"/>
+                <w:i/>
+                <w:iCs/>
+                <w:sz w:val="24"/>
+                <w:lang w:eastAsia="en-US"/>
+              </w:rPr>
+              <w:t>64</w:t>
+            </w:r>
+          </w:p>
+        </w:tc>
+        <w:tc>
+          <w:tcPr>
+            <w:tcW w:w="0" w:type="auto"/>
+            <w:tcBorders>
+              <w:top w:val="single" w:sz="4" w:space="0" w:color="auto"/>
+              <w:right w:val="single" w:sz="4" w:space="0" w:color="auto"/>
+            </w:tcBorders>
+            <w:tcPrChange w:id="56" w:author="Jaeger, Florian" w:date="2025-05-21T14:27:00Z" w16du:dateUtc="2025-05-21T18:27:00Z">
               <w:tcPr>
                 <w:tcW w:w="0" w:type="auto"/>
                 <w:tcBorders>
@@ -8836,7 +8800,7 @@
             <w:tcBorders>
               <w:top w:val="single" w:sz="4" w:space="0" w:color="auto"/>
             </w:tcBorders>
-            <w:tcPrChange w:id="56" w:author="Jaeger, Florian" w:date="2025-05-21T14:27:00Z" w16du:dateUtc="2025-05-21T18:27:00Z">
+            <w:tcPrChange w:id="57" w:author="Jaeger, Florian" w:date="2025-05-21T14:27:00Z" w16du:dateUtc="2025-05-21T18:27:00Z">
               <w:tcPr>
                 <w:tcW w:w="0" w:type="auto"/>
                 <w:tcBorders>
@@ -8878,7 +8842,7 @@
       <w:tr>
         <w:trPr>
           <w:tblCellSpacing w:w="15" w:type="dxa"/>
-          <w:trPrChange w:id="57" w:author="Jaeger, Florian" w:date="2025-05-21T14:27:00Z" w16du:dateUtc="2025-05-21T18:27:00Z">
+          <w:trPrChange w:id="58" w:author="Jaeger, Florian" w:date="2025-05-21T14:27:00Z" w16du:dateUtc="2025-05-21T18:27:00Z">
             <w:trPr>
               <w:gridBefore w:val="1"/>
               <w:tblCellSpacing w:w="15" w:type="dxa"/>
@@ -8889,7 +8853,7 @@
           <w:tcPr>
             <w:tcW w:w="2609" w:type="dxa"/>
             <w:vAlign w:val="center"/>
-            <w:tcPrChange w:id="58" w:author="Jaeger, Florian" w:date="2025-05-21T14:27:00Z" w16du:dateUtc="2025-05-21T18:27:00Z">
+            <w:tcPrChange w:id="59" w:author="Jaeger, Florian" w:date="2025-05-21T14:27:00Z" w16du:dateUtc="2025-05-21T18:27:00Z">
               <w:tcPr>
                 <w:tcW w:w="0" w:type="auto"/>
                 <w:vAlign w:val="center"/>
@@ -8929,53 +8893,11 @@
               <w:right w:val="single" w:sz="4" w:space="0" w:color="auto"/>
             </w:tcBorders>
             <w:vAlign w:val="center"/>
-            <w:tcPrChange w:id="59" w:author="Jaeger, Florian" w:date="2025-05-21T14:27:00Z" w16du:dateUtc="2025-05-21T18:27:00Z">
+            <w:tcPrChange w:id="60" w:author="Jaeger, Florian" w:date="2025-05-21T14:27:00Z" w16du:dateUtc="2025-05-21T18:27:00Z">
               <w:tcPr>
                 <w:tcW w:w="0" w:type="auto"/>
                 <w:tcBorders>
                   <w:left w:val="single" w:sz="4" w:space="0" w:color="auto"/>
-                  <w:right w:val="single" w:sz="4" w:space="0" w:color="auto"/>
-                </w:tcBorders>
-                <w:vAlign w:val="center"/>
-              </w:tcPr>
-            </w:tcPrChange>
-          </w:tcPr>
-          <w:p>
-            <w:pPr>
-              <w:widowControl/>
-              <w:autoSpaceDE/>
-              <w:autoSpaceDN/>
-              <w:adjustRightInd/>
-              <w:spacing w:line="240" w:lineRule="auto"/>
-              <w:ind w:firstLine="0"/>
-              <w:jc w:val="left"/>
-              <w:rPr>
-                <w:rFonts w:eastAsia="Times New Roman"/>
-                <w:sz w:val="24"/>
-                <w:lang w:eastAsia="en-US"/>
-              </w:rPr>
-            </w:pPr>
-            <w:r>
-              <w:rPr>
-                <w:rFonts w:eastAsia="Times New Roman"/>
-                <w:sz w:val="24"/>
-                <w:lang w:eastAsia="en-US"/>
-              </w:rPr>
-              <w:t>-</w:t>
-            </w:r>
-          </w:p>
-        </w:tc>
-        <w:tc>
-          <w:tcPr>
-            <w:tcW w:w="0" w:type="auto"/>
-            <w:tcBorders>
-              <w:right w:val="single" w:sz="4" w:space="0" w:color="auto"/>
-            </w:tcBorders>
-            <w:vAlign w:val="center"/>
-            <w:tcPrChange w:id="60" w:author="Jaeger, Florian" w:date="2025-05-21T14:27:00Z" w16du:dateUtc="2025-05-21T18:27:00Z">
-              <w:tcPr>
-                <w:tcW w:w="0" w:type="auto"/>
-                <w:tcBorders>
                   <w:right w:val="single" w:sz="4" w:space="0" w:color="auto"/>
                 </w:tcBorders>
                 <w:vAlign w:val="center"/>
@@ -9045,7 +8967,7 @@
                 <w:sz w:val="24"/>
                 <w:lang w:eastAsia="en-US"/>
               </w:rPr>
-              <w:t>2 (3.1%)</w:t>
+              <w:t>-</w:t>
             </w:r>
           </w:p>
         </w:tc>
@@ -9055,7 +8977,49 @@
             <w:tcBorders>
               <w:right w:val="single" w:sz="4" w:space="0" w:color="auto"/>
             </w:tcBorders>
+            <w:vAlign w:val="center"/>
             <w:tcPrChange w:id="62" w:author="Jaeger, Florian" w:date="2025-05-21T14:27:00Z" w16du:dateUtc="2025-05-21T18:27:00Z">
+              <w:tcPr>
+                <w:tcW w:w="0" w:type="auto"/>
+                <w:tcBorders>
+                  <w:right w:val="single" w:sz="4" w:space="0" w:color="auto"/>
+                </w:tcBorders>
+                <w:vAlign w:val="center"/>
+              </w:tcPr>
+            </w:tcPrChange>
+          </w:tcPr>
+          <w:p>
+            <w:pPr>
+              <w:widowControl/>
+              <w:autoSpaceDE/>
+              <w:autoSpaceDN/>
+              <w:adjustRightInd/>
+              <w:spacing w:line="240" w:lineRule="auto"/>
+              <w:ind w:firstLine="0"/>
+              <w:jc w:val="left"/>
+              <w:rPr>
+                <w:rFonts w:eastAsia="Times New Roman"/>
+                <w:sz w:val="24"/>
+                <w:lang w:eastAsia="en-US"/>
+              </w:rPr>
+            </w:pPr>
+            <w:r>
+              <w:rPr>
+                <w:rFonts w:eastAsia="Times New Roman"/>
+                <w:sz w:val="24"/>
+                <w:lang w:eastAsia="en-US"/>
+              </w:rPr>
+              <w:t>2 (3.1%)</w:t>
+            </w:r>
+          </w:p>
+        </w:tc>
+        <w:tc>
+          <w:tcPr>
+            <w:tcW w:w="0" w:type="auto"/>
+            <w:tcBorders>
+              <w:right w:val="single" w:sz="4" w:space="0" w:color="auto"/>
+            </w:tcBorders>
+            <w:tcPrChange w:id="63" w:author="Jaeger, Florian" w:date="2025-05-21T14:27:00Z" w16du:dateUtc="2025-05-21T18:27:00Z">
               <w:tcPr>
                 <w:tcW w:w="0" w:type="auto"/>
                 <w:tcBorders>
@@ -9092,7 +9056,7 @@
         <w:tc>
           <w:tcPr>
             <w:tcW w:w="0" w:type="auto"/>
-            <w:tcPrChange w:id="63" w:author="Jaeger, Florian" w:date="2025-05-21T14:27:00Z" w16du:dateUtc="2025-05-21T18:27:00Z">
+            <w:tcPrChange w:id="64" w:author="Jaeger, Florian" w:date="2025-05-21T14:27:00Z" w16du:dateUtc="2025-05-21T18:27:00Z">
               <w:tcPr>
                 <w:tcW w:w="0" w:type="auto"/>
               </w:tcPr>
@@ -9127,7 +9091,7 @@
       <w:tr>
         <w:trPr>
           <w:tblCellSpacing w:w="15" w:type="dxa"/>
-          <w:trPrChange w:id="64" w:author="Jaeger, Florian" w:date="2025-05-21T14:27:00Z" w16du:dateUtc="2025-05-21T18:27:00Z">
+          <w:trPrChange w:id="65" w:author="Jaeger, Florian" w:date="2025-05-21T14:27:00Z" w16du:dateUtc="2025-05-21T18:27:00Z">
             <w:trPr>
               <w:gridBefore w:val="1"/>
               <w:tblCellSpacing w:w="15" w:type="dxa"/>
@@ -9139,7 +9103,7 @@
             <w:tcW w:w="2609" w:type="dxa"/>
             <w:vAlign w:val="center"/>
             <w:hideMark/>
-            <w:tcPrChange w:id="65" w:author="Jaeger, Florian" w:date="2025-05-21T14:27:00Z" w16du:dateUtc="2025-05-21T18:27:00Z">
+            <w:tcPrChange w:id="66" w:author="Jaeger, Florian" w:date="2025-05-21T14:27:00Z" w16du:dateUtc="2025-05-21T18:27:00Z">
               <w:tcPr>
                 <w:tcW w:w="0" w:type="auto"/>
                 <w:vAlign w:val="center"/>
@@ -9189,7 +9153,7 @@
             </w:tcBorders>
             <w:vAlign w:val="center"/>
             <w:hideMark/>
-            <w:tcPrChange w:id="66" w:author="Jaeger, Florian" w:date="2025-05-21T14:27:00Z" w16du:dateUtc="2025-05-21T18:27:00Z">
+            <w:tcPrChange w:id="67" w:author="Jaeger, Florian" w:date="2025-05-21T14:27:00Z" w16du:dateUtc="2025-05-21T18:27:00Z">
               <w:tcPr>
                 <w:tcW w:w="0" w:type="auto"/>
                 <w:tcBorders>
@@ -9223,50 +9187,6 @@
                 <w:lang w:eastAsia="en-US"/>
               </w:rPr>
               <w:t>-</w:t>
-            </w:r>
-          </w:p>
-        </w:tc>
-        <w:tc>
-          <w:tcPr>
-            <w:tcW w:w="0" w:type="auto"/>
-            <w:tcBorders>
-              <w:right w:val="single" w:sz="4" w:space="0" w:color="auto"/>
-            </w:tcBorders>
-            <w:vAlign w:val="center"/>
-            <w:hideMark/>
-            <w:tcPrChange w:id="67" w:author="Jaeger, Florian" w:date="2025-05-21T14:27:00Z" w16du:dateUtc="2025-05-21T18:27:00Z">
-              <w:tcPr>
-                <w:tcW w:w="0" w:type="auto"/>
-                <w:tcBorders>
-                  <w:right w:val="single" w:sz="4" w:space="0" w:color="auto"/>
-                </w:tcBorders>
-                <w:vAlign w:val="center"/>
-                <w:hideMark/>
-              </w:tcPr>
-            </w:tcPrChange>
-          </w:tcPr>
-          <w:p>
-            <w:pPr>
-              <w:widowControl/>
-              <w:autoSpaceDE/>
-              <w:autoSpaceDN/>
-              <w:adjustRightInd/>
-              <w:spacing w:line="240" w:lineRule="auto"/>
-              <w:ind w:firstLine="0"/>
-              <w:jc w:val="left"/>
-              <w:rPr>
-                <w:rFonts w:eastAsia="Times New Roman"/>
-                <w:sz w:val="24"/>
-                <w:lang w:eastAsia="en-US"/>
-              </w:rPr>
-            </w:pPr>
-            <w:r>
-              <w:rPr>
-                <w:rFonts w:eastAsia="Times New Roman"/>
-                <w:sz w:val="24"/>
-                <w:lang w:eastAsia="en-US"/>
-              </w:rPr>
-              <w:t>3 (4.7%)</w:t>
             </w:r>
           </w:p>
         </w:tc>
@@ -9310,7 +9230,7 @@
                 <w:sz w:val="24"/>
                 <w:lang w:eastAsia="en-US"/>
               </w:rPr>
-              <w:t>1 (1.6%)</w:t>
+              <w:t>3 (4.7%)</w:t>
             </w:r>
           </w:p>
         </w:tc>
@@ -9320,7 +9240,51 @@
             <w:tcBorders>
               <w:right w:val="single" w:sz="4" w:space="0" w:color="auto"/>
             </w:tcBorders>
+            <w:vAlign w:val="center"/>
+            <w:hideMark/>
             <w:tcPrChange w:id="69" w:author="Jaeger, Florian" w:date="2025-05-21T14:27:00Z" w16du:dateUtc="2025-05-21T18:27:00Z">
+              <w:tcPr>
+                <w:tcW w:w="0" w:type="auto"/>
+                <w:tcBorders>
+                  <w:right w:val="single" w:sz="4" w:space="0" w:color="auto"/>
+                </w:tcBorders>
+                <w:vAlign w:val="center"/>
+                <w:hideMark/>
+              </w:tcPr>
+            </w:tcPrChange>
+          </w:tcPr>
+          <w:p>
+            <w:pPr>
+              <w:widowControl/>
+              <w:autoSpaceDE/>
+              <w:autoSpaceDN/>
+              <w:adjustRightInd/>
+              <w:spacing w:line="240" w:lineRule="auto"/>
+              <w:ind w:firstLine="0"/>
+              <w:jc w:val="left"/>
+              <w:rPr>
+                <w:rFonts w:eastAsia="Times New Roman"/>
+                <w:sz w:val="24"/>
+                <w:lang w:eastAsia="en-US"/>
+              </w:rPr>
+            </w:pPr>
+            <w:r>
+              <w:rPr>
+                <w:rFonts w:eastAsia="Times New Roman"/>
+                <w:sz w:val="24"/>
+                <w:lang w:eastAsia="en-US"/>
+              </w:rPr>
+              <w:t>1 (1.6%)</w:t>
+            </w:r>
+          </w:p>
+        </w:tc>
+        <w:tc>
+          <w:tcPr>
+            <w:tcW w:w="0" w:type="auto"/>
+            <w:tcBorders>
+              <w:right w:val="single" w:sz="4" w:space="0" w:color="auto"/>
+            </w:tcBorders>
+            <w:tcPrChange w:id="70" w:author="Jaeger, Florian" w:date="2025-05-21T14:27:00Z" w16du:dateUtc="2025-05-21T18:27:00Z">
               <w:tcPr>
                 <w:tcW w:w="0" w:type="auto"/>
                 <w:tcBorders>
@@ -9357,7 +9321,7 @@
         <w:tc>
           <w:tcPr>
             <w:tcW w:w="0" w:type="auto"/>
-            <w:tcPrChange w:id="70" w:author="Jaeger, Florian" w:date="2025-05-21T14:27:00Z" w16du:dateUtc="2025-05-21T18:27:00Z">
+            <w:tcPrChange w:id="71" w:author="Jaeger, Florian" w:date="2025-05-21T14:27:00Z" w16du:dateUtc="2025-05-21T18:27:00Z">
               <w:tcPr>
                 <w:tcW w:w="0" w:type="auto"/>
               </w:tcPr>
@@ -9392,7 +9356,7 @@
       <w:tr>
         <w:trPr>
           <w:tblCellSpacing w:w="15" w:type="dxa"/>
-          <w:trPrChange w:id="71" w:author="Jaeger, Florian" w:date="2025-05-21T14:27:00Z" w16du:dateUtc="2025-05-21T18:27:00Z">
+          <w:trPrChange w:id="72" w:author="Jaeger, Florian" w:date="2025-05-21T14:27:00Z" w16du:dateUtc="2025-05-21T18:27:00Z">
             <w:trPr>
               <w:tblCellSpacing w:w="15" w:type="dxa"/>
             </w:trPr>
@@ -9403,7 +9367,7 @@
             <w:tcW w:w="2609" w:type="dxa"/>
             <w:vAlign w:val="center"/>
             <w:hideMark/>
-            <w:tcPrChange w:id="72" w:author="Jaeger, Florian" w:date="2025-05-21T14:27:00Z" w16du:dateUtc="2025-05-21T18:27:00Z">
+            <w:tcPrChange w:id="73" w:author="Jaeger, Florian" w:date="2025-05-21T14:27:00Z" w16du:dateUtc="2025-05-21T18:27:00Z">
               <w:tcPr>
                 <w:tcW w:w="0" w:type="auto"/>
                 <w:gridSpan w:val="2"/>
@@ -9446,7 +9410,7 @@
             </w:tcBorders>
             <w:vAlign w:val="center"/>
             <w:hideMark/>
-            <w:tcPrChange w:id="73" w:author="Jaeger, Florian" w:date="2025-05-21T14:27:00Z" w16du:dateUtc="2025-05-21T18:27:00Z">
+            <w:tcPrChange w:id="74" w:author="Jaeger, Florian" w:date="2025-05-21T14:27:00Z" w16du:dateUtc="2025-05-21T18:27:00Z">
               <w:tcPr>
                 <w:tcW w:w="0" w:type="auto"/>
                 <w:tcBorders>
@@ -9480,50 +9444,6 @@
                 <w:lang w:eastAsia="en-US"/>
               </w:rPr>
               <w:t>-</w:t>
-            </w:r>
-          </w:p>
-        </w:tc>
-        <w:tc>
-          <w:tcPr>
-            <w:tcW w:w="0" w:type="auto"/>
-            <w:tcBorders>
-              <w:right w:val="single" w:sz="4" w:space="0" w:color="auto"/>
-            </w:tcBorders>
-            <w:vAlign w:val="center"/>
-            <w:hideMark/>
-            <w:tcPrChange w:id="74" w:author="Jaeger, Florian" w:date="2025-05-21T14:27:00Z" w16du:dateUtc="2025-05-21T18:27:00Z">
-              <w:tcPr>
-                <w:tcW w:w="0" w:type="auto"/>
-                <w:tcBorders>
-                  <w:right w:val="single" w:sz="4" w:space="0" w:color="auto"/>
-                </w:tcBorders>
-                <w:vAlign w:val="center"/>
-                <w:hideMark/>
-              </w:tcPr>
-            </w:tcPrChange>
-          </w:tcPr>
-          <w:p>
-            <w:pPr>
-              <w:widowControl/>
-              <w:autoSpaceDE/>
-              <w:autoSpaceDN/>
-              <w:adjustRightInd/>
-              <w:spacing w:line="240" w:lineRule="auto"/>
-              <w:ind w:firstLine="0"/>
-              <w:jc w:val="left"/>
-              <w:rPr>
-                <w:rFonts w:eastAsia="Times New Roman"/>
-                <w:sz w:val="24"/>
-                <w:lang w:eastAsia="en-US"/>
-              </w:rPr>
-            </w:pPr>
-            <w:r>
-              <w:rPr>
-                <w:rFonts w:eastAsia="Times New Roman"/>
-                <w:sz w:val="24"/>
-                <w:lang w:eastAsia="en-US"/>
-              </w:rPr>
-              <w:t>1 (1.6%)</w:t>
             </w:r>
           </w:p>
         </w:tc>
@@ -9577,7 +9497,51 @@
             <w:tcBorders>
               <w:right w:val="single" w:sz="4" w:space="0" w:color="auto"/>
             </w:tcBorders>
+            <w:vAlign w:val="center"/>
+            <w:hideMark/>
             <w:tcPrChange w:id="76" w:author="Jaeger, Florian" w:date="2025-05-21T14:27:00Z" w16du:dateUtc="2025-05-21T18:27:00Z">
+              <w:tcPr>
+                <w:tcW w:w="0" w:type="auto"/>
+                <w:tcBorders>
+                  <w:right w:val="single" w:sz="4" w:space="0" w:color="auto"/>
+                </w:tcBorders>
+                <w:vAlign w:val="center"/>
+                <w:hideMark/>
+              </w:tcPr>
+            </w:tcPrChange>
+          </w:tcPr>
+          <w:p>
+            <w:pPr>
+              <w:widowControl/>
+              <w:autoSpaceDE/>
+              <w:autoSpaceDN/>
+              <w:adjustRightInd/>
+              <w:spacing w:line="240" w:lineRule="auto"/>
+              <w:ind w:firstLine="0"/>
+              <w:jc w:val="left"/>
+              <w:rPr>
+                <w:rFonts w:eastAsia="Times New Roman"/>
+                <w:sz w:val="24"/>
+                <w:lang w:eastAsia="en-US"/>
+              </w:rPr>
+            </w:pPr>
+            <w:r>
+              <w:rPr>
+                <w:rFonts w:eastAsia="Times New Roman"/>
+                <w:sz w:val="24"/>
+                <w:lang w:eastAsia="en-US"/>
+              </w:rPr>
+              <w:t>1 (1.6%)</w:t>
+            </w:r>
+          </w:p>
+        </w:tc>
+        <w:tc>
+          <w:tcPr>
+            <w:tcW w:w="0" w:type="auto"/>
+            <w:tcBorders>
+              <w:right w:val="single" w:sz="4" w:space="0" w:color="auto"/>
+            </w:tcBorders>
+            <w:tcPrChange w:id="77" w:author="Jaeger, Florian" w:date="2025-05-21T14:27:00Z" w16du:dateUtc="2025-05-21T18:27:00Z">
               <w:tcPr>
                 <w:tcW w:w="0" w:type="auto"/>
                 <w:tcBorders>
@@ -9614,7 +9578,7 @@
         <w:tc>
           <w:tcPr>
             <w:tcW w:w="0" w:type="auto"/>
-            <w:tcPrChange w:id="77" w:author="Jaeger, Florian" w:date="2025-05-21T14:27:00Z" w16du:dateUtc="2025-05-21T18:27:00Z">
+            <w:tcPrChange w:id="78" w:author="Jaeger, Florian" w:date="2025-05-21T14:27:00Z" w16du:dateUtc="2025-05-21T18:27:00Z">
               <w:tcPr>
                 <w:tcW w:w="0" w:type="auto"/>
               </w:tcPr>
@@ -9649,7 +9613,7 @@
       <w:tr>
         <w:trPr>
           <w:tblCellSpacing w:w="15" w:type="dxa"/>
-          <w:trPrChange w:id="78" w:author="Jaeger, Florian" w:date="2025-05-21T14:27:00Z" w16du:dateUtc="2025-05-21T18:27:00Z">
+          <w:trPrChange w:id="79" w:author="Jaeger, Florian" w:date="2025-05-21T14:27:00Z" w16du:dateUtc="2025-05-21T18:27:00Z">
             <w:trPr>
               <w:gridBefore w:val="1"/>
               <w:tblCellSpacing w:w="15" w:type="dxa"/>
@@ -9660,7 +9624,7 @@
           <w:tcPr>
             <w:tcW w:w="2609" w:type="dxa"/>
             <w:vAlign w:val="center"/>
-            <w:tcPrChange w:id="79" w:author="Jaeger, Florian" w:date="2025-05-21T14:27:00Z" w16du:dateUtc="2025-05-21T18:27:00Z">
+            <w:tcPrChange w:id="80" w:author="Jaeger, Florian" w:date="2025-05-21T14:27:00Z" w16du:dateUtc="2025-05-21T18:27:00Z">
               <w:tcPr>
                 <w:tcW w:w="0" w:type="auto"/>
                 <w:vAlign w:val="center"/>
@@ -9700,53 +9664,11 @@
               <w:right w:val="single" w:sz="4" w:space="0" w:color="auto"/>
             </w:tcBorders>
             <w:vAlign w:val="center"/>
-            <w:tcPrChange w:id="80" w:author="Jaeger, Florian" w:date="2025-05-21T14:27:00Z" w16du:dateUtc="2025-05-21T18:27:00Z">
+            <w:tcPrChange w:id="81" w:author="Jaeger, Florian" w:date="2025-05-21T14:27:00Z" w16du:dateUtc="2025-05-21T18:27:00Z">
               <w:tcPr>
                 <w:tcW w:w="0" w:type="auto"/>
                 <w:tcBorders>
                   <w:left w:val="single" w:sz="4" w:space="0" w:color="auto"/>
-                  <w:right w:val="single" w:sz="4" w:space="0" w:color="auto"/>
-                </w:tcBorders>
-                <w:vAlign w:val="center"/>
-              </w:tcPr>
-            </w:tcPrChange>
-          </w:tcPr>
-          <w:p>
-            <w:pPr>
-              <w:widowControl/>
-              <w:autoSpaceDE/>
-              <w:autoSpaceDN/>
-              <w:adjustRightInd/>
-              <w:spacing w:line="240" w:lineRule="auto"/>
-              <w:ind w:firstLine="0"/>
-              <w:jc w:val="left"/>
-              <w:rPr>
-                <w:rFonts w:eastAsia="Times New Roman"/>
-                <w:sz w:val="24"/>
-                <w:lang w:eastAsia="en-US"/>
-              </w:rPr>
-            </w:pPr>
-            <w:r>
-              <w:rPr>
-                <w:rFonts w:eastAsia="Times New Roman"/>
-                <w:sz w:val="24"/>
-                <w:lang w:eastAsia="en-US"/>
-              </w:rPr>
-              <w:t>-</w:t>
-            </w:r>
-          </w:p>
-        </w:tc>
-        <w:tc>
-          <w:tcPr>
-            <w:tcW w:w="0" w:type="auto"/>
-            <w:tcBorders>
-              <w:right w:val="single" w:sz="4" w:space="0" w:color="auto"/>
-            </w:tcBorders>
-            <w:vAlign w:val="center"/>
-            <w:tcPrChange w:id="81" w:author="Jaeger, Florian" w:date="2025-05-21T14:27:00Z" w16du:dateUtc="2025-05-21T18:27:00Z">
-              <w:tcPr>
-                <w:tcW w:w="0" w:type="auto"/>
-                <w:tcBorders>
                   <w:right w:val="single" w:sz="4" w:space="0" w:color="auto"/>
                 </w:tcBorders>
                 <w:vAlign w:val="center"/>
@@ -9826,7 +9748,49 @@
             <w:tcBorders>
               <w:right w:val="single" w:sz="4" w:space="0" w:color="auto"/>
             </w:tcBorders>
+            <w:vAlign w:val="center"/>
             <w:tcPrChange w:id="83" w:author="Jaeger, Florian" w:date="2025-05-21T14:27:00Z" w16du:dateUtc="2025-05-21T18:27:00Z">
+              <w:tcPr>
+                <w:tcW w:w="0" w:type="auto"/>
+                <w:tcBorders>
+                  <w:right w:val="single" w:sz="4" w:space="0" w:color="auto"/>
+                </w:tcBorders>
+                <w:vAlign w:val="center"/>
+              </w:tcPr>
+            </w:tcPrChange>
+          </w:tcPr>
+          <w:p>
+            <w:pPr>
+              <w:widowControl/>
+              <w:autoSpaceDE/>
+              <w:autoSpaceDN/>
+              <w:adjustRightInd/>
+              <w:spacing w:line="240" w:lineRule="auto"/>
+              <w:ind w:firstLine="0"/>
+              <w:jc w:val="left"/>
+              <w:rPr>
+                <w:rFonts w:eastAsia="Times New Roman"/>
+                <w:sz w:val="24"/>
+                <w:lang w:eastAsia="en-US"/>
+              </w:rPr>
+            </w:pPr>
+            <w:r>
+              <w:rPr>
+                <w:rFonts w:eastAsia="Times New Roman"/>
+                <w:sz w:val="24"/>
+                <w:lang w:eastAsia="en-US"/>
+              </w:rPr>
+              <w:t>-</w:t>
+            </w:r>
+          </w:p>
+        </w:tc>
+        <w:tc>
+          <w:tcPr>
+            <w:tcW w:w="0" w:type="auto"/>
+            <w:tcBorders>
+              <w:right w:val="single" w:sz="4" w:space="0" w:color="auto"/>
+            </w:tcBorders>
+            <w:tcPrChange w:id="84" w:author="Jaeger, Florian" w:date="2025-05-21T14:27:00Z" w16du:dateUtc="2025-05-21T18:27:00Z">
               <w:tcPr>
                 <w:tcW w:w="0" w:type="auto"/>
                 <w:tcBorders>
@@ -9863,7 +9827,7 @@
         <w:tc>
           <w:tcPr>
             <w:tcW w:w="0" w:type="auto"/>
-            <w:tcPrChange w:id="84" w:author="Jaeger, Florian" w:date="2025-05-21T14:27:00Z" w16du:dateUtc="2025-05-21T18:27:00Z">
+            <w:tcPrChange w:id="85" w:author="Jaeger, Florian" w:date="2025-05-21T14:27:00Z" w16du:dateUtc="2025-05-21T18:27:00Z">
               <w:tcPr>
                 <w:tcW w:w="0" w:type="auto"/>
               </w:tcPr>
@@ -9898,8 +9862,8 @@
       <w:tr>
         <w:trPr>
           <w:tblCellSpacing w:w="15" w:type="dxa"/>
-          <w:del w:id="85" w:author="Jaeger, Florian" w:date="2025-05-21T14:27:00Z" w16du:dateUtc="2025-05-21T18:27:00Z"/>
-          <w:trPrChange w:id="86" w:author="Jaeger, Florian" w:date="2025-05-21T14:27:00Z" w16du:dateUtc="2025-05-21T18:27:00Z">
+          <w:del w:id="86" w:author="Jaeger, Florian" w:date="2025-05-21T14:27:00Z"/>
+          <w:trPrChange w:id="87" w:author="Jaeger, Florian" w:date="2025-05-21T14:27:00Z" w16du:dateUtc="2025-05-21T18:27:00Z">
             <w:trPr>
               <w:gridBefore w:val="1"/>
               <w:tblCellSpacing w:w="15" w:type="dxa"/>
@@ -9911,7 +9875,7 @@
             <w:tcW w:w="2609" w:type="dxa"/>
             <w:vAlign w:val="center"/>
             <w:hideMark/>
-            <w:tcPrChange w:id="87" w:author="Jaeger, Florian" w:date="2025-05-21T14:27:00Z" w16du:dateUtc="2025-05-21T18:27:00Z">
+            <w:tcPrChange w:id="88" w:author="Jaeger, Florian" w:date="2025-05-21T14:27:00Z" w16du:dateUtc="2025-05-21T18:27:00Z">
               <w:tcPr>
                 <w:tcW w:w="0" w:type="auto"/>
                 <w:vAlign w:val="center"/>
@@ -9929,13 +9893,13 @@
               <w:ind w:firstLine="0"/>
               <w:jc w:val="left"/>
               <w:rPr>
-                <w:del w:id="88" w:author="Jaeger, Florian" w:date="2025-05-21T14:27:00Z" w16du:dateUtc="2025-05-21T18:27:00Z"/>
+                <w:del w:id="89" w:author="Jaeger, Florian" w:date="2025-05-21T14:27:00Z" w16du:dateUtc="2025-05-21T18:27:00Z"/>
                 <w:rFonts w:eastAsia="Times New Roman"/>
                 <w:sz w:val="24"/>
                 <w:lang w:eastAsia="en-US"/>
               </w:rPr>
             </w:pPr>
-            <w:del w:id="89" w:author="Jaeger, Florian" w:date="2025-05-21T14:27:00Z" w16du:dateUtc="2025-05-21T18:27:00Z">
+            <w:del w:id="90" w:author="Jaeger, Florian" w:date="2025-05-21T14:27:00Z" w16du:dateUtc="2025-05-21T18:27:00Z">
               <w:r>
                 <w:rPr>
                   <w:rFonts w:eastAsia="Times New Roman"/>
@@ -9956,7 +9920,7 @@
             </w:tcBorders>
             <w:vAlign w:val="center"/>
             <w:hideMark/>
-            <w:tcPrChange w:id="90" w:author="Jaeger, Florian" w:date="2025-05-21T14:27:00Z" w16du:dateUtc="2025-05-21T18:27:00Z">
+            <w:tcPrChange w:id="91" w:author="Jaeger, Florian" w:date="2025-05-21T14:27:00Z" w16du:dateUtc="2025-05-21T18:27:00Z">
               <w:tcPr>
                 <w:tcW w:w="0" w:type="auto"/>
                 <w:tcBorders>
@@ -9978,13 +9942,13 @@
               <w:ind w:firstLine="0"/>
               <w:jc w:val="left"/>
               <w:rPr>
-                <w:del w:id="91" w:author="Jaeger, Florian" w:date="2025-05-21T14:27:00Z" w16du:dateUtc="2025-05-21T18:27:00Z"/>
+                <w:del w:id="92" w:author="Jaeger, Florian" w:date="2025-05-21T14:27:00Z" w16du:dateUtc="2025-05-21T18:27:00Z"/>
                 <w:rFonts w:eastAsia="Times New Roman"/>
                 <w:sz w:val="24"/>
                 <w:lang w:eastAsia="en-US"/>
               </w:rPr>
             </w:pPr>
-            <w:del w:id="92" w:author="Jaeger, Florian" w:date="2025-05-21T14:27:00Z" w16du:dateUtc="2025-05-21T18:27:00Z">
+            <w:del w:id="93" w:author="Jaeger, Florian" w:date="2025-05-21T14:27:00Z" w16du:dateUtc="2025-05-21T18:27:00Z">
               <w:r>
                 <w:rPr>
                   <w:rFonts w:eastAsia="Times New Roman"/>
@@ -10004,7 +9968,7 @@
             </w:tcBorders>
             <w:vAlign w:val="center"/>
             <w:hideMark/>
-            <w:tcPrChange w:id="93" w:author="Jaeger, Florian" w:date="2025-05-21T14:27:00Z" w16du:dateUtc="2025-05-21T18:27:00Z">
+            <w:tcPrChange w:id="94" w:author="Jaeger, Florian" w:date="2025-05-21T14:27:00Z" w16du:dateUtc="2025-05-21T18:27:00Z">
               <w:tcPr>
                 <w:tcW w:w="0" w:type="auto"/>
                 <w:tcBorders>
@@ -10025,13 +9989,13 @@
               <w:ind w:firstLine="0"/>
               <w:jc w:val="left"/>
               <w:rPr>
-                <w:del w:id="94" w:author="Jaeger, Florian" w:date="2025-05-21T14:27:00Z" w16du:dateUtc="2025-05-21T18:27:00Z"/>
+                <w:del w:id="95" w:author="Jaeger, Florian" w:date="2025-05-21T14:27:00Z" w16du:dateUtc="2025-05-21T18:27:00Z"/>
                 <w:rFonts w:eastAsia="Times New Roman"/>
                 <w:sz w:val="24"/>
                 <w:lang w:eastAsia="en-US"/>
               </w:rPr>
             </w:pPr>
-            <w:del w:id="95" w:author="Jaeger, Florian" w:date="2025-05-21T14:27:00Z" w16du:dateUtc="2025-05-21T18:27:00Z">
+            <w:del w:id="96" w:author="Jaeger, Florian" w:date="2025-05-21T14:27:00Z" w16du:dateUtc="2025-05-21T18:27:00Z">
               <w:r>
                 <w:rPr>
                   <w:rFonts w:eastAsia="Times New Roman"/>
@@ -10051,7 +10015,7 @@
             </w:tcBorders>
             <w:vAlign w:val="center"/>
             <w:hideMark/>
-            <w:tcPrChange w:id="96" w:author="Jaeger, Florian" w:date="2025-05-21T14:27:00Z" w16du:dateUtc="2025-05-21T18:27:00Z">
+            <w:tcPrChange w:id="97" w:author="Jaeger, Florian" w:date="2025-05-21T14:27:00Z" w16du:dateUtc="2025-05-21T18:27:00Z">
               <w:tcPr>
                 <w:tcW w:w="0" w:type="auto"/>
                 <w:tcBorders>
@@ -10072,13 +10036,13 @@
               <w:ind w:firstLine="0"/>
               <w:jc w:val="left"/>
               <w:rPr>
-                <w:del w:id="97" w:author="Jaeger, Florian" w:date="2025-05-21T14:27:00Z" w16du:dateUtc="2025-05-21T18:27:00Z"/>
+                <w:del w:id="98" w:author="Jaeger, Florian" w:date="2025-05-21T14:27:00Z" w16du:dateUtc="2025-05-21T18:27:00Z"/>
                 <w:rFonts w:eastAsia="Times New Roman"/>
                 <w:sz w:val="24"/>
                 <w:lang w:eastAsia="en-US"/>
               </w:rPr>
             </w:pPr>
-            <w:del w:id="98" w:author="Jaeger, Florian" w:date="2025-05-21T14:27:00Z" w16du:dateUtc="2025-05-21T18:27:00Z">
+            <w:del w:id="99" w:author="Jaeger, Florian" w:date="2025-05-21T14:27:00Z" w16du:dateUtc="2025-05-21T18:27:00Z">
               <w:r>
                 <w:rPr>
                   <w:rFonts w:eastAsia="Times New Roman"/>
@@ -10096,7 +10060,7 @@
             <w:tcBorders>
               <w:right w:val="single" w:sz="4" w:space="0" w:color="auto"/>
             </w:tcBorders>
-            <w:tcPrChange w:id="99" w:author="Jaeger, Florian" w:date="2025-05-21T14:27:00Z" w16du:dateUtc="2025-05-21T18:27:00Z">
+            <w:tcPrChange w:id="100" w:author="Jaeger, Florian" w:date="2025-05-21T14:27:00Z" w16du:dateUtc="2025-05-21T18:27:00Z">
               <w:tcPr>
                 <w:tcW w:w="0" w:type="auto"/>
                 <w:tcBorders>
@@ -10115,13 +10079,13 @@
               <w:ind w:firstLine="0"/>
               <w:jc w:val="left"/>
               <w:rPr>
-                <w:del w:id="100" w:author="Jaeger, Florian" w:date="2025-05-21T14:27:00Z" w16du:dateUtc="2025-05-21T18:27:00Z"/>
+                <w:del w:id="101" w:author="Jaeger, Florian" w:date="2025-05-21T14:27:00Z" w16du:dateUtc="2025-05-21T18:27:00Z"/>
                 <w:rFonts w:eastAsia="Times New Roman"/>
                 <w:sz w:val="24"/>
                 <w:lang w:eastAsia="en-US"/>
               </w:rPr>
             </w:pPr>
-            <w:del w:id="101" w:author="Jaeger, Florian" w:date="2025-05-21T14:27:00Z" w16du:dateUtc="2025-05-21T18:27:00Z">
+            <w:del w:id="102" w:author="Jaeger, Florian" w:date="2025-05-21T14:27:00Z" w16du:dateUtc="2025-05-21T18:27:00Z">
               <w:r>
                 <w:rPr>
                   <w:rFonts w:eastAsia="Times New Roman"/>
@@ -10136,7 +10100,7 @@
         <w:tc>
           <w:tcPr>
             <w:tcW w:w="0" w:type="auto"/>
-            <w:tcPrChange w:id="102" w:author="Jaeger, Florian" w:date="2025-05-21T14:27:00Z" w16du:dateUtc="2025-05-21T18:27:00Z">
+            <w:tcPrChange w:id="103" w:author="Jaeger, Florian" w:date="2025-05-21T14:27:00Z" w16du:dateUtc="2025-05-21T18:27:00Z">
               <w:tcPr>
                 <w:tcW w:w="0" w:type="auto"/>
               </w:tcPr>
@@ -10152,13 +10116,13 @@
               <w:ind w:firstLine="0"/>
               <w:jc w:val="left"/>
               <w:rPr>
-                <w:del w:id="103" w:author="Jaeger, Florian" w:date="2025-05-21T14:27:00Z" w16du:dateUtc="2025-05-21T18:27:00Z"/>
+                <w:del w:id="104" w:author="Jaeger, Florian" w:date="2025-05-21T14:27:00Z" w16du:dateUtc="2025-05-21T18:27:00Z"/>
                 <w:rFonts w:eastAsia="Times New Roman"/>
                 <w:sz w:val="24"/>
                 <w:lang w:eastAsia="en-US"/>
               </w:rPr>
             </w:pPr>
-            <w:del w:id="104" w:author="Jaeger, Florian" w:date="2025-05-21T14:27:00Z" w16du:dateUtc="2025-05-21T18:27:00Z">
+            <w:del w:id="105" w:author="Jaeger, Florian" w:date="2025-05-21T14:27:00Z" w16du:dateUtc="2025-05-21T18:27:00Z">
               <w:r>
                 <w:rPr>
                   <w:rFonts w:eastAsia="Times New Roman"/>
@@ -10174,7 +10138,7 @@
       <w:tr>
         <w:trPr>
           <w:tblCellSpacing w:w="15" w:type="dxa"/>
-          <w:trPrChange w:id="105" w:author="Jaeger, Florian" w:date="2025-05-21T14:27:00Z" w16du:dateUtc="2025-05-21T18:27:00Z">
+          <w:trPrChange w:id="106" w:author="Jaeger, Florian" w:date="2025-05-21T14:27:00Z" w16du:dateUtc="2025-05-21T18:27:00Z">
             <w:trPr>
               <w:gridBefore w:val="1"/>
               <w:tblCellSpacing w:w="15" w:type="dxa"/>
@@ -10186,7 +10150,7 @@
             <w:tcW w:w="2609" w:type="dxa"/>
             <w:vAlign w:val="center"/>
             <w:hideMark/>
-            <w:tcPrChange w:id="106" w:author="Jaeger, Florian" w:date="2025-05-21T14:27:00Z" w16du:dateUtc="2025-05-21T18:27:00Z">
+            <w:tcPrChange w:id="107" w:author="Jaeger, Florian" w:date="2025-05-21T14:27:00Z" w16du:dateUtc="2025-05-21T18:27:00Z">
               <w:tcPr>
                 <w:tcW w:w="0" w:type="auto"/>
                 <w:vAlign w:val="center"/>
@@ -10228,7 +10192,7 @@
             </w:tcBorders>
             <w:vAlign w:val="center"/>
             <w:hideMark/>
-            <w:tcPrChange w:id="107" w:author="Jaeger, Florian" w:date="2025-05-21T14:27:00Z" w16du:dateUtc="2025-05-21T18:27:00Z">
+            <w:tcPrChange w:id="108" w:author="Jaeger, Florian" w:date="2025-05-21T14:27:00Z" w16du:dateUtc="2025-05-21T18:27:00Z">
               <w:tcPr>
                 <w:tcW w:w="0" w:type="auto"/>
                 <w:tcBorders>
@@ -10262,50 +10226,6 @@
                 <w:lang w:eastAsia="en-US"/>
               </w:rPr>
               <w:t>3 (4.7%)</w:t>
-            </w:r>
-          </w:p>
-        </w:tc>
-        <w:tc>
-          <w:tcPr>
-            <w:tcW w:w="0" w:type="auto"/>
-            <w:tcBorders>
-              <w:right w:val="single" w:sz="4" w:space="0" w:color="auto"/>
-            </w:tcBorders>
-            <w:vAlign w:val="center"/>
-            <w:hideMark/>
-            <w:tcPrChange w:id="108" w:author="Jaeger, Florian" w:date="2025-05-21T14:27:00Z" w16du:dateUtc="2025-05-21T18:27:00Z">
-              <w:tcPr>
-                <w:tcW w:w="0" w:type="auto"/>
-                <w:tcBorders>
-                  <w:right w:val="single" w:sz="4" w:space="0" w:color="auto"/>
-                </w:tcBorders>
-                <w:vAlign w:val="center"/>
-                <w:hideMark/>
-              </w:tcPr>
-            </w:tcPrChange>
-          </w:tcPr>
-          <w:p>
-            <w:pPr>
-              <w:widowControl/>
-              <w:autoSpaceDE/>
-              <w:autoSpaceDN/>
-              <w:adjustRightInd/>
-              <w:spacing w:line="240" w:lineRule="auto"/>
-              <w:ind w:firstLine="0"/>
-              <w:jc w:val="left"/>
-              <w:rPr>
-                <w:rFonts w:eastAsia="Times New Roman"/>
-                <w:sz w:val="24"/>
-                <w:lang w:eastAsia="en-US"/>
-              </w:rPr>
-            </w:pPr>
-            <w:r>
-              <w:rPr>
-                <w:rFonts w:eastAsia="Times New Roman"/>
-                <w:sz w:val="24"/>
-                <w:lang w:eastAsia="en-US"/>
-              </w:rPr>
-              <w:t>-</w:t>
             </w:r>
           </w:p>
         </w:tc>
@@ -10359,7 +10279,51 @@
             <w:tcBorders>
               <w:right w:val="single" w:sz="4" w:space="0" w:color="auto"/>
             </w:tcBorders>
+            <w:vAlign w:val="center"/>
+            <w:hideMark/>
             <w:tcPrChange w:id="110" w:author="Jaeger, Florian" w:date="2025-05-21T14:27:00Z" w16du:dateUtc="2025-05-21T18:27:00Z">
+              <w:tcPr>
+                <w:tcW w:w="0" w:type="auto"/>
+                <w:tcBorders>
+                  <w:right w:val="single" w:sz="4" w:space="0" w:color="auto"/>
+                </w:tcBorders>
+                <w:vAlign w:val="center"/>
+                <w:hideMark/>
+              </w:tcPr>
+            </w:tcPrChange>
+          </w:tcPr>
+          <w:p>
+            <w:pPr>
+              <w:widowControl/>
+              <w:autoSpaceDE/>
+              <w:autoSpaceDN/>
+              <w:adjustRightInd/>
+              <w:spacing w:line="240" w:lineRule="auto"/>
+              <w:ind w:firstLine="0"/>
+              <w:jc w:val="left"/>
+              <w:rPr>
+                <w:rFonts w:eastAsia="Times New Roman"/>
+                <w:sz w:val="24"/>
+                <w:lang w:eastAsia="en-US"/>
+              </w:rPr>
+            </w:pPr>
+            <w:r>
+              <w:rPr>
+                <w:rFonts w:eastAsia="Times New Roman"/>
+                <w:sz w:val="24"/>
+                <w:lang w:eastAsia="en-US"/>
+              </w:rPr>
+              <w:t>-</w:t>
+            </w:r>
+          </w:p>
+        </w:tc>
+        <w:tc>
+          <w:tcPr>
+            <w:tcW w:w="0" w:type="auto"/>
+            <w:tcBorders>
+              <w:right w:val="single" w:sz="4" w:space="0" w:color="auto"/>
+            </w:tcBorders>
+            <w:tcPrChange w:id="111" w:author="Jaeger, Florian" w:date="2025-05-21T14:27:00Z" w16du:dateUtc="2025-05-21T18:27:00Z">
               <w:tcPr>
                 <w:tcW w:w="0" w:type="auto"/>
                 <w:tcBorders>
@@ -10396,7 +10360,7 @@
         <w:tc>
           <w:tcPr>
             <w:tcW w:w="0" w:type="auto"/>
-            <w:tcPrChange w:id="111" w:author="Jaeger, Florian" w:date="2025-05-21T14:27:00Z" w16du:dateUtc="2025-05-21T18:27:00Z">
+            <w:tcPrChange w:id="112" w:author="Jaeger, Florian" w:date="2025-05-21T14:27:00Z" w16du:dateUtc="2025-05-21T18:27:00Z">
               <w:tcPr>
                 <w:tcW w:w="0" w:type="auto"/>
               </w:tcPr>
@@ -10431,7 +10395,7 @@
       <w:tr>
         <w:trPr>
           <w:tblCellSpacing w:w="15" w:type="dxa"/>
-          <w:trPrChange w:id="112" w:author="Jaeger, Florian" w:date="2025-05-21T14:27:00Z" w16du:dateUtc="2025-05-21T18:27:00Z">
+          <w:trPrChange w:id="113" w:author="Jaeger, Florian" w:date="2025-05-21T14:27:00Z" w16du:dateUtc="2025-05-21T18:27:00Z">
             <w:trPr>
               <w:gridBefore w:val="1"/>
               <w:tblCellSpacing w:w="15" w:type="dxa"/>
@@ -10446,7 +10410,7 @@
             </w:tcBorders>
             <w:vAlign w:val="center"/>
             <w:hideMark/>
-            <w:tcPrChange w:id="113" w:author="Jaeger, Florian" w:date="2025-05-21T14:27:00Z" w16du:dateUtc="2025-05-21T18:27:00Z">
+            <w:tcPrChange w:id="114" w:author="Jaeger, Florian" w:date="2025-05-21T14:27:00Z" w16du:dateUtc="2025-05-21T18:27:00Z">
               <w:tcPr>
                 <w:tcW w:w="0" w:type="auto"/>
                 <w:tcBorders>
@@ -10500,7 +10464,7 @@
             </w:tcBorders>
             <w:vAlign w:val="center"/>
             <w:hideMark/>
-            <w:tcPrChange w:id="114" w:author="Jaeger, Florian" w:date="2025-05-21T14:27:00Z" w16du:dateUtc="2025-05-21T18:27:00Z">
+            <w:tcPrChange w:id="115" w:author="Jaeger, Florian" w:date="2025-05-21T14:27:00Z" w16du:dateUtc="2025-05-21T18:27:00Z">
               <w:tcPr>
                 <w:tcW w:w="0" w:type="auto"/>
                 <w:tcBorders>
@@ -10528,53 +10492,7 @@
                 <w:lang w:eastAsia="en-US"/>
               </w:rPr>
             </w:pPr>
-            <w:commentRangeStart w:id="115"/>
-            <w:r>
-              <w:rPr>
-                <w:rFonts w:eastAsia="Times New Roman"/>
-                <w:sz w:val="24"/>
-                <w:lang w:eastAsia="en-US"/>
-              </w:rPr>
-              <w:t>-</w:t>
-            </w:r>
-          </w:p>
-        </w:tc>
-        <w:tc>
-          <w:tcPr>
-            <w:tcW w:w="0" w:type="auto"/>
-            <w:tcBorders>
-              <w:bottom w:val="single" w:sz="4" w:space="0" w:color="auto"/>
-              <w:right w:val="single" w:sz="4" w:space="0" w:color="auto"/>
-            </w:tcBorders>
-            <w:vAlign w:val="center"/>
-            <w:hideMark/>
-            <w:tcPrChange w:id="116" w:author="Jaeger, Florian" w:date="2025-05-21T14:27:00Z" w16du:dateUtc="2025-05-21T18:27:00Z">
-              <w:tcPr>
-                <w:tcW w:w="0" w:type="auto"/>
-                <w:tcBorders>
-                  <w:bottom w:val="single" w:sz="4" w:space="0" w:color="auto"/>
-                  <w:right w:val="single" w:sz="4" w:space="0" w:color="auto"/>
-                </w:tcBorders>
-                <w:vAlign w:val="center"/>
-                <w:hideMark/>
-              </w:tcPr>
-            </w:tcPrChange>
-          </w:tcPr>
-          <w:p>
-            <w:pPr>
-              <w:widowControl/>
-              <w:autoSpaceDE/>
-              <w:autoSpaceDN/>
-              <w:adjustRightInd/>
-              <w:spacing w:line="240" w:lineRule="auto"/>
-              <w:ind w:firstLine="0"/>
-              <w:jc w:val="left"/>
-              <w:rPr>
-                <w:rFonts w:eastAsia="Times New Roman"/>
-                <w:sz w:val="24"/>
-                <w:lang w:eastAsia="en-US"/>
-              </w:rPr>
-            </w:pPr>
+            <w:commentRangeStart w:id="116"/>
             <w:r>
               <w:rPr>
                 <w:rFonts w:eastAsia="Times New Roman"/>
@@ -10638,7 +10556,53 @@
               <w:bottom w:val="single" w:sz="4" w:space="0" w:color="auto"/>
               <w:right w:val="single" w:sz="4" w:space="0" w:color="auto"/>
             </w:tcBorders>
+            <w:vAlign w:val="center"/>
+            <w:hideMark/>
             <w:tcPrChange w:id="118" w:author="Jaeger, Florian" w:date="2025-05-21T14:27:00Z" w16du:dateUtc="2025-05-21T18:27:00Z">
+              <w:tcPr>
+                <w:tcW w:w="0" w:type="auto"/>
+                <w:tcBorders>
+                  <w:bottom w:val="single" w:sz="4" w:space="0" w:color="auto"/>
+                  <w:right w:val="single" w:sz="4" w:space="0" w:color="auto"/>
+                </w:tcBorders>
+                <w:vAlign w:val="center"/>
+                <w:hideMark/>
+              </w:tcPr>
+            </w:tcPrChange>
+          </w:tcPr>
+          <w:p>
+            <w:pPr>
+              <w:widowControl/>
+              <w:autoSpaceDE/>
+              <w:autoSpaceDN/>
+              <w:adjustRightInd/>
+              <w:spacing w:line="240" w:lineRule="auto"/>
+              <w:ind w:firstLine="0"/>
+              <w:jc w:val="left"/>
+              <w:rPr>
+                <w:rFonts w:eastAsia="Times New Roman"/>
+                <w:sz w:val="24"/>
+                <w:lang w:eastAsia="en-US"/>
+              </w:rPr>
+            </w:pPr>
+            <w:r>
+              <w:rPr>
+                <w:rFonts w:eastAsia="Times New Roman"/>
+                <w:sz w:val="24"/>
+                <w:lang w:eastAsia="en-US"/>
+              </w:rPr>
+              <w:t>-</w:t>
+            </w:r>
+          </w:p>
+        </w:tc>
+        <w:tc>
+          <w:tcPr>
+            <w:tcW w:w="0" w:type="auto"/>
+            <w:tcBorders>
+              <w:bottom w:val="single" w:sz="4" w:space="0" w:color="auto"/>
+              <w:right w:val="single" w:sz="4" w:space="0" w:color="auto"/>
+            </w:tcBorders>
+            <w:tcPrChange w:id="119" w:author="Jaeger, Florian" w:date="2025-05-21T14:27:00Z" w16du:dateUtc="2025-05-21T18:27:00Z">
               <w:tcPr>
                 <w:tcW w:w="0" w:type="auto"/>
                 <w:tcBorders>
@@ -10679,7 +10643,7 @@
             <w:tcBorders>
               <w:bottom w:val="single" w:sz="4" w:space="0" w:color="auto"/>
             </w:tcBorders>
-            <w:tcPrChange w:id="119" w:author="Jaeger, Florian" w:date="2025-05-21T14:27:00Z" w16du:dateUtc="2025-05-21T18:27:00Z">
+            <w:tcPrChange w:id="120" w:author="Jaeger, Florian" w:date="2025-05-21T14:27:00Z" w16du:dateUtc="2025-05-21T18:27:00Z">
               <w:tcPr>
                 <w:tcW w:w="0" w:type="auto"/>
                 <w:tcBorders>
@@ -10711,12 +10675,12 @@
               </w:rPr>
               <w:t>-</w:t>
             </w:r>
-            <w:commentRangeEnd w:id="115"/>
+            <w:commentRangeEnd w:id="116"/>
             <w:r>
               <w:rPr>
                 <w:rStyle w:val="CommentReference"/>
               </w:rPr>
-              <w:commentReference w:id="115"/>
+              <w:commentReference w:id="116"/>
             </w:r>
           </w:p>
         </w:tc>
@@ -10724,7 +10688,7 @@
       <w:tr>
         <w:trPr>
           <w:tblCellSpacing w:w="15" w:type="dxa"/>
-          <w:trPrChange w:id="120" w:author="Jaeger, Florian" w:date="2025-05-21T14:27:00Z" w16du:dateUtc="2025-05-21T18:27:00Z">
+          <w:trPrChange w:id="121" w:author="Jaeger, Florian" w:date="2025-05-21T14:27:00Z" w16du:dateUtc="2025-05-21T18:27:00Z">
             <w:trPr>
               <w:gridBefore w:val="1"/>
               <w:tblCellSpacing w:w="15" w:type="dxa"/>
@@ -10739,7 +10703,7 @@
             </w:tcBorders>
             <w:vAlign w:val="center"/>
             <w:hideMark/>
-            <w:tcPrChange w:id="121" w:author="Jaeger, Florian" w:date="2025-05-21T14:27:00Z" w16du:dateUtc="2025-05-21T18:27:00Z">
+            <w:tcPrChange w:id="122" w:author="Jaeger, Florian" w:date="2025-05-21T14:27:00Z" w16du:dateUtc="2025-05-21T18:27:00Z">
               <w:tcPr>
                 <w:tcW w:w="0" w:type="auto"/>
                 <w:tcBorders>
@@ -10789,7 +10753,7 @@
             </w:tcBorders>
             <w:vAlign w:val="center"/>
             <w:hideMark/>
-            <w:tcPrChange w:id="122" w:author="Jaeger, Florian" w:date="2025-05-21T14:27:00Z" w16du:dateUtc="2025-05-21T18:27:00Z">
+            <w:tcPrChange w:id="123" w:author="Jaeger, Florian" w:date="2025-05-21T14:27:00Z" w16du:dateUtc="2025-05-21T18:27:00Z">
               <w:tcPr>
                 <w:tcW w:w="0" w:type="auto"/>
                 <w:tcBorders>
@@ -10828,56 +10792,6 @@
                 <w:lang w:eastAsia="en-US"/>
               </w:rPr>
               <w:t>4 (6.2%)</w:t>
-            </w:r>
-          </w:p>
-        </w:tc>
-        <w:tc>
-          <w:tcPr>
-            <w:tcW w:w="0" w:type="auto"/>
-            <w:tcBorders>
-              <w:top w:val="single" w:sz="18" w:space="0" w:color="auto"/>
-              <w:right w:val="single" w:sz="4" w:space="0" w:color="auto"/>
-            </w:tcBorders>
-            <w:vAlign w:val="center"/>
-            <w:hideMark/>
-            <w:tcPrChange w:id="123" w:author="Jaeger, Florian" w:date="2025-05-21T14:27:00Z" w16du:dateUtc="2025-05-21T18:27:00Z">
-              <w:tcPr>
-                <w:tcW w:w="0" w:type="auto"/>
-                <w:tcBorders>
-                  <w:top w:val="single" w:sz="18" w:space="0" w:color="auto"/>
-                  <w:right w:val="single" w:sz="4" w:space="0" w:color="auto"/>
-                </w:tcBorders>
-                <w:vAlign w:val="center"/>
-                <w:hideMark/>
-              </w:tcPr>
-            </w:tcPrChange>
-          </w:tcPr>
-          <w:p>
-            <w:pPr>
-              <w:widowControl/>
-              <w:autoSpaceDE/>
-              <w:autoSpaceDN/>
-              <w:adjustRightInd/>
-              <w:spacing w:line="240" w:lineRule="auto"/>
-              <w:ind w:firstLine="0"/>
-              <w:jc w:val="left"/>
-              <w:rPr>
-                <w:rFonts w:eastAsia="Times New Roman"/>
-                <w:i/>
-                <w:iCs/>
-                <w:sz w:val="24"/>
-                <w:lang w:eastAsia="en-US"/>
-              </w:rPr>
-            </w:pPr>
-            <w:r>
-              <w:rPr>
-                <w:rFonts w:eastAsia="Times New Roman"/>
-                <w:i/>
-                <w:iCs/>
-                <w:sz w:val="24"/>
-                <w:lang w:eastAsia="en-US"/>
-              </w:rPr>
-              <w:t>6 (9.4%)</w:t>
             </w:r>
           </w:p>
         </w:tc>
@@ -10927,17 +10841,7 @@
                 <w:sz w:val="24"/>
                 <w:lang w:eastAsia="en-US"/>
               </w:rPr>
-              <w:t>5</w:t>
-            </w:r>
-            <w:r>
-              <w:rPr>
-                <w:rFonts w:eastAsia="Times New Roman"/>
-                <w:i/>
-                <w:iCs/>
-                <w:sz w:val="24"/>
-                <w:lang w:eastAsia="en-US"/>
-              </w:rPr>
-              <w:t xml:space="preserve"> (7.8%)</w:t>
+              <w:t>6 (9.4%)</w:t>
             </w:r>
           </w:p>
         </w:tc>
@@ -10948,7 +10852,67 @@
               <w:top w:val="single" w:sz="18" w:space="0" w:color="auto"/>
               <w:right w:val="single" w:sz="4" w:space="0" w:color="auto"/>
             </w:tcBorders>
+            <w:vAlign w:val="center"/>
+            <w:hideMark/>
             <w:tcPrChange w:id="125" w:author="Jaeger, Florian" w:date="2025-05-21T14:27:00Z" w16du:dateUtc="2025-05-21T18:27:00Z">
+              <w:tcPr>
+                <w:tcW w:w="0" w:type="auto"/>
+                <w:tcBorders>
+                  <w:top w:val="single" w:sz="18" w:space="0" w:color="auto"/>
+                  <w:right w:val="single" w:sz="4" w:space="0" w:color="auto"/>
+                </w:tcBorders>
+                <w:vAlign w:val="center"/>
+                <w:hideMark/>
+              </w:tcPr>
+            </w:tcPrChange>
+          </w:tcPr>
+          <w:p>
+            <w:pPr>
+              <w:widowControl/>
+              <w:autoSpaceDE/>
+              <w:autoSpaceDN/>
+              <w:adjustRightInd/>
+              <w:spacing w:line="240" w:lineRule="auto"/>
+              <w:ind w:firstLine="0"/>
+              <w:jc w:val="left"/>
+              <w:rPr>
+                <w:rFonts w:eastAsia="Times New Roman"/>
+                <w:i/>
+                <w:iCs/>
+                <w:sz w:val="24"/>
+                <w:lang w:eastAsia="en-US"/>
+              </w:rPr>
+            </w:pPr>
+            <w:r>
+              <w:rPr>
+                <w:rFonts w:eastAsia="Times New Roman"/>
+                <w:i/>
+                <w:iCs/>
+                <w:sz w:val="24"/>
+                <w:lang w:eastAsia="en-US"/>
+              </w:rPr>
+              <w:t>5</w:t>
+            </w:r>
+            <w:r>
+              <w:rPr>
+                <w:rFonts w:eastAsia="Times New Roman"/>
+                <w:i/>
+                <w:iCs/>
+                <w:sz w:val="24"/>
+                <w:lang w:eastAsia="en-US"/>
+              </w:rPr>
+              <w:t xml:space="preserve"> (7.8%)</w:t>
+            </w:r>
+          </w:p>
+        </w:tc>
+        <w:tc>
+          <w:tcPr>
+            <w:tcW w:w="0" w:type="auto"/>
+            <w:tcBorders>
+              <w:top w:val="single" w:sz="18" w:space="0" w:color="auto"/>
+              <w:right w:val="single" w:sz="4" w:space="0" w:color="auto"/>
+            </w:tcBorders>
+            <w:tcPrChange w:id="126" w:author="Jaeger, Florian" w:date="2025-05-21T14:27:00Z" w16du:dateUtc="2025-05-21T18:27:00Z">
               <w:tcPr>
                 <w:tcW w:w="0" w:type="auto"/>
                 <w:tcBorders>
@@ -10993,7 +10957,7 @@
             <w:tcBorders>
               <w:top w:val="single" w:sz="18" w:space="0" w:color="auto"/>
             </w:tcBorders>
-            <w:tcPrChange w:id="126" w:author="Jaeger, Florian" w:date="2025-05-21T14:27:00Z" w16du:dateUtc="2025-05-21T18:27:00Z">
+            <w:tcPrChange w:id="127" w:author="Jaeger, Florian" w:date="2025-05-21T14:27:00Z" w16du:dateUtc="2025-05-21T18:27:00Z">
               <w:tcPr>
                 <w:tcW w:w="0" w:type="auto"/>
                 <w:tcBorders>
@@ -11513,27 +11477,27 @@
         </w:rPr>
         <w:t xml:space="preserve">the three design variables </w:t>
       </w:r>
-      <w:commentRangeStart w:id="127"/>
       <w:commentRangeStart w:id="128"/>
+      <w:commentRangeStart w:id="129"/>
       <w:r>
         <w:rPr>
           <w:szCs w:val="22"/>
         </w:rPr>
         <w:t>pen location</w:t>
       </w:r>
-      <w:commentRangeEnd w:id="127"/>
+      <w:commentRangeEnd w:id="128"/>
       <w:r>
         <w:rPr>
           <w:rStyle w:val="CommentReference"/>
         </w:rPr>
-        <w:commentReference w:id="127"/>
-      </w:r>
-      <w:commentRangeEnd w:id="128"/>
+        <w:commentReference w:id="128"/>
+      </w:r>
+      <w:commentRangeEnd w:id="129"/>
       <w:r>
         <w:rPr>
           <w:rStyle w:val="CommentReference"/>
         </w:rPr>
-        <w:commentReference w:id="128"/>
+        <w:commentReference w:id="129"/>
       </w:r>
       <w:r>
         <w:rPr>
@@ -12242,7 +12206,7 @@
           <w:docGrid w:linePitch="360"/>
         </w:sectPr>
       </w:pPr>
-      <w:bookmarkStart w:id="129" w:name="_Ref136190394"/>
+      <w:bookmarkStart w:id="130" w:name="_Ref136190394"/>
       <w:r>
         <w:rPr>
           <w:szCs w:val="22"/>
@@ -12287,7 +12251,7 @@
         </w:rPr>
         <w:fldChar w:fldCharType="end"/>
       </w:r>
-      <w:bookmarkEnd w:id="129"/>
+      <w:bookmarkEnd w:id="130"/>
       <w:r>
         <w:rPr>
           <w:szCs w:val="22"/>
@@ -12387,7 +12351,7 @@
       <w:pPr>
         <w:pStyle w:val="Caption"/>
       </w:pPr>
-      <w:bookmarkStart w:id="130" w:name="_Ref136190384"/>
+      <w:bookmarkStart w:id="131" w:name="_Ref136190384"/>
       <w:r>
         <w:rPr>
           <w:szCs w:val="22"/>
@@ -12427,7 +12391,7 @@
         </w:rPr>
         <w:fldChar w:fldCharType="end"/>
       </w:r>
-      <w:bookmarkEnd w:id="130"/>
+      <w:bookmarkEnd w:id="131"/>
       <w:r>
         <w:rPr>
           <w:szCs w:val="22"/>
@@ -17663,7 +17627,7 @@
           <w:szCs w:val="22"/>
         </w:rPr>
       </w:pPr>
-      <w:bookmarkStart w:id="131" w:name="_Ref136084921"/>
+      <w:bookmarkStart w:id="132" w:name="_Ref136084921"/>
       <w:r>
         <w:rPr>
           <w:szCs w:val="22"/>
@@ -17702,7 +17666,7 @@
         </w:rPr>
         <w:fldChar w:fldCharType="end"/>
       </w:r>
-      <w:bookmarkEnd w:id="131"/>
+      <w:bookmarkEnd w:id="132"/>
       <w:r>
         <w:rPr>
           <w:szCs w:val="22"/>
@@ -19225,7 +19189,7 @@
           <w:szCs w:val="22"/>
         </w:rPr>
       </w:pPr>
-      <w:bookmarkStart w:id="132" w:name="_Ref136190811"/>
+      <w:bookmarkStart w:id="133" w:name="_Ref136190811"/>
       <w:r>
         <w:rPr>
           <w:szCs w:val="22"/>
@@ -19264,7 +19228,7 @@
         </w:rPr>
         <w:fldChar w:fldCharType="end"/>
       </w:r>
-      <w:bookmarkEnd w:id="132"/>
+      <w:bookmarkEnd w:id="133"/>
       <w:r>
         <w:rPr>
           <w:szCs w:val="22"/>
@@ -19371,7 +19335,7 @@
       <w:pPr>
         <w:pStyle w:val="Caption"/>
       </w:pPr>
-      <w:bookmarkStart w:id="133" w:name="_Ref136190818"/>
+      <w:bookmarkStart w:id="134" w:name="_Ref136190818"/>
       <w:r>
         <w:rPr>
           <w:szCs w:val="22"/>
@@ -19411,7 +19375,7 @@
         </w:rPr>
         <w:fldChar w:fldCharType="end"/>
       </w:r>
-      <w:bookmarkEnd w:id="133"/>
+      <w:bookmarkEnd w:id="134"/>
       <w:r>
         <w:rPr>
           <w:szCs w:val="22"/>
@@ -22087,15 +22051,7 @@
         <w:t>Indeed, t</w:t>
       </w:r>
       <w:r>
-        <w:t xml:space="preserve">he only striking similarity between the pen-in-the-mouth and visual occlusion was that both reduced the effect of visual bias (see SI for details, </w:t>
-      </w:r>
-      <w:proofErr w:type="gramStart"/>
-      <w:r>
-        <w:t>and also</w:t>
-      </w:r>
-      <w:proofErr w:type="gramEnd"/>
-      <w:r>
-        <w:t xml:space="preserve"> </w:t>
+        <w:t xml:space="preserve">he only striking similarity between the pen-in-the-mouth and visual occlusion was that both reduced the effect of visual bias (see SI for details, and also </w:t>
       </w:r>
       <w:r>
         <w:fldChar w:fldCharType="begin"/>
@@ -22141,6 +22097,7 @@
     <w:p>
       <w:pPr>
         <w:rPr>
+          <w:ins w:id="135" w:author="Cummings, Shawn" w:date="2025-05-22T12:14:00Z" w16du:dateUtc="2025-05-22T16:14:00Z"/>
           <w:szCs w:val="22"/>
         </w:rPr>
       </w:pPr>
@@ -22225,6 +22182,166 @@
         </w:rPr>
         <w:t xml:space="preserve">the state of the articulators. </w:t>
       </w:r>
+      <w:ins w:id="136" w:author="Cummings, Shawn" w:date="2025-05-22T12:13:00Z" w16du:dateUtc="2025-05-22T16:13:00Z">
+        <w:r>
+          <w:rPr>
+            <w:szCs w:val="22"/>
+          </w:rPr>
+          <w:t>Of note, t</w:t>
+        </w:r>
+        <w:r>
+          <w:rPr>
+            <w:szCs w:val="22"/>
+          </w:rPr>
+          <w:t>he proportion of participants who mentioned the pen in the free-response post-experiment survey was lower in experiment 2 (29.7%) compared to 1a-c (36.7%). This is by no means a comprehensive check of attention to the pen or its position</w:t>
+        </w:r>
+      </w:ins>
+      <w:ins w:id="137" w:author="Cummings, Shawn" w:date="2025-05-22T12:16:00Z" w16du:dateUtc="2025-05-22T16:16:00Z">
+        <w:r>
+          <w:rPr>
+            <w:szCs w:val="22"/>
+          </w:rPr>
+          <w:t>. F</w:t>
+        </w:r>
+      </w:ins>
+      <w:ins w:id="138" w:author="Cummings, Shawn" w:date="2025-05-22T12:15:00Z" w16du:dateUtc="2025-05-22T16:15:00Z">
+        <w:r>
+          <w:rPr>
+            <w:szCs w:val="22"/>
+          </w:rPr>
+          <w:t>or example,</w:t>
+        </w:r>
+      </w:ins>
+      <w:ins w:id="139" w:author="Cummings, Shawn" w:date="2025-05-22T12:16:00Z" w16du:dateUtc="2025-05-22T16:16:00Z">
+        <w:r>
+          <w:rPr>
+            <w:szCs w:val="22"/>
+          </w:rPr>
+          <w:t xml:space="preserve"> this trend could emerge if </w:t>
+        </w:r>
+      </w:ins>
+      <w:ins w:id="140" w:author="Cummings, Shawn" w:date="2025-05-22T12:13:00Z" w16du:dateUtc="2025-05-22T16:13:00Z">
+        <w:r>
+          <w:rPr>
+            <w:szCs w:val="22"/>
+          </w:rPr>
+          <w:t xml:space="preserve">listeners in experiment 2 </w:t>
+        </w:r>
+        <w:r>
+          <w:rPr>
+            <w:i/>
+            <w:iCs/>
+            <w:szCs w:val="22"/>
+            <w:rPrChange w:id="141" w:author="Cummings, Shawn" w:date="2025-05-22T12:15:00Z" w16du:dateUtc="2025-05-22T16:15:00Z">
+              <w:rPr>
+                <w:szCs w:val="22"/>
+              </w:rPr>
+            </w:rPrChange>
+          </w:rPr>
+          <w:t>did</w:t>
+        </w:r>
+        <w:r>
+          <w:rPr>
+            <w:szCs w:val="22"/>
+          </w:rPr>
+          <w:t xml:space="preserve"> notice the pen</w:t>
+        </w:r>
+      </w:ins>
+      <w:ins w:id="142" w:author="Cummings, Shawn" w:date="2025-05-22T12:17:00Z" w16du:dateUtc="2025-05-22T16:17:00Z">
+        <w:r>
+          <w:rPr>
+            <w:szCs w:val="22"/>
+          </w:rPr>
+          <w:t>,</w:t>
+        </w:r>
+      </w:ins>
+      <w:ins w:id="143" w:author="Cummings, Shawn" w:date="2025-05-22T12:13:00Z" w16du:dateUtc="2025-05-22T16:13:00Z">
+        <w:r>
+          <w:rPr>
+            <w:szCs w:val="22"/>
+          </w:rPr>
+          <w:t xml:space="preserve"> but </w:t>
+        </w:r>
+      </w:ins>
+      <w:ins w:id="144" w:author="Cummings, Shawn" w:date="2025-05-22T12:17:00Z" w16du:dateUtc="2025-05-22T16:17:00Z">
+        <w:r>
+          <w:rPr>
+            <w:szCs w:val="22"/>
+          </w:rPr>
+          <w:t>became</w:t>
+        </w:r>
+      </w:ins>
+      <w:ins w:id="145" w:author="Cummings, Shawn" w:date="2025-05-22T12:16:00Z" w16du:dateUtc="2025-05-22T16:16:00Z">
+        <w:r>
+          <w:rPr>
+            <w:szCs w:val="22"/>
+          </w:rPr>
+          <w:t xml:space="preserve"> less likely to mention it under the “</w:t>
+        </w:r>
+      </w:ins>
+      <w:ins w:id="146" w:author="Cummings, Shawn" w:date="2025-05-22T12:16:00Z">
+        <w:r>
+          <w:rPr>
+            <w:szCs w:val="22"/>
+          </w:rPr>
+          <w:t>Did you notice anything odd about the person in the video?</w:t>
+        </w:r>
+      </w:ins>
+      <w:ins w:id="147" w:author="Cummings, Shawn" w:date="2025-05-22T12:16:00Z" w16du:dateUtc="2025-05-22T16:16:00Z">
+        <w:r>
+          <w:rPr>
+            <w:szCs w:val="22"/>
+          </w:rPr>
+          <w:t>” prompt</w:t>
+        </w:r>
+      </w:ins>
+      <w:ins w:id="148" w:author="Cummings, Shawn" w:date="2025-05-22T12:17:00Z" w16du:dateUtc="2025-05-22T16:17:00Z">
+        <w:r>
+          <w:rPr>
+            <w:szCs w:val="22"/>
+          </w:rPr>
+          <w:t xml:space="preserve"> when other visually salient objects (the black box) were also apparent</w:t>
+        </w:r>
+      </w:ins>
+      <w:ins w:id="149" w:author="Cummings, Shawn" w:date="2025-05-22T12:16:00Z" w16du:dateUtc="2025-05-22T16:16:00Z">
+        <w:r>
+          <w:rPr>
+            <w:szCs w:val="22"/>
+          </w:rPr>
+          <w:t>. However,</w:t>
+        </w:r>
+      </w:ins>
+      <w:ins w:id="150" w:author="Cummings, Shawn" w:date="2025-05-22T12:17:00Z" w16du:dateUtc="2025-05-22T16:17:00Z">
+        <w:r>
+          <w:rPr>
+            <w:szCs w:val="22"/>
+          </w:rPr>
+          <w:t xml:space="preserve"> it is also possible the occluder </w:t>
+        </w:r>
+        <w:r>
+          <w:rPr>
+            <w:szCs w:val="22"/>
+          </w:rPr>
+          <w:lastRenderedPageBreak/>
+          <w:t xml:space="preserve">created </w:t>
+        </w:r>
+      </w:ins>
+      <w:ins w:id="151" w:author="Cummings, Shawn" w:date="2025-05-22T12:18:00Z" w16du:dateUtc="2025-05-22T16:18:00Z">
+        <w:r>
+          <w:rPr>
+            <w:szCs w:val="22"/>
+          </w:rPr>
+          <w:t>distraction during the task.</w:t>
+        </w:r>
+      </w:ins>
+      <w:ins w:id="152" w:author="Cummings, Shawn" w:date="2025-05-22T12:16:00Z" w16du:dateUtc="2025-05-22T16:16:00Z">
+        <w:r>
+          <w:rPr>
+            <w:szCs w:val="22"/>
+          </w:rPr>
+          <w:t xml:space="preserve"> </w:t>
+        </w:r>
+      </w:ins>
       <w:r>
         <w:rPr>
           <w:szCs w:val="22"/>
@@ -22254,289 +22371,6 @@
           <w:szCs w:val="22"/>
         </w:rPr>
         <w:t xml:space="preserve">. </w:t>
-      </w:r>
-      <w:r>
-        <w:rPr>
-          <w:szCs w:val="22"/>
-        </w:rPr>
-        <w:t>First,</w:t>
-      </w:r>
-      <w:r>
-        <w:rPr>
-          <w:szCs w:val="22"/>
-        </w:rPr>
-        <w:t xml:space="preserve"> </w:t>
-      </w:r>
-      <w:r>
-        <w:rPr>
-          <w:szCs w:val="22"/>
-        </w:rPr>
-        <w:t>the black occluder box might distract participants from the primary task, which could</w:t>
-      </w:r>
-      <w:r>
-        <w:rPr>
-          <w:szCs w:val="22"/>
-        </w:rPr>
-        <w:t xml:space="preserve"> interrupt the cognitive process underlying compensation. </w:t>
-      </w:r>
-      <w:r>
-        <w:rPr>
-          <w:szCs w:val="22"/>
-        </w:rPr>
-        <w:t>While we cannot conclusively rule out this possibility, we consider it unlikely for a</w:t>
-      </w:r>
-      <w:r>
-        <w:rPr>
-          <w:szCs w:val="22"/>
-        </w:rPr>
-        <w:t xml:space="preserve"> number of </w:t>
-      </w:r>
-      <w:r>
-        <w:rPr>
-          <w:szCs w:val="22"/>
-        </w:rPr>
-        <w:t>reasons</w:t>
-      </w:r>
-      <w:r>
-        <w:rPr>
-          <w:szCs w:val="22"/>
-        </w:rPr>
-        <w:t xml:space="preserve">. </w:t>
-      </w:r>
-      <w:r>
-        <w:rPr>
-          <w:szCs w:val="22"/>
-        </w:rPr>
-        <w:t>Compared to Experiments 1a-c, l</w:t>
-      </w:r>
-      <w:r>
-        <w:rPr>
-          <w:szCs w:val="22"/>
-        </w:rPr>
-        <w:t xml:space="preserve">isteners in </w:t>
-      </w:r>
-      <w:r>
-        <w:rPr>
-          <w:szCs w:val="22"/>
-        </w:rPr>
-        <w:t>E</w:t>
-      </w:r>
-      <w:r>
-        <w:rPr>
-          <w:szCs w:val="22"/>
-        </w:rPr>
-        <w:t xml:space="preserve">xperiment 2 demonstrated </w:t>
-      </w:r>
-      <w:r>
-        <w:rPr>
-          <w:szCs w:val="22"/>
-        </w:rPr>
-        <w:t xml:space="preserve">about the same—in fact, </w:t>
-      </w:r>
-      <w:r>
-        <w:rPr>
-          <w:szCs w:val="22"/>
-        </w:rPr>
-        <w:t xml:space="preserve">numerically </w:t>
-      </w:r>
-      <w:r>
-        <w:rPr>
-          <w:szCs w:val="22"/>
-        </w:rPr>
-        <w:t>somewhat greater—</w:t>
-      </w:r>
-      <w:r>
-        <w:rPr>
-          <w:szCs w:val="22"/>
-        </w:rPr>
-        <w:t xml:space="preserve">sensitivity to the acoustic continuum </w:t>
-      </w:r>
-      <w:r>
-        <w:rPr>
-          <w:szCs w:val="22"/>
-        </w:rPr>
-        <w:t xml:space="preserve">(see </w:t>
-      </w:r>
-      <w:r>
-        <w:rPr>
-          <w:szCs w:val="22"/>
-        </w:rPr>
-        <w:fldChar w:fldCharType="begin"/>
-      </w:r>
-      <w:r>
-        <w:rPr>
-          <w:szCs w:val="22"/>
-        </w:rPr>
-        <w:instrText xml:space="preserve"> REF _Ref136190811 \h </w:instrText>
-      </w:r>
-      <w:r>
-        <w:rPr>
-          <w:szCs w:val="22"/>
-        </w:rPr>
-      </w:r>
-      <w:r>
-        <w:rPr>
-          <w:szCs w:val="22"/>
-        </w:rPr>
-        <w:fldChar w:fldCharType="separate"/>
-      </w:r>
-      <w:r>
-        <w:rPr>
-          <w:szCs w:val="22"/>
-        </w:rPr>
-        <w:t xml:space="preserve">Figure </w:t>
-      </w:r>
-      <w:r>
-        <w:rPr>
-          <w:noProof/>
-          <w:szCs w:val="22"/>
-        </w:rPr>
-        <w:t>4</w:t>
-      </w:r>
-      <w:r>
-        <w:rPr>
-          <w:szCs w:val="22"/>
-        </w:rPr>
-        <w:fldChar w:fldCharType="end"/>
-      </w:r>
-      <w:r>
-        <w:rPr>
-          <w:szCs w:val="22"/>
-        </w:rPr>
-        <w:t>A)</w:t>
-      </w:r>
-      <w:r>
-        <w:rPr>
-          <w:szCs w:val="22"/>
-        </w:rPr>
-        <w:t xml:space="preserve">, speaking against a higher </w:t>
-      </w:r>
-      <w:r>
-        <w:rPr>
-          <w:szCs w:val="22"/>
-        </w:rPr>
-        <w:lastRenderedPageBreak/>
-        <w:t>proportion of attentional lapses or random guesses. Along a similar vein, average reaction time</w:t>
-      </w:r>
-      <w:r>
-        <w:rPr>
-          <w:szCs w:val="22"/>
-        </w:rPr>
-        <w:t>s</w:t>
-      </w:r>
-      <w:r>
-        <w:rPr>
-          <w:szCs w:val="22"/>
-        </w:rPr>
-        <w:t xml:space="preserve"> w</w:t>
-      </w:r>
-      <w:r>
-        <w:rPr>
-          <w:szCs w:val="22"/>
-        </w:rPr>
-        <w:t>ere</w:t>
-      </w:r>
-      <w:r>
-        <w:rPr>
-          <w:szCs w:val="22"/>
-        </w:rPr>
-        <w:t xml:space="preserve"> not significantly higher in Experiment 2</w:t>
-      </w:r>
-      <w:r>
-        <w:rPr>
-          <w:szCs w:val="22"/>
-        </w:rPr>
-        <w:t xml:space="preserve"> (mean log-RT = </w:t>
-      </w:r>
-      <w:r>
-        <w:rPr>
-          <w:szCs w:val="22"/>
-        </w:rPr>
-        <w:t>3.45</w:t>
-      </w:r>
-      <w:r>
-        <w:rPr>
-          <w:szCs w:val="22"/>
-        </w:rPr>
-        <w:t xml:space="preserve">, SD = </w:t>
-      </w:r>
-      <w:r>
-        <w:rPr>
-          <w:szCs w:val="22"/>
-        </w:rPr>
-        <w:t>0.14</w:t>
-      </w:r>
-      <w:r>
-        <w:rPr>
-          <w:szCs w:val="22"/>
-        </w:rPr>
-        <w:t xml:space="preserve">), compared to Experiments 1a-c (mean = </w:t>
-      </w:r>
-      <w:r>
-        <w:rPr>
-          <w:szCs w:val="22"/>
-        </w:rPr>
-        <w:t>3.44</w:t>
-      </w:r>
-      <w:r>
-        <w:rPr>
-          <w:szCs w:val="22"/>
-        </w:rPr>
-        <w:t xml:space="preserve">, SD = </w:t>
-      </w:r>
-      <w:r>
-        <w:rPr>
-          <w:szCs w:val="22"/>
-        </w:rPr>
-        <w:t>0.15</w:t>
-      </w:r>
-      <w:r>
-        <w:rPr>
-          <w:szCs w:val="22"/>
-        </w:rPr>
-        <w:t>)</w:t>
-      </w:r>
-      <w:r>
-        <w:rPr>
-          <w:szCs w:val="22"/>
-        </w:rPr>
-        <w:t xml:space="preserve">. Finally, while the black box </w:t>
-      </w:r>
-      <w:r>
-        <w:rPr>
-          <w:szCs w:val="22"/>
-        </w:rPr>
-        <w:t>might have been</w:t>
-      </w:r>
-      <w:r>
-        <w:rPr>
-          <w:szCs w:val="22"/>
-        </w:rPr>
-        <w:t xml:space="preserve"> initially surprising to listeners, it appeared very predictably at </w:t>
-      </w:r>
-      <w:r>
-        <w:rPr>
-          <w:szCs w:val="22"/>
-        </w:rPr>
-        <w:t xml:space="preserve">approximately </w:t>
-      </w:r>
-      <w:r>
-        <w:rPr>
-          <w:szCs w:val="22"/>
-        </w:rPr>
-        <w:t xml:space="preserve">the same point in each of the 72 </w:t>
-      </w:r>
-      <w:r>
-        <w:rPr>
-          <w:szCs w:val="22"/>
-        </w:rPr>
-        <w:t xml:space="preserve">video </w:t>
-      </w:r>
-      <w:r>
-        <w:rPr>
-          <w:szCs w:val="22"/>
-        </w:rPr>
-        <w:t xml:space="preserve">trials. Thus, any initial distraction would likely atrophy over the course of testing. Analyses reported in the SI confirm that no effects emerged or interacted with testing block. </w:t>
       </w:r>
     </w:p>
     <w:p>
@@ -22549,7 +22383,7 @@
         <w:rPr>
           <w:szCs w:val="22"/>
         </w:rPr>
-        <w:t>A second alternative is that while the presence of the pen itself—rather than its impact on the articulators—may be sufficient to induce compensation, the black box made</w:t>
+        <w:t>First,</w:t>
       </w:r>
       <w:r>
         <w:rPr>
@@ -22561,31 +22395,31 @@
         <w:rPr>
           <w:szCs w:val="22"/>
         </w:rPr>
-        <w:t>the location of the pen</w:t>
-      </w:r>
-      <w:r>
-        <w:rPr>
-          <w:szCs w:val="22"/>
-        </w:rPr>
-        <w:t xml:space="preserve"> less obvious and harder to visually access. Experiment 2b addresses this concern to a limited extent, in that </w:t>
-      </w:r>
-      <w:r>
-        <w:rPr>
-          <w:szCs w:val="22"/>
-        </w:rPr>
-        <w:t xml:space="preserve">participants explicitly confirmed awareness of the pen. However, the dual-task nature of the experiment </w:t>
-      </w:r>
-      <w:r>
-        <w:rPr>
-          <w:szCs w:val="22"/>
-        </w:rPr>
-        <w:t>imposed additional and orthogonal attentional demands</w:t>
-      </w:r>
-      <w:r>
-        <w:rPr>
-          <w:szCs w:val="22"/>
-        </w:rPr>
-        <w:t xml:space="preserve"> (for details, we refer to the SI)</w:t>
+        <w:t>the black occluder box might distract participants from the primary task, which could</w:t>
+      </w:r>
+      <w:r>
+        <w:rPr>
+          <w:szCs w:val="22"/>
+        </w:rPr>
+        <w:t xml:space="preserve"> interrupt the cognitive process underlying compensation. </w:t>
+      </w:r>
+      <w:r>
+        <w:rPr>
+          <w:szCs w:val="22"/>
+        </w:rPr>
+        <w:t>While we cannot conclusively rule out this possibility, we consider it unlikely for a</w:t>
+      </w:r>
+      <w:r>
+        <w:rPr>
+          <w:szCs w:val="22"/>
+        </w:rPr>
+        <w:t xml:space="preserve"> number of </w:t>
+      </w:r>
+      <w:r>
+        <w:rPr>
+          <w:szCs w:val="22"/>
+        </w:rPr>
+        <w:t>reasons</w:t>
       </w:r>
       <w:r>
         <w:rPr>
@@ -22597,104 +22431,388 @@
         <w:rPr>
           <w:szCs w:val="22"/>
         </w:rPr>
-        <w:t xml:space="preserve">Future </w:t>
-      </w:r>
-      <w:r>
-        <w:rPr>
-          <w:szCs w:val="22"/>
-        </w:rPr>
-        <w:t xml:space="preserve">work could more </w:t>
-      </w:r>
-      <w:r>
-        <w:rPr>
-          <w:szCs w:val="22"/>
-        </w:rPr>
-        <w:t xml:space="preserve">conclusively assess the role of the pen </w:t>
-      </w:r>
-      <w:r>
-        <w:rPr>
-          <w:szCs w:val="22"/>
-        </w:rPr>
-        <w:t xml:space="preserve">versus its impact on the articulators by </w:t>
-      </w:r>
-      <w:r>
-        <w:rPr>
-          <w:szCs w:val="22"/>
-        </w:rPr>
-        <w:t xml:space="preserve">removing </w:t>
-      </w:r>
-      <w:r>
-        <w:rPr>
-          <w:szCs w:val="22"/>
-        </w:rPr>
-        <w:t>visual information more selectively</w:t>
-      </w:r>
-      <w:r>
-        <w:rPr>
-          <w:szCs w:val="22"/>
-        </w:rPr>
-        <w:t xml:space="preserve">. For example, videos could be presented of pen-impacted articulation, but with the pen itself removed in video post-processing. Conversely, </w:t>
-      </w:r>
-      <w:r>
-        <w:rPr>
-          <w:szCs w:val="22"/>
-        </w:rPr>
-        <w:t xml:space="preserve">video editing could be used to create an occluder that hides visual information about the articulators and face, while still showing </w:t>
-      </w:r>
-      <w:r>
-        <w:rPr>
-          <w:szCs w:val="22"/>
-        </w:rPr>
-        <w:t xml:space="preserve">the pen </w:t>
-      </w:r>
-      <w:r>
-        <w:rPr>
-          <w:szCs w:val="22"/>
-        </w:rPr>
-        <w:t>and hand of the talker</w:t>
-      </w:r>
-      <w:r>
-        <w:rPr>
-          <w:szCs w:val="22"/>
-        </w:rPr>
-        <w:t xml:space="preserve">. </w:t>
-      </w:r>
-      <w:r>
-        <w:rPr>
-          <w:szCs w:val="22"/>
-        </w:rPr>
-        <w:t>Either of these manipulations would require substantial</w:t>
-      </w:r>
-      <w:r>
-        <w:rPr>
-          <w:szCs w:val="22"/>
-        </w:rPr>
-        <w:t>ly</w:t>
-      </w:r>
-      <w:r>
-        <w:rPr>
-          <w:szCs w:val="22"/>
-        </w:rPr>
-        <w:t xml:space="preserve"> more advanced video-editing than used in Experiment 2. </w:t>
+        <w:t>Compared to Experiments 1a-c, l</w:t>
+      </w:r>
+      <w:r>
+        <w:rPr>
+          <w:szCs w:val="22"/>
+        </w:rPr>
+        <w:t xml:space="preserve">isteners in </w:t>
+      </w:r>
+      <w:r>
+        <w:rPr>
+          <w:szCs w:val="22"/>
+        </w:rPr>
+        <w:t>E</w:t>
+      </w:r>
+      <w:r>
+        <w:rPr>
+          <w:szCs w:val="22"/>
+        </w:rPr>
+        <w:t xml:space="preserve">xperiment 2 demonstrated </w:t>
+      </w:r>
+      <w:r>
+        <w:rPr>
+          <w:szCs w:val="22"/>
+        </w:rPr>
+        <w:t xml:space="preserve">about the same—in fact, </w:t>
+      </w:r>
+      <w:r>
+        <w:rPr>
+          <w:szCs w:val="22"/>
+        </w:rPr>
+        <w:t xml:space="preserve">numerically </w:t>
+      </w:r>
+      <w:r>
+        <w:rPr>
+          <w:szCs w:val="22"/>
+        </w:rPr>
+        <w:t>somewhat greater—</w:t>
+      </w:r>
+      <w:r>
+        <w:rPr>
+          <w:szCs w:val="22"/>
+        </w:rPr>
+        <w:t xml:space="preserve">sensitivity to the acoustic continuum </w:t>
+      </w:r>
+      <w:r>
+        <w:rPr>
+          <w:szCs w:val="22"/>
+        </w:rPr>
+        <w:t xml:space="preserve">(see </w:t>
+      </w:r>
+      <w:r>
+        <w:rPr>
+          <w:szCs w:val="22"/>
+        </w:rPr>
+        <w:fldChar w:fldCharType="begin"/>
+      </w:r>
+      <w:r>
+        <w:rPr>
+          <w:szCs w:val="22"/>
+        </w:rPr>
+        <w:instrText xml:space="preserve"> REF _Ref136190811 \h </w:instrText>
+      </w:r>
+      <w:r>
+        <w:rPr>
+          <w:szCs w:val="22"/>
+        </w:rPr>
+      </w:r>
+      <w:r>
+        <w:rPr>
+          <w:szCs w:val="22"/>
+        </w:rPr>
+        <w:fldChar w:fldCharType="separate"/>
+      </w:r>
+      <w:r>
+        <w:rPr>
+          <w:szCs w:val="22"/>
+        </w:rPr>
+        <w:t xml:space="preserve">Figure </w:t>
+      </w:r>
+      <w:r>
+        <w:rPr>
+          <w:noProof/>
+          <w:szCs w:val="22"/>
+        </w:rPr>
+        <w:t>4</w:t>
+      </w:r>
+      <w:r>
+        <w:rPr>
+          <w:szCs w:val="22"/>
+        </w:rPr>
+        <w:fldChar w:fldCharType="end"/>
+      </w:r>
+      <w:r>
+        <w:rPr>
+          <w:szCs w:val="22"/>
+        </w:rPr>
+        <w:t>A)</w:t>
+      </w:r>
+      <w:r>
+        <w:rPr>
+          <w:szCs w:val="22"/>
+        </w:rPr>
+        <w:t>, speaking against a higher proportion of attentional lapses or random guesses. Along a similar vein, average reaction time</w:t>
+      </w:r>
+      <w:r>
+        <w:rPr>
+          <w:szCs w:val="22"/>
+        </w:rPr>
+        <w:t>s</w:t>
+      </w:r>
+      <w:r>
+        <w:rPr>
+          <w:szCs w:val="22"/>
+        </w:rPr>
+        <w:t xml:space="preserve"> w</w:t>
+      </w:r>
+      <w:r>
+        <w:rPr>
+          <w:szCs w:val="22"/>
+        </w:rPr>
+        <w:t>ere</w:t>
+      </w:r>
+      <w:r>
+        <w:rPr>
+          <w:szCs w:val="22"/>
+        </w:rPr>
+        <w:t xml:space="preserve"> not significantly higher in Experiment 2</w:t>
+      </w:r>
+      <w:r>
+        <w:rPr>
+          <w:szCs w:val="22"/>
+        </w:rPr>
+        <w:t xml:space="preserve"> (mean log-RT = </w:t>
+      </w:r>
+      <w:r>
+        <w:rPr>
+          <w:szCs w:val="22"/>
+        </w:rPr>
+        <w:t>3.45</w:t>
+      </w:r>
+      <w:r>
+        <w:rPr>
+          <w:szCs w:val="22"/>
+        </w:rPr>
+        <w:t xml:space="preserve">, SD = </w:t>
+      </w:r>
+      <w:r>
+        <w:rPr>
+          <w:szCs w:val="22"/>
+        </w:rPr>
+        <w:t>0.14</w:t>
+      </w:r>
+      <w:r>
+        <w:rPr>
+          <w:szCs w:val="22"/>
+        </w:rPr>
+        <w:t xml:space="preserve">), compared to Experiments 1a-c (mean = </w:t>
+      </w:r>
+      <w:r>
+        <w:rPr>
+          <w:szCs w:val="22"/>
+        </w:rPr>
+        <w:t>3.44</w:t>
+      </w:r>
+      <w:r>
+        <w:rPr>
+          <w:szCs w:val="22"/>
+        </w:rPr>
+        <w:t xml:space="preserve">, SD = </w:t>
+      </w:r>
+      <w:r>
+        <w:rPr>
+          <w:szCs w:val="22"/>
+        </w:rPr>
+        <w:t>0.15</w:t>
+      </w:r>
+      <w:r>
+        <w:rPr>
+          <w:szCs w:val="22"/>
+        </w:rPr>
+        <w:t>)</w:t>
+      </w:r>
+      <w:r>
+        <w:rPr>
+          <w:szCs w:val="22"/>
+        </w:rPr>
+        <w:t xml:space="preserve">. Finally, while the black box </w:t>
+      </w:r>
+      <w:r>
+        <w:rPr>
+          <w:szCs w:val="22"/>
+        </w:rPr>
+        <w:t>might have been</w:t>
+      </w:r>
+      <w:r>
+        <w:rPr>
+          <w:szCs w:val="22"/>
+        </w:rPr>
+        <w:t xml:space="preserve"> initially surprising to listeners, it appeared very predictably at </w:t>
+      </w:r>
+      <w:r>
+        <w:rPr>
+          <w:szCs w:val="22"/>
+        </w:rPr>
+        <w:t xml:space="preserve">approximately </w:t>
+      </w:r>
+      <w:r>
+        <w:rPr>
+          <w:szCs w:val="22"/>
+        </w:rPr>
+        <w:t xml:space="preserve">the same point in each of the 72 </w:t>
+      </w:r>
+      <w:r>
+        <w:rPr>
+          <w:szCs w:val="22"/>
+        </w:rPr>
+        <w:t xml:space="preserve">video </w:t>
+      </w:r>
+      <w:r>
+        <w:rPr>
+          <w:szCs w:val="22"/>
+        </w:rPr>
+        <w:t xml:space="preserve">trials. Thus, any initial distraction would likely atrophy over the course of testing. Analyses reported in the SI confirm that no effects emerged or interacted with testing block. </w:t>
       </w:r>
     </w:p>
     <w:p>
       <w:pPr>
-        <w:pStyle w:val="Heading1"/>
-        <w:rPr>
-          <w:szCs w:val="22"/>
-        </w:rPr>
-      </w:pPr>
-      <w:r>
-        <w:rPr>
-          <w:sz w:val="22"/>
-          <w:szCs w:val="22"/>
-        </w:rPr>
-        <w:t>General Discussion</w:t>
+        <w:rPr>
+          <w:szCs w:val="22"/>
+        </w:rPr>
+      </w:pPr>
+      <w:r>
+        <w:rPr>
+          <w:szCs w:val="22"/>
+        </w:rPr>
+        <w:t>A second alternative is that while the presence of the pen itself—rather than its impact on the articulators—may be sufficient to induce compensation, the black box made</w:t>
+      </w:r>
+      <w:r>
+        <w:rPr>
+          <w:szCs w:val="22"/>
+        </w:rPr>
+        <w:t xml:space="preserve"> </w:t>
+      </w:r>
+      <w:r>
+        <w:rPr>
+          <w:szCs w:val="22"/>
+        </w:rPr>
+        <w:t>the location of the pen</w:t>
+      </w:r>
+      <w:r>
+        <w:rPr>
+          <w:szCs w:val="22"/>
+        </w:rPr>
+        <w:t xml:space="preserve"> less obvious and harder to visually access. Experiment 2b addresses this concern to a limited extent, in that </w:t>
+      </w:r>
+      <w:r>
+        <w:rPr>
+          <w:szCs w:val="22"/>
+        </w:rPr>
+        <w:t xml:space="preserve">participants explicitly confirmed awareness of the pen. However, the dual-task nature of the experiment </w:t>
+      </w:r>
+      <w:r>
+        <w:rPr>
+          <w:szCs w:val="22"/>
+        </w:rPr>
+        <w:t>imposed additional and orthogonal attentional demands</w:t>
+      </w:r>
+      <w:r>
+        <w:rPr>
+          <w:szCs w:val="22"/>
+        </w:rPr>
+        <w:t xml:space="preserve"> (for details, we refer to the SI)</w:t>
+      </w:r>
+      <w:r>
+        <w:rPr>
+          <w:szCs w:val="22"/>
+        </w:rPr>
+        <w:t xml:space="preserve">. </w:t>
+      </w:r>
+      <w:r>
+        <w:rPr>
+          <w:szCs w:val="22"/>
+        </w:rPr>
+        <w:t xml:space="preserve">Future </w:t>
+      </w:r>
+      <w:r>
+        <w:rPr>
+          <w:szCs w:val="22"/>
+        </w:rPr>
+        <w:t xml:space="preserve">work could more </w:t>
+      </w:r>
+      <w:r>
+        <w:rPr>
+          <w:szCs w:val="22"/>
+        </w:rPr>
+        <w:t xml:space="preserve">conclusively assess the role of the pen </w:t>
+      </w:r>
+      <w:r>
+        <w:rPr>
+          <w:szCs w:val="22"/>
+        </w:rPr>
+        <w:t xml:space="preserve">versus its impact on the articulators by </w:t>
+      </w:r>
+      <w:r>
+        <w:rPr>
+          <w:szCs w:val="22"/>
+        </w:rPr>
+        <w:t xml:space="preserve">removing </w:t>
+      </w:r>
+      <w:r>
+        <w:rPr>
+          <w:szCs w:val="22"/>
+        </w:rPr>
+        <w:t>visual information more selectively</w:t>
+      </w:r>
+      <w:r>
+        <w:rPr>
+          <w:szCs w:val="22"/>
+        </w:rPr>
+        <w:t xml:space="preserve">. For example, videos could be presented of pen-impacted articulation, but with the pen itself removed in video post-processing. Conversely, </w:t>
+      </w:r>
+      <w:r>
+        <w:rPr>
+          <w:szCs w:val="22"/>
+        </w:rPr>
+        <w:t xml:space="preserve">video editing could be used to create an occluder that hides visual information about the articulators and face, while still showing </w:t>
+      </w:r>
+      <w:r>
+        <w:rPr>
+          <w:szCs w:val="22"/>
+        </w:rPr>
+        <w:t xml:space="preserve">the pen </w:t>
+      </w:r>
+      <w:r>
+        <w:rPr>
+          <w:szCs w:val="22"/>
+        </w:rPr>
+        <w:t>and hand of the talker</w:t>
+      </w:r>
+      <w:r>
+        <w:rPr>
+          <w:szCs w:val="22"/>
+        </w:rPr>
+        <w:t xml:space="preserve">. </w:t>
+      </w:r>
+      <w:r>
+        <w:rPr>
+          <w:szCs w:val="22"/>
+        </w:rPr>
+        <w:t>Either of these manipulations would require substantial</w:t>
+      </w:r>
+      <w:r>
+        <w:rPr>
+          <w:szCs w:val="22"/>
+        </w:rPr>
+        <w:t>ly</w:t>
+      </w:r>
+      <w:r>
+        <w:rPr>
+          <w:szCs w:val="22"/>
+        </w:rPr>
+        <w:t xml:space="preserve"> more advanced video-editing than used in Experiment 2. </w:t>
       </w:r>
     </w:p>
     <w:p>
       <w:pPr>
+        <w:pStyle w:val="Heading1"/>
+        <w:rPr>
+          <w:szCs w:val="22"/>
+        </w:rPr>
+      </w:pPr>
+      <w:r>
+        <w:rPr>
+          <w:sz w:val="22"/>
+          <w:szCs w:val="22"/>
+        </w:rPr>
+        <w:lastRenderedPageBreak/>
+        <w:t>General Discussion</w:t>
+      </w:r>
+    </w:p>
+    <w:p>
+      <w:pPr>
         <w:rPr>
           <w:szCs w:val="22"/>
         </w:rPr>
@@ -22847,14 +22965,7 @@
         <w:rPr>
           <w:szCs w:val="22"/>
         </w:rPr>
-        <w:t xml:space="preserve"> articulators—the pen’s </w:t>
-      </w:r>
-      <w:r>
-        <w:rPr>
-          <w:szCs w:val="22"/>
-        </w:rPr>
-        <w:lastRenderedPageBreak/>
-        <w:t xml:space="preserve">effect on lip shape—affect listeners’ perception in ways consistent with compensation accounts. </w:t>
+        <w:t xml:space="preserve"> articulators—the pen’s effect on lip shape—affect listeners’ perception in ways consistent with compensation accounts. </w:t>
       </w:r>
       <w:r>
         <w:rPr>
@@ -22998,7 +23109,14 @@
         <w:rPr>
           <w:szCs w:val="22"/>
         </w:rPr>
-        <w:t xml:space="preserve"> place in the same brain areas that are responsible for audiovisual integration during speech perception, and whether those areas also process compensation for preceding phonetic context. Alternatively, compensation might take place at multiple points in the processing of speech input.</w:t>
+        <w:t xml:space="preserve"> place in the same brain areas that are responsible for audiovisual integration during speech perception, and whether those areas also process compensation for preceding phonetic context. Alternatively, compensation </w:t>
+      </w:r>
+      <w:r>
+        <w:rPr>
+          <w:szCs w:val="22"/>
+        </w:rPr>
+        <w:lastRenderedPageBreak/>
+        <w:t>might take place at multiple points in the processing of speech input.</w:t>
       </w:r>
     </w:p>
     <w:p>
@@ -23053,14 +23171,7 @@
         <w:rPr>
           <w:szCs w:val="22"/>
         </w:rPr>
-        <w:t xml:space="preserve"> to speech from an unfamiliar talker for which the realization of a particular sound is shifted </w:t>
-      </w:r>
-      <w:r>
-        <w:rPr>
-          <w:szCs w:val="22"/>
-        </w:rPr>
-        <w:lastRenderedPageBreak/>
-        <w:t xml:space="preserve">towards a neighboring category. For example, Kraljic &amp; Samuel (2006) exposed listeners to either typical </w:t>
+        <w:t xml:space="preserve"> to speech from an unfamiliar talker for which the realization of a particular sound is shifted towards a neighboring category. For example, Kraljic &amp; Samuel (2006) exposed listeners to either typical </w:t>
       </w:r>
       <w:r>
         <w:rPr>
@@ -23587,7 +23698,14 @@
         <w:rPr>
           <w:szCs w:val="22"/>
         </w:rPr>
-        <w:t xml:space="preserve">—while allowing perceptual learning for changes that are considered “characteristic” of the talker’s speech. Based on a series of new experiments, Kraljic and Samuel (2011) revised this account, suggesting instead that audiovisual inputs with a pen in the mouth are stored as separate exemplars that do not affect listeners’ categorization decisions for audio-only speech inputs—i.e., the type of speech input that has been used in the test phase of </w:t>
+        <w:t xml:space="preserve">—while allowing perceptual learning for changes that are considered “characteristic” of the talker’s speech. Based on a series of new experiments, Kraljic and Samuel (2011) revised this account, suggesting instead that audiovisual inputs with a pen in the mouth are </w:t>
+      </w:r>
+      <w:r>
+        <w:rPr>
+          <w:szCs w:val="22"/>
+        </w:rPr>
+        <w:lastRenderedPageBreak/>
+        <w:t xml:space="preserve">stored as separate exemplars that do not affect listeners’ categorization decisions for audio-only speech inputs—i.e., the type of speech input that has been used in the test phase of </w:t>
       </w:r>
       <w:r>
         <w:rPr>
@@ -23641,7 +23759,7 @@
         </w:rPr>
         <w:t xml:space="preserve"> </w:t>
       </w:r>
-      <w:del w:id="134" w:author="Jaeger, Florian" w:date="2025-05-21T14:34:00Z" w16du:dateUtc="2025-05-21T18:34:00Z">
+      <w:del w:id="153" w:author="Jaeger, Florian" w:date="2025-05-21T14:34:00Z" w16du:dateUtc="2025-05-21T18:34:00Z">
         <w:r>
           <w:rPr>
             <w:szCs w:val="22"/>
@@ -23649,7 +23767,7 @@
           <w:delText xml:space="preserve">While some of these accounts (in particular the causal inference account) have conceptual similarities to compensation, </w:delText>
         </w:r>
       </w:del>
-      <w:del w:id="135" w:author="Jaeger, Florian" w:date="2025-05-21T14:33:00Z" w16du:dateUtc="2025-05-21T18:33:00Z">
+      <w:del w:id="154" w:author="Jaeger, Florian" w:date="2025-05-21T14:33:00Z" w16du:dateUtc="2025-05-21T18:33:00Z">
         <w:r>
           <w:rPr>
             <w:szCs w:val="22"/>
@@ -23657,22 +23775,15 @@
           <w:delText>previously offered</w:delText>
         </w:r>
       </w:del>
-      <w:ins w:id="136" w:author="Jaeger, Florian" w:date="2025-05-21T14:34:00Z" w16du:dateUtc="2025-05-21T18:34:00Z">
+      <w:ins w:id="155" w:author="Jaeger, Florian" w:date="2025-05-21T14:34:00Z" w16du:dateUtc="2025-05-21T18:34:00Z">
         <w:r>
           <w:rPr>
             <w:szCs w:val="22"/>
           </w:rPr>
-          <w:t xml:space="preserve">Despite important similarities between these </w:t>
-        </w:r>
-        <w:r>
-          <w:rPr>
-            <w:szCs w:val="22"/>
-          </w:rPr>
-          <w:lastRenderedPageBreak/>
-          <w:t>different accounts, all</w:t>
+          <w:t>Despite important similarities between these different accounts, all</w:t>
         </w:r>
       </w:ins>
-      <w:ins w:id="137" w:author="Jaeger, Florian" w:date="2025-05-21T14:33:00Z" w16du:dateUtc="2025-05-21T18:33:00Z">
+      <w:ins w:id="156" w:author="Jaeger, Florian" w:date="2025-05-21T14:33:00Z" w16du:dateUtc="2025-05-21T18:33:00Z">
         <w:r>
           <w:rPr>
             <w:szCs w:val="22"/>
@@ -24093,7 +24204,14 @@
         <w:rPr>
           <w:szCs w:val="22"/>
         </w:rPr>
-        <w:t>If an explanation along these lines turns out to be correct, this would also preempt the need to evoke memory (Kraljic &amp; Samuel, 2011) or learning mechanisms (Kraljic et al., 2008).</w:t>
+        <w:t xml:space="preserve">If an explanation along these lines </w:t>
+      </w:r>
+      <w:r>
+        <w:rPr>
+          <w:szCs w:val="22"/>
+        </w:rPr>
+        <w:lastRenderedPageBreak/>
+        <w:t>turns out to be correct, this would also preempt the need to evoke memory (Kraljic &amp; Samuel, 2011) or learning mechanisms (Kraljic et al., 2008).</w:t>
       </w:r>
       <w:r>
         <w:rPr>
@@ -24566,21 +24684,7 @@
         <w:rPr>
           <w:szCs w:val="22"/>
         </w:rPr>
-        <w:t xml:space="preserve">, PS 19(4). Retrieved from </w:t>
-      </w:r>
-      <w:proofErr w:type="gramStart"/>
-      <w:r>
-        <w:rPr>
-          <w:szCs w:val="22"/>
-        </w:rPr>
-        <w:t>osf.io.pj</w:t>
-      </w:r>
-      <w:proofErr w:type="gramEnd"/>
-      <w:r>
-        <w:rPr>
-          <w:szCs w:val="22"/>
-        </w:rPr>
-        <w:t xml:space="preserve">5hb. </w:t>
+        <w:t xml:space="preserve">, PS 19(4). Retrieved from osf.io.pj5hb. </w:t>
       </w:r>
     </w:p>
     <w:p>
@@ -24627,11 +24731,19 @@
         </w:rPr>
       </w:pPr>
       <w:hyperlink w:history="1"/>
-      <w:r>
-        <w:rPr>
-          <w:szCs w:val="22"/>
-        </w:rPr>
-        <w:t xml:space="preserve">Bejjanki, </w:t>
+      <w:proofErr w:type="spellStart"/>
+      <w:r>
+        <w:rPr>
+          <w:szCs w:val="22"/>
+        </w:rPr>
+        <w:t>Bejjanki</w:t>
+      </w:r>
+      <w:proofErr w:type="spellEnd"/>
+      <w:r>
+        <w:rPr>
+          <w:szCs w:val="22"/>
+        </w:rPr>
+        <w:t xml:space="preserve">, </w:t>
       </w:r>
       <w:r>
         <w:rPr>
@@ -24661,7 +24773,21 @@
         <w:rPr>
           <w:szCs w:val="22"/>
         </w:rPr>
-        <w:t>, Clayards M</w:t>
+        <w:t xml:space="preserve">, </w:t>
+      </w:r>
+      <w:proofErr w:type="spellStart"/>
+      <w:r>
+        <w:rPr>
+          <w:szCs w:val="22"/>
+        </w:rPr>
+        <w:t>Clayards</w:t>
+      </w:r>
+      <w:proofErr w:type="spellEnd"/>
+      <w:r>
+        <w:rPr>
+          <w:szCs w:val="22"/>
+        </w:rPr>
+        <w:t xml:space="preserve"> M</w:t>
       </w:r>
       <w:r>
         <w:rPr>
@@ -24980,21 +25106,7 @@
         <w:rPr>
           <w:szCs w:val="22"/>
         </w:rPr>
-        <w:t xml:space="preserve">Fowler, C. A. (2004). Speech as a </w:t>
-      </w:r>
-      <w:proofErr w:type="spellStart"/>
-      <w:r>
-        <w:rPr>
-          <w:szCs w:val="22"/>
-        </w:rPr>
-        <w:t>Supramodal</w:t>
-      </w:r>
-      <w:proofErr w:type="spellEnd"/>
-      <w:r>
-        <w:rPr>
-          <w:szCs w:val="22"/>
-        </w:rPr>
-        <w:t xml:space="preserve"> or </w:t>
+        <w:t xml:space="preserve">Fowler, C. A. (2004). Speech as a Supramodal or </w:t>
       </w:r>
       <w:proofErr w:type="spellStart"/>
       <w:r>
@@ -25541,21 +25653,7 @@
         <w:rPr>
           <w:szCs w:val="22"/>
         </w:rPr>
-        <w:t xml:space="preserve">Kraljic, T., &amp; Samuel, A. G. (2011). Perceptual learning evidence for </w:t>
-      </w:r>
-      <w:proofErr w:type="gramStart"/>
-      <w:r>
-        <w:rPr>
-          <w:szCs w:val="22"/>
-        </w:rPr>
-        <w:t>contextually-specific</w:t>
-      </w:r>
-      <w:proofErr w:type="gramEnd"/>
-      <w:r>
-        <w:rPr>
-          <w:szCs w:val="22"/>
-        </w:rPr>
-        <w:t xml:space="preserve"> representations. </w:t>
+        <w:t xml:space="preserve">Kraljic, T., &amp; Samuel, A. G. (2011). Perceptual learning evidence for contextually-specific representations. </w:t>
       </w:r>
       <w:r>
         <w:rPr>
@@ -26844,8 +26942,8 @@
 </file>
 
 <file path=word/comments.xml><?xml version="1.0" encoding="utf-8"?>
-<w:comments xmlns:wpc="http://schemas.microsoft.com/office/word/2010/wordprocessingCanvas" xmlns:cx="http://schemas.microsoft.com/office/drawing/2014/chartex" xmlns:cx1="http://schemas.microsoft.com/office/drawing/2015/9/8/chartex" xmlns:cx2="http://schemas.microsoft.com/office/drawing/2015/10/21/chartex" xmlns:cx3="http://schemas.microsoft.com/office/drawing/2016/5/9/chartex" xmlns:cx4="http://schemas.microsoft.com/office/drawing/2016/5/10/chartex" xmlns:cx5="http://schemas.microsoft.com/office/drawing/2016/5/11/chartex" xmlns:cx6="http://schemas.microsoft.com/office/drawing/2016/5/12/chartex" xmlns:cx7="http://schemas.microsoft.com/office/drawing/2016/5/13/chartex" xmlns:cx8="http://schemas.microsoft.com/office/drawing/2016/5/14/chartex" xmlns:mc="http://schemas.openxmlformats.org/markup-compatibility/2006" xmlns:aink="http://schemas.microsoft.com/office/drawing/2016/ink" xmlns:am3d="http://schemas.microsoft.com/office/drawing/2017/model3d" xmlns:o="urn:schemas-microsoft-com:office:office" xmlns:oel="http://schemas.microsoft.com/office/2019/extlst" xmlns:r="http://schemas.openxmlformats.org/officeDocument/2006/relationships" xmlns:m="http://schemas.openxmlformats.org/officeDocument/2006/math" xmlns:v="urn:schemas-microsoft-com:vml" xmlns:wp14="http://schemas.microsoft.com/office/word/2010/wordprocessingDrawing" xmlns:wp="http://schemas.openxmlformats.org/drawingml/2006/wordprocessingDrawing" xmlns:w10="urn:schemas-microsoft-com:office:word" xmlns:w="http://schemas.openxmlformats.org/wordprocessingml/2006/main" xmlns:w14="http://schemas.microsoft.com/office/word/2010/wordml" xmlns:w15="http://schemas.microsoft.com/office/word/2012/wordml" xmlns:w16cex="http://schemas.microsoft.com/office/word/2018/wordml/cex" xmlns:w16cid="http://schemas.microsoft.com/office/word/2016/wordml/cid" xmlns:w16="http://schemas.microsoft.com/office/word/2018/wordml" xmlns:w16du="http://schemas.microsoft.com/office/word/2023/wordml/word16du" xmlns:w16sdtdh="http://schemas.microsoft.com/office/word/2020/wordml/sdtdatahash" xmlns:w16sdtfl="http://schemas.microsoft.com/office/word/2024/wordml/sdtformatlock" xmlns:w16se="http://schemas.microsoft.com/office/word/2015/wordml/symex" xmlns:wpg="http://schemas.microsoft.com/office/word/2010/wordprocessingGroup" xmlns:wpi="http://schemas.microsoft.com/office/word/2010/wordprocessingInk" xmlns:wne="http://schemas.microsoft.com/office/word/2006/wordml" xmlns:wps="http://schemas.microsoft.com/office/word/2010/wordprocessingShape" mc:Ignorable="w14 w15 w16se w16cid w16 w16cex w16sdtdh w16sdtfl w16du wp14">
-  <w:comment w:id="5" w:author="Jaeger, Florian" w:date="2025-05-21T14:29:00Z" w:initials="TJ">
+<w:comments xmlns:wpc="http://schemas.microsoft.com/office/word/2010/wordprocessingCanvas" xmlns:cx="http://schemas.microsoft.com/office/drawing/2014/chartex" xmlns:cx1="http://schemas.microsoft.com/office/drawing/2015/9/8/chartex" xmlns:cx2="http://schemas.microsoft.com/office/drawing/2015/10/21/chartex" xmlns:cx3="http://schemas.microsoft.com/office/drawing/2016/5/9/chartex" xmlns:cx4="http://schemas.microsoft.com/office/drawing/2016/5/10/chartex" xmlns:cx5="http://schemas.microsoft.com/office/drawing/2016/5/11/chartex" xmlns:cx6="http://schemas.microsoft.com/office/drawing/2016/5/12/chartex" xmlns:cx7="http://schemas.microsoft.com/office/drawing/2016/5/13/chartex" xmlns:cx8="http://schemas.microsoft.com/office/drawing/2016/5/14/chartex" xmlns:mc="http://schemas.openxmlformats.org/markup-compatibility/2006" xmlns:aink="http://schemas.microsoft.com/office/drawing/2016/ink" xmlns:am3d="http://schemas.microsoft.com/office/drawing/2017/model3d" xmlns:o="urn:schemas-microsoft-com:office:office" xmlns:oel="http://schemas.microsoft.com/office/2019/extlst" xmlns:r="http://schemas.openxmlformats.org/officeDocument/2006/relationships" xmlns:m="http://schemas.openxmlformats.org/officeDocument/2006/math" xmlns:v="urn:schemas-microsoft-com:vml" xmlns:wp14="http://schemas.microsoft.com/office/word/2010/wordprocessingDrawing" xmlns:wp="http://schemas.openxmlformats.org/drawingml/2006/wordprocessingDrawing" xmlns:w10="urn:schemas-microsoft-com:office:word" xmlns:w="http://schemas.openxmlformats.org/wordprocessingml/2006/main" xmlns:w14="http://schemas.microsoft.com/office/word/2010/wordml" xmlns:w15="http://schemas.microsoft.com/office/word/2012/wordml" xmlns:w16cex="http://schemas.microsoft.com/office/word/2018/wordml/cex" xmlns:w16cid="http://schemas.microsoft.com/office/word/2016/wordml/cid" xmlns:w16="http://schemas.microsoft.com/office/word/2018/wordml" xmlns:w16du="http://schemas.microsoft.com/office/word/2023/wordml/word16du" xmlns:w16sdtdh="http://schemas.microsoft.com/office/word/2020/wordml/sdtdatahash" xmlns:w16se="http://schemas.microsoft.com/office/word/2015/wordml/symex" xmlns:wpg="http://schemas.microsoft.com/office/word/2010/wordprocessingGroup" xmlns:wpi="http://schemas.microsoft.com/office/word/2010/wordprocessingInk" xmlns:wne="http://schemas.microsoft.com/office/word/2006/wordml" xmlns:wps="http://schemas.microsoft.com/office/word/2010/wordprocessingShape" mc:Ignorable="w14 w15 w16se w16cid w16 w16cex w16sdtdh w16du wp14">
+  <w:comment w:id="0" w:author="Cummings, Shawn" w:date="2025-05-22T11:05:00Z" w:initials="SC">
     <w:p>
       <w:pPr>
         <w:jc w:val="left"/>
@@ -26857,14 +26955,11 @@
         <w:annotationRef/>
       </w:r>
       <w:r>
-        <w:rPr>
-          <w:color w:val="000000"/>
-        </w:rPr>
-        <w:t>update/check</w:t>
+        <w:t>Edit this at very end</w:t>
       </w:r>
     </w:p>
   </w:comment>
-  <w:comment w:id="24" w:author="Jaeger, Florian" w:date="2025-05-21T14:30:00Z" w:initials="TJ">
+  <w:comment w:id="6" w:author="Jaeger, Florian" w:date="2025-05-21T14:29:00Z" w:initials="TJ">
     <w:p>
       <w:pPr>
         <w:jc w:val="left"/>
@@ -26879,11 +26974,11 @@
         <w:rPr>
           <w:color w:val="000000"/>
         </w:rPr>
-        <w:t>fill in</w:t>
+        <w:t>update/check</w:t>
       </w:r>
     </w:p>
   </w:comment>
-  <w:comment w:id="35" w:author="Jaeger, Florian" w:date="2025-05-21T14:31:00Z" w:initials="TJ">
+  <w:comment w:id="25" w:author="Jaeger, Florian" w:date="2025-05-21T14:30:00Z" w:initials="TJ">
     <w:p>
       <w:pPr>
         <w:jc w:val="left"/>
@@ -26898,11 +26993,11 @@
         <w:rPr>
           <w:color w:val="000000"/>
         </w:rPr>
-        <w:t>check</w:t>
+        <w:t>fill in</w:t>
       </w:r>
     </w:p>
   </w:comment>
-  <w:comment w:id="115" w:author="Jaeger, Florian" w:date="2025-05-21T14:31:00Z" w:initials="TJ">
+  <w:comment w:id="36" w:author="Jaeger, Florian" w:date="2025-05-21T14:31:00Z" w:initials="TJ">
     <w:p>
       <w:pPr>
         <w:jc w:val="left"/>
@@ -26917,11 +27012,30 @@
         <w:rPr>
           <w:color w:val="000000"/>
         </w:rPr>
-        <w:t>update</w:t>
+        <w:t>check</w:t>
       </w:r>
     </w:p>
   </w:comment>
-  <w:comment w:id="127" w:author="Jaeger, Florian" w:date="2025-05-11T16:19:00Z" w:initials="TJ">
+  <w:comment w:id="116" w:author="Jaeger, Florian" w:date="2025-05-21T14:31:00Z" w:initials="TJ">
+    <w:p>
+      <w:pPr>
+        <w:jc w:val="left"/>
+      </w:pPr>
+      <w:r>
+        <w:rPr>
+          <w:rStyle w:val="CommentReference"/>
+        </w:rPr>
+        <w:annotationRef/>
+      </w:r>
+      <w:r>
+        <w:rPr>
+          <w:color w:val="000000"/>
+        </w:rPr>
+        <w:t>update</w:t>
+      </w:r>
+    </w:p>
+  </w:comment>
+  <w:comment w:id="128" w:author="Jaeger, Florian" w:date="2025-05-11T16:19:00Z" w:initials="TJ">
     <w:p>
       <w:pPr>
         <w:jc w:val="left"/>
@@ -26951,7 +27065,7 @@
       </w:r>
     </w:p>
   </w:comment>
-  <w:comment w:id="128" w:author="Cummings, Shawn" w:date="2025-05-12T20:37:00Z" w:initials="SC">
+  <w:comment w:id="129" w:author="Cummings, Shawn" w:date="2025-05-12T20:37:00Z" w:initials="SC">
     <w:p>
       <w:pPr>
         <w:jc w:val="left"/>
@@ -26971,7 +27085,8 @@
 </file>
 
 <file path=word/commentsExtended.xml><?xml version="1.0" encoding="utf-8"?>
-<w15:commentsEx xmlns:wpc="http://schemas.microsoft.com/office/word/2010/wordprocessingCanvas" xmlns:cx="http://schemas.microsoft.com/office/drawing/2014/chartex" xmlns:cx1="http://schemas.microsoft.com/office/drawing/2015/9/8/chartex" xmlns:cx2="http://schemas.microsoft.com/office/drawing/2015/10/21/chartex" xmlns:cx3="http://schemas.microsoft.com/office/drawing/2016/5/9/chartex" xmlns:cx4="http://schemas.microsoft.com/office/drawing/2016/5/10/chartex" xmlns:cx5="http://schemas.microsoft.com/office/drawing/2016/5/11/chartex" xmlns:cx6="http://schemas.microsoft.com/office/drawing/2016/5/12/chartex" xmlns:cx7="http://schemas.microsoft.com/office/drawing/2016/5/13/chartex" xmlns:cx8="http://schemas.microsoft.com/office/drawing/2016/5/14/chartex" xmlns:mc="http://schemas.openxmlformats.org/markup-compatibility/2006" xmlns:aink="http://schemas.microsoft.com/office/drawing/2016/ink" xmlns:am3d="http://schemas.microsoft.com/office/drawing/2017/model3d" xmlns:o="urn:schemas-microsoft-com:office:office" xmlns:oel="http://schemas.microsoft.com/office/2019/extlst" xmlns:r="http://schemas.openxmlformats.org/officeDocument/2006/relationships" xmlns:m="http://schemas.openxmlformats.org/officeDocument/2006/math" xmlns:v="urn:schemas-microsoft-com:vml" xmlns:wp14="http://schemas.microsoft.com/office/word/2010/wordprocessingDrawing" xmlns:wp="http://schemas.openxmlformats.org/drawingml/2006/wordprocessingDrawing" xmlns:w10="urn:schemas-microsoft-com:office:word" xmlns:w="http://schemas.openxmlformats.org/wordprocessingml/2006/main" xmlns:w14="http://schemas.microsoft.com/office/word/2010/wordml" xmlns:w15="http://schemas.microsoft.com/office/word/2012/wordml" xmlns:w16cex="http://schemas.microsoft.com/office/word/2018/wordml/cex" xmlns:w16cid="http://schemas.microsoft.com/office/word/2016/wordml/cid" xmlns:w16="http://schemas.microsoft.com/office/word/2018/wordml" xmlns:w16du="http://schemas.microsoft.com/office/word/2023/wordml/word16du" xmlns:w16sdtdh="http://schemas.microsoft.com/office/word/2020/wordml/sdtdatahash" xmlns:w16sdtfl="http://schemas.microsoft.com/office/word/2024/wordml/sdtformatlock" xmlns:w16se="http://schemas.microsoft.com/office/word/2015/wordml/symex" xmlns:wpg="http://schemas.microsoft.com/office/word/2010/wordprocessingGroup" xmlns:wpi="http://schemas.microsoft.com/office/word/2010/wordprocessingInk" xmlns:wne="http://schemas.microsoft.com/office/word/2006/wordml" xmlns:wps="http://schemas.microsoft.com/office/word/2010/wordprocessingShape" mc:Ignorable="w14 w15 w16se w16cid w16 w16cex w16sdtdh w16sdtfl w16du wp14">
+<w15:commentsEx xmlns:wpc="http://schemas.microsoft.com/office/word/2010/wordprocessingCanvas" xmlns:cx="http://schemas.microsoft.com/office/drawing/2014/chartex" xmlns:cx1="http://schemas.microsoft.com/office/drawing/2015/9/8/chartex" xmlns:cx2="http://schemas.microsoft.com/office/drawing/2015/10/21/chartex" xmlns:cx3="http://schemas.microsoft.com/office/drawing/2016/5/9/chartex" xmlns:cx4="http://schemas.microsoft.com/office/drawing/2016/5/10/chartex" xmlns:cx5="http://schemas.microsoft.com/office/drawing/2016/5/11/chartex" xmlns:cx6="http://schemas.microsoft.com/office/drawing/2016/5/12/chartex" xmlns:cx7="http://schemas.microsoft.com/office/drawing/2016/5/13/chartex" xmlns:cx8="http://schemas.microsoft.com/office/drawing/2016/5/14/chartex" xmlns:mc="http://schemas.openxmlformats.org/markup-compatibility/2006" xmlns:aink="http://schemas.microsoft.com/office/drawing/2016/ink" xmlns:am3d="http://schemas.microsoft.com/office/drawing/2017/model3d" xmlns:o="urn:schemas-microsoft-com:office:office" xmlns:oel="http://schemas.microsoft.com/office/2019/extlst" xmlns:r="http://schemas.openxmlformats.org/officeDocument/2006/relationships" xmlns:m="http://schemas.openxmlformats.org/officeDocument/2006/math" xmlns:v="urn:schemas-microsoft-com:vml" xmlns:wp14="http://schemas.microsoft.com/office/word/2010/wordprocessingDrawing" xmlns:wp="http://schemas.openxmlformats.org/drawingml/2006/wordprocessingDrawing" xmlns:w10="urn:schemas-microsoft-com:office:word" xmlns:w="http://schemas.openxmlformats.org/wordprocessingml/2006/main" xmlns:w14="http://schemas.microsoft.com/office/word/2010/wordml" xmlns:w15="http://schemas.microsoft.com/office/word/2012/wordml" xmlns:w16cex="http://schemas.microsoft.com/office/word/2018/wordml/cex" xmlns:w16cid="http://schemas.microsoft.com/office/word/2016/wordml/cid" xmlns:w16="http://schemas.microsoft.com/office/word/2018/wordml" xmlns:w16du="http://schemas.microsoft.com/office/word/2023/wordml/word16du" xmlns:w16sdtdh="http://schemas.microsoft.com/office/word/2020/wordml/sdtdatahash" xmlns:w16se="http://schemas.microsoft.com/office/word/2015/wordml/symex" xmlns:wpg="http://schemas.microsoft.com/office/word/2010/wordprocessingGroup" xmlns:wpi="http://schemas.microsoft.com/office/word/2010/wordprocessingInk" xmlns:wne="http://schemas.microsoft.com/office/word/2006/wordml" xmlns:wps="http://schemas.microsoft.com/office/word/2010/wordprocessingShape" mc:Ignorable="w14 w15 w16se w16cid w16 w16cex w16sdtdh w16du wp14">
+  <w15:commentEx w15:paraId="506C42D4" w15:done="0"/>
   <w15:commentEx w15:paraId="40D69938" w15:done="0"/>
   <w15:commentEx w15:paraId="387C296F" w15:done="0"/>
   <w15:commentEx w15:paraId="0F9A3FC6" w15:done="0"/>
@@ -26982,7 +27097,8 @@
 </file>
 
 <file path=word/commentsExtensible.xml><?xml version="1.0" encoding="utf-8"?>
-<w16cex:commentsExtensible xmlns:wpc="http://schemas.microsoft.com/office/word/2010/wordprocessingCanvas" xmlns:cx="http://schemas.microsoft.com/office/drawing/2014/chartex" xmlns:cx1="http://schemas.microsoft.com/office/drawing/2015/9/8/chartex" xmlns:cx2="http://schemas.microsoft.com/office/drawing/2015/10/21/chartex" xmlns:cx3="http://schemas.microsoft.com/office/drawing/2016/5/9/chartex" xmlns:cx4="http://schemas.microsoft.com/office/drawing/2016/5/10/chartex" xmlns:cx5="http://schemas.microsoft.com/office/drawing/2016/5/11/chartex" xmlns:cx6="http://schemas.microsoft.com/office/drawing/2016/5/12/chartex" xmlns:cx7="http://schemas.microsoft.com/office/drawing/2016/5/13/chartex" xmlns:cx8="http://schemas.microsoft.com/office/drawing/2016/5/14/chartex" xmlns:cr="http://schemas.microsoft.com/office/comments/2020/reactions" xmlns:mc="http://schemas.openxmlformats.org/markup-compatibility/2006" xmlns:aink="http://schemas.microsoft.com/office/drawing/2016/ink" xmlns:am3d="http://schemas.microsoft.com/office/drawing/2017/model3d" xmlns:o="urn:schemas-microsoft-com:office:office" xmlns:oel="http://schemas.microsoft.com/office/2019/extlst" xmlns:r="http://schemas.openxmlformats.org/officeDocument/2006/relationships" xmlns:m="http://schemas.openxmlformats.org/officeDocument/2006/math" xmlns:v="urn:schemas-microsoft-com:vml" xmlns:wp14="http://schemas.microsoft.com/office/word/2010/wordprocessingDrawing" xmlns:wp="http://schemas.openxmlformats.org/drawingml/2006/wordprocessingDrawing" xmlns:w10="urn:schemas-microsoft-com:office:word" xmlns:w="http://schemas.openxmlformats.org/wordprocessingml/2006/main" xmlns:w14="http://schemas.microsoft.com/office/word/2010/wordml" xmlns:w15="http://schemas.microsoft.com/office/word/2012/wordml" xmlns:w16cex="http://schemas.microsoft.com/office/word/2018/wordml/cex" xmlns:w16cid="http://schemas.microsoft.com/office/word/2016/wordml/cid" xmlns:w16="http://schemas.microsoft.com/office/word/2018/wordml" xmlns:w16du="http://schemas.microsoft.com/office/word/2023/wordml/word16du" xmlns:w16sdtdh="http://schemas.microsoft.com/office/word/2020/wordml/sdtdatahash" xmlns:w16sdtfl="http://schemas.microsoft.com/office/word/2024/wordml/sdtformatlock" xmlns:w16se="http://schemas.microsoft.com/office/word/2015/wordml/symex" xmlns:wpg="http://schemas.microsoft.com/office/word/2010/wordprocessingGroup" xmlns:wpi="http://schemas.microsoft.com/office/word/2010/wordprocessingInk" xmlns:wne="http://schemas.microsoft.com/office/word/2006/wordml" xmlns:wps="http://schemas.microsoft.com/office/word/2010/wordprocessingShape" mc:Ignorable="w14 w15 w16se w16cid w16 w16cex w16sdtdh w16sdtfl cr w16du wp14">
+<w16cex:commentsExtensible xmlns:wpc="http://schemas.microsoft.com/office/word/2010/wordprocessingCanvas" xmlns:cx="http://schemas.microsoft.com/office/drawing/2014/chartex" xmlns:cx1="http://schemas.microsoft.com/office/drawing/2015/9/8/chartex" xmlns:cx2="http://schemas.microsoft.com/office/drawing/2015/10/21/chartex" xmlns:cx3="http://schemas.microsoft.com/office/drawing/2016/5/9/chartex" xmlns:cx4="http://schemas.microsoft.com/office/drawing/2016/5/10/chartex" xmlns:cx5="http://schemas.microsoft.com/office/drawing/2016/5/11/chartex" xmlns:cx6="http://schemas.microsoft.com/office/drawing/2016/5/12/chartex" xmlns:cx7="http://schemas.microsoft.com/office/drawing/2016/5/13/chartex" xmlns:cx8="http://schemas.microsoft.com/office/drawing/2016/5/14/chartex" xmlns:cr="http://schemas.microsoft.com/office/comments/2020/reactions" xmlns:mc="http://schemas.openxmlformats.org/markup-compatibility/2006" xmlns:aink="http://schemas.microsoft.com/office/drawing/2016/ink" xmlns:am3d="http://schemas.microsoft.com/office/drawing/2017/model3d" xmlns:o="urn:schemas-microsoft-com:office:office" xmlns:oel="http://schemas.microsoft.com/office/2019/extlst" xmlns:r="http://schemas.openxmlformats.org/officeDocument/2006/relationships" xmlns:m="http://schemas.openxmlformats.org/officeDocument/2006/math" xmlns:v="urn:schemas-microsoft-com:vml" xmlns:wp14="http://schemas.microsoft.com/office/word/2010/wordprocessingDrawing" xmlns:wp="http://schemas.openxmlformats.org/drawingml/2006/wordprocessingDrawing" xmlns:w10="urn:schemas-microsoft-com:office:word" xmlns:w="http://schemas.openxmlformats.org/wordprocessingml/2006/main" xmlns:w14="http://schemas.microsoft.com/office/word/2010/wordml" xmlns:w15="http://schemas.microsoft.com/office/word/2012/wordml" xmlns:w16cex="http://schemas.microsoft.com/office/word/2018/wordml/cex" xmlns:w16cid="http://schemas.microsoft.com/office/word/2016/wordml/cid" xmlns:w16="http://schemas.microsoft.com/office/word/2018/wordml" xmlns:w16du="http://schemas.microsoft.com/office/word/2023/wordml/word16du" xmlns:w16sdtdh="http://schemas.microsoft.com/office/word/2020/wordml/sdtdatahash" xmlns:w16se="http://schemas.microsoft.com/office/word/2015/wordml/symex" xmlns:wpg="http://schemas.microsoft.com/office/word/2010/wordprocessingGroup" xmlns:wpi="http://schemas.microsoft.com/office/word/2010/wordprocessingInk" xmlns:wne="http://schemas.microsoft.com/office/word/2006/wordml" xmlns:wps="http://schemas.microsoft.com/office/word/2010/wordprocessingShape" mc:Ignorable="w14 w15 w16se w16cid w16 w16cex w16sdtdh cr w16du wp14">
+  <w16cex:commentExtensible w16cex:durableId="680F15F3" w16cex:dateUtc="2025-05-22T15:05:00Z"/>
   <w16cex:commentExtensible w16cex:durableId="65EAFE2B" w16cex:dateUtc="2025-05-21T18:29:00Z"/>
   <w16cex:commentExtensible w16cex:durableId="7658D23A" w16cex:dateUtc="2025-05-21T18:30:00Z"/>
   <w16cex:commentExtensible w16cex:durableId="24F37F1B" w16cex:dateUtc="2025-05-21T18:31:00Z"/>
@@ -26993,7 +27109,8 @@
 </file>
 
 <file path=word/commentsIds.xml><?xml version="1.0" encoding="utf-8"?>
-<w16cid:commentsIds xmlns:wpc="http://schemas.microsoft.com/office/word/2010/wordprocessingCanvas" xmlns:cx="http://schemas.microsoft.com/office/drawing/2014/chartex" xmlns:cx1="http://schemas.microsoft.com/office/drawing/2015/9/8/chartex" xmlns:cx2="http://schemas.microsoft.com/office/drawing/2015/10/21/chartex" xmlns:cx3="http://schemas.microsoft.com/office/drawing/2016/5/9/chartex" xmlns:cx4="http://schemas.microsoft.com/office/drawing/2016/5/10/chartex" xmlns:cx5="http://schemas.microsoft.com/office/drawing/2016/5/11/chartex" xmlns:cx6="http://schemas.microsoft.com/office/drawing/2016/5/12/chartex" xmlns:cx7="http://schemas.microsoft.com/office/drawing/2016/5/13/chartex" xmlns:cx8="http://schemas.microsoft.com/office/drawing/2016/5/14/chartex" xmlns:mc="http://schemas.openxmlformats.org/markup-compatibility/2006" xmlns:aink="http://schemas.microsoft.com/office/drawing/2016/ink" xmlns:am3d="http://schemas.microsoft.com/office/drawing/2017/model3d" xmlns:o="urn:schemas-microsoft-com:office:office" xmlns:oel="http://schemas.microsoft.com/office/2019/extlst" xmlns:r="http://schemas.openxmlformats.org/officeDocument/2006/relationships" xmlns:m="http://schemas.openxmlformats.org/officeDocument/2006/math" xmlns:v="urn:schemas-microsoft-com:vml" xmlns:wp14="http://schemas.microsoft.com/office/word/2010/wordprocessingDrawing" xmlns:wp="http://schemas.openxmlformats.org/drawingml/2006/wordprocessingDrawing" xmlns:w10="urn:schemas-microsoft-com:office:word" xmlns:w="http://schemas.openxmlformats.org/wordprocessingml/2006/main" xmlns:w14="http://schemas.microsoft.com/office/word/2010/wordml" xmlns:w15="http://schemas.microsoft.com/office/word/2012/wordml" xmlns:w16cex="http://schemas.microsoft.com/office/word/2018/wordml/cex" xmlns:w16cid="http://schemas.microsoft.com/office/word/2016/wordml/cid" xmlns:w16="http://schemas.microsoft.com/office/word/2018/wordml" xmlns:w16du="http://schemas.microsoft.com/office/word/2023/wordml/word16du" xmlns:w16sdtdh="http://schemas.microsoft.com/office/word/2020/wordml/sdtdatahash" xmlns:w16sdtfl="http://schemas.microsoft.com/office/word/2024/wordml/sdtformatlock" xmlns:w16se="http://schemas.microsoft.com/office/word/2015/wordml/symex" xmlns:wpg="http://schemas.microsoft.com/office/word/2010/wordprocessingGroup" xmlns:wpi="http://schemas.microsoft.com/office/word/2010/wordprocessingInk" xmlns:wne="http://schemas.microsoft.com/office/word/2006/wordml" xmlns:wps="http://schemas.microsoft.com/office/word/2010/wordprocessingShape" mc:Ignorable="w14 w15 w16se w16cid w16 w16cex w16sdtdh w16sdtfl w16du wp14">
+<w16cid:commentsIds xmlns:wpc="http://schemas.microsoft.com/office/word/2010/wordprocessingCanvas" xmlns:cx="http://schemas.microsoft.com/office/drawing/2014/chartex" xmlns:cx1="http://schemas.microsoft.com/office/drawing/2015/9/8/chartex" xmlns:cx2="http://schemas.microsoft.com/office/drawing/2015/10/21/chartex" xmlns:cx3="http://schemas.microsoft.com/office/drawing/2016/5/9/chartex" xmlns:cx4="http://schemas.microsoft.com/office/drawing/2016/5/10/chartex" xmlns:cx5="http://schemas.microsoft.com/office/drawing/2016/5/11/chartex" xmlns:cx6="http://schemas.microsoft.com/office/drawing/2016/5/12/chartex" xmlns:cx7="http://schemas.microsoft.com/office/drawing/2016/5/13/chartex" xmlns:cx8="http://schemas.microsoft.com/office/drawing/2016/5/14/chartex" xmlns:mc="http://schemas.openxmlformats.org/markup-compatibility/2006" xmlns:aink="http://schemas.microsoft.com/office/drawing/2016/ink" xmlns:am3d="http://schemas.microsoft.com/office/drawing/2017/model3d" xmlns:o="urn:schemas-microsoft-com:office:office" xmlns:oel="http://schemas.microsoft.com/office/2019/extlst" xmlns:r="http://schemas.openxmlformats.org/officeDocument/2006/relationships" xmlns:m="http://schemas.openxmlformats.org/officeDocument/2006/math" xmlns:v="urn:schemas-microsoft-com:vml" xmlns:wp14="http://schemas.microsoft.com/office/word/2010/wordprocessingDrawing" xmlns:wp="http://schemas.openxmlformats.org/drawingml/2006/wordprocessingDrawing" xmlns:w10="urn:schemas-microsoft-com:office:word" xmlns:w="http://schemas.openxmlformats.org/wordprocessingml/2006/main" xmlns:w14="http://schemas.microsoft.com/office/word/2010/wordml" xmlns:w15="http://schemas.microsoft.com/office/word/2012/wordml" xmlns:w16cex="http://schemas.microsoft.com/office/word/2018/wordml/cex" xmlns:w16cid="http://schemas.microsoft.com/office/word/2016/wordml/cid" xmlns:w16="http://schemas.microsoft.com/office/word/2018/wordml" xmlns:w16du="http://schemas.microsoft.com/office/word/2023/wordml/word16du" xmlns:w16sdtdh="http://schemas.microsoft.com/office/word/2020/wordml/sdtdatahash" xmlns:w16se="http://schemas.microsoft.com/office/word/2015/wordml/symex" xmlns:wpg="http://schemas.microsoft.com/office/word/2010/wordprocessingGroup" xmlns:wpi="http://schemas.microsoft.com/office/word/2010/wordprocessingInk" xmlns:wne="http://schemas.microsoft.com/office/word/2006/wordml" xmlns:wps="http://schemas.microsoft.com/office/word/2010/wordprocessingShape" mc:Ignorable="w14 w15 w16se w16cid w16 w16cex w16sdtdh w16du wp14">
+  <w16cid:commentId w16cid:paraId="506C42D4" w16cid:durableId="680F15F3"/>
   <w16cid:commentId w16cid:paraId="40D69938" w16cid:durableId="65EAFE2B"/>
   <w16cid:commentId w16cid:paraId="387C296F" w16cid:durableId="7658D23A"/>
   <w16cid:commentId w16cid:paraId="0F9A3FC6" w16cid:durableId="24F37F1B"/>
@@ -27004,7 +27121,7 @@
 </file>
 
 <file path=word/endnotes.xml><?xml version="1.0" encoding="utf-8"?>
-<w:endnotes xmlns:wpc="http://schemas.microsoft.com/office/word/2010/wordprocessingCanvas" xmlns:cx="http://schemas.microsoft.com/office/drawing/2014/chartex" xmlns:cx1="http://schemas.microsoft.com/office/drawing/2015/9/8/chartex" xmlns:cx2="http://schemas.microsoft.com/office/drawing/2015/10/21/chartex" xmlns:cx3="http://schemas.microsoft.com/office/drawing/2016/5/9/chartex" xmlns:cx4="http://schemas.microsoft.com/office/drawing/2016/5/10/chartex" xmlns:cx5="http://schemas.microsoft.com/office/drawing/2016/5/11/chartex" xmlns:cx6="http://schemas.microsoft.com/office/drawing/2016/5/12/chartex" xmlns:cx7="http://schemas.microsoft.com/office/drawing/2016/5/13/chartex" xmlns:cx8="http://schemas.microsoft.com/office/drawing/2016/5/14/chartex" xmlns:mc="http://schemas.openxmlformats.org/markup-compatibility/2006" xmlns:aink="http://schemas.microsoft.com/office/drawing/2016/ink" xmlns:am3d="http://schemas.microsoft.com/office/drawing/2017/model3d" xmlns:o="urn:schemas-microsoft-com:office:office" xmlns:oel="http://schemas.microsoft.com/office/2019/extlst" xmlns:r="http://schemas.openxmlformats.org/officeDocument/2006/relationships" xmlns:m="http://schemas.openxmlformats.org/officeDocument/2006/math" xmlns:v="urn:schemas-microsoft-com:vml" xmlns:wp14="http://schemas.microsoft.com/office/word/2010/wordprocessingDrawing" xmlns:wp="http://schemas.openxmlformats.org/drawingml/2006/wordprocessingDrawing" xmlns:w10="urn:schemas-microsoft-com:office:word" xmlns:w="http://schemas.openxmlformats.org/wordprocessingml/2006/main" xmlns:w14="http://schemas.microsoft.com/office/word/2010/wordml" xmlns:w15="http://schemas.microsoft.com/office/word/2012/wordml" xmlns:w16cex="http://schemas.microsoft.com/office/word/2018/wordml/cex" xmlns:w16cid="http://schemas.microsoft.com/office/word/2016/wordml/cid" xmlns:w16="http://schemas.microsoft.com/office/word/2018/wordml" xmlns:w16du="http://schemas.microsoft.com/office/word/2023/wordml/word16du" xmlns:w16sdtdh="http://schemas.microsoft.com/office/word/2020/wordml/sdtdatahash" xmlns:w16sdtfl="http://schemas.microsoft.com/office/word/2024/wordml/sdtformatlock" xmlns:w16se="http://schemas.microsoft.com/office/word/2015/wordml/symex" xmlns:wpg="http://schemas.microsoft.com/office/word/2010/wordprocessingGroup" xmlns:wpi="http://schemas.microsoft.com/office/word/2010/wordprocessingInk" xmlns:wne="http://schemas.microsoft.com/office/word/2006/wordml" xmlns:wps="http://schemas.microsoft.com/office/word/2010/wordprocessingShape" mc:Ignorable="w14 w15 w16se w16cid w16 w16cex w16sdtdh w16sdtfl w16du wp14">
+<w:endnotes xmlns:wpc="http://schemas.microsoft.com/office/word/2010/wordprocessingCanvas" xmlns:cx="http://schemas.microsoft.com/office/drawing/2014/chartex" xmlns:cx1="http://schemas.microsoft.com/office/drawing/2015/9/8/chartex" xmlns:cx2="http://schemas.microsoft.com/office/drawing/2015/10/21/chartex" xmlns:cx3="http://schemas.microsoft.com/office/drawing/2016/5/9/chartex" xmlns:cx4="http://schemas.microsoft.com/office/drawing/2016/5/10/chartex" xmlns:cx5="http://schemas.microsoft.com/office/drawing/2016/5/11/chartex" xmlns:cx6="http://schemas.microsoft.com/office/drawing/2016/5/12/chartex" xmlns:cx7="http://schemas.microsoft.com/office/drawing/2016/5/13/chartex" xmlns:cx8="http://schemas.microsoft.com/office/drawing/2016/5/14/chartex" xmlns:mc="http://schemas.openxmlformats.org/markup-compatibility/2006" xmlns:aink="http://schemas.microsoft.com/office/drawing/2016/ink" xmlns:am3d="http://schemas.microsoft.com/office/drawing/2017/model3d" xmlns:o="urn:schemas-microsoft-com:office:office" xmlns:oel="http://schemas.microsoft.com/office/2019/extlst" xmlns:r="http://schemas.openxmlformats.org/officeDocument/2006/relationships" xmlns:m="http://schemas.openxmlformats.org/officeDocument/2006/math" xmlns:v="urn:schemas-microsoft-com:vml" xmlns:wp14="http://schemas.microsoft.com/office/word/2010/wordprocessingDrawing" xmlns:wp="http://schemas.openxmlformats.org/drawingml/2006/wordprocessingDrawing" xmlns:w10="urn:schemas-microsoft-com:office:word" xmlns:w="http://schemas.openxmlformats.org/wordprocessingml/2006/main" xmlns:w14="http://schemas.microsoft.com/office/word/2010/wordml" xmlns:w15="http://schemas.microsoft.com/office/word/2012/wordml" xmlns:w16cex="http://schemas.microsoft.com/office/word/2018/wordml/cex" xmlns:w16cid="http://schemas.microsoft.com/office/word/2016/wordml/cid" xmlns:w16="http://schemas.microsoft.com/office/word/2018/wordml" xmlns:w16du="http://schemas.microsoft.com/office/word/2023/wordml/word16du" xmlns:w16sdtdh="http://schemas.microsoft.com/office/word/2020/wordml/sdtdatahash" xmlns:w16se="http://schemas.microsoft.com/office/word/2015/wordml/symex" xmlns:wpg="http://schemas.microsoft.com/office/word/2010/wordprocessingGroup" xmlns:wpi="http://schemas.microsoft.com/office/word/2010/wordprocessingInk" xmlns:wne="http://schemas.microsoft.com/office/word/2006/wordml" xmlns:wps="http://schemas.microsoft.com/office/word/2010/wordprocessingShape" mc:Ignorable="w14 w15 w16se w16cid w16 w16cex w16sdtdh w16du wp14">
   <w:endnote w:type="separator" w:id="-1">
     <w:p>
       <w:r>
@@ -27026,7 +27143,7 @@
 </file>
 
 <file path=word/footer1.xml><?xml version="1.0" encoding="utf-8"?>
-<w:ftr xmlns:wpc="http://schemas.microsoft.com/office/word/2010/wordprocessingCanvas" xmlns:cx="http://schemas.microsoft.com/office/drawing/2014/chartex" xmlns:cx1="http://schemas.microsoft.com/office/drawing/2015/9/8/chartex" xmlns:cx2="http://schemas.microsoft.com/office/drawing/2015/10/21/chartex" xmlns:cx3="http://schemas.microsoft.com/office/drawing/2016/5/9/chartex" xmlns:cx4="http://schemas.microsoft.com/office/drawing/2016/5/10/chartex" xmlns:cx5="http://schemas.microsoft.com/office/drawing/2016/5/11/chartex" xmlns:cx6="http://schemas.microsoft.com/office/drawing/2016/5/12/chartex" xmlns:cx7="http://schemas.microsoft.com/office/drawing/2016/5/13/chartex" xmlns:cx8="http://schemas.microsoft.com/office/drawing/2016/5/14/chartex" xmlns:mc="http://schemas.openxmlformats.org/markup-compatibility/2006" xmlns:aink="http://schemas.microsoft.com/office/drawing/2016/ink" xmlns:am3d="http://schemas.microsoft.com/office/drawing/2017/model3d" xmlns:o="urn:schemas-microsoft-com:office:office" xmlns:oel="http://schemas.microsoft.com/office/2019/extlst" xmlns:r="http://schemas.openxmlformats.org/officeDocument/2006/relationships" xmlns:m="http://schemas.openxmlformats.org/officeDocument/2006/math" xmlns:v="urn:schemas-microsoft-com:vml" xmlns:wp14="http://schemas.microsoft.com/office/word/2010/wordprocessingDrawing" xmlns:wp="http://schemas.openxmlformats.org/drawingml/2006/wordprocessingDrawing" xmlns:w10="urn:schemas-microsoft-com:office:word" xmlns:w="http://schemas.openxmlformats.org/wordprocessingml/2006/main" xmlns:w14="http://schemas.microsoft.com/office/word/2010/wordml" xmlns:w15="http://schemas.microsoft.com/office/word/2012/wordml" xmlns:w16cex="http://schemas.microsoft.com/office/word/2018/wordml/cex" xmlns:w16cid="http://schemas.microsoft.com/office/word/2016/wordml/cid" xmlns:w16="http://schemas.microsoft.com/office/word/2018/wordml" xmlns:w16du="http://schemas.microsoft.com/office/word/2023/wordml/word16du" xmlns:w16sdtdh="http://schemas.microsoft.com/office/word/2020/wordml/sdtdatahash" xmlns:w16sdtfl="http://schemas.microsoft.com/office/word/2024/wordml/sdtformatlock" xmlns:w16se="http://schemas.microsoft.com/office/word/2015/wordml/symex" xmlns:wpg="http://schemas.microsoft.com/office/word/2010/wordprocessingGroup" xmlns:wpi="http://schemas.microsoft.com/office/word/2010/wordprocessingInk" xmlns:wne="http://schemas.microsoft.com/office/word/2006/wordml" xmlns:wps="http://schemas.microsoft.com/office/word/2010/wordprocessingShape" mc:Ignorable="w14 w15 w16se w16cid w16 w16cex w16sdtdh w16sdtfl w16du wp14">
+<w:ftr xmlns:wpc="http://schemas.microsoft.com/office/word/2010/wordprocessingCanvas" xmlns:cx="http://schemas.microsoft.com/office/drawing/2014/chartex" xmlns:cx1="http://schemas.microsoft.com/office/drawing/2015/9/8/chartex" xmlns:cx2="http://schemas.microsoft.com/office/drawing/2015/10/21/chartex" xmlns:cx3="http://schemas.microsoft.com/office/drawing/2016/5/9/chartex" xmlns:cx4="http://schemas.microsoft.com/office/drawing/2016/5/10/chartex" xmlns:cx5="http://schemas.microsoft.com/office/drawing/2016/5/11/chartex" xmlns:cx6="http://schemas.microsoft.com/office/drawing/2016/5/12/chartex" xmlns:cx7="http://schemas.microsoft.com/office/drawing/2016/5/13/chartex" xmlns:cx8="http://schemas.microsoft.com/office/drawing/2016/5/14/chartex" xmlns:mc="http://schemas.openxmlformats.org/markup-compatibility/2006" xmlns:aink="http://schemas.microsoft.com/office/drawing/2016/ink" xmlns:am3d="http://schemas.microsoft.com/office/drawing/2017/model3d" xmlns:o="urn:schemas-microsoft-com:office:office" xmlns:oel="http://schemas.microsoft.com/office/2019/extlst" xmlns:r="http://schemas.openxmlformats.org/officeDocument/2006/relationships" xmlns:m="http://schemas.openxmlformats.org/officeDocument/2006/math" xmlns:v="urn:schemas-microsoft-com:vml" xmlns:wp14="http://schemas.microsoft.com/office/word/2010/wordprocessingDrawing" xmlns:wp="http://schemas.openxmlformats.org/drawingml/2006/wordprocessingDrawing" xmlns:w10="urn:schemas-microsoft-com:office:word" xmlns:w="http://schemas.openxmlformats.org/wordprocessingml/2006/main" xmlns:w14="http://schemas.microsoft.com/office/word/2010/wordml" xmlns:w15="http://schemas.microsoft.com/office/word/2012/wordml" xmlns:w16cex="http://schemas.microsoft.com/office/word/2018/wordml/cex" xmlns:w16cid="http://schemas.microsoft.com/office/word/2016/wordml/cid" xmlns:w16="http://schemas.microsoft.com/office/word/2018/wordml" xmlns:w16du="http://schemas.microsoft.com/office/word/2023/wordml/word16du" xmlns:w16sdtdh="http://schemas.microsoft.com/office/word/2020/wordml/sdtdatahash" xmlns:w16se="http://schemas.microsoft.com/office/word/2015/wordml/symex" xmlns:wpg="http://schemas.microsoft.com/office/word/2010/wordprocessingGroup" xmlns:wpi="http://schemas.microsoft.com/office/word/2010/wordprocessingInk" xmlns:wne="http://schemas.microsoft.com/office/word/2006/wordml" xmlns:wps="http://schemas.microsoft.com/office/word/2010/wordprocessingShape" mc:Ignorable="w14 w15 w16se w16cid w16 w16cex w16sdtdh w16du wp14">
   <w:sdt>
     <w:sdtPr>
       <w:rPr>
@@ -27076,7 +27193,7 @@
 </file>
 
 <file path=word/footer2.xml><?xml version="1.0" encoding="utf-8"?>
-<w:ftr xmlns:wpc="http://schemas.microsoft.com/office/word/2010/wordprocessingCanvas" xmlns:cx="http://schemas.microsoft.com/office/drawing/2014/chartex" xmlns:cx1="http://schemas.microsoft.com/office/drawing/2015/9/8/chartex" xmlns:cx2="http://schemas.microsoft.com/office/drawing/2015/10/21/chartex" xmlns:cx3="http://schemas.microsoft.com/office/drawing/2016/5/9/chartex" xmlns:cx4="http://schemas.microsoft.com/office/drawing/2016/5/10/chartex" xmlns:cx5="http://schemas.microsoft.com/office/drawing/2016/5/11/chartex" xmlns:cx6="http://schemas.microsoft.com/office/drawing/2016/5/12/chartex" xmlns:cx7="http://schemas.microsoft.com/office/drawing/2016/5/13/chartex" xmlns:cx8="http://schemas.microsoft.com/office/drawing/2016/5/14/chartex" xmlns:mc="http://schemas.openxmlformats.org/markup-compatibility/2006" xmlns:aink="http://schemas.microsoft.com/office/drawing/2016/ink" xmlns:am3d="http://schemas.microsoft.com/office/drawing/2017/model3d" xmlns:o="urn:schemas-microsoft-com:office:office" xmlns:oel="http://schemas.microsoft.com/office/2019/extlst" xmlns:r="http://schemas.openxmlformats.org/officeDocument/2006/relationships" xmlns:m="http://schemas.openxmlformats.org/officeDocument/2006/math" xmlns:v="urn:schemas-microsoft-com:vml" xmlns:wp14="http://schemas.microsoft.com/office/word/2010/wordprocessingDrawing" xmlns:wp="http://schemas.openxmlformats.org/drawingml/2006/wordprocessingDrawing" xmlns:w10="urn:schemas-microsoft-com:office:word" xmlns:w="http://schemas.openxmlformats.org/wordprocessingml/2006/main" xmlns:w14="http://schemas.microsoft.com/office/word/2010/wordml" xmlns:w15="http://schemas.microsoft.com/office/word/2012/wordml" xmlns:w16cex="http://schemas.microsoft.com/office/word/2018/wordml/cex" xmlns:w16cid="http://schemas.microsoft.com/office/word/2016/wordml/cid" xmlns:w16="http://schemas.microsoft.com/office/word/2018/wordml" xmlns:w16du="http://schemas.microsoft.com/office/word/2023/wordml/word16du" xmlns:w16sdtdh="http://schemas.microsoft.com/office/word/2020/wordml/sdtdatahash" xmlns:w16sdtfl="http://schemas.microsoft.com/office/word/2024/wordml/sdtformatlock" xmlns:w16se="http://schemas.microsoft.com/office/word/2015/wordml/symex" xmlns:wpg="http://schemas.microsoft.com/office/word/2010/wordprocessingGroup" xmlns:wpi="http://schemas.microsoft.com/office/word/2010/wordprocessingInk" xmlns:wne="http://schemas.microsoft.com/office/word/2006/wordml" xmlns:wps="http://schemas.microsoft.com/office/word/2010/wordprocessingShape" mc:Ignorable="w14 w15 w16se w16cid w16 w16cex w16sdtdh w16sdtfl w16du wp14">
+<w:ftr xmlns:wpc="http://schemas.microsoft.com/office/word/2010/wordprocessingCanvas" xmlns:cx="http://schemas.microsoft.com/office/drawing/2014/chartex" xmlns:cx1="http://schemas.microsoft.com/office/drawing/2015/9/8/chartex" xmlns:cx2="http://schemas.microsoft.com/office/drawing/2015/10/21/chartex" xmlns:cx3="http://schemas.microsoft.com/office/drawing/2016/5/9/chartex" xmlns:cx4="http://schemas.microsoft.com/office/drawing/2016/5/10/chartex" xmlns:cx5="http://schemas.microsoft.com/office/drawing/2016/5/11/chartex" xmlns:cx6="http://schemas.microsoft.com/office/drawing/2016/5/12/chartex" xmlns:cx7="http://schemas.microsoft.com/office/drawing/2016/5/13/chartex" xmlns:cx8="http://schemas.microsoft.com/office/drawing/2016/5/14/chartex" xmlns:mc="http://schemas.openxmlformats.org/markup-compatibility/2006" xmlns:aink="http://schemas.microsoft.com/office/drawing/2016/ink" xmlns:am3d="http://schemas.microsoft.com/office/drawing/2017/model3d" xmlns:o="urn:schemas-microsoft-com:office:office" xmlns:oel="http://schemas.microsoft.com/office/2019/extlst" xmlns:r="http://schemas.openxmlformats.org/officeDocument/2006/relationships" xmlns:m="http://schemas.openxmlformats.org/officeDocument/2006/math" xmlns:v="urn:schemas-microsoft-com:vml" xmlns:wp14="http://schemas.microsoft.com/office/word/2010/wordprocessingDrawing" xmlns:wp="http://schemas.openxmlformats.org/drawingml/2006/wordprocessingDrawing" xmlns:w10="urn:schemas-microsoft-com:office:word" xmlns:w="http://schemas.openxmlformats.org/wordprocessingml/2006/main" xmlns:w14="http://schemas.microsoft.com/office/word/2010/wordml" xmlns:w15="http://schemas.microsoft.com/office/word/2012/wordml" xmlns:w16cex="http://schemas.microsoft.com/office/word/2018/wordml/cex" xmlns:w16cid="http://schemas.microsoft.com/office/word/2016/wordml/cid" xmlns:w16="http://schemas.microsoft.com/office/word/2018/wordml" xmlns:w16du="http://schemas.microsoft.com/office/word/2023/wordml/word16du" xmlns:w16sdtdh="http://schemas.microsoft.com/office/word/2020/wordml/sdtdatahash" xmlns:w16se="http://schemas.microsoft.com/office/word/2015/wordml/symex" xmlns:wpg="http://schemas.microsoft.com/office/word/2010/wordprocessingGroup" xmlns:wpi="http://schemas.microsoft.com/office/word/2010/wordprocessingInk" xmlns:wne="http://schemas.microsoft.com/office/word/2006/wordml" xmlns:wps="http://schemas.microsoft.com/office/word/2010/wordprocessingShape" mc:Ignorable="w14 w15 w16se w16cid w16 w16cex w16sdtdh w16du wp14">
   <w:p>
     <w:pPr>
       <w:pStyle w:val="Footer"/>
@@ -27171,7 +27288,7 @@
 </file>
 
 <file path=word/footer3.xml><?xml version="1.0" encoding="utf-8"?>
-<w:ftr xmlns:wpc="http://schemas.microsoft.com/office/word/2010/wordprocessingCanvas" xmlns:cx="http://schemas.microsoft.com/office/drawing/2014/chartex" xmlns:cx1="http://schemas.microsoft.com/office/drawing/2015/9/8/chartex" xmlns:cx2="http://schemas.microsoft.com/office/drawing/2015/10/21/chartex" xmlns:cx3="http://schemas.microsoft.com/office/drawing/2016/5/9/chartex" xmlns:cx4="http://schemas.microsoft.com/office/drawing/2016/5/10/chartex" xmlns:cx5="http://schemas.microsoft.com/office/drawing/2016/5/11/chartex" xmlns:cx6="http://schemas.microsoft.com/office/drawing/2016/5/12/chartex" xmlns:cx7="http://schemas.microsoft.com/office/drawing/2016/5/13/chartex" xmlns:cx8="http://schemas.microsoft.com/office/drawing/2016/5/14/chartex" xmlns:mc="http://schemas.openxmlformats.org/markup-compatibility/2006" xmlns:aink="http://schemas.microsoft.com/office/drawing/2016/ink" xmlns:am3d="http://schemas.microsoft.com/office/drawing/2017/model3d" xmlns:o="urn:schemas-microsoft-com:office:office" xmlns:oel="http://schemas.microsoft.com/office/2019/extlst" xmlns:r="http://schemas.openxmlformats.org/officeDocument/2006/relationships" xmlns:m="http://schemas.openxmlformats.org/officeDocument/2006/math" xmlns:v="urn:schemas-microsoft-com:vml" xmlns:wp14="http://schemas.microsoft.com/office/word/2010/wordprocessingDrawing" xmlns:wp="http://schemas.openxmlformats.org/drawingml/2006/wordprocessingDrawing" xmlns:w10="urn:schemas-microsoft-com:office:word" xmlns:w="http://schemas.openxmlformats.org/wordprocessingml/2006/main" xmlns:w14="http://schemas.microsoft.com/office/word/2010/wordml" xmlns:w15="http://schemas.microsoft.com/office/word/2012/wordml" xmlns:w16cex="http://schemas.microsoft.com/office/word/2018/wordml/cex" xmlns:w16cid="http://schemas.microsoft.com/office/word/2016/wordml/cid" xmlns:w16="http://schemas.microsoft.com/office/word/2018/wordml" xmlns:w16du="http://schemas.microsoft.com/office/word/2023/wordml/word16du" xmlns:w16sdtdh="http://schemas.microsoft.com/office/word/2020/wordml/sdtdatahash" xmlns:w16sdtfl="http://schemas.microsoft.com/office/word/2024/wordml/sdtformatlock" xmlns:w16se="http://schemas.microsoft.com/office/word/2015/wordml/symex" xmlns:wpg="http://schemas.microsoft.com/office/word/2010/wordprocessingGroup" xmlns:wpi="http://schemas.microsoft.com/office/word/2010/wordprocessingInk" xmlns:wne="http://schemas.microsoft.com/office/word/2006/wordml" xmlns:wps="http://schemas.microsoft.com/office/word/2010/wordprocessingShape" mc:Ignorable="w14 w15 w16se w16cid w16 w16cex w16sdtdh w16sdtfl w16du wp14">
+<w:ftr xmlns:wpc="http://schemas.microsoft.com/office/word/2010/wordprocessingCanvas" xmlns:cx="http://schemas.microsoft.com/office/drawing/2014/chartex" xmlns:cx1="http://schemas.microsoft.com/office/drawing/2015/9/8/chartex" xmlns:cx2="http://schemas.microsoft.com/office/drawing/2015/10/21/chartex" xmlns:cx3="http://schemas.microsoft.com/office/drawing/2016/5/9/chartex" xmlns:cx4="http://schemas.microsoft.com/office/drawing/2016/5/10/chartex" xmlns:cx5="http://schemas.microsoft.com/office/drawing/2016/5/11/chartex" xmlns:cx6="http://schemas.microsoft.com/office/drawing/2016/5/12/chartex" xmlns:cx7="http://schemas.microsoft.com/office/drawing/2016/5/13/chartex" xmlns:cx8="http://schemas.microsoft.com/office/drawing/2016/5/14/chartex" xmlns:mc="http://schemas.openxmlformats.org/markup-compatibility/2006" xmlns:aink="http://schemas.microsoft.com/office/drawing/2016/ink" xmlns:am3d="http://schemas.microsoft.com/office/drawing/2017/model3d" xmlns:o="urn:schemas-microsoft-com:office:office" xmlns:oel="http://schemas.microsoft.com/office/2019/extlst" xmlns:r="http://schemas.openxmlformats.org/officeDocument/2006/relationships" xmlns:m="http://schemas.openxmlformats.org/officeDocument/2006/math" xmlns:v="urn:schemas-microsoft-com:vml" xmlns:wp14="http://schemas.microsoft.com/office/word/2010/wordprocessingDrawing" xmlns:wp="http://schemas.openxmlformats.org/drawingml/2006/wordprocessingDrawing" xmlns:w10="urn:schemas-microsoft-com:office:word" xmlns:w="http://schemas.openxmlformats.org/wordprocessingml/2006/main" xmlns:w14="http://schemas.microsoft.com/office/word/2010/wordml" xmlns:w15="http://schemas.microsoft.com/office/word/2012/wordml" xmlns:w16cex="http://schemas.microsoft.com/office/word/2018/wordml/cex" xmlns:w16cid="http://schemas.microsoft.com/office/word/2016/wordml/cid" xmlns:w16="http://schemas.microsoft.com/office/word/2018/wordml" xmlns:w16du="http://schemas.microsoft.com/office/word/2023/wordml/word16du" xmlns:w16sdtdh="http://schemas.microsoft.com/office/word/2020/wordml/sdtdatahash" xmlns:w16se="http://schemas.microsoft.com/office/word/2015/wordml/symex" xmlns:wpg="http://schemas.microsoft.com/office/word/2010/wordprocessingGroup" xmlns:wpi="http://schemas.microsoft.com/office/word/2010/wordprocessingInk" xmlns:wne="http://schemas.microsoft.com/office/word/2006/wordml" xmlns:wps="http://schemas.microsoft.com/office/word/2010/wordprocessingShape" mc:Ignorable="w14 w15 w16se w16cid w16 w16cex w16sdtdh w16du wp14">
   <w:p>
     <w:pPr>
       <w:pStyle w:val="Footer"/>
@@ -27266,7 +27383,7 @@
 </file>
 
 <file path=word/footnotes.xml><?xml version="1.0" encoding="utf-8"?>
-<w:footnotes xmlns:wpc="http://schemas.microsoft.com/office/word/2010/wordprocessingCanvas" xmlns:cx="http://schemas.microsoft.com/office/drawing/2014/chartex" xmlns:cx1="http://schemas.microsoft.com/office/drawing/2015/9/8/chartex" xmlns:cx2="http://schemas.microsoft.com/office/drawing/2015/10/21/chartex" xmlns:cx3="http://schemas.microsoft.com/office/drawing/2016/5/9/chartex" xmlns:cx4="http://schemas.microsoft.com/office/drawing/2016/5/10/chartex" xmlns:cx5="http://schemas.microsoft.com/office/drawing/2016/5/11/chartex" xmlns:cx6="http://schemas.microsoft.com/office/drawing/2016/5/12/chartex" xmlns:cx7="http://schemas.microsoft.com/office/drawing/2016/5/13/chartex" xmlns:cx8="http://schemas.microsoft.com/office/drawing/2016/5/14/chartex" xmlns:mc="http://schemas.openxmlformats.org/markup-compatibility/2006" xmlns:aink="http://schemas.microsoft.com/office/drawing/2016/ink" xmlns:am3d="http://schemas.microsoft.com/office/drawing/2017/model3d" xmlns:o="urn:schemas-microsoft-com:office:office" xmlns:oel="http://schemas.microsoft.com/office/2019/extlst" xmlns:r="http://schemas.openxmlformats.org/officeDocument/2006/relationships" xmlns:m="http://schemas.openxmlformats.org/officeDocument/2006/math" xmlns:v="urn:schemas-microsoft-com:vml" xmlns:wp14="http://schemas.microsoft.com/office/word/2010/wordprocessingDrawing" xmlns:wp="http://schemas.openxmlformats.org/drawingml/2006/wordprocessingDrawing" xmlns:w10="urn:schemas-microsoft-com:office:word" xmlns:w="http://schemas.openxmlformats.org/wordprocessingml/2006/main" xmlns:w14="http://schemas.microsoft.com/office/word/2010/wordml" xmlns:w15="http://schemas.microsoft.com/office/word/2012/wordml" xmlns:w16cex="http://schemas.microsoft.com/office/word/2018/wordml/cex" xmlns:w16cid="http://schemas.microsoft.com/office/word/2016/wordml/cid" xmlns:w16="http://schemas.microsoft.com/office/word/2018/wordml" xmlns:w16du="http://schemas.microsoft.com/office/word/2023/wordml/word16du" xmlns:w16sdtdh="http://schemas.microsoft.com/office/word/2020/wordml/sdtdatahash" xmlns:w16sdtfl="http://schemas.microsoft.com/office/word/2024/wordml/sdtformatlock" xmlns:w16se="http://schemas.microsoft.com/office/word/2015/wordml/symex" xmlns:wpg="http://schemas.microsoft.com/office/word/2010/wordprocessingGroup" xmlns:wpi="http://schemas.microsoft.com/office/word/2010/wordprocessingInk" xmlns:wne="http://schemas.microsoft.com/office/word/2006/wordml" xmlns:wps="http://schemas.microsoft.com/office/word/2010/wordprocessingShape" mc:Ignorable="w14 w15 w16se w16cid w16 w16cex w16sdtdh w16sdtfl w16du wp14">
+<w:footnotes xmlns:wpc="http://schemas.microsoft.com/office/word/2010/wordprocessingCanvas" xmlns:cx="http://schemas.microsoft.com/office/drawing/2014/chartex" xmlns:cx1="http://schemas.microsoft.com/office/drawing/2015/9/8/chartex" xmlns:cx2="http://schemas.microsoft.com/office/drawing/2015/10/21/chartex" xmlns:cx3="http://schemas.microsoft.com/office/drawing/2016/5/9/chartex" xmlns:cx4="http://schemas.microsoft.com/office/drawing/2016/5/10/chartex" xmlns:cx5="http://schemas.microsoft.com/office/drawing/2016/5/11/chartex" xmlns:cx6="http://schemas.microsoft.com/office/drawing/2016/5/12/chartex" xmlns:cx7="http://schemas.microsoft.com/office/drawing/2016/5/13/chartex" xmlns:cx8="http://schemas.microsoft.com/office/drawing/2016/5/14/chartex" xmlns:mc="http://schemas.openxmlformats.org/markup-compatibility/2006" xmlns:aink="http://schemas.microsoft.com/office/drawing/2016/ink" xmlns:am3d="http://schemas.microsoft.com/office/drawing/2017/model3d" xmlns:o="urn:schemas-microsoft-com:office:office" xmlns:oel="http://schemas.microsoft.com/office/2019/extlst" xmlns:r="http://schemas.openxmlformats.org/officeDocument/2006/relationships" xmlns:m="http://schemas.openxmlformats.org/officeDocument/2006/math" xmlns:v="urn:schemas-microsoft-com:vml" xmlns:wp14="http://schemas.microsoft.com/office/word/2010/wordprocessingDrawing" xmlns:wp="http://schemas.openxmlformats.org/drawingml/2006/wordprocessingDrawing" xmlns:w10="urn:schemas-microsoft-com:office:word" xmlns:w="http://schemas.openxmlformats.org/wordprocessingml/2006/main" xmlns:w14="http://schemas.microsoft.com/office/word/2010/wordml" xmlns:w15="http://schemas.microsoft.com/office/word/2012/wordml" xmlns:w16cex="http://schemas.microsoft.com/office/word/2018/wordml/cex" xmlns:w16cid="http://schemas.microsoft.com/office/word/2016/wordml/cid" xmlns:w16="http://schemas.microsoft.com/office/word/2018/wordml" xmlns:w16du="http://schemas.microsoft.com/office/word/2023/wordml/word16du" xmlns:w16sdtdh="http://schemas.microsoft.com/office/word/2020/wordml/sdtdatahash" xmlns:w16se="http://schemas.microsoft.com/office/word/2015/wordml/symex" xmlns:wpg="http://schemas.microsoft.com/office/word/2010/wordprocessingGroup" xmlns:wpi="http://schemas.microsoft.com/office/word/2010/wordprocessingInk" xmlns:wne="http://schemas.microsoft.com/office/word/2006/wordml" xmlns:wps="http://schemas.microsoft.com/office/word/2010/wordprocessingShape" mc:Ignorable="w14 w15 w16se w16cid w16 w16cex w16sdtdh w16du wp14">
   <w:footnote w:type="separator" w:id="-1">
     <w:p>
       <w:r>
@@ -27622,7 +27739,7 @@
 </file>
 
 <file path=word/header1.xml><?xml version="1.0" encoding="utf-8"?>
-<w:hdr xmlns:wpc="http://schemas.microsoft.com/office/word/2010/wordprocessingCanvas" xmlns:cx="http://schemas.microsoft.com/office/drawing/2014/chartex" xmlns:cx1="http://schemas.microsoft.com/office/drawing/2015/9/8/chartex" xmlns:cx2="http://schemas.microsoft.com/office/drawing/2015/10/21/chartex" xmlns:cx3="http://schemas.microsoft.com/office/drawing/2016/5/9/chartex" xmlns:cx4="http://schemas.microsoft.com/office/drawing/2016/5/10/chartex" xmlns:cx5="http://schemas.microsoft.com/office/drawing/2016/5/11/chartex" xmlns:cx6="http://schemas.microsoft.com/office/drawing/2016/5/12/chartex" xmlns:cx7="http://schemas.microsoft.com/office/drawing/2016/5/13/chartex" xmlns:cx8="http://schemas.microsoft.com/office/drawing/2016/5/14/chartex" xmlns:mc="http://schemas.openxmlformats.org/markup-compatibility/2006" xmlns:aink="http://schemas.microsoft.com/office/drawing/2016/ink" xmlns:am3d="http://schemas.microsoft.com/office/drawing/2017/model3d" xmlns:o="urn:schemas-microsoft-com:office:office" xmlns:oel="http://schemas.microsoft.com/office/2019/extlst" xmlns:r="http://schemas.openxmlformats.org/officeDocument/2006/relationships" xmlns:m="http://schemas.openxmlformats.org/officeDocument/2006/math" xmlns:v="urn:schemas-microsoft-com:vml" xmlns:wp14="http://schemas.microsoft.com/office/word/2010/wordprocessingDrawing" xmlns:wp="http://schemas.openxmlformats.org/drawingml/2006/wordprocessingDrawing" xmlns:w10="urn:schemas-microsoft-com:office:word" xmlns:w="http://schemas.openxmlformats.org/wordprocessingml/2006/main" xmlns:w14="http://schemas.microsoft.com/office/word/2010/wordml" xmlns:w15="http://schemas.microsoft.com/office/word/2012/wordml" xmlns:w16cex="http://schemas.microsoft.com/office/word/2018/wordml/cex" xmlns:w16cid="http://schemas.microsoft.com/office/word/2016/wordml/cid" xmlns:w16="http://schemas.microsoft.com/office/word/2018/wordml" xmlns:w16du="http://schemas.microsoft.com/office/word/2023/wordml/word16du" xmlns:w16sdtdh="http://schemas.microsoft.com/office/word/2020/wordml/sdtdatahash" xmlns:w16sdtfl="http://schemas.microsoft.com/office/word/2024/wordml/sdtformatlock" xmlns:w16se="http://schemas.microsoft.com/office/word/2015/wordml/symex" xmlns:wpg="http://schemas.microsoft.com/office/word/2010/wordprocessingGroup" xmlns:wpi="http://schemas.microsoft.com/office/word/2010/wordprocessingInk" xmlns:wne="http://schemas.microsoft.com/office/word/2006/wordml" xmlns:wps="http://schemas.microsoft.com/office/word/2010/wordprocessingShape" mc:Ignorable="w14 w15 w16se w16cid w16 w16cex w16sdtdh w16sdtfl w16du wp14">
+<w:hdr xmlns:wpc="http://schemas.microsoft.com/office/word/2010/wordprocessingCanvas" xmlns:cx="http://schemas.microsoft.com/office/drawing/2014/chartex" xmlns:cx1="http://schemas.microsoft.com/office/drawing/2015/9/8/chartex" xmlns:cx2="http://schemas.microsoft.com/office/drawing/2015/10/21/chartex" xmlns:cx3="http://schemas.microsoft.com/office/drawing/2016/5/9/chartex" xmlns:cx4="http://schemas.microsoft.com/office/drawing/2016/5/10/chartex" xmlns:cx5="http://schemas.microsoft.com/office/drawing/2016/5/11/chartex" xmlns:cx6="http://schemas.microsoft.com/office/drawing/2016/5/12/chartex" xmlns:cx7="http://schemas.microsoft.com/office/drawing/2016/5/13/chartex" xmlns:cx8="http://schemas.microsoft.com/office/drawing/2016/5/14/chartex" xmlns:mc="http://schemas.openxmlformats.org/markup-compatibility/2006" xmlns:aink="http://schemas.microsoft.com/office/drawing/2016/ink" xmlns:am3d="http://schemas.microsoft.com/office/drawing/2017/model3d" xmlns:o="urn:schemas-microsoft-com:office:office" xmlns:oel="http://schemas.microsoft.com/office/2019/extlst" xmlns:r="http://schemas.openxmlformats.org/officeDocument/2006/relationships" xmlns:m="http://schemas.openxmlformats.org/officeDocument/2006/math" xmlns:v="urn:schemas-microsoft-com:vml" xmlns:wp14="http://schemas.microsoft.com/office/word/2010/wordprocessingDrawing" xmlns:wp="http://schemas.openxmlformats.org/drawingml/2006/wordprocessingDrawing" xmlns:w10="urn:schemas-microsoft-com:office:word" xmlns:w="http://schemas.openxmlformats.org/wordprocessingml/2006/main" xmlns:w14="http://schemas.microsoft.com/office/word/2010/wordml" xmlns:w15="http://schemas.microsoft.com/office/word/2012/wordml" xmlns:w16cex="http://schemas.microsoft.com/office/word/2018/wordml/cex" xmlns:w16cid="http://schemas.microsoft.com/office/word/2016/wordml/cid" xmlns:w16="http://schemas.microsoft.com/office/word/2018/wordml" xmlns:w16du="http://schemas.microsoft.com/office/word/2023/wordml/word16du" xmlns:w16sdtdh="http://schemas.microsoft.com/office/word/2020/wordml/sdtdatahash" xmlns:w16se="http://schemas.microsoft.com/office/word/2015/wordml/symex" xmlns:wpg="http://schemas.microsoft.com/office/word/2010/wordprocessingGroup" xmlns:wpi="http://schemas.microsoft.com/office/word/2010/wordprocessingInk" xmlns:wne="http://schemas.microsoft.com/office/word/2006/wordml" xmlns:wps="http://schemas.microsoft.com/office/word/2010/wordprocessingShape" mc:Ignorable="w14 w15 w16se w16cid w16 w16cex w16sdtdh w16du wp14">
   <w:p>
     <w:pPr>
       <w:pStyle w:val="Header"/>
@@ -27647,7 +27764,7 @@
 </file>
 
 <file path=word/numbering.xml><?xml version="1.0" encoding="utf-8"?>
-<w:numbering xmlns:wpc="http://schemas.microsoft.com/office/word/2010/wordprocessingCanvas" xmlns:cx="http://schemas.microsoft.com/office/drawing/2014/chartex" xmlns:cx1="http://schemas.microsoft.com/office/drawing/2015/9/8/chartex" xmlns:cx2="http://schemas.microsoft.com/office/drawing/2015/10/21/chartex" xmlns:cx3="http://schemas.microsoft.com/office/drawing/2016/5/9/chartex" xmlns:cx4="http://schemas.microsoft.com/office/drawing/2016/5/10/chartex" xmlns:cx5="http://schemas.microsoft.com/office/drawing/2016/5/11/chartex" xmlns:cx6="http://schemas.microsoft.com/office/drawing/2016/5/12/chartex" xmlns:cx7="http://schemas.microsoft.com/office/drawing/2016/5/13/chartex" xmlns:cx8="http://schemas.microsoft.com/office/drawing/2016/5/14/chartex" xmlns:mc="http://schemas.openxmlformats.org/markup-compatibility/2006" xmlns:aink="http://schemas.microsoft.com/office/drawing/2016/ink" xmlns:am3d="http://schemas.microsoft.com/office/drawing/2017/model3d" xmlns:o="urn:schemas-microsoft-com:office:office" xmlns:oel="http://schemas.microsoft.com/office/2019/extlst" xmlns:r="http://schemas.openxmlformats.org/officeDocument/2006/relationships" xmlns:m="http://schemas.openxmlformats.org/officeDocument/2006/math" xmlns:v="urn:schemas-microsoft-com:vml" xmlns:wp14="http://schemas.microsoft.com/office/word/2010/wordprocessingDrawing" xmlns:wp="http://schemas.openxmlformats.org/drawingml/2006/wordprocessingDrawing" xmlns:w10="urn:schemas-microsoft-com:office:word" xmlns:w="http://schemas.openxmlformats.org/wordprocessingml/2006/main" xmlns:w14="http://schemas.microsoft.com/office/word/2010/wordml" xmlns:w15="http://schemas.microsoft.com/office/word/2012/wordml" xmlns:w16cex="http://schemas.microsoft.com/office/word/2018/wordml/cex" xmlns:w16cid="http://schemas.microsoft.com/office/word/2016/wordml/cid" xmlns:w16="http://schemas.microsoft.com/office/word/2018/wordml" xmlns:w16du="http://schemas.microsoft.com/office/word/2023/wordml/word16du" xmlns:w16sdtdh="http://schemas.microsoft.com/office/word/2020/wordml/sdtdatahash" xmlns:w16sdtfl="http://schemas.microsoft.com/office/word/2024/wordml/sdtformatlock" xmlns:w16se="http://schemas.microsoft.com/office/word/2015/wordml/symex" xmlns:wpg="http://schemas.microsoft.com/office/word/2010/wordprocessingGroup" xmlns:wpi="http://schemas.microsoft.com/office/word/2010/wordprocessingInk" xmlns:wne="http://schemas.microsoft.com/office/word/2006/wordml" xmlns:wps="http://schemas.microsoft.com/office/word/2010/wordprocessingShape" mc:Ignorable="w14 w15 w16se w16cid w16 w16cex w16sdtdh w16sdtfl w16du wp14">
+<w:numbering xmlns:wpc="http://schemas.microsoft.com/office/word/2010/wordprocessingCanvas" xmlns:cx="http://schemas.microsoft.com/office/drawing/2014/chartex" xmlns:cx1="http://schemas.microsoft.com/office/drawing/2015/9/8/chartex" xmlns:cx2="http://schemas.microsoft.com/office/drawing/2015/10/21/chartex" xmlns:cx3="http://schemas.microsoft.com/office/drawing/2016/5/9/chartex" xmlns:cx4="http://schemas.microsoft.com/office/drawing/2016/5/10/chartex" xmlns:cx5="http://schemas.microsoft.com/office/drawing/2016/5/11/chartex" xmlns:cx6="http://schemas.microsoft.com/office/drawing/2016/5/12/chartex" xmlns:cx7="http://schemas.microsoft.com/office/drawing/2016/5/13/chartex" xmlns:cx8="http://schemas.microsoft.com/office/drawing/2016/5/14/chartex" xmlns:mc="http://schemas.openxmlformats.org/markup-compatibility/2006" xmlns:aink="http://schemas.microsoft.com/office/drawing/2016/ink" xmlns:am3d="http://schemas.microsoft.com/office/drawing/2017/model3d" xmlns:o="urn:schemas-microsoft-com:office:office" xmlns:oel="http://schemas.microsoft.com/office/2019/extlst" xmlns:r="http://schemas.openxmlformats.org/officeDocument/2006/relationships" xmlns:m="http://schemas.openxmlformats.org/officeDocument/2006/math" xmlns:v="urn:schemas-microsoft-com:vml" xmlns:wp14="http://schemas.microsoft.com/office/word/2010/wordprocessingDrawing" xmlns:wp="http://schemas.openxmlformats.org/drawingml/2006/wordprocessingDrawing" xmlns:w10="urn:schemas-microsoft-com:office:word" xmlns:w="http://schemas.openxmlformats.org/wordprocessingml/2006/main" xmlns:w14="http://schemas.microsoft.com/office/word/2010/wordml" xmlns:w15="http://schemas.microsoft.com/office/word/2012/wordml" xmlns:w16cex="http://schemas.microsoft.com/office/word/2018/wordml/cex" xmlns:w16cid="http://schemas.microsoft.com/office/word/2016/wordml/cid" xmlns:w16="http://schemas.microsoft.com/office/word/2018/wordml" xmlns:w16du="http://schemas.microsoft.com/office/word/2023/wordml/word16du" xmlns:w16sdtdh="http://schemas.microsoft.com/office/word/2020/wordml/sdtdatahash" xmlns:w16se="http://schemas.microsoft.com/office/word/2015/wordml/symex" xmlns:wpg="http://schemas.microsoft.com/office/word/2010/wordprocessingGroup" xmlns:wpi="http://schemas.microsoft.com/office/word/2010/wordprocessingInk" xmlns:wne="http://schemas.microsoft.com/office/word/2006/wordml" xmlns:wps="http://schemas.microsoft.com/office/word/2010/wordprocessingShape" mc:Ignorable="w14 w15 w16se w16cid w16 w16cex w16sdtdh w16du wp14">
   <w:abstractNum w:abstractNumId="0" w15:restartNumberingAfterBreak="0">
     <w:nsid w:val="05EC708F"/>
     <w:multiLevelType w:val="hybridMultilevel"/>
@@ -27762,6 +27879,119 @@
     </w:lvl>
   </w:abstractNum>
   <w:abstractNum w:abstractNumId="1" w15:restartNumberingAfterBreak="0">
+    <w:nsid w:val="06371C0E"/>
+    <w:multiLevelType w:val="multilevel"/>
+    <w:tmpl w:val="F774B818"/>
+    <w:lvl w:ilvl="0">
+      <w:start w:val="1"/>
+      <w:numFmt w:val="decimal"/>
+      <w:lvlText w:val="%1."/>
+      <w:lvlJc w:val="left"/>
+      <w:pPr>
+        <w:tabs>
+          <w:tab w:val="num" w:pos="720"/>
+        </w:tabs>
+        <w:ind w:left="720" w:hanging="360"/>
+      </w:pPr>
+    </w:lvl>
+    <w:lvl w:ilvl="1" w:tentative="1">
+      <w:start w:val="1"/>
+      <w:numFmt w:val="decimal"/>
+      <w:lvlText w:val="%2."/>
+      <w:lvlJc w:val="left"/>
+      <w:pPr>
+        <w:tabs>
+          <w:tab w:val="num" w:pos="1440"/>
+        </w:tabs>
+        <w:ind w:left="1440" w:hanging="360"/>
+      </w:pPr>
+    </w:lvl>
+    <w:lvl w:ilvl="2" w:tentative="1">
+      <w:start w:val="1"/>
+      <w:numFmt w:val="decimal"/>
+      <w:lvlText w:val="%3."/>
+      <w:lvlJc w:val="left"/>
+      <w:pPr>
+        <w:tabs>
+          <w:tab w:val="num" w:pos="2160"/>
+        </w:tabs>
+        <w:ind w:left="2160" w:hanging="360"/>
+      </w:pPr>
+    </w:lvl>
+    <w:lvl w:ilvl="3" w:tentative="1">
+      <w:start w:val="1"/>
+      <w:numFmt w:val="decimal"/>
+      <w:lvlText w:val="%4."/>
+      <w:lvlJc w:val="left"/>
+      <w:pPr>
+        <w:tabs>
+          <w:tab w:val="num" w:pos="2880"/>
+        </w:tabs>
+        <w:ind w:left="2880" w:hanging="360"/>
+      </w:pPr>
+    </w:lvl>
+    <w:lvl w:ilvl="4" w:tentative="1">
+      <w:start w:val="1"/>
+      <w:numFmt w:val="decimal"/>
+      <w:lvlText w:val="%5."/>
+      <w:lvlJc w:val="left"/>
+      <w:pPr>
+        <w:tabs>
+          <w:tab w:val="num" w:pos="3600"/>
+        </w:tabs>
+        <w:ind w:left="3600" w:hanging="360"/>
+      </w:pPr>
+    </w:lvl>
+    <w:lvl w:ilvl="5" w:tentative="1">
+      <w:start w:val="1"/>
+      <w:numFmt w:val="decimal"/>
+      <w:lvlText w:val="%6."/>
+      <w:lvlJc w:val="left"/>
+      <w:pPr>
+        <w:tabs>
+          <w:tab w:val="num" w:pos="4320"/>
+        </w:tabs>
+        <w:ind w:left="4320" w:hanging="360"/>
+      </w:pPr>
+    </w:lvl>
+    <w:lvl w:ilvl="6" w:tentative="1">
+      <w:start w:val="1"/>
+      <w:numFmt w:val="decimal"/>
+      <w:lvlText w:val="%7."/>
+      <w:lvlJc w:val="left"/>
+      <w:pPr>
+        <w:tabs>
+          <w:tab w:val="num" w:pos="5040"/>
+        </w:tabs>
+        <w:ind w:left="5040" w:hanging="360"/>
+      </w:pPr>
+    </w:lvl>
+    <w:lvl w:ilvl="7" w:tentative="1">
+      <w:start w:val="1"/>
+      <w:numFmt w:val="decimal"/>
+      <w:lvlText w:val="%8."/>
+      <w:lvlJc w:val="left"/>
+      <w:pPr>
+        <w:tabs>
+          <w:tab w:val="num" w:pos="5760"/>
+        </w:tabs>
+        <w:ind w:left="5760" w:hanging="360"/>
+      </w:pPr>
+    </w:lvl>
+    <w:lvl w:ilvl="8" w:tentative="1">
+      <w:start w:val="1"/>
+      <w:numFmt w:val="decimal"/>
+      <w:lvlText w:val="%9."/>
+      <w:lvlJc w:val="left"/>
+      <w:pPr>
+        <w:tabs>
+          <w:tab w:val="num" w:pos="6480"/>
+        </w:tabs>
+        <w:ind w:left="6480" w:hanging="360"/>
+      </w:pPr>
+    </w:lvl>
+  </w:abstractNum>
+  <w:abstractNum w:abstractNumId="2" w15:restartNumberingAfterBreak="0">
     <w:nsid w:val="07B020F9"/>
     <w:multiLevelType w:val="hybridMultilevel"/>
     <w:tmpl w:val="68723FD0"/>
@@ -27850,7 +28080,7 @@
       </w:pPr>
     </w:lvl>
   </w:abstractNum>
-  <w:abstractNum w:abstractNumId="2" w15:restartNumberingAfterBreak="0">
+  <w:abstractNum w:abstractNumId="3" w15:restartNumberingAfterBreak="0">
     <w:nsid w:val="14A23730"/>
     <w:multiLevelType w:val="hybridMultilevel"/>
     <w:tmpl w:val="C2FAA68E"/>
@@ -27963,7 +28193,7 @@
       </w:rPr>
     </w:lvl>
   </w:abstractNum>
-  <w:abstractNum w:abstractNumId="3" w15:restartNumberingAfterBreak="0">
+  <w:abstractNum w:abstractNumId="4" w15:restartNumberingAfterBreak="0">
     <w:nsid w:val="15D125A0"/>
     <w:multiLevelType w:val="multilevel"/>
     <w:tmpl w:val="04090021"/>
@@ -28076,7 +28306,7 @@
       </w:rPr>
     </w:lvl>
   </w:abstractNum>
-  <w:abstractNum w:abstractNumId="4" w15:restartNumberingAfterBreak="0">
+  <w:abstractNum w:abstractNumId="5" w15:restartNumberingAfterBreak="0">
     <w:nsid w:val="16D17AE1"/>
     <w:multiLevelType w:val="hybridMultilevel"/>
     <w:tmpl w:val="63D663EE"/>
@@ -28165,7 +28395,7 @@
       </w:pPr>
     </w:lvl>
   </w:abstractNum>
-  <w:abstractNum w:abstractNumId="5" w15:restartNumberingAfterBreak="0">
+  <w:abstractNum w:abstractNumId="6" w15:restartNumberingAfterBreak="0">
     <w:nsid w:val="1825013C"/>
     <w:multiLevelType w:val="hybridMultilevel"/>
     <w:tmpl w:val="A1442F44"/>
@@ -28254,7 +28484,7 @@
       </w:pPr>
     </w:lvl>
   </w:abstractNum>
-  <w:abstractNum w:abstractNumId="6" w15:restartNumberingAfterBreak="0">
+  <w:abstractNum w:abstractNumId="7" w15:restartNumberingAfterBreak="0">
     <w:nsid w:val="1A683475"/>
     <w:multiLevelType w:val="hybridMultilevel"/>
     <w:tmpl w:val="35BA944A"/>
@@ -28367,7 +28597,7 @@
       </w:rPr>
     </w:lvl>
   </w:abstractNum>
-  <w:abstractNum w:abstractNumId="7" w15:restartNumberingAfterBreak="0">
+  <w:abstractNum w:abstractNumId="8" w15:restartNumberingAfterBreak="0">
     <w:nsid w:val="1A8A481B"/>
     <w:multiLevelType w:val="hybridMultilevel"/>
     <w:tmpl w:val="E11EDBCC"/>
@@ -28480,7 +28710,7 @@
       </w:rPr>
     </w:lvl>
   </w:abstractNum>
-  <w:abstractNum w:abstractNumId="8" w15:restartNumberingAfterBreak="0">
+  <w:abstractNum w:abstractNumId="9" w15:restartNumberingAfterBreak="0">
     <w:nsid w:val="2102138C"/>
     <w:multiLevelType w:val="hybridMultilevel"/>
     <w:tmpl w:val="05945220"/>
@@ -28593,7 +28823,7 @@
       </w:rPr>
     </w:lvl>
   </w:abstractNum>
-  <w:abstractNum w:abstractNumId="9" w15:restartNumberingAfterBreak="0">
+  <w:abstractNum w:abstractNumId="10" w15:restartNumberingAfterBreak="0">
     <w:nsid w:val="25612CE0"/>
     <w:multiLevelType w:val="hybridMultilevel"/>
     <w:tmpl w:val="0C544464"/>
@@ -28682,7 +28912,7 @@
       </w:pPr>
     </w:lvl>
   </w:abstractNum>
-  <w:abstractNum w:abstractNumId="10" w15:restartNumberingAfterBreak="0">
+  <w:abstractNum w:abstractNumId="11" w15:restartNumberingAfterBreak="0">
     <w:nsid w:val="25667173"/>
     <w:multiLevelType w:val="hybridMultilevel"/>
     <w:tmpl w:val="3352498C"/>
@@ -28795,7 +29025,7 @@
       </w:rPr>
     </w:lvl>
   </w:abstractNum>
-  <w:abstractNum w:abstractNumId="11" w15:restartNumberingAfterBreak="0">
+  <w:abstractNum w:abstractNumId="12" w15:restartNumberingAfterBreak="0">
     <w:nsid w:val="25D773C1"/>
     <w:multiLevelType w:val="hybridMultilevel"/>
     <w:tmpl w:val="D332E376"/>
@@ -28884,7 +29114,7 @@
       </w:pPr>
     </w:lvl>
   </w:abstractNum>
-  <w:abstractNum w:abstractNumId="12" w15:restartNumberingAfterBreak="0">
+  <w:abstractNum w:abstractNumId="13" w15:restartNumberingAfterBreak="0">
     <w:nsid w:val="265669E6"/>
     <w:multiLevelType w:val="hybridMultilevel"/>
     <w:tmpl w:val="007255C6"/>
@@ -28973,7 +29203,7 @@
       </w:pPr>
     </w:lvl>
   </w:abstractNum>
-  <w:abstractNum w:abstractNumId="13" w15:restartNumberingAfterBreak="0">
+  <w:abstractNum w:abstractNumId="14" w15:restartNumberingAfterBreak="0">
     <w:nsid w:val="2A5374C3"/>
     <w:multiLevelType w:val="hybridMultilevel"/>
     <w:tmpl w:val="3EAA7D7E"/>
@@ -29086,7 +29316,7 @@
       </w:rPr>
     </w:lvl>
   </w:abstractNum>
-  <w:abstractNum w:abstractNumId="14" w15:restartNumberingAfterBreak="0">
+  <w:abstractNum w:abstractNumId="15" w15:restartNumberingAfterBreak="0">
     <w:nsid w:val="2AAA7AD9"/>
     <w:multiLevelType w:val="hybridMultilevel"/>
     <w:tmpl w:val="75D62288"/>
@@ -29199,7 +29429,7 @@
       </w:rPr>
     </w:lvl>
   </w:abstractNum>
-  <w:abstractNum w:abstractNumId="15" w15:restartNumberingAfterBreak="0">
+  <w:abstractNum w:abstractNumId="16" w15:restartNumberingAfterBreak="0">
     <w:nsid w:val="2BA91ED5"/>
     <w:multiLevelType w:val="multilevel"/>
     <w:tmpl w:val="04090021"/>
@@ -29312,7 +29542,7 @@
       </w:rPr>
     </w:lvl>
   </w:abstractNum>
-  <w:abstractNum w:abstractNumId="16" w15:restartNumberingAfterBreak="0">
+  <w:abstractNum w:abstractNumId="17" w15:restartNumberingAfterBreak="0">
     <w:nsid w:val="2DFC549B"/>
     <w:multiLevelType w:val="hybridMultilevel"/>
     <w:tmpl w:val="1B20159C"/>
@@ -29425,7 +29655,7 @@
       </w:rPr>
     </w:lvl>
   </w:abstractNum>
-  <w:abstractNum w:abstractNumId="17" w15:restartNumberingAfterBreak="0">
+  <w:abstractNum w:abstractNumId="18" w15:restartNumberingAfterBreak="0">
     <w:nsid w:val="3100021D"/>
     <w:multiLevelType w:val="hybridMultilevel"/>
     <w:tmpl w:val="A1FA5E08"/>
@@ -29538,7 +29768,7 @@
       </w:rPr>
     </w:lvl>
   </w:abstractNum>
-  <w:abstractNum w:abstractNumId="18" w15:restartNumberingAfterBreak="0">
+  <w:abstractNum w:abstractNumId="19" w15:restartNumberingAfterBreak="0">
     <w:nsid w:val="338F2AA6"/>
     <w:multiLevelType w:val="hybridMultilevel"/>
     <w:tmpl w:val="A2E2255E"/>
@@ -29651,7 +29881,7 @@
       </w:rPr>
     </w:lvl>
   </w:abstractNum>
-  <w:abstractNum w:abstractNumId="19" w15:restartNumberingAfterBreak="0">
+  <w:abstractNum w:abstractNumId="20" w15:restartNumberingAfterBreak="0">
     <w:nsid w:val="36D54FF0"/>
     <w:multiLevelType w:val="hybridMultilevel"/>
     <w:tmpl w:val="26F4A22C"/>
@@ -29740,7 +29970,7 @@
       </w:pPr>
     </w:lvl>
   </w:abstractNum>
-  <w:abstractNum w:abstractNumId="20" w15:restartNumberingAfterBreak="0">
+  <w:abstractNum w:abstractNumId="21" w15:restartNumberingAfterBreak="0">
     <w:nsid w:val="3793430D"/>
     <w:multiLevelType w:val="hybridMultilevel"/>
     <w:tmpl w:val="1AC0C0CA"/>
@@ -29853,7 +30083,7 @@
       </w:rPr>
     </w:lvl>
   </w:abstractNum>
-  <w:abstractNum w:abstractNumId="21" w15:restartNumberingAfterBreak="0">
+  <w:abstractNum w:abstractNumId="22" w15:restartNumberingAfterBreak="0">
     <w:nsid w:val="39B107CB"/>
     <w:multiLevelType w:val="hybridMultilevel"/>
     <w:tmpl w:val="55B6AEBC"/>
@@ -29965,7 +30195,7 @@
       </w:rPr>
     </w:lvl>
   </w:abstractNum>
-  <w:abstractNum w:abstractNumId="22" w15:restartNumberingAfterBreak="0">
+  <w:abstractNum w:abstractNumId="23" w15:restartNumberingAfterBreak="0">
     <w:nsid w:val="43211A8A"/>
     <w:multiLevelType w:val="hybridMultilevel"/>
     <w:tmpl w:val="9FC00E12"/>
@@ -30078,7 +30308,7 @@
       </w:rPr>
     </w:lvl>
   </w:abstractNum>
-  <w:abstractNum w:abstractNumId="23" w15:restartNumberingAfterBreak="0">
+  <w:abstractNum w:abstractNumId="24" w15:restartNumberingAfterBreak="0">
     <w:nsid w:val="4447123D"/>
     <w:multiLevelType w:val="hybridMultilevel"/>
     <w:tmpl w:val="0F8CAB3E"/>
@@ -30191,7 +30421,7 @@
       </w:rPr>
     </w:lvl>
   </w:abstractNum>
-  <w:abstractNum w:abstractNumId="24" w15:restartNumberingAfterBreak="0">
+  <w:abstractNum w:abstractNumId="25" w15:restartNumberingAfterBreak="0">
     <w:nsid w:val="49533DA0"/>
     <w:multiLevelType w:val="multilevel"/>
     <w:tmpl w:val="04090021"/>
@@ -30304,7 +30534,7 @@
       </w:rPr>
     </w:lvl>
   </w:abstractNum>
-  <w:abstractNum w:abstractNumId="25" w15:restartNumberingAfterBreak="0">
+  <w:abstractNum w:abstractNumId="26" w15:restartNumberingAfterBreak="0">
     <w:nsid w:val="4AB71A38"/>
     <w:multiLevelType w:val="hybridMultilevel"/>
     <w:tmpl w:val="35AEE4BE"/>
@@ -30417,7 +30647,7 @@
       </w:rPr>
     </w:lvl>
   </w:abstractNum>
-  <w:abstractNum w:abstractNumId="26" w15:restartNumberingAfterBreak="0">
+  <w:abstractNum w:abstractNumId="27" w15:restartNumberingAfterBreak="0">
     <w:nsid w:val="4AEF7357"/>
     <w:multiLevelType w:val="hybridMultilevel"/>
     <w:tmpl w:val="059C94FE"/>
@@ -30506,7 +30736,7 @@
       </w:pPr>
     </w:lvl>
   </w:abstractNum>
-  <w:abstractNum w:abstractNumId="27" w15:restartNumberingAfterBreak="0">
+  <w:abstractNum w:abstractNumId="28" w15:restartNumberingAfterBreak="0">
     <w:nsid w:val="536461A3"/>
     <w:multiLevelType w:val="hybridMultilevel"/>
     <w:tmpl w:val="27E0013A"/>
@@ -30595,7 +30825,7 @@
       </w:pPr>
     </w:lvl>
   </w:abstractNum>
-  <w:abstractNum w:abstractNumId="28" w15:restartNumberingAfterBreak="0">
+  <w:abstractNum w:abstractNumId="29" w15:restartNumberingAfterBreak="0">
     <w:nsid w:val="575E0349"/>
     <w:multiLevelType w:val="hybridMultilevel"/>
     <w:tmpl w:val="BB9241C2"/>
@@ -30707,7 +30937,7 @@
       </w:rPr>
     </w:lvl>
   </w:abstractNum>
-  <w:abstractNum w:abstractNumId="29" w15:restartNumberingAfterBreak="0">
+  <w:abstractNum w:abstractNumId="30" w15:restartNumberingAfterBreak="0">
     <w:nsid w:val="5A7D3268"/>
     <w:multiLevelType w:val="hybridMultilevel"/>
     <w:tmpl w:val="0D5014B4"/>
@@ -30820,7 +31050,7 @@
       </w:rPr>
     </w:lvl>
   </w:abstractNum>
-  <w:abstractNum w:abstractNumId="30" w15:restartNumberingAfterBreak="0">
+  <w:abstractNum w:abstractNumId="31" w15:restartNumberingAfterBreak="0">
     <w:nsid w:val="5EBD5118"/>
     <w:multiLevelType w:val="hybridMultilevel"/>
     <w:tmpl w:val="AD1EE666"/>
@@ -30933,7 +31163,7 @@
       </w:rPr>
     </w:lvl>
   </w:abstractNum>
-  <w:abstractNum w:abstractNumId="31" w15:restartNumberingAfterBreak="0">
+  <w:abstractNum w:abstractNumId="32" w15:restartNumberingAfterBreak="0">
     <w:nsid w:val="6EF75348"/>
     <w:multiLevelType w:val="hybridMultilevel"/>
     <w:tmpl w:val="884A053C"/>
@@ -31046,7 +31276,7 @@
       </w:rPr>
     </w:lvl>
   </w:abstractNum>
-  <w:abstractNum w:abstractNumId="32" w15:restartNumberingAfterBreak="0">
+  <w:abstractNum w:abstractNumId="33" w15:restartNumberingAfterBreak="0">
     <w:nsid w:val="71F469F9"/>
     <w:multiLevelType w:val="hybridMultilevel"/>
     <w:tmpl w:val="6728F372"/>
@@ -31159,7 +31389,7 @@
       </w:rPr>
     </w:lvl>
   </w:abstractNum>
-  <w:abstractNum w:abstractNumId="33" w15:restartNumberingAfterBreak="0">
+  <w:abstractNum w:abstractNumId="34" w15:restartNumberingAfterBreak="0">
     <w:nsid w:val="72585DEA"/>
     <w:multiLevelType w:val="hybridMultilevel"/>
     <w:tmpl w:val="4558C310"/>
@@ -31272,7 +31502,7 @@
       </w:rPr>
     </w:lvl>
   </w:abstractNum>
-  <w:abstractNum w:abstractNumId="34" w15:restartNumberingAfterBreak="0">
+  <w:abstractNum w:abstractNumId="35" w15:restartNumberingAfterBreak="0">
     <w:nsid w:val="769A3631"/>
     <w:multiLevelType w:val="multilevel"/>
     <w:tmpl w:val="4BE851B6"/>
@@ -31421,7 +31651,7 @@
       </w:rPr>
     </w:lvl>
   </w:abstractNum>
-  <w:abstractNum w:abstractNumId="35" w15:restartNumberingAfterBreak="0">
+  <w:abstractNum w:abstractNumId="36" w15:restartNumberingAfterBreak="0">
     <w:nsid w:val="773C060E"/>
     <w:multiLevelType w:val="hybridMultilevel"/>
     <w:tmpl w:val="D00AAFA4"/>
@@ -31534,7 +31764,7 @@
       </w:rPr>
     </w:lvl>
   </w:abstractNum>
-  <w:abstractNum w:abstractNumId="36" w15:restartNumberingAfterBreak="0">
+  <w:abstractNum w:abstractNumId="37" w15:restartNumberingAfterBreak="0">
     <w:nsid w:val="7B5825C2"/>
     <w:multiLevelType w:val="hybridMultilevel"/>
     <w:tmpl w:val="75FEECCE"/>
@@ -31647,7 +31877,7 @@
       </w:rPr>
     </w:lvl>
   </w:abstractNum>
-  <w:abstractNum w:abstractNumId="37" w15:restartNumberingAfterBreak="0">
+  <w:abstractNum w:abstractNumId="38" w15:restartNumberingAfterBreak="0">
     <w:nsid w:val="7DE75FBC"/>
     <w:multiLevelType w:val="hybridMultilevel"/>
     <w:tmpl w:val="D87C91C6"/>
@@ -31733,7 +31963,7 @@
       </w:pPr>
     </w:lvl>
   </w:abstractNum>
-  <w:abstractNum w:abstractNumId="38" w15:restartNumberingAfterBreak="0">
+  <w:abstractNum w:abstractNumId="39" w15:restartNumberingAfterBreak="0">
     <w:nsid w:val="7E69563E"/>
     <w:multiLevelType w:val="hybridMultilevel"/>
     <w:tmpl w:val="87E4AA1E"/>
@@ -31847,138 +32077,141 @@
     </w:lvl>
   </w:abstractNum>
   <w:num w:numId="1" w16cid:durableId="1721901104">
+    <w:abstractNumId w:val="24"/>
+  </w:num>
+  <w:num w:numId="2" w16cid:durableId="1937470372">
+    <w:abstractNumId w:val="29"/>
+  </w:num>
+  <w:num w:numId="3" w16cid:durableId="284237462">
+    <w:abstractNumId w:val="4"/>
+  </w:num>
+  <w:num w:numId="4" w16cid:durableId="844127995">
+    <w:abstractNumId w:val="16"/>
+  </w:num>
+  <w:num w:numId="5" w16cid:durableId="862014625">
+    <w:abstractNumId w:val="11"/>
+  </w:num>
+  <w:num w:numId="6" w16cid:durableId="604077374">
+    <w:abstractNumId w:val="19"/>
+  </w:num>
+  <w:num w:numId="7" w16cid:durableId="241372837">
+    <w:abstractNumId w:val="25"/>
+  </w:num>
+  <w:num w:numId="8" w16cid:durableId="1642466594">
+    <w:abstractNumId w:val="37"/>
+  </w:num>
+  <w:num w:numId="9" w16cid:durableId="433138005">
+    <w:abstractNumId w:val="14"/>
+  </w:num>
+  <w:num w:numId="10" w16cid:durableId="669530973">
     <w:abstractNumId w:val="23"/>
   </w:num>
-  <w:num w:numId="2" w16cid:durableId="1937470372">
+  <w:num w:numId="11" w16cid:durableId="420563296">
+    <w:abstractNumId w:val="22"/>
+  </w:num>
+  <w:num w:numId="12" w16cid:durableId="578907855">
+    <w:abstractNumId w:val="18"/>
+  </w:num>
+  <w:num w:numId="13" w16cid:durableId="178127849">
+    <w:abstractNumId w:val="20"/>
+  </w:num>
+  <w:num w:numId="14" w16cid:durableId="636649434">
+    <w:abstractNumId w:val="21"/>
+  </w:num>
+  <w:num w:numId="15" w16cid:durableId="694696527">
+    <w:abstractNumId w:val="27"/>
+  </w:num>
+  <w:num w:numId="16" w16cid:durableId="1765297479">
     <w:abstractNumId w:val="28"/>
   </w:num>
-  <w:num w:numId="3" w16cid:durableId="284237462">
+  <w:num w:numId="17" w16cid:durableId="40986502">
+    <w:abstractNumId w:val="12"/>
+  </w:num>
+  <w:num w:numId="18" w16cid:durableId="927930495">
+    <w:abstractNumId w:val="13"/>
+  </w:num>
+  <w:num w:numId="19" w16cid:durableId="1700011789">
+    <w:abstractNumId w:val="34"/>
+  </w:num>
+  <w:num w:numId="20" w16cid:durableId="1229146778">
+    <w:abstractNumId w:val="31"/>
+  </w:num>
+  <w:num w:numId="21" w16cid:durableId="220216002">
+    <w:abstractNumId w:val="9"/>
+  </w:num>
+  <w:num w:numId="22" w16cid:durableId="14580772">
+    <w:abstractNumId w:val="10"/>
+  </w:num>
+  <w:num w:numId="23" w16cid:durableId="97608300">
+    <w:abstractNumId w:val="6"/>
+  </w:num>
+  <w:num w:numId="24" w16cid:durableId="1378550822">
+    <w:abstractNumId w:val="39"/>
+  </w:num>
+  <w:num w:numId="25" w16cid:durableId="1075905966">
+    <w:abstractNumId w:val="7"/>
+  </w:num>
+  <w:num w:numId="26" w16cid:durableId="1110510486">
+    <w:abstractNumId w:val="8"/>
+  </w:num>
+  <w:num w:numId="27" w16cid:durableId="214775573">
+    <w:abstractNumId w:val="32"/>
+  </w:num>
+  <w:num w:numId="28" w16cid:durableId="457457634">
+    <w:abstractNumId w:val="36"/>
+  </w:num>
+  <w:num w:numId="29" w16cid:durableId="1685400787">
+    <w:abstractNumId w:val="26"/>
+  </w:num>
+  <w:num w:numId="30" w16cid:durableId="1104881152">
+    <w:abstractNumId w:val="2"/>
+  </w:num>
+  <w:num w:numId="31" w16cid:durableId="1181970774">
+    <w:abstractNumId w:val="5"/>
+  </w:num>
+  <w:num w:numId="32" w16cid:durableId="501244050">
     <w:abstractNumId w:val="3"/>
   </w:num>
-  <w:num w:numId="4" w16cid:durableId="844127995">
-    <w:abstractNumId w:val="15"/>
-  </w:num>
-  <w:num w:numId="5" w16cid:durableId="862014625">
-    <w:abstractNumId w:val="10"/>
-  </w:num>
-  <w:num w:numId="6" w16cid:durableId="604077374">
-    <w:abstractNumId w:val="18"/>
-  </w:num>
-  <w:num w:numId="7" w16cid:durableId="241372837">
-    <w:abstractNumId w:val="24"/>
-  </w:num>
-  <w:num w:numId="8" w16cid:durableId="1642466594">
-    <w:abstractNumId w:val="36"/>
-  </w:num>
-  <w:num w:numId="9" w16cid:durableId="433138005">
-    <w:abstractNumId w:val="13"/>
-  </w:num>
-  <w:num w:numId="10" w16cid:durableId="669530973">
-    <w:abstractNumId w:val="22"/>
-  </w:num>
-  <w:num w:numId="11" w16cid:durableId="420563296">
-    <w:abstractNumId w:val="21"/>
-  </w:num>
-  <w:num w:numId="12" w16cid:durableId="578907855">
-    <w:abstractNumId w:val="17"/>
-  </w:num>
-  <w:num w:numId="13" w16cid:durableId="178127849">
-    <w:abstractNumId w:val="19"/>
-  </w:num>
-  <w:num w:numId="14" w16cid:durableId="636649434">
-    <w:abstractNumId w:val="20"/>
-  </w:num>
-  <w:num w:numId="15" w16cid:durableId="694696527">
-    <w:abstractNumId w:val="26"/>
-  </w:num>
-  <w:num w:numId="16" w16cid:durableId="1765297479">
-    <w:abstractNumId w:val="27"/>
-  </w:num>
-  <w:num w:numId="17" w16cid:durableId="40986502">
-    <w:abstractNumId w:val="11"/>
-  </w:num>
-  <w:num w:numId="18" w16cid:durableId="927930495">
-    <w:abstractNumId w:val="12"/>
-  </w:num>
-  <w:num w:numId="19" w16cid:durableId="1700011789">
-    <w:abstractNumId w:val="33"/>
-  </w:num>
-  <w:num w:numId="20" w16cid:durableId="1229146778">
+  <w:num w:numId="33" w16cid:durableId="1135177154">
     <w:abstractNumId w:val="30"/>
-  </w:num>
-  <w:num w:numId="21" w16cid:durableId="220216002">
-    <w:abstractNumId w:val="8"/>
-  </w:num>
-  <w:num w:numId="22" w16cid:durableId="14580772">
-    <w:abstractNumId w:val="9"/>
-  </w:num>
-  <w:num w:numId="23" w16cid:durableId="97608300">
-    <w:abstractNumId w:val="5"/>
-  </w:num>
-  <w:num w:numId="24" w16cid:durableId="1378550822">
-    <w:abstractNumId w:val="38"/>
-  </w:num>
-  <w:num w:numId="25" w16cid:durableId="1075905966">
-    <w:abstractNumId w:val="6"/>
-  </w:num>
-  <w:num w:numId="26" w16cid:durableId="1110510486">
-    <w:abstractNumId w:val="7"/>
-  </w:num>
-  <w:num w:numId="27" w16cid:durableId="214775573">
-    <w:abstractNumId w:val="31"/>
-  </w:num>
-  <w:num w:numId="28" w16cid:durableId="457457634">
-    <w:abstractNumId w:val="35"/>
-  </w:num>
-  <w:num w:numId="29" w16cid:durableId="1685400787">
-    <w:abstractNumId w:val="25"/>
-  </w:num>
-  <w:num w:numId="30" w16cid:durableId="1104881152">
-    <w:abstractNumId w:val="1"/>
-  </w:num>
-  <w:num w:numId="31" w16cid:durableId="1181970774">
-    <w:abstractNumId w:val="4"/>
-  </w:num>
-  <w:num w:numId="32" w16cid:durableId="501244050">
-    <w:abstractNumId w:val="2"/>
-  </w:num>
-  <w:num w:numId="33" w16cid:durableId="1135177154">
-    <w:abstractNumId w:val="29"/>
   </w:num>
   <w:num w:numId="34" w16cid:durableId="437023721">
     <w:abstractNumId w:val="0"/>
   </w:num>
   <w:num w:numId="35" w16cid:durableId="809710676">
-    <w:abstractNumId w:val="16"/>
+    <w:abstractNumId w:val="17"/>
   </w:num>
   <w:num w:numId="36" w16cid:durableId="851724587">
-    <w:abstractNumId w:val="14"/>
+    <w:abstractNumId w:val="15"/>
   </w:num>
   <w:num w:numId="37" w16cid:durableId="148057100">
-    <w:abstractNumId w:val="37"/>
+    <w:abstractNumId w:val="38"/>
   </w:num>
   <w:num w:numId="38" w16cid:durableId="284389552">
-    <w:abstractNumId w:val="34"/>
+    <w:abstractNumId w:val="35"/>
   </w:num>
   <w:num w:numId="39" w16cid:durableId="1069810163">
-    <w:abstractNumId w:val="32"/>
+    <w:abstractNumId w:val="33"/>
+  </w:num>
+  <w:num w:numId="40" w16cid:durableId="226376364">
+    <w:abstractNumId w:val="1"/>
   </w:num>
 </w:numbering>
 </file>
 
 <file path=word/people.xml><?xml version="1.0" encoding="utf-8"?>
-<w15:people xmlns:wpc="http://schemas.microsoft.com/office/word/2010/wordprocessingCanvas" xmlns:cx="http://schemas.microsoft.com/office/drawing/2014/chartex" xmlns:cx1="http://schemas.microsoft.com/office/drawing/2015/9/8/chartex" xmlns:cx2="http://schemas.microsoft.com/office/drawing/2015/10/21/chartex" xmlns:cx3="http://schemas.microsoft.com/office/drawing/2016/5/9/chartex" xmlns:cx4="http://schemas.microsoft.com/office/drawing/2016/5/10/chartex" xmlns:cx5="http://schemas.microsoft.com/office/drawing/2016/5/11/chartex" xmlns:cx6="http://schemas.microsoft.com/office/drawing/2016/5/12/chartex" xmlns:cx7="http://schemas.microsoft.com/office/drawing/2016/5/13/chartex" xmlns:cx8="http://schemas.microsoft.com/office/drawing/2016/5/14/chartex" xmlns:mc="http://schemas.openxmlformats.org/markup-compatibility/2006" xmlns:aink="http://schemas.microsoft.com/office/drawing/2016/ink" xmlns:am3d="http://schemas.microsoft.com/office/drawing/2017/model3d" xmlns:o="urn:schemas-microsoft-com:office:office" xmlns:oel="http://schemas.microsoft.com/office/2019/extlst" xmlns:r="http://schemas.openxmlformats.org/officeDocument/2006/relationships" xmlns:m="http://schemas.openxmlformats.org/officeDocument/2006/math" xmlns:v="urn:schemas-microsoft-com:vml" xmlns:wp14="http://schemas.microsoft.com/office/word/2010/wordprocessingDrawing" xmlns:wp="http://schemas.openxmlformats.org/drawingml/2006/wordprocessingDrawing" xmlns:w10="urn:schemas-microsoft-com:office:word" xmlns:w="http://schemas.openxmlformats.org/wordprocessingml/2006/main" xmlns:w14="http://schemas.microsoft.com/office/word/2010/wordml" xmlns:w15="http://schemas.microsoft.com/office/word/2012/wordml" xmlns:w16cex="http://schemas.microsoft.com/office/word/2018/wordml/cex" xmlns:w16cid="http://schemas.microsoft.com/office/word/2016/wordml/cid" xmlns:w16="http://schemas.microsoft.com/office/word/2018/wordml" xmlns:w16du="http://schemas.microsoft.com/office/word/2023/wordml/word16du" xmlns:w16sdtdh="http://schemas.microsoft.com/office/word/2020/wordml/sdtdatahash" xmlns:w16sdtfl="http://schemas.microsoft.com/office/word/2024/wordml/sdtformatlock" xmlns:w16se="http://schemas.microsoft.com/office/word/2015/wordml/symex" xmlns:wpg="http://schemas.microsoft.com/office/word/2010/wordprocessingGroup" xmlns:wpi="http://schemas.microsoft.com/office/word/2010/wordprocessingInk" xmlns:wne="http://schemas.microsoft.com/office/word/2006/wordml" xmlns:wps="http://schemas.microsoft.com/office/word/2010/wordprocessingShape" mc:Ignorable="w14 w15 w16se w16cid w16 w16cex w16sdtdh w16sdtfl w16du wp14">
+<w15:people xmlns:wpc="http://schemas.microsoft.com/office/word/2010/wordprocessingCanvas" xmlns:cx="http://schemas.microsoft.com/office/drawing/2014/chartex" xmlns:cx1="http://schemas.microsoft.com/office/drawing/2015/9/8/chartex" xmlns:cx2="http://schemas.microsoft.com/office/drawing/2015/10/21/chartex" xmlns:cx3="http://schemas.microsoft.com/office/drawing/2016/5/9/chartex" xmlns:cx4="http://schemas.microsoft.com/office/drawing/2016/5/10/chartex" xmlns:cx5="http://schemas.microsoft.com/office/drawing/2016/5/11/chartex" xmlns:cx6="http://schemas.microsoft.com/office/drawing/2016/5/12/chartex" xmlns:cx7="http://schemas.microsoft.com/office/drawing/2016/5/13/chartex" xmlns:cx8="http://schemas.microsoft.com/office/drawing/2016/5/14/chartex" xmlns:mc="http://schemas.openxmlformats.org/markup-compatibility/2006" xmlns:aink="http://schemas.microsoft.com/office/drawing/2016/ink" xmlns:am3d="http://schemas.microsoft.com/office/drawing/2017/model3d" xmlns:o="urn:schemas-microsoft-com:office:office" xmlns:oel="http://schemas.microsoft.com/office/2019/extlst" xmlns:r="http://schemas.openxmlformats.org/officeDocument/2006/relationships" xmlns:m="http://schemas.openxmlformats.org/officeDocument/2006/math" xmlns:v="urn:schemas-microsoft-com:vml" xmlns:wp14="http://schemas.microsoft.com/office/word/2010/wordprocessingDrawing" xmlns:wp="http://schemas.openxmlformats.org/drawingml/2006/wordprocessingDrawing" xmlns:w10="urn:schemas-microsoft-com:office:word" xmlns:w="http://schemas.openxmlformats.org/wordprocessingml/2006/main" xmlns:w14="http://schemas.microsoft.com/office/word/2010/wordml" xmlns:w15="http://schemas.microsoft.com/office/word/2012/wordml" xmlns:w16cex="http://schemas.microsoft.com/office/word/2018/wordml/cex" xmlns:w16cid="http://schemas.microsoft.com/office/word/2016/wordml/cid" xmlns:w16="http://schemas.microsoft.com/office/word/2018/wordml" xmlns:w16du="http://schemas.microsoft.com/office/word/2023/wordml/word16du" xmlns:w16sdtdh="http://schemas.microsoft.com/office/word/2020/wordml/sdtdatahash" xmlns:w16se="http://schemas.microsoft.com/office/word/2015/wordml/symex" xmlns:wpg="http://schemas.microsoft.com/office/word/2010/wordprocessingGroup" xmlns:wpi="http://schemas.microsoft.com/office/word/2010/wordprocessingInk" xmlns:wne="http://schemas.microsoft.com/office/word/2006/wordml" xmlns:wps="http://schemas.microsoft.com/office/word/2010/wordprocessingShape" mc:Ignorable="w14 w15 w16se w16cid w16 w16cex w16sdtdh w16du wp14">
+  <w15:person w15:author="Cummings, Shawn">
+    <w15:presenceInfo w15:providerId="AD" w15:userId="S::shawn.cummings@uconn.edu::de2d00fc-0438-4d53-9dfb-ffd47e6e9224"/>
+  </w15:person>
   <w15:person w15:author="Jaeger, Florian">
     <w15:presenceInfo w15:providerId="AD" w15:userId="S::fjaeger@ur.rochester.edu::0d0acd91-09a2-4ddb-a934-22efc544688e"/>
-  </w15:person>
-  <w15:person w15:author="Cummings, Shawn">
-    <w15:presenceInfo w15:providerId="AD" w15:userId="S::shawn.cummings@uconn.edu::de2d00fc-0438-4d53-9dfb-ffd47e6e9224"/>
   </w15:person>
 </w15:people>
 </file>
 
 <file path=word/styles.xml><?xml version="1.0" encoding="utf-8"?>
-<w:styles xmlns:mc="http://schemas.openxmlformats.org/markup-compatibility/2006" xmlns:r="http://schemas.openxmlformats.org/officeDocument/2006/relationships" xmlns:w="http://schemas.openxmlformats.org/wordprocessingml/2006/main" xmlns:w14="http://schemas.microsoft.com/office/word/2010/wordml" xmlns:w15="http://schemas.microsoft.com/office/word/2012/wordml" xmlns:w16cex="http://schemas.microsoft.com/office/word/2018/wordml/cex" xmlns:w16cid="http://schemas.microsoft.com/office/word/2016/wordml/cid" xmlns:w16="http://schemas.microsoft.com/office/word/2018/wordml" xmlns:w16du="http://schemas.microsoft.com/office/word/2023/wordml/word16du" xmlns:w16sdtdh="http://schemas.microsoft.com/office/word/2020/wordml/sdtdatahash" xmlns:w16sdtfl="http://schemas.microsoft.com/office/word/2024/wordml/sdtformatlock" xmlns:w16se="http://schemas.microsoft.com/office/word/2015/wordml/symex" mc:Ignorable="w14 w15 w16se w16cid w16 w16cex w16sdtdh w16sdtfl w16du">
+<w:styles xmlns:mc="http://schemas.openxmlformats.org/markup-compatibility/2006" xmlns:r="http://schemas.openxmlformats.org/officeDocument/2006/relationships" xmlns:w="http://schemas.openxmlformats.org/wordprocessingml/2006/main" xmlns:w14="http://schemas.microsoft.com/office/word/2010/wordml" xmlns:w15="http://schemas.microsoft.com/office/word/2012/wordml" xmlns:w16cex="http://schemas.microsoft.com/office/word/2018/wordml/cex" xmlns:w16cid="http://schemas.microsoft.com/office/word/2016/wordml/cid" xmlns:w16="http://schemas.microsoft.com/office/word/2018/wordml" xmlns:w16du="http://schemas.microsoft.com/office/word/2023/wordml/word16du" xmlns:w16sdtdh="http://schemas.microsoft.com/office/word/2020/wordml/sdtdatahash" xmlns:w16se="http://schemas.microsoft.com/office/word/2015/wordml/symex" mc:Ignorable="w14 w15 w16se w16cid w16 w16cex w16sdtdh w16du">
   <w:docDefaults>
     <w:rPrDefault>
       <w:rPr>
@@ -32425,7 +32658,6 @@
   <w:style w:type="character" w:default="1" w:styleId="DefaultParagraphFont">
     <w:name w:val="Default Paragraph Font"/>
     <w:uiPriority w:val="1"/>
-    <w:semiHidden/>
     <w:unhideWhenUsed/>
   </w:style>
   <w:style w:type="table" w:default="1" w:styleId="TableNormal">
@@ -33308,7 +33540,7 @@
 </file>
 
 <file path=customXml/itemProps1.xml><?xml version="1.0" encoding="utf-8"?>
-<ds:datastoreItem xmlns:ds="http://schemas.openxmlformats.org/officeDocument/2006/customXml" ds:itemID="{CEAF82DD-8E2B-F442-854C-D22AA8B4402F}">
+<ds:datastoreItem xmlns:ds="http://schemas.openxmlformats.org/officeDocument/2006/customXml" ds:itemID="{B20ED14E-20BD-0342-A447-925FFA2C3804}">
   <ds:schemaRefs>
     <ds:schemaRef ds:uri="http://schemas.openxmlformats.org/officeDocument/2006/bibliography"/>
   </ds:schemaRefs>
@@ -33316,7 +33548,7 @@
 </file>
 
 <file path=customXml/itemProps2.xml><?xml version="1.0" encoding="utf-8"?>
-<ds:datastoreItem xmlns:ds="http://schemas.openxmlformats.org/officeDocument/2006/customXml" ds:itemID="{B20ED14E-20BD-0342-A447-925FFA2C3804}">
+<ds:datastoreItem xmlns:ds="http://schemas.openxmlformats.org/officeDocument/2006/customXml" ds:itemID="{CEAF82DD-8E2B-F442-854C-D22AA8B4402F}">
   <ds:schemaRefs>
     <ds:schemaRef ds:uri="http://schemas.openxmlformats.org/officeDocument/2006/bibliography"/>
   </ds:schemaRefs>

</xml_diff>

<commit_message>
Update trial level exclusions
</commit_message>
<xml_diff>
--- a/output/papers/Round 2/manuscript-brief.docx
+++ b/output/papers/Round 2/manuscript-brief.docx
@@ -7608,6 +7608,7 @@
     <w:p>
       <w:pPr>
         <w:rPr>
+          <w:ins w:id="2" w:author="Cummings, Shawn" w:date="2025-05-22T12:44:00Z" w16du:dateUtc="2025-05-22T16:44:00Z"/>
           <w:szCs w:val="22"/>
         </w:rPr>
       </w:pPr>
@@ -7655,7 +7656,7 @@
         </w:rPr>
         <w:t xml:space="preserve"> summarizes the </w:t>
       </w:r>
-      <w:ins w:id="2" w:author="Jaeger, Florian" w:date="2025-05-21T14:28:00Z" w16du:dateUtc="2025-05-21T18:28:00Z">
+      <w:ins w:id="3" w:author="Jaeger, Florian" w:date="2025-05-21T14:28:00Z" w16du:dateUtc="2025-05-21T18:28:00Z">
         <w:r>
           <w:rPr>
             <w:szCs w:val="22"/>
@@ -7675,7 +7676,7 @@
         </w:rPr>
         <w:t xml:space="preserve">After participant exclusions, </w:t>
       </w:r>
-      <w:ins w:id="3" w:author="Jaeger, Florian" w:date="2025-05-21T14:17:00Z" w16du:dateUtc="2025-05-21T18:17:00Z">
+      <w:ins w:id="4" w:author="Jaeger, Florian" w:date="2025-05-21T14:17:00Z" w16du:dateUtc="2025-05-21T18:17:00Z">
         <w:r>
           <w:rPr>
             <w:szCs w:val="22"/>
@@ -7683,7 +7684,7 @@
           <w:t xml:space="preserve">we applied trial-level exclusions. </w:t>
         </w:r>
       </w:ins>
-      <w:ins w:id="4" w:author="Jaeger, Florian" w:date="2025-05-21T14:28:00Z" w16du:dateUtc="2025-05-21T18:28:00Z">
+      <w:ins w:id="5" w:author="Jaeger, Florian" w:date="2025-05-21T14:28:00Z" w16du:dateUtc="2025-05-21T18:28:00Z">
         <w:r>
           <w:rPr>
             <w:szCs w:val="22"/>
@@ -7691,7 +7692,7 @@
           <w:t>For Experiments 1a-c, w</w:t>
         </w:r>
       </w:ins>
-      <w:ins w:id="5" w:author="Jaeger, Florian" w:date="2025-05-21T14:17:00Z" w16du:dateUtc="2025-05-21T18:17:00Z">
+      <w:ins w:id="6" w:author="Jaeger, Florian" w:date="2025-05-21T14:17:00Z" w16du:dateUtc="2025-05-21T18:17:00Z">
         <w:r>
           <w:rPr>
             <w:szCs w:val="22"/>
@@ -7699,19 +7700,29 @@
           <w:t xml:space="preserve">e excluded </w:t>
         </w:r>
       </w:ins>
-      <w:commentRangeStart w:id="6"/>
-      <w:r>
-        <w:rPr>
-          <w:szCs w:val="22"/>
-        </w:rPr>
-        <w:t>5</w:t>
-      </w:r>
-      <w:r>
-        <w:rPr>
-          <w:szCs w:val="22"/>
-        </w:rPr>
-        <w:t>9</w:t>
-      </w:r>
+      <w:ins w:id="7" w:author="Cummings, Shawn" w:date="2025-05-22T12:45:00Z" w16du:dateUtc="2025-05-22T16:45:00Z">
+        <w:r>
+          <w:rPr>
+            <w:szCs w:val="22"/>
+          </w:rPr>
+          <w:t>85</w:t>
+        </w:r>
+      </w:ins>
+      <w:commentRangeStart w:id="8"/>
+      <w:del w:id="9" w:author="Cummings, Shawn" w:date="2025-05-22T12:45:00Z" w16du:dateUtc="2025-05-22T16:45:00Z">
+        <w:r>
+          <w:rPr>
+            <w:szCs w:val="22"/>
+          </w:rPr>
+          <w:delText>5</w:delText>
+        </w:r>
+        <w:r>
+          <w:rPr>
+            <w:szCs w:val="22"/>
+          </w:rPr>
+          <w:delText>9</w:delText>
+        </w:r>
+      </w:del>
       <w:r>
         <w:rPr>
           <w:szCs w:val="22"/>
@@ -7728,7 +7739,29 @@
         <w:rPr>
           <w:szCs w:val="22"/>
         </w:rPr>
-        <w:t>(0.5%)</w:t>
+        <w:t>(0.</w:t>
+      </w:r>
+      <w:ins w:id="10" w:author="Cummings, Shawn" w:date="2025-05-22T12:45:00Z" w16du:dateUtc="2025-05-22T16:45:00Z">
+        <w:r>
+          <w:rPr>
+            <w:szCs w:val="22"/>
+          </w:rPr>
+          <w:t>8</w:t>
+        </w:r>
+      </w:ins>
+      <w:del w:id="11" w:author="Cummings, Shawn" w:date="2025-05-22T12:45:00Z" w16du:dateUtc="2025-05-22T16:45:00Z">
+        <w:r>
+          <w:rPr>
+            <w:szCs w:val="22"/>
+          </w:rPr>
+          <w:delText>5</w:delText>
+        </w:r>
+      </w:del>
+      <w:r>
+        <w:rPr>
+          <w:szCs w:val="22"/>
+        </w:rPr>
+        <w:t>%)</w:t>
       </w:r>
       <w:r>
         <w:rPr>
@@ -7736,14 +7769,14 @@
         </w:rPr>
         <w:t xml:space="preserve"> </w:t>
       </w:r>
-      <w:commentRangeEnd w:id="6"/>
+      <w:commentRangeEnd w:id="8"/>
       <w:r>
         <w:rPr>
           <w:rStyle w:val="CommentReference"/>
         </w:rPr>
-        <w:commentReference w:id="6"/>
-      </w:r>
-      <w:ins w:id="7" w:author="Jaeger, Florian" w:date="2025-05-21T14:28:00Z" w16du:dateUtc="2025-05-21T18:28:00Z">
+        <w:commentReference w:id="8"/>
+      </w:r>
+      <w:ins w:id="12" w:author="Jaeger, Florian" w:date="2025-05-21T14:28:00Z" w16du:dateUtc="2025-05-21T18:28:00Z">
         <w:r>
           <w:rPr>
             <w:szCs w:val="22"/>
@@ -7751,7 +7784,7 @@
           <w:t>that were missing a categorization response since</w:t>
         </w:r>
       </w:ins>
-      <w:del w:id="8" w:author="Jaeger, Florian" w:date="2025-05-21T14:17:00Z" w16du:dateUtc="2025-05-21T18:17:00Z">
+      <w:del w:id="13" w:author="Jaeger, Florian" w:date="2025-05-21T14:17:00Z" w16du:dateUtc="2025-05-21T18:17:00Z">
         <w:r>
           <w:rPr>
             <w:szCs w:val="22"/>
@@ -7759,7 +7792,7 @@
           <w:delText xml:space="preserve">were </w:delText>
         </w:r>
       </w:del>
-      <w:ins w:id="9" w:author="Jaeger, Florian" w:date="2025-05-21T14:28:00Z" w16du:dateUtc="2025-05-21T18:28:00Z">
+      <w:ins w:id="14" w:author="Jaeger, Florian" w:date="2025-05-21T14:28:00Z" w16du:dateUtc="2025-05-21T18:28:00Z">
         <w:r>
           <w:rPr>
             <w:szCs w:val="22"/>
@@ -7767,7 +7800,7 @@
           <w:t xml:space="preserve"> </w:t>
         </w:r>
       </w:ins>
-      <w:ins w:id="10" w:author="Jaeger, Florian" w:date="2025-05-21T14:19:00Z" w16du:dateUtc="2025-05-21T18:19:00Z">
+      <w:ins w:id="15" w:author="Jaeger, Florian" w:date="2025-05-21T14:19:00Z" w16du:dateUtc="2025-05-21T18:19:00Z">
         <w:r>
           <w:rPr>
             <w:szCs w:val="22"/>
@@ -7775,7 +7808,7 @@
           <w:t>participants indicated a catch trial</w:t>
         </w:r>
       </w:ins>
-      <w:ins w:id="11" w:author="Jaeger, Florian" w:date="2025-05-21T14:21:00Z" w16du:dateUtc="2025-05-21T18:21:00Z">
+      <w:ins w:id="16" w:author="Jaeger, Florian" w:date="2025-05-21T14:21:00Z" w16du:dateUtc="2025-05-21T18:21:00Z">
         <w:r>
           <w:rPr>
             <w:szCs w:val="22"/>
@@ -7783,7 +7816,7 @@
           <w:t xml:space="preserve"> (a</w:t>
         </w:r>
       </w:ins>
-      <w:ins w:id="12" w:author="Jaeger, Florian" w:date="2025-05-21T14:19:00Z" w16du:dateUtc="2025-05-21T18:19:00Z">
+      <w:ins w:id="17" w:author="Jaeger, Florian" w:date="2025-05-21T14:19:00Z" w16du:dateUtc="2025-05-21T18:19:00Z">
         <w:r>
           <w:rPr>
             <w:szCs w:val="22"/>
@@ -7791,7 +7824,7 @@
           <w:t xml:space="preserve">s detailed </w:t>
         </w:r>
       </w:ins>
-      <w:ins w:id="13" w:author="Jaeger, Florian" w:date="2025-05-21T14:20:00Z" w16du:dateUtc="2025-05-21T18:20:00Z">
+      <w:ins w:id="18" w:author="Jaeger, Florian" w:date="2025-05-21T14:20:00Z" w16du:dateUtc="2025-05-21T18:20:00Z">
         <w:r>
           <w:rPr>
             <w:szCs w:val="22"/>
@@ -7803,7 +7836,7 @@
             <w:i/>
             <w:iCs/>
             <w:szCs w:val="22"/>
-            <w:rPrChange w:id="14" w:author="Jaeger, Florian" w:date="2025-05-21T14:20:00Z" w16du:dateUtc="2025-05-21T18:20:00Z">
+            <w:rPrChange w:id="19" w:author="Jaeger, Florian" w:date="2025-05-21T14:20:00Z" w16du:dateUtc="2025-05-21T18:20:00Z">
               <w:rPr>
                 <w:szCs w:val="22"/>
               </w:rPr>
@@ -7812,7 +7845,7 @@
           <w:t>Procedure</w:t>
         </w:r>
       </w:ins>
-      <w:ins w:id="15" w:author="Jaeger, Florian" w:date="2025-05-21T14:19:00Z" w16du:dateUtc="2025-05-21T18:19:00Z">
+      <w:ins w:id="20" w:author="Jaeger, Florian" w:date="2025-05-21T14:19:00Z" w16du:dateUtc="2025-05-21T18:19:00Z">
         <w:r>
           <w:rPr>
             <w:szCs w:val="22"/>
@@ -7820,7 +7853,7 @@
           <w:t xml:space="preserve">, </w:t>
         </w:r>
       </w:ins>
-      <w:ins w:id="16" w:author="Jaeger, Florian" w:date="2025-05-21T14:20:00Z" w16du:dateUtc="2025-05-21T18:20:00Z">
+      <w:ins w:id="21" w:author="Jaeger, Florian" w:date="2025-05-21T14:20:00Z" w16du:dateUtc="2025-05-21T18:20:00Z">
         <w:r>
           <w:rPr>
             <w:szCs w:val="22"/>
@@ -7828,7 +7861,7 @@
           <w:t>the experiments reporte</w:t>
         </w:r>
       </w:ins>
-      <w:ins w:id="17" w:author="Jaeger, Florian" w:date="2025-05-21T14:21:00Z" w16du:dateUtc="2025-05-21T18:21:00Z">
+      <w:ins w:id="22" w:author="Jaeger, Florian" w:date="2025-05-21T14:21:00Z" w16du:dateUtc="2025-05-21T18:21:00Z">
         <w:r>
           <w:rPr>
             <w:szCs w:val="22"/>
@@ -7836,7 +7869,7 @@
           <w:t xml:space="preserve">d here </w:t>
         </w:r>
       </w:ins>
-      <w:ins w:id="18" w:author="Jaeger, Florian" w:date="2025-05-21T14:22:00Z" w16du:dateUtc="2025-05-21T18:22:00Z">
+      <w:ins w:id="23" w:author="Jaeger, Florian" w:date="2025-05-21T14:22:00Z" w16du:dateUtc="2025-05-21T18:22:00Z">
         <w:r>
           <w:rPr>
             <w:szCs w:val="22"/>
@@ -7844,7 +7877,7 @@
           <w:t>did not actually</w:t>
         </w:r>
       </w:ins>
-      <w:ins w:id="19" w:author="Jaeger, Florian" w:date="2025-05-21T14:21:00Z" w16du:dateUtc="2025-05-21T18:21:00Z">
+      <w:ins w:id="24" w:author="Jaeger, Florian" w:date="2025-05-21T14:21:00Z" w16du:dateUtc="2025-05-21T18:21:00Z">
         <w:r>
           <w:rPr>
             <w:szCs w:val="22"/>
@@ -7852,7 +7885,7 @@
           <w:t xml:space="preserve"> contain</w:t>
         </w:r>
       </w:ins>
-      <w:ins w:id="20" w:author="Jaeger, Florian" w:date="2025-05-21T14:22:00Z" w16du:dateUtc="2025-05-21T18:22:00Z">
+      <w:ins w:id="25" w:author="Jaeger, Florian" w:date="2025-05-21T14:22:00Z" w16du:dateUtc="2025-05-21T18:22:00Z">
         <w:r>
           <w:rPr>
             <w:szCs w:val="22"/>
@@ -7860,7 +7893,7 @@
           <w:t xml:space="preserve"> any</w:t>
         </w:r>
       </w:ins>
-      <w:ins w:id="21" w:author="Jaeger, Florian" w:date="2025-05-21T14:21:00Z" w16du:dateUtc="2025-05-21T18:21:00Z">
+      <w:ins w:id="26" w:author="Jaeger, Florian" w:date="2025-05-21T14:21:00Z" w16du:dateUtc="2025-05-21T18:21:00Z">
         <w:r>
           <w:rPr>
             <w:szCs w:val="22"/>
@@ -7868,7 +7901,7 @@
           <w:t xml:space="preserve"> catch trials</w:t>
         </w:r>
       </w:ins>
-      <w:ins w:id="22" w:author="Jaeger, Florian" w:date="2025-05-21T14:22:00Z" w16du:dateUtc="2025-05-21T18:22:00Z">
+      <w:ins w:id="27" w:author="Jaeger, Florian" w:date="2025-05-21T14:22:00Z" w16du:dateUtc="2025-05-21T18:22:00Z">
         <w:r>
           <w:rPr>
             <w:szCs w:val="22"/>
@@ -7876,7 +7909,7 @@
           <w:t>)</w:t>
         </w:r>
       </w:ins>
-      <w:ins w:id="23" w:author="Jaeger, Florian" w:date="2025-05-21T14:21:00Z" w16du:dateUtc="2025-05-21T18:21:00Z">
+      <w:ins w:id="28" w:author="Jaeger, Florian" w:date="2025-05-21T14:21:00Z" w16du:dateUtc="2025-05-21T18:21:00Z">
         <w:r>
           <w:rPr>
             <w:szCs w:val="22"/>
@@ -7884,7 +7917,7 @@
           <w:t>.</w:t>
         </w:r>
       </w:ins>
-      <w:ins w:id="24" w:author="Jaeger, Florian" w:date="2025-05-21T14:22:00Z" w16du:dateUtc="2025-05-21T18:22:00Z">
+      <w:ins w:id="29" w:author="Jaeger, Florian" w:date="2025-05-21T14:22:00Z" w16du:dateUtc="2025-05-21T18:22:00Z">
         <w:r>
           <w:rPr>
             <w:szCs w:val="22"/>
@@ -7892,16 +7925,26 @@
           <w:t xml:space="preserve"> We also excluded </w:t>
         </w:r>
       </w:ins>
-      <w:commentRangeStart w:id="25"/>
-      <w:ins w:id="26" w:author="Jaeger, Florian" w:date="2025-05-21T14:23:00Z" w16du:dateUtc="2025-05-21T18:23:00Z">
+      <w:ins w:id="30" w:author="Cummings, Shawn" w:date="2025-05-22T12:45:00Z" w16du:dateUtc="2025-05-22T16:45:00Z">
         <w:r>
           <w:rPr>
             <w:szCs w:val="22"/>
           </w:rPr>
-          <w:t>XXX</w:t>
+          <w:t>236</w:t>
         </w:r>
       </w:ins>
-      <w:ins w:id="27" w:author="Jaeger, Florian" w:date="2025-05-21T14:22:00Z" w16du:dateUtc="2025-05-21T18:22:00Z">
+      <w:commentRangeStart w:id="31"/>
+      <w:ins w:id="32" w:author="Jaeger, Florian" w:date="2025-05-21T14:23:00Z" w16du:dateUtc="2025-05-21T18:23:00Z">
+        <w:del w:id="33" w:author="Cummings, Shawn" w:date="2025-05-22T12:45:00Z" w16du:dateUtc="2025-05-22T16:45:00Z">
+          <w:r>
+            <w:rPr>
+              <w:szCs w:val="22"/>
+            </w:rPr>
+            <w:delText>XXX</w:delText>
+          </w:r>
+        </w:del>
+      </w:ins>
+      <w:ins w:id="34" w:author="Jaeger, Florian" w:date="2025-05-21T14:22:00Z" w16du:dateUtc="2025-05-21T18:22:00Z">
         <w:r>
           <w:rPr>
             <w:szCs w:val="22"/>
@@ -7909,15 +7952,39 @@
           <w:t xml:space="preserve"> trials</w:t>
         </w:r>
       </w:ins>
-      <w:ins w:id="28" w:author="Jaeger, Florian" w:date="2025-05-21T14:24:00Z" w16du:dateUtc="2025-05-21T18:24:00Z">
+      <w:ins w:id="35" w:author="Jaeger, Florian" w:date="2025-05-21T14:24:00Z" w16du:dateUtc="2025-05-21T18:24:00Z">
         <w:r>
           <w:rPr>
             <w:szCs w:val="22"/>
           </w:rPr>
-          <w:t xml:space="preserve"> (XX.X%)</w:t>
+          <w:t xml:space="preserve"> (</w:t>
         </w:r>
       </w:ins>
-      <w:ins w:id="29" w:author="Jaeger, Florian" w:date="2025-05-21T14:22:00Z" w16du:dateUtc="2025-05-21T18:22:00Z">
+      <w:ins w:id="36" w:author="Cummings, Shawn" w:date="2025-05-22T12:45:00Z" w16du:dateUtc="2025-05-22T16:45:00Z">
+        <w:r>
+          <w:rPr>
+            <w:szCs w:val="22"/>
+          </w:rPr>
+          <w:t>1.8</w:t>
+        </w:r>
+      </w:ins>
+      <w:ins w:id="37" w:author="Jaeger, Florian" w:date="2025-05-21T14:24:00Z" w16du:dateUtc="2025-05-21T18:24:00Z">
+        <w:del w:id="38" w:author="Cummings, Shawn" w:date="2025-05-22T12:45:00Z" w16du:dateUtc="2025-05-22T16:45:00Z">
+          <w:r>
+            <w:rPr>
+              <w:szCs w:val="22"/>
+            </w:rPr>
+            <w:delText>XX.X</w:delText>
+          </w:r>
+        </w:del>
+        <w:r>
+          <w:rPr>
+            <w:szCs w:val="22"/>
+          </w:rPr>
+          <w:t>%)</w:t>
+        </w:r>
+      </w:ins>
+      <w:ins w:id="39" w:author="Jaeger, Florian" w:date="2025-05-21T14:22:00Z" w16du:dateUtc="2025-05-21T18:22:00Z">
         <w:r>
           <w:rPr>
             <w:szCs w:val="22"/>
@@ -7925,31 +7992,31 @@
           <w:t xml:space="preserve"> </w:t>
         </w:r>
       </w:ins>
-      <w:commentRangeEnd w:id="25"/>
-      <w:ins w:id="30" w:author="Jaeger, Florian" w:date="2025-05-21T14:30:00Z" w16du:dateUtc="2025-05-21T18:30:00Z">
+      <w:commentRangeEnd w:id="31"/>
+      <w:ins w:id="40" w:author="Jaeger, Florian" w:date="2025-05-21T14:30:00Z" w16du:dateUtc="2025-05-21T18:30:00Z">
         <w:r>
           <w:rPr>
             <w:rStyle w:val="CommentReference"/>
           </w:rPr>
-          <w:commentReference w:id="25"/>
+          <w:commentReference w:id="31"/>
         </w:r>
       </w:ins>
-      <w:ins w:id="31" w:author="Jaeger, Florian" w:date="2025-05-21T14:22:00Z" w16du:dateUtc="2025-05-21T18:22:00Z">
+      <w:ins w:id="41" w:author="Jaeger, Florian" w:date="2025-05-21T14:22:00Z" w16du:dateUtc="2025-05-21T18:22:00Z">
         <w:r>
           <w:rPr>
             <w:szCs w:val="22"/>
           </w:rPr>
-          <w:t xml:space="preserve">with unusually fast or slow reaction times (with-participant scaled </w:t>
+          <w:t>with unusually fast or slow reaction times (with-participant scaled log-</w:t>
         </w:r>
         <w:r>
           <w:rPr>
             <w:szCs w:val="22"/>
           </w:rPr>
           <w:lastRenderedPageBreak/>
-          <w:t>log-transformed RTs outs</w:t>
+          <w:t>transformed RTs outs</w:t>
         </w:r>
       </w:ins>
-      <w:ins w:id="32" w:author="Jaeger, Florian" w:date="2025-05-21T14:23:00Z" w16du:dateUtc="2025-05-21T18:23:00Z">
+      <w:ins w:id="42" w:author="Jaeger, Florian" w:date="2025-05-21T14:23:00Z" w16du:dateUtc="2025-05-21T18:23:00Z">
         <w:r>
           <w:rPr>
             <w:szCs w:val="22"/>
@@ -7963,7 +8030,7 @@
           <w:t xml:space="preserve"> SD of mean of scaled log-transformed RTs at that trial position; for details and visualization, see SI). This </w:t>
         </w:r>
       </w:ins>
-      <w:del w:id="33" w:author="Jaeger, Florian" w:date="2025-05-21T14:19:00Z" w16du:dateUtc="2025-05-21T18:19:00Z">
+      <w:del w:id="43" w:author="Jaeger, Florian" w:date="2025-05-21T14:19:00Z" w16du:dateUtc="2025-05-21T18:19:00Z">
         <w:r>
           <w:rPr>
             <w:szCs w:val="22"/>
@@ -7983,7 +8050,7 @@
           <w:delText xml:space="preserve">, </w:delText>
         </w:r>
       </w:del>
-      <w:ins w:id="34" w:author="Jaeger, Florian" w:date="2025-05-21T14:29:00Z" w16du:dateUtc="2025-05-21T18:29:00Z">
+      <w:ins w:id="44" w:author="Jaeger, Florian" w:date="2025-05-21T14:29:00Z" w16du:dateUtc="2025-05-21T18:29:00Z">
         <w:r>
           <w:rPr>
             <w:szCs w:val="22"/>
@@ -7991,7 +8058,7 @@
           <w:t>left</w:t>
         </w:r>
       </w:ins>
-      <w:del w:id="35" w:author="Jaeger, Florian" w:date="2025-05-21T14:29:00Z" w16du:dateUtc="2025-05-21T18:29:00Z">
+      <w:del w:id="45" w:author="Jaeger, Florian" w:date="2025-05-21T14:29:00Z" w16du:dateUtc="2025-05-21T18:29:00Z">
         <w:r>
           <w:rPr>
             <w:szCs w:val="22"/>
@@ -8011,7 +8078,7 @@
         </w:rPr>
         <w:t xml:space="preserve"> </w:t>
       </w:r>
-      <w:commentRangeStart w:id="36"/>
+      <w:commentRangeStart w:id="46"/>
       <w:r>
         <w:rPr>
           <w:szCs w:val="22"/>
@@ -8024,12 +8091,22 @@
         </w:rPr>
         <w:t>,</w:t>
       </w:r>
-      <w:r>
-        <w:rPr>
-          <w:szCs w:val="22"/>
-        </w:rPr>
-        <w:t>472</w:t>
-      </w:r>
+      <w:ins w:id="47" w:author="Cummings, Shawn" w:date="2025-05-22T12:46:00Z" w16du:dateUtc="2025-05-22T16:46:00Z">
+        <w:r>
+          <w:rPr>
+            <w:szCs w:val="22"/>
+          </w:rPr>
+          <w:t>595</w:t>
+        </w:r>
+      </w:ins>
+      <w:del w:id="48" w:author="Cummings, Shawn" w:date="2025-05-22T12:46:00Z" w16du:dateUtc="2025-05-22T16:46:00Z">
+        <w:r>
+          <w:rPr>
+            <w:szCs w:val="22"/>
+          </w:rPr>
+          <w:delText>472</w:delText>
+        </w:r>
+      </w:del>
       <w:r>
         <w:rPr>
           <w:szCs w:val="22"/>
@@ -8048,24 +8125,34 @@
         </w:rPr>
         <w:t>17</w:t>
       </w:r>
-      <w:r>
-        <w:rPr>
-          <w:szCs w:val="22"/>
-        </w:rPr>
-        <w:t>7</w:t>
-      </w:r>
+      <w:ins w:id="49" w:author="Cummings, Shawn" w:date="2025-05-22T12:46:00Z" w16du:dateUtc="2025-05-22T16:46:00Z">
+        <w:r>
+          <w:rPr>
+            <w:szCs w:val="22"/>
+          </w:rPr>
+          <w:t>9</w:t>
+        </w:r>
+      </w:ins>
+      <w:del w:id="50" w:author="Cummings, Shawn" w:date="2025-05-22T12:46:00Z" w16du:dateUtc="2025-05-22T16:46:00Z">
+        <w:r>
+          <w:rPr>
+            <w:szCs w:val="22"/>
+          </w:rPr>
+          <w:delText>7</w:delText>
+        </w:r>
+      </w:del>
       <w:r>
         <w:rPr>
           <w:szCs w:val="22"/>
         </w:rPr>
         <w:t xml:space="preserve"> </w:t>
       </w:r>
-      <w:commentRangeEnd w:id="36"/>
+      <w:commentRangeEnd w:id="46"/>
       <w:r>
         <w:rPr>
           <w:rStyle w:val="CommentReference"/>
         </w:rPr>
-        <w:commentReference w:id="36"/>
+        <w:commentReference w:id="46"/>
       </w:r>
       <w:r>
         <w:rPr>
@@ -8091,6 +8178,25 @@
         </w:rPr>
         <w:t>s</w:t>
       </w:r>
+      <w:commentRangeStart w:id="51"/>
+      <w:ins w:id="52" w:author="Cummings, Shawn" w:date="2025-05-22T12:47:00Z" w16du:dateUtc="2025-05-22T16:47:00Z">
+        <w:r>
+          <w:rPr>
+            <w:rStyle w:val="FootnoteReference"/>
+            <w:szCs w:val="22"/>
+          </w:rPr>
+          <w:footnoteReference w:id="6"/>
+        </w:r>
+      </w:ins>
+      <w:commentRangeEnd w:id="51"/>
+      <w:ins w:id="55" w:author="Cummings, Shawn" w:date="2025-05-22T12:49:00Z" w16du:dateUtc="2025-05-22T16:49:00Z">
+        <w:r>
+          <w:rPr>
+            <w:rStyle w:val="CommentReference"/>
+          </w:rPr>
+          <w:commentReference w:id="51"/>
+        </w:r>
+      </w:ins>
       <w:r>
         <w:rPr>
           <w:szCs w:val="22"/>
@@ -8125,23 +8231,39 @@
         <w:rPr>
           <w:szCs w:val="22"/>
         </w:rPr>
-        <w:t xml:space="preserve"> This was, however, </w:t>
-      </w:r>
-      <w:r>
-        <w:rPr>
-          <w:szCs w:val="22"/>
-        </w:rPr>
-        <w:t>never the case.</w:t>
-      </w:r>
+        <w:t xml:space="preserve"> </w:t>
+      </w:r>
+      <w:del w:id="56" w:author="Cummings, Shawn" w:date="2025-05-22T12:46:00Z" w16du:dateUtc="2025-05-22T16:46:00Z">
+        <w:r>
+          <w:rPr>
+            <w:szCs w:val="22"/>
+          </w:rPr>
+          <w:delText xml:space="preserve">This was, however, </w:delText>
+        </w:r>
+        <w:r>
+          <w:rPr>
+            <w:szCs w:val="22"/>
+          </w:rPr>
+          <w:delText>never the case.</w:delText>
+        </w:r>
+      </w:del>
     </w:p>
     <w:p>
       <w:pPr>
+        <w:rPr>
+          <w:del w:id="57" w:author="Cummings, Shawn" w:date="2025-05-22T12:48:00Z" w16du:dateUtc="2025-05-22T16:48:00Z"/>
+          <w:szCs w:val="22"/>
+        </w:rPr>
+      </w:pPr>
+    </w:p>
+    <w:p>
+      <w:pPr>
         <w:pStyle w:val="Caption"/>
         <w:rPr>
           <w:szCs w:val="22"/>
         </w:rPr>
       </w:pPr>
-      <w:bookmarkStart w:id="37" w:name="_Ref136088042"/>
+      <w:bookmarkStart w:id="58" w:name="_Ref136088042"/>
       <w:r>
         <w:t>T</w:t>
       </w:r>
@@ -8169,16 +8291,16 @@
         </w:rPr>
         <w:fldChar w:fldCharType="end"/>
       </w:r>
-      <w:bookmarkEnd w:id="37"/>
+      <w:bookmarkEnd w:id="58"/>
       <w:r>
         <w:tab/>
       </w:r>
-      <w:del w:id="38" w:author="Jaeger, Florian" w:date="2025-05-21T14:27:00Z" w16du:dateUtc="2025-05-21T18:27:00Z">
+      <w:del w:id="59" w:author="Jaeger, Florian" w:date="2025-05-21T14:27:00Z" w16du:dateUtc="2025-05-21T18:27:00Z">
         <w:r>
           <w:delText xml:space="preserve">Exclusions </w:delText>
         </w:r>
       </w:del>
-      <w:ins w:id="39" w:author="Jaeger, Florian" w:date="2025-05-21T14:27:00Z" w16du:dateUtc="2025-05-21T18:27:00Z">
+      <w:ins w:id="60" w:author="Jaeger, Florian" w:date="2025-05-21T14:27:00Z" w16du:dateUtc="2025-05-21T18:27:00Z">
         <w:r>
           <w:t xml:space="preserve">Participant exclusions </w:t>
         </w:r>
@@ -8189,12 +8311,12 @@
       <w:r>
         <w:t xml:space="preserve">Total exclusions can be less than the sum of all individual exclusion criteria since some participants failed multiple criteria. </w:t>
       </w:r>
-      <w:ins w:id="40" w:author="Jaeger, Florian" w:date="2025-05-21T14:16:00Z" w16du:dateUtc="2025-05-21T18:16:00Z">
+      <w:ins w:id="61" w:author="Jaeger, Florian" w:date="2025-05-21T14:16:00Z" w16du:dateUtc="2025-05-21T18:16:00Z">
         <w:r>
           <w:t>The SI contains additional visualizations of particip</w:t>
         </w:r>
       </w:ins>
-      <w:ins w:id="41" w:author="Jaeger, Florian" w:date="2025-05-21T14:17:00Z" w16du:dateUtc="2025-05-21T18:17:00Z">
+      <w:ins w:id="62" w:author="Jaeger, Florian" w:date="2025-05-21T14:17:00Z" w16du:dateUtc="2025-05-21T18:17:00Z">
         <w:r>
           <w:t>ant exclusions.</w:t>
         </w:r>
@@ -8212,7 +8334,7 @@
           <w:right w:w="15" w:type="dxa"/>
         </w:tblCellMar>
         <w:tblLook w:val="04A0" w:firstRow="1" w:lastRow="0" w:firstColumn="1" w:lastColumn="0" w:noHBand="0" w:noVBand="1"/>
-        <w:tblPrChange w:id="42" w:author="Cummings, Shawn" w:date="2025-05-22T12:42:00Z" w16du:dateUtc="2025-05-22T16:42:00Z">
+        <w:tblPrChange w:id="63" w:author="Cummings, Shawn" w:date="2025-05-22T12:42:00Z" w16du:dateUtc="2025-05-22T16:42:00Z">
           <w:tblPr>
             <w:tblW w:w="0" w:type="auto"/>
             <w:tblCellSpacing w:w="15" w:type="dxa"/>
@@ -8233,7 +8355,7 @@
         <w:gridCol w:w="1323"/>
         <w:gridCol w:w="1019"/>
         <w:gridCol w:w="1350"/>
-        <w:tblGridChange w:id="43">
+        <w:tblGridChange w:id="64">
           <w:tblGrid>
             <w:gridCol w:w="45"/>
             <w:gridCol w:w="2653"/>
@@ -8254,7 +8376,7 @@
       <w:tr>
         <w:trPr>
           <w:tblCellSpacing w:w="15" w:type="dxa"/>
-          <w:trPrChange w:id="44" w:author="Cummings, Shawn" w:date="2025-05-22T12:42:00Z" w16du:dateUtc="2025-05-22T16:42:00Z">
+          <w:trPrChange w:id="65" w:author="Cummings, Shawn" w:date="2025-05-22T12:42:00Z" w16du:dateUtc="2025-05-22T16:42:00Z">
             <w:trPr>
               <w:gridBefore w:val="1"/>
               <w:gridAfter w:val="0"/>
@@ -8270,7 +8392,7 @@
             </w:tcBorders>
             <w:vAlign w:val="center"/>
             <w:hideMark/>
-            <w:tcPrChange w:id="45" w:author="Cummings, Shawn" w:date="2025-05-22T12:42:00Z" w16du:dateUtc="2025-05-22T16:42:00Z">
+            <w:tcPrChange w:id="66" w:author="Cummings, Shawn" w:date="2025-05-22T12:42:00Z" w16du:dateUtc="2025-05-22T16:42:00Z">
               <w:tcPr>
                 <w:tcW w:w="0" w:type="auto"/>
                 <w:gridSpan w:val="2"/>
@@ -8321,7 +8443,7 @@
             </w:tcBorders>
             <w:vAlign w:val="center"/>
             <w:hideMark/>
-            <w:tcPrChange w:id="46" w:author="Cummings, Shawn" w:date="2025-05-22T12:42:00Z" w16du:dateUtc="2025-05-22T16:42:00Z">
+            <w:tcPrChange w:id="67" w:author="Cummings, Shawn" w:date="2025-05-22T12:42:00Z" w16du:dateUtc="2025-05-22T16:42:00Z">
               <w:tcPr>
                 <w:tcW w:w="0" w:type="auto"/>
                 <w:tcBorders>
@@ -8372,7 +8494,7 @@
             </w:tcBorders>
             <w:vAlign w:val="center"/>
             <w:hideMark/>
-            <w:tcPrChange w:id="47" w:author="Cummings, Shawn" w:date="2025-05-22T12:42:00Z" w16du:dateUtc="2025-05-22T16:42:00Z">
+            <w:tcPrChange w:id="68" w:author="Cummings, Shawn" w:date="2025-05-22T12:42:00Z" w16du:dateUtc="2025-05-22T16:42:00Z">
               <w:tcPr>
                 <w:tcW w:w="0" w:type="auto"/>
                 <w:gridSpan w:val="2"/>
@@ -8423,7 +8545,7 @@
             </w:tcBorders>
             <w:vAlign w:val="center"/>
             <w:hideMark/>
-            <w:tcPrChange w:id="48" w:author="Cummings, Shawn" w:date="2025-05-22T12:42:00Z" w16du:dateUtc="2025-05-22T16:42:00Z">
+            <w:tcPrChange w:id="69" w:author="Cummings, Shawn" w:date="2025-05-22T12:42:00Z" w16du:dateUtc="2025-05-22T16:42:00Z">
               <w:tcPr>
                 <w:tcW w:w="0" w:type="auto"/>
                 <w:gridSpan w:val="2"/>
@@ -8472,7 +8594,7 @@
               <w:bottom w:val="single" w:sz="18" w:space="0" w:color="auto"/>
               <w:right w:val="single" w:sz="4" w:space="0" w:color="auto"/>
             </w:tcBorders>
-            <w:tcPrChange w:id="49" w:author="Cummings, Shawn" w:date="2025-05-22T12:42:00Z" w16du:dateUtc="2025-05-22T16:42:00Z">
+            <w:tcPrChange w:id="70" w:author="Cummings, Shawn" w:date="2025-05-22T12:42:00Z" w16du:dateUtc="2025-05-22T16:42:00Z">
               <w:tcPr>
                 <w:tcW w:w="0" w:type="auto"/>
                 <w:gridSpan w:val="2"/>
@@ -8518,7 +8640,7 @@
             <w:tcBorders>
               <w:bottom w:val="single" w:sz="18" w:space="0" w:color="auto"/>
             </w:tcBorders>
-            <w:tcPrChange w:id="50" w:author="Cummings, Shawn" w:date="2025-05-22T12:42:00Z" w16du:dateUtc="2025-05-22T16:42:00Z">
+            <w:tcPrChange w:id="71" w:author="Cummings, Shawn" w:date="2025-05-22T12:42:00Z" w16du:dateUtc="2025-05-22T16:42:00Z">
               <w:tcPr>
                 <w:tcW w:w="0" w:type="auto"/>
                 <w:gridSpan w:val="2"/>
@@ -8561,7 +8683,7 @@
       <w:tr>
         <w:trPr>
           <w:tblCellSpacing w:w="15" w:type="dxa"/>
-          <w:trPrChange w:id="51" w:author="Cummings, Shawn" w:date="2025-05-22T12:42:00Z" w16du:dateUtc="2025-05-22T16:42:00Z">
+          <w:trPrChange w:id="72" w:author="Cummings, Shawn" w:date="2025-05-22T12:42:00Z" w16du:dateUtc="2025-05-22T16:42:00Z">
             <w:trPr>
               <w:gridBefore w:val="1"/>
               <w:gridAfter w:val="0"/>
@@ -8576,7 +8698,7 @@
               <w:top w:val="single" w:sz="4" w:space="0" w:color="auto"/>
             </w:tcBorders>
             <w:vAlign w:val="center"/>
-            <w:tcPrChange w:id="52" w:author="Cummings, Shawn" w:date="2025-05-22T12:42:00Z" w16du:dateUtc="2025-05-22T16:42:00Z">
+            <w:tcPrChange w:id="73" w:author="Cummings, Shawn" w:date="2025-05-22T12:42:00Z" w16du:dateUtc="2025-05-22T16:42:00Z">
               <w:tcPr>
                 <w:tcW w:w="0" w:type="auto"/>
                 <w:gridSpan w:val="2"/>
@@ -8625,7 +8747,7 @@
               <w:right w:val="single" w:sz="4" w:space="0" w:color="auto"/>
             </w:tcBorders>
             <w:vAlign w:val="center"/>
-            <w:tcPrChange w:id="53" w:author="Cummings, Shawn" w:date="2025-05-22T12:42:00Z" w16du:dateUtc="2025-05-22T16:42:00Z">
+            <w:tcPrChange w:id="74" w:author="Cummings, Shawn" w:date="2025-05-22T12:42:00Z" w16du:dateUtc="2025-05-22T16:42:00Z">
               <w:tcPr>
                 <w:tcW w:w="0" w:type="auto"/>
                 <w:tcBorders>
@@ -8674,7 +8796,7 @@
               <w:right w:val="single" w:sz="4" w:space="0" w:color="auto"/>
             </w:tcBorders>
             <w:vAlign w:val="center"/>
-            <w:tcPrChange w:id="54" w:author="Cummings, Shawn" w:date="2025-05-22T12:42:00Z" w16du:dateUtc="2025-05-22T16:42:00Z">
+            <w:tcPrChange w:id="75" w:author="Cummings, Shawn" w:date="2025-05-22T12:42:00Z" w16du:dateUtc="2025-05-22T16:42:00Z">
               <w:tcPr>
                 <w:tcW w:w="0" w:type="auto"/>
                 <w:gridSpan w:val="2"/>
@@ -8723,7 +8845,7 @@
               <w:right w:val="single" w:sz="4" w:space="0" w:color="auto"/>
             </w:tcBorders>
             <w:vAlign w:val="center"/>
-            <w:tcPrChange w:id="55" w:author="Cummings, Shawn" w:date="2025-05-22T12:42:00Z" w16du:dateUtc="2025-05-22T16:42:00Z">
+            <w:tcPrChange w:id="76" w:author="Cummings, Shawn" w:date="2025-05-22T12:42:00Z" w16du:dateUtc="2025-05-22T16:42:00Z">
               <w:tcPr>
                 <w:tcW w:w="0" w:type="auto"/>
                 <w:gridSpan w:val="2"/>
@@ -8771,7 +8893,7 @@
               <w:top w:val="single" w:sz="4" w:space="0" w:color="auto"/>
               <w:right w:val="single" w:sz="4" w:space="0" w:color="auto"/>
             </w:tcBorders>
-            <w:tcPrChange w:id="56" w:author="Cummings, Shawn" w:date="2025-05-22T12:42:00Z" w16du:dateUtc="2025-05-22T16:42:00Z">
+            <w:tcPrChange w:id="77" w:author="Cummings, Shawn" w:date="2025-05-22T12:42:00Z" w16du:dateUtc="2025-05-22T16:42:00Z">
               <w:tcPr>
                 <w:tcW w:w="0" w:type="auto"/>
                 <w:gridSpan w:val="2"/>
@@ -8817,7 +8939,7 @@
             <w:tcBorders>
               <w:top w:val="single" w:sz="4" w:space="0" w:color="auto"/>
             </w:tcBorders>
-            <w:tcPrChange w:id="57" w:author="Cummings, Shawn" w:date="2025-05-22T12:42:00Z" w16du:dateUtc="2025-05-22T16:42:00Z">
+            <w:tcPrChange w:id="78" w:author="Cummings, Shawn" w:date="2025-05-22T12:42:00Z" w16du:dateUtc="2025-05-22T16:42:00Z">
               <w:tcPr>
                 <w:tcW w:w="0" w:type="auto"/>
                 <w:gridSpan w:val="2"/>
@@ -8860,7 +8982,7 @@
       <w:tr>
         <w:trPr>
           <w:tblCellSpacing w:w="15" w:type="dxa"/>
-          <w:trPrChange w:id="58" w:author="Cummings, Shawn" w:date="2025-05-22T12:42:00Z" w16du:dateUtc="2025-05-22T16:42:00Z">
+          <w:trPrChange w:id="79" w:author="Cummings, Shawn" w:date="2025-05-22T12:42:00Z" w16du:dateUtc="2025-05-22T16:42:00Z">
             <w:trPr>
               <w:gridBefore w:val="1"/>
               <w:gridAfter w:val="0"/>
@@ -8872,7 +8994,7 @@
           <w:tcPr>
             <w:tcW w:w="2608" w:type="dxa"/>
             <w:vAlign w:val="center"/>
-            <w:tcPrChange w:id="59" w:author="Cummings, Shawn" w:date="2025-05-22T12:42:00Z" w16du:dateUtc="2025-05-22T16:42:00Z">
+            <w:tcPrChange w:id="80" w:author="Cummings, Shawn" w:date="2025-05-22T12:42:00Z" w16du:dateUtc="2025-05-22T16:42:00Z">
               <w:tcPr>
                 <w:tcW w:w="0" w:type="auto"/>
                 <w:gridSpan w:val="2"/>
@@ -8913,7 +9035,7 @@
               <w:right w:val="single" w:sz="4" w:space="0" w:color="auto"/>
             </w:tcBorders>
             <w:vAlign w:val="center"/>
-            <w:tcPrChange w:id="60" w:author="Cummings, Shawn" w:date="2025-05-22T12:42:00Z" w16du:dateUtc="2025-05-22T16:42:00Z">
+            <w:tcPrChange w:id="81" w:author="Cummings, Shawn" w:date="2025-05-22T12:42:00Z" w16du:dateUtc="2025-05-22T16:42:00Z">
               <w:tcPr>
                 <w:tcW w:w="0" w:type="auto"/>
                 <w:tcBorders>
@@ -8956,7 +9078,7 @@
               <w:right w:val="single" w:sz="4" w:space="0" w:color="auto"/>
             </w:tcBorders>
             <w:vAlign w:val="center"/>
-            <w:tcPrChange w:id="61" w:author="Cummings, Shawn" w:date="2025-05-22T12:42:00Z" w16du:dateUtc="2025-05-22T16:42:00Z">
+            <w:tcPrChange w:id="82" w:author="Cummings, Shawn" w:date="2025-05-22T12:42:00Z" w16du:dateUtc="2025-05-22T16:42:00Z">
               <w:tcPr>
                 <w:tcW w:w="0" w:type="auto"/>
                 <w:gridSpan w:val="2"/>
@@ -8999,7 +9121,7 @@
               <w:right w:val="single" w:sz="4" w:space="0" w:color="auto"/>
             </w:tcBorders>
             <w:vAlign w:val="center"/>
-            <w:tcPrChange w:id="62" w:author="Cummings, Shawn" w:date="2025-05-22T12:42:00Z" w16du:dateUtc="2025-05-22T16:42:00Z">
+            <w:tcPrChange w:id="83" w:author="Cummings, Shawn" w:date="2025-05-22T12:42:00Z" w16du:dateUtc="2025-05-22T16:42:00Z">
               <w:tcPr>
                 <w:tcW w:w="0" w:type="auto"/>
                 <w:gridSpan w:val="2"/>
@@ -9025,7 +9147,7 @@
                 <w:lang w:eastAsia="en-US"/>
               </w:rPr>
             </w:pPr>
-            <w:commentRangeStart w:id="63"/>
+            <w:commentRangeStart w:id="84"/>
             <w:r>
               <w:rPr>
                 <w:rFonts w:eastAsia="Times New Roman"/>
@@ -9034,12 +9156,12 @@
               </w:rPr>
               <w:t>2 (3.1%)</w:t>
             </w:r>
-            <w:commentRangeEnd w:id="63"/>
+            <w:commentRangeEnd w:id="84"/>
             <w:r>
               <w:rPr>
                 <w:rStyle w:val="CommentReference"/>
               </w:rPr>
-              <w:commentReference w:id="63"/>
+              <w:commentReference w:id="84"/>
             </w:r>
           </w:p>
         </w:tc>
@@ -9049,7 +9171,7 @@
             <w:tcBorders>
               <w:right w:val="single" w:sz="4" w:space="0" w:color="auto"/>
             </w:tcBorders>
-            <w:tcPrChange w:id="64" w:author="Cummings, Shawn" w:date="2025-05-22T12:42:00Z" w16du:dateUtc="2025-05-22T16:42:00Z">
+            <w:tcPrChange w:id="85" w:author="Cummings, Shawn" w:date="2025-05-22T12:42:00Z" w16du:dateUtc="2025-05-22T16:42:00Z">
               <w:tcPr>
                 <w:tcW w:w="0" w:type="auto"/>
                 <w:gridSpan w:val="2"/>
@@ -9087,7 +9209,7 @@
         <w:tc>
           <w:tcPr>
             <w:tcW w:w="1305" w:type="dxa"/>
-            <w:tcPrChange w:id="65" w:author="Cummings, Shawn" w:date="2025-05-22T12:42:00Z" w16du:dateUtc="2025-05-22T16:42:00Z">
+            <w:tcPrChange w:id="86" w:author="Cummings, Shawn" w:date="2025-05-22T12:42:00Z" w16du:dateUtc="2025-05-22T16:42:00Z">
               <w:tcPr>
                 <w:tcW w:w="0" w:type="auto"/>
                 <w:gridSpan w:val="2"/>
@@ -9123,7 +9245,7 @@
       <w:tr>
         <w:trPr>
           <w:tblCellSpacing w:w="15" w:type="dxa"/>
-          <w:trPrChange w:id="66" w:author="Cummings, Shawn" w:date="2025-05-22T12:42:00Z" w16du:dateUtc="2025-05-22T16:42:00Z">
+          <w:trPrChange w:id="87" w:author="Cummings, Shawn" w:date="2025-05-22T12:42:00Z" w16du:dateUtc="2025-05-22T16:42:00Z">
             <w:trPr>
               <w:gridBefore w:val="1"/>
               <w:gridAfter w:val="0"/>
@@ -9136,7 +9258,7 @@
             <w:tcW w:w="2608" w:type="dxa"/>
             <w:vAlign w:val="center"/>
             <w:hideMark/>
-            <w:tcPrChange w:id="67" w:author="Cummings, Shawn" w:date="2025-05-22T12:42:00Z" w16du:dateUtc="2025-05-22T16:42:00Z">
+            <w:tcPrChange w:id="88" w:author="Cummings, Shawn" w:date="2025-05-22T12:42:00Z" w16du:dateUtc="2025-05-22T16:42:00Z">
               <w:tcPr>
                 <w:tcW w:w="0" w:type="auto"/>
                 <w:gridSpan w:val="2"/>
@@ -9187,7 +9309,7 @@
             </w:tcBorders>
             <w:vAlign w:val="center"/>
             <w:hideMark/>
-            <w:tcPrChange w:id="68" w:author="Cummings, Shawn" w:date="2025-05-22T12:42:00Z" w16du:dateUtc="2025-05-22T16:42:00Z">
+            <w:tcPrChange w:id="89" w:author="Cummings, Shawn" w:date="2025-05-22T12:42:00Z" w16du:dateUtc="2025-05-22T16:42:00Z">
               <w:tcPr>
                 <w:tcW w:w="0" w:type="auto"/>
                 <w:tcBorders>
@@ -9232,7 +9354,7 @@
             </w:tcBorders>
             <w:vAlign w:val="center"/>
             <w:hideMark/>
-            <w:tcPrChange w:id="69" w:author="Cummings, Shawn" w:date="2025-05-22T12:42:00Z" w16du:dateUtc="2025-05-22T16:42:00Z">
+            <w:tcPrChange w:id="90" w:author="Cummings, Shawn" w:date="2025-05-22T12:42:00Z" w16du:dateUtc="2025-05-22T16:42:00Z">
               <w:tcPr>
                 <w:tcW w:w="0" w:type="auto"/>
                 <w:gridSpan w:val="2"/>
@@ -9259,7 +9381,7 @@
                 <w:lang w:eastAsia="en-US"/>
               </w:rPr>
             </w:pPr>
-            <w:commentRangeStart w:id="70"/>
+            <w:commentRangeStart w:id="91"/>
             <w:r>
               <w:rPr>
                 <w:rFonts w:eastAsia="Times New Roman"/>
@@ -9268,12 +9390,12 @@
               </w:rPr>
               <w:t>3 (4.7%)</w:t>
             </w:r>
-            <w:commentRangeEnd w:id="70"/>
+            <w:commentRangeEnd w:id="91"/>
             <w:r>
               <w:rPr>
                 <w:rStyle w:val="CommentReference"/>
               </w:rPr>
-              <w:commentReference w:id="70"/>
+              <w:commentReference w:id="91"/>
             </w:r>
           </w:p>
         </w:tc>
@@ -9285,7 +9407,7 @@
             </w:tcBorders>
             <w:vAlign w:val="center"/>
             <w:hideMark/>
-            <w:tcPrChange w:id="71" w:author="Cummings, Shawn" w:date="2025-05-22T12:42:00Z" w16du:dateUtc="2025-05-22T16:42:00Z">
+            <w:tcPrChange w:id="92" w:author="Cummings, Shawn" w:date="2025-05-22T12:42:00Z" w16du:dateUtc="2025-05-22T16:42:00Z">
               <w:tcPr>
                 <w:tcW w:w="0" w:type="auto"/>
                 <w:gridSpan w:val="2"/>
@@ -9328,7 +9450,7 @@
             <w:tcBorders>
               <w:right w:val="single" w:sz="4" w:space="0" w:color="auto"/>
             </w:tcBorders>
-            <w:tcPrChange w:id="72" w:author="Cummings, Shawn" w:date="2025-05-22T12:42:00Z" w16du:dateUtc="2025-05-22T16:42:00Z">
+            <w:tcPrChange w:id="93" w:author="Cummings, Shawn" w:date="2025-05-22T12:42:00Z" w16du:dateUtc="2025-05-22T16:42:00Z">
               <w:tcPr>
                 <w:tcW w:w="0" w:type="auto"/>
                 <w:gridSpan w:val="2"/>
@@ -9366,7 +9488,7 @@
         <w:tc>
           <w:tcPr>
             <w:tcW w:w="1305" w:type="dxa"/>
-            <w:tcPrChange w:id="73" w:author="Cummings, Shawn" w:date="2025-05-22T12:42:00Z" w16du:dateUtc="2025-05-22T16:42:00Z">
+            <w:tcPrChange w:id="94" w:author="Cummings, Shawn" w:date="2025-05-22T12:42:00Z" w16du:dateUtc="2025-05-22T16:42:00Z">
               <w:tcPr>
                 <w:tcW w:w="0" w:type="auto"/>
                 <w:gridSpan w:val="2"/>
@@ -9402,7 +9524,7 @@
       <w:tr>
         <w:trPr>
           <w:tblCellSpacing w:w="15" w:type="dxa"/>
-          <w:trPrChange w:id="74" w:author="Cummings, Shawn" w:date="2025-05-22T12:42:00Z" w16du:dateUtc="2025-05-22T16:42:00Z">
+          <w:trPrChange w:id="95" w:author="Cummings, Shawn" w:date="2025-05-22T12:42:00Z" w16du:dateUtc="2025-05-22T16:42:00Z">
             <w:trPr>
               <w:gridAfter w:val="0"/>
               <w:tblCellSpacing w:w="15" w:type="dxa"/>
@@ -9414,7 +9536,7 @@
             <w:tcW w:w="2608" w:type="dxa"/>
             <w:vAlign w:val="center"/>
             <w:hideMark/>
-            <w:tcPrChange w:id="75" w:author="Cummings, Shawn" w:date="2025-05-22T12:42:00Z" w16du:dateUtc="2025-05-22T16:42:00Z">
+            <w:tcPrChange w:id="96" w:author="Cummings, Shawn" w:date="2025-05-22T12:42:00Z" w16du:dateUtc="2025-05-22T16:42:00Z">
               <w:tcPr>
                 <w:tcW w:w="0" w:type="auto"/>
                 <w:gridSpan w:val="3"/>
@@ -9457,7 +9579,7 @@
             </w:tcBorders>
             <w:vAlign w:val="center"/>
             <w:hideMark/>
-            <w:tcPrChange w:id="76" w:author="Cummings, Shawn" w:date="2025-05-22T12:42:00Z" w16du:dateUtc="2025-05-22T16:42:00Z">
+            <w:tcPrChange w:id="97" w:author="Cummings, Shawn" w:date="2025-05-22T12:42:00Z" w16du:dateUtc="2025-05-22T16:42:00Z">
               <w:tcPr>
                 <w:tcW w:w="0" w:type="auto"/>
                 <w:tcBorders>
@@ -9502,7 +9624,7 @@
             </w:tcBorders>
             <w:vAlign w:val="center"/>
             <w:hideMark/>
-            <w:tcPrChange w:id="77" w:author="Cummings, Shawn" w:date="2025-05-22T12:42:00Z" w16du:dateUtc="2025-05-22T16:42:00Z">
+            <w:tcPrChange w:id="98" w:author="Cummings, Shawn" w:date="2025-05-22T12:42:00Z" w16du:dateUtc="2025-05-22T16:42:00Z">
               <w:tcPr>
                 <w:tcW w:w="0" w:type="auto"/>
                 <w:gridSpan w:val="2"/>
@@ -9537,534 +9659,6 @@
               </w:rPr>
               <w:t>1 (1.6%)</w:t>
             </w:r>
-          </w:p>
-        </w:tc>
-        <w:tc>
-          <w:tcPr>
-            <w:tcW w:w="0" w:type="auto"/>
-            <w:tcBorders>
-              <w:right w:val="single" w:sz="4" w:space="0" w:color="auto"/>
-            </w:tcBorders>
-            <w:vAlign w:val="center"/>
-            <w:hideMark/>
-            <w:tcPrChange w:id="78" w:author="Cummings, Shawn" w:date="2025-05-22T12:42:00Z" w16du:dateUtc="2025-05-22T16:42:00Z">
-              <w:tcPr>
-                <w:tcW w:w="0" w:type="auto"/>
-                <w:gridSpan w:val="2"/>
-                <w:tcBorders>
-                  <w:right w:val="single" w:sz="4" w:space="0" w:color="auto"/>
-                </w:tcBorders>
-                <w:vAlign w:val="center"/>
-                <w:hideMark/>
-              </w:tcPr>
-            </w:tcPrChange>
-          </w:tcPr>
-          <w:p>
-            <w:pPr>
-              <w:widowControl/>
-              <w:autoSpaceDE/>
-              <w:autoSpaceDN/>
-              <w:adjustRightInd/>
-              <w:spacing w:line="240" w:lineRule="auto"/>
-              <w:ind w:firstLine="0"/>
-              <w:jc w:val="left"/>
-              <w:rPr>
-                <w:rFonts w:eastAsia="Times New Roman"/>
-                <w:sz w:val="24"/>
-                <w:lang w:eastAsia="en-US"/>
-              </w:rPr>
-            </w:pPr>
-            <w:r>
-              <w:rPr>
-                <w:rFonts w:eastAsia="Times New Roman"/>
-                <w:sz w:val="24"/>
-                <w:lang w:eastAsia="en-US"/>
-              </w:rPr>
-              <w:t>1 (1.6%)</w:t>
-            </w:r>
-          </w:p>
-        </w:tc>
-        <w:tc>
-          <w:tcPr>
-            <w:tcW w:w="989" w:type="dxa"/>
-            <w:tcBorders>
-              <w:right w:val="single" w:sz="4" w:space="0" w:color="auto"/>
-            </w:tcBorders>
-            <w:tcPrChange w:id="79" w:author="Cummings, Shawn" w:date="2025-05-22T12:42:00Z" w16du:dateUtc="2025-05-22T16:42:00Z">
-              <w:tcPr>
-                <w:tcW w:w="0" w:type="auto"/>
-                <w:gridSpan w:val="2"/>
-                <w:tcBorders>
-                  <w:right w:val="single" w:sz="4" w:space="0" w:color="auto"/>
-                </w:tcBorders>
-              </w:tcPr>
-            </w:tcPrChange>
-          </w:tcPr>
-          <w:p>
-            <w:pPr>
-              <w:widowControl/>
-              <w:autoSpaceDE/>
-              <w:autoSpaceDN/>
-              <w:adjustRightInd/>
-              <w:spacing w:line="240" w:lineRule="auto"/>
-              <w:ind w:firstLine="0"/>
-              <w:jc w:val="left"/>
-              <w:rPr>
-                <w:rFonts w:eastAsia="Times New Roman"/>
-                <w:sz w:val="24"/>
-                <w:lang w:eastAsia="en-US"/>
-              </w:rPr>
-            </w:pPr>
-            <w:r>
-              <w:rPr>
-                <w:rFonts w:eastAsia="Times New Roman"/>
-                <w:sz w:val="24"/>
-                <w:lang w:eastAsia="en-US"/>
-              </w:rPr>
-              <w:t>2 (3.1%)</w:t>
-            </w:r>
-          </w:p>
-        </w:tc>
-        <w:tc>
-          <w:tcPr>
-            <w:tcW w:w="1305" w:type="dxa"/>
-            <w:tcPrChange w:id="80" w:author="Cummings, Shawn" w:date="2025-05-22T12:42:00Z" w16du:dateUtc="2025-05-22T16:42:00Z">
-              <w:tcPr>
-                <w:tcW w:w="0" w:type="auto"/>
-                <w:gridSpan w:val="2"/>
-              </w:tcPr>
-            </w:tcPrChange>
-          </w:tcPr>
-          <w:p>
-            <w:pPr>
-              <w:widowControl/>
-              <w:autoSpaceDE/>
-              <w:autoSpaceDN/>
-              <w:adjustRightInd/>
-              <w:spacing w:line="240" w:lineRule="auto"/>
-              <w:ind w:firstLine="0"/>
-              <w:jc w:val="left"/>
-              <w:rPr>
-                <w:rFonts w:eastAsia="Times New Roman"/>
-                <w:sz w:val="24"/>
-                <w:lang w:eastAsia="en-US"/>
-              </w:rPr>
-            </w:pPr>
-            <w:r>
-              <w:rPr>
-                <w:rFonts w:eastAsia="Times New Roman"/>
-                <w:sz w:val="24"/>
-                <w:lang w:eastAsia="en-US"/>
-              </w:rPr>
-              <w:t>-</w:t>
-            </w:r>
-          </w:p>
-        </w:tc>
-      </w:tr>
-      <w:tr>
-        <w:trPr>
-          <w:tblCellSpacing w:w="15" w:type="dxa"/>
-          <w:trPrChange w:id="81" w:author="Cummings, Shawn" w:date="2025-05-22T12:42:00Z" w16du:dateUtc="2025-05-22T16:42:00Z">
-            <w:trPr>
-              <w:gridBefore w:val="1"/>
-              <w:gridAfter w:val="0"/>
-              <w:tblCellSpacing w:w="15" w:type="dxa"/>
-            </w:trPr>
-          </w:trPrChange>
-        </w:trPr>
-        <w:tc>
-          <w:tcPr>
-            <w:tcW w:w="2608" w:type="dxa"/>
-            <w:vAlign w:val="center"/>
-            <w:tcPrChange w:id="82" w:author="Cummings, Shawn" w:date="2025-05-22T12:42:00Z" w16du:dateUtc="2025-05-22T16:42:00Z">
-              <w:tcPr>
-                <w:tcW w:w="0" w:type="auto"/>
-                <w:gridSpan w:val="2"/>
-                <w:vAlign w:val="center"/>
-              </w:tcPr>
-            </w:tcPrChange>
-          </w:tcPr>
-          <w:p>
-            <w:pPr>
-              <w:widowControl/>
-              <w:autoSpaceDE/>
-              <w:autoSpaceDN/>
-              <w:adjustRightInd/>
-              <w:spacing w:line="240" w:lineRule="auto"/>
-              <w:ind w:firstLine="0"/>
-              <w:jc w:val="left"/>
-              <w:rPr>
-                <w:rFonts w:eastAsia="Times New Roman"/>
-                <w:sz w:val="24"/>
-                <w:lang w:eastAsia="en-US"/>
-              </w:rPr>
-            </w:pPr>
-            <w:r>
-              <w:rPr>
-                <w:rFonts w:eastAsia="Times New Roman"/>
-                <w:sz w:val="24"/>
-                <w:lang w:eastAsia="en-US"/>
-              </w:rPr>
-              <w:t>Catch question</w:t>
-            </w:r>
-          </w:p>
-        </w:tc>
-        <w:tc>
-          <w:tcPr>
-            <w:tcW w:w="1051" w:type="dxa"/>
-            <w:tcBorders>
-              <w:left w:val="single" w:sz="4" w:space="0" w:color="auto"/>
-              <w:right w:val="single" w:sz="4" w:space="0" w:color="auto"/>
-            </w:tcBorders>
-            <w:vAlign w:val="center"/>
-            <w:tcPrChange w:id="83" w:author="Cummings, Shawn" w:date="2025-05-22T12:42:00Z" w16du:dateUtc="2025-05-22T16:42:00Z">
-              <w:tcPr>
-                <w:tcW w:w="0" w:type="auto"/>
-                <w:tcBorders>
-                  <w:left w:val="single" w:sz="4" w:space="0" w:color="auto"/>
-                  <w:right w:val="single" w:sz="4" w:space="0" w:color="auto"/>
-                </w:tcBorders>
-                <w:vAlign w:val="center"/>
-              </w:tcPr>
-            </w:tcPrChange>
-          </w:tcPr>
-          <w:p>
-            <w:pPr>
-              <w:widowControl/>
-              <w:autoSpaceDE/>
-              <w:autoSpaceDN/>
-              <w:adjustRightInd/>
-              <w:spacing w:line="240" w:lineRule="auto"/>
-              <w:ind w:firstLine="0"/>
-              <w:jc w:val="left"/>
-              <w:rPr>
-                <w:rFonts w:eastAsia="Times New Roman"/>
-                <w:sz w:val="24"/>
-                <w:lang w:eastAsia="en-US"/>
-              </w:rPr>
-            </w:pPr>
-            <w:r>
-              <w:rPr>
-                <w:rFonts w:eastAsia="Times New Roman"/>
-                <w:sz w:val="24"/>
-                <w:lang w:eastAsia="en-US"/>
-              </w:rPr>
-              <w:t>-</w:t>
-            </w:r>
-          </w:p>
-        </w:tc>
-        <w:tc>
-          <w:tcPr>
-            <w:tcW w:w="1139" w:type="dxa"/>
-            <w:tcBorders>
-              <w:right w:val="single" w:sz="4" w:space="0" w:color="auto"/>
-            </w:tcBorders>
-            <w:vAlign w:val="center"/>
-            <w:tcPrChange w:id="84" w:author="Cummings, Shawn" w:date="2025-05-22T12:42:00Z" w16du:dateUtc="2025-05-22T16:42:00Z">
-              <w:tcPr>
-                <w:tcW w:w="0" w:type="auto"/>
-                <w:gridSpan w:val="2"/>
-                <w:tcBorders>
-                  <w:right w:val="single" w:sz="4" w:space="0" w:color="auto"/>
-                </w:tcBorders>
-                <w:vAlign w:val="center"/>
-              </w:tcPr>
-            </w:tcPrChange>
-          </w:tcPr>
-          <w:p>
-            <w:pPr>
-              <w:widowControl/>
-              <w:autoSpaceDE/>
-              <w:autoSpaceDN/>
-              <w:adjustRightInd/>
-              <w:spacing w:line="240" w:lineRule="auto"/>
-              <w:ind w:firstLine="0"/>
-              <w:jc w:val="left"/>
-              <w:rPr>
-                <w:rFonts w:eastAsia="Times New Roman"/>
-                <w:sz w:val="24"/>
-                <w:lang w:eastAsia="en-US"/>
-              </w:rPr>
-            </w:pPr>
-            <w:r>
-              <w:rPr>
-                <w:rFonts w:eastAsia="Times New Roman"/>
-                <w:sz w:val="24"/>
-                <w:lang w:eastAsia="en-US"/>
-              </w:rPr>
-              <w:t>-</w:t>
-            </w:r>
-          </w:p>
-        </w:tc>
-        <w:tc>
-          <w:tcPr>
-            <w:tcW w:w="0" w:type="auto"/>
-            <w:tcBorders>
-              <w:right w:val="single" w:sz="4" w:space="0" w:color="auto"/>
-            </w:tcBorders>
-            <w:vAlign w:val="center"/>
-            <w:tcPrChange w:id="85" w:author="Cummings, Shawn" w:date="2025-05-22T12:42:00Z" w16du:dateUtc="2025-05-22T16:42:00Z">
-              <w:tcPr>
-                <w:tcW w:w="0" w:type="auto"/>
-                <w:gridSpan w:val="2"/>
-                <w:tcBorders>
-                  <w:right w:val="single" w:sz="4" w:space="0" w:color="auto"/>
-                </w:tcBorders>
-                <w:vAlign w:val="center"/>
-              </w:tcPr>
-            </w:tcPrChange>
-          </w:tcPr>
-          <w:p>
-            <w:pPr>
-              <w:widowControl/>
-              <w:autoSpaceDE/>
-              <w:autoSpaceDN/>
-              <w:adjustRightInd/>
-              <w:spacing w:line="240" w:lineRule="auto"/>
-              <w:ind w:firstLine="0"/>
-              <w:jc w:val="left"/>
-              <w:rPr>
-                <w:rFonts w:eastAsia="Times New Roman"/>
-                <w:sz w:val="24"/>
-                <w:lang w:eastAsia="en-US"/>
-              </w:rPr>
-            </w:pPr>
-            <w:r>
-              <w:rPr>
-                <w:rFonts w:eastAsia="Times New Roman"/>
-                <w:sz w:val="24"/>
-                <w:lang w:eastAsia="en-US"/>
-              </w:rPr>
-              <w:t>-</w:t>
-            </w:r>
-          </w:p>
-        </w:tc>
-        <w:tc>
-          <w:tcPr>
-            <w:tcW w:w="989" w:type="dxa"/>
-            <w:tcBorders>
-              <w:right w:val="single" w:sz="4" w:space="0" w:color="auto"/>
-            </w:tcBorders>
-            <w:tcPrChange w:id="86" w:author="Cummings, Shawn" w:date="2025-05-22T12:42:00Z" w16du:dateUtc="2025-05-22T16:42:00Z">
-              <w:tcPr>
-                <w:tcW w:w="0" w:type="auto"/>
-                <w:gridSpan w:val="2"/>
-                <w:tcBorders>
-                  <w:right w:val="single" w:sz="4" w:space="0" w:color="auto"/>
-                </w:tcBorders>
-              </w:tcPr>
-            </w:tcPrChange>
-          </w:tcPr>
-          <w:p>
-            <w:pPr>
-              <w:widowControl/>
-              <w:autoSpaceDE/>
-              <w:autoSpaceDN/>
-              <w:adjustRightInd/>
-              <w:spacing w:line="240" w:lineRule="auto"/>
-              <w:ind w:firstLine="0"/>
-              <w:jc w:val="left"/>
-              <w:rPr>
-                <w:rFonts w:eastAsia="Times New Roman"/>
-                <w:sz w:val="24"/>
-                <w:lang w:eastAsia="en-US"/>
-              </w:rPr>
-            </w:pPr>
-            <w:r>
-              <w:rPr>
-                <w:rFonts w:eastAsia="Times New Roman"/>
-                <w:sz w:val="24"/>
-                <w:lang w:eastAsia="en-US"/>
-              </w:rPr>
-              <w:t>-</w:t>
-            </w:r>
-          </w:p>
-        </w:tc>
-        <w:tc>
-          <w:tcPr>
-            <w:tcW w:w="1305" w:type="dxa"/>
-            <w:tcPrChange w:id="87" w:author="Cummings, Shawn" w:date="2025-05-22T12:42:00Z" w16du:dateUtc="2025-05-22T16:42:00Z">
-              <w:tcPr>
-                <w:tcW w:w="0" w:type="auto"/>
-                <w:gridSpan w:val="2"/>
-              </w:tcPr>
-            </w:tcPrChange>
-          </w:tcPr>
-          <w:p>
-            <w:pPr>
-              <w:widowControl/>
-              <w:autoSpaceDE/>
-              <w:autoSpaceDN/>
-              <w:adjustRightInd/>
-              <w:spacing w:line="240" w:lineRule="auto"/>
-              <w:ind w:firstLine="0"/>
-              <w:jc w:val="left"/>
-              <w:rPr>
-                <w:rFonts w:eastAsia="Times New Roman"/>
-                <w:sz w:val="24"/>
-                <w:lang w:eastAsia="en-US"/>
-              </w:rPr>
-            </w:pPr>
-            <w:r>
-              <w:rPr>
-                <w:rFonts w:eastAsia="Times New Roman"/>
-                <w:sz w:val="24"/>
-                <w:lang w:eastAsia="en-US"/>
-              </w:rPr>
-              <w:t>-</w:t>
-            </w:r>
-          </w:p>
-        </w:tc>
-      </w:tr>
-      <w:tr>
-        <w:trPr>
-          <w:tblCellSpacing w:w="15" w:type="dxa"/>
-          <w:del w:id="88" w:author="Jaeger, Florian" w:date="2025-05-21T14:27:00Z"/>
-          <w:trPrChange w:id="89" w:author="Cummings, Shawn" w:date="2025-05-22T12:42:00Z" w16du:dateUtc="2025-05-22T16:42:00Z">
-            <w:trPr>
-              <w:gridBefore w:val="1"/>
-              <w:gridAfter w:val="0"/>
-              <w:tblCellSpacing w:w="15" w:type="dxa"/>
-            </w:trPr>
-          </w:trPrChange>
-        </w:trPr>
-        <w:tc>
-          <w:tcPr>
-            <w:tcW w:w="2608" w:type="dxa"/>
-            <w:vAlign w:val="center"/>
-            <w:hideMark/>
-            <w:tcPrChange w:id="90" w:author="Cummings, Shawn" w:date="2025-05-22T12:42:00Z" w16du:dateUtc="2025-05-22T16:42:00Z">
-              <w:tcPr>
-                <w:tcW w:w="0" w:type="auto"/>
-                <w:gridSpan w:val="2"/>
-                <w:vAlign w:val="center"/>
-                <w:hideMark/>
-              </w:tcPr>
-            </w:tcPrChange>
-          </w:tcPr>
-          <w:p>
-            <w:pPr>
-              <w:widowControl/>
-              <w:autoSpaceDE/>
-              <w:autoSpaceDN/>
-              <w:adjustRightInd/>
-              <w:spacing w:line="240" w:lineRule="auto"/>
-              <w:ind w:firstLine="0"/>
-              <w:jc w:val="left"/>
-              <w:rPr>
-                <w:del w:id="91" w:author="Jaeger, Florian" w:date="2025-05-21T14:27:00Z" w16du:dateUtc="2025-05-21T18:27:00Z"/>
-                <w:rFonts w:eastAsia="Times New Roman"/>
-                <w:sz w:val="24"/>
-                <w:lang w:eastAsia="en-US"/>
-              </w:rPr>
-            </w:pPr>
-            <w:del w:id="92" w:author="Jaeger, Florian" w:date="2025-05-21T14:27:00Z" w16du:dateUtc="2025-05-21T18:27:00Z">
-              <w:r>
-                <w:rPr>
-                  <w:rFonts w:eastAsia="Times New Roman"/>
-                  <w:sz w:val="24"/>
-                  <w:lang w:eastAsia="en-US"/>
-                </w:rPr>
-                <w:delText>Catch trials</w:delText>
-              </w:r>
-            </w:del>
-          </w:p>
-        </w:tc>
-        <w:tc>
-          <w:tcPr>
-            <w:tcW w:w="1051" w:type="dxa"/>
-            <w:tcBorders>
-              <w:left w:val="single" w:sz="4" w:space="0" w:color="auto"/>
-              <w:right w:val="single" w:sz="4" w:space="0" w:color="auto"/>
-            </w:tcBorders>
-            <w:vAlign w:val="center"/>
-            <w:hideMark/>
-            <w:tcPrChange w:id="93" w:author="Cummings, Shawn" w:date="2025-05-22T12:42:00Z" w16du:dateUtc="2025-05-22T16:42:00Z">
-              <w:tcPr>
-                <w:tcW w:w="0" w:type="auto"/>
-                <w:tcBorders>
-                  <w:left w:val="single" w:sz="4" w:space="0" w:color="auto"/>
-                  <w:right w:val="single" w:sz="4" w:space="0" w:color="auto"/>
-                </w:tcBorders>
-                <w:vAlign w:val="center"/>
-                <w:hideMark/>
-              </w:tcPr>
-            </w:tcPrChange>
-          </w:tcPr>
-          <w:p>
-            <w:pPr>
-              <w:widowControl/>
-              <w:autoSpaceDE/>
-              <w:autoSpaceDN/>
-              <w:adjustRightInd/>
-              <w:spacing w:line="240" w:lineRule="auto"/>
-              <w:ind w:firstLine="0"/>
-              <w:jc w:val="left"/>
-              <w:rPr>
-                <w:del w:id="94" w:author="Jaeger, Florian" w:date="2025-05-21T14:27:00Z" w16du:dateUtc="2025-05-21T18:27:00Z"/>
-                <w:rFonts w:eastAsia="Times New Roman"/>
-                <w:sz w:val="24"/>
-                <w:lang w:eastAsia="en-US"/>
-              </w:rPr>
-            </w:pPr>
-            <w:del w:id="95" w:author="Jaeger, Florian" w:date="2025-05-21T14:27:00Z" w16du:dateUtc="2025-05-21T18:27:00Z">
-              <w:r>
-                <w:rPr>
-                  <w:rFonts w:eastAsia="Times New Roman"/>
-                  <w:sz w:val="24"/>
-                  <w:lang w:eastAsia="en-US"/>
-                </w:rPr>
-                <w:delText>1 (1.6%)</w:delText>
-              </w:r>
-            </w:del>
-          </w:p>
-        </w:tc>
-        <w:tc>
-          <w:tcPr>
-            <w:tcW w:w="1139" w:type="dxa"/>
-            <w:tcBorders>
-              <w:right w:val="single" w:sz="4" w:space="0" w:color="auto"/>
-            </w:tcBorders>
-            <w:vAlign w:val="center"/>
-            <w:hideMark/>
-            <w:tcPrChange w:id="96" w:author="Cummings, Shawn" w:date="2025-05-22T12:42:00Z" w16du:dateUtc="2025-05-22T16:42:00Z">
-              <w:tcPr>
-                <w:tcW w:w="0" w:type="auto"/>
-                <w:gridSpan w:val="2"/>
-                <w:tcBorders>
-                  <w:right w:val="single" w:sz="4" w:space="0" w:color="auto"/>
-                </w:tcBorders>
-                <w:vAlign w:val="center"/>
-                <w:hideMark/>
-              </w:tcPr>
-            </w:tcPrChange>
-          </w:tcPr>
-          <w:p>
-            <w:pPr>
-              <w:widowControl/>
-              <w:autoSpaceDE/>
-              <w:autoSpaceDN/>
-              <w:adjustRightInd/>
-              <w:spacing w:line="240" w:lineRule="auto"/>
-              <w:ind w:firstLine="0"/>
-              <w:jc w:val="left"/>
-              <w:rPr>
-                <w:del w:id="97" w:author="Jaeger, Florian" w:date="2025-05-21T14:27:00Z" w16du:dateUtc="2025-05-21T18:27:00Z"/>
-                <w:rFonts w:eastAsia="Times New Roman"/>
-                <w:sz w:val="24"/>
-                <w:lang w:eastAsia="en-US"/>
-              </w:rPr>
-            </w:pPr>
-            <w:del w:id="98" w:author="Jaeger, Florian" w:date="2025-05-21T14:27:00Z" w16du:dateUtc="2025-05-21T18:27:00Z">
-              <w:r>
-                <w:rPr>
-                  <w:rFonts w:eastAsia="Times New Roman"/>
-                  <w:sz w:val="24"/>
-                  <w:lang w:eastAsia="en-US"/>
-                </w:rPr>
-                <w:delText>2 (3.1%)</w:delText>
-              </w:r>
-            </w:del>
           </w:p>
         </w:tc>
         <w:tc>
@@ -10097,22 +9691,19 @@
               <w:ind w:firstLine="0"/>
               <w:jc w:val="left"/>
               <w:rPr>
-                <w:del w:id="100" w:author="Jaeger, Florian" w:date="2025-05-21T14:27:00Z" w16du:dateUtc="2025-05-21T18:27:00Z"/>
                 <w:rFonts w:eastAsia="Times New Roman"/>
                 <w:sz w:val="24"/>
                 <w:lang w:eastAsia="en-US"/>
               </w:rPr>
             </w:pPr>
-            <w:del w:id="101" w:author="Jaeger, Florian" w:date="2025-05-21T14:27:00Z" w16du:dateUtc="2025-05-21T18:27:00Z">
-              <w:r>
-                <w:rPr>
-                  <w:rFonts w:eastAsia="Times New Roman"/>
-                  <w:sz w:val="24"/>
-                  <w:lang w:eastAsia="en-US"/>
-                </w:rPr>
-                <w:delText>1 (1.6%)</w:delText>
-              </w:r>
-            </w:del>
+            <w:r>
+              <w:rPr>
+                <w:rFonts w:eastAsia="Times New Roman"/>
+                <w:sz w:val="24"/>
+                <w:lang w:eastAsia="en-US"/>
+              </w:rPr>
+              <w:t>1 (1.6%)</w:t>
+            </w:r>
           </w:p>
         </w:tc>
         <w:tc>
@@ -10121,7 +9712,7 @@
             <w:tcBorders>
               <w:right w:val="single" w:sz="4" w:space="0" w:color="auto"/>
             </w:tcBorders>
-            <w:tcPrChange w:id="102" w:author="Cummings, Shawn" w:date="2025-05-22T12:42:00Z" w16du:dateUtc="2025-05-22T16:42:00Z">
+            <w:tcPrChange w:id="100" w:author="Cummings, Shawn" w:date="2025-05-22T12:42:00Z" w16du:dateUtc="2025-05-22T16:42:00Z">
               <w:tcPr>
                 <w:tcW w:w="0" w:type="auto"/>
                 <w:gridSpan w:val="2"/>
@@ -10141,28 +9732,25 @@
               <w:ind w:firstLine="0"/>
               <w:jc w:val="left"/>
               <w:rPr>
-                <w:del w:id="103" w:author="Jaeger, Florian" w:date="2025-05-21T14:27:00Z" w16du:dateUtc="2025-05-21T18:27:00Z"/>
                 <w:rFonts w:eastAsia="Times New Roman"/>
                 <w:sz w:val="24"/>
                 <w:lang w:eastAsia="en-US"/>
               </w:rPr>
             </w:pPr>
-            <w:del w:id="104" w:author="Jaeger, Florian" w:date="2025-05-21T14:27:00Z" w16du:dateUtc="2025-05-21T18:27:00Z">
-              <w:r>
-                <w:rPr>
-                  <w:rFonts w:eastAsia="Times New Roman"/>
-                  <w:sz w:val="24"/>
-                  <w:lang w:eastAsia="en-US"/>
-                </w:rPr>
-                <w:delText>1 (1.6%)</w:delText>
-              </w:r>
-            </w:del>
+            <w:r>
+              <w:rPr>
+                <w:rFonts w:eastAsia="Times New Roman"/>
+                <w:sz w:val="24"/>
+                <w:lang w:eastAsia="en-US"/>
+              </w:rPr>
+              <w:t>2 (3.1%)</w:t>
+            </w:r>
           </w:p>
         </w:tc>
         <w:tc>
           <w:tcPr>
             <w:tcW w:w="1305" w:type="dxa"/>
-            <w:tcPrChange w:id="105" w:author="Cummings, Shawn" w:date="2025-05-22T12:42:00Z" w16du:dateUtc="2025-05-22T16:42:00Z">
+            <w:tcPrChange w:id="101" w:author="Cummings, Shawn" w:date="2025-05-22T12:42:00Z" w16du:dateUtc="2025-05-22T16:42:00Z">
               <w:tcPr>
                 <w:tcW w:w="0" w:type="auto"/>
                 <w:gridSpan w:val="2"/>
@@ -10179,29 +9767,282 @@
               <w:ind w:firstLine="0"/>
               <w:jc w:val="left"/>
               <w:rPr>
-                <w:del w:id="106" w:author="Jaeger, Florian" w:date="2025-05-21T14:27:00Z" w16du:dateUtc="2025-05-21T18:27:00Z"/>
                 <w:rFonts w:eastAsia="Times New Roman"/>
                 <w:sz w:val="24"/>
                 <w:lang w:eastAsia="en-US"/>
               </w:rPr>
             </w:pPr>
-            <w:del w:id="107" w:author="Jaeger, Florian" w:date="2025-05-21T14:27:00Z" w16du:dateUtc="2025-05-21T18:27:00Z">
-              <w:r>
-                <w:rPr>
-                  <w:rFonts w:eastAsia="Times New Roman"/>
-                  <w:sz w:val="24"/>
-                  <w:lang w:eastAsia="en-US"/>
-                </w:rPr>
-                <w:delText>-</w:delText>
-              </w:r>
-            </w:del>
+            <w:r>
+              <w:rPr>
+                <w:rFonts w:eastAsia="Times New Roman"/>
+                <w:sz w:val="24"/>
+                <w:lang w:eastAsia="en-US"/>
+              </w:rPr>
+              <w:t>-</w:t>
+            </w:r>
           </w:p>
         </w:tc>
       </w:tr>
       <w:tr>
         <w:trPr>
           <w:tblCellSpacing w:w="15" w:type="dxa"/>
-          <w:trPrChange w:id="108" w:author="Cummings, Shawn" w:date="2025-05-22T12:42:00Z" w16du:dateUtc="2025-05-22T16:42:00Z">
+          <w:trPrChange w:id="102" w:author="Cummings, Shawn" w:date="2025-05-22T12:42:00Z" w16du:dateUtc="2025-05-22T16:42:00Z">
+            <w:trPr>
+              <w:gridBefore w:val="1"/>
+              <w:gridAfter w:val="0"/>
+              <w:tblCellSpacing w:w="15" w:type="dxa"/>
+            </w:trPr>
+          </w:trPrChange>
+        </w:trPr>
+        <w:tc>
+          <w:tcPr>
+            <w:tcW w:w="2608" w:type="dxa"/>
+            <w:vAlign w:val="center"/>
+            <w:tcPrChange w:id="103" w:author="Cummings, Shawn" w:date="2025-05-22T12:42:00Z" w16du:dateUtc="2025-05-22T16:42:00Z">
+              <w:tcPr>
+                <w:tcW w:w="0" w:type="auto"/>
+                <w:gridSpan w:val="2"/>
+                <w:vAlign w:val="center"/>
+              </w:tcPr>
+            </w:tcPrChange>
+          </w:tcPr>
+          <w:p>
+            <w:pPr>
+              <w:widowControl/>
+              <w:autoSpaceDE/>
+              <w:autoSpaceDN/>
+              <w:adjustRightInd/>
+              <w:spacing w:line="240" w:lineRule="auto"/>
+              <w:ind w:firstLine="0"/>
+              <w:jc w:val="left"/>
+              <w:rPr>
+                <w:rFonts w:eastAsia="Times New Roman"/>
+                <w:sz w:val="24"/>
+                <w:lang w:eastAsia="en-US"/>
+              </w:rPr>
+            </w:pPr>
+            <w:r>
+              <w:rPr>
+                <w:rFonts w:eastAsia="Times New Roman"/>
+                <w:sz w:val="24"/>
+                <w:lang w:eastAsia="en-US"/>
+              </w:rPr>
+              <w:t>Catch question</w:t>
+            </w:r>
+          </w:p>
+        </w:tc>
+        <w:tc>
+          <w:tcPr>
+            <w:tcW w:w="1051" w:type="dxa"/>
+            <w:tcBorders>
+              <w:left w:val="single" w:sz="4" w:space="0" w:color="auto"/>
+              <w:right w:val="single" w:sz="4" w:space="0" w:color="auto"/>
+            </w:tcBorders>
+            <w:vAlign w:val="center"/>
+            <w:tcPrChange w:id="104" w:author="Cummings, Shawn" w:date="2025-05-22T12:42:00Z" w16du:dateUtc="2025-05-22T16:42:00Z">
+              <w:tcPr>
+                <w:tcW w:w="0" w:type="auto"/>
+                <w:tcBorders>
+                  <w:left w:val="single" w:sz="4" w:space="0" w:color="auto"/>
+                  <w:right w:val="single" w:sz="4" w:space="0" w:color="auto"/>
+                </w:tcBorders>
+                <w:vAlign w:val="center"/>
+              </w:tcPr>
+            </w:tcPrChange>
+          </w:tcPr>
+          <w:p>
+            <w:pPr>
+              <w:widowControl/>
+              <w:autoSpaceDE/>
+              <w:autoSpaceDN/>
+              <w:adjustRightInd/>
+              <w:spacing w:line="240" w:lineRule="auto"/>
+              <w:ind w:firstLine="0"/>
+              <w:jc w:val="left"/>
+              <w:rPr>
+                <w:rFonts w:eastAsia="Times New Roman"/>
+                <w:sz w:val="24"/>
+                <w:lang w:eastAsia="en-US"/>
+              </w:rPr>
+            </w:pPr>
+            <w:r>
+              <w:rPr>
+                <w:rFonts w:eastAsia="Times New Roman"/>
+                <w:sz w:val="24"/>
+                <w:lang w:eastAsia="en-US"/>
+              </w:rPr>
+              <w:t>-</w:t>
+            </w:r>
+          </w:p>
+        </w:tc>
+        <w:tc>
+          <w:tcPr>
+            <w:tcW w:w="1139" w:type="dxa"/>
+            <w:tcBorders>
+              <w:right w:val="single" w:sz="4" w:space="0" w:color="auto"/>
+            </w:tcBorders>
+            <w:vAlign w:val="center"/>
+            <w:tcPrChange w:id="105" w:author="Cummings, Shawn" w:date="2025-05-22T12:42:00Z" w16du:dateUtc="2025-05-22T16:42:00Z">
+              <w:tcPr>
+                <w:tcW w:w="0" w:type="auto"/>
+                <w:gridSpan w:val="2"/>
+                <w:tcBorders>
+                  <w:right w:val="single" w:sz="4" w:space="0" w:color="auto"/>
+                </w:tcBorders>
+                <w:vAlign w:val="center"/>
+              </w:tcPr>
+            </w:tcPrChange>
+          </w:tcPr>
+          <w:p>
+            <w:pPr>
+              <w:widowControl/>
+              <w:autoSpaceDE/>
+              <w:autoSpaceDN/>
+              <w:adjustRightInd/>
+              <w:spacing w:line="240" w:lineRule="auto"/>
+              <w:ind w:firstLine="0"/>
+              <w:jc w:val="left"/>
+              <w:rPr>
+                <w:rFonts w:eastAsia="Times New Roman"/>
+                <w:sz w:val="24"/>
+                <w:lang w:eastAsia="en-US"/>
+              </w:rPr>
+            </w:pPr>
+            <w:r>
+              <w:rPr>
+                <w:rFonts w:eastAsia="Times New Roman"/>
+                <w:sz w:val="24"/>
+                <w:lang w:eastAsia="en-US"/>
+              </w:rPr>
+              <w:t>-</w:t>
+            </w:r>
+          </w:p>
+        </w:tc>
+        <w:tc>
+          <w:tcPr>
+            <w:tcW w:w="0" w:type="auto"/>
+            <w:tcBorders>
+              <w:right w:val="single" w:sz="4" w:space="0" w:color="auto"/>
+            </w:tcBorders>
+            <w:vAlign w:val="center"/>
+            <w:tcPrChange w:id="106" w:author="Cummings, Shawn" w:date="2025-05-22T12:42:00Z" w16du:dateUtc="2025-05-22T16:42:00Z">
+              <w:tcPr>
+                <w:tcW w:w="0" w:type="auto"/>
+                <w:gridSpan w:val="2"/>
+                <w:tcBorders>
+                  <w:right w:val="single" w:sz="4" w:space="0" w:color="auto"/>
+                </w:tcBorders>
+                <w:vAlign w:val="center"/>
+              </w:tcPr>
+            </w:tcPrChange>
+          </w:tcPr>
+          <w:p>
+            <w:pPr>
+              <w:widowControl/>
+              <w:autoSpaceDE/>
+              <w:autoSpaceDN/>
+              <w:adjustRightInd/>
+              <w:spacing w:line="240" w:lineRule="auto"/>
+              <w:ind w:firstLine="0"/>
+              <w:jc w:val="left"/>
+              <w:rPr>
+                <w:rFonts w:eastAsia="Times New Roman"/>
+                <w:sz w:val="24"/>
+                <w:lang w:eastAsia="en-US"/>
+              </w:rPr>
+            </w:pPr>
+            <w:r>
+              <w:rPr>
+                <w:rFonts w:eastAsia="Times New Roman"/>
+                <w:sz w:val="24"/>
+                <w:lang w:eastAsia="en-US"/>
+              </w:rPr>
+              <w:t>-</w:t>
+            </w:r>
+          </w:p>
+        </w:tc>
+        <w:tc>
+          <w:tcPr>
+            <w:tcW w:w="989" w:type="dxa"/>
+            <w:tcBorders>
+              <w:right w:val="single" w:sz="4" w:space="0" w:color="auto"/>
+            </w:tcBorders>
+            <w:tcPrChange w:id="107" w:author="Cummings, Shawn" w:date="2025-05-22T12:42:00Z" w16du:dateUtc="2025-05-22T16:42:00Z">
+              <w:tcPr>
+                <w:tcW w:w="0" w:type="auto"/>
+                <w:gridSpan w:val="2"/>
+                <w:tcBorders>
+                  <w:right w:val="single" w:sz="4" w:space="0" w:color="auto"/>
+                </w:tcBorders>
+              </w:tcPr>
+            </w:tcPrChange>
+          </w:tcPr>
+          <w:p>
+            <w:pPr>
+              <w:widowControl/>
+              <w:autoSpaceDE/>
+              <w:autoSpaceDN/>
+              <w:adjustRightInd/>
+              <w:spacing w:line="240" w:lineRule="auto"/>
+              <w:ind w:firstLine="0"/>
+              <w:jc w:val="left"/>
+              <w:rPr>
+                <w:rFonts w:eastAsia="Times New Roman"/>
+                <w:sz w:val="24"/>
+                <w:lang w:eastAsia="en-US"/>
+              </w:rPr>
+            </w:pPr>
+            <w:r>
+              <w:rPr>
+                <w:rFonts w:eastAsia="Times New Roman"/>
+                <w:sz w:val="24"/>
+                <w:lang w:eastAsia="en-US"/>
+              </w:rPr>
+              <w:t>-</w:t>
+            </w:r>
+          </w:p>
+        </w:tc>
+        <w:tc>
+          <w:tcPr>
+            <w:tcW w:w="1305" w:type="dxa"/>
+            <w:tcPrChange w:id="108" w:author="Cummings, Shawn" w:date="2025-05-22T12:42:00Z" w16du:dateUtc="2025-05-22T16:42:00Z">
+              <w:tcPr>
+                <w:tcW w:w="0" w:type="auto"/>
+                <w:gridSpan w:val="2"/>
+              </w:tcPr>
+            </w:tcPrChange>
+          </w:tcPr>
+          <w:p>
+            <w:pPr>
+              <w:widowControl/>
+              <w:autoSpaceDE/>
+              <w:autoSpaceDN/>
+              <w:adjustRightInd/>
+              <w:spacing w:line="240" w:lineRule="auto"/>
+              <w:ind w:firstLine="0"/>
+              <w:jc w:val="left"/>
+              <w:rPr>
+                <w:rFonts w:eastAsia="Times New Roman"/>
+                <w:sz w:val="24"/>
+                <w:lang w:eastAsia="en-US"/>
+              </w:rPr>
+            </w:pPr>
+            <w:r>
+              <w:rPr>
+                <w:rFonts w:eastAsia="Times New Roman"/>
+                <w:sz w:val="24"/>
+                <w:lang w:eastAsia="en-US"/>
+              </w:rPr>
+              <w:t>-</w:t>
+            </w:r>
+          </w:p>
+        </w:tc>
+      </w:tr>
+      <w:tr>
+        <w:trPr>
+          <w:tblCellSpacing w:w="15" w:type="dxa"/>
+          <w:del w:id="109" w:author="Jaeger, Florian" w:date="2025-05-21T14:27:00Z"/>
+          <w:trPrChange w:id="110" w:author="Cummings, Shawn" w:date="2025-05-22T12:42:00Z" w16du:dateUtc="2025-05-22T16:42:00Z">
             <w:trPr>
               <w:gridBefore w:val="1"/>
               <w:gridAfter w:val="0"/>
@@ -10214,7 +10055,7 @@
             <w:tcW w:w="2608" w:type="dxa"/>
             <w:vAlign w:val="center"/>
             <w:hideMark/>
-            <w:tcPrChange w:id="109" w:author="Cummings, Shawn" w:date="2025-05-22T12:42:00Z" w16du:dateUtc="2025-05-22T16:42:00Z">
+            <w:tcPrChange w:id="111" w:author="Cummings, Shawn" w:date="2025-05-22T12:42:00Z" w16du:dateUtc="2025-05-22T16:42:00Z">
               <w:tcPr>
                 <w:tcW w:w="0" w:type="auto"/>
                 <w:gridSpan w:val="2"/>
@@ -10233,19 +10074,22 @@
               <w:ind w:firstLine="0"/>
               <w:jc w:val="left"/>
               <w:rPr>
+                <w:del w:id="112" w:author="Jaeger, Florian" w:date="2025-05-21T14:27:00Z" w16du:dateUtc="2025-05-21T18:27:00Z"/>
                 <w:rFonts w:eastAsia="Times New Roman"/>
                 <w:sz w:val="24"/>
                 <w:lang w:eastAsia="en-US"/>
               </w:rPr>
             </w:pPr>
-            <w:r>
-              <w:rPr>
-                <w:rFonts w:eastAsia="Times New Roman"/>
-                <w:sz w:val="24"/>
-                <w:lang w:eastAsia="en-US"/>
-              </w:rPr>
-              <w:t>Outlier RT</w:t>
-            </w:r>
+            <w:del w:id="113" w:author="Jaeger, Florian" w:date="2025-05-21T14:27:00Z" w16du:dateUtc="2025-05-21T18:27:00Z">
+              <w:r>
+                <w:rPr>
+                  <w:rFonts w:eastAsia="Times New Roman"/>
+                  <w:sz w:val="24"/>
+                  <w:lang w:eastAsia="en-US"/>
+                </w:rPr>
+                <w:delText>Catch trials</w:delText>
+              </w:r>
+            </w:del>
           </w:p>
         </w:tc>
         <w:tc>
@@ -10257,7 +10101,7 @@
             </w:tcBorders>
             <w:vAlign w:val="center"/>
             <w:hideMark/>
-            <w:tcPrChange w:id="110" w:author="Cummings, Shawn" w:date="2025-05-22T12:42:00Z" w16du:dateUtc="2025-05-22T16:42:00Z">
+            <w:tcPrChange w:id="114" w:author="Cummings, Shawn" w:date="2025-05-22T12:42:00Z" w16du:dateUtc="2025-05-22T16:42:00Z">
               <w:tcPr>
                 <w:tcW w:w="0" w:type="auto"/>
                 <w:tcBorders>
@@ -10279,67 +10123,22 @@
               <w:ind w:firstLine="0"/>
               <w:jc w:val="left"/>
               <w:rPr>
+                <w:del w:id="115" w:author="Jaeger, Florian" w:date="2025-05-21T14:27:00Z" w16du:dateUtc="2025-05-21T18:27:00Z"/>
                 <w:rFonts w:eastAsia="Times New Roman"/>
                 <w:sz w:val="24"/>
                 <w:lang w:eastAsia="en-US"/>
               </w:rPr>
             </w:pPr>
-            <w:ins w:id="111" w:author="Cummings, Shawn" w:date="2025-05-22T12:34:00Z" w16du:dateUtc="2025-05-22T16:34:00Z">
+            <w:del w:id="116" w:author="Jaeger, Florian" w:date="2025-05-21T14:27:00Z" w16du:dateUtc="2025-05-21T18:27:00Z">
               <w:r>
                 <w:rPr>
                   <w:rFonts w:eastAsia="Times New Roman"/>
                   <w:sz w:val="24"/>
                   <w:lang w:eastAsia="en-US"/>
                 </w:rPr>
-                <w:t>1</w:t>
-              </w:r>
-            </w:ins>
-            <w:del w:id="112" w:author="Cummings, Shawn" w:date="2025-05-22T12:34:00Z" w16du:dateUtc="2025-05-22T16:34:00Z">
-              <w:r>
-                <w:rPr>
-                  <w:rFonts w:eastAsia="Times New Roman"/>
-                  <w:sz w:val="24"/>
-                  <w:lang w:eastAsia="en-US"/>
-                </w:rPr>
-                <w:delText>3</w:delText>
+                <w:delText>1 (1.6%)</w:delText>
               </w:r>
             </w:del>
-            <w:r>
-              <w:rPr>
-                <w:rFonts w:eastAsia="Times New Roman"/>
-                <w:sz w:val="24"/>
-                <w:lang w:eastAsia="en-US"/>
-              </w:rPr>
-              <w:t xml:space="preserve"> (</w:t>
-            </w:r>
-            <w:ins w:id="113" w:author="Cummings, Shawn" w:date="2025-05-22T12:35:00Z" w16du:dateUtc="2025-05-22T16:35:00Z">
-              <w:r>
-                <w:rPr>
-                  <w:rFonts w:eastAsia="Times New Roman"/>
-                  <w:sz w:val="24"/>
-                  <w:lang w:eastAsia="en-US"/>
-                </w:rPr>
-                <w:t>1.6</w:t>
-              </w:r>
-            </w:ins>
-            <w:del w:id="114" w:author="Cummings, Shawn" w:date="2025-05-22T12:35:00Z" w16du:dateUtc="2025-05-22T16:35:00Z">
-              <w:r>
-                <w:rPr>
-                  <w:rFonts w:eastAsia="Times New Roman"/>
-                  <w:sz w:val="24"/>
-                  <w:lang w:eastAsia="en-US"/>
-                </w:rPr>
-                <w:delText>4.7</w:delText>
-              </w:r>
-            </w:del>
-            <w:r>
-              <w:rPr>
-                <w:rFonts w:eastAsia="Times New Roman"/>
-                <w:sz w:val="24"/>
-                <w:lang w:eastAsia="en-US"/>
-              </w:rPr>
-              <w:t>%)</w:t>
-            </w:r>
           </w:p>
         </w:tc>
         <w:tc>
@@ -10350,7 +10149,7 @@
             </w:tcBorders>
             <w:vAlign w:val="center"/>
             <w:hideMark/>
-            <w:tcPrChange w:id="115" w:author="Cummings, Shawn" w:date="2025-05-22T12:42:00Z" w16du:dateUtc="2025-05-22T16:42:00Z">
+            <w:tcPrChange w:id="117" w:author="Cummings, Shawn" w:date="2025-05-22T12:42:00Z" w16du:dateUtc="2025-05-22T16:42:00Z">
               <w:tcPr>
                 <w:tcW w:w="0" w:type="auto"/>
                 <w:gridSpan w:val="2"/>
@@ -10372,19 +10171,22 @@
               <w:ind w:firstLine="0"/>
               <w:jc w:val="left"/>
               <w:rPr>
+                <w:del w:id="118" w:author="Jaeger, Florian" w:date="2025-05-21T14:27:00Z" w16du:dateUtc="2025-05-21T18:27:00Z"/>
                 <w:rFonts w:eastAsia="Times New Roman"/>
                 <w:sz w:val="24"/>
                 <w:lang w:eastAsia="en-US"/>
               </w:rPr>
             </w:pPr>
-            <w:r>
-              <w:rPr>
-                <w:rFonts w:eastAsia="Times New Roman"/>
-                <w:sz w:val="24"/>
-                <w:lang w:eastAsia="en-US"/>
-              </w:rPr>
-              <w:t>-</w:t>
-            </w:r>
+            <w:del w:id="119" w:author="Jaeger, Florian" w:date="2025-05-21T14:27:00Z" w16du:dateUtc="2025-05-21T18:27:00Z">
+              <w:r>
+                <w:rPr>
+                  <w:rFonts w:eastAsia="Times New Roman"/>
+                  <w:sz w:val="24"/>
+                  <w:lang w:eastAsia="en-US"/>
+                </w:rPr>
+                <w:delText>2 (3.1%)</w:delText>
+              </w:r>
+            </w:del>
           </w:p>
         </w:tc>
         <w:tc>
@@ -10395,7 +10197,7 @@
             </w:tcBorders>
             <w:vAlign w:val="center"/>
             <w:hideMark/>
-            <w:tcPrChange w:id="116" w:author="Cummings, Shawn" w:date="2025-05-22T12:42:00Z" w16du:dateUtc="2025-05-22T16:42:00Z">
+            <w:tcPrChange w:id="120" w:author="Cummings, Shawn" w:date="2025-05-22T12:42:00Z" w16du:dateUtc="2025-05-22T16:42:00Z">
               <w:tcPr>
                 <w:tcW w:w="0" w:type="auto"/>
                 <w:gridSpan w:val="2"/>
@@ -10417,19 +10219,22 @@
               <w:ind w:firstLine="0"/>
               <w:jc w:val="left"/>
               <w:rPr>
+                <w:del w:id="121" w:author="Jaeger, Florian" w:date="2025-05-21T14:27:00Z" w16du:dateUtc="2025-05-21T18:27:00Z"/>
                 <w:rFonts w:eastAsia="Times New Roman"/>
                 <w:sz w:val="24"/>
                 <w:lang w:eastAsia="en-US"/>
               </w:rPr>
             </w:pPr>
-            <w:r>
-              <w:rPr>
-                <w:rFonts w:eastAsia="Times New Roman"/>
-                <w:sz w:val="24"/>
-                <w:lang w:eastAsia="en-US"/>
-              </w:rPr>
-              <w:t>-</w:t>
-            </w:r>
+            <w:del w:id="122" w:author="Jaeger, Florian" w:date="2025-05-21T14:27:00Z" w16du:dateUtc="2025-05-21T18:27:00Z">
+              <w:r>
+                <w:rPr>
+                  <w:rFonts w:eastAsia="Times New Roman"/>
+                  <w:sz w:val="24"/>
+                  <w:lang w:eastAsia="en-US"/>
+                </w:rPr>
+                <w:delText>1 (1.6%)</w:delText>
+              </w:r>
+            </w:del>
           </w:p>
         </w:tc>
         <w:tc>
@@ -10438,7 +10243,7 @@
             <w:tcBorders>
               <w:right w:val="single" w:sz="4" w:space="0" w:color="auto"/>
             </w:tcBorders>
-            <w:tcPrChange w:id="117" w:author="Cummings, Shawn" w:date="2025-05-22T12:42:00Z" w16du:dateUtc="2025-05-22T16:42:00Z">
+            <w:tcPrChange w:id="123" w:author="Cummings, Shawn" w:date="2025-05-22T12:42:00Z" w16du:dateUtc="2025-05-22T16:42:00Z">
               <w:tcPr>
                 <w:tcW w:w="0" w:type="auto"/>
                 <w:gridSpan w:val="2"/>
@@ -10458,37 +10263,28 @@
               <w:ind w:firstLine="0"/>
               <w:jc w:val="left"/>
               <w:rPr>
+                <w:del w:id="124" w:author="Jaeger, Florian" w:date="2025-05-21T14:27:00Z" w16du:dateUtc="2025-05-21T18:27:00Z"/>
                 <w:rFonts w:eastAsia="Times New Roman"/>
                 <w:sz w:val="24"/>
                 <w:lang w:eastAsia="en-US"/>
               </w:rPr>
             </w:pPr>
-            <w:del w:id="118" w:author="Cummings, Shawn" w:date="2025-05-22T12:42:00Z" w16du:dateUtc="2025-05-22T16:42:00Z">
+            <w:del w:id="125" w:author="Jaeger, Florian" w:date="2025-05-21T14:27:00Z" w16du:dateUtc="2025-05-21T18:27:00Z">
               <w:r>
                 <w:rPr>
                   <w:rFonts w:eastAsia="Times New Roman"/>
                   <w:sz w:val="24"/>
                   <w:lang w:eastAsia="en-US"/>
                 </w:rPr>
-                <w:delText>2 (3.1%)</w:delText>
+                <w:delText>1 (1.6%)</w:delText>
               </w:r>
             </w:del>
-            <w:ins w:id="119" w:author="Cummings, Shawn" w:date="2025-05-22T12:42:00Z" w16du:dateUtc="2025-05-22T16:42:00Z">
-              <w:r>
-                <w:rPr>
-                  <w:rFonts w:eastAsia="Times New Roman"/>
-                  <w:sz w:val="24"/>
-                  <w:lang w:eastAsia="en-US"/>
-                </w:rPr>
-                <w:t>-</w:t>
-              </w:r>
-            </w:ins>
           </w:p>
         </w:tc>
         <w:tc>
           <w:tcPr>
             <w:tcW w:w="1305" w:type="dxa"/>
-            <w:tcPrChange w:id="120" w:author="Cummings, Shawn" w:date="2025-05-22T12:42:00Z" w16du:dateUtc="2025-05-22T16:42:00Z">
+            <w:tcPrChange w:id="126" w:author="Cummings, Shawn" w:date="2025-05-22T12:42:00Z" w16du:dateUtc="2025-05-22T16:42:00Z">
               <w:tcPr>
                 <w:tcW w:w="0" w:type="auto"/>
                 <w:gridSpan w:val="2"/>
@@ -10505,26 +10301,352 @@
               <w:ind w:firstLine="0"/>
               <w:jc w:val="left"/>
               <w:rPr>
+                <w:del w:id="127" w:author="Jaeger, Florian" w:date="2025-05-21T14:27:00Z" w16du:dateUtc="2025-05-21T18:27:00Z"/>
                 <w:rFonts w:eastAsia="Times New Roman"/>
                 <w:sz w:val="24"/>
                 <w:lang w:eastAsia="en-US"/>
               </w:rPr>
             </w:pPr>
-            <w:r>
-              <w:rPr>
-                <w:rFonts w:eastAsia="Times New Roman"/>
-                <w:sz w:val="24"/>
-                <w:lang w:eastAsia="en-US"/>
-              </w:rPr>
-              <w:t>2 (3.1%)</w:t>
-            </w:r>
+            <w:del w:id="128" w:author="Jaeger, Florian" w:date="2025-05-21T14:27:00Z" w16du:dateUtc="2025-05-21T18:27:00Z">
+              <w:r>
+                <w:rPr>
+                  <w:rFonts w:eastAsia="Times New Roman"/>
+                  <w:sz w:val="24"/>
+                  <w:lang w:eastAsia="en-US"/>
+                </w:rPr>
+                <w:delText>-</w:delText>
+              </w:r>
+            </w:del>
           </w:p>
         </w:tc>
       </w:tr>
       <w:tr>
         <w:trPr>
           <w:tblCellSpacing w:w="15" w:type="dxa"/>
-          <w:trPrChange w:id="121" w:author="Cummings, Shawn" w:date="2025-05-22T12:42:00Z" w16du:dateUtc="2025-05-22T16:42:00Z">
+          <w:trPrChange w:id="129" w:author="Cummings, Shawn" w:date="2025-05-22T12:42:00Z" w16du:dateUtc="2025-05-22T16:42:00Z">
+            <w:trPr>
+              <w:gridBefore w:val="1"/>
+              <w:gridAfter w:val="0"/>
+              <w:tblCellSpacing w:w="15" w:type="dxa"/>
+            </w:trPr>
+          </w:trPrChange>
+        </w:trPr>
+        <w:tc>
+          <w:tcPr>
+            <w:tcW w:w="2608" w:type="dxa"/>
+            <w:vAlign w:val="center"/>
+            <w:hideMark/>
+            <w:tcPrChange w:id="130" w:author="Cummings, Shawn" w:date="2025-05-22T12:42:00Z" w16du:dateUtc="2025-05-22T16:42:00Z">
+              <w:tcPr>
+                <w:tcW w:w="0" w:type="auto"/>
+                <w:gridSpan w:val="2"/>
+                <w:vAlign w:val="center"/>
+                <w:hideMark/>
+              </w:tcPr>
+            </w:tcPrChange>
+          </w:tcPr>
+          <w:p>
+            <w:pPr>
+              <w:widowControl/>
+              <w:autoSpaceDE/>
+              <w:autoSpaceDN/>
+              <w:adjustRightInd/>
+              <w:spacing w:line="240" w:lineRule="auto"/>
+              <w:ind w:firstLine="0"/>
+              <w:jc w:val="left"/>
+              <w:rPr>
+                <w:rFonts w:eastAsia="Times New Roman"/>
+                <w:sz w:val="24"/>
+                <w:lang w:eastAsia="en-US"/>
+              </w:rPr>
+            </w:pPr>
+            <w:r>
+              <w:rPr>
+                <w:rFonts w:eastAsia="Times New Roman"/>
+                <w:sz w:val="24"/>
+                <w:lang w:eastAsia="en-US"/>
+              </w:rPr>
+              <w:t>Outlier RT</w:t>
+            </w:r>
+          </w:p>
+        </w:tc>
+        <w:tc>
+          <w:tcPr>
+            <w:tcW w:w="1051" w:type="dxa"/>
+            <w:tcBorders>
+              <w:left w:val="single" w:sz="4" w:space="0" w:color="auto"/>
+              <w:right w:val="single" w:sz="4" w:space="0" w:color="auto"/>
+            </w:tcBorders>
+            <w:vAlign w:val="center"/>
+            <w:hideMark/>
+            <w:tcPrChange w:id="131" w:author="Cummings, Shawn" w:date="2025-05-22T12:42:00Z" w16du:dateUtc="2025-05-22T16:42:00Z">
+              <w:tcPr>
+                <w:tcW w:w="0" w:type="auto"/>
+                <w:tcBorders>
+                  <w:left w:val="single" w:sz="4" w:space="0" w:color="auto"/>
+                  <w:right w:val="single" w:sz="4" w:space="0" w:color="auto"/>
+                </w:tcBorders>
+                <w:vAlign w:val="center"/>
+                <w:hideMark/>
+              </w:tcPr>
+            </w:tcPrChange>
+          </w:tcPr>
+          <w:p>
+            <w:pPr>
+              <w:widowControl/>
+              <w:autoSpaceDE/>
+              <w:autoSpaceDN/>
+              <w:adjustRightInd/>
+              <w:spacing w:line="240" w:lineRule="auto"/>
+              <w:ind w:firstLine="0"/>
+              <w:jc w:val="left"/>
+              <w:rPr>
+                <w:rFonts w:eastAsia="Times New Roman"/>
+                <w:sz w:val="24"/>
+                <w:lang w:eastAsia="en-US"/>
+              </w:rPr>
+            </w:pPr>
+            <w:ins w:id="132" w:author="Cummings, Shawn" w:date="2025-05-22T12:34:00Z" w16du:dateUtc="2025-05-22T16:34:00Z">
+              <w:r>
+                <w:rPr>
+                  <w:rFonts w:eastAsia="Times New Roman"/>
+                  <w:sz w:val="24"/>
+                  <w:lang w:eastAsia="en-US"/>
+                </w:rPr>
+                <w:t>1</w:t>
+              </w:r>
+            </w:ins>
+            <w:del w:id="133" w:author="Cummings, Shawn" w:date="2025-05-22T12:34:00Z" w16du:dateUtc="2025-05-22T16:34:00Z">
+              <w:r>
+                <w:rPr>
+                  <w:rFonts w:eastAsia="Times New Roman"/>
+                  <w:sz w:val="24"/>
+                  <w:lang w:eastAsia="en-US"/>
+                </w:rPr>
+                <w:delText>3</w:delText>
+              </w:r>
+            </w:del>
+            <w:r>
+              <w:rPr>
+                <w:rFonts w:eastAsia="Times New Roman"/>
+                <w:sz w:val="24"/>
+                <w:lang w:eastAsia="en-US"/>
+              </w:rPr>
+              <w:t xml:space="preserve"> (</w:t>
+            </w:r>
+            <w:ins w:id="134" w:author="Cummings, Shawn" w:date="2025-05-22T12:35:00Z" w16du:dateUtc="2025-05-22T16:35:00Z">
+              <w:r>
+                <w:rPr>
+                  <w:rFonts w:eastAsia="Times New Roman"/>
+                  <w:sz w:val="24"/>
+                  <w:lang w:eastAsia="en-US"/>
+                </w:rPr>
+                <w:t>1.6</w:t>
+              </w:r>
+            </w:ins>
+            <w:del w:id="135" w:author="Cummings, Shawn" w:date="2025-05-22T12:35:00Z" w16du:dateUtc="2025-05-22T16:35:00Z">
+              <w:r>
+                <w:rPr>
+                  <w:rFonts w:eastAsia="Times New Roman"/>
+                  <w:sz w:val="24"/>
+                  <w:lang w:eastAsia="en-US"/>
+                </w:rPr>
+                <w:delText>4.7</w:delText>
+              </w:r>
+            </w:del>
+            <w:r>
+              <w:rPr>
+                <w:rFonts w:eastAsia="Times New Roman"/>
+                <w:sz w:val="24"/>
+                <w:lang w:eastAsia="en-US"/>
+              </w:rPr>
+              <w:t>%)</w:t>
+            </w:r>
+          </w:p>
+        </w:tc>
+        <w:tc>
+          <w:tcPr>
+            <w:tcW w:w="1139" w:type="dxa"/>
+            <w:tcBorders>
+              <w:right w:val="single" w:sz="4" w:space="0" w:color="auto"/>
+            </w:tcBorders>
+            <w:vAlign w:val="center"/>
+            <w:hideMark/>
+            <w:tcPrChange w:id="136" w:author="Cummings, Shawn" w:date="2025-05-22T12:42:00Z" w16du:dateUtc="2025-05-22T16:42:00Z">
+              <w:tcPr>
+                <w:tcW w:w="0" w:type="auto"/>
+                <w:gridSpan w:val="2"/>
+                <w:tcBorders>
+                  <w:right w:val="single" w:sz="4" w:space="0" w:color="auto"/>
+                </w:tcBorders>
+                <w:vAlign w:val="center"/>
+                <w:hideMark/>
+              </w:tcPr>
+            </w:tcPrChange>
+          </w:tcPr>
+          <w:p>
+            <w:pPr>
+              <w:widowControl/>
+              <w:autoSpaceDE/>
+              <w:autoSpaceDN/>
+              <w:adjustRightInd/>
+              <w:spacing w:line="240" w:lineRule="auto"/>
+              <w:ind w:firstLine="0"/>
+              <w:jc w:val="left"/>
+              <w:rPr>
+                <w:rFonts w:eastAsia="Times New Roman"/>
+                <w:sz w:val="24"/>
+                <w:lang w:eastAsia="en-US"/>
+              </w:rPr>
+            </w:pPr>
+            <w:r>
+              <w:rPr>
+                <w:rFonts w:eastAsia="Times New Roman"/>
+                <w:sz w:val="24"/>
+                <w:lang w:eastAsia="en-US"/>
+              </w:rPr>
+              <w:t>-</w:t>
+            </w:r>
+          </w:p>
+        </w:tc>
+        <w:tc>
+          <w:tcPr>
+            <w:tcW w:w="0" w:type="auto"/>
+            <w:tcBorders>
+              <w:right w:val="single" w:sz="4" w:space="0" w:color="auto"/>
+            </w:tcBorders>
+            <w:vAlign w:val="center"/>
+            <w:hideMark/>
+            <w:tcPrChange w:id="137" w:author="Cummings, Shawn" w:date="2025-05-22T12:42:00Z" w16du:dateUtc="2025-05-22T16:42:00Z">
+              <w:tcPr>
+                <w:tcW w:w="0" w:type="auto"/>
+                <w:gridSpan w:val="2"/>
+                <w:tcBorders>
+                  <w:right w:val="single" w:sz="4" w:space="0" w:color="auto"/>
+                </w:tcBorders>
+                <w:vAlign w:val="center"/>
+                <w:hideMark/>
+              </w:tcPr>
+            </w:tcPrChange>
+          </w:tcPr>
+          <w:p>
+            <w:pPr>
+              <w:widowControl/>
+              <w:autoSpaceDE/>
+              <w:autoSpaceDN/>
+              <w:adjustRightInd/>
+              <w:spacing w:line="240" w:lineRule="auto"/>
+              <w:ind w:firstLine="0"/>
+              <w:jc w:val="left"/>
+              <w:rPr>
+                <w:rFonts w:eastAsia="Times New Roman"/>
+                <w:sz w:val="24"/>
+                <w:lang w:eastAsia="en-US"/>
+              </w:rPr>
+            </w:pPr>
+            <w:r>
+              <w:rPr>
+                <w:rFonts w:eastAsia="Times New Roman"/>
+                <w:sz w:val="24"/>
+                <w:lang w:eastAsia="en-US"/>
+              </w:rPr>
+              <w:t>-</w:t>
+            </w:r>
+          </w:p>
+        </w:tc>
+        <w:tc>
+          <w:tcPr>
+            <w:tcW w:w="989" w:type="dxa"/>
+            <w:tcBorders>
+              <w:right w:val="single" w:sz="4" w:space="0" w:color="auto"/>
+            </w:tcBorders>
+            <w:tcPrChange w:id="138" w:author="Cummings, Shawn" w:date="2025-05-22T12:42:00Z" w16du:dateUtc="2025-05-22T16:42:00Z">
+              <w:tcPr>
+                <w:tcW w:w="0" w:type="auto"/>
+                <w:gridSpan w:val="2"/>
+                <w:tcBorders>
+                  <w:right w:val="single" w:sz="4" w:space="0" w:color="auto"/>
+                </w:tcBorders>
+              </w:tcPr>
+            </w:tcPrChange>
+          </w:tcPr>
+          <w:p>
+            <w:pPr>
+              <w:widowControl/>
+              <w:autoSpaceDE/>
+              <w:autoSpaceDN/>
+              <w:adjustRightInd/>
+              <w:spacing w:line="240" w:lineRule="auto"/>
+              <w:ind w:firstLine="0"/>
+              <w:jc w:val="left"/>
+              <w:rPr>
+                <w:rFonts w:eastAsia="Times New Roman"/>
+                <w:sz w:val="24"/>
+                <w:lang w:eastAsia="en-US"/>
+              </w:rPr>
+            </w:pPr>
+            <w:del w:id="139" w:author="Cummings, Shawn" w:date="2025-05-22T12:42:00Z" w16du:dateUtc="2025-05-22T16:42:00Z">
+              <w:r>
+                <w:rPr>
+                  <w:rFonts w:eastAsia="Times New Roman"/>
+                  <w:sz w:val="24"/>
+                  <w:lang w:eastAsia="en-US"/>
+                </w:rPr>
+                <w:delText>2 (3.1%)</w:delText>
+              </w:r>
+            </w:del>
+            <w:ins w:id="140" w:author="Cummings, Shawn" w:date="2025-05-22T12:42:00Z" w16du:dateUtc="2025-05-22T16:42:00Z">
+              <w:r>
+                <w:rPr>
+                  <w:rFonts w:eastAsia="Times New Roman"/>
+                  <w:sz w:val="24"/>
+                  <w:lang w:eastAsia="en-US"/>
+                </w:rPr>
+                <w:t>-</w:t>
+              </w:r>
+            </w:ins>
+          </w:p>
+        </w:tc>
+        <w:tc>
+          <w:tcPr>
+            <w:tcW w:w="1305" w:type="dxa"/>
+            <w:tcPrChange w:id="141" w:author="Cummings, Shawn" w:date="2025-05-22T12:42:00Z" w16du:dateUtc="2025-05-22T16:42:00Z">
+              <w:tcPr>
+                <w:tcW w:w="0" w:type="auto"/>
+                <w:gridSpan w:val="2"/>
+              </w:tcPr>
+            </w:tcPrChange>
+          </w:tcPr>
+          <w:p>
+            <w:pPr>
+              <w:widowControl/>
+              <w:autoSpaceDE/>
+              <w:autoSpaceDN/>
+              <w:adjustRightInd/>
+              <w:spacing w:line="240" w:lineRule="auto"/>
+              <w:ind w:firstLine="0"/>
+              <w:jc w:val="left"/>
+              <w:rPr>
+                <w:rFonts w:eastAsia="Times New Roman"/>
+                <w:sz w:val="24"/>
+                <w:lang w:eastAsia="en-US"/>
+              </w:rPr>
+            </w:pPr>
+            <w:r>
+              <w:rPr>
+                <w:rFonts w:eastAsia="Times New Roman"/>
+                <w:sz w:val="24"/>
+                <w:lang w:eastAsia="en-US"/>
+              </w:rPr>
+              <w:t>2 (3.1%)</w:t>
+            </w:r>
+          </w:p>
+        </w:tc>
+      </w:tr>
+      <w:tr>
+        <w:trPr>
+          <w:tblCellSpacing w:w="15" w:type="dxa"/>
+          <w:trPrChange w:id="142" w:author="Cummings, Shawn" w:date="2025-05-22T12:42:00Z" w16du:dateUtc="2025-05-22T16:42:00Z">
             <w:trPr>
               <w:gridBefore w:val="1"/>
               <w:gridAfter w:val="0"/>
@@ -10540,7 +10662,7 @@
             </w:tcBorders>
             <w:vAlign w:val="center"/>
             <w:hideMark/>
-            <w:tcPrChange w:id="122" w:author="Cummings, Shawn" w:date="2025-05-22T12:42:00Z" w16du:dateUtc="2025-05-22T16:42:00Z">
+            <w:tcPrChange w:id="143" w:author="Cummings, Shawn" w:date="2025-05-22T12:42:00Z" w16du:dateUtc="2025-05-22T16:42:00Z">
               <w:tcPr>
                 <w:tcW w:w="0" w:type="auto"/>
                 <w:gridSpan w:val="2"/>
@@ -10595,7 +10717,7 @@
             </w:tcBorders>
             <w:vAlign w:val="center"/>
             <w:hideMark/>
-            <w:tcPrChange w:id="123" w:author="Cummings, Shawn" w:date="2025-05-22T12:42:00Z" w16du:dateUtc="2025-05-22T16:42:00Z">
+            <w:tcPrChange w:id="144" w:author="Cummings, Shawn" w:date="2025-05-22T12:42:00Z" w16du:dateUtc="2025-05-22T16:42:00Z">
               <w:tcPr>
                 <w:tcW w:w="0" w:type="auto"/>
                 <w:tcBorders>
@@ -10623,7 +10745,7 @@
                 <w:lang w:eastAsia="en-US"/>
               </w:rPr>
             </w:pPr>
-            <w:ins w:id="124" w:author="Cummings, Shawn" w:date="2025-05-22T12:35:00Z" w16du:dateUtc="2025-05-22T16:35:00Z">
+            <w:ins w:id="145" w:author="Cummings, Shawn" w:date="2025-05-22T12:35:00Z" w16du:dateUtc="2025-05-22T16:35:00Z">
               <w:r>
                 <w:rPr>
                   <w:rFonts w:eastAsia="Times New Roman"/>
@@ -10633,8 +10755,8 @@
                 <w:t>1 (1.6%)</w:t>
               </w:r>
             </w:ins>
-            <w:commentRangeStart w:id="125"/>
-            <w:del w:id="126" w:author="Cummings, Shawn" w:date="2025-05-22T12:35:00Z" w16du:dateUtc="2025-05-22T16:35:00Z">
+            <w:commentRangeStart w:id="146"/>
+            <w:del w:id="147" w:author="Cummings, Shawn" w:date="2025-05-22T12:35:00Z" w16du:dateUtc="2025-05-22T16:35:00Z">
               <w:r>
                 <w:rPr>
                   <w:rFonts w:eastAsia="Times New Roman"/>
@@ -10655,7 +10777,7 @@
             </w:tcBorders>
             <w:vAlign w:val="center"/>
             <w:hideMark/>
-            <w:tcPrChange w:id="127" w:author="Cummings, Shawn" w:date="2025-05-22T12:42:00Z" w16du:dateUtc="2025-05-22T16:42:00Z">
+            <w:tcPrChange w:id="148" w:author="Cummings, Shawn" w:date="2025-05-22T12:42:00Z" w16du:dateUtc="2025-05-22T16:42:00Z">
               <w:tcPr>
                 <w:tcW w:w="0" w:type="auto"/>
                 <w:gridSpan w:val="2"/>
@@ -10702,7 +10824,7 @@
             </w:tcBorders>
             <w:vAlign w:val="center"/>
             <w:hideMark/>
-            <w:tcPrChange w:id="128" w:author="Cummings, Shawn" w:date="2025-05-22T12:42:00Z" w16du:dateUtc="2025-05-22T16:42:00Z">
+            <w:tcPrChange w:id="149" w:author="Cummings, Shawn" w:date="2025-05-22T12:42:00Z" w16du:dateUtc="2025-05-22T16:42:00Z">
               <w:tcPr>
                 <w:tcW w:w="0" w:type="auto"/>
                 <w:gridSpan w:val="2"/>
@@ -10730,7 +10852,7 @@
                 <w:lang w:eastAsia="en-US"/>
               </w:rPr>
             </w:pPr>
-            <w:ins w:id="129" w:author="Cummings, Shawn" w:date="2025-05-22T12:37:00Z" w16du:dateUtc="2025-05-22T16:37:00Z">
+            <w:ins w:id="150" w:author="Cummings, Shawn" w:date="2025-05-22T12:37:00Z" w16du:dateUtc="2025-05-22T16:37:00Z">
               <w:r>
                 <w:rPr>
                   <w:rFonts w:eastAsia="Times New Roman"/>
@@ -10740,7 +10862,7 @@
                 <w:t>1 (1.6%)</w:t>
               </w:r>
             </w:ins>
-            <w:del w:id="130" w:author="Cummings, Shawn" w:date="2025-05-22T12:37:00Z" w16du:dateUtc="2025-05-22T16:37:00Z">
+            <w:del w:id="151" w:author="Cummings, Shawn" w:date="2025-05-22T12:37:00Z" w16du:dateUtc="2025-05-22T16:37:00Z">
               <w:r>
                 <w:rPr>
                   <w:rFonts w:eastAsia="Times New Roman"/>
@@ -10759,7 +10881,7 @@
               <w:bottom w:val="single" w:sz="4" w:space="0" w:color="auto"/>
               <w:right w:val="single" w:sz="4" w:space="0" w:color="auto"/>
             </w:tcBorders>
-            <w:tcPrChange w:id="131" w:author="Cummings, Shawn" w:date="2025-05-22T12:42:00Z" w16du:dateUtc="2025-05-22T16:42:00Z">
+            <w:tcPrChange w:id="152" w:author="Cummings, Shawn" w:date="2025-05-22T12:42:00Z" w16du:dateUtc="2025-05-22T16:42:00Z">
               <w:tcPr>
                 <w:tcW w:w="0" w:type="auto"/>
                 <w:gridSpan w:val="2"/>
@@ -10785,7 +10907,7 @@
                 <w:lang w:eastAsia="en-US"/>
               </w:rPr>
             </w:pPr>
-            <w:ins w:id="132" w:author="Cummings, Shawn" w:date="2025-05-22T12:42:00Z" w16du:dateUtc="2025-05-22T16:42:00Z">
+            <w:ins w:id="153" w:author="Cummings, Shawn" w:date="2025-05-22T12:42:00Z" w16du:dateUtc="2025-05-22T16:42:00Z">
               <w:r>
                 <w:rPr>
                   <w:rFonts w:eastAsia="Times New Roman"/>
@@ -10795,7 +10917,7 @@
                 <w:t>1 (1.6%)</w:t>
               </w:r>
             </w:ins>
-            <w:del w:id="133" w:author="Cummings, Shawn" w:date="2025-05-22T12:42:00Z" w16du:dateUtc="2025-05-22T16:42:00Z">
+            <w:del w:id="154" w:author="Cummings, Shawn" w:date="2025-05-22T12:42:00Z" w16du:dateUtc="2025-05-22T16:42:00Z">
               <w:r>
                 <w:rPr>
                   <w:rFonts w:eastAsia="Times New Roman"/>
@@ -10813,7 +10935,7 @@
             <w:tcBorders>
               <w:bottom w:val="single" w:sz="4" w:space="0" w:color="auto"/>
             </w:tcBorders>
-            <w:tcPrChange w:id="134" w:author="Cummings, Shawn" w:date="2025-05-22T12:42:00Z" w16du:dateUtc="2025-05-22T16:42:00Z">
+            <w:tcPrChange w:id="155" w:author="Cummings, Shawn" w:date="2025-05-22T12:42:00Z" w16du:dateUtc="2025-05-22T16:42:00Z">
               <w:tcPr>
                 <w:tcW w:w="0" w:type="auto"/>
                 <w:gridSpan w:val="2"/>
@@ -10846,12 +10968,12 @@
               </w:rPr>
               <w:t>-</w:t>
             </w:r>
-            <w:commentRangeEnd w:id="125"/>
+            <w:commentRangeEnd w:id="146"/>
             <w:r>
               <w:rPr>
                 <w:rStyle w:val="CommentReference"/>
               </w:rPr>
-              <w:commentReference w:id="125"/>
+              <w:commentReference w:id="146"/>
             </w:r>
           </w:p>
         </w:tc>
@@ -10859,7 +10981,7 @@
       <w:tr>
         <w:trPr>
           <w:tblCellSpacing w:w="15" w:type="dxa"/>
-          <w:trPrChange w:id="135" w:author="Cummings, Shawn" w:date="2025-05-22T12:42:00Z" w16du:dateUtc="2025-05-22T16:42:00Z">
+          <w:trPrChange w:id="156" w:author="Cummings, Shawn" w:date="2025-05-22T12:42:00Z" w16du:dateUtc="2025-05-22T16:42:00Z">
             <w:trPr>
               <w:gridBefore w:val="1"/>
               <w:gridAfter w:val="0"/>
@@ -10875,7 +10997,7 @@
             </w:tcBorders>
             <w:vAlign w:val="center"/>
             <w:hideMark/>
-            <w:tcPrChange w:id="136" w:author="Cummings, Shawn" w:date="2025-05-22T12:42:00Z" w16du:dateUtc="2025-05-22T16:42:00Z">
+            <w:tcPrChange w:id="157" w:author="Cummings, Shawn" w:date="2025-05-22T12:42:00Z" w16du:dateUtc="2025-05-22T16:42:00Z">
               <w:tcPr>
                 <w:tcW w:w="0" w:type="auto"/>
                 <w:gridSpan w:val="2"/>
@@ -10926,7 +11048,7 @@
             </w:tcBorders>
             <w:vAlign w:val="center"/>
             <w:hideMark/>
-            <w:tcPrChange w:id="137" w:author="Cummings, Shawn" w:date="2025-05-22T12:42:00Z" w16du:dateUtc="2025-05-22T16:42:00Z">
+            <w:tcPrChange w:id="158" w:author="Cummings, Shawn" w:date="2025-05-22T12:42:00Z" w16du:dateUtc="2025-05-22T16:42:00Z">
               <w:tcPr>
                 <w:tcW w:w="0" w:type="auto"/>
                 <w:tcBorders>
@@ -10956,7 +11078,7 @@
                 <w:lang w:eastAsia="en-US"/>
               </w:rPr>
             </w:pPr>
-            <w:ins w:id="138" w:author="Cummings, Shawn" w:date="2025-05-22T12:35:00Z" w16du:dateUtc="2025-05-22T16:35:00Z">
+            <w:ins w:id="159" w:author="Cummings, Shawn" w:date="2025-05-22T12:35:00Z" w16du:dateUtc="2025-05-22T16:35:00Z">
               <w:r>
                 <w:rPr>
                   <w:rFonts w:eastAsia="Times New Roman"/>
@@ -10968,7 +11090,7 @@
                 <w:t>2</w:t>
               </w:r>
             </w:ins>
-            <w:del w:id="139" w:author="Cummings, Shawn" w:date="2025-05-22T12:35:00Z" w16du:dateUtc="2025-05-22T16:35:00Z">
+            <w:del w:id="160" w:author="Cummings, Shawn" w:date="2025-05-22T12:35:00Z" w16du:dateUtc="2025-05-22T16:35:00Z">
               <w:r>
                 <w:rPr>
                   <w:rFonts w:eastAsia="Times New Roman"/>
@@ -10990,7 +11112,7 @@
               </w:rPr>
               <w:t xml:space="preserve"> (</w:t>
             </w:r>
-            <w:ins w:id="140" w:author="Cummings, Shawn" w:date="2025-05-22T12:35:00Z" w16du:dateUtc="2025-05-22T16:35:00Z">
+            <w:ins w:id="161" w:author="Cummings, Shawn" w:date="2025-05-22T12:35:00Z" w16du:dateUtc="2025-05-22T16:35:00Z">
               <w:r>
                 <w:rPr>
                   <w:rFonts w:eastAsia="Times New Roman"/>
@@ -11002,7 +11124,7 @@
                 <w:t>3</w:t>
               </w:r>
             </w:ins>
-            <w:del w:id="141" w:author="Cummings, Shawn" w:date="2025-05-22T12:35:00Z" w16du:dateUtc="2025-05-22T16:35:00Z">
+            <w:del w:id="162" w:author="Cummings, Shawn" w:date="2025-05-22T12:35:00Z" w16du:dateUtc="2025-05-22T16:35:00Z">
               <w:r>
                 <w:rPr>
                   <w:rFonts w:eastAsia="Times New Roman"/>
@@ -11024,7 +11146,7 @@
               </w:rPr>
               <w:t>.</w:t>
             </w:r>
-            <w:ins w:id="142" w:author="Cummings, Shawn" w:date="2025-05-22T12:35:00Z" w16du:dateUtc="2025-05-22T16:35:00Z">
+            <w:ins w:id="163" w:author="Cummings, Shawn" w:date="2025-05-22T12:35:00Z" w16du:dateUtc="2025-05-22T16:35:00Z">
               <w:r>
                 <w:rPr>
                   <w:rFonts w:eastAsia="Times New Roman"/>
@@ -11036,7 +11158,7 @@
                 <w:t>1</w:t>
               </w:r>
             </w:ins>
-            <w:del w:id="143" w:author="Cummings, Shawn" w:date="2025-05-22T12:35:00Z" w16du:dateUtc="2025-05-22T16:35:00Z">
+            <w:del w:id="164" w:author="Cummings, Shawn" w:date="2025-05-22T12:35:00Z" w16du:dateUtc="2025-05-22T16:35:00Z">
               <w:r>
                 <w:rPr>
                   <w:rFonts w:eastAsia="Times New Roman"/>
@@ -11069,7 +11191,7 @@
             </w:tcBorders>
             <w:vAlign w:val="center"/>
             <w:hideMark/>
-            <w:tcPrChange w:id="144" w:author="Cummings, Shawn" w:date="2025-05-22T12:42:00Z" w16du:dateUtc="2025-05-22T16:42:00Z">
+            <w:tcPrChange w:id="165" w:author="Cummings, Shawn" w:date="2025-05-22T12:42:00Z" w16du:dateUtc="2025-05-22T16:42:00Z">
               <w:tcPr>
                 <w:tcW w:w="0" w:type="auto"/>
                 <w:gridSpan w:val="2"/>
@@ -11099,7 +11221,7 @@
                 <w:lang w:eastAsia="en-US"/>
               </w:rPr>
             </w:pPr>
-            <w:ins w:id="145" w:author="Cummings, Shawn" w:date="2025-05-22T12:37:00Z" w16du:dateUtc="2025-05-22T16:37:00Z">
+            <w:ins w:id="166" w:author="Cummings, Shawn" w:date="2025-05-22T12:37:00Z" w16du:dateUtc="2025-05-22T16:37:00Z">
               <w:r>
                 <w:rPr>
                   <w:rFonts w:eastAsia="Times New Roman"/>
@@ -11111,7 +11233,7 @@
                 <w:t>4</w:t>
               </w:r>
             </w:ins>
-            <w:del w:id="146" w:author="Cummings, Shawn" w:date="2025-05-22T12:37:00Z" w16du:dateUtc="2025-05-22T16:37:00Z">
+            <w:del w:id="167" w:author="Cummings, Shawn" w:date="2025-05-22T12:37:00Z" w16du:dateUtc="2025-05-22T16:37:00Z">
               <w:r>
                 <w:rPr>
                   <w:rFonts w:eastAsia="Times New Roman"/>
@@ -11133,7 +11255,7 @@
               </w:rPr>
               <w:t xml:space="preserve"> (</w:t>
             </w:r>
-            <w:ins w:id="147" w:author="Cummings, Shawn" w:date="2025-05-22T12:38:00Z" w16du:dateUtc="2025-05-22T16:38:00Z">
+            <w:ins w:id="168" w:author="Cummings, Shawn" w:date="2025-05-22T12:38:00Z" w16du:dateUtc="2025-05-22T16:38:00Z">
               <w:r>
                 <w:rPr>
                   <w:rFonts w:eastAsia="Times New Roman"/>
@@ -11145,7 +11267,7 @@
                 <w:t>6</w:t>
               </w:r>
             </w:ins>
-            <w:del w:id="148" w:author="Cummings, Shawn" w:date="2025-05-22T12:38:00Z" w16du:dateUtc="2025-05-22T16:38:00Z">
+            <w:del w:id="169" w:author="Cummings, Shawn" w:date="2025-05-22T12:38:00Z" w16du:dateUtc="2025-05-22T16:38:00Z">
               <w:r>
                 <w:rPr>
                   <w:rFonts w:eastAsia="Times New Roman"/>
@@ -11167,7 +11289,7 @@
               </w:rPr>
               <w:t>.</w:t>
             </w:r>
-            <w:ins w:id="149" w:author="Cummings, Shawn" w:date="2025-05-22T12:38:00Z" w16du:dateUtc="2025-05-22T16:38:00Z">
+            <w:ins w:id="170" w:author="Cummings, Shawn" w:date="2025-05-22T12:38:00Z" w16du:dateUtc="2025-05-22T16:38:00Z">
               <w:r>
                 <w:rPr>
                   <w:rFonts w:eastAsia="Times New Roman"/>
@@ -11179,7 +11301,7 @@
                 <w:t>3</w:t>
               </w:r>
             </w:ins>
-            <w:del w:id="150" w:author="Cummings, Shawn" w:date="2025-05-22T12:38:00Z" w16du:dateUtc="2025-05-22T16:38:00Z">
+            <w:del w:id="171" w:author="Cummings, Shawn" w:date="2025-05-22T12:38:00Z" w16du:dateUtc="2025-05-22T16:38:00Z">
               <w:r>
                 <w:rPr>
                   <w:rFonts w:eastAsia="Times New Roman"/>
@@ -11212,7 +11334,7 @@
             </w:tcBorders>
             <w:vAlign w:val="center"/>
             <w:hideMark/>
-            <w:tcPrChange w:id="151" w:author="Cummings, Shawn" w:date="2025-05-22T12:42:00Z" w16du:dateUtc="2025-05-22T16:42:00Z">
+            <w:tcPrChange w:id="172" w:author="Cummings, Shawn" w:date="2025-05-22T12:42:00Z" w16du:dateUtc="2025-05-22T16:42:00Z">
               <w:tcPr>
                 <w:tcW w:w="0" w:type="auto"/>
                 <w:gridSpan w:val="2"/>
@@ -11271,7 +11393,7 @@
               <w:top w:val="single" w:sz="18" w:space="0" w:color="auto"/>
               <w:right w:val="single" w:sz="4" w:space="0" w:color="auto"/>
             </w:tcBorders>
-            <w:tcPrChange w:id="152" w:author="Cummings, Shawn" w:date="2025-05-22T12:42:00Z" w16du:dateUtc="2025-05-22T16:42:00Z">
+            <w:tcPrChange w:id="173" w:author="Cummings, Shawn" w:date="2025-05-22T12:42:00Z" w16du:dateUtc="2025-05-22T16:42:00Z">
               <w:tcPr>
                 <w:tcW w:w="0" w:type="auto"/>
                 <w:gridSpan w:val="2"/>
@@ -11299,7 +11421,7 @@
                 <w:lang w:eastAsia="en-US"/>
               </w:rPr>
             </w:pPr>
-            <w:ins w:id="153" w:author="Cummings, Shawn" w:date="2025-05-22T12:42:00Z" w16du:dateUtc="2025-05-22T16:42:00Z">
+            <w:ins w:id="174" w:author="Cummings, Shawn" w:date="2025-05-22T12:42:00Z" w16du:dateUtc="2025-05-22T16:42:00Z">
               <w:r>
                 <w:rPr>
                   <w:rFonts w:eastAsia="Times New Roman"/>
@@ -11311,7 +11433,7 @@
                 <w:t>4</w:t>
               </w:r>
             </w:ins>
-            <w:del w:id="154" w:author="Cummings, Shawn" w:date="2025-05-22T12:42:00Z" w16du:dateUtc="2025-05-22T16:42:00Z">
+            <w:del w:id="175" w:author="Cummings, Shawn" w:date="2025-05-22T12:42:00Z" w16du:dateUtc="2025-05-22T16:42:00Z">
               <w:r>
                 <w:rPr>
                   <w:rFonts w:eastAsia="Times New Roman"/>
@@ -11333,7 +11455,7 @@
               </w:rPr>
               <w:t xml:space="preserve"> (</w:t>
             </w:r>
-            <w:ins w:id="155" w:author="Cummings, Shawn" w:date="2025-05-22T12:42:00Z" w16du:dateUtc="2025-05-22T16:42:00Z">
+            <w:ins w:id="176" w:author="Cummings, Shawn" w:date="2025-05-22T12:42:00Z" w16du:dateUtc="2025-05-22T16:42:00Z">
               <w:r>
                 <w:rPr>
                   <w:rFonts w:eastAsia="Times New Roman"/>
@@ -11345,7 +11467,7 @@
                 <w:t>6</w:t>
               </w:r>
             </w:ins>
-            <w:del w:id="156" w:author="Cummings, Shawn" w:date="2025-05-22T12:42:00Z" w16du:dateUtc="2025-05-22T16:42:00Z">
+            <w:del w:id="177" w:author="Cummings, Shawn" w:date="2025-05-22T12:42:00Z" w16du:dateUtc="2025-05-22T16:42:00Z">
               <w:r>
                 <w:rPr>
                   <w:rFonts w:eastAsia="Times New Roman"/>
@@ -11367,7 +11489,7 @@
               </w:rPr>
               <w:t>.</w:t>
             </w:r>
-            <w:ins w:id="157" w:author="Cummings, Shawn" w:date="2025-05-22T12:42:00Z" w16du:dateUtc="2025-05-22T16:42:00Z">
+            <w:ins w:id="178" w:author="Cummings, Shawn" w:date="2025-05-22T12:42:00Z" w16du:dateUtc="2025-05-22T16:42:00Z">
               <w:r>
                 <w:rPr>
                   <w:rFonts w:eastAsia="Times New Roman"/>
@@ -11379,7 +11501,7 @@
                 <w:t>3</w:t>
               </w:r>
             </w:ins>
-            <w:del w:id="158" w:author="Cummings, Shawn" w:date="2025-05-22T12:42:00Z" w16du:dateUtc="2025-05-22T16:42:00Z">
+            <w:del w:id="179" w:author="Cummings, Shawn" w:date="2025-05-22T12:42:00Z" w16du:dateUtc="2025-05-22T16:42:00Z">
               <w:r>
                 <w:rPr>
                   <w:rFonts w:eastAsia="Times New Roman"/>
@@ -11409,7 +11531,7 @@
             <w:tcBorders>
               <w:top w:val="single" w:sz="18" w:space="0" w:color="auto"/>
             </w:tcBorders>
-            <w:tcPrChange w:id="159" w:author="Cummings, Shawn" w:date="2025-05-22T12:42:00Z" w16du:dateUtc="2025-05-22T16:42:00Z">
+            <w:tcPrChange w:id="180" w:author="Cummings, Shawn" w:date="2025-05-22T12:42:00Z" w16du:dateUtc="2025-05-22T16:42:00Z">
               <w:tcPr>
                 <w:tcW w:w="0" w:type="auto"/>
                 <w:gridSpan w:val="2"/>
@@ -11640,7 +11762,14 @@
         <w:rPr>
           <w:szCs w:val="22"/>
         </w:rPr>
-        <w:t>test (Experiments 1a-c)</w:t>
+        <w:t xml:space="preserve">test </w:t>
+      </w:r>
+      <w:r>
+        <w:rPr>
+          <w:szCs w:val="22"/>
+        </w:rPr>
+        <w:lastRenderedPageBreak/>
+        <w:t>(Experiments 1a-c)</w:t>
       </w:r>
       <w:r>
         <w:rPr>
@@ -11693,14 +11822,7 @@
         <w:rPr>
           <w:szCs w:val="22"/>
         </w:rPr>
-        <w:t xml:space="preserve">models with a </w:t>
-      </w:r>
-      <w:r>
-        <w:rPr>
-          <w:szCs w:val="22"/>
-        </w:rPr>
-        <w:lastRenderedPageBreak/>
-        <w:t xml:space="preserve">Bernoulli (logit) link—mixed-effects </w:t>
+        <w:t xml:space="preserve">models with a Bernoulli (logit) link—mixed-effects </w:t>
       </w:r>
       <w:r>
         <w:rPr>
@@ -11885,7 +12007,7 @@
           <w:rStyle w:val="FootnoteReference"/>
           <w:szCs w:val="22"/>
         </w:rPr>
-        <w:footnoteReference w:id="6"/>
+        <w:footnoteReference w:id="7"/>
       </w:r>
       <w:r>
         <w:rPr>
@@ -11930,27 +12052,27 @@
         </w:rPr>
         <w:t xml:space="preserve">the three design variables </w:t>
       </w:r>
-      <w:commentRangeStart w:id="160"/>
-      <w:commentRangeStart w:id="161"/>
+      <w:commentRangeStart w:id="181"/>
+      <w:commentRangeStart w:id="182"/>
       <w:r>
         <w:rPr>
           <w:szCs w:val="22"/>
         </w:rPr>
         <w:t>pen location</w:t>
       </w:r>
-      <w:commentRangeEnd w:id="160"/>
+      <w:commentRangeEnd w:id="181"/>
       <w:r>
         <w:rPr>
           <w:rStyle w:val="CommentReference"/>
         </w:rPr>
-        <w:commentReference w:id="160"/>
-      </w:r>
-      <w:commentRangeEnd w:id="161"/>
+        <w:commentReference w:id="181"/>
+      </w:r>
+      <w:commentRangeEnd w:id="182"/>
       <w:r>
         <w:rPr>
           <w:rStyle w:val="CommentReference"/>
         </w:rPr>
-        <w:commentReference w:id="161"/>
+        <w:commentReference w:id="182"/>
       </w:r>
       <w:r>
         <w:rPr>
@@ -12197,7 +12319,14 @@
         <w:rPr>
           <w:szCs w:val="22"/>
         </w:rPr>
-        <w:t xml:space="preserve"> a Cauchy prior with location 0 and scale 2, and for random effect correlations, we use</w:t>
+        <w:t xml:space="preserve"> a Cauchy </w:t>
+      </w:r>
+      <w:r>
+        <w:rPr>
+          <w:szCs w:val="22"/>
+        </w:rPr>
+        <w:lastRenderedPageBreak/>
+        <w:t>prior with location 0 and scale 2, and for random effect correlations, we use</w:t>
       </w:r>
       <w:r>
         <w:rPr>
@@ -12215,14 +12344,7 @@
         <w:rPr>
           <w:szCs w:val="22"/>
         </w:rPr>
-        <w:t xml:space="preserve">describing a </w:t>
-      </w:r>
-      <w:r>
-        <w:rPr>
-          <w:szCs w:val="22"/>
-        </w:rPr>
-        <w:lastRenderedPageBreak/>
-        <w:t xml:space="preserve">uniform prior over correlation matrices. Model diagnostic indicated convergence (e.g., all </w:t>
+        <w:t xml:space="preserve">describing a uniform prior over correlation matrices. Model diagnostic indicated convergence (e.g., all </w:t>
       </w:r>
       <m:oMath>
         <m:acc>
@@ -12659,7 +12781,7 @@
           <w:docGrid w:linePitch="360"/>
         </w:sectPr>
       </w:pPr>
-      <w:bookmarkStart w:id="162" w:name="_Ref136190394"/>
+      <w:bookmarkStart w:id="183" w:name="_Ref136190394"/>
       <w:r>
         <w:rPr>
           <w:szCs w:val="22"/>
@@ -12704,7 +12826,7 @@
         </w:rPr>
         <w:fldChar w:fldCharType="end"/>
       </w:r>
-      <w:bookmarkEnd w:id="162"/>
+      <w:bookmarkEnd w:id="183"/>
       <w:r>
         <w:rPr>
           <w:szCs w:val="22"/>
@@ -12804,7 +12926,7 @@
       <w:pPr>
         <w:pStyle w:val="Caption"/>
       </w:pPr>
-      <w:bookmarkStart w:id="163" w:name="_Ref136190384"/>
+      <w:bookmarkStart w:id="184" w:name="_Ref136190384"/>
       <w:r>
         <w:rPr>
           <w:szCs w:val="22"/>
@@ -12844,7 +12966,7 @@
         </w:rPr>
         <w:fldChar w:fldCharType="end"/>
       </w:r>
-      <w:bookmarkEnd w:id="163"/>
+      <w:bookmarkEnd w:id="184"/>
       <w:r>
         <w:rPr>
           <w:szCs w:val="22"/>
@@ -18080,7 +18202,7 @@
           <w:szCs w:val="22"/>
         </w:rPr>
       </w:pPr>
-      <w:bookmarkStart w:id="164" w:name="_Ref136084921"/>
+      <w:bookmarkStart w:id="185" w:name="_Ref136084921"/>
       <w:r>
         <w:rPr>
           <w:szCs w:val="22"/>
@@ -18119,7 +18241,7 @@
         </w:rPr>
         <w:fldChar w:fldCharType="end"/>
       </w:r>
-      <w:bookmarkEnd w:id="164"/>
+      <w:bookmarkEnd w:id="185"/>
       <w:r>
         <w:rPr>
           <w:szCs w:val="22"/>
@@ -19642,7 +19764,7 @@
           <w:szCs w:val="22"/>
         </w:rPr>
       </w:pPr>
-      <w:bookmarkStart w:id="165" w:name="_Ref136190811"/>
+      <w:bookmarkStart w:id="186" w:name="_Ref136190811"/>
       <w:r>
         <w:rPr>
           <w:szCs w:val="22"/>
@@ -19681,7 +19803,7 @@
         </w:rPr>
         <w:fldChar w:fldCharType="end"/>
       </w:r>
-      <w:bookmarkEnd w:id="165"/>
+      <w:bookmarkEnd w:id="186"/>
       <w:r>
         <w:rPr>
           <w:szCs w:val="22"/>
@@ -19788,7 +19910,7 @@
       <w:pPr>
         <w:pStyle w:val="Caption"/>
       </w:pPr>
-      <w:bookmarkStart w:id="166" w:name="_Ref136190818"/>
+      <w:bookmarkStart w:id="187" w:name="_Ref136190818"/>
       <w:r>
         <w:rPr>
           <w:szCs w:val="22"/>
@@ -19828,7 +19950,7 @@
         </w:rPr>
         <w:fldChar w:fldCharType="end"/>
       </w:r>
-      <w:bookmarkEnd w:id="166"/>
+      <w:bookmarkEnd w:id="187"/>
       <w:r>
         <w:rPr>
           <w:szCs w:val="22"/>
@@ -22022,7 +22144,7 @@
           <w:rStyle w:val="FootnoteReference"/>
           <w:szCs w:val="22"/>
         </w:rPr>
-        <w:footnoteReference w:id="7"/>
+        <w:footnoteReference w:id="8"/>
       </w:r>
       <w:r>
         <w:rPr>
@@ -22550,7 +22672,7 @@
     <w:p>
       <w:pPr>
         <w:rPr>
-          <w:ins w:id="167" w:author="Cummings, Shawn" w:date="2025-05-22T12:14:00Z" w16du:dateUtc="2025-05-22T16:14:00Z"/>
+          <w:ins w:id="188" w:author="Cummings, Shawn" w:date="2025-05-22T12:14:00Z" w16du:dateUtc="2025-05-22T16:14:00Z"/>
           <w:szCs w:val="22"/>
         </w:rPr>
       </w:pPr>
@@ -22635,7 +22757,7 @@
         </w:rPr>
         <w:t xml:space="preserve">the state of the articulators. </w:t>
       </w:r>
-      <w:ins w:id="168" w:author="Cummings, Shawn" w:date="2025-05-22T12:13:00Z" w16du:dateUtc="2025-05-22T16:13:00Z">
+      <w:ins w:id="189" w:author="Cummings, Shawn" w:date="2025-05-22T12:13:00Z" w16du:dateUtc="2025-05-22T16:13:00Z">
         <w:r>
           <w:rPr>
             <w:szCs w:val="22"/>
@@ -22649,7 +22771,7 @@
           <w:t>he proportion of participants who mentioned the pen in the free-response post-experiment survey was lower in experiment 2 (29.7%) compared to 1a-c (36.7%</w:t>
         </w:r>
       </w:ins>
-      <w:ins w:id="169" w:author="Cummings, Shawn" w:date="2025-05-22T12:19:00Z" w16du:dateUtc="2025-05-22T16:19:00Z">
+      <w:ins w:id="190" w:author="Cummings, Shawn" w:date="2025-05-22T12:19:00Z" w16du:dateUtc="2025-05-22T16:19:00Z">
         <w:r>
           <w:rPr>
             <w:szCs w:val="22"/>
@@ -22657,7 +22779,7 @@
           <w:t>; see SI for further details</w:t>
         </w:r>
       </w:ins>
-      <w:ins w:id="170" w:author="Cummings, Shawn" w:date="2025-05-22T12:13:00Z" w16du:dateUtc="2025-05-22T16:13:00Z">
+      <w:ins w:id="191" w:author="Cummings, Shawn" w:date="2025-05-22T12:13:00Z" w16du:dateUtc="2025-05-22T16:13:00Z">
         <w:r>
           <w:rPr>
             <w:szCs w:val="22"/>
@@ -22665,7 +22787,7 @@
           <w:t>). This is by no means a comprehensive check of attention to the pen or its position</w:t>
         </w:r>
       </w:ins>
-      <w:ins w:id="171" w:author="Cummings, Shawn" w:date="2025-05-22T12:16:00Z" w16du:dateUtc="2025-05-22T16:16:00Z">
+      <w:ins w:id="192" w:author="Cummings, Shawn" w:date="2025-05-22T12:16:00Z" w16du:dateUtc="2025-05-22T16:16:00Z">
         <w:r>
           <w:rPr>
             <w:szCs w:val="22"/>
@@ -22673,7 +22795,7 @@
           <w:t>. F</w:t>
         </w:r>
       </w:ins>
-      <w:ins w:id="172" w:author="Cummings, Shawn" w:date="2025-05-22T12:15:00Z" w16du:dateUtc="2025-05-22T16:15:00Z">
+      <w:ins w:id="193" w:author="Cummings, Shawn" w:date="2025-05-22T12:15:00Z" w16du:dateUtc="2025-05-22T16:15:00Z">
         <w:r>
           <w:rPr>
             <w:szCs w:val="22"/>
@@ -22681,7 +22803,7 @@
           <w:t>or example,</w:t>
         </w:r>
       </w:ins>
-      <w:ins w:id="173" w:author="Cummings, Shawn" w:date="2025-05-22T12:16:00Z" w16du:dateUtc="2025-05-22T16:16:00Z">
+      <w:ins w:id="194" w:author="Cummings, Shawn" w:date="2025-05-22T12:16:00Z" w16du:dateUtc="2025-05-22T16:16:00Z">
         <w:r>
           <w:rPr>
             <w:szCs w:val="22"/>
@@ -22689,7 +22811,7 @@
           <w:t xml:space="preserve"> this trend could emerge if </w:t>
         </w:r>
       </w:ins>
-      <w:ins w:id="174" w:author="Cummings, Shawn" w:date="2025-05-22T12:13:00Z" w16du:dateUtc="2025-05-22T16:13:00Z">
+      <w:ins w:id="195" w:author="Cummings, Shawn" w:date="2025-05-22T12:13:00Z" w16du:dateUtc="2025-05-22T16:13:00Z">
         <w:r>
           <w:rPr>
             <w:szCs w:val="22"/>
@@ -22701,7 +22823,7 @@
             <w:i/>
             <w:iCs/>
             <w:szCs w:val="22"/>
-            <w:rPrChange w:id="175" w:author="Cummings, Shawn" w:date="2025-05-22T12:15:00Z" w16du:dateUtc="2025-05-22T16:15:00Z">
+            <w:rPrChange w:id="196" w:author="Cummings, Shawn" w:date="2025-05-22T12:15:00Z" w16du:dateUtc="2025-05-22T16:15:00Z">
               <w:rPr>
                 <w:szCs w:val="22"/>
               </w:rPr>
@@ -22716,7 +22838,7 @@
           <w:t xml:space="preserve"> notice the pen</w:t>
         </w:r>
       </w:ins>
-      <w:ins w:id="176" w:author="Cummings, Shawn" w:date="2025-05-22T12:17:00Z" w16du:dateUtc="2025-05-22T16:17:00Z">
+      <w:ins w:id="197" w:author="Cummings, Shawn" w:date="2025-05-22T12:17:00Z" w16du:dateUtc="2025-05-22T16:17:00Z">
         <w:r>
           <w:rPr>
             <w:szCs w:val="22"/>
@@ -22724,7 +22846,7 @@
           <w:t>,</w:t>
         </w:r>
       </w:ins>
-      <w:ins w:id="177" w:author="Cummings, Shawn" w:date="2025-05-22T12:13:00Z" w16du:dateUtc="2025-05-22T16:13:00Z">
+      <w:ins w:id="198" w:author="Cummings, Shawn" w:date="2025-05-22T12:13:00Z" w16du:dateUtc="2025-05-22T16:13:00Z">
         <w:r>
           <w:rPr>
             <w:szCs w:val="22"/>
@@ -22732,7 +22854,7 @@
           <w:t xml:space="preserve"> but </w:t>
         </w:r>
       </w:ins>
-      <w:ins w:id="178" w:author="Cummings, Shawn" w:date="2025-05-22T12:17:00Z" w16du:dateUtc="2025-05-22T16:17:00Z">
+      <w:ins w:id="199" w:author="Cummings, Shawn" w:date="2025-05-22T12:17:00Z" w16du:dateUtc="2025-05-22T16:17:00Z">
         <w:r>
           <w:rPr>
             <w:szCs w:val="22"/>
@@ -22740,7 +22862,7 @@
           <w:t>became</w:t>
         </w:r>
       </w:ins>
-      <w:ins w:id="179" w:author="Cummings, Shawn" w:date="2025-05-22T12:16:00Z" w16du:dateUtc="2025-05-22T16:16:00Z">
+      <w:ins w:id="200" w:author="Cummings, Shawn" w:date="2025-05-22T12:16:00Z" w16du:dateUtc="2025-05-22T16:16:00Z">
         <w:r>
           <w:rPr>
             <w:szCs w:val="22"/>
@@ -22748,7 +22870,7 @@
           <w:t xml:space="preserve"> less likely to mention it under the “</w:t>
         </w:r>
       </w:ins>
-      <w:ins w:id="180" w:author="Cummings, Shawn" w:date="2025-05-22T12:16:00Z">
+      <w:ins w:id="201" w:author="Cummings, Shawn" w:date="2025-05-22T12:16:00Z">
         <w:r>
           <w:rPr>
             <w:szCs w:val="22"/>
@@ -22756,7 +22878,7 @@
           <w:t>Did you notice anything odd about the person in the video?</w:t>
         </w:r>
       </w:ins>
-      <w:ins w:id="181" w:author="Cummings, Shawn" w:date="2025-05-22T12:16:00Z" w16du:dateUtc="2025-05-22T16:16:00Z">
+      <w:ins w:id="202" w:author="Cummings, Shawn" w:date="2025-05-22T12:16:00Z" w16du:dateUtc="2025-05-22T16:16:00Z">
         <w:r>
           <w:rPr>
             <w:szCs w:val="22"/>
@@ -22764,7 +22886,7 @@
           <w:t>” prompt</w:t>
         </w:r>
       </w:ins>
-      <w:ins w:id="182" w:author="Cummings, Shawn" w:date="2025-05-22T12:17:00Z" w16du:dateUtc="2025-05-22T16:17:00Z">
+      <w:ins w:id="203" w:author="Cummings, Shawn" w:date="2025-05-22T12:17:00Z" w16du:dateUtc="2025-05-22T16:17:00Z">
         <w:r>
           <w:rPr>
             <w:szCs w:val="22"/>
@@ -22772,7 +22894,7 @@
           <w:t xml:space="preserve"> when other visually salient objects (the black box) were also apparent</w:t>
         </w:r>
       </w:ins>
-      <w:ins w:id="183" w:author="Cummings, Shawn" w:date="2025-05-22T12:16:00Z" w16du:dateUtc="2025-05-22T16:16:00Z">
+      <w:ins w:id="204" w:author="Cummings, Shawn" w:date="2025-05-22T12:16:00Z" w16du:dateUtc="2025-05-22T16:16:00Z">
         <w:r>
           <w:rPr>
             <w:szCs w:val="22"/>
@@ -22780,7 +22902,7 @@
           <w:t>. However,</w:t>
         </w:r>
       </w:ins>
-      <w:ins w:id="184" w:author="Cummings, Shawn" w:date="2025-05-22T12:17:00Z" w16du:dateUtc="2025-05-22T16:17:00Z">
+      <w:ins w:id="205" w:author="Cummings, Shawn" w:date="2025-05-22T12:17:00Z" w16du:dateUtc="2025-05-22T16:17:00Z">
         <w:r>
           <w:rPr>
             <w:szCs w:val="22"/>
@@ -22795,7 +22917,7 @@
           <w:t xml:space="preserve">it is also possible the occluder created </w:t>
         </w:r>
       </w:ins>
-      <w:ins w:id="185" w:author="Cummings, Shawn" w:date="2025-05-22T12:18:00Z" w16du:dateUtc="2025-05-22T16:18:00Z">
+      <w:ins w:id="206" w:author="Cummings, Shawn" w:date="2025-05-22T12:18:00Z" w16du:dateUtc="2025-05-22T16:18:00Z">
         <w:r>
           <w:rPr>
             <w:szCs w:val="22"/>
@@ -22803,7 +22925,7 @@
           <w:t>distraction during the task.</w:t>
         </w:r>
       </w:ins>
-      <w:ins w:id="186" w:author="Cummings, Shawn" w:date="2025-05-22T12:16:00Z" w16du:dateUtc="2025-05-22T16:16:00Z">
+      <w:ins w:id="207" w:author="Cummings, Shawn" w:date="2025-05-22T12:16:00Z" w16du:dateUtc="2025-05-22T16:16:00Z">
         <w:r>
           <w:rPr>
             <w:szCs w:val="22"/>
@@ -24228,7 +24350,7 @@
         </w:rPr>
         <w:t xml:space="preserve"> </w:t>
       </w:r>
-      <w:del w:id="187" w:author="Jaeger, Florian" w:date="2025-05-21T14:34:00Z" w16du:dateUtc="2025-05-21T18:34:00Z">
+      <w:del w:id="208" w:author="Jaeger, Florian" w:date="2025-05-21T14:34:00Z" w16du:dateUtc="2025-05-21T18:34:00Z">
         <w:r>
           <w:rPr>
             <w:szCs w:val="22"/>
@@ -24236,7 +24358,7 @@
           <w:delText xml:space="preserve">While some of these accounts (in particular the causal inference account) have conceptual similarities to compensation, </w:delText>
         </w:r>
       </w:del>
-      <w:del w:id="188" w:author="Jaeger, Florian" w:date="2025-05-21T14:33:00Z" w16du:dateUtc="2025-05-21T18:33:00Z">
+      <w:del w:id="209" w:author="Jaeger, Florian" w:date="2025-05-21T14:33:00Z" w16du:dateUtc="2025-05-21T18:33:00Z">
         <w:r>
           <w:rPr>
             <w:szCs w:val="22"/>
@@ -24244,7 +24366,7 @@
           <w:delText>previously offered</w:delText>
         </w:r>
       </w:del>
-      <w:ins w:id="189" w:author="Jaeger, Florian" w:date="2025-05-21T14:34:00Z" w16du:dateUtc="2025-05-21T18:34:00Z">
+      <w:ins w:id="210" w:author="Jaeger, Florian" w:date="2025-05-21T14:34:00Z" w16du:dateUtc="2025-05-21T18:34:00Z">
         <w:r>
           <w:rPr>
             <w:szCs w:val="22"/>
@@ -24252,7 +24374,7 @@
           <w:t>Despite important similarities between these different accounts, all</w:t>
         </w:r>
       </w:ins>
-      <w:ins w:id="190" w:author="Jaeger, Florian" w:date="2025-05-21T14:33:00Z" w16du:dateUtc="2025-05-21T18:33:00Z">
+      <w:ins w:id="211" w:author="Jaeger, Florian" w:date="2025-05-21T14:33:00Z" w16du:dateUtc="2025-05-21T18:33:00Z">
         <w:r>
           <w:rPr>
             <w:szCs w:val="22"/>
@@ -27428,7 +27550,7 @@
       </w:r>
     </w:p>
   </w:comment>
-  <w:comment w:id="6" w:author="Jaeger, Florian" w:date="2025-05-21T14:29:00Z" w:initials="TJ">
+  <w:comment w:id="8" w:author="Jaeger, Florian" w:date="2025-05-21T14:29:00Z" w:initials="TJ">
     <w:p>
       <w:pPr>
         <w:jc w:val="left"/>
@@ -27447,7 +27569,7 @@
       </w:r>
     </w:p>
   </w:comment>
-  <w:comment w:id="25" w:author="Jaeger, Florian" w:date="2025-05-21T14:30:00Z" w:initials="TJ">
+  <w:comment w:id="31" w:author="Jaeger, Florian" w:date="2025-05-21T14:30:00Z" w:initials="TJ">
     <w:p>
       <w:pPr>
         <w:jc w:val="left"/>
@@ -27466,7 +27588,7 @@
       </w:r>
     </w:p>
   </w:comment>
-  <w:comment w:id="36" w:author="Jaeger, Florian" w:date="2025-05-21T14:31:00Z" w:initials="TJ">
+  <w:comment w:id="46" w:author="Jaeger, Florian" w:date="2025-05-21T14:31:00Z" w:initials="TJ">
     <w:p>
       <w:pPr>
         <w:jc w:val="left"/>
@@ -27485,7 +27607,7 @@
       </w:r>
     </w:p>
   </w:comment>
-  <w:comment w:id="63" w:author="Cummings, Shawn" w:date="2025-05-22T12:38:00Z" w:initials="SC">
+  <w:comment w:id="51" w:author="Cummings, Shawn" w:date="2025-05-22T12:49:00Z" w:initials="SC">
     <w:p>
       <w:pPr>
         <w:jc w:val="left"/>
@@ -27497,11 +27619,11 @@
         <w:annotationRef/>
       </w:r>
       <w:r>
-        <w:t>Includes the person for whom we don’t have data</w:t>
+        <w:t>This is kind of a strange place to put trial level exclusions for Exp2, but it is where we report the pt level ones… I originally put this in the methods section of Exp2, but that felt even worse.</w:t>
       </w:r>
     </w:p>
   </w:comment>
-  <w:comment w:id="70" w:author="Cummings, Shawn" w:date="2025-05-22T12:37:00Z" w:initials="SC">
+  <w:comment w:id="84" w:author="Cummings, Shawn" w:date="2025-05-22T12:38:00Z" w:initials="SC">
     <w:p>
       <w:pPr>
         <w:jc w:val="left"/>
@@ -27513,11 +27635,11 @@
         <w:annotationRef/>
       </w:r>
       <w:r>
-        <w:t>This includes the two repeat takers</w:t>
+        <w:t>Includes the person for whom we don’t have data</w:t>
       </w:r>
     </w:p>
   </w:comment>
-  <w:comment w:id="125" w:author="Jaeger, Florian" w:date="2025-05-21T14:31:00Z" w:initials="TJ">
+  <w:comment w:id="91" w:author="Cummings, Shawn" w:date="2025-05-22T12:37:00Z" w:initials="SC">
     <w:p>
       <w:pPr>
         <w:jc w:val="left"/>
@@ -27529,14 +27651,30 @@
         <w:annotationRef/>
       </w:r>
       <w:r>
-        <w:rPr>
-          <w:color w:val="000000"/>
-        </w:rPr>
-        <w:t>update</w:t>
+        <w:t>This includes the two repeat takers</w:t>
       </w:r>
     </w:p>
   </w:comment>
-  <w:comment w:id="160" w:author="Jaeger, Florian" w:date="2025-05-11T16:19:00Z" w:initials="TJ">
+  <w:comment w:id="146" w:author="Jaeger, Florian" w:date="2025-05-21T14:31:00Z" w:initials="TJ">
+    <w:p>
+      <w:pPr>
+        <w:jc w:val="left"/>
+      </w:pPr>
+      <w:r>
+        <w:rPr>
+          <w:rStyle w:val="CommentReference"/>
+        </w:rPr>
+        <w:annotationRef/>
+      </w:r>
+      <w:r>
+        <w:rPr>
+          <w:color w:val="000000"/>
+        </w:rPr>
+        <w:t>update</w:t>
+      </w:r>
+    </w:p>
+  </w:comment>
+  <w:comment w:id="181" w:author="Jaeger, Florian" w:date="2025-05-11T16:19:00Z" w:initials="TJ">
     <w:p>
       <w:pPr>
         <w:jc w:val="left"/>
@@ -27566,7 +27704,7 @@
       </w:r>
     </w:p>
   </w:comment>
-  <w:comment w:id="161" w:author="Cummings, Shawn" w:date="2025-05-12T20:37:00Z" w:initials="SC">
+  <w:comment w:id="182" w:author="Cummings, Shawn" w:date="2025-05-12T20:37:00Z" w:initials="SC">
     <w:p>
       <w:pPr>
         <w:jc w:val="left"/>
@@ -27591,6 +27729,7 @@
   <w15:commentEx w15:paraId="40D69938" w15:done="0"/>
   <w15:commentEx w15:paraId="387C296F" w15:done="0"/>
   <w15:commentEx w15:paraId="0F9A3FC6" w15:done="0"/>
+  <w15:commentEx w15:paraId="57D8E437" w15:done="0"/>
   <w15:commentEx w15:paraId="2D5281C0" w15:done="0"/>
   <w15:commentEx w15:paraId="732E5606" w15:done="0"/>
   <w15:commentEx w15:paraId="3499D5D1" w15:done="0"/>
@@ -27605,6 +27744,7 @@
   <w16cex:commentExtensible w16cex:durableId="65EAFE2B" w16cex:dateUtc="2025-05-21T18:29:00Z"/>
   <w16cex:commentExtensible w16cex:durableId="7658D23A" w16cex:dateUtc="2025-05-21T18:30:00Z"/>
   <w16cex:commentExtensible w16cex:durableId="24F37F1B" w16cex:dateUtc="2025-05-21T18:31:00Z"/>
+  <w16cex:commentExtensible w16cex:durableId="2BCDC9EB" w16cex:dateUtc="2025-05-22T16:49:00Z"/>
   <w16cex:commentExtensible w16cex:durableId="12A3244D" w16cex:dateUtc="2025-05-22T16:38:00Z"/>
   <w16cex:commentExtensible w16cex:durableId="5F1583AA" w16cex:dateUtc="2025-05-22T16:37:00Z"/>
   <w16cex:commentExtensible w16cex:durableId="47E32A8D" w16cex:dateUtc="2025-05-21T18:31:00Z"/>
@@ -27619,6 +27759,7 @@
   <w16cid:commentId w16cid:paraId="40D69938" w16cid:durableId="65EAFE2B"/>
   <w16cid:commentId w16cid:paraId="387C296F" w16cid:durableId="7658D23A"/>
   <w16cid:commentId w16cid:paraId="0F9A3FC6" w16cid:durableId="24F37F1B"/>
+  <w16cid:commentId w16cid:paraId="57D8E437" w16cid:durableId="2BCDC9EB"/>
   <w16cid:commentId w16cid:paraId="2D5281C0" w16cid:durableId="12A3244D"/>
   <w16cid:commentId w16cid:paraId="732E5606" w16cid:durableId="5F1583AA"/>
   <w16cid:commentId w16cid:paraId="3499D5D1" w16cid:durableId="47E32A8D"/>
@@ -28185,33 +28326,80 @@
       <w:pPr>
         <w:pStyle w:val="FootnoteText"/>
       </w:pPr>
-      <w:r>
-        <w:rPr>
-          <w:rStyle w:val="FootnoteReference"/>
-        </w:rPr>
-        <w:footnoteRef/>
-      </w:r>
-      <w:r>
-        <w:t xml:space="preserve"> </w:t>
-      </w:r>
-      <w:r>
-        <w:t>Block was included in the analysis to provide a baseline for planned subsequent experiments on question (2) mentioned in the Open Science Statement. The inclusion does not, however, change any of the results.</w:t>
-      </w:r>
-      <w:r>
-        <w:t xml:space="preserve"> </w:t>
-      </w:r>
-      <w:r>
-        <w:t xml:space="preserve">Additional analyses strongly supported linear effects of acoustic continuum and non-linear effects of test blocks for all experiments. The results we report below replicate when standard linear effects </w:t>
-      </w:r>
-      <w:r>
-        <w:t xml:space="preserve">are </w:t>
-      </w:r>
-      <w:r>
-        <w:t>used for continuum and block.</w:t>
-      </w:r>
+      <w:ins w:id="53" w:author="Cummings, Shawn" w:date="2025-05-22T12:47:00Z" w16du:dateUtc="2025-05-22T16:47:00Z">
+        <w:r>
+          <w:rPr>
+            <w:rStyle w:val="FootnoteReference"/>
+          </w:rPr>
+          <w:footnoteRef/>
+        </w:r>
+        <w:r>
+          <w:t xml:space="preserve"> For experiments 2 </w:t>
+        </w:r>
+      </w:ins>
+      <w:ins w:id="54" w:author="Cummings, Shawn" w:date="2025-05-22T12:48:00Z" w16du:dateUtc="2025-05-22T16:48:00Z">
+        <w:r>
+          <w:t xml:space="preserve">(reported later in main text) and 2b (reported in the SI), 12 observations (0.2%) were missing due to catch trial responses, and </w:t>
+        </w:r>
+        <w:r>
+          <w:rPr>
+            <w:szCs w:val="22"/>
+          </w:rPr>
+          <w:t>14</w:t>
+        </w:r>
+        <w:r>
+          <w:rPr>
+            <w:szCs w:val="22"/>
+          </w:rPr>
+          <w:t>3 were</w:t>
+        </w:r>
+        <w:r>
+          <w:rPr>
+            <w:szCs w:val="22"/>
+          </w:rPr>
+          <w:t xml:space="preserve"> excluded for irregular RTs (1.8%), leaving 7622 observations from 108 participants</w:t>
+        </w:r>
+        <w:r>
+          <w:rPr>
+            <w:szCs w:val="22"/>
+          </w:rPr>
+          <w:t>.</w:t>
+        </w:r>
+      </w:ins>
     </w:p>
   </w:footnote>
   <w:footnote w:id="7">
+    <w:p>
+      <w:pPr>
+        <w:pStyle w:val="FootnoteText"/>
+      </w:pPr>
+      <w:r>
+        <w:rPr>
+          <w:rStyle w:val="FootnoteReference"/>
+        </w:rPr>
+        <w:footnoteRef/>
+      </w:r>
+      <w:r>
+        <w:t xml:space="preserve"> </w:t>
+      </w:r>
+      <w:r>
+        <w:t>Block was included in the analysis to provide a baseline for planned subsequent experiments on question (2) mentioned in the Open Science Statement. The inclusion does not, however, change any of the results.</w:t>
+      </w:r>
+      <w:r>
+        <w:t xml:space="preserve"> </w:t>
+      </w:r>
+      <w:r>
+        <w:t xml:space="preserve">Additional analyses strongly supported linear effects of acoustic continuum and non-linear effects of test blocks for all experiments. The results we report below replicate when standard linear effects </w:t>
+      </w:r>
+      <w:r>
+        <w:t xml:space="preserve">are </w:t>
+      </w:r>
+      <w:r>
+        <w:t>used for continuum and block.</w:t>
+      </w:r>
+    </w:p>
+  </w:footnote>
+  <w:footnote w:id="8">
     <w:p>
       <w:pPr>
         <w:pStyle w:val="FootnoteText"/>

</xml_diff>

<commit_message>
some edits to make clearer how we differ from the earlier PR work
</commit_message>
<xml_diff>
--- a/output/papers/Round 2/manuscript-brief.docx
+++ b/output/papers/Round 2/manuscript-brief.docx
@@ -2152,6 +2152,7 @@
     <w:p>
       <w:pPr>
         <w:rPr>
+          <w:ins w:id="1" w:author="Jaeger, Florian" w:date="2025-05-22T16:44:00Z" w16du:dateUtc="2025-05-22T20:44:00Z"/>
           <w:szCs w:val="22"/>
         </w:rPr>
       </w:pPr>
@@ -2353,8 +2354,24 @@
         <w:rPr>
           <w:szCs w:val="22"/>
         </w:rPr>
-        <w:t>/s/-to-/ʃ/-</w:t>
-      </w:r>
+        <w:t>/s/-to-/ʃ/</w:t>
+      </w:r>
+      <w:ins w:id="2" w:author="Jaeger, Florian" w:date="2025-05-22T16:43:00Z" w16du:dateUtc="2025-05-22T20:43:00Z">
+        <w:r>
+          <w:rPr>
+            <w:szCs w:val="22"/>
+          </w:rPr>
+          <w:t xml:space="preserve"> test</w:t>
+        </w:r>
+      </w:ins>
+      <w:del w:id="3" w:author="Jaeger, Florian" w:date="2025-05-22T16:43:00Z" w16du:dateUtc="2025-05-22T20:43:00Z">
+        <w:r>
+          <w:rPr>
+            <w:szCs w:val="22"/>
+          </w:rPr>
+          <w:delText>-</w:delText>
+        </w:r>
+      </w:del>
       <w:r>
         <w:rPr>
           <w:szCs w:val="22"/>
@@ -2365,157 +2382,577 @@
         <w:rPr>
           <w:szCs w:val="22"/>
         </w:rPr>
-        <w:t xml:space="preserve"> as “s”, suggesting that they </w:t>
-      </w:r>
-      <w:r>
-        <w:rPr>
-          <w:szCs w:val="22"/>
-        </w:rPr>
-        <w:t xml:space="preserve">recalibrated their “s” category by </w:t>
-      </w:r>
-      <w:r>
-        <w:rPr>
-          <w:szCs w:val="22"/>
-        </w:rPr>
-        <w:t>expand</w:t>
-      </w:r>
-      <w:r>
-        <w:rPr>
-          <w:szCs w:val="22"/>
-        </w:rPr>
-        <w:t>ing</w:t>
-      </w:r>
-      <w:r>
-        <w:rPr>
-          <w:szCs w:val="22"/>
-        </w:rPr>
-        <w:t xml:space="preserve"> and/or shift</w:t>
-      </w:r>
-      <w:r>
-        <w:rPr>
-          <w:szCs w:val="22"/>
-        </w:rPr>
-        <w:t>ing it</w:t>
-      </w:r>
+        <w:t xml:space="preserve"> as “s”, suggesting that </w:t>
+      </w:r>
+      <w:del w:id="4" w:author="Jaeger, Florian" w:date="2025-05-22T16:43:00Z" w16du:dateUtc="2025-05-22T20:43:00Z">
+        <w:r>
+          <w:rPr>
+            <w:szCs w:val="22"/>
+          </w:rPr>
+          <w:delText xml:space="preserve">they </w:delText>
+        </w:r>
+      </w:del>
+      <w:ins w:id="5" w:author="Jaeger, Florian" w:date="2025-05-22T16:43:00Z" w16du:dateUtc="2025-05-22T20:43:00Z">
+        <w:r>
+          <w:rPr>
+            <w:szCs w:val="22"/>
+          </w:rPr>
+          <w:t>exposure</w:t>
+        </w:r>
+        <w:r>
+          <w:rPr>
+            <w:szCs w:val="22"/>
+          </w:rPr>
+          <w:t xml:space="preserve"> </w:t>
+        </w:r>
+      </w:ins>
+      <w:ins w:id="6" w:author="Jaeger, Florian" w:date="2025-05-22T16:44:00Z" w16du:dateUtc="2025-05-22T20:44:00Z">
+        <w:r>
+          <w:rPr>
+            <w:szCs w:val="22"/>
+          </w:rPr>
+          <w:t xml:space="preserve">shifted or expanded </w:t>
+        </w:r>
+      </w:ins>
+      <w:del w:id="7" w:author="Jaeger, Florian" w:date="2025-05-22T16:44:00Z" w16du:dateUtc="2025-05-22T20:44:00Z">
+        <w:r>
+          <w:rPr>
+            <w:szCs w:val="22"/>
+          </w:rPr>
+          <w:delText xml:space="preserve">recalibrated </w:delText>
+        </w:r>
+      </w:del>
+      <w:del w:id="8" w:author="Jaeger, Florian" w:date="2025-05-22T16:43:00Z" w16du:dateUtc="2025-05-22T20:43:00Z">
+        <w:r>
+          <w:rPr>
+            <w:szCs w:val="22"/>
+          </w:rPr>
+          <w:delText xml:space="preserve">their </w:delText>
+        </w:r>
+      </w:del>
+      <w:ins w:id="9" w:author="Jaeger, Florian" w:date="2025-05-22T16:43:00Z" w16du:dateUtc="2025-05-22T20:43:00Z">
+        <w:r>
+          <w:rPr>
+            <w:szCs w:val="22"/>
+          </w:rPr>
+          <w:t>listeners’</w:t>
+        </w:r>
+        <w:r>
+          <w:rPr>
+            <w:szCs w:val="22"/>
+          </w:rPr>
+          <w:t xml:space="preserve"> </w:t>
+        </w:r>
+      </w:ins>
+      <w:r>
+        <w:rPr>
+          <w:szCs w:val="22"/>
+        </w:rPr>
+        <w:t>“s” category</w:t>
+      </w:r>
+      <w:del w:id="10" w:author="Jaeger, Florian" w:date="2025-05-22T16:44:00Z" w16du:dateUtc="2025-05-22T20:44:00Z">
+        <w:r>
+          <w:rPr>
+            <w:szCs w:val="22"/>
+          </w:rPr>
+          <w:delText xml:space="preserve"> </w:delText>
+        </w:r>
+      </w:del>
+      <w:ins w:id="11" w:author="Jaeger, Florian" w:date="2025-05-22T16:44:00Z" w16du:dateUtc="2025-05-22T20:44:00Z">
+        <w:r>
+          <w:rPr>
+            <w:szCs w:val="22"/>
+          </w:rPr>
+          <w:t xml:space="preserve"> (Kleinschmidt &amp; Jaeger, 2015; Cummings &amp; Theodore, 2023)</w:t>
+        </w:r>
+      </w:ins>
+      <w:del w:id="12" w:author="Jaeger, Florian" w:date="2025-05-22T16:44:00Z" w16du:dateUtc="2025-05-22T20:44:00Z">
+        <w:r>
+          <w:rPr>
+            <w:szCs w:val="22"/>
+          </w:rPr>
+          <w:delText xml:space="preserve">by </w:delText>
+        </w:r>
+        <w:r>
+          <w:rPr>
+            <w:szCs w:val="22"/>
+          </w:rPr>
+          <w:delText>expand</w:delText>
+        </w:r>
+        <w:r>
+          <w:rPr>
+            <w:szCs w:val="22"/>
+          </w:rPr>
+          <w:delText>ing</w:delText>
+        </w:r>
+        <w:r>
+          <w:rPr>
+            <w:szCs w:val="22"/>
+          </w:rPr>
+          <w:delText xml:space="preserve"> and/or shift</w:delText>
+        </w:r>
+        <w:r>
+          <w:rPr>
+            <w:szCs w:val="22"/>
+          </w:rPr>
+          <w:delText>ing it</w:delText>
+        </w:r>
+      </w:del>
+      <w:r>
+        <w:rPr>
+          <w:szCs w:val="22"/>
+        </w:rPr>
+        <w:t>.</w:t>
+      </w:r>
+      <w:del w:id="13" w:author="Jaeger, Florian" w:date="2025-05-22T16:31:00Z" w16du:dateUtc="2025-05-22T20:31:00Z">
+        <w:r>
+          <w:rPr>
+            <w:szCs w:val="22"/>
+          </w:rPr>
+          <w:delText xml:space="preserve"> </w:delText>
+        </w:r>
+        <w:r>
+          <w:rPr>
+            <w:szCs w:val="22"/>
+          </w:rPr>
+          <w:delText>Similar</w:delText>
+        </w:r>
+        <w:r>
+          <w:rPr>
+            <w:szCs w:val="22"/>
+          </w:rPr>
+          <w:delText xml:space="preserve"> </w:delText>
+        </w:r>
+        <w:r>
+          <w:rPr>
+            <w:szCs w:val="22"/>
+          </w:rPr>
+          <w:delText>has now been observed for</w:delText>
+        </w:r>
+        <w:r>
+          <w:rPr>
+            <w:szCs w:val="22"/>
+          </w:rPr>
+          <w:delText xml:space="preserve"> </w:delText>
+        </w:r>
+        <w:r>
+          <w:rPr>
+            <w:szCs w:val="22"/>
+          </w:rPr>
+          <w:delText>many</w:delText>
+        </w:r>
+        <w:r>
+          <w:rPr>
+            <w:szCs w:val="22"/>
+          </w:rPr>
+          <w:delText xml:space="preserve"> types of sound categories and languages (for reviews, see Samuel</w:delText>
+        </w:r>
+        <w:r>
+          <w:rPr>
+            <w:szCs w:val="22"/>
+          </w:rPr>
+          <w:delText xml:space="preserve"> &amp; Kraljic</w:delText>
+        </w:r>
+        <w:r>
+          <w:rPr>
+            <w:szCs w:val="22"/>
+          </w:rPr>
+          <w:delText>, 20</w:delText>
+        </w:r>
+        <w:r>
+          <w:rPr>
+            <w:szCs w:val="22"/>
+          </w:rPr>
+          <w:delText>09; Xie et al., 2023</w:delText>
+        </w:r>
+        <w:r>
+          <w:rPr>
+            <w:szCs w:val="22"/>
+          </w:rPr>
+          <w:delText>).</w:delText>
+        </w:r>
+      </w:del>
+      <w:r>
+        <w:rPr>
+          <w:szCs w:val="22"/>
+        </w:rPr>
+        <w:t xml:space="preserve"> </w:t>
+      </w:r>
+    </w:p>
+    <w:p>
+      <w:pPr>
+        <w:rPr>
+          <w:del w:id="14" w:author="Jaeger, Florian" w:date="2025-05-22T17:02:00Z" w16du:dateUtc="2025-05-22T21:02:00Z"/>
+          <w:szCs w:val="22"/>
+        </w:rPr>
+      </w:pPr>
+      <w:ins w:id="15" w:author="Jaeger, Florian" w:date="2025-05-22T16:45:00Z" w16du:dateUtc="2025-05-22T20:45:00Z">
+        <w:r>
+          <w:rPr>
+            <w:szCs w:val="22"/>
+          </w:rPr>
+          <w:t xml:space="preserve">One influential finding in this line of work is </w:t>
+        </w:r>
+      </w:ins>
+      <w:del w:id="16" w:author="Jaeger, Florian" w:date="2025-05-22T15:08:00Z" w16du:dateUtc="2025-05-22T19:08:00Z">
+        <w:r>
+          <w:rPr>
+            <w:szCs w:val="22"/>
+          </w:rPr>
+          <w:delText>Intriguingly though</w:delText>
+        </w:r>
+      </w:del>
+      <w:ins w:id="17" w:author="Jaeger, Florian" w:date="2025-05-22T16:45:00Z" w16du:dateUtc="2025-05-22T20:45:00Z">
+        <w:r>
+          <w:rPr>
+            <w:szCs w:val="22"/>
+          </w:rPr>
+          <w:t>o</w:t>
+        </w:r>
+      </w:ins>
+      <w:ins w:id="18" w:author="Jaeger, Florian" w:date="2025-05-22T15:08:00Z" w16du:dateUtc="2025-05-22T19:08:00Z">
+        <w:r>
+          <w:rPr>
+            <w:szCs w:val="22"/>
+          </w:rPr>
+          <w:t xml:space="preserve">f </w:t>
+        </w:r>
+      </w:ins>
+      <w:ins w:id="19" w:author="Jaeger, Florian" w:date="2025-05-22T15:09:00Z" w16du:dateUtc="2025-05-22T19:09:00Z">
+        <w:r>
+          <w:rPr>
+            <w:szCs w:val="22"/>
+          </w:rPr>
+          <w:t>direct relevance to the present study</w:t>
+        </w:r>
+      </w:ins>
+      <w:ins w:id="20" w:author="Jaeger, Florian" w:date="2025-05-22T16:45:00Z" w16du:dateUtc="2025-05-22T20:45:00Z">
+        <w:r>
+          <w:rPr>
+            <w:szCs w:val="22"/>
+          </w:rPr>
+          <w:t>:</w:t>
+        </w:r>
+      </w:ins>
+      <w:del w:id="21" w:author="Jaeger, Florian" w:date="2025-05-22T16:45:00Z" w16du:dateUtc="2025-05-22T20:45:00Z">
+        <w:r>
+          <w:rPr>
+            <w:szCs w:val="22"/>
+          </w:rPr>
+          <w:delText>,</w:delText>
+        </w:r>
+      </w:del>
+      <w:r>
+        <w:rPr>
+          <w:szCs w:val="22"/>
+        </w:rPr>
+        <w:t xml:space="preserve"> </w:t>
+      </w:r>
+      <w:r>
+        <w:rPr>
+          <w:szCs w:val="22"/>
+        </w:rPr>
+        <w:t xml:space="preserve">perceptual recalibration to /s/ or /ʃ/ </w:t>
+      </w:r>
+      <w:r>
+        <w:rPr>
+          <w:szCs w:val="22"/>
+        </w:rPr>
+        <w:t>has been found to be partially or completely</w:t>
+      </w:r>
+      <w:r>
+        <w:rPr>
+          <w:szCs w:val="22"/>
+        </w:rPr>
+        <w:t xml:space="preserve"> blocked </w:t>
+      </w:r>
+      <w:r>
+        <w:rPr>
+          <w:szCs w:val="22"/>
+        </w:rPr>
+        <w:t>if the talker has a pen in the mouth during the pronunciation of the shifted words (</w:t>
+      </w:r>
+      <w:r>
+        <w:rPr>
+          <w:szCs w:val="22"/>
+        </w:rPr>
+        <w:t xml:space="preserve">Kraljic et al., 2008; Kraljic &amp; Samuel, 2011; Liu &amp; Jaeger, 2018). </w:t>
+      </w:r>
+      <w:ins w:id="22" w:author="Jaeger, Florian" w:date="2025-05-22T16:59:00Z" w16du:dateUtc="2025-05-22T20:59:00Z">
+        <w:r>
+          <w:rPr>
+            <w:szCs w:val="22"/>
+          </w:rPr>
+          <w:t>Why this happens has</w:t>
+        </w:r>
+      </w:ins>
+      <w:ins w:id="23" w:author="Jaeger, Florian" w:date="2025-05-22T16:31:00Z" w16du:dateUtc="2025-05-22T20:31:00Z">
+        <w:r>
+          <w:rPr>
+            <w:szCs w:val="22"/>
+          </w:rPr>
+          <w:t xml:space="preserve"> remained a matter of theoretical debate</w:t>
+        </w:r>
+      </w:ins>
+      <w:ins w:id="24" w:author="Jaeger, Florian" w:date="2025-05-22T16:32:00Z" w16du:dateUtc="2025-05-22T20:32:00Z">
+        <w:r>
+          <w:rPr>
+            <w:szCs w:val="22"/>
+          </w:rPr>
+          <w:t xml:space="preserve">, </w:t>
+        </w:r>
+      </w:ins>
+      <w:ins w:id="25" w:author="Jaeger, Florian" w:date="2025-05-22T16:35:00Z" w16du:dateUtc="2025-05-22T20:35:00Z">
+        <w:r>
+          <w:rPr>
+            <w:szCs w:val="22"/>
+          </w:rPr>
+          <w:t>and</w:t>
+        </w:r>
+      </w:ins>
+      <w:ins w:id="26" w:author="Jaeger, Florian" w:date="2025-05-22T16:32:00Z" w16du:dateUtc="2025-05-22T20:32:00Z">
+        <w:r>
+          <w:rPr>
+            <w:szCs w:val="22"/>
+          </w:rPr>
+          <w:t xml:space="preserve"> </w:t>
+        </w:r>
+      </w:ins>
+      <w:del w:id="27" w:author="Jaeger, Florian" w:date="2025-05-22T16:32:00Z" w16du:dateUtc="2025-05-22T20:32:00Z">
+        <w:r>
+          <w:rPr>
+            <w:szCs w:val="22"/>
+          </w:rPr>
+          <w:delText xml:space="preserve">As we </w:delText>
+        </w:r>
+      </w:del>
+      <w:del w:id="28" w:author="Jaeger, Florian" w:date="2025-05-22T16:31:00Z" w16du:dateUtc="2025-05-22T20:31:00Z">
+        <w:r>
+          <w:rPr>
+            <w:szCs w:val="22"/>
+          </w:rPr>
+          <w:delText xml:space="preserve">detail </w:delText>
+        </w:r>
+      </w:del>
+      <w:del w:id="29" w:author="Jaeger, Florian" w:date="2025-05-22T16:32:00Z" w16du:dateUtc="2025-05-22T20:32:00Z">
+        <w:r>
+          <w:rPr>
+            <w:szCs w:val="22"/>
+          </w:rPr>
+          <w:delText>in the general discussion, different</w:delText>
+        </w:r>
+      </w:del>
+      <w:ins w:id="30" w:author="Jaeger, Florian" w:date="2025-05-22T16:32:00Z" w16du:dateUtc="2025-05-22T20:32:00Z">
+        <w:r>
+          <w:rPr>
+            <w:szCs w:val="22"/>
+          </w:rPr>
+          <w:t>competing proposals appeal to different</w:t>
+        </w:r>
+      </w:ins>
+      <w:r>
+        <w:rPr>
+          <w:szCs w:val="22"/>
+        </w:rPr>
+        <w:t xml:space="preserve"> learning and memory</w:t>
+      </w:r>
+      <w:del w:id="31" w:author="Jaeger, Florian" w:date="2025-05-22T16:32:00Z" w16du:dateUtc="2025-05-22T20:32:00Z">
+        <w:r>
+          <w:rPr>
+            <w:szCs w:val="22"/>
+          </w:rPr>
+          <w:delText xml:space="preserve"> </w:delText>
+        </w:r>
+      </w:del>
+      <w:ins w:id="32" w:author="Jaeger, Florian" w:date="2025-05-22T16:32:00Z" w16du:dateUtc="2025-05-22T20:32:00Z">
+        <w:r>
+          <w:rPr>
+            <w:szCs w:val="22"/>
+          </w:rPr>
+          <w:t xml:space="preserve"> mech</w:t>
+        </w:r>
+      </w:ins>
+      <w:ins w:id="33" w:author="Jaeger, Florian" w:date="2025-05-22T16:33:00Z" w16du:dateUtc="2025-05-22T20:33:00Z">
+        <w:r>
+          <w:rPr>
+            <w:szCs w:val="22"/>
+          </w:rPr>
+          <w:t>anisms</w:t>
+        </w:r>
+      </w:ins>
+      <w:del w:id="34" w:author="Jaeger, Florian" w:date="2025-05-22T16:32:00Z" w16du:dateUtc="2025-05-22T20:32:00Z">
+        <w:r>
+          <w:rPr>
+            <w:szCs w:val="22"/>
+          </w:rPr>
+          <w:delText>mechanisms have been evoked as explanation for this blocking</w:delText>
+        </w:r>
+      </w:del>
       <w:r>
         <w:rPr>
           <w:szCs w:val="22"/>
         </w:rPr>
         <w:t xml:space="preserve">. </w:t>
       </w:r>
-      <w:r>
-        <w:rPr>
-          <w:szCs w:val="22"/>
-        </w:rPr>
-        <w:t>Similar</w:t>
-      </w:r>
-      <w:r>
-        <w:rPr>
-          <w:szCs w:val="22"/>
-        </w:rPr>
-        <w:t xml:space="preserve"> </w:t>
-      </w:r>
-      <w:r>
-        <w:rPr>
-          <w:szCs w:val="22"/>
-        </w:rPr>
-        <w:t>has now been observed for</w:t>
-      </w:r>
-      <w:r>
-        <w:rPr>
-          <w:szCs w:val="22"/>
-        </w:rPr>
-        <w:t xml:space="preserve"> </w:t>
-      </w:r>
-      <w:r>
-        <w:rPr>
-          <w:szCs w:val="22"/>
-        </w:rPr>
-        <w:t>many</w:t>
-      </w:r>
-      <w:r>
-        <w:rPr>
-          <w:szCs w:val="22"/>
-        </w:rPr>
-        <w:t xml:space="preserve"> types of sound categories and languages (for reviews, see Samuel</w:t>
-      </w:r>
-      <w:r>
-        <w:rPr>
-          <w:szCs w:val="22"/>
-        </w:rPr>
-        <w:t xml:space="preserve"> &amp; Kraljic</w:t>
-      </w:r>
-      <w:r>
-        <w:rPr>
-          <w:szCs w:val="22"/>
-        </w:rPr>
-        <w:t>, 20</w:t>
-      </w:r>
-      <w:r>
-        <w:rPr>
-          <w:szCs w:val="22"/>
-        </w:rPr>
-        <w:t>09; Xie et al., 2023</w:t>
-      </w:r>
-      <w:r>
-        <w:rPr>
-          <w:szCs w:val="22"/>
-        </w:rPr>
-        <w:t>).</w:t>
-      </w:r>
-      <w:r>
-        <w:rPr>
-          <w:szCs w:val="22"/>
-        </w:rPr>
-        <w:t xml:space="preserve"> </w:t>
-      </w:r>
-      <w:r>
-        <w:rPr>
-          <w:szCs w:val="22"/>
-        </w:rPr>
-        <w:t>Intriguingly though</w:t>
-      </w:r>
-      <w:r>
-        <w:rPr>
-          <w:szCs w:val="22"/>
-        </w:rPr>
-        <w:t xml:space="preserve">, </w:t>
-      </w:r>
-      <w:r>
-        <w:rPr>
-          <w:szCs w:val="22"/>
-        </w:rPr>
-        <w:t xml:space="preserve">perceptual recalibration to /s/ or /ʃ/ </w:t>
-      </w:r>
-      <w:r>
-        <w:rPr>
-          <w:szCs w:val="22"/>
-        </w:rPr>
-        <w:t>has been found to be partially or completely</w:t>
-      </w:r>
-      <w:r>
-        <w:rPr>
-          <w:szCs w:val="22"/>
-        </w:rPr>
-        <w:t xml:space="preserve"> blocked </w:t>
-      </w:r>
-      <w:r>
-        <w:rPr>
-          <w:szCs w:val="22"/>
-        </w:rPr>
-        <w:t>if the talker has a pen in the mouth during the pronunciation of the shifted words (</w:t>
-      </w:r>
-      <w:r>
-        <w:rPr>
-          <w:szCs w:val="22"/>
-        </w:rPr>
-        <w:t>Kraljic et al., 2008; Kraljic &amp; Samuel, 2011; Liu &amp; Jaeger, 2018). As we detail in the general discussion, different learning and memory mechanisms have been evoked as explanation for this blocking</w:t>
-      </w:r>
-      <w:r>
-        <w:rPr>
-          <w:szCs w:val="22"/>
-        </w:rPr>
-        <w:t xml:space="preserve">. If, however, the pen in the mouth affects </w:t>
+      <w:ins w:id="35" w:author="Jaeger, Florian" w:date="2025-05-22T16:35:00Z" w16du:dateUtc="2025-05-22T20:35:00Z">
+        <w:r>
+          <w:rPr>
+            <w:szCs w:val="22"/>
+          </w:rPr>
+          <w:t xml:space="preserve">For instance, one hypothesis holds that listeners </w:t>
+        </w:r>
+      </w:ins>
+      <w:ins w:id="36" w:author="Jaeger, Florian" w:date="2025-05-22T16:40:00Z" w16du:dateUtc="2025-05-22T20:40:00Z">
+        <w:r>
+          <w:rPr>
+            <w:szCs w:val="22"/>
+          </w:rPr>
+          <w:t>store audio-visual ex</w:t>
+        </w:r>
+        <w:r>
+          <w:rPr>
+            <w:szCs w:val="22"/>
+          </w:rPr>
+          <w:t>e</w:t>
+        </w:r>
+        <w:r>
+          <w:rPr>
+            <w:szCs w:val="22"/>
+          </w:rPr>
+          <w:t xml:space="preserve">mplars </w:t>
+        </w:r>
+      </w:ins>
+      <w:ins w:id="37" w:author="Jaeger, Florian" w:date="2025-05-22T16:41:00Z" w16du:dateUtc="2025-05-22T20:41:00Z">
+        <w:r>
+          <w:rPr>
+            <w:szCs w:val="22"/>
+          </w:rPr>
+          <w:t xml:space="preserve">of the talker </w:t>
+        </w:r>
+      </w:ins>
+      <w:ins w:id="38" w:author="Jaeger, Florian" w:date="2025-05-22T16:40:00Z" w16du:dateUtc="2025-05-22T20:40:00Z">
+        <w:r>
+          <w:rPr>
+            <w:szCs w:val="22"/>
+          </w:rPr>
+          <w:t xml:space="preserve">with the </w:t>
+        </w:r>
+      </w:ins>
+      <w:ins w:id="39" w:author="Jaeger, Florian" w:date="2025-05-22T16:36:00Z" w16du:dateUtc="2025-05-22T20:36:00Z">
+        <w:r>
+          <w:rPr>
+            <w:szCs w:val="22"/>
+          </w:rPr>
+          <w:t xml:space="preserve">pen in the mouth </w:t>
+        </w:r>
+      </w:ins>
+      <w:ins w:id="40" w:author="Jaeger, Florian" w:date="2025-05-22T16:40:00Z" w16du:dateUtc="2025-05-22T20:40:00Z">
+        <w:r>
+          <w:rPr>
+            <w:szCs w:val="22"/>
+          </w:rPr>
+          <w:t xml:space="preserve">separately from </w:t>
+        </w:r>
+      </w:ins>
+      <w:ins w:id="41" w:author="Jaeger, Florian" w:date="2025-05-22T16:41:00Z" w16du:dateUtc="2025-05-22T20:41:00Z">
+        <w:r>
+          <w:rPr>
+            <w:szCs w:val="22"/>
+          </w:rPr>
+          <w:t xml:space="preserve">audio-visual </w:t>
+        </w:r>
+        <w:r>
+          <w:rPr>
+            <w:szCs w:val="22"/>
+          </w:rPr>
+          <w:t xml:space="preserve">exemplars with the pen in the hand, and </w:t>
+        </w:r>
+      </w:ins>
+      <w:ins w:id="42" w:author="Jaeger, Florian" w:date="2025-05-22T16:42:00Z" w16du:dateUtc="2025-05-22T20:42:00Z">
+        <w:r>
+          <w:rPr>
+            <w:szCs w:val="22"/>
+          </w:rPr>
+          <w:t>that only the latter type of exemplars affect</w:t>
+        </w:r>
+      </w:ins>
+      <w:ins w:id="43" w:author="Jaeger, Florian" w:date="2025-05-22T16:45:00Z" w16du:dateUtc="2025-05-22T20:45:00Z">
+        <w:r>
+          <w:rPr>
+            <w:szCs w:val="22"/>
+          </w:rPr>
+          <w:t>s</w:t>
+        </w:r>
+      </w:ins>
+      <w:ins w:id="44" w:author="Jaeger, Florian" w:date="2025-05-22T16:42:00Z" w16du:dateUtc="2025-05-22T20:42:00Z">
+        <w:r>
+          <w:rPr>
+            <w:szCs w:val="22"/>
+          </w:rPr>
+          <w:t xml:space="preserve"> listeners’ responses during </w:t>
+        </w:r>
+      </w:ins>
+      <w:ins w:id="45" w:author="Jaeger, Florian" w:date="2025-05-22T16:45:00Z" w16du:dateUtc="2025-05-22T20:45:00Z">
+        <w:r>
+          <w:rPr>
+            <w:szCs w:val="22"/>
+          </w:rPr>
+          <w:t xml:space="preserve">the </w:t>
+        </w:r>
+      </w:ins>
+      <w:ins w:id="46" w:author="Jaeger, Florian" w:date="2025-05-22T16:42:00Z" w16du:dateUtc="2025-05-22T20:42:00Z">
+        <w:r>
+          <w:rPr>
+            <w:szCs w:val="22"/>
+          </w:rPr>
+          <w:t xml:space="preserve">audio-only test phase </w:t>
+        </w:r>
+      </w:ins>
+      <w:ins w:id="47" w:author="Jaeger, Florian" w:date="2025-05-22T16:41:00Z" w16du:dateUtc="2025-05-22T20:41:00Z">
+        <w:r>
+          <w:rPr>
+            <w:szCs w:val="22"/>
+          </w:rPr>
+          <w:t>(</w:t>
+        </w:r>
+      </w:ins>
+      <w:ins w:id="48" w:author="Jaeger, Florian" w:date="2025-05-22T16:36:00Z" w16du:dateUtc="2025-05-22T20:36:00Z">
+        <w:r>
+          <w:rPr>
+            <w:szCs w:val="22"/>
+          </w:rPr>
+          <w:t>Kraljic &amp; Samuel, 20</w:t>
+        </w:r>
+      </w:ins>
+      <w:ins w:id="49" w:author="Jaeger, Florian" w:date="2025-05-22T16:41:00Z" w16du:dateUtc="2025-05-22T20:41:00Z">
+        <w:r>
+          <w:rPr>
+            <w:szCs w:val="22"/>
+          </w:rPr>
+          <w:t>11</w:t>
+        </w:r>
+      </w:ins>
+      <w:ins w:id="50" w:author="Jaeger, Florian" w:date="2025-05-22T16:46:00Z" w16du:dateUtc="2025-05-22T20:46:00Z">
+        <w:r>
+          <w:rPr>
+            <w:szCs w:val="22"/>
+          </w:rPr>
+          <w:t>). This is where the present study potentially becomes relevant: if</w:t>
+        </w:r>
+      </w:ins>
+      <w:del w:id="51" w:author="Jaeger, Florian" w:date="2025-05-22T16:46:00Z" w16du:dateUtc="2025-05-22T20:46:00Z">
+        <w:r>
+          <w:rPr>
+            <w:szCs w:val="22"/>
+          </w:rPr>
+          <w:delText>If, however,</w:delText>
+        </w:r>
+      </w:del>
+      <w:r>
+        <w:rPr>
+          <w:szCs w:val="22"/>
+        </w:rPr>
+        <w:t xml:space="preserve"> the pen in the mouth affects </w:t>
       </w:r>
       <w:r>
         <w:rPr>
@@ -2531,17 +2968,92 @@
         </w:rPr>
         <w:t xml:space="preserve"> </w:t>
       </w:r>
+      <w:ins w:id="52" w:author="Jaeger, Florian" w:date="2025-05-22T16:46:00Z" w16du:dateUtc="2025-05-22T20:46:00Z">
+        <w:r>
+          <w:rPr>
+            <w:szCs w:val="22"/>
+          </w:rPr>
+          <w:t>(</w:t>
+        </w:r>
+      </w:ins>
       <w:r>
         <w:rPr>
           <w:szCs w:val="22"/>
         </w:rPr>
         <w:t>through compensation</w:t>
       </w:r>
-      <w:r>
-        <w:rPr>
-          <w:szCs w:val="22"/>
-        </w:rPr>
-        <w:t>—as we test here—this would potentially preempt the need to appeal to learning or memory mechanisms to explain the</w:t>
+      <w:ins w:id="53" w:author="Jaeger, Florian" w:date="2025-05-22T16:46:00Z" w16du:dateUtc="2025-05-22T20:46:00Z">
+        <w:r>
+          <w:rPr>
+            <w:szCs w:val="22"/>
+          </w:rPr>
+          <w:t>)</w:t>
+        </w:r>
+      </w:ins>
+      <w:r>
+        <w:rPr>
+          <w:szCs w:val="22"/>
+        </w:rPr>
+        <w:t xml:space="preserve">—as we test here—this would potentially preempt the need to </w:t>
+      </w:r>
+      <w:r>
+        <w:rPr>
+          <w:szCs w:val="22"/>
+        </w:rPr>
+        <w:lastRenderedPageBreak/>
+        <w:t xml:space="preserve">appeal to </w:t>
+      </w:r>
+      <w:r>
+        <w:rPr>
+          <w:i/>
+          <w:iCs/>
+          <w:szCs w:val="22"/>
+          <w:rPrChange w:id="54" w:author="Jaeger, Florian" w:date="2025-05-22T16:59:00Z" w16du:dateUtc="2025-05-22T20:59:00Z">
+            <w:rPr>
+              <w:szCs w:val="22"/>
+            </w:rPr>
+          </w:rPrChange>
+        </w:rPr>
+        <w:t>learning</w:t>
+      </w:r>
+      <w:r>
+        <w:rPr>
+          <w:szCs w:val="22"/>
+        </w:rPr>
+        <w:t xml:space="preserve"> or </w:t>
+      </w:r>
+      <w:r>
+        <w:rPr>
+          <w:i/>
+          <w:iCs/>
+          <w:szCs w:val="22"/>
+          <w:rPrChange w:id="55" w:author="Jaeger, Florian" w:date="2025-05-22T17:00:00Z" w16du:dateUtc="2025-05-22T21:00:00Z">
+            <w:rPr>
+              <w:szCs w:val="22"/>
+            </w:rPr>
+          </w:rPrChange>
+        </w:rPr>
+        <w:t>memory</w:t>
+      </w:r>
+      <w:r>
+        <w:rPr>
+          <w:szCs w:val="22"/>
+        </w:rPr>
+        <w:t xml:space="preserve"> </w:t>
+      </w:r>
+      <w:del w:id="56" w:author="Jaeger, Florian" w:date="2025-05-22T17:00:00Z" w16du:dateUtc="2025-05-22T21:00:00Z">
+        <w:r>
+          <w:rPr>
+            <w:szCs w:val="22"/>
+          </w:rPr>
+          <w:delText xml:space="preserve">mechanisms </w:delText>
+        </w:r>
+      </w:del>
+      <w:r>
+        <w:rPr>
+          <w:szCs w:val="22"/>
+        </w:rPr>
+        <w:t>to explain the</w:t>
       </w:r>
       <w:r>
         <w:rPr>
@@ -2555,12 +3067,46 @@
         </w:rPr>
         <w:t xml:space="preserve"> </w:t>
       </w:r>
-      <w:r>
-        <w:rPr>
-          <w:szCs w:val="22"/>
-        </w:rPr>
-        <w:t>We return to this point below.</w:t>
-      </w:r>
+      <w:del w:id="57" w:author="Jaeger, Florian" w:date="2025-05-22T17:00:00Z" w16du:dateUtc="2025-05-22T21:00:00Z">
+        <w:r>
+          <w:rPr>
+            <w:szCs w:val="22"/>
+          </w:rPr>
+          <w:delText>We return to this point below.</w:delText>
+        </w:r>
+      </w:del>
+      <w:ins w:id="58" w:author="Jaeger, Florian" w:date="2025-05-22T17:00:00Z" w16du:dateUtc="2025-05-22T21:00:00Z">
+        <w:r>
+          <w:rPr>
+            <w:szCs w:val="22"/>
+          </w:rPr>
+          <w:t>We return to this point in the general discussion, where we also clarify why the design of perceptual recalibration experiment</w:t>
+        </w:r>
+      </w:ins>
+      <w:ins w:id="59" w:author="Jaeger, Florian" w:date="2025-05-22T17:01:00Z" w16du:dateUtc="2025-05-22T21:01:00Z">
+        <w:r>
+          <w:rPr>
+            <w:szCs w:val="22"/>
+          </w:rPr>
+          <w:t xml:space="preserve">s </w:t>
+        </w:r>
+      </w:ins>
+      <w:ins w:id="60" w:author="Jaeger, Florian" w:date="2025-05-22T17:03:00Z" w16du:dateUtc="2025-05-22T21:03:00Z">
+        <w:r>
+          <w:rPr>
+            <w:szCs w:val="22"/>
+          </w:rPr>
+          <w:t>is</w:t>
+        </w:r>
+      </w:ins>
+      <w:ins w:id="61" w:author="Jaeger, Florian" w:date="2025-05-22T17:01:00Z" w16du:dateUtc="2025-05-22T21:01:00Z">
+        <w:r>
+          <w:rPr>
+            <w:szCs w:val="22"/>
+          </w:rPr>
+          <w:t xml:space="preserve"> not suited (and, of course, was never meant) to address questions about compensation.</w:t>
+        </w:r>
+      </w:ins>
     </w:p>
     <w:p>
       <w:pPr>
@@ -2581,7 +3127,6 @@
           <w:sz w:val="22"/>
           <w:szCs w:val="22"/>
         </w:rPr>
-        <w:lastRenderedPageBreak/>
         <w:t>Open science statement</w:t>
       </w:r>
     </w:p>
@@ -2931,6 +3476,7 @@
           <w:sz w:val="22"/>
           <w:szCs w:val="22"/>
         </w:rPr>
+        <w:lastRenderedPageBreak/>
         <w:t>Aggregate Demographic Information About Participants</w:t>
       </w:r>
     </w:p>
@@ -2948,11 +3494,7 @@
         <w:t xml:space="preserve"> </w:t>
       </w:r>
       <w:r>
-        <w:t xml:space="preserve">information here. All demographic categories were based </w:t>
-      </w:r>
-      <w:r>
-        <w:lastRenderedPageBreak/>
-        <w:t>verbatim</w:t>
+        <w:t>information here. All demographic categories were based verbatim</w:t>
       </w:r>
       <w:r>
         <w:t xml:space="preserve"> </w:t>
@@ -3698,6 +4240,7 @@
         <w:rPr>
           <w:szCs w:val="22"/>
         </w:rPr>
+        <w:lastRenderedPageBreak/>
         <w:t>contrast.</w:t>
       </w:r>
       <w:r>
@@ -3723,7 +4266,6 @@
         <w:rPr>
           <w:noProof/>
         </w:rPr>
-        <w:lastRenderedPageBreak/>
         <w:drawing>
           <wp:anchor distT="0" distB="0" distL="114300" distR="114300" simplePos="0" relativeHeight="251671552" behindDoc="0" locked="0" layoutInCell="1" allowOverlap="1" wp14:anchorId="5DBEF848" wp14:editId="081CC111">
             <wp:simplePos x="0" y="0"/>
@@ -3840,7 +4382,7 @@
           <w:szCs w:val="22"/>
         </w:rPr>
       </w:pPr>
-      <w:bookmarkStart w:id="1" w:name="_Ref81579849"/>
+      <w:bookmarkStart w:id="77" w:name="_Ref81579849"/>
       <w:r>
         <w:rPr>
           <w:szCs w:val="22"/>
@@ -3879,7 +4421,7 @@
         </w:rPr>
         <w:fldChar w:fldCharType="end"/>
       </w:r>
-      <w:bookmarkEnd w:id="1"/>
+      <w:bookmarkEnd w:id="77"/>
       <w:r>
         <w:rPr>
           <w:szCs w:val="22"/>
@@ -4264,6 +4806,7 @@
         <w:rPr>
           <w:szCs w:val="22"/>
         </w:rPr>
+        <w:lastRenderedPageBreak/>
         <w:t>visual cues to /s/ and /ʃ/</w:t>
       </w:r>
       <w:r>
@@ -4282,14 +4825,7 @@
         <w:rPr>
           <w:szCs w:val="22"/>
         </w:rPr>
-        <w:t xml:space="preserve"> possibility </w:t>
-      </w:r>
-      <w:r>
-        <w:rPr>
-          <w:szCs w:val="22"/>
-        </w:rPr>
-        <w:lastRenderedPageBreak/>
-        <w:t>primarily for reasons of feasibility.</w:t>
+        <w:t xml:space="preserve"> possibility primarily for reasons of feasibility.</w:t>
       </w:r>
       <w:r>
         <w:rPr>
@@ -8066,7 +8602,7 @@
           <w:szCs w:val="22"/>
         </w:rPr>
       </w:pPr>
-      <w:bookmarkStart w:id="2" w:name="_Ref136088042"/>
+      <w:bookmarkStart w:id="78" w:name="_Ref136088042"/>
       <w:r>
         <w:t>T</w:t>
       </w:r>
@@ -8081,7 +8617,7 @@
           <w:t>1</w:t>
         </w:r>
       </w:fldSimple>
-      <w:bookmarkEnd w:id="2"/>
+      <w:bookmarkEnd w:id="78"/>
       <w:r>
         <w:tab/>
       </w:r>
@@ -8707,7 +9243,7 @@
                 <w:lang w:eastAsia="en-US"/>
               </w:rPr>
             </w:pPr>
-            <w:commentRangeStart w:id="3"/>
+            <w:commentRangeStart w:id="79"/>
             <w:r>
               <w:rPr>
                 <w:rFonts w:eastAsia="Times New Roman"/>
@@ -8716,12 +9252,12 @@
               </w:rPr>
               <w:t>2 (3.1%)</w:t>
             </w:r>
-            <w:commentRangeEnd w:id="3"/>
+            <w:commentRangeEnd w:id="79"/>
             <w:r>
               <w:rPr>
                 <w:rStyle w:val="CommentReference"/>
               </w:rPr>
-              <w:commentReference w:id="3"/>
+              <w:commentReference w:id="79"/>
             </w:r>
           </w:p>
         </w:tc>
@@ -8889,7 +9425,7 @@
                 <w:lang w:eastAsia="en-US"/>
               </w:rPr>
             </w:pPr>
-            <w:commentRangeStart w:id="4"/>
+            <w:commentRangeStart w:id="80"/>
             <w:r>
               <w:rPr>
                 <w:rFonts w:eastAsia="Times New Roman"/>
@@ -8898,12 +9434,12 @@
               </w:rPr>
               <w:t>3 (4.7%)</w:t>
             </w:r>
-            <w:commentRangeEnd w:id="4"/>
+            <w:commentRangeEnd w:id="80"/>
             <w:r>
               <w:rPr>
                 <w:rStyle w:val="CommentReference"/>
               </w:rPr>
-              <w:commentReference w:id="4"/>
+              <w:commentReference w:id="80"/>
             </w:r>
           </w:p>
         </w:tc>
@@ -9703,7 +10239,7 @@
               </w:rPr>
               <w:t>1 (1.6%)</w:t>
             </w:r>
-            <w:commentRangeStart w:id="5"/>
+            <w:commentRangeStart w:id="81"/>
           </w:p>
         </w:tc>
         <w:tc>
@@ -9839,12 +10375,12 @@
               </w:rPr>
               <w:t>-</w:t>
             </w:r>
-            <w:commentRangeEnd w:id="5"/>
+            <w:commentRangeEnd w:id="81"/>
             <w:r>
               <w:rPr>
                 <w:rStyle w:val="CommentReference"/>
               </w:rPr>
-              <w:commentReference w:id="5"/>
+              <w:commentReference w:id="81"/>
             </w:r>
           </w:p>
         </w:tc>
@@ -10724,27 +11260,27 @@
         </w:rPr>
         <w:t xml:space="preserve">the three design variables </w:t>
       </w:r>
-      <w:commentRangeStart w:id="6"/>
-      <w:commentRangeStart w:id="7"/>
+      <w:commentRangeStart w:id="82"/>
+      <w:commentRangeStart w:id="83"/>
       <w:r>
         <w:rPr>
           <w:szCs w:val="22"/>
         </w:rPr>
         <w:t>pen location</w:t>
       </w:r>
-      <w:commentRangeEnd w:id="6"/>
+      <w:commentRangeEnd w:id="82"/>
       <w:r>
         <w:rPr>
           <w:rStyle w:val="CommentReference"/>
         </w:rPr>
-        <w:commentReference w:id="6"/>
-      </w:r>
-      <w:commentRangeEnd w:id="7"/>
+        <w:commentReference w:id="82"/>
+      </w:r>
+      <w:commentRangeEnd w:id="83"/>
       <w:r>
         <w:rPr>
           <w:rStyle w:val="CommentReference"/>
         </w:rPr>
-        <w:commentReference w:id="7"/>
+        <w:commentReference w:id="83"/>
       </w:r>
       <w:r>
         <w:rPr>
@@ -11453,7 +11989,7 @@
           <w:docGrid w:linePitch="360"/>
         </w:sectPr>
       </w:pPr>
-      <w:bookmarkStart w:id="8" w:name="_Ref136190394"/>
+      <w:bookmarkStart w:id="84" w:name="_Ref136190394"/>
       <w:r>
         <w:rPr>
           <w:szCs w:val="22"/>
@@ -11498,7 +12034,7 @@
         </w:rPr>
         <w:fldChar w:fldCharType="end"/>
       </w:r>
-      <w:bookmarkEnd w:id="8"/>
+      <w:bookmarkEnd w:id="84"/>
       <w:r>
         <w:rPr>
           <w:szCs w:val="22"/>
@@ -11598,7 +12134,7 @@
       <w:pPr>
         <w:pStyle w:val="Caption"/>
       </w:pPr>
-      <w:bookmarkStart w:id="9" w:name="_Ref136190384"/>
+      <w:bookmarkStart w:id="85" w:name="_Ref136190384"/>
       <w:r>
         <w:rPr>
           <w:szCs w:val="22"/>
@@ -11638,7 +12174,7 @@
         </w:rPr>
         <w:fldChar w:fldCharType="end"/>
       </w:r>
-      <w:bookmarkEnd w:id="9"/>
+      <w:bookmarkEnd w:id="85"/>
       <w:r>
         <w:rPr>
           <w:szCs w:val="22"/>
@@ -16893,7 +17429,7 @@
           <w:szCs w:val="22"/>
         </w:rPr>
       </w:pPr>
-      <w:bookmarkStart w:id="10" w:name="_Ref136084921"/>
+      <w:bookmarkStart w:id="86" w:name="_Ref136084921"/>
       <w:r>
         <w:rPr>
           <w:szCs w:val="22"/>
@@ -16932,7 +17468,7 @@
         </w:rPr>
         <w:fldChar w:fldCharType="end"/>
       </w:r>
-      <w:bookmarkEnd w:id="10"/>
+      <w:bookmarkEnd w:id="86"/>
       <w:r>
         <w:rPr>
           <w:szCs w:val="22"/>
@@ -17838,7 +18374,7 @@
         </w:rPr>
         <w:t>After participant exclusions</w:t>
       </w:r>
-      <w:commentRangeStart w:id="11"/>
+      <w:commentRangeStart w:id="87"/>
       <w:r>
         <w:rPr>
           <w:szCs w:val="22"/>
@@ -17929,12 +18465,12 @@
         </w:rPr>
         <w:t>participants</w:t>
       </w:r>
-      <w:commentRangeEnd w:id="11"/>
+      <w:commentRangeEnd w:id="87"/>
       <w:r>
         <w:rPr>
           <w:rStyle w:val="CommentReference"/>
         </w:rPr>
-        <w:commentReference w:id="11"/>
+        <w:commentReference w:id="87"/>
       </w:r>
       <w:r>
         <w:rPr>
@@ -18436,7 +18972,7 @@
           <w:szCs w:val="22"/>
         </w:rPr>
       </w:pPr>
-      <w:bookmarkStart w:id="12" w:name="_Ref136190811"/>
+      <w:bookmarkStart w:id="88" w:name="_Ref136190811"/>
       <w:r>
         <w:rPr>
           <w:szCs w:val="22"/>
@@ -18475,7 +19011,7 @@
         </w:rPr>
         <w:fldChar w:fldCharType="end"/>
       </w:r>
-      <w:bookmarkEnd w:id="12"/>
+      <w:bookmarkEnd w:id="88"/>
       <w:r>
         <w:rPr>
           <w:szCs w:val="22"/>
@@ -18582,7 +19118,7 @@
       <w:pPr>
         <w:pStyle w:val="Caption"/>
       </w:pPr>
-      <w:bookmarkStart w:id="13" w:name="_Ref136190818"/>
+      <w:bookmarkStart w:id="89" w:name="_Ref136190818"/>
       <w:r>
         <w:rPr>
           <w:szCs w:val="22"/>
@@ -18622,7 +19158,7 @@
         </w:rPr>
         <w:fldChar w:fldCharType="end"/>
       </w:r>
-      <w:bookmarkEnd w:id="13"/>
+      <w:bookmarkEnd w:id="89"/>
       <w:r>
         <w:rPr>
           <w:szCs w:val="22"/>
@@ -21380,7 +21916,7 @@
     <w:p>
       <w:pPr>
         <w:rPr>
-          <w:ins w:id="14" w:author="Cummings, Shawn" w:date="2025-05-22T12:14:00Z" w16du:dateUtc="2025-05-22T16:14:00Z"/>
+          <w:ins w:id="90" w:author="Cummings, Shawn" w:date="2025-05-22T12:14:00Z" w16du:dateUtc="2025-05-22T16:14:00Z"/>
           <w:szCs w:val="22"/>
         </w:rPr>
       </w:pPr>
@@ -21465,7 +22001,7 @@
         </w:rPr>
         <w:t xml:space="preserve">the state of the articulators. </w:t>
       </w:r>
-      <w:ins w:id="15" w:author="Cummings, Shawn" w:date="2025-05-22T12:13:00Z" w16du:dateUtc="2025-05-22T16:13:00Z">
+      <w:ins w:id="91" w:author="Cummings, Shawn" w:date="2025-05-22T12:13:00Z" w16du:dateUtc="2025-05-22T16:13:00Z">
         <w:r>
           <w:rPr>
             <w:szCs w:val="22"/>
@@ -21473,7 +22009,7 @@
           <w:t>Of note, the proportion of participants who mentioned the pen in the free-response post-experiment survey was lower in experiment 2 (29.7%) compared to 1a-c (36.7%</w:t>
         </w:r>
       </w:ins>
-      <w:ins w:id="16" w:author="Cummings, Shawn" w:date="2025-05-22T12:19:00Z" w16du:dateUtc="2025-05-22T16:19:00Z">
+      <w:ins w:id="92" w:author="Cummings, Shawn" w:date="2025-05-22T12:19:00Z" w16du:dateUtc="2025-05-22T16:19:00Z">
         <w:r>
           <w:rPr>
             <w:szCs w:val="22"/>
@@ -21481,7 +22017,7 @@
           <w:t>; see SI for further details</w:t>
         </w:r>
       </w:ins>
-      <w:ins w:id="17" w:author="Cummings, Shawn" w:date="2025-05-22T12:13:00Z" w16du:dateUtc="2025-05-22T16:13:00Z">
+      <w:ins w:id="93" w:author="Cummings, Shawn" w:date="2025-05-22T12:13:00Z" w16du:dateUtc="2025-05-22T16:13:00Z">
         <w:r>
           <w:rPr>
             <w:szCs w:val="22"/>
@@ -21489,7 +22025,7 @@
           <w:t>). This is by no means a comprehensive check of attention to the pen or its position</w:t>
         </w:r>
       </w:ins>
-      <w:ins w:id="18" w:author="Cummings, Shawn" w:date="2025-05-22T12:16:00Z" w16du:dateUtc="2025-05-22T16:16:00Z">
+      <w:ins w:id="94" w:author="Cummings, Shawn" w:date="2025-05-22T12:16:00Z" w16du:dateUtc="2025-05-22T16:16:00Z">
         <w:r>
           <w:rPr>
             <w:szCs w:val="22"/>
@@ -21497,7 +22033,7 @@
           <w:t>. F</w:t>
         </w:r>
       </w:ins>
-      <w:ins w:id="19" w:author="Cummings, Shawn" w:date="2025-05-22T12:15:00Z" w16du:dateUtc="2025-05-22T16:15:00Z">
+      <w:ins w:id="95" w:author="Cummings, Shawn" w:date="2025-05-22T12:15:00Z" w16du:dateUtc="2025-05-22T16:15:00Z">
         <w:r>
           <w:rPr>
             <w:szCs w:val="22"/>
@@ -21505,7 +22041,7 @@
           <w:t>or example,</w:t>
         </w:r>
       </w:ins>
-      <w:ins w:id="20" w:author="Cummings, Shawn" w:date="2025-05-22T12:16:00Z" w16du:dateUtc="2025-05-22T16:16:00Z">
+      <w:ins w:id="96" w:author="Cummings, Shawn" w:date="2025-05-22T12:16:00Z" w16du:dateUtc="2025-05-22T16:16:00Z">
         <w:r>
           <w:rPr>
             <w:szCs w:val="22"/>
@@ -21513,7 +22049,7 @@
           <w:t xml:space="preserve"> this trend could emerge if </w:t>
         </w:r>
       </w:ins>
-      <w:ins w:id="21" w:author="Cummings, Shawn" w:date="2025-05-22T12:13:00Z" w16du:dateUtc="2025-05-22T16:13:00Z">
+      <w:ins w:id="97" w:author="Cummings, Shawn" w:date="2025-05-22T12:13:00Z" w16du:dateUtc="2025-05-22T16:13:00Z">
         <w:r>
           <w:rPr>
             <w:szCs w:val="22"/>
@@ -21525,7 +22061,7 @@
             <w:i/>
             <w:iCs/>
             <w:szCs w:val="22"/>
-            <w:rPrChange w:id="22" w:author="Cummings, Shawn" w:date="2025-05-22T12:15:00Z" w16du:dateUtc="2025-05-22T16:15:00Z">
+            <w:rPrChange w:id="98" w:author="Cummings, Shawn" w:date="2025-05-22T12:15:00Z" w16du:dateUtc="2025-05-22T16:15:00Z">
               <w:rPr>
                 <w:szCs w:val="22"/>
               </w:rPr>
@@ -21540,7 +22076,7 @@
           <w:t xml:space="preserve"> notice the pen</w:t>
         </w:r>
       </w:ins>
-      <w:ins w:id="23" w:author="Cummings, Shawn" w:date="2025-05-22T12:17:00Z" w16du:dateUtc="2025-05-22T16:17:00Z">
+      <w:ins w:id="99" w:author="Cummings, Shawn" w:date="2025-05-22T12:17:00Z" w16du:dateUtc="2025-05-22T16:17:00Z">
         <w:r>
           <w:rPr>
             <w:szCs w:val="22"/>
@@ -21548,7 +22084,7 @@
           <w:t>,</w:t>
         </w:r>
       </w:ins>
-      <w:ins w:id="24" w:author="Cummings, Shawn" w:date="2025-05-22T12:13:00Z" w16du:dateUtc="2025-05-22T16:13:00Z">
+      <w:ins w:id="100" w:author="Cummings, Shawn" w:date="2025-05-22T12:13:00Z" w16du:dateUtc="2025-05-22T16:13:00Z">
         <w:r>
           <w:rPr>
             <w:szCs w:val="22"/>
@@ -21556,7 +22092,7 @@
           <w:t xml:space="preserve"> but </w:t>
         </w:r>
       </w:ins>
-      <w:ins w:id="25" w:author="Cummings, Shawn" w:date="2025-05-22T12:17:00Z" w16du:dateUtc="2025-05-22T16:17:00Z">
+      <w:ins w:id="101" w:author="Cummings, Shawn" w:date="2025-05-22T12:17:00Z" w16du:dateUtc="2025-05-22T16:17:00Z">
         <w:r>
           <w:rPr>
             <w:szCs w:val="22"/>
@@ -21564,7 +22100,7 @@
           <w:t>became</w:t>
         </w:r>
       </w:ins>
-      <w:ins w:id="26" w:author="Cummings, Shawn" w:date="2025-05-22T12:16:00Z" w16du:dateUtc="2025-05-22T16:16:00Z">
+      <w:ins w:id="102" w:author="Cummings, Shawn" w:date="2025-05-22T12:16:00Z" w16du:dateUtc="2025-05-22T16:16:00Z">
         <w:r>
           <w:rPr>
             <w:szCs w:val="22"/>
@@ -21572,7 +22108,7 @@
           <w:t xml:space="preserve"> less likely to mention it under the “</w:t>
         </w:r>
       </w:ins>
-      <w:ins w:id="27" w:author="Cummings, Shawn" w:date="2025-05-22T12:16:00Z">
+      <w:ins w:id="103" w:author="Cummings, Shawn" w:date="2025-05-22T12:16:00Z">
         <w:r>
           <w:rPr>
             <w:szCs w:val="22"/>
@@ -21580,7 +22116,7 @@
           <w:t>Did you notice anything odd about the person in the video?</w:t>
         </w:r>
       </w:ins>
-      <w:ins w:id="28" w:author="Cummings, Shawn" w:date="2025-05-22T12:16:00Z" w16du:dateUtc="2025-05-22T16:16:00Z">
+      <w:ins w:id="104" w:author="Cummings, Shawn" w:date="2025-05-22T12:16:00Z" w16du:dateUtc="2025-05-22T16:16:00Z">
         <w:r>
           <w:rPr>
             <w:szCs w:val="22"/>
@@ -21588,7 +22124,7 @@
           <w:t>” prompt</w:t>
         </w:r>
       </w:ins>
-      <w:ins w:id="29" w:author="Cummings, Shawn" w:date="2025-05-22T12:17:00Z" w16du:dateUtc="2025-05-22T16:17:00Z">
+      <w:ins w:id="105" w:author="Cummings, Shawn" w:date="2025-05-22T12:17:00Z" w16du:dateUtc="2025-05-22T16:17:00Z">
         <w:r>
           <w:rPr>
             <w:szCs w:val="22"/>
@@ -21596,7 +22132,7 @@
           <w:t xml:space="preserve"> when other visually salient objects (the black box) were also apparent</w:t>
         </w:r>
       </w:ins>
-      <w:ins w:id="30" w:author="Cummings, Shawn" w:date="2025-05-22T12:16:00Z" w16du:dateUtc="2025-05-22T16:16:00Z">
+      <w:ins w:id="106" w:author="Cummings, Shawn" w:date="2025-05-22T12:16:00Z" w16du:dateUtc="2025-05-22T16:16:00Z">
         <w:r>
           <w:rPr>
             <w:szCs w:val="22"/>
@@ -21604,7 +22140,7 @@
           <w:t>. However,</w:t>
         </w:r>
       </w:ins>
-      <w:ins w:id="31" w:author="Cummings, Shawn" w:date="2025-05-22T12:17:00Z" w16du:dateUtc="2025-05-22T16:17:00Z">
+      <w:ins w:id="107" w:author="Cummings, Shawn" w:date="2025-05-22T12:17:00Z" w16du:dateUtc="2025-05-22T16:17:00Z">
         <w:r>
           <w:rPr>
             <w:szCs w:val="22"/>
@@ -21619,7 +22155,7 @@
           <w:t xml:space="preserve">it is also possible the occluder created </w:t>
         </w:r>
       </w:ins>
-      <w:ins w:id="32" w:author="Cummings, Shawn" w:date="2025-05-22T12:18:00Z" w16du:dateUtc="2025-05-22T16:18:00Z">
+      <w:ins w:id="108" w:author="Cummings, Shawn" w:date="2025-05-22T12:18:00Z" w16du:dateUtc="2025-05-22T16:18:00Z">
         <w:r>
           <w:rPr>
             <w:szCs w:val="22"/>
@@ -21627,7 +22163,7 @@
           <w:t>distraction during the task.</w:t>
         </w:r>
       </w:ins>
-      <w:ins w:id="33" w:author="Cummings, Shawn" w:date="2025-05-22T12:16:00Z" w16du:dateUtc="2025-05-22T16:16:00Z">
+      <w:ins w:id="109" w:author="Cummings, Shawn" w:date="2025-05-22T12:16:00Z" w16du:dateUtc="2025-05-22T16:16:00Z">
         <w:r>
           <w:rPr>
             <w:szCs w:val="22"/>
@@ -23094,7 +23630,7 @@
         </w:rPr>
         <w:t xml:space="preserve"> </w:t>
       </w:r>
-      <w:del w:id="34" w:author="Jaeger, Florian" w:date="2025-05-21T14:34:00Z" w16du:dateUtc="2025-05-21T18:34:00Z">
+      <w:del w:id="110" w:author="Jaeger, Florian" w:date="2025-05-21T14:34:00Z" w16du:dateUtc="2025-05-21T18:34:00Z">
         <w:r>
           <w:rPr>
             <w:szCs w:val="22"/>
@@ -23102,7 +23638,7 @@
           <w:delText xml:space="preserve">While some of these accounts (in particular the causal inference account) have conceptual similarities to compensation, </w:delText>
         </w:r>
       </w:del>
-      <w:del w:id="35" w:author="Jaeger, Florian" w:date="2025-05-21T14:33:00Z" w16du:dateUtc="2025-05-21T18:33:00Z">
+      <w:del w:id="111" w:author="Jaeger, Florian" w:date="2025-05-21T14:33:00Z" w16du:dateUtc="2025-05-21T18:33:00Z">
         <w:r>
           <w:rPr>
             <w:szCs w:val="22"/>
@@ -26304,7 +26840,7 @@
       </w:r>
     </w:p>
   </w:comment>
-  <w:comment w:id="3" w:author="Cummings, Shawn" w:date="2025-05-22T12:38:00Z" w:initials="SC">
+  <w:comment w:id="79" w:author="Cummings, Shawn" w:date="2025-05-22T12:38:00Z" w:initials="SC">
     <w:p>
       <w:pPr>
         <w:jc w:val="left"/>
@@ -26320,7 +26856,7 @@
       </w:r>
     </w:p>
   </w:comment>
-  <w:comment w:id="4" w:author="Cummings, Shawn" w:date="2025-05-22T12:37:00Z" w:initials="SC">
+  <w:comment w:id="80" w:author="Cummings, Shawn" w:date="2025-05-22T12:37:00Z" w:initials="SC">
     <w:p>
       <w:pPr>
         <w:jc w:val="left"/>
@@ -26336,7 +26872,7 @@
       </w:r>
     </w:p>
   </w:comment>
-  <w:comment w:id="5" w:author="Jaeger, Florian" w:date="2025-05-21T14:31:00Z" w:initials="TJ">
+  <w:comment w:id="81" w:author="Jaeger, Florian" w:date="2025-05-21T14:31:00Z" w:initials="TJ">
     <w:p>
       <w:pPr>
         <w:jc w:val="left"/>
@@ -26355,7 +26891,7 @@
       </w:r>
     </w:p>
   </w:comment>
-  <w:comment w:id="6" w:author="Jaeger, Florian" w:date="2025-05-11T16:19:00Z" w:initials="TJ">
+  <w:comment w:id="82" w:author="Jaeger, Florian" w:date="2025-05-11T16:19:00Z" w:initials="TJ">
     <w:p>
       <w:pPr>
         <w:jc w:val="left"/>
@@ -26385,7 +26921,7 @@
       </w:r>
     </w:p>
   </w:comment>
-  <w:comment w:id="7" w:author="Cummings, Shawn" w:date="2025-05-12T20:37:00Z" w:initials="SC">
+  <w:comment w:id="83" w:author="Cummings, Shawn" w:date="2025-05-12T20:37:00Z" w:initials="SC">
     <w:p>
       <w:pPr>
         <w:jc w:val="left"/>
@@ -26401,7 +26937,7 @@
       </w:r>
     </w:p>
   </w:comment>
-  <w:comment w:id="11" w:author="Jaeger, Florian" w:date="2025-05-22T14:47:00Z" w:initials="TJ">
+  <w:comment w:id="87" w:author="Jaeger, Florian" w:date="2025-05-22T14:47:00Z" w:initials="TJ">
     <w:p>
       <w:pPr>
         <w:jc w:val="left"/>
@@ -26777,25 +27313,87 @@
         <w:footnoteRef/>
       </w:r>
       <w:r>
-        <w:t xml:space="preserve"> We note that this is a different question</w:t>
-      </w:r>
-      <w:r>
-        <w:t>, and a different manipulation,</w:t>
+        <w:t xml:space="preserve"> </w:t>
+      </w:r>
+      <w:del w:id="62" w:author="Jaeger, Florian" w:date="2025-05-22T17:04:00Z" w16du:dateUtc="2025-05-22T21:04:00Z">
+        <w:r>
+          <w:delText>We n</w:delText>
+        </w:r>
+      </w:del>
+      <w:ins w:id="63" w:author="Jaeger, Florian" w:date="2025-05-22T17:04:00Z" w16du:dateUtc="2025-05-22T21:04:00Z">
+        <w:r>
+          <w:t>N</w:t>
+        </w:r>
+      </w:ins>
+      <w:r>
+        <w:t xml:space="preserve">ote that this is a </w:t>
+      </w:r>
+      <w:del w:id="64" w:author="Jaeger, Florian" w:date="2025-05-22T17:04:00Z" w16du:dateUtc="2025-05-22T21:04:00Z">
+        <w:r>
+          <w:delText>different question</w:delText>
+        </w:r>
+        <w:r>
+          <w:delText xml:space="preserve">, and a </w:delText>
+        </w:r>
+      </w:del>
+      <w:r>
+        <w:t>different manipulation,</w:t>
       </w:r>
       <w:r>
         <w:t xml:space="preserve"> than the one in previous research on perceptual recalibration</w:t>
       </w:r>
       <w:r>
-        <w:t xml:space="preserve"> including a pen in the mouth as</w:t>
-      </w:r>
-      <w:r>
-        <w:t xml:space="preserve"> described in the introduction. Those studies </w:t>
-      </w:r>
-      <w:r>
-        <w:rPr>
-          <w:szCs w:val="22"/>
-        </w:rPr>
-        <w:t xml:space="preserve">used audiovisual </w:t>
+        <w:t xml:space="preserve"> </w:t>
+      </w:r>
+      <w:del w:id="65" w:author="Jaeger, Florian" w:date="2025-05-22T17:05:00Z" w16du:dateUtc="2025-05-22T21:05:00Z">
+        <w:r>
+          <w:delText>including a pen in the mouth as</w:delText>
+        </w:r>
+        <w:r>
+          <w:delText xml:space="preserve"> </w:delText>
+        </w:r>
+      </w:del>
+      <w:r>
+        <w:t xml:space="preserve">described in the introduction. Those studies </w:t>
+      </w:r>
+      <w:ins w:id="66" w:author="Jaeger, Florian" w:date="2025-05-22T17:06:00Z" w16du:dateUtc="2025-05-22T21:06:00Z">
+        <w:r>
+          <w:t xml:space="preserve">assessed how listeners’ categorization responses during an </w:t>
+        </w:r>
+        <w:r>
+          <w:rPr>
+            <w:i/>
+            <w:iCs/>
+            <w:szCs w:val="22"/>
+          </w:rPr>
+          <w:t>audio-only</w:t>
+        </w:r>
+        <w:r>
+          <w:rPr>
+            <w:szCs w:val="22"/>
+          </w:rPr>
+          <w:t xml:space="preserve"> test phase</w:t>
+        </w:r>
+        <w:r>
+          <w:rPr>
+            <w:szCs w:val="22"/>
+          </w:rPr>
+          <w:t xml:space="preserve"> were affected by a preceding </w:t>
+        </w:r>
+      </w:ins>
+      <w:del w:id="67" w:author="Jaeger, Florian" w:date="2025-05-22T17:06:00Z" w16du:dateUtc="2025-05-22T21:06:00Z">
+        <w:r>
+          <w:rPr>
+            <w:szCs w:val="22"/>
+          </w:rPr>
+          <w:delText xml:space="preserve">used </w:delText>
+        </w:r>
+      </w:del>
+      <w:r>
+        <w:rPr>
+          <w:szCs w:val="22"/>
+        </w:rPr>
+        <w:t xml:space="preserve">audiovisual </w:t>
       </w:r>
       <w:r>
         <w:rPr>
@@ -26809,27 +27407,93 @@
         <w:rPr>
           <w:szCs w:val="22"/>
         </w:rPr>
-        <w:t xml:space="preserve"> inputs that manipulated pen placement (mouth vs. hand) to investigate how pen placement affects perceptual recalibration, as measured in a subsequent </w:t>
-      </w:r>
-      <w:r>
-        <w:rPr>
-          <w:i/>
-          <w:iCs/>
-          <w:szCs w:val="22"/>
-        </w:rPr>
-        <w:t>audio-only</w:t>
-      </w:r>
-      <w:r>
-        <w:rPr>
-          <w:szCs w:val="22"/>
-        </w:rPr>
-        <w:t xml:space="preserve"> test phase</w:t>
-      </w:r>
-      <w:r>
-        <w:rPr>
-          <w:szCs w:val="22"/>
-        </w:rPr>
-        <w:t xml:space="preserve"> (e.g., Kraljic et al., 2008)</w:t>
+        <w:t xml:space="preserve"> </w:t>
+      </w:r>
+      <w:del w:id="68" w:author="Jaeger, Florian" w:date="2025-05-22T17:06:00Z" w16du:dateUtc="2025-05-22T21:06:00Z">
+        <w:r>
+          <w:rPr>
+            <w:szCs w:val="22"/>
+          </w:rPr>
+          <w:delText xml:space="preserve">inputs </w:delText>
+        </w:r>
+      </w:del>
+      <w:ins w:id="69" w:author="Jaeger, Florian" w:date="2025-05-22T17:06:00Z" w16du:dateUtc="2025-05-22T21:06:00Z">
+        <w:r>
+          <w:rPr>
+            <w:szCs w:val="22"/>
+          </w:rPr>
+          <w:t>phase</w:t>
+        </w:r>
+        <w:r>
+          <w:rPr>
+            <w:szCs w:val="22"/>
+          </w:rPr>
+          <w:t xml:space="preserve"> </w:t>
+        </w:r>
+      </w:ins>
+      <w:r>
+        <w:rPr>
+          <w:szCs w:val="22"/>
+        </w:rPr>
+        <w:t>that manipulated pen placement</w:t>
+      </w:r>
+      <w:ins w:id="70" w:author="Jaeger, Florian" w:date="2025-05-22T17:08:00Z" w16du:dateUtc="2025-05-22T21:08:00Z">
+        <w:r>
+          <w:rPr>
+            <w:szCs w:val="22"/>
+          </w:rPr>
+          <w:t xml:space="preserve"> (no categorization responses were elicited during exposure</w:t>
+        </w:r>
+      </w:ins>
+      <w:del w:id="71" w:author="Jaeger, Florian" w:date="2025-05-22T17:08:00Z" w16du:dateUtc="2025-05-22T21:08:00Z">
+        <w:r>
+          <w:rPr>
+            <w:szCs w:val="22"/>
+          </w:rPr>
+          <w:delText xml:space="preserve"> </w:delText>
+        </w:r>
+      </w:del>
+      <w:del w:id="72" w:author="Jaeger, Florian" w:date="2025-05-22T17:07:00Z" w16du:dateUtc="2025-05-22T21:07:00Z">
+        <w:r>
+          <w:rPr>
+            <w:szCs w:val="22"/>
+          </w:rPr>
+          <w:delText xml:space="preserve">(mouth vs. hand) to investigate how pen placement affects perceptual recalibration, as measured in a subsequent </w:delText>
+        </w:r>
+        <w:r>
+          <w:rPr>
+            <w:i/>
+            <w:iCs/>
+            <w:szCs w:val="22"/>
+          </w:rPr>
+          <w:delText>audio-only</w:delText>
+        </w:r>
+        <w:r>
+          <w:rPr>
+            <w:szCs w:val="22"/>
+          </w:rPr>
+          <w:delText xml:space="preserve"> test phase</w:delText>
+        </w:r>
+        <w:r>
+          <w:rPr>
+            <w:szCs w:val="22"/>
+          </w:rPr>
+          <w:delText xml:space="preserve"> </w:delText>
+        </w:r>
+      </w:del>
+      <w:del w:id="73" w:author="Jaeger, Florian" w:date="2025-05-22T17:08:00Z" w16du:dateUtc="2025-05-22T21:08:00Z">
+        <w:r>
+          <w:rPr>
+            <w:szCs w:val="22"/>
+          </w:rPr>
+          <w:delText>(e.g., Kraljic et al., 2008</w:delText>
+        </w:r>
+      </w:del>
+      <w:r>
+        <w:rPr>
+          <w:szCs w:val="22"/>
+        </w:rPr>
+        <w:t>)</w:t>
       </w:r>
       <w:r>
         <w:rPr>
@@ -26841,7 +27505,49 @@
         <w:rPr>
           <w:szCs w:val="22"/>
         </w:rPr>
-        <w:t xml:space="preserve"> This leaves open how, and why, perception is affected </w:t>
+        <w:t xml:space="preserve"> </w:t>
+      </w:r>
+      <w:del w:id="74" w:author="Jaeger, Florian" w:date="2025-05-22T17:08:00Z" w16du:dateUtc="2025-05-22T21:08:00Z">
+        <w:r>
+          <w:rPr>
+            <w:szCs w:val="22"/>
+          </w:rPr>
+          <w:delText xml:space="preserve">This </w:delText>
+        </w:r>
+      </w:del>
+      <w:ins w:id="75" w:author="Jaeger, Florian" w:date="2025-05-22T17:08:00Z" w16du:dateUtc="2025-05-22T21:08:00Z">
+        <w:r>
+          <w:rPr>
+            <w:szCs w:val="22"/>
+          </w:rPr>
+          <w:t>Such designs</w:t>
+        </w:r>
+        <w:r>
+          <w:rPr>
+            <w:szCs w:val="22"/>
+          </w:rPr>
+          <w:t xml:space="preserve"> </w:t>
+        </w:r>
+      </w:ins>
+      <w:r>
+        <w:rPr>
+          <w:szCs w:val="22"/>
+        </w:rPr>
+        <w:t>leave</w:t>
+      </w:r>
+      <w:del w:id="76" w:author="Jaeger, Florian" w:date="2025-05-22T17:08:00Z" w16du:dateUtc="2025-05-22T21:08:00Z">
+        <w:r>
+          <w:rPr>
+            <w:szCs w:val="22"/>
+          </w:rPr>
+          <w:delText>s</w:delText>
+        </w:r>
+      </w:del>
+      <w:r>
+        <w:rPr>
+          <w:szCs w:val="22"/>
+        </w:rPr>
+        <w:t xml:space="preserve"> open how, and why, perception is affected </w:t>
       </w:r>
       <w:r>
         <w:rPr>
@@ -32887,7 +33593,7 @@
 </file>
 
 <file path=customXml/itemProps1.xml><?xml version="1.0" encoding="utf-8"?>
-<ds:datastoreItem xmlns:ds="http://schemas.openxmlformats.org/officeDocument/2006/customXml" ds:itemID="{CEAF82DD-8E2B-F442-854C-D22AA8B4402F}">
+<ds:datastoreItem xmlns:ds="http://schemas.openxmlformats.org/officeDocument/2006/customXml" ds:itemID="{B20ED14E-20BD-0342-A447-925FFA2C3804}">
   <ds:schemaRefs>
     <ds:schemaRef ds:uri="http://schemas.openxmlformats.org/officeDocument/2006/bibliography"/>
   </ds:schemaRefs>
@@ -32895,7 +33601,7 @@
 </file>
 
 <file path=customXml/itemProps2.xml><?xml version="1.0" encoding="utf-8"?>
-<ds:datastoreItem xmlns:ds="http://schemas.openxmlformats.org/officeDocument/2006/customXml" ds:itemID="{B20ED14E-20BD-0342-A447-925FFA2C3804}">
+<ds:datastoreItem xmlns:ds="http://schemas.openxmlformats.org/officeDocument/2006/customXml" ds:itemID="{CEAF82DD-8E2B-F442-854C-D22AA8B4402F}">
   <ds:schemaRefs>
     <ds:schemaRef ds:uri="http://schemas.openxmlformats.org/officeDocument/2006/bibliography"/>
   </ds:schemaRefs>

</xml_diff>

<commit_message>
updates to discussion of Exp 2
</commit_message>
<xml_diff>
--- a/output/papers/Round 2/manuscript-brief.docx
+++ b/output/papers/Round 2/manuscript-brief.docx
@@ -2397,13 +2397,7 @@
           <w:rPr>
             <w:szCs w:val="22"/>
           </w:rPr>
-          <w:t>exposure</w:t>
-        </w:r>
-        <w:r>
-          <w:rPr>
-            <w:szCs w:val="22"/>
-          </w:rPr>
-          <w:t xml:space="preserve"> </w:t>
+          <w:t xml:space="preserve">exposure </w:t>
         </w:r>
       </w:ins>
       <w:ins w:id="6" w:author="Jaeger, Florian" w:date="2025-05-22T16:44:00Z" w16du:dateUtc="2025-05-22T20:44:00Z">
@@ -2435,13 +2429,7 @@
           <w:rPr>
             <w:szCs w:val="22"/>
           </w:rPr>
-          <w:t>listeners’</w:t>
-        </w:r>
-        <w:r>
-          <w:rPr>
-            <w:szCs w:val="22"/>
-          </w:rPr>
-          <w:t xml:space="preserve"> </w:t>
+          <w:t xml:space="preserve">listeners’ </w:t>
         </w:r>
       </w:ins>
       <w:r>
@@ -2859,13 +2847,7 @@
           <w:rPr>
             <w:szCs w:val="22"/>
           </w:rPr>
-          <w:t xml:space="preserve">audio-visual </w:t>
-        </w:r>
-        <w:r>
-          <w:rPr>
-            <w:szCs w:val="22"/>
-          </w:rPr>
-          <w:t xml:space="preserve">exemplars with the pen in the hand, and </w:t>
+          <w:t xml:space="preserve">audio-visual exemplars with the pen in the hand, and </w:t>
         </w:r>
       </w:ins>
       <w:ins w:id="42" w:author="Jaeger, Florian" w:date="2025-05-22T16:42:00Z" w16du:dateUtc="2025-05-22T20:42:00Z">
@@ -22002,168 +21984,695 @@
         <w:t xml:space="preserve">the state of the articulators. </w:t>
       </w:r>
       <w:ins w:id="91" w:author="Cummings, Shawn" w:date="2025-05-22T12:13:00Z" w16du:dateUtc="2025-05-22T16:13:00Z">
+        <w:del w:id="92" w:author="Jaeger, Florian" w:date="2025-05-24T19:07:00Z" w16du:dateUtc="2025-05-24T23:07:00Z">
+          <w:r>
+            <w:rPr>
+              <w:szCs w:val="22"/>
+            </w:rPr>
+            <w:delText xml:space="preserve">Of note, the proportion of participants who mentioned the pen in the free-response post-experiment survey was </w:delText>
+          </w:r>
+        </w:del>
+        <w:del w:id="93" w:author="Jaeger, Florian" w:date="2025-05-24T19:04:00Z" w16du:dateUtc="2025-05-24T23:04:00Z">
+          <w:r>
+            <w:rPr>
+              <w:szCs w:val="22"/>
+            </w:rPr>
+            <w:delText>lower</w:delText>
+          </w:r>
+        </w:del>
+        <w:del w:id="94" w:author="Jaeger, Florian" w:date="2025-05-24T19:07:00Z" w16du:dateUtc="2025-05-24T23:07:00Z">
+          <w:r>
+            <w:rPr>
+              <w:szCs w:val="22"/>
+            </w:rPr>
+            <w:delText xml:space="preserve"> in </w:delText>
+          </w:r>
+        </w:del>
+        <w:del w:id="95" w:author="Jaeger, Florian" w:date="2025-05-24T19:04:00Z" w16du:dateUtc="2025-05-24T23:04:00Z">
+          <w:r>
+            <w:rPr>
+              <w:szCs w:val="22"/>
+            </w:rPr>
+            <w:delText>e</w:delText>
+          </w:r>
+        </w:del>
+        <w:del w:id="96" w:author="Jaeger, Florian" w:date="2025-05-24T19:07:00Z" w16du:dateUtc="2025-05-24T23:07:00Z">
+          <w:r>
+            <w:rPr>
+              <w:szCs w:val="22"/>
+            </w:rPr>
+            <w:delText>xperiment 2 (</w:delText>
+          </w:r>
+          <w:commentRangeStart w:id="97"/>
+          <w:r>
+            <w:rPr>
+              <w:szCs w:val="22"/>
+            </w:rPr>
+            <w:delText>29.7%) compared to 1</w:delText>
+          </w:r>
+        </w:del>
+        <w:del w:id="98" w:author="Jaeger, Florian" w:date="2025-05-24T19:05:00Z" w16du:dateUtc="2025-05-24T23:05:00Z">
+          <w:r>
+            <w:rPr>
+              <w:szCs w:val="22"/>
+            </w:rPr>
+            <w:delText>a-</w:delText>
+          </w:r>
+        </w:del>
+        <w:del w:id="99" w:author="Jaeger, Florian" w:date="2025-05-24T19:07:00Z" w16du:dateUtc="2025-05-24T23:07:00Z">
+          <w:r>
+            <w:rPr>
+              <w:szCs w:val="22"/>
+            </w:rPr>
+            <w:delText>c (36.7%</w:delText>
+          </w:r>
+        </w:del>
+      </w:ins>
+      <w:commentRangeEnd w:id="97"/>
+      <w:del w:id="100" w:author="Jaeger, Florian" w:date="2025-05-24T19:07:00Z" w16du:dateUtc="2025-05-24T23:07:00Z">
+        <w:r>
+          <w:rPr>
+            <w:rStyle w:val="CommentReference"/>
+          </w:rPr>
+          <w:commentReference w:id="97"/>
+        </w:r>
+      </w:del>
+      <w:ins w:id="101" w:author="Cummings, Shawn" w:date="2025-05-22T12:19:00Z" w16du:dateUtc="2025-05-22T16:19:00Z">
+        <w:del w:id="102" w:author="Jaeger, Florian" w:date="2025-05-24T19:07:00Z" w16du:dateUtc="2025-05-24T23:07:00Z">
+          <w:r>
+            <w:rPr>
+              <w:szCs w:val="22"/>
+            </w:rPr>
+            <w:delText>; see SI for further details</w:delText>
+          </w:r>
+        </w:del>
+      </w:ins>
+      <w:ins w:id="103" w:author="Cummings, Shawn" w:date="2025-05-22T12:13:00Z" w16du:dateUtc="2025-05-22T16:13:00Z">
+        <w:del w:id="104" w:author="Jaeger, Florian" w:date="2025-05-24T19:07:00Z" w16du:dateUtc="2025-05-24T23:07:00Z">
+          <w:r>
+            <w:rPr>
+              <w:szCs w:val="22"/>
+            </w:rPr>
+            <w:delText xml:space="preserve">). </w:delText>
+          </w:r>
+        </w:del>
+        <w:del w:id="105" w:author="Jaeger, Florian" w:date="2025-05-24T19:06:00Z" w16du:dateUtc="2025-05-24T23:06:00Z">
+          <w:r>
+            <w:rPr>
+              <w:szCs w:val="22"/>
+            </w:rPr>
+            <w:delText>This is by no means a comprehensive check of attention to the pen or its position</w:delText>
+          </w:r>
+        </w:del>
+      </w:ins>
+      <w:ins w:id="106" w:author="Cummings, Shawn" w:date="2025-05-22T12:16:00Z" w16du:dateUtc="2025-05-22T16:16:00Z">
+        <w:del w:id="107" w:author="Jaeger, Florian" w:date="2025-05-24T19:06:00Z" w16du:dateUtc="2025-05-24T23:06:00Z">
+          <w:r>
+            <w:rPr>
+              <w:szCs w:val="22"/>
+            </w:rPr>
+            <w:delText>. F</w:delText>
+          </w:r>
+        </w:del>
+      </w:ins>
+      <w:ins w:id="108" w:author="Cummings, Shawn" w:date="2025-05-22T12:15:00Z" w16du:dateUtc="2025-05-22T16:15:00Z">
+        <w:del w:id="109" w:author="Jaeger, Florian" w:date="2025-05-24T19:06:00Z" w16du:dateUtc="2025-05-24T23:06:00Z">
+          <w:r>
+            <w:rPr>
+              <w:szCs w:val="22"/>
+            </w:rPr>
+            <w:delText>or example,</w:delText>
+          </w:r>
+        </w:del>
+      </w:ins>
+      <w:ins w:id="110" w:author="Cummings, Shawn" w:date="2025-05-22T12:16:00Z" w16du:dateUtc="2025-05-22T16:16:00Z">
+        <w:del w:id="111" w:author="Jaeger, Florian" w:date="2025-05-24T19:06:00Z" w16du:dateUtc="2025-05-24T23:06:00Z">
+          <w:r>
+            <w:rPr>
+              <w:szCs w:val="22"/>
+            </w:rPr>
+            <w:delText xml:space="preserve"> this trend could emerge if </w:delText>
+          </w:r>
+        </w:del>
+      </w:ins>
+      <w:ins w:id="112" w:author="Cummings, Shawn" w:date="2025-05-22T12:13:00Z" w16du:dateUtc="2025-05-22T16:13:00Z">
+        <w:del w:id="113" w:author="Jaeger, Florian" w:date="2025-05-24T19:06:00Z" w16du:dateUtc="2025-05-24T23:06:00Z">
+          <w:r>
+            <w:rPr>
+              <w:szCs w:val="22"/>
+            </w:rPr>
+            <w:delText xml:space="preserve">listeners in experiment 2 </w:delText>
+          </w:r>
+          <w:r>
+            <w:rPr>
+              <w:i/>
+              <w:iCs/>
+              <w:szCs w:val="22"/>
+              <w:rPrChange w:id="114" w:author="Cummings, Shawn" w:date="2025-05-22T12:15:00Z" w16du:dateUtc="2025-05-22T16:15:00Z">
+                <w:rPr>
+                  <w:szCs w:val="22"/>
+                </w:rPr>
+              </w:rPrChange>
+            </w:rPr>
+            <w:delText>did</w:delText>
+          </w:r>
+          <w:r>
+            <w:rPr>
+              <w:szCs w:val="22"/>
+            </w:rPr>
+            <w:delText xml:space="preserve"> notice the pen</w:delText>
+          </w:r>
+        </w:del>
+      </w:ins>
+      <w:ins w:id="115" w:author="Cummings, Shawn" w:date="2025-05-22T12:17:00Z" w16du:dateUtc="2025-05-22T16:17:00Z">
+        <w:del w:id="116" w:author="Jaeger, Florian" w:date="2025-05-24T19:06:00Z" w16du:dateUtc="2025-05-24T23:06:00Z">
+          <w:r>
+            <w:rPr>
+              <w:szCs w:val="22"/>
+            </w:rPr>
+            <w:delText>,</w:delText>
+          </w:r>
+        </w:del>
+      </w:ins>
+      <w:ins w:id="117" w:author="Cummings, Shawn" w:date="2025-05-22T12:13:00Z" w16du:dateUtc="2025-05-22T16:13:00Z">
+        <w:del w:id="118" w:author="Jaeger, Florian" w:date="2025-05-24T19:06:00Z" w16du:dateUtc="2025-05-24T23:06:00Z">
+          <w:r>
+            <w:rPr>
+              <w:szCs w:val="22"/>
+            </w:rPr>
+            <w:delText xml:space="preserve"> but </w:delText>
+          </w:r>
+        </w:del>
+      </w:ins>
+      <w:ins w:id="119" w:author="Cummings, Shawn" w:date="2025-05-22T12:17:00Z" w16du:dateUtc="2025-05-22T16:17:00Z">
+        <w:del w:id="120" w:author="Jaeger, Florian" w:date="2025-05-24T19:06:00Z" w16du:dateUtc="2025-05-24T23:06:00Z">
+          <w:r>
+            <w:rPr>
+              <w:szCs w:val="22"/>
+            </w:rPr>
+            <w:delText>became</w:delText>
+          </w:r>
+        </w:del>
+      </w:ins>
+      <w:ins w:id="121" w:author="Cummings, Shawn" w:date="2025-05-22T12:16:00Z" w16du:dateUtc="2025-05-22T16:16:00Z">
+        <w:del w:id="122" w:author="Jaeger, Florian" w:date="2025-05-24T19:06:00Z" w16du:dateUtc="2025-05-24T23:06:00Z">
+          <w:r>
+            <w:rPr>
+              <w:szCs w:val="22"/>
+            </w:rPr>
+            <w:delText xml:space="preserve"> less likely to mention it under the “</w:delText>
+          </w:r>
+        </w:del>
+      </w:ins>
+      <w:ins w:id="123" w:author="Cummings, Shawn" w:date="2025-05-22T12:16:00Z">
+        <w:del w:id="124" w:author="Jaeger, Florian" w:date="2025-05-24T19:06:00Z" w16du:dateUtc="2025-05-24T23:06:00Z">
+          <w:r>
+            <w:rPr>
+              <w:szCs w:val="22"/>
+            </w:rPr>
+            <w:delText>Did you notice anything odd about the person in the video?</w:delText>
+          </w:r>
+        </w:del>
+      </w:ins>
+      <w:ins w:id="125" w:author="Cummings, Shawn" w:date="2025-05-22T12:16:00Z" w16du:dateUtc="2025-05-22T16:16:00Z">
+        <w:del w:id="126" w:author="Jaeger, Florian" w:date="2025-05-24T19:06:00Z" w16du:dateUtc="2025-05-24T23:06:00Z">
+          <w:r>
+            <w:rPr>
+              <w:szCs w:val="22"/>
+            </w:rPr>
+            <w:delText>” prompt</w:delText>
+          </w:r>
+        </w:del>
+      </w:ins>
+      <w:ins w:id="127" w:author="Cummings, Shawn" w:date="2025-05-22T12:17:00Z" w16du:dateUtc="2025-05-22T16:17:00Z">
+        <w:del w:id="128" w:author="Jaeger, Florian" w:date="2025-05-24T19:06:00Z" w16du:dateUtc="2025-05-24T23:06:00Z">
+          <w:r>
+            <w:rPr>
+              <w:szCs w:val="22"/>
+            </w:rPr>
+            <w:delText xml:space="preserve"> when other visually salient objects (the black box) were also apparent</w:delText>
+          </w:r>
+        </w:del>
+      </w:ins>
+      <w:ins w:id="129" w:author="Cummings, Shawn" w:date="2025-05-22T12:16:00Z" w16du:dateUtc="2025-05-22T16:16:00Z">
+        <w:del w:id="130" w:author="Jaeger, Florian" w:date="2025-05-24T19:06:00Z" w16du:dateUtc="2025-05-24T23:06:00Z">
+          <w:r>
+            <w:rPr>
+              <w:szCs w:val="22"/>
+            </w:rPr>
+            <w:delText>. However,</w:delText>
+          </w:r>
+        </w:del>
+      </w:ins>
+      <w:ins w:id="131" w:author="Cummings, Shawn" w:date="2025-05-22T12:17:00Z" w16du:dateUtc="2025-05-22T16:17:00Z">
+        <w:del w:id="132" w:author="Jaeger, Florian" w:date="2025-05-24T19:06:00Z" w16du:dateUtc="2025-05-24T23:06:00Z">
+          <w:r>
+            <w:rPr>
+              <w:szCs w:val="22"/>
+            </w:rPr>
+            <w:delText xml:space="preserve"> it is also possible the occluder created </w:delText>
+          </w:r>
+        </w:del>
+      </w:ins>
+      <w:ins w:id="133" w:author="Cummings, Shawn" w:date="2025-05-22T12:18:00Z" w16du:dateUtc="2025-05-22T16:18:00Z">
+        <w:del w:id="134" w:author="Jaeger, Florian" w:date="2025-05-24T19:06:00Z" w16du:dateUtc="2025-05-24T23:06:00Z">
+          <w:r>
+            <w:rPr>
+              <w:szCs w:val="22"/>
+            </w:rPr>
+            <w:delText>distraction during the task.</w:delText>
+          </w:r>
+        </w:del>
+      </w:ins>
+      <w:ins w:id="135" w:author="Cummings, Shawn" w:date="2025-05-22T12:16:00Z" w16du:dateUtc="2025-05-22T16:16:00Z">
+        <w:del w:id="136" w:author="Jaeger, Florian" w:date="2025-05-24T19:06:00Z" w16du:dateUtc="2025-05-24T23:06:00Z">
+          <w:r>
+            <w:rPr>
+              <w:szCs w:val="22"/>
+            </w:rPr>
+            <w:delText xml:space="preserve"> </w:delText>
+          </w:r>
+        </w:del>
+      </w:ins>
+      <w:r>
+        <w:rPr>
+          <w:szCs w:val="22"/>
+        </w:rPr>
+        <w:t>Here we briefly discuss</w:t>
+      </w:r>
+      <w:r>
+        <w:rPr>
+          <w:szCs w:val="22"/>
+        </w:rPr>
+        <w:t xml:space="preserve"> two possibilities</w:t>
+      </w:r>
+      <w:r>
+        <w:rPr>
+          <w:szCs w:val="22"/>
+        </w:rPr>
+        <w:t xml:space="preserve"> </w:t>
+      </w:r>
+      <w:r>
+        <w:rPr>
+          <w:szCs w:val="22"/>
+        </w:rPr>
+        <w:t>that might require attention in future research</w:t>
+      </w:r>
+      <w:r>
+        <w:rPr>
+          <w:szCs w:val="22"/>
+        </w:rPr>
+        <w:t xml:space="preserve">. </w:t>
+      </w:r>
+    </w:p>
+    <w:p>
+      <w:pPr>
+        <w:rPr>
+          <w:szCs w:val="22"/>
+        </w:rPr>
+      </w:pPr>
+      <w:r>
+        <w:rPr>
+          <w:szCs w:val="22"/>
+        </w:rPr>
+        <w:t>First,</w:t>
+      </w:r>
+      <w:r>
+        <w:rPr>
+          <w:szCs w:val="22"/>
+        </w:rPr>
+        <w:t xml:space="preserve"> </w:t>
+      </w:r>
+      <w:r>
+        <w:rPr>
+          <w:szCs w:val="22"/>
+        </w:rPr>
+        <w:t>the black occluder box might distract participants from the primary task, which could</w:t>
+      </w:r>
+      <w:r>
+        <w:rPr>
+          <w:szCs w:val="22"/>
+        </w:rPr>
+        <w:t xml:space="preserve"> interrupt the cognitive process underlying compensation. </w:t>
+      </w:r>
+      <w:r>
+        <w:rPr>
+          <w:szCs w:val="22"/>
+        </w:rPr>
+        <w:t xml:space="preserve">While we cannot conclusively rule out this possibility, we consider it unlikely for </w:t>
+      </w:r>
+      <w:proofErr w:type="gramStart"/>
+      <w:r>
+        <w:rPr>
+          <w:szCs w:val="22"/>
+        </w:rPr>
+        <w:t>a</w:t>
+      </w:r>
+      <w:r>
+        <w:rPr>
+          <w:szCs w:val="22"/>
+        </w:rPr>
+        <w:t xml:space="preserve"> number of</w:t>
+      </w:r>
+      <w:proofErr w:type="gramEnd"/>
+      <w:r>
+        <w:rPr>
+          <w:szCs w:val="22"/>
+        </w:rPr>
+        <w:t xml:space="preserve"> </w:t>
+      </w:r>
+      <w:r>
+        <w:rPr>
+          <w:szCs w:val="22"/>
+        </w:rPr>
+        <w:t>reasons</w:t>
+      </w:r>
+      <w:r>
+        <w:rPr>
+          <w:szCs w:val="22"/>
+        </w:rPr>
+        <w:t xml:space="preserve">. </w:t>
+      </w:r>
+      <w:r>
+        <w:rPr>
+          <w:szCs w:val="22"/>
+        </w:rPr>
+        <w:t>Compared to Experiments 1a-c, l</w:t>
+      </w:r>
+      <w:r>
+        <w:rPr>
+          <w:szCs w:val="22"/>
+        </w:rPr>
+        <w:t xml:space="preserve">isteners in </w:t>
+      </w:r>
+      <w:r>
+        <w:rPr>
+          <w:szCs w:val="22"/>
+        </w:rPr>
+        <w:t>E</w:t>
+      </w:r>
+      <w:r>
+        <w:rPr>
+          <w:szCs w:val="22"/>
+        </w:rPr>
+        <w:t xml:space="preserve">xperiment 2 demonstrated </w:t>
+      </w:r>
+      <w:r>
+        <w:rPr>
+          <w:szCs w:val="22"/>
+        </w:rPr>
+        <w:t xml:space="preserve">about the same—in fact, </w:t>
+      </w:r>
+      <w:r>
+        <w:rPr>
+          <w:szCs w:val="22"/>
+        </w:rPr>
+        <w:t xml:space="preserve">numerically </w:t>
+      </w:r>
+      <w:r>
+        <w:rPr>
+          <w:szCs w:val="22"/>
+        </w:rPr>
+        <w:t>somewhat greater—</w:t>
+      </w:r>
+      <w:r>
+        <w:rPr>
+          <w:szCs w:val="22"/>
+        </w:rPr>
+        <w:lastRenderedPageBreak/>
+        <w:t xml:space="preserve">sensitivity to the acoustic continuum </w:t>
+      </w:r>
+      <w:r>
+        <w:rPr>
+          <w:szCs w:val="22"/>
+        </w:rPr>
+        <w:t xml:space="preserve">(see </w:t>
+      </w:r>
+      <w:r>
+        <w:rPr>
+          <w:szCs w:val="22"/>
+        </w:rPr>
+        <w:fldChar w:fldCharType="begin"/>
+      </w:r>
+      <w:r>
+        <w:rPr>
+          <w:szCs w:val="22"/>
+        </w:rPr>
+        <w:instrText xml:space="preserve"> REF _Ref136190811 \h </w:instrText>
+      </w:r>
+      <w:r>
+        <w:rPr>
+          <w:szCs w:val="22"/>
+        </w:rPr>
+      </w:r>
+      <w:r>
+        <w:rPr>
+          <w:szCs w:val="22"/>
+        </w:rPr>
+        <w:fldChar w:fldCharType="separate"/>
+      </w:r>
+      <w:r>
+        <w:rPr>
+          <w:szCs w:val="22"/>
+        </w:rPr>
+        <w:t xml:space="preserve">Figure </w:t>
+      </w:r>
+      <w:r>
+        <w:rPr>
+          <w:noProof/>
+          <w:szCs w:val="22"/>
+        </w:rPr>
+        <w:t>4</w:t>
+      </w:r>
+      <w:r>
+        <w:rPr>
+          <w:szCs w:val="22"/>
+        </w:rPr>
+        <w:fldChar w:fldCharType="end"/>
+      </w:r>
+      <w:r>
+        <w:rPr>
+          <w:szCs w:val="22"/>
+        </w:rPr>
+        <w:t>A)</w:t>
+      </w:r>
+      <w:r>
+        <w:rPr>
+          <w:szCs w:val="22"/>
+        </w:rPr>
+        <w:t>, speaking against a higher proportion of attentional lapses or random guesses. Along a similar vein, average reaction time</w:t>
+      </w:r>
+      <w:r>
+        <w:rPr>
+          <w:szCs w:val="22"/>
+        </w:rPr>
+        <w:t>s</w:t>
+      </w:r>
+      <w:r>
+        <w:rPr>
+          <w:szCs w:val="22"/>
+        </w:rPr>
+        <w:t xml:space="preserve"> w</w:t>
+      </w:r>
+      <w:r>
+        <w:rPr>
+          <w:szCs w:val="22"/>
+        </w:rPr>
+        <w:t>ere</w:t>
+      </w:r>
+      <w:r>
+        <w:rPr>
+          <w:szCs w:val="22"/>
+        </w:rPr>
+        <w:t xml:space="preserve"> not significantly higher in Experiment 2</w:t>
+      </w:r>
+      <w:r>
+        <w:rPr>
+          <w:szCs w:val="22"/>
+        </w:rPr>
+        <w:t xml:space="preserve"> (mean log-RT = </w:t>
+      </w:r>
+      <w:r>
+        <w:rPr>
+          <w:szCs w:val="22"/>
+        </w:rPr>
+        <w:t>3.45</w:t>
+      </w:r>
+      <w:r>
+        <w:rPr>
+          <w:szCs w:val="22"/>
+        </w:rPr>
+        <w:t xml:space="preserve">, SD = </w:t>
+      </w:r>
+      <w:r>
+        <w:rPr>
+          <w:szCs w:val="22"/>
+        </w:rPr>
+        <w:t>0.14</w:t>
+      </w:r>
+      <w:r>
+        <w:rPr>
+          <w:szCs w:val="22"/>
+        </w:rPr>
+        <w:t xml:space="preserve">), compared to Experiments 1a-c (mean = </w:t>
+      </w:r>
+      <w:r>
+        <w:rPr>
+          <w:szCs w:val="22"/>
+        </w:rPr>
+        <w:t>3.44</w:t>
+      </w:r>
+      <w:r>
+        <w:rPr>
+          <w:szCs w:val="22"/>
+        </w:rPr>
+        <w:t xml:space="preserve">, SD = </w:t>
+      </w:r>
+      <w:r>
+        <w:rPr>
+          <w:szCs w:val="22"/>
+        </w:rPr>
+        <w:t>0.15</w:t>
+      </w:r>
+      <w:r>
+        <w:rPr>
+          <w:szCs w:val="22"/>
+        </w:rPr>
+        <w:t>)</w:t>
+      </w:r>
+      <w:r>
+        <w:rPr>
+          <w:szCs w:val="22"/>
+        </w:rPr>
+        <w:t xml:space="preserve">. Finally, while the black box </w:t>
+      </w:r>
+      <w:r>
+        <w:rPr>
+          <w:szCs w:val="22"/>
+        </w:rPr>
+        <w:t>might have been</w:t>
+      </w:r>
+      <w:r>
+        <w:rPr>
+          <w:szCs w:val="22"/>
+        </w:rPr>
+        <w:t xml:space="preserve"> initially surprising to listeners, it appeared very predictably at </w:t>
+      </w:r>
+      <w:r>
+        <w:rPr>
+          <w:szCs w:val="22"/>
+        </w:rPr>
+        <w:t xml:space="preserve">approximately </w:t>
+      </w:r>
+      <w:r>
+        <w:rPr>
+          <w:szCs w:val="22"/>
+        </w:rPr>
+        <w:t xml:space="preserve">the same point in each of the 72 </w:t>
+      </w:r>
+      <w:r>
+        <w:rPr>
+          <w:szCs w:val="22"/>
+        </w:rPr>
+        <w:t xml:space="preserve">video </w:t>
+      </w:r>
+      <w:r>
+        <w:rPr>
+          <w:szCs w:val="22"/>
+        </w:rPr>
+        <w:t xml:space="preserve">trials. Thus, any initial distraction would likely atrophy over the course of testing. Analyses reported in the SI confirm that no effects emerged or interacted with testing block. </w:t>
+      </w:r>
+    </w:p>
+    <w:p>
+      <w:pPr>
+        <w:rPr>
+          <w:szCs w:val="22"/>
+        </w:rPr>
+      </w:pPr>
+      <w:r>
+        <w:rPr>
+          <w:szCs w:val="22"/>
+        </w:rPr>
+        <w:t>A second alternative is that while the presence of the pen itself—rather than its impact on the articulators—may be sufficient to induce compensation, the black box made</w:t>
+      </w:r>
+      <w:r>
+        <w:rPr>
+          <w:szCs w:val="22"/>
+        </w:rPr>
+        <w:t xml:space="preserve"> </w:t>
+      </w:r>
+      <w:r>
+        <w:rPr>
+          <w:szCs w:val="22"/>
+        </w:rPr>
+        <w:t>the location of the pen</w:t>
+      </w:r>
+      <w:r>
+        <w:rPr>
+          <w:szCs w:val="22"/>
+        </w:rPr>
+        <w:t xml:space="preserve"> less obvious and harder to visually access. </w:t>
+      </w:r>
+      <w:ins w:id="137" w:author="Jaeger, Florian" w:date="2025-05-24T19:08:00Z" w16du:dateUtc="2025-05-24T23:08:00Z">
         <w:r>
           <w:rPr>
             <w:szCs w:val="22"/>
           </w:rPr>
-          <w:t>Of note, the proportion of participants who mentioned the pen in the free-response post-experiment survey was lower in experiment 2 (29.7%) compared to 1a-c (36.7%</w:t>
+          <w:t>The exit surv</w:t>
         </w:r>
       </w:ins>
-      <w:ins w:id="92" w:author="Cummings, Shawn" w:date="2025-05-22T12:19:00Z" w16du:dateUtc="2025-05-22T16:19:00Z">
+      <w:ins w:id="138" w:author="Jaeger, Florian" w:date="2025-05-24T19:09:00Z" w16du:dateUtc="2025-05-24T23:09:00Z">
         <w:r>
           <w:rPr>
             <w:szCs w:val="22"/>
           </w:rPr>
-          <w:t>; see SI for further details</w:t>
+          <w:t>ey ameliorates this concern:</w:t>
         </w:r>
-      </w:ins>
-      <w:ins w:id="93" w:author="Cummings, Shawn" w:date="2025-05-22T12:13:00Z" w16du:dateUtc="2025-05-22T16:13:00Z">
         <w:r>
           <w:rPr>
             <w:szCs w:val="22"/>
           </w:rPr>
-          <w:t>). This is by no means a comprehensive check of attention to the pen or its position</w:t>
-        </w:r>
-      </w:ins>
-      <w:ins w:id="94" w:author="Cummings, Shawn" w:date="2025-05-22T12:16:00Z" w16du:dateUtc="2025-05-22T16:16:00Z">
-        <w:r>
-          <w:rPr>
-            <w:szCs w:val="22"/>
-          </w:rPr>
-          <w:t>. F</w:t>
-        </w:r>
-      </w:ins>
-      <w:ins w:id="95" w:author="Cummings, Shawn" w:date="2025-05-22T12:15:00Z" w16du:dateUtc="2025-05-22T16:15:00Z">
-        <w:r>
-          <w:rPr>
-            <w:szCs w:val="22"/>
-          </w:rPr>
-          <w:t>or example,</w:t>
-        </w:r>
-      </w:ins>
-      <w:ins w:id="96" w:author="Cummings, Shawn" w:date="2025-05-22T12:16:00Z" w16du:dateUtc="2025-05-22T16:16:00Z">
-        <w:r>
-          <w:rPr>
-            <w:szCs w:val="22"/>
-          </w:rPr>
-          <w:t xml:space="preserve"> this trend could emerge if </w:t>
-        </w:r>
-      </w:ins>
-      <w:ins w:id="97" w:author="Cummings, Shawn" w:date="2025-05-22T12:13:00Z" w16du:dateUtc="2025-05-22T16:13:00Z">
-        <w:r>
-          <w:rPr>
-            <w:szCs w:val="22"/>
-          </w:rPr>
-          <w:t xml:space="preserve">listeners in experiment 2 </w:t>
+          <w:t xml:space="preserve"> the proportion of participants who mentioned the pen in the free-response post-experiment survey was about the same, and numerically </w:t>
         </w:r>
         <w:r>
           <w:rPr>
             <w:i/>
             <w:iCs/>
             <w:szCs w:val="22"/>
-            <w:rPrChange w:id="98" w:author="Cummings, Shawn" w:date="2025-05-22T12:15:00Z" w16du:dateUtc="2025-05-22T16:15:00Z">
+            <w:rPrChange w:id="139" w:author="Jaeger, Florian" w:date="2025-05-24T19:09:00Z" w16du:dateUtc="2025-05-24T23:09:00Z">
               <w:rPr>
                 <w:szCs w:val="22"/>
               </w:rPr>
             </w:rPrChange>
           </w:rPr>
-          <w:t>did</w:t>
+          <w:t>higher</w:t>
         </w:r>
         <w:r>
           <w:rPr>
             <w:szCs w:val="22"/>
           </w:rPr>
-          <w:t xml:space="preserve"> notice the pen</w:t>
+          <w:t>, in Experiment 2 (</w:t>
         </w:r>
-      </w:ins>
-      <w:ins w:id="99" w:author="Cummings, Shawn" w:date="2025-05-22T12:17:00Z" w16du:dateUtc="2025-05-22T16:17:00Z">
+        <w:commentRangeStart w:id="140"/>
         <w:r>
           <w:rPr>
             <w:szCs w:val="22"/>
           </w:rPr>
-          <w:t>,</w:t>
+          <w:t>29.7%) compared to Experiment 1c (36.7%</w:t>
         </w:r>
-      </w:ins>
-      <w:ins w:id="100" w:author="Cummings, Shawn" w:date="2025-05-22T12:13:00Z" w16du:dateUtc="2025-05-22T16:13:00Z">
+        <w:commentRangeEnd w:id="140"/>
         <w:r>
           <w:rPr>
-            <w:szCs w:val="22"/>
+            <w:rStyle w:val="CommentReference"/>
           </w:rPr>
-          <w:t xml:space="preserve"> but </w:t>
-        </w:r>
-      </w:ins>
-      <w:ins w:id="101" w:author="Cummings, Shawn" w:date="2025-05-22T12:17:00Z" w16du:dateUtc="2025-05-22T16:17:00Z">
-        <w:r>
-          <w:rPr>
-            <w:szCs w:val="22"/>
-          </w:rPr>
-          <w:t>became</w:t>
-        </w:r>
-      </w:ins>
-      <w:ins w:id="102" w:author="Cummings, Shawn" w:date="2025-05-22T12:16:00Z" w16du:dateUtc="2025-05-22T16:16:00Z">
-        <w:r>
-          <w:rPr>
-            <w:szCs w:val="22"/>
-          </w:rPr>
-          <w:t xml:space="preserve"> less likely to mention it under the “</w:t>
-        </w:r>
-      </w:ins>
-      <w:ins w:id="103" w:author="Cummings, Shawn" w:date="2025-05-22T12:16:00Z">
-        <w:r>
-          <w:rPr>
-            <w:szCs w:val="22"/>
-          </w:rPr>
-          <w:t>Did you notice anything odd about the person in the video?</w:t>
-        </w:r>
-      </w:ins>
-      <w:ins w:id="104" w:author="Cummings, Shawn" w:date="2025-05-22T12:16:00Z" w16du:dateUtc="2025-05-22T16:16:00Z">
-        <w:r>
-          <w:rPr>
-            <w:szCs w:val="22"/>
-          </w:rPr>
-          <w:t>” prompt</w:t>
-        </w:r>
-      </w:ins>
-      <w:ins w:id="105" w:author="Cummings, Shawn" w:date="2025-05-22T12:17:00Z" w16du:dateUtc="2025-05-22T16:17:00Z">
-        <w:r>
-          <w:rPr>
-            <w:szCs w:val="22"/>
-          </w:rPr>
-          <w:t xml:space="preserve"> when other visually salient objects (the black box) were also apparent</w:t>
-        </w:r>
-      </w:ins>
-      <w:ins w:id="106" w:author="Cummings, Shawn" w:date="2025-05-22T12:16:00Z" w16du:dateUtc="2025-05-22T16:16:00Z">
-        <w:r>
-          <w:rPr>
-            <w:szCs w:val="22"/>
-          </w:rPr>
-          <w:t>. However,</w:t>
-        </w:r>
-      </w:ins>
-      <w:ins w:id="107" w:author="Cummings, Shawn" w:date="2025-05-22T12:17:00Z" w16du:dateUtc="2025-05-22T16:17:00Z">
-        <w:r>
-          <w:rPr>
-            <w:szCs w:val="22"/>
-          </w:rPr>
-          <w:t xml:space="preserve"> </w:t>
+          <w:commentReference w:id="140"/>
         </w:r>
         <w:r>
           <w:rPr>
             <w:szCs w:val="22"/>
           </w:rPr>
-          <w:lastRenderedPageBreak/>
-          <w:t xml:space="preserve">it is also possible the occluder created </w:t>
+          <w:t>; for details, see SI).</w:t>
         </w:r>
-      </w:ins>
-      <w:ins w:id="108" w:author="Cummings, Shawn" w:date="2025-05-22T12:18:00Z" w16du:dateUtc="2025-05-22T16:18:00Z">
-        <w:r>
-          <w:rPr>
-            <w:szCs w:val="22"/>
-          </w:rPr>
-          <w:t>distraction during the task.</w:t>
-        </w:r>
-      </w:ins>
-      <w:ins w:id="109" w:author="Cummings, Shawn" w:date="2025-05-22T12:16:00Z" w16du:dateUtc="2025-05-22T16:16:00Z">
         <w:r>
           <w:rPr>
             <w:szCs w:val="22"/>
@@ -22171,18 +22680,98 @@
           <w:t xml:space="preserve"> </w:t>
         </w:r>
       </w:ins>
-      <w:r>
-        <w:rPr>
-          <w:szCs w:val="22"/>
-        </w:rPr>
-        <w:t>Here we briefly discuss</w:t>
-      </w:r>
-      <w:r>
-        <w:rPr>
-          <w:szCs w:val="22"/>
-        </w:rPr>
-        <w:t xml:space="preserve"> two possibilities</w:t>
-      </w:r>
+      <w:ins w:id="141" w:author="Jaeger, Florian" w:date="2025-05-24T19:10:00Z" w16du:dateUtc="2025-05-24T23:10:00Z">
+        <w:r>
+          <w:rPr>
+            <w:szCs w:val="22"/>
+          </w:rPr>
+          <w:t>Additionally, Experiment 2—which explicitly asked participants</w:t>
+        </w:r>
+      </w:ins>
+      <w:ins w:id="142" w:author="Jaeger, Florian" w:date="2025-05-24T19:11:00Z" w16du:dateUtc="2025-05-24T23:11:00Z">
+        <w:r>
+          <w:rPr>
+            <w:szCs w:val="22"/>
+          </w:rPr>
+          <w:t xml:space="preserve"> to press SPACE whenever the pen was in the talker’s mouth—also failed to find the compens</w:t>
+        </w:r>
+      </w:ins>
+      <w:ins w:id="143" w:author="Jaeger, Florian" w:date="2025-05-24T19:12:00Z" w16du:dateUtc="2025-05-24T23:12:00Z">
+        <w:r>
+          <w:rPr>
+            <w:szCs w:val="22"/>
+          </w:rPr>
+          <w:t>ation effects we obtained in Experiments 1a-c.</w:t>
+        </w:r>
+      </w:ins>
+      <w:del w:id="144" w:author="Jaeger, Florian" w:date="2025-05-24T19:10:00Z" w16du:dateUtc="2025-05-24T23:10:00Z">
+        <w:r>
+          <w:rPr>
+            <w:szCs w:val="22"/>
+          </w:rPr>
+          <w:delText>Experiment 2b</w:delText>
+        </w:r>
+      </w:del>
+      <w:del w:id="145" w:author="Jaeger, Florian" w:date="2025-05-24T19:09:00Z" w16du:dateUtc="2025-05-24T23:09:00Z">
+        <w:r>
+          <w:rPr>
+            <w:szCs w:val="22"/>
+          </w:rPr>
+          <w:delText xml:space="preserve"> addresses this concern to a limited extent, in that </w:delText>
+        </w:r>
+        <w:r>
+          <w:rPr>
+            <w:szCs w:val="22"/>
+          </w:rPr>
+          <w:delText xml:space="preserve">participants explicitly </w:delText>
+        </w:r>
+      </w:del>
+      <w:del w:id="146" w:author="Jaeger, Florian" w:date="2025-05-24T19:10:00Z" w16du:dateUtc="2025-05-24T23:10:00Z">
+        <w:r>
+          <w:rPr>
+            <w:szCs w:val="22"/>
+          </w:rPr>
+          <w:delText>confirmed awareness of the pen</w:delText>
+        </w:r>
+      </w:del>
+      <w:ins w:id="147" w:author="Jaeger, Florian" w:date="2025-05-24T19:14:00Z" w16du:dateUtc="2025-05-24T23:14:00Z">
+        <w:r>
+          <w:rPr>
+            <w:szCs w:val="22"/>
+          </w:rPr>
+          <w:t xml:space="preserve"> </w:t>
+        </w:r>
+      </w:ins>
+      <w:del w:id="148" w:author="Jaeger, Florian" w:date="2025-05-24T19:07:00Z" w16du:dateUtc="2025-05-24T23:07:00Z">
+        <w:r>
+          <w:rPr>
+            <w:szCs w:val="22"/>
+          </w:rPr>
+          <w:delText xml:space="preserve">. </w:delText>
+        </w:r>
+      </w:del>
+      <w:r>
+        <w:rPr>
+          <w:szCs w:val="22"/>
+        </w:rPr>
+        <w:t xml:space="preserve">However, the dual-task nature of </w:t>
+      </w:r>
+      <w:del w:id="149" w:author="Jaeger, Florian" w:date="2025-05-24T19:14:00Z" w16du:dateUtc="2025-05-24T23:14:00Z">
+        <w:r>
+          <w:rPr>
+            <w:szCs w:val="22"/>
+          </w:rPr>
+          <w:delText>the experiment</w:delText>
+        </w:r>
+      </w:del>
+      <w:ins w:id="150" w:author="Jaeger, Florian" w:date="2025-05-24T19:14:00Z" w16du:dateUtc="2025-05-24T23:14:00Z">
+        <w:r>
+          <w:rPr>
+            <w:szCs w:val="22"/>
+          </w:rPr>
+          <w:t>Experiment 2b</w:t>
+        </w:r>
+      </w:ins>
       <w:r>
         <w:rPr>
           <w:szCs w:val="22"/>
@@ -22193,310 +22782,118 @@
         <w:rPr>
           <w:szCs w:val="22"/>
         </w:rPr>
-        <w:t>that might require attention in future research</w:t>
+        <w:t>imposed additional and orthogonal attentional demands</w:t>
+      </w:r>
+      <w:r>
+        <w:rPr>
+          <w:szCs w:val="22"/>
+        </w:rPr>
+        <w:t xml:space="preserve"> (for details, we refer to the SI)</w:t>
       </w:r>
       <w:r>
         <w:rPr>
           <w:szCs w:val="22"/>
         </w:rPr>
         <w:t xml:space="preserve">. </w:t>
+      </w:r>
+      <w:r>
+        <w:rPr>
+          <w:szCs w:val="22"/>
+        </w:rPr>
+        <w:t xml:space="preserve">Future </w:t>
+      </w:r>
+      <w:r>
+        <w:rPr>
+          <w:szCs w:val="22"/>
+        </w:rPr>
+        <w:t xml:space="preserve">work could more </w:t>
+      </w:r>
+      <w:r>
+        <w:rPr>
+          <w:szCs w:val="22"/>
+        </w:rPr>
+        <w:t xml:space="preserve">conclusively assess the role of the pen </w:t>
+      </w:r>
+      <w:r>
+        <w:rPr>
+          <w:szCs w:val="22"/>
+        </w:rPr>
+        <w:t xml:space="preserve">versus its impact on the articulators by </w:t>
+      </w:r>
+      <w:r>
+        <w:rPr>
+          <w:szCs w:val="22"/>
+        </w:rPr>
+        <w:t xml:space="preserve">removing </w:t>
+      </w:r>
+      <w:r>
+        <w:rPr>
+          <w:szCs w:val="22"/>
+        </w:rPr>
+        <w:t>visual information more selectively</w:t>
+      </w:r>
+      <w:r>
+        <w:rPr>
+          <w:szCs w:val="22"/>
+        </w:rPr>
+        <w:t xml:space="preserve">. For example, videos could be presented of pen-impacted articulation, but with the pen itself removed in video post-processing. Conversely, </w:t>
+      </w:r>
+      <w:r>
+        <w:rPr>
+          <w:szCs w:val="22"/>
+        </w:rPr>
+        <w:t xml:space="preserve">video editing could be used to create an occluder that hides visual information about the articulators and face, while still showing </w:t>
+      </w:r>
+      <w:r>
+        <w:rPr>
+          <w:szCs w:val="22"/>
+        </w:rPr>
+        <w:t xml:space="preserve">the pen </w:t>
+      </w:r>
+      <w:r>
+        <w:rPr>
+          <w:szCs w:val="22"/>
+        </w:rPr>
+        <w:t>and hand of the talker</w:t>
+      </w:r>
+      <w:r>
+        <w:rPr>
+          <w:szCs w:val="22"/>
+        </w:rPr>
+        <w:t xml:space="preserve">. </w:t>
+      </w:r>
+      <w:r>
+        <w:rPr>
+          <w:szCs w:val="22"/>
+        </w:rPr>
+        <w:t>Either of these manipulations would require substantial</w:t>
+      </w:r>
+      <w:r>
+        <w:rPr>
+          <w:szCs w:val="22"/>
+        </w:rPr>
+        <w:t>ly</w:t>
+      </w:r>
+      <w:r>
+        <w:rPr>
+          <w:szCs w:val="22"/>
+        </w:rPr>
+        <w:t xml:space="preserve"> more advanced video-editing than used in Experiment 2. </w:t>
       </w:r>
     </w:p>
     <w:p>
       <w:pPr>
-        <w:rPr>
-          <w:szCs w:val="22"/>
-        </w:rPr>
-      </w:pPr>
-      <w:r>
-        <w:rPr>
-          <w:szCs w:val="22"/>
-        </w:rPr>
-        <w:t>First,</w:t>
-      </w:r>
-      <w:r>
-        <w:rPr>
-          <w:szCs w:val="22"/>
-        </w:rPr>
-        <w:t xml:space="preserve"> </w:t>
-      </w:r>
-      <w:r>
-        <w:rPr>
-          <w:szCs w:val="22"/>
-        </w:rPr>
-        <w:t>the black occluder box might distract participants from the primary task, which could</w:t>
-      </w:r>
-      <w:r>
-        <w:rPr>
-          <w:szCs w:val="22"/>
-        </w:rPr>
-        <w:t xml:space="preserve"> interrupt the cognitive process underlying compensation. </w:t>
-      </w:r>
-      <w:r>
-        <w:rPr>
-          <w:szCs w:val="22"/>
-        </w:rPr>
-        <w:t xml:space="preserve">While we cannot conclusively rule out this possibility, we consider it unlikely for </w:t>
-      </w:r>
-      <w:proofErr w:type="gramStart"/>
-      <w:r>
-        <w:rPr>
-          <w:szCs w:val="22"/>
-        </w:rPr>
-        <w:t>a</w:t>
-      </w:r>
-      <w:r>
-        <w:rPr>
-          <w:szCs w:val="22"/>
-        </w:rPr>
-        <w:t xml:space="preserve"> number of</w:t>
-      </w:r>
-      <w:proofErr w:type="gramEnd"/>
-      <w:r>
-        <w:rPr>
-          <w:szCs w:val="22"/>
-        </w:rPr>
-        <w:t xml:space="preserve"> </w:t>
-      </w:r>
-      <w:r>
-        <w:rPr>
-          <w:szCs w:val="22"/>
-        </w:rPr>
-        <w:t>reasons</w:t>
-      </w:r>
-      <w:r>
-        <w:rPr>
-          <w:szCs w:val="22"/>
-        </w:rPr>
-        <w:t xml:space="preserve">. </w:t>
-      </w:r>
-      <w:r>
-        <w:rPr>
-          <w:szCs w:val="22"/>
-        </w:rPr>
-        <w:t>Compared to Experiments 1a-c, l</w:t>
-      </w:r>
-      <w:r>
-        <w:rPr>
-          <w:szCs w:val="22"/>
-        </w:rPr>
-        <w:t xml:space="preserve">isteners in </w:t>
-      </w:r>
-      <w:r>
-        <w:rPr>
-          <w:szCs w:val="22"/>
-        </w:rPr>
-        <w:t>E</w:t>
-      </w:r>
-      <w:r>
-        <w:rPr>
-          <w:szCs w:val="22"/>
-        </w:rPr>
-        <w:t xml:space="preserve">xperiment 2 demonstrated </w:t>
-      </w:r>
-      <w:r>
-        <w:rPr>
-          <w:szCs w:val="22"/>
-        </w:rPr>
-        <w:t xml:space="preserve">about the same—in fact, </w:t>
-      </w:r>
-      <w:r>
-        <w:rPr>
-          <w:szCs w:val="22"/>
-        </w:rPr>
-        <w:t xml:space="preserve">numerically </w:t>
-      </w:r>
-      <w:r>
-        <w:rPr>
-          <w:szCs w:val="22"/>
-        </w:rPr>
-        <w:t>somewhat greater—</w:t>
-      </w:r>
-      <w:r>
-        <w:rPr>
-          <w:szCs w:val="22"/>
-        </w:rPr>
-        <w:t xml:space="preserve">sensitivity to the acoustic continuum </w:t>
-      </w:r>
-      <w:r>
-        <w:rPr>
-          <w:szCs w:val="22"/>
-        </w:rPr>
-        <w:t xml:space="preserve">(see </w:t>
-      </w:r>
-      <w:r>
-        <w:rPr>
-          <w:szCs w:val="22"/>
-        </w:rPr>
-        <w:fldChar w:fldCharType="begin"/>
-      </w:r>
-      <w:r>
-        <w:rPr>
-          <w:szCs w:val="22"/>
-        </w:rPr>
-        <w:instrText xml:space="preserve"> REF _Ref136190811 \h </w:instrText>
-      </w:r>
-      <w:r>
-        <w:rPr>
-          <w:szCs w:val="22"/>
-        </w:rPr>
-      </w:r>
-      <w:r>
-        <w:rPr>
-          <w:szCs w:val="22"/>
-        </w:rPr>
-        <w:fldChar w:fldCharType="separate"/>
-      </w:r>
-      <w:r>
-        <w:rPr>
-          <w:szCs w:val="22"/>
-        </w:rPr>
-        <w:t xml:space="preserve">Figure </w:t>
-      </w:r>
-      <w:r>
-        <w:rPr>
-          <w:noProof/>
-          <w:szCs w:val="22"/>
-        </w:rPr>
-        <w:t>4</w:t>
-      </w:r>
-      <w:r>
-        <w:rPr>
-          <w:szCs w:val="22"/>
-        </w:rPr>
-        <w:fldChar w:fldCharType="end"/>
-      </w:r>
-      <w:r>
-        <w:rPr>
-          <w:szCs w:val="22"/>
-        </w:rPr>
-        <w:t>A)</w:t>
-      </w:r>
-      <w:r>
-        <w:rPr>
-          <w:szCs w:val="22"/>
-        </w:rPr>
-        <w:t>, speaking against a higher proportion of attentional lapses or random guesses. Along a similar vein, average reaction time</w:t>
-      </w:r>
-      <w:r>
-        <w:rPr>
-          <w:szCs w:val="22"/>
-        </w:rPr>
-        <w:t>s</w:t>
-      </w:r>
-      <w:r>
-        <w:rPr>
-          <w:szCs w:val="22"/>
-        </w:rPr>
-        <w:t xml:space="preserve"> w</w:t>
-      </w:r>
-      <w:r>
-        <w:rPr>
-          <w:szCs w:val="22"/>
-        </w:rPr>
-        <w:t>ere</w:t>
-      </w:r>
-      <w:r>
-        <w:rPr>
-          <w:szCs w:val="22"/>
-        </w:rPr>
-        <w:t xml:space="preserve"> not significantly higher in Experiment 2</w:t>
-      </w:r>
-      <w:r>
-        <w:rPr>
-          <w:szCs w:val="22"/>
-        </w:rPr>
-        <w:t xml:space="preserve"> (mean log-RT = </w:t>
-      </w:r>
-      <w:r>
-        <w:rPr>
-          <w:szCs w:val="22"/>
-        </w:rPr>
-        <w:t>3.45</w:t>
-      </w:r>
-      <w:r>
-        <w:rPr>
-          <w:szCs w:val="22"/>
-        </w:rPr>
-        <w:t xml:space="preserve">, SD = </w:t>
-      </w:r>
-      <w:r>
-        <w:rPr>
-          <w:szCs w:val="22"/>
-        </w:rPr>
-        <w:t>0.14</w:t>
-      </w:r>
-      <w:r>
-        <w:rPr>
-          <w:szCs w:val="22"/>
-        </w:rPr>
-        <w:t xml:space="preserve">), compared to Experiments 1a-c (mean = </w:t>
-      </w:r>
-      <w:r>
-        <w:rPr>
-          <w:szCs w:val="22"/>
-        </w:rPr>
-        <w:t>3.44</w:t>
-      </w:r>
-      <w:r>
-        <w:rPr>
-          <w:szCs w:val="22"/>
-        </w:rPr>
-        <w:t xml:space="preserve">, SD = </w:t>
-      </w:r>
-      <w:r>
-        <w:rPr>
-          <w:szCs w:val="22"/>
-        </w:rPr>
-        <w:t>0.15</w:t>
-      </w:r>
-      <w:r>
-        <w:rPr>
-          <w:szCs w:val="22"/>
-        </w:rPr>
-        <w:t>)</w:t>
-      </w:r>
-      <w:r>
-        <w:rPr>
-          <w:szCs w:val="22"/>
-        </w:rPr>
-        <w:t xml:space="preserve">. Finally, while the black box </w:t>
-      </w:r>
-      <w:r>
-        <w:rPr>
-          <w:szCs w:val="22"/>
-        </w:rPr>
-        <w:t>might have been</w:t>
-      </w:r>
-      <w:r>
-        <w:rPr>
-          <w:szCs w:val="22"/>
-        </w:rPr>
-        <w:t xml:space="preserve"> initially surprising to listeners, it appeared very predictably at </w:t>
-      </w:r>
-      <w:r>
-        <w:rPr>
-          <w:szCs w:val="22"/>
-        </w:rPr>
-        <w:t xml:space="preserve">approximately </w:t>
-      </w:r>
-      <w:r>
-        <w:rPr>
-          <w:szCs w:val="22"/>
-        </w:rPr>
-        <w:t xml:space="preserve">the same point in each of the 72 </w:t>
-      </w:r>
-      <w:r>
-        <w:rPr>
-          <w:szCs w:val="22"/>
-        </w:rPr>
-        <w:t xml:space="preserve">video </w:t>
-      </w:r>
-      <w:r>
-        <w:rPr>
-          <w:szCs w:val="22"/>
-        </w:rPr>
-        <w:t xml:space="preserve">trials. Thus, any initial distraction would likely atrophy over the course of testing. Analyses reported in the SI confirm that no effects emerged or interacted with testing block. </w:t>
+        <w:pStyle w:val="Heading1"/>
+        <w:rPr>
+          <w:szCs w:val="22"/>
+        </w:rPr>
+      </w:pPr>
+      <w:r>
+        <w:rPr>
+          <w:sz w:val="22"/>
+          <w:szCs w:val="22"/>
+        </w:rPr>
+        <w:t>General Discussion</w:t>
       </w:r>
     </w:p>
     <w:p>
@@ -22509,7 +22906,140 @@
         <w:rPr>
           <w:szCs w:val="22"/>
         </w:rPr>
-        <w:t>A second alternative is that while the presence of the pen itself—rather than its impact on the articulators—may be sufficient to induce compensation, the black box made</w:t>
+        <w:t xml:space="preserve">Taken together the </w:t>
+      </w:r>
+      <w:r>
+        <w:rPr>
+          <w:szCs w:val="22"/>
+        </w:rPr>
+        <w:t xml:space="preserve">results </w:t>
+      </w:r>
+      <w:r>
+        <w:rPr>
+          <w:szCs w:val="22"/>
+        </w:rPr>
+        <w:t xml:space="preserve">of </w:t>
+      </w:r>
+      <w:r>
+        <w:rPr>
+          <w:szCs w:val="22"/>
+        </w:rPr>
+        <w:t xml:space="preserve">Experiments 1a-c </w:t>
+      </w:r>
+      <w:r>
+        <w:rPr>
+          <w:szCs w:val="22"/>
+        </w:rPr>
+        <w:t xml:space="preserve">and 2, suggest that listeners </w:t>
+      </w:r>
+      <w:r>
+        <w:rPr>
+          <w:szCs w:val="22"/>
+        </w:rPr>
+        <w:t>compensat</w:t>
+      </w:r>
+      <w:r>
+        <w:rPr>
+          <w:szCs w:val="22"/>
+        </w:rPr>
+        <w:t>e</w:t>
+      </w:r>
+      <w:r>
+        <w:rPr>
+          <w:szCs w:val="22"/>
+        </w:rPr>
+        <w:t xml:space="preserve"> for </w:t>
+      </w:r>
+      <w:r>
+        <w:rPr>
+          <w:szCs w:val="22"/>
+        </w:rPr>
+        <w:lastRenderedPageBreak/>
+        <w:t xml:space="preserve">visually evident effects of the pen on the </w:t>
+      </w:r>
+      <w:r>
+        <w:rPr>
+          <w:szCs w:val="22"/>
+        </w:rPr>
+        <w:t xml:space="preserve">configuration of articulators that are relevant to the </w:t>
+      </w:r>
+      <w:r>
+        <w:rPr>
+          <w:szCs w:val="22"/>
+        </w:rPr>
+        <w:t>/s/-/ʃ/</w:t>
+      </w:r>
+      <w:r>
+        <w:rPr>
+          <w:szCs w:val="22"/>
+        </w:rPr>
+        <w:t xml:space="preserve"> contrast. This suggests that </w:t>
+      </w:r>
+      <w:r>
+        <w:rPr>
+          <w:szCs w:val="22"/>
+        </w:rPr>
+        <w:t xml:space="preserve">speech perception </w:t>
+      </w:r>
+      <w:r>
+        <w:rPr>
+          <w:szCs w:val="22"/>
+        </w:rPr>
+        <w:t xml:space="preserve">can normalize or ‘explain away’ </w:t>
+      </w:r>
+      <w:r>
+        <w:rPr>
+          <w:szCs w:val="22"/>
+        </w:rPr>
+        <w:t xml:space="preserve">at least </w:t>
+      </w:r>
+      <w:r>
+        <w:rPr>
+          <w:szCs w:val="22"/>
+        </w:rPr>
+        <w:t xml:space="preserve">some effects of the pen </w:t>
+      </w:r>
+      <w:r>
+        <w:rPr>
+          <w:szCs w:val="22"/>
+        </w:rPr>
+        <w:t xml:space="preserve">on articulation, </w:t>
+      </w:r>
+      <w:r>
+        <w:rPr>
+          <w:szCs w:val="22"/>
+        </w:rPr>
+        <w:t>if they are sufficiently visually evident.</w:t>
+      </w:r>
+      <w:r>
+        <w:rPr>
+          <w:szCs w:val="22"/>
+        </w:rPr>
+        <w:t xml:space="preserve"> To the best of our knowledge, this is the first demonstration that </w:t>
+      </w:r>
+      <w:r>
+        <w:rPr>
+          <w:szCs w:val="22"/>
+        </w:rPr>
+        <w:t>non-</w:t>
+      </w:r>
+      <w:r>
+        <w:rPr>
+          <w:szCs w:val="22"/>
+        </w:rPr>
+        <w:t>phon</w:t>
+      </w:r>
+      <w:r>
+        <w:rPr>
+          <w:szCs w:val="22"/>
+        </w:rPr>
+        <w:t>etic</w:t>
+      </w:r>
+      <w:r>
+        <w:rPr>
+          <w:szCs w:val="22"/>
+        </w:rPr>
+        <w:t>, visually evident</w:t>
       </w:r>
       <w:r>
         <w:rPr>
@@ -22521,137 +23051,122 @@
         <w:rPr>
           <w:szCs w:val="22"/>
         </w:rPr>
-        <w:t>the location of the pen</w:t>
-      </w:r>
-      <w:r>
-        <w:rPr>
-          <w:szCs w:val="22"/>
-        </w:rPr>
-        <w:t xml:space="preserve"> less obvious and harder to visually access. Experiment 2b addresses this concern to a limited extent, in that </w:t>
-      </w:r>
-      <w:r>
-        <w:rPr>
-          <w:szCs w:val="22"/>
-        </w:rPr>
-        <w:t xml:space="preserve">participants explicitly confirmed awareness of the pen. However, the dual-task nature of the experiment </w:t>
-      </w:r>
-      <w:r>
-        <w:rPr>
-          <w:szCs w:val="22"/>
-        </w:rPr>
-        <w:t>imposed additional and orthogonal attentional demands</w:t>
-      </w:r>
-      <w:r>
-        <w:rPr>
-          <w:szCs w:val="22"/>
-        </w:rPr>
-        <w:t xml:space="preserve"> (for details, we refer to the SI)</w:t>
-      </w:r>
-      <w:r>
-        <w:rPr>
-          <w:szCs w:val="22"/>
-        </w:rPr>
-        <w:t xml:space="preserve">. </w:t>
-      </w:r>
-      <w:r>
-        <w:rPr>
-          <w:szCs w:val="22"/>
-        </w:rPr>
-        <w:t xml:space="preserve">Future </w:t>
-      </w:r>
-      <w:r>
-        <w:rPr>
-          <w:szCs w:val="22"/>
-        </w:rPr>
-        <w:t xml:space="preserve">work could more </w:t>
-      </w:r>
-      <w:r>
-        <w:rPr>
-          <w:szCs w:val="22"/>
-        </w:rPr>
-        <w:t xml:space="preserve">conclusively assess the role of the pen </w:t>
-      </w:r>
-      <w:r>
-        <w:rPr>
-          <w:szCs w:val="22"/>
-        </w:rPr>
-        <w:t xml:space="preserve">versus its impact on the articulators by </w:t>
-      </w:r>
-      <w:r>
-        <w:rPr>
-          <w:szCs w:val="22"/>
-        </w:rPr>
-        <w:t xml:space="preserve">removing </w:t>
-      </w:r>
-      <w:r>
-        <w:rPr>
-          <w:szCs w:val="22"/>
-        </w:rPr>
-        <w:t>visual information more selectively</w:t>
-      </w:r>
-      <w:r>
-        <w:rPr>
-          <w:szCs w:val="22"/>
-        </w:rPr>
-        <w:t xml:space="preserve">. For example, videos could be presented of pen-impacted articulation, but with the pen itself removed in video post-processing. Conversely, </w:t>
-      </w:r>
-      <w:r>
-        <w:rPr>
-          <w:szCs w:val="22"/>
-        </w:rPr>
-        <w:t xml:space="preserve">video editing could be used to create an occluder that hides visual information about the articulators and face, while still showing </w:t>
-      </w:r>
-      <w:r>
-        <w:rPr>
-          <w:szCs w:val="22"/>
-        </w:rPr>
-        <w:t xml:space="preserve">the pen </w:t>
-      </w:r>
-      <w:r>
-        <w:rPr>
-          <w:szCs w:val="22"/>
-        </w:rPr>
-        <w:t>and hand of the talker</w:t>
-      </w:r>
-      <w:r>
-        <w:rPr>
-          <w:szCs w:val="22"/>
-        </w:rPr>
-        <w:t xml:space="preserve">. </w:t>
-      </w:r>
-      <w:r>
-        <w:rPr>
-          <w:szCs w:val="22"/>
-        </w:rPr>
-        <w:t>Either of these manipulations would require substantial</w:t>
-      </w:r>
-      <w:r>
-        <w:rPr>
-          <w:szCs w:val="22"/>
-        </w:rPr>
-        <w:t>ly</w:t>
-      </w:r>
-      <w:r>
-        <w:rPr>
-          <w:szCs w:val="22"/>
-        </w:rPr>
-        <w:t xml:space="preserve"> more advanced video-editing than used in Experiment 2. </w:t>
+        <w:t>effects on</w:t>
+      </w:r>
+      <w:r>
+        <w:rPr>
+          <w:szCs w:val="22"/>
+        </w:rPr>
+        <w:t xml:space="preserve"> articulators—the pen’s effect on lip shape—affect listeners’ perception in ways consistent with compensation accounts. </w:t>
+      </w:r>
+      <w:r>
+        <w:rPr>
+          <w:szCs w:val="22"/>
+        </w:rPr>
+        <w:t xml:space="preserve">This provides novel support for Fowler’s conjecture (Fowler, 2006): it indeed does not appear to matter </w:t>
+      </w:r>
+      <w:r>
+        <w:rPr>
+          <w:szCs w:val="22"/>
+        </w:rPr>
+        <w:t>why</w:t>
+      </w:r>
+      <w:r>
+        <w:rPr>
+          <w:szCs w:val="22"/>
+        </w:rPr>
+        <w:t xml:space="preserve"> </w:t>
+      </w:r>
+      <w:r>
+        <w:rPr>
+          <w:i/>
+          <w:iCs/>
+          <w:szCs w:val="22"/>
+        </w:rPr>
+        <w:t>exactly</w:t>
+      </w:r>
+      <w:r>
+        <w:rPr>
+          <w:szCs w:val="22"/>
+        </w:rPr>
+        <w:t xml:space="preserve"> a talker’s lips exhibit a certain shape, </w:t>
+      </w:r>
+      <w:proofErr w:type="gramStart"/>
+      <w:r>
+        <w:rPr>
+          <w:szCs w:val="22"/>
+        </w:rPr>
+        <w:t>as long as</w:t>
+      </w:r>
+      <w:proofErr w:type="gramEnd"/>
+      <w:r>
+        <w:rPr>
+          <w:szCs w:val="22"/>
+        </w:rPr>
+        <w:t xml:space="preserve"> (1) they do, and (2) plausibly do so for </w:t>
+      </w:r>
+      <w:r>
+        <w:rPr>
+          <w:szCs w:val="22"/>
+        </w:rPr>
+        <w:t xml:space="preserve">some </w:t>
+      </w:r>
+      <w:r>
+        <w:rPr>
+          <w:szCs w:val="22"/>
+        </w:rPr>
+        <w:t xml:space="preserve">reason other than the articulation of the current segment (here, the pen in the mouth). </w:t>
       </w:r>
     </w:p>
     <w:p>
       <w:pPr>
-        <w:pStyle w:val="Heading1"/>
-        <w:rPr>
-          <w:szCs w:val="22"/>
-        </w:rPr>
-      </w:pPr>
-      <w:r>
-        <w:rPr>
-          <w:sz w:val="22"/>
-          <w:szCs w:val="22"/>
-        </w:rPr>
-        <w:lastRenderedPageBreak/>
-        <w:t>General Discussion</w:t>
+        <w:rPr>
+          <w:szCs w:val="22"/>
+          <w:highlight w:val="yellow"/>
+        </w:rPr>
+      </w:pPr>
+      <w:r>
+        <w:rPr>
+          <w:szCs w:val="22"/>
+        </w:rPr>
+        <w:t>The results of Experiment 2—the absence of compensation in the absence of direct visual evidence that lip shape was indeed affected by the pen—</w:t>
+      </w:r>
+      <w:r>
+        <w:rPr>
+          <w:szCs w:val="22"/>
+        </w:rPr>
+        <w:t>replicates for non-phonetic context, what has previously been demonstrated for phonetic context: compensation for visually presented context seems to be substantially reduced or no longer observed when the relevant articulatory effects are no</w:t>
+      </w:r>
+      <w:r>
+        <w:rPr>
+          <w:szCs w:val="22"/>
+        </w:rPr>
+        <w:t xml:space="preserve">t </w:t>
+      </w:r>
+      <w:r>
+        <w:rPr>
+          <w:szCs w:val="22"/>
+        </w:rPr>
+        <w:t>visually evident during the articulation of the target sound</w:t>
+      </w:r>
+      <w:r>
+        <w:rPr>
+          <w:szCs w:val="22"/>
+        </w:rPr>
+        <w:t xml:space="preserve"> (Holt et al., 2005</w:t>
+      </w:r>
+      <w:r>
+        <w:rPr>
+          <w:szCs w:val="22"/>
+        </w:rPr>
+        <w:t>; Viswanathan &amp; Stephens, 2016).</w:t>
+      </w:r>
+      <w:r>
+        <w:rPr>
+          <w:szCs w:val="22"/>
+          <w:highlight w:val="yellow"/>
+        </w:rPr>
+        <w:t xml:space="preserve"> </w:t>
       </w:r>
     </w:p>
     <w:p>
@@ -22664,133 +23179,33 @@
         <w:rPr>
           <w:szCs w:val="22"/>
         </w:rPr>
-        <w:t xml:space="preserve">Taken together the </w:t>
-      </w:r>
-      <w:r>
-        <w:rPr>
-          <w:szCs w:val="22"/>
-        </w:rPr>
-        <w:t xml:space="preserve">results </w:t>
-      </w:r>
-      <w:r>
-        <w:rPr>
-          <w:szCs w:val="22"/>
-        </w:rPr>
-        <w:t xml:space="preserve">of </w:t>
-      </w:r>
-      <w:r>
-        <w:rPr>
-          <w:szCs w:val="22"/>
-        </w:rPr>
-        <w:t xml:space="preserve">Experiments 1a-c </w:t>
-      </w:r>
-      <w:r>
-        <w:rPr>
-          <w:szCs w:val="22"/>
-        </w:rPr>
-        <w:t xml:space="preserve">and 2, suggest that listeners </w:t>
-      </w:r>
-      <w:r>
-        <w:rPr>
-          <w:szCs w:val="22"/>
-        </w:rPr>
-        <w:t>compensat</w:t>
-      </w:r>
-      <w:r>
-        <w:rPr>
-          <w:szCs w:val="22"/>
-        </w:rPr>
-        <w:t>e</w:t>
-      </w:r>
-      <w:r>
-        <w:rPr>
-          <w:szCs w:val="22"/>
-        </w:rPr>
-        <w:t xml:space="preserve"> for visually evident effects of the pen on the </w:t>
-      </w:r>
-      <w:r>
-        <w:rPr>
-          <w:szCs w:val="22"/>
-        </w:rPr>
-        <w:t xml:space="preserve">configuration of articulators that are relevant to the </w:t>
-      </w:r>
-      <w:r>
-        <w:rPr>
-          <w:szCs w:val="22"/>
-        </w:rPr>
-        <w:t>/s/-/ʃ/</w:t>
-      </w:r>
-      <w:r>
-        <w:rPr>
-          <w:szCs w:val="22"/>
-        </w:rPr>
-        <w:t xml:space="preserve"> contrast. This suggests that </w:t>
-      </w:r>
-      <w:r>
-        <w:rPr>
-          <w:szCs w:val="22"/>
-        </w:rPr>
-        <w:t xml:space="preserve">speech perception </w:t>
-      </w:r>
-      <w:r>
-        <w:rPr>
-          <w:szCs w:val="22"/>
-        </w:rPr>
-        <w:t xml:space="preserve">can normalize or ‘explain away’ </w:t>
-      </w:r>
-      <w:r>
-        <w:rPr>
-          <w:szCs w:val="22"/>
-        </w:rPr>
-        <w:t xml:space="preserve">at least </w:t>
-      </w:r>
-      <w:r>
-        <w:rPr>
-          <w:szCs w:val="22"/>
-        </w:rPr>
-        <w:t xml:space="preserve">some effects of the pen </w:t>
-      </w:r>
-      <w:r>
-        <w:rPr>
-          <w:szCs w:val="22"/>
-        </w:rPr>
-        <w:t xml:space="preserve">on articulation, </w:t>
-      </w:r>
-      <w:r>
-        <w:rPr>
-          <w:szCs w:val="22"/>
-        </w:rPr>
-        <w:t>if they are sufficiently visually evident.</w:t>
-      </w:r>
-      <w:r>
-        <w:rPr>
-          <w:szCs w:val="22"/>
-        </w:rPr>
-        <w:t xml:space="preserve"> To the best of our knowledge, this is the first demonstration that </w:t>
-      </w:r>
-      <w:r>
-        <w:rPr>
-          <w:szCs w:val="22"/>
-        </w:rPr>
-        <w:t>non-</w:t>
-      </w:r>
-      <w:r>
-        <w:rPr>
-          <w:szCs w:val="22"/>
-        </w:rPr>
-        <w:t>phon</w:t>
-      </w:r>
-      <w:r>
-        <w:rPr>
-          <w:szCs w:val="22"/>
-        </w:rPr>
-        <w:t>etic</w:t>
-      </w:r>
-      <w:r>
-        <w:rPr>
-          <w:szCs w:val="22"/>
-        </w:rPr>
-        <w:t>, visually evident</w:t>
+        <w:t xml:space="preserve">The present results also raise </w:t>
+      </w:r>
+      <w:proofErr w:type="gramStart"/>
+      <w:r>
+        <w:rPr>
+          <w:szCs w:val="22"/>
+        </w:rPr>
+        <w:t>a number of</w:t>
+      </w:r>
+      <w:proofErr w:type="gramEnd"/>
+      <w:r>
+        <w:rPr>
+          <w:szCs w:val="22"/>
+        </w:rPr>
+        <w:t xml:space="preserve"> questions for future research on compensation and adaptive speech perception more broadly. We briefly discuss t</w:t>
+      </w:r>
+      <w:r>
+        <w:rPr>
+          <w:szCs w:val="22"/>
+        </w:rPr>
+        <w:t>wo</w:t>
+      </w:r>
+      <w:r>
+        <w:rPr>
+          <w:szCs w:val="22"/>
+        </w:rPr>
+        <w:t>. First, our findings leave open whether compensation for visually evident effects of non-phonological causes—like the pen—draws on the same neural mechanisms as normalization/compensation for the effects of phonetic contexts. The present findings only suggest that Fowler’s compensation account provides a unifying explanation for the qualitative consequences of both phenomena. It is unclear, for example, whether compensation for visually</w:t>
       </w:r>
       <w:r>
         <w:rPr>
@@ -22802,161 +23217,572 @@
         <w:rPr>
           <w:szCs w:val="22"/>
         </w:rPr>
-        <w:t>effects on</w:t>
-      </w:r>
-      <w:r>
-        <w:rPr>
-          <w:szCs w:val="22"/>
-        </w:rPr>
-        <w:t xml:space="preserve"> articulators—the pen’s effect on lip shape—affect listeners’ perception in ways consistent with compensation accounts. </w:t>
-      </w:r>
-      <w:r>
-        <w:rPr>
-          <w:szCs w:val="22"/>
-        </w:rPr>
-        <w:t xml:space="preserve">This provides novel support for Fowler’s conjecture (Fowler, 2006): it indeed does not appear to matter </w:t>
-      </w:r>
-      <w:r>
-        <w:rPr>
-          <w:szCs w:val="22"/>
-        </w:rPr>
-        <w:t>why</w:t>
-      </w:r>
-      <w:r>
-        <w:rPr>
-          <w:szCs w:val="22"/>
-        </w:rPr>
-        <w:t xml:space="preserve"> </w:t>
-      </w:r>
+        <w:t>presented non-phonetic context take</w:t>
+      </w:r>
+      <w:r>
+        <w:rPr>
+          <w:szCs w:val="22"/>
+        </w:rPr>
+        <w:t>s</w:t>
+      </w:r>
+      <w:r>
+        <w:rPr>
+          <w:szCs w:val="22"/>
+        </w:rPr>
+        <w:t xml:space="preserve"> place in the same brain areas that are responsible for audiovisual integration during speech perception, and whether those areas also process compensation for preceding phonetic context. Alternatively, compensation might take place at multiple points in the processing of speech input.</w:t>
+      </w:r>
+    </w:p>
+    <w:p>
+      <w:pPr>
+        <w:rPr>
+          <w:szCs w:val="22"/>
+        </w:rPr>
+      </w:pPr>
+      <w:r>
+        <w:rPr>
+          <w:szCs w:val="22"/>
+        </w:rPr>
+        <w:t>Second and f</w:t>
+      </w:r>
+      <w:r>
+        <w:rPr>
+          <w:szCs w:val="22"/>
+        </w:rPr>
+        <w:t xml:space="preserve">inally, the </w:t>
+      </w:r>
+      <w:r>
+        <w:rPr>
+          <w:szCs w:val="22"/>
+        </w:rPr>
+        <w:t xml:space="preserve">present </w:t>
+      </w:r>
+      <w:r>
+        <w:rPr>
+          <w:szCs w:val="22"/>
+        </w:rPr>
+        <w:t xml:space="preserve">results raise questions for future research on perceptual </w:t>
+      </w:r>
+      <w:r>
+        <w:rPr>
+          <w:szCs w:val="22"/>
+        </w:rPr>
+        <w:lastRenderedPageBreak/>
+        <w:t xml:space="preserve">recalibration. </w:t>
+      </w:r>
+      <w:r>
+        <w:rPr>
+          <w:szCs w:val="22"/>
+        </w:rPr>
+        <w:t xml:space="preserve">As mentioned in the introduction, previous </w:t>
+      </w:r>
+      <w:r>
+        <w:rPr>
+          <w:szCs w:val="22"/>
+        </w:rPr>
+        <w:t>work has found that perceptual recalibration to an unfamiliar talker’s speech can be blocked when the unexpected pronunciations occur while the talker has a pen in the mouth. In perceptual recalibration experiments, listeners are exp</w:t>
+      </w:r>
+      <w:r>
+        <w:rPr>
+          <w:szCs w:val="22"/>
+        </w:rPr>
+        <w:t>osed</w:t>
+      </w:r>
+      <w:r>
+        <w:rPr>
+          <w:szCs w:val="22"/>
+        </w:rPr>
+        <w:t xml:space="preserve"> to speech from an unfamiliar talker for which the realization of a particular sound is shifted towards a neighboring category. For example, Kraljic &amp; Samuel (2006) exposed listeners to either typical </w:t>
+      </w:r>
+      <w:r>
+        <w:rPr>
+          <w:szCs w:val="22"/>
+        </w:rPr>
+        <w:t>/ʃ/</w:t>
+      </w:r>
+      <w:r>
+        <w:rPr>
+          <w:szCs w:val="22"/>
+        </w:rPr>
+        <w:t xml:space="preserve"> sounds and s</w:t>
+      </w:r>
+      <w:r>
+        <w:rPr>
+          <w:szCs w:val="22"/>
+        </w:rPr>
+        <w:t>ounds ambiguous between /s/ and /ʃ/ but in lexical contexts favoring /s/ interpretation</w:t>
+      </w:r>
+      <w:r>
+        <w:rPr>
+          <w:szCs w:val="22"/>
+        </w:rPr>
+        <w:t xml:space="preserve"> (e.g., </w:t>
+      </w:r>
+      <w:proofErr w:type="spellStart"/>
       <w:r>
         <w:rPr>
           <w:i/>
           <w:iCs/>
           <w:szCs w:val="22"/>
         </w:rPr>
-        <w:t>exactly</w:t>
-      </w:r>
-      <w:r>
-        <w:rPr>
-          <w:szCs w:val="22"/>
-        </w:rPr>
-        <w:t xml:space="preserve"> a talker’s lips exhibit a certain shape, </w:t>
-      </w:r>
-      <w:proofErr w:type="gramStart"/>
-      <w:r>
-        <w:rPr>
-          <w:szCs w:val="22"/>
-        </w:rPr>
-        <w:t>as long as</w:t>
-      </w:r>
-      <w:proofErr w:type="gramEnd"/>
-      <w:r>
-        <w:rPr>
-          <w:szCs w:val="22"/>
-        </w:rPr>
-        <w:t xml:space="preserve"> (1) they do, and (2) plausibly do so for </w:t>
-      </w:r>
-      <w:r>
-        <w:rPr>
-          <w:szCs w:val="22"/>
-        </w:rPr>
-        <w:t xml:space="preserve">some </w:t>
-      </w:r>
-      <w:r>
-        <w:rPr>
-          <w:szCs w:val="22"/>
-        </w:rPr>
-        <w:t xml:space="preserve">reason other than the articulation of the current segment (here, the pen in the mouth). </w:t>
+        <w:t>dinoshaur</w:t>
+      </w:r>
+      <w:proofErr w:type="spellEnd"/>
+      <w:r>
+        <w:rPr>
+          <w:szCs w:val="22"/>
+        </w:rPr>
+        <w:t xml:space="preserve">, </w:t>
+      </w:r>
+      <w:r>
+        <w:rPr>
+          <w:szCs w:val="22"/>
+        </w:rPr>
+        <w:t>/s/</w:t>
+      </w:r>
+      <w:r>
+        <w:rPr>
+          <w:szCs w:val="22"/>
+        </w:rPr>
+        <w:t>-biased exposure</w:t>
+      </w:r>
+      <w:r>
+        <w:rPr>
+          <w:szCs w:val="22"/>
+        </w:rPr>
+        <w:t xml:space="preserve">) or to typical </w:t>
+      </w:r>
+      <w:r>
+        <w:rPr>
+          <w:szCs w:val="22"/>
+        </w:rPr>
+        <w:t>/s/</w:t>
+      </w:r>
+      <w:r>
+        <w:rPr>
+          <w:szCs w:val="22"/>
+        </w:rPr>
+        <w:t xml:space="preserve"> sounds and </w:t>
+      </w:r>
+      <w:r>
+        <w:rPr>
+          <w:szCs w:val="22"/>
+        </w:rPr>
+        <w:t>ambiguous sounds rather in /ʃ/-favoring contexts</w:t>
+      </w:r>
+      <w:r>
+        <w:rPr>
+          <w:szCs w:val="22"/>
+        </w:rPr>
+        <w:t xml:space="preserve"> (e.g., </w:t>
+      </w:r>
+      <w:proofErr w:type="spellStart"/>
+      <w:r>
+        <w:rPr>
+          <w:i/>
+          <w:iCs/>
+          <w:szCs w:val="22"/>
+        </w:rPr>
+        <w:t>ma</w:t>
+      </w:r>
+      <w:r>
+        <w:rPr>
+          <w:i/>
+          <w:iCs/>
+          <w:szCs w:val="22"/>
+        </w:rPr>
+        <w:t>s</w:t>
+      </w:r>
+      <w:r>
+        <w:rPr>
+          <w:i/>
+          <w:iCs/>
+          <w:szCs w:val="22"/>
+        </w:rPr>
+        <w:t>inery</w:t>
+      </w:r>
+      <w:proofErr w:type="spellEnd"/>
+      <w:r>
+        <w:rPr>
+          <w:szCs w:val="22"/>
+        </w:rPr>
+        <w:t xml:space="preserve">, </w:t>
+      </w:r>
+      <w:r>
+        <w:rPr>
+          <w:szCs w:val="22"/>
+        </w:rPr>
+        <w:t>/ʃ/-</w:t>
+      </w:r>
+      <w:r>
+        <w:rPr>
+          <w:szCs w:val="22"/>
+        </w:rPr>
+        <w:t>biased exposure</w:t>
+      </w:r>
+      <w:r>
+        <w:rPr>
+          <w:szCs w:val="22"/>
+        </w:rPr>
+        <w:t xml:space="preserve">), </w:t>
+      </w:r>
+      <w:r>
+        <w:rPr>
+          <w:szCs w:val="22"/>
+        </w:rPr>
+        <w:t>mixed with many filler stimuli. Following exposure, listeners were tested on an audio-only</w:t>
+      </w:r>
+      <w:r>
+        <w:rPr>
+          <w:i/>
+          <w:iCs/>
+          <w:szCs w:val="22"/>
+        </w:rPr>
+        <w:t xml:space="preserve"> </w:t>
+      </w:r>
+      <w:proofErr w:type="spellStart"/>
+      <w:r>
+        <w:rPr>
+          <w:i/>
+          <w:iCs/>
+          <w:szCs w:val="22"/>
+        </w:rPr>
+        <w:t>asi-ashi</w:t>
+      </w:r>
+      <w:proofErr w:type="spellEnd"/>
+      <w:r>
+        <w:rPr>
+          <w:szCs w:val="22"/>
+        </w:rPr>
+        <w:t xml:space="preserve"> continuum. As is typical for </w:t>
+      </w:r>
+      <w:r>
+        <w:rPr>
+          <w:szCs w:val="22"/>
+        </w:rPr>
+        <w:t xml:space="preserve">such </w:t>
+      </w:r>
+      <w:r>
+        <w:rPr>
+          <w:szCs w:val="22"/>
+        </w:rPr>
+        <w:t>perceptual recalibration</w:t>
+      </w:r>
+      <w:r>
+        <w:rPr>
+          <w:szCs w:val="22"/>
+        </w:rPr>
+        <w:t xml:space="preserve"> experiments, </w:t>
+      </w:r>
+      <w:r>
+        <w:rPr>
+          <w:szCs w:val="22"/>
+        </w:rPr>
+        <w:t>/ʃ/-</w:t>
+      </w:r>
+      <w:r>
+        <w:rPr>
+          <w:szCs w:val="22"/>
+        </w:rPr>
+        <w:t>biased</w:t>
+      </w:r>
+      <w:r>
+        <w:rPr>
+          <w:szCs w:val="22"/>
+        </w:rPr>
+        <w:t xml:space="preserve"> </w:t>
+      </w:r>
+      <w:r>
+        <w:rPr>
+          <w:szCs w:val="22"/>
+        </w:rPr>
+        <w:t>exposure caused listeners to</w:t>
+      </w:r>
+      <w:r>
+        <w:rPr>
+          <w:szCs w:val="22"/>
+        </w:rPr>
+        <w:t xml:space="preserve"> categorize more tokens along the </w:t>
+      </w:r>
+      <w:r>
+        <w:rPr>
+          <w:szCs w:val="22"/>
+        </w:rPr>
+        <w:t xml:space="preserve">test </w:t>
+      </w:r>
+      <w:r>
+        <w:rPr>
+          <w:szCs w:val="22"/>
+        </w:rPr>
+        <w:t xml:space="preserve">continuum as </w:t>
+      </w:r>
+      <w:proofErr w:type="spellStart"/>
+      <w:r>
+        <w:rPr>
+          <w:i/>
+          <w:iCs/>
+          <w:szCs w:val="22"/>
+        </w:rPr>
+        <w:t>ashi</w:t>
+      </w:r>
+      <w:proofErr w:type="spellEnd"/>
+      <w:r>
+        <w:rPr>
+          <w:szCs w:val="22"/>
+        </w:rPr>
+        <w:t xml:space="preserve">, compared to </w:t>
+      </w:r>
+      <w:r>
+        <w:rPr>
+          <w:szCs w:val="22"/>
+        </w:rPr>
+        <w:t>/s/-</w:t>
+      </w:r>
+      <w:r>
+        <w:rPr>
+          <w:szCs w:val="22"/>
+        </w:rPr>
+        <w:t>biased exposure</w:t>
+      </w:r>
+      <w:r>
+        <w:rPr>
+          <w:szCs w:val="22"/>
+        </w:rPr>
+        <w:t xml:space="preserve">. In a thought-provoking </w:t>
+      </w:r>
+      <w:r>
+        <w:rPr>
+          <w:szCs w:val="22"/>
+        </w:rPr>
+        <w:t>follow-up</w:t>
+      </w:r>
+      <w:r>
+        <w:rPr>
+          <w:szCs w:val="22"/>
+        </w:rPr>
+        <w:t xml:space="preserve">, Kraljic et al. (2008) found that </w:t>
+      </w:r>
+      <w:r>
+        <w:rPr>
+          <w:szCs w:val="22"/>
+        </w:rPr>
+        <w:t>this</w:t>
+      </w:r>
+      <w:r>
+        <w:rPr>
+          <w:szCs w:val="22"/>
+        </w:rPr>
+        <w:t xml:space="preserve"> perceptual recalibration</w:t>
+      </w:r>
+      <w:r>
+        <w:rPr>
+          <w:szCs w:val="22"/>
+        </w:rPr>
+        <w:t xml:space="preserve"> effect</w:t>
+      </w:r>
+      <w:r>
+        <w:rPr>
+          <w:szCs w:val="22"/>
+        </w:rPr>
+        <w:t xml:space="preserve">—the difference between </w:t>
+      </w:r>
+      <w:r>
+        <w:rPr>
+          <w:szCs w:val="22"/>
+        </w:rPr>
+        <w:t>/ʃ/</w:t>
+      </w:r>
+      <w:r>
+        <w:rPr>
+          <w:szCs w:val="22"/>
+        </w:rPr>
+        <w:t xml:space="preserve">- and </w:t>
+      </w:r>
+      <w:r>
+        <w:rPr>
+          <w:szCs w:val="22"/>
+        </w:rPr>
+        <w:t>/</w:t>
+      </w:r>
+      <w:r>
+        <w:rPr>
+          <w:szCs w:val="22"/>
+        </w:rPr>
+        <w:t>s</w:t>
+      </w:r>
+      <w:r>
+        <w:rPr>
+          <w:szCs w:val="22"/>
+        </w:rPr>
+        <w:t>/</w:t>
+      </w:r>
+      <w:r>
+        <w:rPr>
+          <w:szCs w:val="22"/>
+        </w:rPr>
+        <w:t xml:space="preserve">-biased exposure during </w:t>
+      </w:r>
+      <w:r>
+        <w:rPr>
+          <w:szCs w:val="22"/>
+        </w:rPr>
+        <w:t xml:space="preserve">the audio-only </w:t>
+      </w:r>
+      <w:r>
+        <w:rPr>
+          <w:szCs w:val="22"/>
+        </w:rPr>
+        <w:t>test</w:t>
+      </w:r>
+      <w:r>
+        <w:rPr>
+          <w:szCs w:val="22"/>
+        </w:rPr>
+        <w:t xml:space="preserve"> </w:t>
+      </w:r>
+      <w:r>
+        <w:rPr>
+          <w:szCs w:val="22"/>
+        </w:rPr>
+        <w:t>phase—</w:t>
+      </w:r>
+      <w:r>
+        <w:rPr>
+          <w:szCs w:val="22"/>
+        </w:rPr>
+        <w:t>is</w:t>
+      </w:r>
+      <w:r>
+        <w:rPr>
+          <w:szCs w:val="22"/>
+        </w:rPr>
+        <w:t xml:space="preserve"> blocked</w:t>
+      </w:r>
+      <w:r>
+        <w:rPr>
+          <w:szCs w:val="22"/>
+        </w:rPr>
+        <w:t xml:space="preserve"> </w:t>
+      </w:r>
+      <w:r>
+        <w:rPr>
+          <w:szCs w:val="22"/>
+        </w:rPr>
+        <w:t>when the talker ha</w:t>
+      </w:r>
+      <w:r>
+        <w:rPr>
+          <w:szCs w:val="22"/>
+        </w:rPr>
+        <w:t>d</w:t>
+      </w:r>
+      <w:r>
+        <w:rPr>
+          <w:szCs w:val="22"/>
+        </w:rPr>
+        <w:t xml:space="preserve"> a pen in the mouth during the </w:t>
+      </w:r>
+      <w:r>
+        <w:rPr>
+          <w:szCs w:val="22"/>
+        </w:rPr>
+        <w:t xml:space="preserve">pronunciation of the </w:t>
+      </w:r>
+      <w:r>
+        <w:rPr>
+          <w:szCs w:val="22"/>
+        </w:rPr>
+        <w:t xml:space="preserve">critical shifted </w:t>
+      </w:r>
+      <w:r>
+        <w:rPr>
+          <w:szCs w:val="22"/>
+        </w:rPr>
+        <w:t>exposure tokens</w:t>
+      </w:r>
+      <w:r>
+        <w:rPr>
+          <w:szCs w:val="22"/>
+        </w:rPr>
+        <w:t xml:space="preserve">. When the pen was instead in the hand during the shifted </w:t>
+      </w:r>
+      <w:r>
+        <w:rPr>
+          <w:szCs w:val="22"/>
+        </w:rPr>
+        <w:t>tokens</w:t>
+      </w:r>
+      <w:r>
+        <w:rPr>
+          <w:szCs w:val="22"/>
+        </w:rPr>
+        <w:t>, listeners again exhibited perceptual recalibration</w:t>
+      </w:r>
+      <w:r>
+        <w:rPr>
+          <w:szCs w:val="22"/>
+        </w:rPr>
+        <w:t>.</w:t>
       </w:r>
     </w:p>
     <w:p>
       <w:pPr>
         <w:rPr>
           <w:szCs w:val="22"/>
-          <w:highlight w:val="yellow"/>
-        </w:rPr>
-      </w:pPr>
-      <w:r>
-        <w:rPr>
-          <w:szCs w:val="22"/>
-        </w:rPr>
-        <w:t>The results of Experiment 2—the absence of compensation in the absence of direct visual evidence that lip shape was indeed affected by the pen—</w:t>
-      </w:r>
-      <w:r>
-        <w:rPr>
-          <w:szCs w:val="22"/>
-        </w:rPr>
-        <w:t>replicates for non-phonetic context, what has previously been demonstrated for phonetic context: compensation for visually presented context seems to be substantially reduced or no longer observed when the relevant articulatory effects are no</w:t>
-      </w:r>
-      <w:r>
-        <w:rPr>
-          <w:szCs w:val="22"/>
-        </w:rPr>
-        <w:t xml:space="preserve">t </w:t>
-      </w:r>
-      <w:r>
-        <w:rPr>
-          <w:szCs w:val="22"/>
-        </w:rPr>
-        <w:t>visually evident during the articulation of the target sound</w:t>
-      </w:r>
-      <w:r>
-        <w:rPr>
-          <w:szCs w:val="22"/>
-        </w:rPr>
-        <w:t xml:space="preserve"> (Holt et al., 2005</w:t>
-      </w:r>
-      <w:r>
-        <w:rPr>
-          <w:szCs w:val="22"/>
-        </w:rPr>
-        <w:t>; Viswanathan &amp; Stephens, 2016).</w:t>
-      </w:r>
-      <w:r>
-        <w:rPr>
-          <w:szCs w:val="22"/>
-          <w:highlight w:val="yellow"/>
+        </w:rPr>
+      </w:pPr>
+      <w:r>
+        <w:rPr>
+          <w:szCs w:val="22"/>
+        </w:rPr>
+        <w:t>While this blocking effect has since been replicated multiple times, the mechanisms underlying the effect remain unclear</w:t>
+      </w:r>
+      <w:r>
+        <w:rPr>
+          <w:szCs w:val="22"/>
+        </w:rPr>
+        <w:t xml:space="preserve"> (</w:t>
+      </w:r>
+      <w:r>
+        <w:rPr>
+          <w:szCs w:val="22"/>
+        </w:rPr>
+        <w:t xml:space="preserve">see discussion in </w:t>
+      </w:r>
+      <w:r>
+        <w:rPr>
+          <w:szCs w:val="22"/>
+        </w:rPr>
+        <w:t>Kraljic &amp; Samuel, 2011; Liu &amp; Jaeger, 2018).</w:t>
+      </w:r>
+      <w:r>
+        <w:rPr>
+          <w:szCs w:val="22"/>
         </w:rPr>
         <w:t xml:space="preserve"> </w:t>
       </w:r>
-    </w:p>
-    <w:p>
-      <w:pPr>
-        <w:rPr>
-          <w:szCs w:val="22"/>
-        </w:rPr>
-      </w:pPr>
-      <w:r>
-        <w:rPr>
-          <w:szCs w:val="22"/>
-        </w:rPr>
-        <w:t xml:space="preserve">The present results also raise </w:t>
-      </w:r>
-      <w:proofErr w:type="gramStart"/>
-      <w:r>
-        <w:rPr>
-          <w:szCs w:val="22"/>
-        </w:rPr>
-        <w:t>a number of</w:t>
-      </w:r>
-      <w:proofErr w:type="gramEnd"/>
-      <w:r>
-        <w:rPr>
-          <w:szCs w:val="22"/>
-        </w:rPr>
-        <w:t xml:space="preserve"> questions for future research on compensation and adaptive speech perception more broadly. We briefly discuss t</w:t>
-      </w:r>
-      <w:r>
-        <w:rPr>
-          <w:szCs w:val="22"/>
-        </w:rPr>
-        <w:t>wo</w:t>
-      </w:r>
-      <w:r>
-        <w:rPr>
-          <w:szCs w:val="22"/>
-        </w:rPr>
-        <w:t>. First, our findings leave open whether compensation for visually evident effects of non-phonological causes—like the pen—draws on the same neural mechanisms as normalization/compensation for the effects of phonetic contexts. The present findings only suggest that Fowler’s compensation account provides a unifying explanation for the qualitative consequences of both phenomena. It is unclear, for example, whether compensation for visually</w:t>
+      <w:r>
+        <w:rPr>
+          <w:szCs w:val="22"/>
+        </w:rPr>
+        <w:t xml:space="preserve">For instance, Kraljic et al. (2008) attributing the blocking effect to “pragmatic” reasoning that prevents perceptual learning for </w:t>
+      </w:r>
+      <w:r>
+        <w:rPr>
+          <w:szCs w:val="22"/>
+        </w:rPr>
+        <w:t>“</w:t>
+      </w:r>
+      <w:r>
+        <w:rPr>
+          <w:szCs w:val="22"/>
+        </w:rPr>
+        <w:t>incidental</w:t>
+      </w:r>
+      <w:r>
+        <w:rPr>
+          <w:szCs w:val="22"/>
+        </w:rPr>
+        <w:t>”</w:t>
       </w:r>
       <w:r>
         <w:rPr>
@@ -22968,669 +23794,92 @@
         <w:rPr>
           <w:szCs w:val="22"/>
         </w:rPr>
-        <w:t>presented non-phonetic context take</w:t>
-      </w:r>
-      <w:r>
-        <w:rPr>
-          <w:szCs w:val="22"/>
-        </w:rPr>
-        <w:t>s</w:t>
-      </w:r>
-      <w:r>
-        <w:rPr>
-          <w:szCs w:val="22"/>
-        </w:rPr>
-        <w:t xml:space="preserve"> place in the same brain areas that are responsible for audiovisual integration during speech perception, and whether those areas also process compensation for preceding phonetic context. Alternatively, compensation </w:t>
-      </w:r>
-      <w:r>
-        <w:rPr>
-          <w:szCs w:val="22"/>
-        </w:rPr>
-        <w:lastRenderedPageBreak/>
-        <w:t>might take place at multiple points in the processing of speech input.</w:t>
-      </w:r>
-    </w:p>
-    <w:p>
-      <w:pPr>
-        <w:rPr>
-          <w:szCs w:val="22"/>
-        </w:rPr>
-      </w:pPr>
-      <w:r>
-        <w:rPr>
-          <w:szCs w:val="22"/>
-        </w:rPr>
-        <w:t>Second and f</w:t>
-      </w:r>
-      <w:r>
-        <w:rPr>
-          <w:szCs w:val="22"/>
-        </w:rPr>
-        <w:t xml:space="preserve">inally, the </w:t>
-      </w:r>
-      <w:r>
-        <w:rPr>
-          <w:szCs w:val="22"/>
-        </w:rPr>
-        <w:t xml:space="preserve">present </w:t>
-      </w:r>
-      <w:r>
-        <w:rPr>
-          <w:szCs w:val="22"/>
-        </w:rPr>
-        <w:t xml:space="preserve">results raise questions for future research on perceptual recalibration. </w:t>
-      </w:r>
-      <w:r>
-        <w:rPr>
-          <w:szCs w:val="22"/>
-        </w:rPr>
-        <w:t xml:space="preserve">As mentioned in the introduction, previous </w:t>
-      </w:r>
-      <w:r>
-        <w:rPr>
-          <w:szCs w:val="22"/>
-        </w:rPr>
-        <w:t>work has found that perceptual recalibration to an unfamiliar talker’s speech can be blocked when the unexpected pronunciations occur while the talker has a pen in the mouth. In perceptual recalibration experiments, listeners are exp</w:t>
-      </w:r>
-      <w:r>
-        <w:rPr>
-          <w:szCs w:val="22"/>
-        </w:rPr>
-        <w:t>osed</w:t>
-      </w:r>
-      <w:r>
-        <w:rPr>
-          <w:szCs w:val="22"/>
-        </w:rPr>
-        <w:t xml:space="preserve"> to speech from an unfamiliar talker for which the realization of a particular sound is shifted towards a neighboring category. For example, Kraljic &amp; Samuel (2006) exposed listeners to either typical </w:t>
-      </w:r>
-      <w:r>
-        <w:rPr>
-          <w:szCs w:val="22"/>
-        </w:rPr>
-        <w:t>/ʃ/</w:t>
-      </w:r>
-      <w:r>
-        <w:rPr>
-          <w:szCs w:val="22"/>
-        </w:rPr>
-        <w:t xml:space="preserve"> sounds and s</w:t>
-      </w:r>
-      <w:r>
-        <w:rPr>
-          <w:szCs w:val="22"/>
-        </w:rPr>
-        <w:t>ounds ambiguous between /s/ and /ʃ/ but in lexical contexts favoring /s/ interpretation</w:t>
-      </w:r>
-      <w:r>
-        <w:rPr>
-          <w:szCs w:val="22"/>
-        </w:rPr>
-        <w:t xml:space="preserve"> (e.g., </w:t>
-      </w:r>
-      <w:proofErr w:type="spellStart"/>
+        <w:t>changes in pronunciation</w:t>
+      </w:r>
+      <w:r>
+        <w:rPr>
+          <w:szCs w:val="22"/>
+        </w:rPr>
+        <w:t xml:space="preserve">—like </w:t>
+      </w:r>
+      <w:r>
+        <w:rPr>
+          <w:szCs w:val="22"/>
+        </w:rPr>
+        <w:t xml:space="preserve">those arising </w:t>
+      </w:r>
+      <w:r>
+        <w:rPr>
+          <w:szCs w:val="22"/>
+        </w:rPr>
+        <w:t>a pen is in the mouth</w:t>
+      </w:r>
+      <w:r>
+        <w:rPr>
+          <w:szCs w:val="22"/>
+        </w:rPr>
+        <w:t xml:space="preserve">—while allowing perceptual learning for changes that are considered “characteristic” of the talker’s speech. Based on a series of new experiments, Kraljic and Samuel (2011) revised this account, suggesting instead that audiovisual inputs with a pen in the mouth are stored as separate exemplars that do not affect listeners’ categorization decisions for audio-only speech inputs—i.e., the type of speech input that has been used in the test phase of </w:t>
+      </w:r>
       <w:r>
         <w:rPr>
           <w:i/>
           <w:iCs/>
           <w:szCs w:val="22"/>
         </w:rPr>
-        <w:t>dinoshaur</w:t>
-      </w:r>
-      <w:proofErr w:type="spellEnd"/>
-      <w:r>
-        <w:rPr>
-          <w:szCs w:val="22"/>
-        </w:rPr>
-        <w:t xml:space="preserve">, </w:t>
-      </w:r>
-      <w:r>
-        <w:rPr>
-          <w:szCs w:val="22"/>
-        </w:rPr>
-        <w:t>/s/</w:t>
-      </w:r>
-      <w:r>
-        <w:rPr>
-          <w:szCs w:val="22"/>
-        </w:rPr>
-        <w:t>-biased exposure</w:t>
-      </w:r>
-      <w:r>
-        <w:rPr>
-          <w:szCs w:val="22"/>
-        </w:rPr>
-        <w:t xml:space="preserve">) or to typical </w:t>
-      </w:r>
-      <w:r>
-        <w:rPr>
-          <w:szCs w:val="22"/>
-        </w:rPr>
-        <w:t>/s/</w:t>
-      </w:r>
-      <w:r>
-        <w:rPr>
-          <w:szCs w:val="22"/>
-        </w:rPr>
-        <w:t xml:space="preserve"> sounds and </w:t>
-      </w:r>
-      <w:r>
-        <w:rPr>
-          <w:szCs w:val="22"/>
-        </w:rPr>
-        <w:t>ambiguous sounds rather in /ʃ/-favoring contexts</w:t>
-      </w:r>
-      <w:r>
-        <w:rPr>
-          <w:szCs w:val="22"/>
-        </w:rPr>
-        <w:t xml:space="preserve"> (e.g., </w:t>
-      </w:r>
-      <w:proofErr w:type="spellStart"/>
+        <w:t>all</w:t>
+      </w:r>
+      <w:r>
+        <w:rPr>
+          <w:szCs w:val="22"/>
+        </w:rPr>
+        <w:t xml:space="preserve"> perceptual </w:t>
+      </w:r>
+      <w:r>
+        <w:rPr>
+          <w:szCs w:val="22"/>
+        </w:rPr>
+        <w:lastRenderedPageBreak/>
+        <w:t xml:space="preserve">recalibration experiments on this question to date. </w:t>
+      </w:r>
+      <w:r>
+        <w:rPr>
+          <w:szCs w:val="22"/>
+        </w:rPr>
+        <w:t>However, based on additional experiments</w:t>
+      </w:r>
+      <w:r>
+        <w:rPr>
+          <w:szCs w:val="22"/>
+        </w:rPr>
+        <w:t>, Liu and Jaeger (2018) argued that the existing data were, in fact, more compatible with an account more along the lines of the original proposal by Kraljic et al. (2008)</w:t>
+      </w:r>
+      <w:r>
+        <w:rPr>
+          <w:szCs w:val="22"/>
+        </w:rPr>
+        <w:t xml:space="preserve">—as inference under uncertainty about the </w:t>
+      </w:r>
       <w:r>
         <w:rPr>
           <w:i/>
           <w:iCs/>
           <w:szCs w:val="22"/>
         </w:rPr>
-        <w:t>ma</w:t>
-      </w:r>
-      <w:r>
-        <w:rPr>
-          <w:i/>
-          <w:iCs/>
-          <w:szCs w:val="22"/>
-        </w:rPr>
-        <w:t>s</w:t>
-      </w:r>
-      <w:r>
-        <w:rPr>
-          <w:i/>
-          <w:iCs/>
-          <w:szCs w:val="22"/>
-        </w:rPr>
-        <w:t>inery</w:t>
-      </w:r>
-      <w:proofErr w:type="spellEnd"/>
-      <w:r>
-        <w:rPr>
-          <w:szCs w:val="22"/>
-        </w:rPr>
-        <w:t xml:space="preserve">, </w:t>
-      </w:r>
-      <w:r>
-        <w:rPr>
-          <w:szCs w:val="22"/>
-        </w:rPr>
-        <w:t>/ʃ/-</w:t>
-      </w:r>
-      <w:r>
-        <w:rPr>
-          <w:szCs w:val="22"/>
-        </w:rPr>
-        <w:t>biased exposure</w:t>
-      </w:r>
-      <w:r>
-        <w:rPr>
-          <w:szCs w:val="22"/>
-        </w:rPr>
-        <w:t xml:space="preserve">), </w:t>
-      </w:r>
-      <w:r>
-        <w:rPr>
-          <w:szCs w:val="22"/>
-        </w:rPr>
-        <w:t>mixed with many filler stimuli. Following exposure, listeners were tested on an audio-only</w:t>
-      </w:r>
-      <w:r>
-        <w:rPr>
-          <w:i/>
-          <w:iCs/>
+        <w:t>causes</w:t>
+      </w:r>
+      <w:r>
+        <w:rPr>
+          <w:szCs w:val="22"/>
+        </w:rPr>
+        <w:t xml:space="preserve"> for the unexpected pronunciations.</w:t>
+      </w:r>
+      <w:r>
+        <w:rPr>
           <w:szCs w:val="22"/>
         </w:rPr>
         <w:t xml:space="preserve"> </w:t>
       </w:r>
-      <w:proofErr w:type="spellStart"/>
-      <w:r>
-        <w:rPr>
-          <w:i/>
-          <w:iCs/>
-          <w:szCs w:val="22"/>
-        </w:rPr>
-        <w:t>asi-ashi</w:t>
-      </w:r>
-      <w:proofErr w:type="spellEnd"/>
-      <w:r>
-        <w:rPr>
-          <w:szCs w:val="22"/>
-        </w:rPr>
-        <w:t xml:space="preserve"> continuum. As is typical for </w:t>
-      </w:r>
-      <w:r>
-        <w:rPr>
-          <w:szCs w:val="22"/>
-        </w:rPr>
-        <w:t xml:space="preserve">such </w:t>
-      </w:r>
-      <w:r>
-        <w:rPr>
-          <w:szCs w:val="22"/>
-        </w:rPr>
-        <w:t>perceptual recalibration</w:t>
-      </w:r>
-      <w:r>
-        <w:rPr>
-          <w:szCs w:val="22"/>
-        </w:rPr>
-        <w:t xml:space="preserve"> experiments, </w:t>
-      </w:r>
-      <w:r>
-        <w:rPr>
-          <w:szCs w:val="22"/>
-        </w:rPr>
-        <w:t>/ʃ/-</w:t>
-      </w:r>
-      <w:r>
-        <w:rPr>
-          <w:szCs w:val="22"/>
-        </w:rPr>
-        <w:t>biased</w:t>
-      </w:r>
-      <w:r>
-        <w:rPr>
-          <w:szCs w:val="22"/>
-        </w:rPr>
-        <w:t xml:space="preserve"> </w:t>
-      </w:r>
-      <w:r>
-        <w:rPr>
-          <w:szCs w:val="22"/>
-        </w:rPr>
-        <w:t>exposure caused listeners to</w:t>
-      </w:r>
-      <w:r>
-        <w:rPr>
-          <w:szCs w:val="22"/>
-        </w:rPr>
-        <w:t xml:space="preserve"> categorize more tokens along the </w:t>
-      </w:r>
-      <w:r>
-        <w:rPr>
-          <w:szCs w:val="22"/>
-        </w:rPr>
-        <w:t xml:space="preserve">test </w:t>
-      </w:r>
-      <w:r>
-        <w:rPr>
-          <w:szCs w:val="22"/>
-        </w:rPr>
-        <w:t xml:space="preserve">continuum as </w:t>
-      </w:r>
-      <w:proofErr w:type="spellStart"/>
-      <w:r>
-        <w:rPr>
-          <w:i/>
-          <w:iCs/>
-          <w:szCs w:val="22"/>
-        </w:rPr>
-        <w:t>ashi</w:t>
-      </w:r>
-      <w:proofErr w:type="spellEnd"/>
-      <w:r>
-        <w:rPr>
-          <w:szCs w:val="22"/>
-        </w:rPr>
-        <w:t xml:space="preserve">, compared to </w:t>
-      </w:r>
-      <w:r>
-        <w:rPr>
-          <w:szCs w:val="22"/>
-        </w:rPr>
-        <w:t>/s/-</w:t>
-      </w:r>
-      <w:r>
-        <w:rPr>
-          <w:szCs w:val="22"/>
-        </w:rPr>
-        <w:t>biased exposure</w:t>
-      </w:r>
-      <w:r>
-        <w:rPr>
-          <w:szCs w:val="22"/>
-        </w:rPr>
-        <w:t xml:space="preserve">. In a thought-provoking </w:t>
-      </w:r>
-      <w:r>
-        <w:rPr>
-          <w:szCs w:val="22"/>
-        </w:rPr>
-        <w:t>follow-up</w:t>
-      </w:r>
-      <w:r>
-        <w:rPr>
-          <w:szCs w:val="22"/>
-        </w:rPr>
-        <w:t xml:space="preserve">, Kraljic et al. (2008) found that </w:t>
-      </w:r>
-      <w:r>
-        <w:rPr>
-          <w:szCs w:val="22"/>
-        </w:rPr>
-        <w:t>this</w:t>
-      </w:r>
-      <w:r>
-        <w:rPr>
-          <w:szCs w:val="22"/>
-        </w:rPr>
-        <w:t xml:space="preserve"> perceptual recalibration</w:t>
-      </w:r>
-      <w:r>
-        <w:rPr>
-          <w:szCs w:val="22"/>
-        </w:rPr>
-        <w:t xml:space="preserve"> effect</w:t>
-      </w:r>
-      <w:r>
-        <w:rPr>
-          <w:szCs w:val="22"/>
-        </w:rPr>
-        <w:t xml:space="preserve">—the difference between </w:t>
-      </w:r>
-      <w:r>
-        <w:rPr>
-          <w:szCs w:val="22"/>
-        </w:rPr>
-        <w:t>/ʃ/</w:t>
-      </w:r>
-      <w:r>
-        <w:rPr>
-          <w:szCs w:val="22"/>
-        </w:rPr>
-        <w:t xml:space="preserve">- and </w:t>
-      </w:r>
-      <w:r>
-        <w:rPr>
-          <w:szCs w:val="22"/>
-        </w:rPr>
-        <w:t>/</w:t>
-      </w:r>
-      <w:r>
-        <w:rPr>
-          <w:szCs w:val="22"/>
-        </w:rPr>
-        <w:t>s</w:t>
-      </w:r>
-      <w:r>
-        <w:rPr>
-          <w:szCs w:val="22"/>
-        </w:rPr>
-        <w:t>/</w:t>
-      </w:r>
-      <w:r>
-        <w:rPr>
-          <w:szCs w:val="22"/>
-        </w:rPr>
-        <w:t xml:space="preserve">-biased exposure during </w:t>
-      </w:r>
-      <w:r>
-        <w:rPr>
-          <w:szCs w:val="22"/>
-        </w:rPr>
-        <w:t xml:space="preserve">the audio-only </w:t>
-      </w:r>
-      <w:r>
-        <w:rPr>
-          <w:szCs w:val="22"/>
-        </w:rPr>
-        <w:t>test</w:t>
-      </w:r>
-      <w:r>
-        <w:rPr>
-          <w:szCs w:val="22"/>
-        </w:rPr>
-        <w:t xml:space="preserve"> </w:t>
-      </w:r>
-      <w:r>
-        <w:rPr>
-          <w:szCs w:val="22"/>
-        </w:rPr>
-        <w:t>phase—</w:t>
-      </w:r>
-      <w:r>
-        <w:rPr>
-          <w:szCs w:val="22"/>
-        </w:rPr>
-        <w:t>is</w:t>
-      </w:r>
-      <w:r>
-        <w:rPr>
-          <w:szCs w:val="22"/>
-        </w:rPr>
-        <w:t xml:space="preserve"> blocked</w:t>
-      </w:r>
-      <w:r>
-        <w:rPr>
-          <w:szCs w:val="22"/>
-        </w:rPr>
-        <w:t xml:space="preserve"> </w:t>
-      </w:r>
-      <w:r>
-        <w:rPr>
-          <w:szCs w:val="22"/>
-        </w:rPr>
-        <w:t>when the talker ha</w:t>
-      </w:r>
-      <w:r>
-        <w:rPr>
-          <w:szCs w:val="22"/>
-        </w:rPr>
-        <w:t>d</w:t>
-      </w:r>
-      <w:r>
-        <w:rPr>
-          <w:szCs w:val="22"/>
-        </w:rPr>
-        <w:t xml:space="preserve"> a pen in the mouth during the </w:t>
-      </w:r>
-      <w:r>
-        <w:rPr>
-          <w:szCs w:val="22"/>
-        </w:rPr>
-        <w:t xml:space="preserve">pronunciation of the </w:t>
-      </w:r>
-      <w:r>
-        <w:rPr>
-          <w:szCs w:val="22"/>
-        </w:rPr>
-        <w:t xml:space="preserve">critical shifted </w:t>
-      </w:r>
-      <w:r>
-        <w:rPr>
-          <w:szCs w:val="22"/>
-        </w:rPr>
-        <w:t>exposure tokens</w:t>
-      </w:r>
-      <w:r>
-        <w:rPr>
-          <w:szCs w:val="22"/>
-        </w:rPr>
-        <w:t xml:space="preserve">. When the pen was instead in the hand during the shifted </w:t>
-      </w:r>
-      <w:r>
-        <w:rPr>
-          <w:szCs w:val="22"/>
-        </w:rPr>
-        <w:t>tokens</w:t>
-      </w:r>
-      <w:r>
-        <w:rPr>
-          <w:szCs w:val="22"/>
-        </w:rPr>
-        <w:t>, listeners again exhibited perceptual recalibration</w:t>
-      </w:r>
-      <w:r>
-        <w:rPr>
-          <w:szCs w:val="22"/>
-        </w:rPr>
-        <w:t>.</w:t>
-      </w:r>
-    </w:p>
-    <w:p>
-      <w:pPr>
-        <w:rPr>
-          <w:szCs w:val="22"/>
-        </w:rPr>
-      </w:pPr>
-      <w:r>
-        <w:rPr>
-          <w:szCs w:val="22"/>
-        </w:rPr>
-        <w:t>While this blocking effect has since been replicated multiple times, the mechanisms underlying the effect remain unclear</w:t>
-      </w:r>
-      <w:r>
-        <w:rPr>
-          <w:szCs w:val="22"/>
-        </w:rPr>
-        <w:t xml:space="preserve"> (</w:t>
-      </w:r>
-      <w:r>
-        <w:rPr>
-          <w:szCs w:val="22"/>
-        </w:rPr>
-        <w:t xml:space="preserve">see discussion in </w:t>
-      </w:r>
-      <w:r>
-        <w:rPr>
-          <w:szCs w:val="22"/>
-        </w:rPr>
-        <w:t>Kraljic &amp; Samuel, 2011; Liu &amp; Jaeger, 2018).</w:t>
-      </w:r>
-      <w:r>
-        <w:rPr>
-          <w:szCs w:val="22"/>
-        </w:rPr>
-        <w:t xml:space="preserve"> </w:t>
-      </w:r>
-      <w:r>
-        <w:rPr>
-          <w:szCs w:val="22"/>
-        </w:rPr>
-        <w:t xml:space="preserve">For instance, Kraljic et al. (2008) attributing the blocking effect to “pragmatic” reasoning that prevents perceptual learning for </w:t>
-      </w:r>
-      <w:r>
-        <w:rPr>
-          <w:szCs w:val="22"/>
-        </w:rPr>
-        <w:t>“</w:t>
-      </w:r>
-      <w:r>
-        <w:rPr>
-          <w:szCs w:val="22"/>
-        </w:rPr>
-        <w:t>incidental</w:t>
-      </w:r>
-      <w:r>
-        <w:rPr>
-          <w:szCs w:val="22"/>
-        </w:rPr>
-        <w:t>”</w:t>
-      </w:r>
-      <w:r>
-        <w:rPr>
-          <w:szCs w:val="22"/>
-        </w:rPr>
-        <w:t xml:space="preserve"> </w:t>
-      </w:r>
-      <w:r>
-        <w:rPr>
-          <w:szCs w:val="22"/>
-        </w:rPr>
-        <w:t>changes in pronunciation</w:t>
-      </w:r>
-      <w:r>
-        <w:rPr>
-          <w:szCs w:val="22"/>
-        </w:rPr>
-        <w:t xml:space="preserve">—like </w:t>
-      </w:r>
-      <w:r>
-        <w:rPr>
-          <w:szCs w:val="22"/>
-        </w:rPr>
-        <w:t xml:space="preserve">those arising </w:t>
-      </w:r>
-      <w:r>
-        <w:rPr>
-          <w:szCs w:val="22"/>
-        </w:rPr>
-        <w:t>a pen is in the mouth</w:t>
-      </w:r>
-      <w:r>
-        <w:rPr>
-          <w:szCs w:val="22"/>
-        </w:rPr>
-        <w:t xml:space="preserve">—while allowing perceptual learning for changes that are considered “characteristic” of the talker’s speech. Based on a series of new experiments, Kraljic and Samuel (2011) revised this account, suggesting instead that audiovisual inputs with a pen in the mouth are </w:t>
-      </w:r>
-      <w:r>
-        <w:rPr>
-          <w:szCs w:val="22"/>
-        </w:rPr>
-        <w:lastRenderedPageBreak/>
-        <w:t xml:space="preserve">stored as separate exemplars that do not affect listeners’ categorization decisions for audio-only speech inputs—i.e., the type of speech input that has been used in the test phase of </w:t>
-      </w:r>
-      <w:r>
-        <w:rPr>
-          <w:i/>
-          <w:iCs/>
-          <w:szCs w:val="22"/>
-        </w:rPr>
-        <w:t>all</w:t>
-      </w:r>
-      <w:r>
-        <w:rPr>
-          <w:szCs w:val="22"/>
-        </w:rPr>
-        <w:t xml:space="preserve"> perceptual recalibration experiments on this question to date. </w:t>
-      </w:r>
-      <w:r>
-        <w:rPr>
-          <w:szCs w:val="22"/>
-        </w:rPr>
-        <w:t>However, based on additional experiments</w:t>
-      </w:r>
-      <w:r>
-        <w:rPr>
-          <w:szCs w:val="22"/>
-        </w:rPr>
-        <w:t>, Liu and Jaeger (2018) argued that the existing data were, in fact, more compatible with an account more along the lines of the original proposal by Kraljic et al. (2008)</w:t>
-      </w:r>
-      <w:r>
-        <w:rPr>
-          <w:szCs w:val="22"/>
-        </w:rPr>
-        <w:t xml:space="preserve">—as inference under uncertainty about the </w:t>
-      </w:r>
-      <w:r>
-        <w:rPr>
-          <w:i/>
-          <w:iCs/>
-          <w:szCs w:val="22"/>
-        </w:rPr>
-        <w:t>causes</w:t>
-      </w:r>
-      <w:r>
-        <w:rPr>
-          <w:szCs w:val="22"/>
-        </w:rPr>
-        <w:t xml:space="preserve"> for the unexpected pronunciations.</w:t>
-      </w:r>
-      <w:r>
-        <w:rPr>
-          <w:szCs w:val="22"/>
-        </w:rPr>
-        <w:t xml:space="preserve"> </w:t>
-      </w:r>
-      <w:del w:id="110" w:author="Jaeger, Florian" w:date="2025-05-21T14:34:00Z" w16du:dateUtc="2025-05-21T18:34:00Z">
+      <w:del w:id="151" w:author="Jaeger, Florian" w:date="2025-05-21T14:34:00Z" w16du:dateUtc="2025-05-21T18:34:00Z">
         <w:r>
           <w:rPr>
             <w:szCs w:val="22"/>
@@ -23638,7 +23887,7 @@
           <w:delText xml:space="preserve">While some of these accounts (in particular the causal inference account) have conceptual similarities to compensation, </w:delText>
         </w:r>
       </w:del>
-      <w:del w:id="111" w:author="Jaeger, Florian" w:date="2025-05-21T14:33:00Z" w16du:dateUtc="2025-05-21T18:33:00Z">
+      <w:del w:id="152" w:author="Jaeger, Florian" w:date="2025-05-21T14:33:00Z" w16du:dateUtc="2025-05-21T18:33:00Z">
         <w:r>
           <w:rPr>
             <w:szCs w:val="22"/>
@@ -24065,26 +24314,26 @@
         <w:rPr>
           <w:szCs w:val="22"/>
         </w:rPr>
-        <w:t xml:space="preserve">If an explanation along these lines </w:t>
+        <w:t>If an explanation along these lines turns out to be correct, this would also preempt the need to evoke memory (Kraljic &amp; Samuel, 2011) or learning mechanisms (Kraljic et al., 2008).</w:t>
+      </w:r>
+      <w:r>
+        <w:rPr>
+          <w:szCs w:val="22"/>
+        </w:rPr>
+        <w:t xml:space="preserve"> </w:t>
+      </w:r>
+      <w:r>
+        <w:rPr>
+          <w:szCs w:val="22"/>
+        </w:rPr>
+        <w:t xml:space="preserve">We consider this an interesting possibility to be </w:t>
       </w:r>
       <w:r>
         <w:rPr>
           <w:szCs w:val="22"/>
         </w:rPr>
         <w:lastRenderedPageBreak/>
-        <w:t>turns out to be correct, this would also preempt the need to evoke memory (Kraljic &amp; Samuel, 2011) or learning mechanisms (Kraljic et al., 2008).</w:t>
-      </w:r>
-      <w:r>
-        <w:rPr>
-          <w:szCs w:val="22"/>
-        </w:rPr>
-        <w:t xml:space="preserve"> </w:t>
-      </w:r>
-      <w:r>
-        <w:rPr>
-          <w:szCs w:val="22"/>
-        </w:rPr>
-        <w:t>We consider this an interesting possibility to be explored in future research.</w:t>
+        <w:t>explored in future research.</w:t>
       </w:r>
     </w:p>
     <w:p>
@@ -26956,6 +27205,44 @@
       </w:r>
     </w:p>
   </w:comment>
+  <w:comment w:id="97" w:author="Jaeger, Florian" w:date="2025-05-24T19:04:00Z" w:initials="TJ">
+    <w:p>
+      <w:pPr>
+        <w:jc w:val="left"/>
+      </w:pPr>
+      <w:r>
+        <w:rPr>
+          <w:rStyle w:val="CommentReference"/>
+        </w:rPr>
+        <w:annotationRef/>
+      </w:r>
+      <w:r>
+        <w:rPr>
+          <w:color w:val="000000"/>
+        </w:rPr>
+        <w:t>@Shawn, please see updated numbers in SI?</w:t>
+      </w:r>
+    </w:p>
+  </w:comment>
+  <w:comment w:id="140" w:author="Jaeger, Florian" w:date="2025-05-24T19:04:00Z" w:initials="TJ">
+    <w:p>
+      <w:pPr>
+        <w:jc w:val="left"/>
+      </w:pPr>
+      <w:r>
+        <w:rPr>
+          <w:rStyle w:val="CommentReference"/>
+        </w:rPr>
+        <w:annotationRef/>
+      </w:r>
+      <w:r>
+        <w:rPr>
+          <w:color w:val="000000"/>
+        </w:rPr>
+        <w:t>@Shawn, please see updated numbers in SI?</w:t>
+      </w:r>
+    </w:p>
+  </w:comment>
 </w:comments>
 </file>
 
@@ -26968,6 +27255,8 @@
   <w15:commentEx w15:paraId="0CC8A972" w15:done="0"/>
   <w15:commentEx w15:paraId="5574534F" w15:paraIdParent="0CC8A972" w15:done="0"/>
   <w15:commentEx w15:paraId="3C03F9D0" w15:done="0"/>
+  <w15:commentEx w15:paraId="2EBB6485" w15:done="0"/>
+  <w15:commentEx w15:paraId="350C2CF8" w15:done="0"/>
 </w15:commentsEx>
 </file>
 
@@ -26980,6 +27269,8 @@
   <w16cex:commentExtensible w16cex:durableId="6BE9660C" w16cex:dateUtc="2025-05-11T20:19:00Z"/>
   <w16cex:commentExtensible w16cex:durableId="0D181876" w16cex:dateUtc="2025-05-13T00:37:00Z"/>
   <w16cex:commentExtensible w16cex:durableId="3D3EEDCC" w16cex:dateUtc="2025-05-22T18:47:00Z"/>
+  <w16cex:commentExtensible w16cex:durableId="2CF33E17" w16cex:dateUtc="2025-05-24T23:04:00Z"/>
+  <w16cex:commentExtensible w16cex:durableId="6EBAD0C9" w16cex:dateUtc="2025-05-24T23:04:00Z"/>
 </w16cex:commentsExtensible>
 </file>
 
@@ -26992,6 +27283,8 @@
   <w16cid:commentId w16cid:paraId="0CC8A972" w16cid:durableId="6BE9660C"/>
   <w16cid:commentId w16cid:paraId="5574534F" w16cid:durableId="0D181876"/>
   <w16cid:commentId w16cid:paraId="3C03F9D0" w16cid:durableId="3D3EEDCC"/>
+  <w16cid:commentId w16cid:paraId="2EBB6485" w16cid:durableId="2CF33E17"/>
+  <w16cid:commentId w16cid:paraId="350C2CF8" w16cid:durableId="6EBAD0C9"/>
 </w16cid:commentsIds>
 </file>
 
@@ -27372,13 +27665,7 @@
           <w:rPr>
             <w:szCs w:val="22"/>
           </w:rPr>
-          <w:t xml:space="preserve"> test phase</w:t>
-        </w:r>
-        <w:r>
-          <w:rPr>
-            <w:szCs w:val="22"/>
-          </w:rPr>
-          <w:t xml:space="preserve"> were affected by a preceding </w:t>
+          <w:t xml:space="preserve"> test phase were affected by a preceding </w:t>
         </w:r>
       </w:ins>
       <w:del w:id="67" w:author="Jaeger, Florian" w:date="2025-05-22T17:06:00Z" w16du:dateUtc="2025-05-22T21:06:00Z">
@@ -27422,13 +27709,7 @@
           <w:rPr>
             <w:szCs w:val="22"/>
           </w:rPr>
-          <w:t>phase</w:t>
-        </w:r>
-        <w:r>
-          <w:rPr>
-            <w:szCs w:val="22"/>
-          </w:rPr>
-          <w:t xml:space="preserve"> </w:t>
+          <w:t xml:space="preserve">phase </w:t>
         </w:r>
       </w:ins>
       <w:r>
@@ -27520,13 +27801,7 @@
           <w:rPr>
             <w:szCs w:val="22"/>
           </w:rPr>
-          <w:t>Such designs</w:t>
-        </w:r>
-        <w:r>
-          <w:rPr>
-            <w:szCs w:val="22"/>
-          </w:rPr>
-          <w:t xml:space="preserve"> </w:t>
+          <w:t xml:space="preserve">Such designs </w:t>
         </w:r>
       </w:ins>
       <w:r>
@@ -32711,6 +32986,7 @@
   <w:style w:type="character" w:default="1" w:styleId="DefaultParagraphFont">
     <w:name w:val="Default Paragraph Font"/>
     <w:uiPriority w:val="1"/>
+    <w:semiHidden/>
     <w:unhideWhenUsed/>
   </w:style>
   <w:style w:type="table" w:default="1" w:styleId="TableNormal">
@@ -33593,7 +33869,7 @@
 </file>
 
 <file path=customXml/itemProps1.xml><?xml version="1.0" encoding="utf-8"?>
-<ds:datastoreItem xmlns:ds="http://schemas.openxmlformats.org/officeDocument/2006/customXml" ds:itemID="{B20ED14E-20BD-0342-A447-925FFA2C3804}">
+<ds:datastoreItem xmlns:ds="http://schemas.openxmlformats.org/officeDocument/2006/customXml" ds:itemID="{CEAF82DD-8E2B-F442-854C-D22AA8B4402F}">
   <ds:schemaRefs>
     <ds:schemaRef ds:uri="http://schemas.openxmlformats.org/officeDocument/2006/bibliography"/>
   </ds:schemaRefs>
@@ -33601,7 +33877,7 @@
 </file>
 
 <file path=customXml/itemProps2.xml><?xml version="1.0" encoding="utf-8"?>
-<ds:datastoreItem xmlns:ds="http://schemas.openxmlformats.org/officeDocument/2006/customXml" ds:itemID="{CEAF82DD-8E2B-F442-854C-D22AA8B4402F}">
+<ds:datastoreItem xmlns:ds="http://schemas.openxmlformats.org/officeDocument/2006/customXml" ds:itemID="{B20ED14E-20BD-0342-A447-925FFA2C3804}">
   <ds:schemaRefs>
     <ds:schemaRef ds:uri="http://schemas.openxmlformats.org/officeDocument/2006/bibliography"/>
   </ds:schemaRefs>

</xml_diff>